<commit_message>
Implement LCA interoperability and reliability modeling
</commit_message>
<xml_diff>
--- a/paper/OpenDC-LCA_manuscript.docx
+++ b/paper/OpenDC-LCA_manuscript.docx
@@ -87,7 +87,7 @@
           <w:rFonts w:ascii="Calibri" w:hAnsi="Calibri"/>
           <w:sz w:val="21"/>
         </w:rPr>
-        <w:t>The rapid growth and increasing power density of cloud infrastructure have made cooling architecture a consequential design variable for data-center energy use, water consumption, material demand, and greenhouse-gas emissions. Published life-cycle assessments have demonstrated the potential value of cold plates and one- and two-phase immersion cooling, but independent analysis is limited by heterogeneous data formats, licensed background inventories, confidential equipment data, annual-average operating assumptions, and weak separation between illustrative calculations and evidence suitable for comparative claims. We present OpenDC-LCA, an open-source Python framework that connects traceable lifecycle inventories, public grid and climate data, and laboratory or simulated cooling-performance maps. The framework implements a common functional unit, explicit system boundaries, annualized and discrete replacement models, hourly weather-load-performance integration, uncertainty and sensitivity analysis, and a machine-readable scientific audit that blocks comparative claims when evidence is synthetic or incomplete. As a validation case, OpenDC-LCA reconstructed all 24 normalized totals released with a 2025 Microsoft data-center cooling study; the maximum absolute difference between the reported totals and the sum of their seven released contributions was 1.42 × 10⁻¹⁴ percentage points. For the grid scenario, the released data corresponded to greenhouse-gas reductions of 15.18%, 16.41%, and 20.66% for cold-plate, one-phase immersion, and two-phase immersion cooling relative to air cooling. A second demonstration coupled 8,760 typical-meteorological-year observations for Fayetteville, Arkansas with explicit, hypothetical temperature-PUE curves and an EPA eGRID factor. A third demonstration used complete synthetic load-temperature surfaces to verify bilinear interpolation, uncertainty propagation, and no-extrapolation safeguards. The latter demonstrations are intentionally labeled hypothesis-generating or synthetic and cannot support technology comparisons. OpenDC-LCA therefore contributes not another generic LCA database, but a transparent and extensible interface between data-center cooling physics, lifecycle inventories, temporal operation, and reviewable environmental claims.</w:t>
+        <w:t>The rapid growth and increasing power density of cloud infrastructure have made cooling architecture a consequential design variable for data-center energy use, water consumption, material demand, and greenhouse-gas emissions. Published life-cycle assessments have demonstrated the potential value of cold plates and one- and two-phase immersion cooling, but independent analysis is limited by heterogeneous data formats, licensed background inventories, confidential equipment data, annual-average operating assumptions, and weak separation between illustrative calculations and evidence suitable for comparative claims. We present OpenDC-LCA, an open-source Python framework that connects traceable lifecycle inventories, public grid and climate data, and laboratory or simulated cooling-performance maps. The framework implements a common functional unit, explicit system boundaries, annualized, discrete, and reliability-driven replacement models, hourly weather-load-performance integration, openLCA/Brightway inventory exchange, uncertainty and sensitivity analysis, and a machine-readable scientific audit that blocks comparative claims when evidence is synthetic or incomplete. As a validation case, OpenDC-LCA reconstructed all 24 normalized totals released with a 2025 Microsoft data-center cooling study; the maximum absolute difference between the reported totals and the sum of their seven released contributions was 1.42 × 10⁻¹⁴ percentage points. For the grid scenario, the released data corresponded to greenhouse-gas reductions of 15.18%, 16.41%, and 20.66% for cold-plate, one-phase immersion, and two-phase immersion cooling relative to air cooling. A second demonstration coupled 8,760 typical-meteorological-year observations for Fayetteville, Arkansas with explicit, hypothetical temperature-PUE curves and an EPA eGRID factor. A third demonstration used complete synthetic load-temperature surfaces to verify bilinear interpolation, uncertainty propagation, and no-extrapolation safeguards. The latter demonstrations are intentionally labeled hypothesis-generating or synthetic and cannot support technology comparisons. OpenDC-LCA therefore contributes not another generic LCA database, but a transparent and extensible interface between data-center cooling physics, lifecycle inventories, temporal operation, and reviewable environmental claims.</w:t>
       </w:r>
     </w:p>
     <w:p>
@@ -340,7 +340,7 @@
           <w:rFonts w:ascii="Calibri" w:hAnsi="Calibri"/>
           <w:sz w:val="21"/>
         </w:rPr>
-        <w:t>The framework is implemented in Python 3.10 or later and distributed under the MIT License [4]. Version 1.0 exposes validated scenario analysis, performance-map summarization, scientific audit functions, report generation, and a local browser-based GUI. The GUI binds to the local host by default and does not alter the data model or calculation path.</w:t>
+        <w:t>The framework is implemented in Python 3.10 or later and distributed under the MIT License [4]. Version 1.1 exposes validated scenario analysis, performance-map summarization, scientific audit functions, report generation, a local browser-based GUI, complete openLCA JSON-LD process exchange, and Brightway database-write mappings. The GUI binds to the local host by default and does not alter the data model or calculation path.</w:t>
       </w:r>
     </w:p>
     <w:p>
@@ -701,6 +701,122 @@
     </w:p>
     <w:p>
       <w:pPr>
+        <w:pStyle w:val="Heading2"/>
+      </w:pPr>
+      <w:r>
+        <w:t>2.6. Inventory interoperability and reliability</w:t>
+      </w:r>
+    </w:p>
+    <w:p>
+      <w:r>
+        <w:rPr>
+          <w:rFonts w:ascii="Calibri" w:hAnsi="Calibri"/>
+          <w:sz w:val="21"/>
+        </w:rPr>
+        <w:t xml:space="preserve">OpenDC-LCA reads complete openLCA JSON-LD process exchanges, including flow and provider identifiers, flow type, amount, unit, direction, and quantitative reference. The same records map to dictionaries accepted by </w:t>
+      </w:r>
+      <w:r>
+        <w:rPr>
+          <w:rFonts w:ascii="Courier New" w:hAnsi="Courier New"/>
+          <w:color w:val="17324D"/>
+          <w:sz w:val="20"/>
+        </w:rPr>
+        <w:t>bw2data.Database.write</w:t>
+      </w:r>
+      <w:r>
+        <w:rPr>
+          <w:rFonts w:ascii="Calibri" w:hAnsi="Calibri"/>
+          <w:sz w:val="21"/>
+        </w:rPr>
+        <w:t>. Conversely, an OpenDC-LCA scenario can be exported as an annual foreground unit process containing delivered IT service, facility electricity, on-site water, and equipment exchanges. LCIA factors are not misrepresented as elementary flows; background providers, elementary-flow mapping, and impact methods remain explicit tasks in openLCA or Brightway.</w:t>
+      </w:r>
+    </w:p>
+    <w:p>
+      <w:r>
+        <w:rPr>
+          <w:rFonts w:ascii="Calibri" w:hAnsi="Calibri"/>
+          <w:sz w:val="21"/>
+        </w:rPr>
+        <w:t>For a component with Weibull characteristic life \eta and shape β, the first-failure distribution is</w:t>
+      </w:r>
+    </w:p>
+    <w:p>
+      <w:pPr>
+        <w:keepLines/>
+        <w:spacing w:before="80" w:after="140"/>
+        <w:jc w:val="center"/>
+      </w:pPr>
+      <w:r>
+        <w:rPr>
+          <w:rFonts w:ascii="Cambria Math" w:hAnsi="Cambria Math"/>
+          <w:i/>
+          <w:color w:val="17324D"/>
+          <w:sz w:val="21"/>
+        </w:rPr>
+        <w:t>F(t) = 1 - exp[-(t / eta)^beta]                                      (10)</w:t>
+      </w:r>
+    </w:p>
+    <w:p>
+      <w:r>
+        <w:rPr>
+          <w:rFonts w:ascii="Calibri" w:hAnsi="Calibri"/>
+          <w:sz w:val="21"/>
+        </w:rPr>
+        <w:t>Expected failures after as-good-as-new replacement are obtained from the renewal equation</w:t>
+      </w:r>
+    </w:p>
+    <w:p>
+      <w:pPr>
+        <w:keepLines/>
+        <w:spacing w:before="80" w:after="140"/>
+        <w:jc w:val="center"/>
+      </w:pPr>
+      <w:r>
+        <w:rPr>
+          <w:rFonts w:ascii="Cambria Math" w:hAnsi="Cambria Math"/>
+          <w:i/>
+          <w:color w:val="17324D"/>
+          <w:sz w:val="21"/>
+        </w:rPr>
+        <w:t>M(t) = F(t) + integral[0,t] M(t-x) dF(x)                              (11)</w:t>
+      </w:r>
+    </w:p>
+    <w:p>
+      <w:r>
+        <w:rPr>
+          <w:rFonts w:ascii="Calibri" w:hAnsi="Calibri"/>
+          <w:sz w:val="21"/>
+        </w:rPr>
+        <w:t>An optional Arrhenius acceleration adjusts characteristic life from reference temperature T_ref to operating temperature T_op:</w:t>
+      </w:r>
+    </w:p>
+    <w:p>
+      <w:pPr>
+        <w:keepLines/>
+        <w:spacing w:before="80" w:after="140"/>
+        <w:jc w:val="center"/>
+      </w:pPr>
+      <w:r>
+        <w:rPr>
+          <w:rFonts w:ascii="Cambria Math" w:hAnsi="Cambria Math"/>
+          <w:i/>
+          <w:color w:val="17324D"/>
+          <w:sz w:val="21"/>
+        </w:rPr>
+        <w:t>eta_op = eta_ref / exp[Ea/kB (1/T_ref - 1/T_op)]                      (12)</w:t>
+      </w:r>
+    </w:p>
+    <w:p>
+      <w:r>
+        <w:rPr>
+          <w:rFonts w:ascii="Calibri" w:hAnsi="Calibri"/>
+          <w:sz w:val="21"/>
+        </w:rPr>
+        <w:t>The calculation reports expected failures and installations, scheduled maintenance, maintenance impacts, downtime, and unserved-IT-energy exposure. These are expectation values. Redundancy, common-cause failure, repair queues, and backup-system energy are outside the present model.</w:t>
+      </w:r>
+    </w:p>
+    <w:p>
+      <w:pPr>
         <w:pStyle w:val="Heading1"/>
       </w:pPr>
       <w:r>
@@ -817,7 +933,22 @@
           <w:rFonts w:ascii="Calibri" w:hAnsi="Calibri"/>
           <w:sz w:val="21"/>
         </w:rPr>
-        <w:t>The source registry also documents USLCI v1.2026-06.0, ÖKOBAUDAT 2024-II, Boavizta ICT factors, seven NREL hydrogen datasets accessed through GLAD and the Federal LCA Commons, and USGS watershed data [9-13]. These sources establish future adapters for equipment, building, backup-power, embodied ICT, and water context. Registration does not make datasets automatically compatible; geography, reference year, unit, product system, impact method, and allocation must be harmonized for each study.</w:t>
+        <w:t xml:space="preserve">The source registry also documents USLCI v1.2026-06.0, ÖKOBAUDAT 2024-II, Boavizta ICT factors, seven NREL hydrogen datasets accessed through GLAD and the Federal LCA Commons, and USGS watershed data [9-13]. These sources establish inputs for equipment, building, backup-power, embodied ICT, and water context. The seven GLAD archives can now be read as complete openLCA JSON-LD inventories and mapped to Brightway; the </w:t>
+      </w:r>
+      <w:r>
+        <w:rPr>
+          <w:rFonts w:ascii="Courier New" w:hAnsi="Courier New"/>
+          <w:color w:val="17324D"/>
+          <w:sz w:val="20"/>
+        </w:rPr>
+        <w:t>.zolca</w:t>
+      </w:r>
+      <w:r>
+        <w:rPr>
+          <w:rFonts w:ascii="Calibri" w:hAnsi="Calibri"/>
+          <w:sz w:val="21"/>
+        </w:rPr>
+        <w:t xml:space="preserve"> USLCI backup must first be exported from openLCA as portable JSON-LD. Registration or successful exchange does not make datasets automatically compatible; geography, reference year, unit, product system, impact method, and allocation must be harmonized for each study.</w:t>
       </w:r>
     </w:p>
     <w:p>
@@ -2020,6 +2151,310 @@
                 <w:rFonts w:ascii="Calibri" w:hAnsi="Calibri"/>
                 <w:sz w:val="15"/>
               </w:rPr>
+              <w:t>Inventory exchange</w:t>
+            </w:r>
+          </w:p>
+        </w:tc>
+        <w:tc>
+          <w:tcPr>
+            <w:tcW w:type="dxa" w:w="1750"/>
+            <w:vAlign w:val="center"/>
+            <w:tcMar>
+              <w:top w:w="80" w:type="dxa"/>
+              <w:start w:w="120" w:type="dxa"/>
+              <w:bottom w:w="80" w:type="dxa"/>
+              <w:end w:w="120" w:type="dxa"/>
+            </w:tcMar>
+          </w:tcPr>
+          <w:p>
+            <w:pPr>
+              <w:spacing w:after="0" w:line="240" w:lineRule="auto"/>
+              <w:jc w:val="left"/>
+            </w:pPr>
+            <w:r>
+              <w:rPr>
+                <w:rFonts w:ascii="Calibri" w:hAnsi="Calibri"/>
+                <w:sz w:val="15"/>
+              </w:rPr>
+              <w:t>openLCA JSON-LD processes or OpenDC-LCA scenario</w:t>
+            </w:r>
+          </w:p>
+        </w:tc>
+        <w:tc>
+          <w:tcPr>
+            <w:tcW w:type="dxa" w:w="1650"/>
+            <w:vAlign w:val="center"/>
+            <w:tcMar>
+              <w:top w:w="80" w:type="dxa"/>
+              <w:start w:w="120" w:type="dxa"/>
+              <w:bottom w:w="80" w:type="dxa"/>
+              <w:end w:w="120" w:type="dxa"/>
+            </w:tcMar>
+          </w:tcPr>
+          <w:p>
+            <w:pPr>
+              <w:spacing w:after="0" w:line="240" w:lineRule="auto"/>
+              <w:jc w:val="left"/>
+            </w:pPr>
+            <w:r>
+              <w:rPr>
+                <w:rFonts w:ascii="Calibri" w:hAnsi="Calibri"/>
+                <w:sz w:val="15"/>
+              </w:rPr>
+              <w:t>Exchange-preserving import/export and Brightway mapping</w:t>
+            </w:r>
+          </w:p>
+        </w:tc>
+        <w:tc>
+          <w:tcPr>
+            <w:tcW w:type="dxa" w:w="1650"/>
+            <w:vAlign w:val="center"/>
+            <w:tcMar>
+              <w:top w:w="80" w:type="dxa"/>
+              <w:start w:w="120" w:type="dxa"/>
+              <w:bottom w:w="80" w:type="dxa"/>
+              <w:end w:w="120" w:type="dxa"/>
+            </w:tcMar>
+          </w:tcPr>
+          <w:p>
+            <w:pPr>
+              <w:spacing w:after="0" w:line="240" w:lineRule="auto"/>
+              <w:jc w:val="left"/>
+            </w:pPr>
+            <w:r>
+              <w:rPr>
+                <w:rFonts w:ascii="Calibri" w:hAnsi="Calibri"/>
+                <w:sz w:val="15"/>
+              </w:rPr>
+              <w:t>Foreground process network</w:t>
+            </w:r>
+          </w:p>
+        </w:tc>
+        <w:tc>
+          <w:tcPr>
+            <w:tcW w:type="dxa" w:w="1850"/>
+            <w:vAlign w:val="center"/>
+            <w:tcMar>
+              <w:top w:w="80" w:type="dxa"/>
+              <w:start w:w="120" w:type="dxa"/>
+              <w:bottom w:w="80" w:type="dxa"/>
+              <w:end w:w="120" w:type="dxa"/>
+            </w:tcMar>
+          </w:tcPr>
+          <w:p>
+            <w:pPr>
+              <w:spacing w:after="0" w:line="240" w:lineRule="auto"/>
+              <w:jc w:val="left"/>
+            </w:pPr>
+            <w:r>
+              <w:rPr>
+                <w:rFonts w:ascii="Calibri" w:hAnsi="Calibri"/>
+                <w:sz w:val="15"/>
+              </w:rPr>
+              <w:t>Flow, provider, unit, system-model and LCIA compatibility review</w:t>
+            </w:r>
+          </w:p>
+        </w:tc>
+        <w:tc>
+          <w:tcPr>
+            <w:tcW w:type="dxa" w:w="1010"/>
+            <w:vAlign w:val="center"/>
+            <w:tcMar>
+              <w:top w:w="80" w:type="dxa"/>
+              <w:start w:w="120" w:type="dxa"/>
+              <w:bottom w:w="80" w:type="dxa"/>
+              <w:end w:w="120" w:type="dxa"/>
+            </w:tcMar>
+          </w:tcPr>
+          <w:p>
+            <w:pPr>
+              <w:spacing w:after="0" w:line="240" w:lineRule="auto"/>
+              <w:jc w:val="left"/>
+            </w:pPr>
+            <w:r>
+              <w:rPr>
+                <w:rFonts w:ascii="Calibri" w:hAnsi="Calibri"/>
+                <w:sz w:val="15"/>
+              </w:rPr>
+              <w:t>Implemented</w:t>
+            </w:r>
+          </w:p>
+        </w:tc>
+      </w:tr>
+      <w:tr>
+        <w:tc>
+          <w:tcPr>
+            <w:tcW w:type="dxa" w:w="1450"/>
+            <w:vAlign w:val="center"/>
+            <w:tcMar>
+              <w:top w:w="80" w:type="dxa"/>
+              <w:start w:w="120" w:type="dxa"/>
+              <w:bottom w:w="80" w:type="dxa"/>
+              <w:end w:w="120" w:type="dxa"/>
+            </w:tcMar>
+          </w:tcPr>
+          <w:p>
+            <w:pPr>
+              <w:spacing w:after="0" w:line="240" w:lineRule="auto"/>
+              <w:jc w:val="left"/>
+            </w:pPr>
+            <w:r>
+              <w:rPr>
+                <w:rFonts w:ascii="Calibri" w:hAnsi="Calibri"/>
+                <w:sz w:val="15"/>
+              </w:rPr>
+              <w:t>Reliability</w:t>
+            </w:r>
+          </w:p>
+        </w:tc>
+        <w:tc>
+          <w:tcPr>
+            <w:tcW w:type="dxa" w:w="1750"/>
+            <w:vAlign w:val="center"/>
+            <w:tcMar>
+              <w:top w:w="80" w:type="dxa"/>
+              <w:start w:w="120" w:type="dxa"/>
+              <w:bottom w:w="80" w:type="dxa"/>
+              <w:end w:w="120" w:type="dxa"/>
+            </w:tcMar>
+          </w:tcPr>
+          <w:p>
+            <w:pPr>
+              <w:spacing w:after="0" w:line="240" w:lineRule="auto"/>
+              <w:jc w:val="left"/>
+            </w:pPr>
+            <w:r>
+              <w:rPr>
+                <w:rFonts w:ascii="Calibri" w:hAnsi="Calibri"/>
+                <w:sz w:val="15"/>
+              </w:rPr>
+              <w:t>Weibull/Arrhenius parameters, maintenance and downtime</w:t>
+            </w:r>
+          </w:p>
+        </w:tc>
+        <w:tc>
+          <w:tcPr>
+            <w:tcW w:type="dxa" w:w="1650"/>
+            <w:vAlign w:val="center"/>
+            <w:tcMar>
+              <w:top w:w="80" w:type="dxa"/>
+              <w:start w:w="120" w:type="dxa"/>
+              <w:bottom w:w="80" w:type="dxa"/>
+              <w:end w:w="120" w:type="dxa"/>
+            </w:tcMar>
+          </w:tcPr>
+          <w:p>
+            <w:pPr>
+              <w:spacing w:after="0" w:line="240" w:lineRule="auto"/>
+              <w:jc w:val="left"/>
+            </w:pPr>
+            <w:r>
+              <w:rPr>
+                <w:rFonts w:ascii="Calibri" w:hAnsi="Calibri"/>
+                <w:sz w:val="15"/>
+              </w:rPr>
+              <w:t>Renewal equation and lifecycle annualization</w:t>
+            </w:r>
+          </w:p>
+        </w:tc>
+        <w:tc>
+          <w:tcPr>
+            <w:tcW w:type="dxa" w:w="1650"/>
+            <w:vAlign w:val="center"/>
+            <w:tcMar>
+              <w:top w:w="80" w:type="dxa"/>
+              <w:start w:w="120" w:type="dxa"/>
+              <w:bottom w:w="80" w:type="dxa"/>
+              <w:end w:w="120" w:type="dxa"/>
+            </w:tcMar>
+          </w:tcPr>
+          <w:p>
+            <w:pPr>
+              <w:spacing w:after="0" w:line="240" w:lineRule="auto"/>
+              <w:jc w:val="left"/>
+            </w:pPr>
+            <w:r>
+              <w:rPr>
+                <w:rFonts w:ascii="Calibri" w:hAnsi="Calibri"/>
+                <w:sz w:val="15"/>
+              </w:rPr>
+              <w:t>Expected failures, replacements, downtime and impacts</w:t>
+            </w:r>
+          </w:p>
+        </w:tc>
+        <w:tc>
+          <w:tcPr>
+            <w:tcW w:type="dxa" w:w="1850"/>
+            <w:vAlign w:val="center"/>
+            <w:tcMar>
+              <w:top w:w="80" w:type="dxa"/>
+              <w:start w:w="120" w:type="dxa"/>
+              <w:bottom w:w="80" w:type="dxa"/>
+              <w:end w:w="120" w:type="dxa"/>
+            </w:tcMar>
+          </w:tcPr>
+          <w:p>
+            <w:pPr>
+              <w:spacing w:after="0" w:line="240" w:lineRule="auto"/>
+              <w:jc w:val="left"/>
+            </w:pPr>
+            <w:r>
+              <w:rPr>
+                <w:rFonts w:ascii="Calibri" w:hAnsi="Calibri"/>
+                <w:sz w:val="15"/>
+              </w:rPr>
+              <w:t>Empirical failure model and uncertainty</w:t>
+            </w:r>
+          </w:p>
+        </w:tc>
+        <w:tc>
+          <w:tcPr>
+            <w:tcW w:type="dxa" w:w="1010"/>
+            <w:vAlign w:val="center"/>
+            <w:tcMar>
+              <w:top w:w="80" w:type="dxa"/>
+              <w:start w:w="120" w:type="dxa"/>
+              <w:bottom w:w="80" w:type="dxa"/>
+              <w:end w:w="120" w:type="dxa"/>
+            </w:tcMar>
+          </w:tcPr>
+          <w:p>
+            <w:pPr>
+              <w:spacing w:after="0" w:line="240" w:lineRule="auto"/>
+              <w:jc w:val="left"/>
+            </w:pPr>
+            <w:r>
+              <w:rPr>
+                <w:rFonts w:ascii="Calibri" w:hAnsi="Calibri"/>
+                <w:sz w:val="15"/>
+              </w:rPr>
+              <w:t>Implemented</w:t>
+            </w:r>
+          </w:p>
+        </w:tc>
+      </w:tr>
+      <w:tr>
+        <w:tc>
+          <w:tcPr>
+            <w:tcW w:type="dxa" w:w="1450"/>
+            <w:vAlign w:val="center"/>
+            <w:tcMar>
+              <w:top w:w="80" w:type="dxa"/>
+              <w:start w:w="120" w:type="dxa"/>
+              <w:bottom w:w="80" w:type="dxa"/>
+              <w:end w:w="120" w:type="dxa"/>
+            </w:tcMar>
+          </w:tcPr>
+          <w:p>
+            <w:pPr>
+              <w:spacing w:after="0" w:line="240" w:lineRule="auto"/>
+              <w:jc w:val="left"/>
+            </w:pPr>
+            <w:r>
+              <w:rPr>
+                <w:rFonts w:ascii="Calibri" w:hAnsi="Calibri"/>
+                <w:sz w:val="15"/>
+              </w:rPr>
               <w:t>Uncertainty and sensitivity</w:t>
             </w:r>
           </w:p>
@@ -2509,6 +2944,15 @@
           <w:rFonts w:ascii="Calibri" w:hAnsi="Calibri"/>
           <w:sz w:val="21"/>
         </w:rPr>
+        <w:t>The interoperability layer also clarifies the division of responsibility between tools. openLCA or Brightway manages background process networks and LCIA; OpenDC-LCA manages the cooling-specific foreground, temporal operation, reliability assumptions, and evidence gate. UUID preservation exposes missing providers and flow mappings instead of silently substituting a dataset.</w:t>
+      </w:r>
+    </w:p>
+    <w:p>
+      <w:r>
+        <w:rPr>
+          <w:rFonts w:ascii="Calibri" w:hAnsi="Calibri"/>
+          <w:sz w:val="21"/>
+        </w:rPr>
         <w:t>The third contribution is staged reproducibility. Exact reconstruction of the released Microsoft/Nature component totals establishes arithmetic and lineage consistency. It does not imply an independent recreation of proprietary background datasets. This distinction helps identify the next evidence needed for a deeper comparison: reviewed foreground bills of materials, measured cooling surfaces, equipment lifetimes, fluid losses, and background processes with compatible system models.</w:t>
       </w:r>
     </w:p>
@@ -2561,7 +3005,7 @@
           <w:rFonts w:ascii="Calibri" w:hAnsi="Calibri"/>
           <w:sz w:val="21"/>
         </w:rPr>
-        <w:t>The synthetic surface demonstration applies independent point uncertainty and does not capture correlated sensor bias, interpolation error, model-form uncertainty, degradation, or failures. The supported functional unit does not yet capture useful computation directly. The audit cannot replace expert critical review, and a model can satisfy automated schema checks while still using scientifically inappropriate factors. Finally, the present framework is a foreground and screening tool, not a complete life-cycle inventory database.</w:t>
+        <w:t>The synthetic surface demonstration applies independent point uncertainty and does not capture correlated sensor bias, interpolation error, model-form uncertainty, or degradation. The reliability model uses expected Weibull renewal counts and optional Arrhenius temperature acceleration; it does not capture redundancy topology, dependent failures, repair queues, or time-varying damage. The supported functional unit does not yet capture useful computation directly. The audit cannot replace expert critical review, and a model can satisfy automated schema checks while still using scientifically inappropriate factors. Finally, the present framework is a foreground and screening tool, not a complete life-cycle inventory database.</w:t>
       </w:r>
     </w:p>
     <w:p>
@@ -2578,7 +3022,7 @@
           <w:rFonts w:ascii="Calibri" w:hAnsi="Calibri"/>
           <w:sz w:val="21"/>
         </w:rPr>
-        <w:t>Four steps would move OpenDC-LCA from a reproducible research framework toward decision-grade comparative studies. First, populate reviewed NED3 load-temperature performance surfaces for multiple cooling architectures. Second, add adapters for USLCI and openLCA exchange formats while retaining provider licenses and process-system metadata. Third, add time-resolved grid factors, humidity-sensitive heat rejection, water-scarcity characterization, and workload-based functional units. Fourth, conduct an independent LCA critical review, including review of allocation, replacement, uncertainty, cutoff, and data-quality choices. Dr. Nutter's review should be recorded as an assessment of the method notes and claim-gate logic rather than a request to answer isolated questions without context.</w:t>
+        <w:t>Four steps would move OpenDC-LCA from a reproducible research framework toward decision-grade comparative studies. First, populate reviewed NED3 load-temperature performance surfaces for multiple cooling architectures. Second, calibrate the implemented openLCA/Brightway mappings and reliability models against the selected USLCI processes and measured failure records while retaining licenses and process-system metadata. Third, add time-resolved grid factors, humidity-sensitive heat rejection, water-scarcity characterization, and workload-based functional units. Fourth, conduct an independent LCA critical review, including review of allocation, replacement, uncertainty, cutoff, and data-quality choices. Dr. Nutter's review should be recorded as an assessment of the method notes and claim-gate logic rather than a request to answer isolated questions without context.</w:t>
       </w:r>
     </w:p>
     <w:p>
@@ -2595,7 +3039,7 @@
           <w:rFonts w:ascii="Calibri" w:hAnsi="Calibri"/>
           <w:sz w:val="21"/>
         </w:rPr>
-        <w:t>OpenDC-LCA provides a transparent, open-source connection between data-center cooling physics and lifecycle interpretation. Version 1.0 registers evidence, validates functional and physical assumptions, calculates static and temporal impacts, integrates measured load-temperature surfaces, propagates screening uncertainty, and emits machine-readable audit findings through a command line, Python API, and local GUI. The package exactly reconstructed all 24 released normalized totals tested from the Microsoft/Nature study, with a maximum absolute numerical difference of 1.42 × 10⁻¹⁴ percentage points. Its climate and measurement-surface demonstrations show how public data and laboratory measurements can be connected to annual environmental indicators, while their evidence labels prevent synthetic values from becoming technology claims.</w:t>
+        <w:t>OpenDC-LCA provides a transparent, open-source connection between data-center cooling physics and lifecycle interpretation. Version 1.1 registers evidence, validates functional and physical assumptions, calculates static and temporal impacts, integrates measured load-temperature surfaces, exchanges foreground inventories with openLCA and Brightway, models reliability-driven replacement and maintenance, propagates screening uncertainty, and emits machine-readable audit findings through a command line, Python API, and local GUI. The package exactly reconstructed all 24 released normalized totals tested from the Microsoft/Nature study, with a maximum absolute numerical difference of 1.42 × 10⁻¹⁴ percentage points. Its climate and measurement-surface demonstrations show how public data and laboratory measurements can be connected to annual environmental indicators, while their evidence labels prevent synthetic values from becoming technology claims.</w:t>
       </w:r>
     </w:p>
     <w:p>
@@ -2621,7 +3065,7 @@
           <w:rFonts w:ascii="Calibri" w:hAnsi="Calibri"/>
           <w:sz w:val="21"/>
         </w:rPr>
-        <w:t>OpenDC-LCA version 1.0 source code, examples, documentation, tests, and derived paper tables and figures are available at https://github.com/UARK-NED3/OpenDC-LCA. Provider-native raw files remain local when redistribution permission has not been established. Released Microsoft/Nature model files are available from Zenodo [2]. EPA eGRID and NOAA TMY data are available from their respective public portals [5,6].</w:t>
+        <w:t>OpenDC-LCA version 1.1 source code, examples, documentation, tests, and derived paper tables and figures are available at https://github.com/UARK-NED3/OpenDC-LCA. Provider-native raw files remain local when redistribution permission has not been established. Released Microsoft/Nature model files are available from Zenodo [2]. EPA eGRID and NOAA TMY data are available from their respective public portals [5,6].</w:t>
       </w:r>
     </w:p>
     <w:p>

</xml_diff>

<commit_message>
Deepen evidence synthesis and manuscript analysis
</commit_message>
<xml_diff>
--- a/paper/OpenDC-LCA_manuscript.docx
+++ b/paper/OpenDC-LCA_manuscript.docx
@@ -14,7 +14,7 @@
           <w:color w:val="17324D"/>
           <w:sz w:val="42"/>
         </w:rPr>
-        <w:t>OpenDC-LCA: an open, evidence-gated framework for reproducible life-cycle and climate-performance analysis of data-center cooling</w:t>
+        <w:t>OpenDC-LCA: an evidence-governed framework for transferable life-cycle assessment of data-center cooling</w:t>
       </w:r>
     </w:p>
     <w:p>
@@ -87,7 +87,7 @@
           <w:rFonts w:ascii="Calibri" w:hAnsi="Calibri"/>
           <w:sz w:val="21"/>
         </w:rPr>
-        <w:t>The rapid growth and increasing power density of cloud infrastructure have made cooling architecture a consequential design variable for data-center energy use, water consumption, material demand, and greenhouse-gas emissions. Published life-cycle assessments have demonstrated the potential value of cold plates and one- and two-phase immersion cooling, but independent analysis is limited by heterogeneous data formats, licensed background inventories, confidential equipment data, annual-average operating assumptions, and weak separation between illustrative calculations and evidence suitable for comparative claims. We present OpenDC-LCA, an open-source Python framework that connects traceable lifecycle inventories, public grid and climate data, and laboratory or simulated cooling-performance maps. The framework implements a common functional unit, explicit system boundaries, annualized, discrete, and reliability-driven replacement models, hourly weather-load-performance integration, openLCA/Brightway inventory exchange, uncertainty and sensitivity analysis, and a machine-readable scientific audit that blocks comparative claims when evidence is synthetic or incomplete. As a validation case, OpenDC-LCA reconstructed all 24 normalized totals released with a 2025 Microsoft data-center cooling study; the maximum absolute difference between the reported totals and the sum of their seven released contributions was 1.42 × 10⁻¹⁴ percentage points. For the grid scenario, the released data corresponded to greenhouse-gas reductions of 15.18%, 16.41%, and 20.66% for cold-plate, one-phase immersion, and two-phase immersion cooling relative to air cooling. A second demonstration coupled 8,760 typical-meteorological-year observations for Fayetteville, Arkansas with explicit, hypothetical temperature-PUE curves and an EPA eGRID factor. A third demonstration used complete synthetic load-temperature surfaces to verify bilinear interpolation, uncertainty propagation, and no-extrapolation safeguards. The latter demonstrations are intentionally labeled hypothesis-generating or synthetic and cannot support technology comparisons. OpenDC-LCA therefore contributes not another generic LCA database, but a transparent and extensible interface between data-center cooling physics, lifecycle inventories, temporal operation, and reviewable environmental claims.</w:t>
+        <w:t>Liquid cooling can reduce data-center operating energy and water use, yet the preferred architecture depends on electricity supply, compute performance, hardware and fluid inventories, service life, climate, and the functional unit used for comparison. Existing studies establish the importance of these effects but are difficult to update or transfer because foreground bills of materials and background processes are often proprietary, operational performance is represented by annual averages, water consumption is rarely scarcity-weighted, and data-quality assessments are not connected to measurement priorities. We present OpenDC-LCA, an open-source, evidence-governed research layer that couples data-center cooling physics to general life-cycle assessment (LCA) tools while preserving source identity, functional unit, geography, transformation equations, uncertainty, and evidence status. The framework supports openLCA JSON-LD and Brightway interoperability, hourly weather-load-performance integration, discrete and reliability-driven replacement, uncertainty analysis, and a machine-readable claim gate. We use released Microsoft/WSP results, EPA eGRID 2023, 48 Boavizta server product-carbon-footprint records, selected ÖKOBAUDAT construction processes, NOAA weather data, and the released Microsoft pedigree assessment to demonstrate analyses that cannot be obtained from any source alone. All 24 released normalized totals were independently reconciled to floating-point precision. Re-basing the released greenhouse-gas contributions across 51 eGRID state records identified a cold-plate/one-phase-immersion crossover near 61 kg CO2e MWh−1: cold plate was lower only for Vermont among the observed states, whereas two-phase immersion remained lowest under the released model. Across the state range, embodied contributions increased from approximately 4% to 57-58% as electricity intensity declined. A contribution-weighted pedigree diagnostic ranked use-phase performance first and server inventories next as evidence-improvement priorities. Public server records showed a manufacturing median of 1,215 kg CO2e per server and a 465-2,503 kg CO2e range. ÖKOBAUDAT unit-process comparisons indicated 60% lower A1-A3 GHG for high-scrap electric-arc-furnace steel than a blast-furnace route and 50% lower GHG for CEM III than CEM II/A cement, but facility propagation is blocked until quantities are disclosed. The results show that open data can support new, decision-relevant deductions when incompatible units and evidence limits are not hidden. OpenDC-LCA complements rather than replaces openLCA or Brightway by supplying the cooling-specific engineering, evidence lineage, and claim governance needed for reproducible comparative research.</w:t>
       </w:r>
     </w:p>
     <w:p>
@@ -112,7 +112,15 @@
         <w:pStyle w:val="Heading1"/>
       </w:pPr>
       <w:r>
-        <w:t>1. Introduction</w:t>
+        <w:t>1. Introduction and literature review</w:t>
+      </w:r>
+    </w:p>
+    <w:p>
+      <w:pPr>
+        <w:pStyle w:val="Heading2"/>
+      </w:pPr>
+      <w:r>
+        <w:t>1.1. Cooling is becoming a lifecycle design decision</w:t>
       </w:r>
     </w:p>
     <w:p>
@@ -121,7 +129,7 @@
           <w:rFonts w:ascii="Calibri" w:hAnsi="Calibri"/>
           <w:sz w:val="21"/>
         </w:rPr>
-        <w:t>Data-center thermal management is changing as compute density increases and operators pursue lower energy and water burdens. Air cooling remains common, whereas cold plates, single-phase immersion, and two-phase immersion shift heat removal toward liquid loops and can alter pumps, fans, heat-rejection equipment, coolants, racks or tanks, building systems, and server configuration. A credible comparison must therefore extend beyond cooling power alone. It must preserve equivalent computational service, apply consistent boundaries, include equipment and fluid lifecycles when they differ, and disclose the conditions under which the cooling system operates.</w:t>
+        <w:t>Data-center electricity demand is increasing with cloud and artificial- intelligence workloads even as energy per computation improves [14,15]. Simultaneously, processor heat flux and rack power density are moving beyond the practical envelope of conventional air cooling. Cold plates transfer heat from selected high-power devices to a liquid loop; single-phase immersion submerges the server in a dielectric liquid; and two-phase immersion uses boiling and condensation. Reviews document substantial differences in heat- transfer coefficient, allowable chip temperature, parasitic power, heat- rejection design, water use, maintainability and deployment maturity [16,17]. Experimental work further shows that cooling can affect clock frequency and compute density, meaning that equal IT electricity or equal server count may not represent equal service [18,19].</w:t>
       </w:r>
     </w:p>
     <w:p>
@@ -130,7 +138,15 @@
           <w:rFonts w:ascii="Calibri" w:hAnsi="Calibri"/>
           <w:sz w:val="21"/>
         </w:rPr>
-        <w:t>Alissa et al. used life-cycle assessment (LCA) to compare data-center cooling architectures and showed how design choices, electricity supply, equipment, buildings, servers, and fluids contribute to primary energy, greenhouse-gas (GHG) emissions, and blue-water consumption [1]. Their publication and released model archive provide an unusually valuable reference for transparent data-center cooling research [2]. At the same time, the study illustrates a broader reproducibility problem. Public source tables allow selected results to be reconstructed, but complete independent replication still requires foreground bills of materials, measured operating data, manufacturer information, and background processes that may be licensed or confidential.</w:t>
+        <w:t>These interactions make a cooling comparison fundamentally different from a component efficiency comparison. A design that lowers fan energy can require tanks, cold plates, coolant distribution units, pumps, piping or fluorinated fluid. A design that permits overclocking may deliver more virtual cores but alter power, server count and lifetime. A design that eliminates evaporative cooling can reduce onsite water while changing electricity-mediated water. Consequently, the comparison must connect thermal performance, facility operation, equipment and fluid production, replacement, end of life, grid conditions and a functionally equivalent computation unit.</w:t>
+      </w:r>
+    </w:p>
+    <w:p>
+      <w:pPr>
+        <w:pStyle w:val="Heading2"/>
+      </w:pPr>
+      <w:r>
+        <w:t>1.2. What existing data-center LCAs establish</w:t>
       </w:r>
     </w:p>
     <w:p>
@@ -139,7 +155,7 @@
           <w:rFonts w:ascii="Calibri" w:hAnsi="Calibri"/>
           <w:sz w:val="21"/>
         </w:rPr>
-        <w:t>General-purpose LCA software, including openLCA, provides process-network modeling, impact assessment, and database interoperability [3]. OpenDC-LCA is not intended to replace these tools. Its role is narrower and complementary: it defines a domain-specific, inspectable bridge between electronics-cooling measurements and simulations, data-center operating conditions, lifecycle inventory factors, and publishable claims. This bridge is important because a generic LCA model does not by itself determine how a cooling-performance map should be sampled, how hourly weather and workload should be aligned, when extrapolation is unacceptable, whether IT service is functionally equivalent, or whether a result derived from synthetic data can be communicated as a technology comparison.</w:t>
+        <w:t>Early screening LCA work showed that operational metrics such as power usage effectiveness (PUE) are insufficient because interventions can transfer burdens between operation, construction and equipment production [20]. Facility-level studies subsequently quantified the importance of electricity, servers, buildings and cooling systems. Siddik, Shehabi and Marston mapped the energy, carbon and water footprint of U.S. data centers and demonstrated that location changes the trade-off between energy- and water-related objectives [21]. Ristic et al. separated onsite water from electricity-supply-chain water and emphasized the uncertainty of water factors [22]. Product-focused work used manufacturer inventories to assess the manufacturing of a cooling device across multiple environmental categories [23], while Wenzel et al. compared LCA with material-flow, exergy and life-cycle-exergy approaches for a data-center cooling tower [24].</w:t>
       </w:r>
     </w:p>
     <w:p>
@@ -148,7 +164,59 @@
           <w:rFonts w:ascii="Calibri" w:hAnsi="Calibri"/>
           <w:sz w:val="21"/>
         </w:rPr>
-        <w:t>The objectives of this work are to:</w:t>
+        <w:t>Alissa et al. provided the most comprehensive public comparison of air, cold-plate, single-phase immersion and two-phase immersion cooling at hyperscale [1]. Their cradle-to-grave model included buildings, supporting equipment, servers, racks or tanks, cables, fluids, use-phase electricity and water, replacements and end of life. Crucially, they used Vcore-year rather than facility area or IT energy, allowing cooling-enabled overclocking and packing density to enter the functional unit. The released results showed 15-21% GHG, 15-20% primary-energy and 31-52% blue-water reductions relative to air cooling, depending on architecture and electricity case. The study also released normalized component results, detailed equations and a pedigree assessment, creating an unusually strong basis for independent secondary analysis [2].</w:t>
+      </w:r>
+    </w:p>
+    <w:p>
+      <w:r>
+        <w:rPr>
+          <w:rFonts w:ascii="Calibri" w:hAnsi="Calibri"/>
+          <w:sz w:val="21"/>
+        </w:rPr>
+        <w:t>Recent work reinforces two conclusions. First, grid decarbonization and cooling efficiency are complementary rather than interchangeable; improving one can shift burdens or expose categories that the other does not address [25]. Second, as operational electricity becomes cleaner, manufacturing and replacement of servers and electronics become proportionally more important. ICT LCAs report large embodied impacts and methodological dispersion among products [26,27]. These results make data quality—not only model completeness—a design concern.</w:t>
+      </w:r>
+    </w:p>
+    <w:p>
+      <w:pPr>
+        <w:pStyle w:val="Heading2"/>
+      </w:pPr>
+      <w:r>
+        <w:t>1.3. Water, time and geography remain weakly connected</w:t>
+      </w:r>
+    </w:p>
+    <w:p>
+      <w:r>
+        <w:rPr>
+          <w:rFonts w:ascii="Calibri" w:hAnsi="Calibri"/>
+          <w:sz w:val="21"/>
+        </w:rPr>
+        <w:t>Blue-water consumption is a volume; water-scarcity impact depends on where and when that volume is consumed. The AWARE consensus method characterizes remaining water availability and its uncertainty [28,29]. Yet data-center studies often combine onsite evaporation and power-sector water at annual, national resolution, or use watershed boundaries without scarcity factors. Likewise, annual-average PUE hides part-load, weather, humidity, economizer availability and heat-rejection behavior. Hourly cooling studies show that energy and onsite/source-water rankings can change by season and climate [30,31]. A transferable cooling LCA therefore requires both a temporal performance model and a geographically matched impact model; neither can be substituted by a site name alone.</w:t>
+      </w:r>
+    </w:p>
+    <w:p>
+      <w:pPr>
+        <w:pStyle w:val="Heading2"/>
+      </w:pPr>
+      <w:r>
+        <w:t>1.4. General LCA software does not close the domain gap</w:t>
+      </w:r>
+    </w:p>
+    <w:p>
+      <w:r>
+        <w:rPr>
+          <w:rFonts w:ascii="Calibri" w:hAnsi="Calibri"/>
+          <w:sz w:val="21"/>
+        </w:rPr>
+        <w:t>openLCA and Brightway provide transparent process-network calculation, inventory exchange and life-cycle impact assessment [3,32]. Commercial tools and databases provide additional curated processes. These engines are necessary, but they do not determine whether two cooling systems deliver equivalent computation, whether a measured performance surface covers all operating hours, how reliability changes replacement burden, or whether synthetic values may support a public comparative claim. Nor does importing a dataset guarantee compatible geography, reference flow, allocation, system model or impact method.</w:t>
+      </w:r>
+    </w:p>
+    <w:p>
+      <w:r>
+        <w:rPr>
+          <w:rFonts w:ascii="Calibri" w:hAnsi="Calibri"/>
+          <w:sz w:val="21"/>
+        </w:rPr>
+        <w:t>The literature therefore leaves six connected bottlenecks:</w:t>
       </w:r>
     </w:p>
     <w:p>
@@ -160,7 +228,7 @@
           <w:rFonts w:ascii="Calibri" w:hAnsi="Calibri"/>
           <w:sz w:val="21"/>
         </w:rPr>
-        <w:t>define a transparent data model and calculation boundary for screening the</w:t>
+        <w:t>released totals are not readily updateable when foreground quantities,</w:t>
       </w:r>
     </w:p>
     <w:p>
@@ -169,7 +237,7 @@
           <w:rFonts w:ascii="Calibri" w:hAnsi="Calibri"/>
           <w:sz w:val="21"/>
         </w:rPr>
-        <w:t>lifecycle impacts of data-center cooling architectures;</w:t>
+        <w:t>background mappings or licensed processes are unavailable;</w:t>
       </w:r>
     </w:p>
     <w:p>
@@ -181,16 +249,7 @@
           <w:rFonts w:ascii="Calibri" w:hAnsi="Calibri"/>
           <w:sz w:val="21"/>
         </w:rPr>
-        <w:t>connect laboratory or simulation performance surfaces to hourly climate and</w:t>
-      </w:r>
-    </w:p>
-    <w:p>
-      <w:r>
-        <w:rPr>
-          <w:rFonts w:ascii="Calibri" w:hAnsi="Calibri"/>
-          <w:sz w:val="21"/>
-        </w:rPr>
-        <w:t>workload data without hiding interpolation or extrapolation assumptions;</w:t>
+        <w:t>annual-average results obscure grid, climate and part-load transferability;</w:t>
       </w:r>
     </w:p>
     <w:p>
@@ -202,7 +261,7 @@
           <w:rFonts w:ascii="Calibri" w:hAnsi="Calibri"/>
           <w:sz w:val="21"/>
         </w:rPr>
-        <w:t>preserve source identifiers, versions, units, geography, evidence status,</w:t>
+        <w:t>Vcore-year, IT MWh, server-year, rack and kilogram-of-material units are</w:t>
       </w:r>
     </w:p>
     <w:p>
@@ -211,7 +270,7 @@
           <w:rFonts w:ascii="Calibri" w:hAnsi="Calibri"/>
           <w:sz w:val="21"/>
         </w:rPr>
-        <w:t>and model version in every analysis;</w:t>
+        <w:t>frequently discussed together without a formal conversion;</w:t>
       </w:r>
     </w:p>
     <w:p>
@@ -223,7 +282,7 @@
           <w:rFonts w:ascii="Calibri" w:hAnsi="Calibri"/>
           <w:sz w:val="21"/>
         </w:rPr>
-        <w:t>reproduce released results from a leading data-center cooling LCA as a</w:t>
+        <w:t>old or proxy electronics, support-equipment and fluid inventories become</w:t>
       </w:r>
     </w:p>
     <w:p>
@@ -232,7 +291,7 @@
           <w:rFonts w:ascii="Calibri" w:hAnsi="Calibri"/>
           <w:sz w:val="21"/>
         </w:rPr>
-        <w:t>calculation and lineage check; and</w:t>
+        <w:t>more influential under grid decarbonization;</w:t>
       </w:r>
     </w:p>
     <w:p>
@@ -244,7 +303,7 @@
           <w:rFonts w:ascii="Calibri" w:hAnsi="Calibri"/>
           <w:sz w:val="21"/>
         </w:rPr>
-        <w:t>prevent numerical completeness from being mistaken for evidentiary</w:t>
+        <w:t>pedigree matrices describe weakness but do not identify which weak data</w:t>
       </w:r>
     </w:p>
     <w:p>
@@ -253,7 +312,150 @@
           <w:rFonts w:ascii="Calibri" w:hAnsi="Calibri"/>
           <w:sz w:val="21"/>
         </w:rPr>
-        <w:t>sufficiency through an automated scientific audit and comparative-claim gate.</w:t>
+        <w:t>most affect the decision; and</w:t>
+      </w:r>
+    </w:p>
+    <w:p>
+      <w:pPr>
+        <w:pStyle w:val="ListNumber"/>
+      </w:pPr>
+      <w:r>
+        <w:rPr>
+          <w:rFonts w:ascii="Calibri" w:hAnsi="Calibri"/>
+          <w:sz w:val="21"/>
+        </w:rPr>
+        <w:t>general LCA tools lack a cooling-specific evidence and comparative-claim</w:t>
+      </w:r>
+    </w:p>
+    <w:p>
+      <w:r>
+        <w:rPr>
+          <w:rFonts w:ascii="Calibri" w:hAnsi="Calibri"/>
+          <w:sz w:val="21"/>
+        </w:rPr>
+        <w:t>contract.</w:t>
+      </w:r>
+    </w:p>
+    <w:p>
+      <w:pPr>
+        <w:pStyle w:val="Heading2"/>
+      </w:pPr>
+      <w:r>
+        <w:t>1.5. Objectives and contribution</w:t>
+      </w:r>
+    </w:p>
+    <w:p>
+      <w:r>
+        <w:rPr>
+          <w:rFonts w:ascii="Calibri" w:hAnsi="Calibri"/>
+          <w:sz w:val="21"/>
+        </w:rPr>
+        <w:t>This work addresses those bottlenecks with an open, evidence-governed domain layer rather than another background database or general LCA engine. The objectives are to:</w:t>
+      </w:r>
+    </w:p>
+    <w:p>
+      <w:pPr>
+        <w:pStyle w:val="ListNumber"/>
+      </w:pPr>
+      <w:r>
+        <w:rPr>
+          <w:rFonts w:ascii="Calibri" w:hAnsi="Calibri"/>
+          <w:sz w:val="21"/>
+        </w:rPr>
+        <w:t>preserve source identifiers, functional units, transformations and evidence</w:t>
+      </w:r>
+    </w:p>
+    <w:p>
+      <w:r>
+        <w:rPr>
+          <w:rFonts w:ascii="Calibri" w:hAnsi="Calibri"/>
+          <w:sz w:val="21"/>
+        </w:rPr>
+        <w:t>status across heterogeneous cooling evidence;</w:t>
+      </w:r>
+    </w:p>
+    <w:p>
+      <w:pPr>
+        <w:pStyle w:val="ListNumber"/>
+      </w:pPr>
+      <w:r>
+        <w:rPr>
+          <w:rFonts w:ascii="Calibri" w:hAnsi="Calibri"/>
+          <w:sz w:val="21"/>
+        </w:rPr>
+        <w:t>connect static lifecycle models to measured load-weather performance,</w:t>
+      </w:r>
+    </w:p>
+    <w:p>
+      <w:r>
+        <w:rPr>
+          <w:rFonts w:ascii="Calibri" w:hAnsi="Calibri"/>
+          <w:sz w:val="21"/>
+        </w:rPr>
+        <w:t>replacement and general-purpose LCA inventories;</w:t>
+      </w:r>
+    </w:p>
+    <w:p>
+      <w:pPr>
+        <w:pStyle w:val="ListNumber"/>
+      </w:pPr>
+      <w:r>
+        <w:rPr>
+          <w:rFonts w:ascii="Calibri" w:hAnsi="Calibri"/>
+          <w:sz w:val="21"/>
+        </w:rPr>
+        <w:t>independently reconstruct the released Microsoft/WSP results and use them</w:t>
+      </w:r>
+    </w:p>
+    <w:p>
+      <w:r>
+        <w:rPr>
+          <w:rFonts w:ascii="Calibri" w:hAnsi="Calibri"/>
+          <w:sz w:val="21"/>
+        </w:rPr>
+        <w:t>with public data to derive location-dependent rankings and burden shifts;</w:t>
+      </w:r>
+    </w:p>
+    <w:p>
+      <w:pPr>
+        <w:pStyle w:val="ListNumber"/>
+      </w:pPr>
+      <w:r>
+        <w:rPr>
+          <w:rFonts w:ascii="Calibri" w:hAnsi="Calibri"/>
+          <w:sz w:val="21"/>
+        </w:rPr>
+        <w:t>combine contribution magnitude with released pedigree scores to prioritize</w:t>
+      </w:r>
+    </w:p>
+    <w:p>
+      <w:r>
+        <w:rPr>
+          <w:rFonts w:ascii="Calibri" w:hAnsi="Calibri"/>
+          <w:sz w:val="21"/>
+        </w:rPr>
+        <w:t>the next experiments and inventories; and</w:t>
+      </w:r>
+    </w:p>
+    <w:p>
+      <w:pPr>
+        <w:pStyle w:val="ListNumber"/>
+      </w:pPr>
+      <w:r>
+        <w:rPr>
+          <w:rFonts w:ascii="Calibri" w:hAnsi="Calibri"/>
+          <w:sz w:val="21"/>
+        </w:rPr>
+        <w:t>prevent numerical outputs from being communicated beyond the evidence that</w:t>
+      </w:r>
+    </w:p>
+    <w:p>
+      <w:r>
+        <w:rPr>
+          <w:rFonts w:ascii="Calibri" w:hAnsi="Calibri"/>
+          <w:sz w:val="21"/>
+        </w:rPr>
+        <w:t>supports them.</w:t>
       </w:r>
     </w:p>
     <w:p>
@@ -290,8 +492,8 @@
       <w:r>
         <w:drawing>
           <wp:inline xmlns:a="http://schemas.openxmlformats.org/drawingml/2006/main" xmlns:pic="http://schemas.openxmlformats.org/drawingml/2006/picture">
-            <wp:extent cx="5897880" cy="3540823"/>
-            <wp:docPr id="1" name="Picture 1" descr="Figure 1. OpenDC-LCA evidence-to-decision workflow. Panel (a) connects heterogeneous published, public, laboratory, and simulated evidence to a registered and validated scenario package. Panel (b) connects the common package to static, temporal, uncertainty, and sensitivity engines; a scientific audit blocks comparative claims when evidence or compatibility requirements are not met." title="OpenDC-LCA Figure 1"/>
+            <wp:extent cx="5897880" cy="3394463"/>
+            <wp:docPr id="1" name="Picture 1" descr="Figure 1. OpenDC-LCA evidence-to-decision architecture. The evidence atlas identifies the numerical role and limits of each downloaded source; the harmonization spine preserves provenance, functional unit, bounded transformations, uncertainty and evidence status; decision-facing outputs expose arithmetic reconstruction, geographic crossover conditions, data-improvement priorities and the next experimental or inventory need." title="OpenDC-LCA Figure 1"/>
             <wp:cNvGraphicFramePr>
               <a:graphicFrameLocks noChangeAspect="1"/>
             </wp:cNvGraphicFramePr>
@@ -311,7 +513,7 @@
                   <pic:spPr>
                     <a:xfrm>
                       <a:off x="0" y="0"/>
-                      <a:ext cx="5897880" cy="3540823"/>
+                      <a:ext cx="5897880" cy="3394463"/>
                     </a:xfrm>
                     <a:prstGeom prst="rect"/>
                   </pic:spPr>
@@ -331,7 +533,7 @@
           <w:rFonts w:ascii="Calibri" w:hAnsi="Calibri"/>
           <w:sz w:val="18"/>
         </w:rPr>
-        <w:t>Figure 1. OpenDC-LCA evidence-to-decision workflow. Panel (a) connects heterogeneous published, public, laboratory, and simulated evidence to a registered and validated scenario package. Panel (b) connects the common package to static, temporal, uncertainty, and sensitivity engines; a scientific audit blocks comparative claims when evidence or compatibility requirements are not met.</w:t>
+        <w:t>Figure 1. OpenDC-LCA evidence-to-decision architecture. The evidence atlas identifies the numerical role and limits of each downloaded source; the harmonization spine preserves provenance, functional unit, bounded transformations, uncertainty and evidence status; decision-facing outputs expose arithmetic reconstruction, geographic crossover conditions, data-improvement priorities and the next experimental or inventory need.</w:t>
       </w:r>
     </w:p>
     <w:p>
@@ -577,7 +779,7 @@
         <w:pStyle w:val="Heading2"/>
       </w:pPr>
       <w:r>
-        <w:t>2.4. Performance-map and temporal integration</w:t>
+        <w:t>2.4. Multi-source evidence synthesis</w:t>
       </w:r>
     </w:p>
     <w:p>
@@ -586,16 +788,7 @@
           <w:rFonts w:ascii="Calibri" w:hAnsi="Calibri"/>
           <w:sz w:val="21"/>
         </w:rPr>
-        <w:t>Each performance-map row records architecture, test identifier, IT load, heat removed, coolant temperatures, flow, pressure drop, pump power, fan power, CDU power, heat-rejection power, on-site water rate, dry- and wet-bulb temperature, duration, measurement uncertainty, and source identifier. Aggregate metrics are energy-weighted rather than arithmetic averages of ratios.</w:t>
-      </w:r>
-    </w:p>
-    <w:p>
-      <w:r>
-        <w:rPr>
-          <w:rFonts w:ascii="Calibri" w:hAnsi="Calibri"/>
-          <w:sz w:val="21"/>
-        </w:rPr>
-        <w:t>The measurement-ready interface uses a complete rectangular surface over IT load P and ambient dry-bulb temperature T. For a query point inside one cell of the measured grid, cooling power is evaluated by bilinear interpolation:</w:t>
+        <w:t>The Microsoft/WSP normalized GHG workbook reports use-phase and embodied contributions for a U.S. grid case and a 100% renewable case. To test geographic transferability without asserting access to the proprietary background model, we used an affine re-basing. For technology j, eGRID state s, and the generation-weighted national eGRID factor EF_US,</w:t>
       </w:r>
     </w:p>
     <w:p>
@@ -611,7 +804,7 @@
           <w:color w:val="17324D"/>
           <w:sz w:val="21"/>
         </w:rPr>
-        <w:t>Q_c(P,T) = (1-α)(1-β)Q_11 + α(1-β)Q_21 + (1-α)βQ_12 + αβQ_22          (7)</w:t>
+        <w:t>I_j,s = I_j,RE + (I_j,grid - I_j,RE) EF_s / EF_US                       (7)</w:t>
       </w:r>
     </w:p>
     <w:p>
@@ -620,16 +813,7 @@
           <w:rFonts w:ascii="Calibri" w:hAnsi="Calibri"/>
           <w:sz w:val="21"/>
         </w:rPr>
-        <w:t>where α=(P-P_1)/(P_2-P_1) and β=(T-T_1)/(T_2-T_1). The same operation is applied to on-site water rate and declared measurement uncertainty. Queries outside the measured domain are rejected; the software does not silently extrapolate.</w:t>
-      </w:r>
-    </w:p>
-    <w:p>
-      <w:r>
-        <w:rPr>
-          <w:rFonts w:ascii="Calibri" w:hAnsi="Calibri"/>
-          <w:sz w:val="21"/>
-        </w:rPr>
-        <w:t>For hour h, partial PUE and normalized operational GHG are</w:t>
+        <w:t>The published grid and renewable endpoints are therefore reproduced at ratios one and zero, respectively. This is a screening transformation, not a claim that all upstream electricity impacts scale with direct eGRID CO2e. State records with missing or nonpositive generation were excluded. The crossover between technologies a and b follows by equating the two affine relationships:</w:t>
       </w:r>
     </w:p>
     <w:p>
@@ -645,7 +829,16 @@
           <w:color w:val="17324D"/>
           <w:sz w:val="21"/>
         </w:rPr>
-        <w:t>PUE_h = 1 + Q_c,h / P_IT,h                                              (8)</w:t>
+        <w:t>EF*_(a,b) = EF_US (I_b,RE - I_a,RE) / [(I_a,grid-I_a,RE) - (I_b,grid-I_b,RE)]  (8)</w:t>
+      </w:r>
+    </w:p>
+    <w:p>
+      <w:r>
+        <w:rPr>
+          <w:rFonts w:ascii="Calibri" w:hAnsi="Calibri"/>
+          <w:sz w:val="21"/>
+        </w:rPr>
+        <w:t>To translate the released pedigree matrix into a research priority, each component's mean grid-case GHG contribution share \bar{s_c was multiplied by its normalized mean pedigree weakness. With pedigree score q=1 best and q=5 worst,</w:t>
       </w:r>
     </w:p>
     <w:p>
@@ -661,7 +854,7 @@
           <w:color w:val="17324D"/>
           <w:sz w:val="21"/>
         </w:rPr>
-        <w:t>GHG_op = [Σ_h E_IT,h PUE_h EF_grid,h] / [Σ_h E_IT,h]                   (9)</w:t>
+        <w:t>P_c = S_c [(D_c - 1) / 4]                                              (9)</w:t>
       </w:r>
     </w:p>
     <w:p>
@@ -670,7 +863,31 @@
           <w:rFonts w:ascii="Calibri" w:hAnsi="Calibri"/>
           <w:sz w:val="21"/>
         </w:rPr>
-        <w:t>The current public-data demonstration uses an annual location-based EPA eGRID factor rather than an hourly or marginal factor. Weather observations are from a NOAA typical meteorological year (TMY) file [5,6].</w:t>
+        <w:t>P_c is a transparent screening diagnostic, not a formal expected value of information. It ranks data that are simultaneously consequential in the released model and weak according to the released assessment.</w:t>
+      </w:r>
+    </w:p>
+    <w:p>
+      <w:r>
+        <w:rPr>
+          <w:rFonts w:ascii="Calibri" w:hAnsi="Calibri"/>
+          <w:sz w:val="21"/>
+        </w:rPr>
+        <w:t xml:space="preserve">Boavizta records were filtered to </w:t>
+      </w:r>
+      <w:r>
+        <w:rPr>
+          <w:rFonts w:ascii="Courier New" w:hAnsi="Courier New"/>
+          <w:color w:val="17324D"/>
+          <w:sz w:val="20"/>
+        </w:rPr>
+        <w:t>Datacenter/Server</w:t>
+      </w:r>
+      <w:r>
+        <w:rPr>
+          <w:rFonts w:ascii="Calibri" w:hAnsi="Calibri"/>
+          <w:sz w:val="21"/>
+        </w:rPr>
+        <w:t xml:space="preserve"> products with total GHG, manufacturing share and lifetime. Manufacturing GHG was calculated as total product GHG multiplied by the reported manufacturing share and was not mixed with the Microsoft Vcore-year results. ÖKOBAUDAT A1-A3 processes were compared within matched product families using 100(1-I_alt/I_base). These per-kilogram reductions were not propagated to a facility because the necessary architecture-specific material quantities are not public.</w:t>
       </w:r>
     </w:p>
     <w:p>
@@ -678,7 +895,7 @@
         <w:pStyle w:val="Heading2"/>
       </w:pPr>
       <w:r>
-        <w:t>2.5. Uncertainty, sensitivity, and scientific audit</w:t>
+        <w:t>2.5. Performance-map and temporal integration</w:t>
       </w:r>
     </w:p>
     <w:p>
@@ -687,7 +904,7 @@
           <w:rFonts w:ascii="Calibri" w:hAnsi="Calibri"/>
           <w:sz w:val="21"/>
         </w:rPr>
-        <w:t>OpenDC-LCA supports seeded Monte Carlo screening with uniform, triangular, normal, and lognormal distributions for selected continuous parameters. Independent sampling improves reproducibility but does not represent correlation, systematic measurement bias, or model-form uncertainty. One-at-a-time elasticity identifies influential inputs but should not be interpreted as a global sensitivity analysis.</w:t>
+        <w:t>Each performance-map row records architecture, test identifier, IT load, heat removed, coolant temperatures, flow, pressure drop, pump power, fan power, CDU power, heat-rejection power, on-site water rate, dry- and wet-bulb temperature, duration, measurement uncertainty, and source identifier. Aggregate metrics are energy-weighted rather than arithmetic averages of ratios.</w:t>
       </w:r>
     </w:p>
     <w:p>
@@ -696,48 +913,7 @@
           <w:rFonts w:ascii="Calibri" w:hAnsi="Calibri"/>
           <w:sz w:val="21"/>
         </w:rPr>
-        <w:t>The audit operates on scientific as well as numerical requirements. It checks source completeness, duplicate identifiers, physical values, functional unit, boundary description, evidence status, uncertainty disclosure, and comparative assertion intent. Synthetic or illustrative data must set the comparative assertion to false. A public comparative claim additionally requires decision-grade provenance, consistent boundaries, quantified uncertainty, and independent critical review consistent with the intent of ISO 14040 and ISO 14044 [7,8]. The automated audit supports review but is not an ISO conformity assessment.</w:t>
-      </w:r>
-    </w:p>
-    <w:p>
-      <w:pPr>
-        <w:pStyle w:val="Heading2"/>
-      </w:pPr>
-      <w:r>
-        <w:t>2.6. Inventory interoperability and reliability</w:t>
-      </w:r>
-    </w:p>
-    <w:p>
-      <w:r>
-        <w:rPr>
-          <w:rFonts w:ascii="Calibri" w:hAnsi="Calibri"/>
-          <w:sz w:val="21"/>
-        </w:rPr>
-        <w:t xml:space="preserve">OpenDC-LCA reads complete openLCA JSON-LD process exchanges, including flow and provider identifiers, flow type, amount, unit, direction, and quantitative reference. The same records map to dictionaries accepted by </w:t>
-      </w:r>
-      <w:r>
-        <w:rPr>
-          <w:rFonts w:ascii="Courier New" w:hAnsi="Courier New"/>
-          <w:color w:val="17324D"/>
-          <w:sz w:val="20"/>
-        </w:rPr>
-        <w:t>bw2data.Database.write</w:t>
-      </w:r>
-      <w:r>
-        <w:rPr>
-          <w:rFonts w:ascii="Calibri" w:hAnsi="Calibri"/>
-          <w:sz w:val="21"/>
-        </w:rPr>
-        <w:t>. Conversely, an OpenDC-LCA scenario can be exported as an annual foreground unit process containing delivered IT service, facility electricity, on-site water, and equipment exchanges. LCIA factors are not misrepresented as elementary flows; background providers, elementary-flow mapping, and impact methods remain explicit tasks in openLCA or Brightway.</w:t>
-      </w:r>
-    </w:p>
-    <w:p>
-      <w:r>
-        <w:rPr>
-          <w:rFonts w:ascii="Calibri" w:hAnsi="Calibri"/>
-          <w:sz w:val="21"/>
-        </w:rPr>
-        <w:t>For a component with Weibull characteristic life \eta and shape β, the first-failure distribution is</w:t>
+        <w:t>The measurement-ready interface uses a complete rectangular surface over IT load P and ambient dry-bulb temperature T. For a query point inside one cell of the measured grid, cooling power is evaluated by bilinear interpolation:</w:t>
       </w:r>
     </w:p>
     <w:p>
@@ -753,7 +929,7 @@
           <w:color w:val="17324D"/>
           <w:sz w:val="21"/>
         </w:rPr>
-        <w:t>F(t) = 1 - exp[-(t / eta)^beta]                                      (10)</w:t>
+        <w:t>Q_c(P,T) = (1-α)(1-β)Q_11 + α(1-β)Q_21 + (1-α)βQ_12 + αβQ_22         (10)</w:t>
       </w:r>
     </w:p>
     <w:p>
@@ -762,7 +938,16 @@
           <w:rFonts w:ascii="Calibri" w:hAnsi="Calibri"/>
           <w:sz w:val="21"/>
         </w:rPr>
-        <w:t>Expected failures after as-good-as-new replacement are obtained from the renewal equation</w:t>
+        <w:t>where α=(P-P_1)/(P_2-P_1) and β=(T-T_1)/(T_2-T_1). The same operation is applied to on-site water rate and declared measurement uncertainty. Queries outside the measured domain are rejected; the software does not silently extrapolate.</w:t>
+      </w:r>
+    </w:p>
+    <w:p>
+      <w:r>
+        <w:rPr>
+          <w:rFonts w:ascii="Calibri" w:hAnsi="Calibri"/>
+          <w:sz w:val="21"/>
+        </w:rPr>
+        <w:t>For hour h, partial PUE and normalized operational GHG are</w:t>
       </w:r>
     </w:p>
     <w:p>
@@ -778,16 +963,7 @@
           <w:color w:val="17324D"/>
           <w:sz w:val="21"/>
         </w:rPr>
-        <w:t>M(t) = F(t) + integral[0,t] M(t-x) dF(x)                              (11)</w:t>
-      </w:r>
-    </w:p>
-    <w:p>
-      <w:r>
-        <w:rPr>
-          <w:rFonts w:ascii="Calibri" w:hAnsi="Calibri"/>
-          <w:sz w:val="21"/>
-        </w:rPr>
-        <w:t>An optional Arrhenius acceleration adjusts characteristic life from reference temperature T_ref to operating temperature T_op:</w:t>
+        <w:t>PUE_h = 1 + Q_c,h / P_IT,h                                            (11)</w:t>
       </w:r>
     </w:p>
     <w:p>
@@ -803,7 +979,149 @@
           <w:color w:val="17324D"/>
           <w:sz w:val="21"/>
         </w:rPr>
-        <w:t>eta_op = eta_ref / exp[Ea/kB (1/T_ref - 1/T_op)]                      (12)</w:t>
+        <w:t>GHG_op = [Σ_h E_IT,h PUE_h EF_grid,h] / [Σ_h E_IT,h]                 (12)</w:t>
+      </w:r>
+    </w:p>
+    <w:p>
+      <w:r>
+        <w:rPr>
+          <w:rFonts w:ascii="Calibri" w:hAnsi="Calibri"/>
+          <w:sz w:val="21"/>
+        </w:rPr>
+        <w:t>The current public-data demonstration uses an annual location-based EPA eGRID factor rather than an hourly or marginal factor. Weather observations are from a NOAA typical meteorological year (TMY) file [5,6].</w:t>
+      </w:r>
+    </w:p>
+    <w:p>
+      <w:pPr>
+        <w:pStyle w:val="Heading2"/>
+      </w:pPr>
+      <w:r>
+        <w:t>2.6. Uncertainty, sensitivity, and scientific audit</w:t>
+      </w:r>
+    </w:p>
+    <w:p>
+      <w:r>
+        <w:rPr>
+          <w:rFonts w:ascii="Calibri" w:hAnsi="Calibri"/>
+          <w:sz w:val="21"/>
+        </w:rPr>
+        <w:t>OpenDC-LCA supports seeded Monte Carlo screening with uniform, triangular, normal, and lognormal distributions for selected continuous parameters. Independent sampling improves reproducibility but does not represent correlation, systematic measurement bias, or model-form uncertainty. One-at-a-time elasticity identifies influential inputs but should not be interpreted as a global sensitivity analysis.</w:t>
+      </w:r>
+    </w:p>
+    <w:p>
+      <w:r>
+        <w:rPr>
+          <w:rFonts w:ascii="Calibri" w:hAnsi="Calibri"/>
+          <w:sz w:val="21"/>
+        </w:rPr>
+        <w:t>The audit operates on scientific as well as numerical requirements. It checks source completeness, duplicate identifiers, physical values, functional unit, boundary description, evidence status, uncertainty disclosure, and comparative assertion intent. Synthetic or illustrative data must set the comparative assertion to false. A public comparative claim additionally requires decision-grade provenance, consistent boundaries, quantified uncertainty, and independent critical review consistent with the intent of ISO 14040 and ISO 14044 [7,8]. The automated audit supports review but is not an ISO conformity assessment.</w:t>
+      </w:r>
+    </w:p>
+    <w:p>
+      <w:pPr>
+        <w:pStyle w:val="Heading2"/>
+      </w:pPr>
+      <w:r>
+        <w:t>2.7. Inventory interoperability and reliability</w:t>
+      </w:r>
+    </w:p>
+    <w:p>
+      <w:r>
+        <w:rPr>
+          <w:rFonts w:ascii="Calibri" w:hAnsi="Calibri"/>
+          <w:sz w:val="21"/>
+        </w:rPr>
+        <w:t xml:space="preserve">OpenDC-LCA reads complete openLCA JSON-LD process exchanges, including flow and provider identifiers, flow type, amount, unit, direction, and quantitative reference. The same records map to dictionaries accepted by </w:t>
+      </w:r>
+      <w:r>
+        <w:rPr>
+          <w:rFonts w:ascii="Courier New" w:hAnsi="Courier New"/>
+          <w:color w:val="17324D"/>
+          <w:sz w:val="20"/>
+        </w:rPr>
+        <w:t>bw2data.Database.write</w:t>
+      </w:r>
+      <w:r>
+        <w:rPr>
+          <w:rFonts w:ascii="Calibri" w:hAnsi="Calibri"/>
+          <w:sz w:val="21"/>
+        </w:rPr>
+        <w:t>. Conversely, an OpenDC-LCA scenario can be exported as an annual foreground unit process containing delivered IT service, facility electricity, on-site water, and equipment exchanges. LCIA factors are not misrepresented as elementary flows; background providers, elementary-flow mapping, and impact methods remain explicit tasks in openLCA or Brightway.</w:t>
+      </w:r>
+    </w:p>
+    <w:p>
+      <w:r>
+        <w:rPr>
+          <w:rFonts w:ascii="Calibri" w:hAnsi="Calibri"/>
+          <w:sz w:val="21"/>
+        </w:rPr>
+        <w:t>For a component with Weibull characteristic life \eta and shape β, the first-failure distribution is</w:t>
+      </w:r>
+    </w:p>
+    <w:p>
+      <w:pPr>
+        <w:keepLines/>
+        <w:spacing w:before="80" w:after="140"/>
+        <w:jc w:val="center"/>
+      </w:pPr>
+      <w:r>
+        <w:rPr>
+          <w:rFonts w:ascii="Cambria Math" w:hAnsi="Cambria Math"/>
+          <w:i/>
+          <w:color w:val="17324D"/>
+          <w:sz w:val="21"/>
+        </w:rPr>
+        <w:t>F(t) = 1 - exp[-(t / eta)^beta]                                      (13)</w:t>
+      </w:r>
+    </w:p>
+    <w:p>
+      <w:r>
+        <w:rPr>
+          <w:rFonts w:ascii="Calibri" w:hAnsi="Calibri"/>
+          <w:sz w:val="21"/>
+        </w:rPr>
+        <w:t>Expected failures after as-good-as-new replacement are obtained from the renewal equation</w:t>
+      </w:r>
+    </w:p>
+    <w:p>
+      <w:pPr>
+        <w:keepLines/>
+        <w:spacing w:before="80" w:after="140"/>
+        <w:jc w:val="center"/>
+      </w:pPr>
+      <w:r>
+        <w:rPr>
+          <w:rFonts w:ascii="Cambria Math" w:hAnsi="Cambria Math"/>
+          <w:i/>
+          <w:color w:val="17324D"/>
+          <w:sz w:val="21"/>
+        </w:rPr>
+        <w:t>M(t) = F(t) + integral[0,t] M(t-x) dF(x)                              (14)</w:t>
+      </w:r>
+    </w:p>
+    <w:p>
+      <w:r>
+        <w:rPr>
+          <w:rFonts w:ascii="Calibri" w:hAnsi="Calibri"/>
+          <w:sz w:val="21"/>
+        </w:rPr>
+        <w:t>An optional Arrhenius acceleration adjusts characteristic life from reference temperature T_ref to operating temperature T_op:</w:t>
+      </w:r>
+    </w:p>
+    <w:p>
+      <w:pPr>
+        <w:keepLines/>
+        <w:spacing w:before="80" w:after="140"/>
+        <w:jc w:val="center"/>
+      </w:pPr>
+      <w:r>
+        <w:rPr>
+          <w:rFonts w:ascii="Cambria Math" w:hAnsi="Cambria Math"/>
+          <w:i/>
+          <w:color w:val="17324D"/>
+          <w:sz w:val="21"/>
+        </w:rPr>
+        <w:t>eta_op = eta_ref / exp[Ea/kB (1/T_ref - 1/T_op)]                      (15)</w:t>
       </w:r>
     </w:p>
     <w:p>
@@ -845,7 +1163,7 @@
         <w:pStyle w:val="Heading2"/>
       </w:pPr>
       <w:r>
-        <w:t>3.2. Public grid and climate data</w:t>
+        <w:t>3.2. EPA eGRID geographic transfer case</w:t>
       </w:r>
     </w:p>
     <w:p>
@@ -854,7 +1172,22 @@
           <w:rFonts w:ascii="Calibri" w:hAnsi="Calibri"/>
           <w:sz w:val="21"/>
         </w:rPr>
-        <w:t xml:space="preserve">EPA eGRID 2023 supplied the Arkansas state total-output emission rate </w:t>
+        <w:t>The metric eGRID 2023 workbook supplied state net generation (</w:t>
+      </w:r>
+      <w:r>
+        <w:rPr>
+          <w:rFonts w:ascii="Courier New" w:hAnsi="Courier New"/>
+          <w:color w:val="17324D"/>
+          <w:sz w:val="20"/>
+        </w:rPr>
+        <w:t>STNGENAN</w:t>
+      </w:r>
+      <w:r>
+        <w:rPr>
+          <w:rFonts w:ascii="Calibri" w:hAnsi="Calibri"/>
+          <w:sz w:val="21"/>
+        </w:rPr>
+        <w:t>) and state annual CO2-equivalent total-output emission rate (</w:t>
       </w:r>
       <w:r>
         <w:rPr>
@@ -869,7 +1202,7 @@
           <w:rFonts w:ascii="Calibri" w:hAnsi="Calibri"/>
           <w:sz w:val="21"/>
         </w:rPr>
-        <w:t>, 452.881 kg CO2e per MWh [5]. This annual factor is location-based and cannot be interpreted as marginal, hourly, or market-based. NOAA TMY data for the station nearest Fayetteville supplied 8,760 hourly weather observations [6]. The hourly preview combined these observations with explicit piecewise-linear temperature-PUE hypotheses. These curves are not measurements.</w:t>
+        <w:t>) [5]. The analysis included 50 states and the District of Columbia. The generation-weighted mean was 348.194 kg CO2e MWh−1 and the observed state range was 23.696-893.079 kg CO2e MWh−1. These are annual, location-based factors; they are not marginal, hourly or market-based. The factors were used only in the affine re-basing of Eq. (7).</w:t>
       </w:r>
     </w:p>
     <w:p>
@@ -877,7 +1210,7 @@
         <w:pStyle w:val="Heading2"/>
       </w:pPr>
       <w:r>
-        <w:t>3.3. Measurement-surface software fixtures</w:t>
+        <w:t>3.3. Boavizta server product-footprint case</w:t>
       </w:r>
     </w:p>
     <w:p>
@@ -886,7 +1219,82 @@
           <w:rFonts w:ascii="Calibri" w:hAnsi="Calibri"/>
           <w:sz w:val="21"/>
         </w:rPr>
-        <w:t xml:space="preserve">Complete air-cooled and direct-to-chip load-temperature surfaces were generated as synthetic fixtures to test input validation, bilinear interpolation, uncertainty bounds, hourly workload-weather alignment, and annual aggregation. Both datasets carry </w:t>
+        <w:t xml:space="preserve">The downloaded U.S. Boavizta table contained 1,226 ICT product records. We retained 48 </w:t>
+      </w:r>
+      <w:r>
+        <w:rPr>
+          <w:rFonts w:ascii="Courier New" w:hAnsi="Courier New"/>
+          <w:color w:val="17324D"/>
+          <w:sz w:val="20"/>
+        </w:rPr>
+        <w:t>Datacenter/Server</w:t>
+      </w:r>
+      <w:r>
+        <w:rPr>
+          <w:rFonts w:ascii="Calibri" w:hAnsi="Calibri"/>
+          <w:sz w:val="21"/>
+        </w:rPr>
+        <w:t xml:space="preserve"> records having total GHG, manufacturing share and declared lifetime [11]. Each record retains manufacturer, product, report date and source URL. Product carbon footprints were developed by different manufacturers and may differ in boundary, electricity, allocation and use assumptions. The distribution therefore measures public-factor dispersion; it is not a like-for-like server ranking.</w:t>
+      </w:r>
+    </w:p>
+    <w:p>
+      <w:pPr>
+        <w:pStyle w:val="Heading2"/>
+      </w:pPr>
+      <w:r>
+        <w:t>3.4. ÖKOBAUDAT construction-process case</w:t>
+      </w:r>
+    </w:p>
+    <w:p>
+      <w:r>
+        <w:rPr>
+          <w:rFonts w:ascii="Calibri" w:hAnsi="Calibri"/>
+          <w:sz w:val="21"/>
+        </w:rPr>
+        <w:t>Six selected ÖKOBAUDAT 2024-II generic A1-A3 records retained UUID, product name, geography, reference year, unit and URL [10]. Matched comparisons were made between galvanized steel profiles using high-scrap electric-arc-furnace and low-scrap blast-furnace routes, and between CEM III and CEM II/A cement. Ready-mix concrete records were registered but not compared across mass units because their reference unit is cubic metre. No construction factor was added to a data-center total without a foreground quantity.</w:t>
+      </w:r>
+    </w:p>
+    <w:p>
+      <w:pPr>
+        <w:pStyle w:val="Heading2"/>
+      </w:pPr>
+      <w:r>
+        <w:t>3.5. Released pedigree assessment</w:t>
+      </w:r>
+    </w:p>
+    <w:p>
+      <w:r>
+        <w:rPr>
+          <w:rFonts w:ascii="Calibri" w:hAnsi="Calibri"/>
+          <w:sz w:val="21"/>
+        </w:rPr>
+        <w:t>The Microsoft/WSP workbook contains five scores for each of nine component groups: reliability, completeness, temporal correlation, geographical correlation and technological correlation. Scores range from 1 (best) to 5 (worst). Forty-five component-criterion records were parsed with their full released rationales and combined with mean grid-case GHG contribution shares using Eq. (9).</w:t>
+      </w:r>
+    </w:p>
+    <w:p>
+      <w:pPr>
+        <w:pStyle w:val="Heading2"/>
+      </w:pPr>
+      <w:r>
+        <w:t>3.6. Climate and measurement-surface software cases</w:t>
+      </w:r>
+    </w:p>
+    <w:p>
+      <w:r>
+        <w:rPr>
+          <w:rFonts w:ascii="Calibri" w:hAnsi="Calibri"/>
+          <w:sz w:val="21"/>
+        </w:rPr>
+        <w:t>NOAA TMY data for the station nearest Fayetteville supplied 8,760 hourly weather observations [6]. The public preview combined these observations with explicit piecewise-linear temperature-PUE hypotheses. Complete air-cooled and direct-to-chip load-temperature surfaces were also generated as synthetic fixtures to test input validation, bilinear interpolation, uncertainty bounds, hourly workload-weather alignment and annual aggregation. These curves and surfaces are not measurements.</w:t>
+      </w:r>
+    </w:p>
+    <w:p>
+      <w:r>
+        <w:rPr>
+          <w:rFonts w:ascii="Calibri" w:hAnsi="Calibri"/>
+          <w:sz w:val="21"/>
+        </w:rPr>
+        <w:t xml:space="preserve">Both datasets carry </w:t>
       </w:r>
       <w:r>
         <w:rPr>
@@ -924,7 +1332,7 @@
         <w:pStyle w:val="Heading2"/>
       </w:pPr>
       <w:r>
-        <w:t>3.4. Additional registered evidence</w:t>
+        <w:t>3.7. Registered but not numerically combined evidence</w:t>
       </w:r>
     </w:p>
     <w:p>
@@ -933,7 +1341,7 @@
           <w:rFonts w:ascii="Calibri" w:hAnsi="Calibri"/>
           <w:sz w:val="21"/>
         </w:rPr>
-        <w:t xml:space="preserve">The source registry also documents USLCI v1.2026-06.0, ÖKOBAUDAT 2024-II, Boavizta ICT factors, seven NREL hydrogen datasets accessed through GLAD and the Federal LCA Commons, and USGS watershed data [9-13]. These sources establish inputs for equipment, building, backup-power, embodied ICT, and water context. The seven GLAD archives can now be read as complete openLCA JSON-LD inventories and mapped to Brightway; the </w:t>
+        <w:t xml:space="preserve">The source registry also documents USLCI v1.2026-06.0, ÖKOBAUDAT 2024-II, seven NREL hydrogen datasets accessed through GLAD and the Federal LCA Commons, and USGS watershed data [9,12,13]. These sources establish potential inputs for equipment, backup power and water context. The seven GLAD archives can now be read as complete openLCA JSON-LD inventories and mapped to Brightway; the </w:t>
       </w:r>
       <w:r>
         <w:rPr>
@@ -948,7 +1356,7 @@
           <w:rFonts w:ascii="Calibri" w:hAnsi="Calibri"/>
           <w:sz w:val="21"/>
         </w:rPr>
-        <w:t xml:space="preserve"> USLCI backup must first be exported from openLCA as portable JSON-LD. Registration or successful exchange does not make datasets automatically compatible; geography, reference year, unit, product system, impact method, and allocation must be harmonized for each study.</w:t>
+        <w:t xml:space="preserve"> USLCI backup must first be exported from openLCA as portable JSON-LD. Registration or successful exchange does not make datasets automatically compatible; geography, reference year, unit, product system, impact method, and allocation must be harmonized for each study. No numerical LCIA result was calculated from GLAD or USLCI because providers and characterization methods have not yet been linked. The USGS HU12 archive supplies watershed boundaries, not water consumption or AWARE factors, and therefore cannot support a scarcity result.</w:t>
       </w:r>
     </w:p>
     <w:p>
@@ -1043,7 +1451,7 @@
         <w:pStyle w:val="Heading2"/>
       </w:pPr>
       <w:r>
-        <w:t>4.2. Hourly climate-performance preview</w:t>
+        <w:t>4.2. Grid intensity changes the cold-plate/one-phase ranking</w:t>
       </w:r>
     </w:p>
     <w:p>
@@ -1052,7 +1460,7 @@
           <w:rFonts w:ascii="Calibri" w:hAnsi="Calibri"/>
           <w:sz w:val="21"/>
         </w:rPr>
-        <w:t>The Fayetteville TMY ranged from cool winter conditions to hot summer conditions, producing distinct monthly means under the assumed temperature-PUE curves (Figure 3). Annual mean PUE values were 1.0907 for air cooling, 1.0529 for cold plate, 1.0406 for one-phase immersion, and 1.0352 for two-phase immersion.</w:t>
+        <w:t>Figure 3 applies Eq. (7) to the 51 eGRID state/DC records. The modeled cold-plate and one-phase totals intersect at 60.8 kg CO2e MWh−1, within the observed 23.7-893.1 kg CO2e MWh−1 state range. Cold plate was lower than one-phase immersion only for Vermont (23.7 kg CO2e MWh−1); one-phase was lower for the other 50 records. At the Arkansas factor (452.9 kg CO2e MWh−1), one-phase was lower than cold plate by 0.617 kg CO2e Vcore−1 yr−1. Two-phase immersion remained the lowest-GHG architecture in all 51 re-based cases under the released assumptions.</w:t>
       </w:r>
     </w:p>
     <w:p>
@@ -1064,8 +1472,8 @@
       <w:r>
         <w:drawing>
           <wp:inline xmlns:a="http://schemas.openxmlformats.org/drawingml/2006/main" xmlns:pic="http://schemas.openxmlformats.org/drawingml/2006/picture">
-            <wp:extent cx="5897880" cy="3409603"/>
-            <wp:docPr id="3" name="Picture 3" descr="Figure 3. Monthly Fayetteville TMY temperature and mean PUE obtained from explicit piecewise-linear response hypotheses. The curves are not measurements; the figure demonstrates the temporal analysis protocol and defines measurements needed for calibration." title="OpenDC-LCA Figure 3"/>
+            <wp:extent cx="5897880" cy="3372417"/>
+            <wp:docPr id="3" name="Picture 3" descr="Figure 3. Screening re-basing of the released Microsoft/WSP GHG contributions across EPA eGRID 2023 state total-output intensities. The vertical dashed line marks the cold-plate/one-phase crossover near 61 kg CO2e MWh−1. Lines connect state scenarios and do not represent a dynamic grid trajectory. Two-phase immersion remains lowest under the released foreground assumptions." title="OpenDC-LCA Figure 3"/>
             <wp:cNvGraphicFramePr>
               <a:graphicFrameLocks noChangeAspect="1"/>
             </wp:cNvGraphicFramePr>
@@ -1073,7 +1481,7 @@
               <a:graphicData uri="http://schemas.openxmlformats.org/drawingml/2006/picture">
                 <pic:pic>
                   <pic:nvPicPr>
-                    <pic:cNvPr id="0" name="figure2_monthly_climate_pue.png"/>
+                    <pic:cNvPr id="0" name="figure2_grid_crossover.png"/>
                     <pic:cNvPicPr/>
                   </pic:nvPicPr>
                   <pic:blipFill>
@@ -1085,7 +1493,7 @@
                   <pic:spPr>
                     <a:xfrm>
                       <a:off x="0" y="0"/>
-                      <a:ext cx="5897880" cy="3409603"/>
+                      <a:ext cx="5897880" cy="3372417"/>
                     </a:xfrm>
                     <a:prstGeom prst="rect"/>
                   </pic:spPr>
@@ -1105,7 +1513,7 @@
           <w:rFonts w:ascii="Calibri" w:hAnsi="Calibri"/>
           <w:sz w:val="18"/>
         </w:rPr>
-        <w:t>Figure 3. Monthly Fayetteville TMY temperature and mean PUE obtained from explicit piecewise-linear response hypotheses. The curves are not measurements; the figure demonstrates the temporal analysis protocol and defines measurements needed for calibration.</w:t>
+        <w:t>Figure 3. Screening re-basing of the released Microsoft/WSP GHG contributions across EPA eGRID 2023 state total-output intensities. The vertical dashed line marks the cold-plate/one-phase crossover near 61 kg CO2e MWh−1. Lines connect state scenarios and do not represent a dynamic grid trajectory. Two-phase immersion remains lowest under the released foreground assumptions.</w:t>
       </w:r>
     </w:p>
     <w:p>
@@ -1114,7 +1522,50 @@
           <w:rFonts w:ascii="Calibri" w:hAnsi="Calibri"/>
           <w:sz w:val="21"/>
         </w:rPr>
-        <w:t>Using the annual Arkansas eGRID factor, the assumed curves produced operational GHG intensities of 493.97, 476.84, 471.27, and 468.82 kg CO2e per delivered IT MWh for air, cold-plate, one-phase, and two-phase cooling, respectively (Figure 4). Relative to the air-cooled hypothesis, the reductions were 3.47%, 4.59%, and 5.09%. These values quantify only the consequences of the stated PUE hypotheses and must not be interpreted as measured architecture performance.</w:t>
+        <w:t>The result has two implications. First, the statement that one liquid-cooling architecture is categorically preferable does not follow from a national- average case: at least one pair changes order within contemporary U.S. grids. Second, grid intensity is not the only determinant. Two-phase immersion remained lowest because the released model combined lower use-phase burden with Vcore-normalized server and building effects. This ranking should not be transferred to fluids, server designs or regulations outside the released foreground assumptions.</w:t>
+      </w:r>
+    </w:p>
+    <w:p>
+      <w:pPr>
+        <w:pStyle w:val="Heading2"/>
+      </w:pPr>
+      <w:r>
+        <w:t>4.3. Decarbonization transfers attention from operation to hardware</w:t>
+      </w:r>
+    </w:p>
+    <w:p>
+      <w:r>
+        <w:rPr>
+          <w:rFonts w:ascii="Calibri" w:hAnsi="Calibri"/>
+          <w:sz w:val="21"/>
+        </w:rPr>
+        <w:t>At the high end of the eGRID state range, embodied contributions were approximately 4.0-4.2% of total GHG across architectures. At the lowest state factor they increased to 56.9-58.2%. Thus, grid decarbonization does not make cooling architecture irrelevant; it changes the evidence required to judge it. PUE and IT power dominate high-carbon locations, whereas server quantity, server lifetime, overclocking, electronics manufacturing and replacement become co-dominant on low-carbon grids.</w:t>
+      </w:r>
+    </w:p>
+    <w:p>
+      <w:r>
+        <w:rPr>
+          <w:rFonts w:ascii="Calibri" w:hAnsi="Calibri"/>
+          <w:sz w:val="21"/>
+        </w:rPr>
+        <w:t>The released endpoints illustrate the same transition. In the grid case, use phase contributed approximately 90% of mean GHG. In the renewable case, the absolute use-phase term fell sharply while the embodied server terms were unchanged. An operational-only comparison can therefore be directionally useful on a carbon-intensive grid but becomes increasingly incomplete as electricity decarbonizes.</w:t>
+      </w:r>
+    </w:p>
+    <w:p>
+      <w:pPr>
+        <w:pStyle w:val="Heading2"/>
+      </w:pPr>
+      <w:r>
+        <w:t>4.4. Contribution-weighted pedigree scores identify the next evidence</w:t>
+      </w:r>
+    </w:p>
+    <w:p>
+      <w:r>
+        <w:rPr>
+          <w:rFonts w:ascii="Calibri" w:hAnsi="Calibri"/>
+          <w:sz w:val="21"/>
+        </w:rPr>
+        <w:t>The released pedigree assessment alone assigns the weakest average score to networking equipment (3.6/5), followed by storage servers (2.8/5). Weakness alone, however, would prioritize a small contributor. Multiplying weakness by mean GHG contribution changed the order (Figure 4). Use phase ranked first because its 90.3% mean contribution outweighed a relatively good 1.4/5 pedigree score. Storage, networking and compute-server evidence formed the next tier with nearly equal priority indices (0.0127-0.0129).</w:t>
       </w:r>
     </w:p>
     <w:p>
@@ -1126,8 +1577,8 @@
       <w:r>
         <w:drawing>
           <wp:inline xmlns:a="http://schemas.openxmlformats.org/drawingml/2006/main" xmlns:pic="http://schemas.openxmlformats.org/drawingml/2006/picture">
-            <wp:extent cx="5897880" cy="3409603"/>
-            <wp:docPr id="4" name="Picture 4" descr="Figure 4. Operational GHG intensity calculated from the Fayetteville TMY, hypothetical temperature-PUE curves, and the EPA eGRID 2023 Arkansas annual total-output factor. Results are hypothesis-generating and exclude embodied impacts." title="OpenDC-LCA Figure 4"/>
+            <wp:extent cx="5897880" cy="3374064"/>
+            <wp:docPr id="4" name="Picture 4" descr="Figure 4. Contribution-weighted evidence-improvement priority derived from the released Microsoft/WSP grid-case GHG contributions and pedigree matrix. The diagnostic multiplies mean contribution share by normalized pedigree weakness; it is a transparent screening rank, not a formal expected value of information." title="OpenDC-LCA Figure 4"/>
             <wp:cNvGraphicFramePr>
               <a:graphicFrameLocks noChangeAspect="1"/>
             </wp:cNvGraphicFramePr>
@@ -1135,7 +1586,7 @@
               <a:graphicData uri="http://schemas.openxmlformats.org/drawingml/2006/picture">
                 <pic:pic>
                   <pic:nvPicPr>
-                    <pic:cNvPr id="0" name="figure3_hourly_operational_ghg.png"/>
+                    <pic:cNvPr id="0" name="figure3_data_priority.png"/>
                     <pic:cNvPicPr/>
                   </pic:nvPicPr>
                   <pic:blipFill>
@@ -1147,7 +1598,7 @@
                   <pic:spPr>
                     <a:xfrm>
                       <a:off x="0" y="0"/>
-                      <a:ext cx="5897880" cy="3409603"/>
+                      <a:ext cx="5897880" cy="3374064"/>
                     </a:xfrm>
                     <a:prstGeom prst="rect"/>
                   </pic:spPr>
@@ -1167,7 +1618,16 @@
           <w:rFonts w:ascii="Calibri" w:hAnsi="Calibri"/>
           <w:sz w:val="18"/>
         </w:rPr>
-        <w:t>Figure 4. Operational GHG intensity calculated from the Fayetteville TMY, hypothetical temperature-PUE curves, and the EPA eGRID 2023 Arkansas annual total-output factor. Results are hypothesis-generating and exclude embodied impacts.</w:t>
+        <w:t>Figure 4. Contribution-weighted evidence-improvement priority derived from the released Microsoft/WSP grid-case GHG contributions and pedigree matrix. The diagnostic multiplies mean contribution share by normalized pedigree weakness; it is a transparent screening rank, not a formal expected value of information.</w:t>
+      </w:r>
+    </w:p>
+    <w:p>
+      <w:r>
+        <w:rPr>
+          <w:rFonts w:ascii="Calibri" w:hAnsi="Calibri"/>
+          <w:sz w:val="21"/>
+        </w:rPr>
+        <w:t>This result separates two research programs. Improving measured PUE, IT power, utilization and water response has the greatest present consequence for grid-powered facilities. Improving server inventories—especially storage and networking proxies—becomes the next priority and grows in importance on cleaner grids. Fluid data remain important for toxicity, regulation, leakage and feasibility even though their released climate contribution is small; the priority index is not a complete environmental, health and safety ranking.</w:t>
       </w:r>
     </w:p>
     <w:p>
@@ -1175,7 +1635,7 @@
         <w:pStyle w:val="Heading2"/>
       </w:pPr>
       <w:r>
-        <w:t>4.3. Measurement-ready surface demonstration</w:t>
+        <w:t>4.5. Public product and construction data quantify uncertainty and leverage</w:t>
       </w:r>
     </w:p>
     <w:p>
@@ -1184,7 +1644,7 @@
           <w:rFonts w:ascii="Calibri" w:hAnsi="Calibri"/>
           <w:sz w:val="21"/>
         </w:rPr>
-        <w:t>The synthetic surfaces supplied complete combinations of load and ambient temperature. The engine integrated 8,760 aligned hourly observations without extrapolation (Figure 5). Both fixtures processed 646,050 kWh of IT electricity. The air-cooled fixture produced 47,308.5 kWh of cooling electricity, 8,137.8 L of on-site water, mean PUE 1.07323, and 486.04 kg CO2e per IT MWh. The direct-to-chip fixture produced 26,209.8 kWh of cooling electricity, 2,170.1 L of water, mean PUE 1.04057, and 471.25 kg CO2e per IT MWh. These numbers verify the computational pathway only.</w:t>
+        <w:t>The 48 usable Boavizta server records yielded manufacturing GHG values from 465 to 2,503 kg CO2e per server, with a median of 1,215 kg CO2e and an interquartile range of 1,146-1,337 kg CO2e (Figure 5). Annualized by the declared four-year lifetime, the median was 304 kg CO2e server−1 yr−1. The approximately 5.4-fold full range is large relative to many reported cooling savings. Because manufacturer PCFs differ in method and configuration, this range is an evidence envelope rather than a product ranking.</w:t>
       </w:r>
     </w:p>
     <w:p>
@@ -1196,8 +1656,8 @@
       <w:r>
         <w:drawing>
           <wp:inline xmlns:a="http://schemas.openxmlformats.org/drawingml/2006/main" xmlns:pic="http://schemas.openxmlformats.org/drawingml/2006/picture">
-            <wp:extent cx="5897880" cy="3280478"/>
-            <wp:docPr id="5" name="Picture 5" descr="Figure 5. Synthetic measurement-surface demonstration connecting hourly weather and workload to interpolated cooling power, PUE, water, and operational GHG. Comparative claims are blocked because both input surfaces are synthetic." title="OpenDC-LCA Figure 5"/>
+            <wp:extent cx="5897880" cy="3374064"/>
+            <wp:docPr id="5" name="Picture 5" descr="Figure 5. Distribution of manufacturing GHG for 48 Boavizta `Datacenter/Server` records having total product GHG and manufacturing share. Dashed lines show the 25th percentile, median and 75th percentile. Heterogeneous manufacturer methods and product configurations preclude a product ranking." title="OpenDC-LCA Figure 5"/>
             <wp:cNvGraphicFramePr>
               <a:graphicFrameLocks noChangeAspect="1"/>
             </wp:cNvGraphicFramePr>
@@ -1205,7 +1665,7 @@
               <a:graphicData uri="http://schemas.openxmlformats.org/drawingml/2006/picture">
                 <pic:pic>
                   <pic:nvPicPr>
-                    <pic:cNvPr id="0" name="figure4_measurement_surface_demo.png"/>
+                    <pic:cNvPr id="0" name="figure4_server_epd_distribution.png"/>
                     <pic:cNvPicPr/>
                   </pic:nvPicPr>
                   <pic:blipFill>
@@ -1217,7 +1677,7 @@
                   <pic:spPr>
                     <a:xfrm>
                       <a:off x="0" y="0"/>
-                      <a:ext cx="5897880" cy="3280478"/>
+                      <a:ext cx="5897880" cy="3374064"/>
                     </a:xfrm>
                     <a:prstGeom prst="rect"/>
                   </pic:spPr>
@@ -1237,7 +1697,22 @@
           <w:rFonts w:ascii="Calibri" w:hAnsi="Calibri"/>
           <w:sz w:val="18"/>
         </w:rPr>
-        <w:t>Figure 5. Synthetic measurement-surface demonstration connecting hourly weather and workload to interpolated cooling power, PUE, water, and operational GHG. Comparative claims are blocked because both input surfaces are synthetic.</w:t>
+        <w:t xml:space="preserve">Figure 5. Distribution of manufacturing GHG for 48 Boavizta </w:t>
+      </w:r>
+      <w:r>
+        <w:rPr>
+          <w:rFonts w:ascii="Courier New" w:hAnsi="Courier New"/>
+          <w:color w:val="17324D"/>
+          <w:sz w:val="17"/>
+        </w:rPr>
+        <w:t>Datacenter/Server</w:t>
+      </w:r>
+      <w:r>
+        <w:rPr>
+          <w:rFonts w:ascii="Calibri" w:hAnsi="Calibri"/>
+          <w:sz w:val="18"/>
+        </w:rPr>
+        <w:t xml:space="preserve"> records having total product GHG and manufacturing share. Dashed lines show the 25th percentile, median and 75th percentile. Heterogeneous manufacturer methods and product configurations preclude a product ranking.</w:t>
       </w:r>
     </w:p>
     <w:p>
@@ -1246,7 +1721,7 @@
           <w:rFonts w:ascii="Calibri" w:hAnsi="Calibri"/>
           <w:sz w:val="21"/>
         </w:rPr>
-        <w:t>Declared measurement uncertainty was propagated to cooling power, producing a PUE interval of 1.06957-1.07689 for the air-cooled fixture and 1.03854-1.04260 for the direct-to-chip fixture. Figure 6 visualizes the performance-surface contract and its bounded interpolation domain.</w:t>
+        <w:t>The selected ÖKOBAUDAT records identified large construction procurement levers (Figure 6). High-scrap electric-arc-furnace galvanized steel had 59.9% lower A1-A3 GHG, 47.9% lower nonrenewable primary energy and 52.0% lower freshwater use than the selected low-scrap blast-furnace profile. CEM III cement had 49.8% lower GHG, 12.1% lower nonrenewable primary energy and 23.5% lower freshwater use than CEM II/A. Their facility significance cannot be calculated without architecture-specific material quantities.</w:t>
       </w:r>
     </w:p>
     <w:p>
@@ -1258,8 +1733,8 @@
       <w:r>
         <w:drawing>
           <wp:inline xmlns:a="http://schemas.openxmlformats.org/drawingml/2006/main" xmlns:pic="http://schemas.openxmlformats.org/drawingml/2006/picture">
-            <wp:extent cx="5897880" cy="3280478"/>
-            <wp:docPr id="6" name="Picture 6" descr="Figure 6. Synthetic load-temperature performance surface used to verify the OpenDC-LCA measurement contract. Bilinear interpolation is allowed only within the complete measured grid; extrapolation is rejected." title="OpenDC-LCA Figure 6"/>
+            <wp:extent cx="5897880" cy="3374064"/>
+            <wp:docPr id="6" name="Picture 6" descr="Figure 6. Selected ÖKOBAUDAT 2024-II A1-A3 GHG factors for baseline and alternative steel and cement routes. The figure identifies unit-process procurement leverage; it does not quantify a data-center reduction because foreground quantities are unavailable." title="OpenDC-LCA Figure 6"/>
             <wp:cNvGraphicFramePr>
               <a:graphicFrameLocks noChangeAspect="1"/>
             </wp:cNvGraphicFramePr>
@@ -1267,7 +1742,7 @@
               <a:graphicData uri="http://schemas.openxmlformats.org/drawingml/2006/picture">
                 <pic:pic>
                   <pic:nvPicPr>
-                    <pic:cNvPr id="0" name="figure5_synthetic_performance_surface.png"/>
+                    <pic:cNvPr id="0" name="figure5_material_levers.png"/>
                     <pic:cNvPicPr/>
                   </pic:nvPicPr>
                   <pic:blipFill>
@@ -1279,7 +1754,7 @@
                   <pic:spPr>
                     <a:xfrm>
                       <a:off x="0" y="0"/>
-                      <a:ext cx="5897880" cy="3280478"/>
+                      <a:ext cx="5897880" cy="3374064"/>
                     </a:xfrm>
                     <a:prstGeom prst="rect"/>
                   </pic:spPr>
@@ -1299,7 +1774,7 @@
           <w:rFonts w:ascii="Calibri" w:hAnsi="Calibri"/>
           <w:sz w:val="18"/>
         </w:rPr>
-        <w:t>Figure 6. Synthetic load-temperature performance surface used to verify the OpenDC-LCA measurement contract. Bilinear interpolation is allowed only within the complete measured grid; extrapolation is rejected.</w:t>
+        <w:t>Figure 6. Selected ÖKOBAUDAT 2024-II A1-A3 GHG factors for baseline and alternative steel and cement routes. The figure identifies unit-process procurement leverage; it does not quantify a data-center reduction because foreground quantities are unavailable.</w:t>
       </w:r>
     </w:p>
     <w:p>
@@ -1307,7 +1782,24 @@
         <w:pStyle w:val="Heading2"/>
       </w:pPr>
       <w:r>
-        <w:t>4.4. Capability and evidence matrix</w:t>
+        <w:t>4.6. Temporal and measurement pathways remain validation cases</w:t>
+      </w:r>
+    </w:p>
+    <w:p>
+      <w:r>
+        <w:rPr>
+          <w:rFonts w:ascii="Calibri" w:hAnsi="Calibri"/>
+          <w:sz w:val="21"/>
+        </w:rPr>
+        <w:t>The Fayetteville TMY and assumed temperature-PUE curves produced annual mean PUE values of 1.0907, 1.0529, 1.0406 and 1.0352 for air, cold plate, one-phase and two-phase cases, respectively. These are hypotheses, not technology findings. Likewise, the synthetic measurement surfaces processed 8,760 hourly observations, rejected extrapolation and propagated declared point uncertainty. Their role is to specify exactly how reviewed laboratory data will enter the lifecycle calculation. The resulting climate and surface figures are retained as Supplementary Figures rather than core evidence.</w:t>
+      </w:r>
+    </w:p>
+    <w:p>
+      <w:pPr>
+        <w:pStyle w:val="Heading2"/>
+      </w:pPr>
+      <w:r>
+        <w:t>4.7. Capability and evidence matrix</w:t>
       </w:r>
     </w:p>
     <w:p>
@@ -2908,7 +3400,7 @@
         <w:pStyle w:val="Heading2"/>
       </w:pPr>
       <w:r>
-        <w:t>5.1. Contribution relative to general LCA software</w:t>
+        <w:t>5.1. The technology ranking is conditional, not universal</w:t>
       </w:r>
     </w:p>
     <w:p>
@@ -2917,7 +3409,7 @@
           <w:rFonts w:ascii="Calibri" w:hAnsi="Calibri"/>
           <w:sz w:val="21"/>
         </w:rPr>
-        <w:t>OpenDC-LCA does not compete with openLCA as a process-network editor, database manager, or life-cycle impact assessment platform. Instead, it supplies data-center-specific foreground logic and a reproducibility contract. An openLCA or another LCA tool can generate background factors or complete product systems; OpenDC-LCA can then preserve the factors' provenance and couple them to cooling physics, hourly operating conditions, equipment replacement, and comparative-claim rules. This division allows domain experts to inspect the assumptions that most directly control cooling comparisons.</w:t>
+        <w:t>The geographic screening exposes a decision boundary that is hidden by a single national-average scenario. Cold plate and one-phase immersion cross at 60.8 kg CO2e MWh−1: a small difference in their non-use-phase terms reverses the ordering once grid emissions are sufficiently low. The practical take-home message is not that Vermont should select cold plates. The affine transfer holds the released foreground model fixed and changes only the electricity-dependent term. Rather, the finding demonstrates that a cooling ranking must be reported together with its grid range, foreground assumptions and crossover conditions. The same principle applies to climate, workload, water stress and equipment lifetime.</w:t>
       </w:r>
     </w:p>
     <w:p>
@@ -2926,34 +3418,7 @@
           <w:rFonts w:ascii="Calibri" w:hAnsi="Calibri"/>
           <w:sz w:val="21"/>
         </w:rPr>
-        <w:t>The framework's first scientific contribution is an explicit bridge between measurements and LCA. Cooling studies commonly report COP, pump power, temperature, flow, pressure drop, or PUE under selected conditions. Lifecycle studies often require annual energy and water totals. The performance-surface contract makes that transformation reviewable and rejects operation outside the tested domain.</w:t>
-      </w:r>
-    </w:p>
-    <w:p>
-      <w:r>
-        <w:rPr>
-          <w:rFonts w:ascii="Calibri" w:hAnsi="Calibri"/>
-          <w:sz w:val="21"/>
-        </w:rPr>
-        <w:t>The second contribution is evidence-aware computation. The same engine accepts published, public, experimental, and simulated data, but the audit does not treat these evidence classes as interchangeable. This is especially important for software examples: a polished figure generated from synthetic values can look like a technology benchmark. Machine-readable blocking makes the limitation part of the result rather than a sentence that can be accidentally removed.</w:t>
-      </w:r>
-    </w:p>
-    <w:p>
-      <w:r>
-        <w:rPr>
-          <w:rFonts w:ascii="Calibri" w:hAnsi="Calibri"/>
-          <w:sz w:val="21"/>
-        </w:rPr>
-        <w:t>The interoperability layer also clarifies the division of responsibility between tools. openLCA or Brightway manages background process networks and LCIA; OpenDC-LCA manages the cooling-specific foreground, temporal operation, reliability assumptions, and evidence gate. UUID preservation exposes missing providers and flow mappings instead of silently substituting a dataset.</w:t>
-      </w:r>
-    </w:p>
-    <w:p>
-      <w:r>
-        <w:rPr>
-          <w:rFonts w:ascii="Calibri" w:hAnsi="Calibri"/>
-          <w:sz w:val="21"/>
-        </w:rPr>
-        <w:t>The third contribution is staged reproducibility. Exact reconstruction of the released Microsoft/Nature component totals establishes arithmetic and lineage consistency. It does not imply an independent recreation of proprietary background datasets. This distinction helps identify the next evidence needed for a deeper comparison: reviewed foreground bills of materials, measured cooling surfaces, equipment lifetimes, fluid losses, and background processes with compatible system models.</w:t>
+        <w:t>Two-phase immersion did not cross another architecture in the tested state range. That result is stronger within the released model but is not universal. It inherits the paper's assumptions concerning server count and performance, fluid production and loss, cooling-system boundaries, equipment lifetime and regulatory feasibility. A robust comparative claim should therefore report both the observed no-crossover range and the untested assumptions that could create one.</w:t>
       </w:r>
     </w:p>
     <w:p>
@@ -2961,7 +3426,7 @@
         <w:pStyle w:val="Heading2"/>
       </w:pPr>
       <w:r>
-        <w:t>5.2. Implications for experimental research</w:t>
+        <w:t>5.2. Decarbonization changes the research question</w:t>
       </w:r>
     </w:p>
     <w:p>
@@ -2970,7 +3435,7 @@
           <w:rFonts w:ascii="Calibri" w:hAnsi="Calibri"/>
           <w:sz w:val="21"/>
         </w:rPr>
-        <w:t>The current package identifies a direct contribution pathway for electronics cooling laboratories. Experiments should span IT load or heat load, ambient or heat-sink temperature, coolant supply temperature, flow, pressure drop, pump and fan power, heat-rejection power, on-site water, duration, and measurement uncertainty. Source identifiers and calibration records should accompany every row. A complete factorial grid is valuable because it supports bounded interpolation and exposes unsupported operating regions.</w:t>
+        <w:t>At the highest observed state grid intensity, embodied terms supplied only about 4% of the re-based total; at the lowest, they supplied 57-58%. This transition changes what constitutes adequate evidence. On a carbon-intensive grid, improved PUE, reduced IT power and water-aware heat rejection are the largest near-term levers. On a low-carbon grid, the comparison becomes increasingly sensitive to useful computation per server, server count, manufacturing, lifetime and replacement. Operational efficiency and embodied impact are therefore not competing narratives but successive constraints along a decarbonization pathway.</w:t>
       </w:r>
     </w:p>
     <w:p>
@@ -2979,7 +3444,7 @@
           <w:rFonts w:ascii="Calibri" w:hAnsi="Calibri"/>
           <w:sz w:val="21"/>
         </w:rPr>
-        <w:t>The highest-value next dataset is a reviewed comparison of air, cold-plate, single-phase immersion, and, where safely feasible, two-phase systems under a shared heat-load emulator and heat-rejection boundary. The experiment should separate IT-integral fan power, facility cooling power, and heat-rejection power; report parasitic power at part load; and quantify uncertainty and repeatability. These measurements would replace the hypothetical and synthetic curves used here without changing the analysis interface.</w:t>
+        <w:t>The 5.4-fold range in public Boavizta server manufacturing footprints shows why a single generic server factor is inadequate for low-carbon scenarios. It does not establish a probability distribution or rank products, because the records are heterogeneous. It does establish scale: public foreground dispersion can exceed the differences among cooling options. Reporting a cooling saving to high precision while proxying the servers with one legacy factor creates false confidence. Product-specific bills of materials, functional performance and harmonized product-carbon-footprint rules are thus central research data, not secondary documentation.</w:t>
       </w:r>
     </w:p>
     <w:p>
@@ -2987,7 +3452,7 @@
         <w:pStyle w:val="Heading2"/>
       </w:pPr>
       <w:r>
-        <w:t>5.3. Limitations</w:t>
+        <w:t>5.3. Evidence priority links LCA to experiments and procurement</w:t>
       </w:r>
     </w:p>
     <w:p>
@@ -2996,7 +3461,7 @@
           <w:rFonts w:ascii="Calibri" w:hAnsi="Calibri"/>
           <w:sz w:val="21"/>
         </w:rPr>
-        <w:t>The validation result is limited to arithmetic reconstruction of released normalized source data. The package does not redistribute or independently recreate licensed ecoinvent or LCA for Experts processes. The hourly preview uses an annual average eGRID factor and hypothetical PUE curves; it does not capture hourly grid variation, marginal emissions, humidity-dependent heat rejection, water scarcity, reliability, server performance, or embodied effects. TMY data describe a representative climate year rather than a specific future year or extreme event.</w:t>
+        <w:t>The contribution-weighted pedigree analysis provides an actionable measurement sequence. Present grid-powered comparisons should first improve hourly IT and cooling electricity, utilization, part-load parasitics and on-site water response. Storage, networking and compute-server inventories form the next evidence tier. As grids decarbonize, this second tier moves upward. This ranking is intentionally transparent and can be replaced by formal value-of- information analysis when parameter distributions and decision losses become available.</w:t>
       </w:r>
     </w:p>
     <w:p>
@@ -3005,7 +3470,16 @@
           <w:rFonts w:ascii="Calibri" w:hAnsi="Calibri"/>
           <w:sz w:val="21"/>
         </w:rPr>
-        <w:t>The synthetic surface demonstration applies independent point uncertainty and does not capture correlated sensor bias, interpolation error, model-form uncertainty, or degradation. The reliability model uses expected Weibull renewal counts and optional Arrhenius temperature acceleration; it does not capture redundancy topology, dependent failures, repair queues, or time-varying damage. The supported functional unit does not yet capture useful computation directly. The audit cannot replace expert critical review, and a model can satisfy automated schema checks while still using scientifically inappropriate factors. Finally, the present framework is a foreground and screening tool, not a complete life-cycle inventory database.</w:t>
+        <w:t>For electronics-cooling laboratories, the immediate contribution is a shared performance-map protocol spanning heat load, ambient and coolant temperature, flow, pressure drop, pump and fan power, heat-rejection power, water, duration, uncertainty and calibration lineage. A complete bounded surface permits annual integration without extrapolation. Comparative experiments should use a common heat-load emulator and heat-rejection boundary and should separate IT-integral fan power from facility parasitics. Those measurements would replace the present synthetic fixtures through the same data contract.</w:t>
+      </w:r>
+    </w:p>
+    <w:p>
+      <w:r>
+        <w:rPr>
+          <w:rFonts w:ascii="Calibri" w:hAnsi="Calibri"/>
+          <w:sz w:val="21"/>
+        </w:rPr>
+        <w:t>The ÖKOBAUDAT comparison identifies a complementary procurement pathway. Selected lower-impact steel and cement routes reduced cradle-to-gate GHG by approximately 50-60% per kilogram. Whether this matters more than cooling equipment or server replacement depends on an architecture-specific bill of quantities, which is currently absent. The appropriate next step is therefore not to apply the percentages to an assumed facility, but to obtain reviewed quantities and preserve product geography, unit and module boundary.</w:t>
       </w:r>
     </w:p>
     <w:p>
@@ -3013,7 +3487,7 @@
         <w:pStyle w:val="Heading2"/>
       </w:pPr>
       <w:r>
-        <w:t>5.4. Development priorities</w:t>
+        <w:t>5.4. Role relative to openLCA and Brightway</w:t>
       </w:r>
     </w:p>
     <w:p>
@@ -3022,7 +3496,51 @@
           <w:rFonts w:ascii="Calibri" w:hAnsi="Calibri"/>
           <w:sz w:val="21"/>
         </w:rPr>
-        <w:t>Four steps would move OpenDC-LCA from a reproducible research framework toward decision-grade comparative studies. First, populate reviewed NED3 load-temperature performance surfaces for multiple cooling architectures. Second, calibrate the implemented openLCA/Brightway mappings and reliability models against the selected USLCI processes and measured failure records while retaining licenses and process-system metadata. Third, add time-resolved grid factors, humidity-sensitive heat rejection, water-scarcity characterization, and workload-based functional units. Fourth, conduct an independent LCA critical review, including review of allocation, replacement, uncertainty, cutoff, and data-quality choices. Dr. Nutter's review should be recorded as an assessment of the method notes and claim-gate logic rather than a request to answer isolated questions without context.</w:t>
+        <w:t>OpenDC-LCA is not a replacement for openLCA or Brightway [3,32]. Those platforms manage process networks, databases and impact assessment. The contribution here is a data-center-specific foreground and evidence layer: cooling-performance surfaces, hourly operation, reliability and replacement, functional-unit controls, source lineage and a comparative-claim gate. The interoperability functions preserve identifiers and expose missing providers or impact methods rather than silently treating an imported archive as a complete product system.</w:t>
+      </w:r>
+    </w:p>
+    <w:p>
+      <w:r>
+        <w:rPr>
+          <w:rFonts w:ascii="Calibri" w:hAnsi="Calibri"/>
+          <w:sz w:val="21"/>
+        </w:rPr>
+        <w:t>This separation also explains why the downloaded GLAD hydrogen inventories and USLCI database were not forced into the reported totals. They are relevant to backup power and equipment supply chains, but numerical combination without provider linking, a shared system model and a selected LCIA method would create an apparently comprehensive but irreproducible result. Evidence registration, successful exchange and impact calculation are three distinct stages.</w:t>
+      </w:r>
+    </w:p>
+    <w:p>
+      <w:pPr>
+        <w:pStyle w:val="Heading2"/>
+      </w:pPr>
+      <w:r>
+        <w:t>5.5. Limitations and decision-grade next steps</w:t>
+      </w:r>
+    </w:p>
+    <w:p>
+      <w:r>
+        <w:rPr>
+          <w:rFonts w:ascii="Calibri" w:hAnsi="Calibri"/>
+          <w:sz w:val="21"/>
+        </w:rPr>
+        <w:t>The state analysis is a screening re-basis between two released endpoints, not a 51-state process LCA. It uses annual location-based eGRID factors and omits hourly or marginal emissions, procurement contracts and transmission effects. The exact reconstruction verifies released arithmetic, not licensed ecoinvent or LCA for Experts inventories, confidential bills of materials or measured PUE. The Boavizta sample mixes manufacturers and methods; the ÖKOBAUDAT factors are German product-stage proxies without data-center quantities. The USGS file contains watershed geometry rather than withdrawal, consumption or scarcity characterization, so no watershed-level water claim is made.</w:t>
+      </w:r>
+    </w:p>
+    <w:p>
+      <w:r>
+        <w:rPr>
+          <w:rFonts w:ascii="Calibri" w:hAnsi="Calibri"/>
+          <w:sz w:val="21"/>
+        </w:rPr>
+        <w:t>The temporal examples use TMY weather and declared hypothetical or synthetic performance curves. They exclude humidity-sensitive heat rejection, extreme events and correlated measurement or model-form error. Reliability results are expectations from Weibull renewal and optional Arrhenius acceleration; they exclude redundancy, dependent failures and repair queues. Vcore-year improves on rack- or facility-level comparisons but does not fully represent useful computation, workload quality or rebound effects. Automated checks cannot replace an ISO-aligned critical review.</w:t>
+      </w:r>
+    </w:p>
+    <w:p>
+      <w:r>
+        <w:rPr>
+          <w:rFonts w:ascii="Calibri" w:hAnsi="Calibri"/>
+          <w:sz w:val="21"/>
+        </w:rPr>
+        <w:t>Four additions would enable a decision-grade multi-location comparison: (i) reviewed architecture-specific performance surfaces and water measurements; (ii) server, network, storage, facility and cooling-system bills of quantities with uncertainty and lifetime data; (iii) hourly electricity and watershed scarcity characterization; and (iv) harmonized background product systems in openLCA or Brightway. Dr. Nutter's independent review should assess the recorded methodological decisions, dataset mappings and claim-gate findings as a coherent package before public comparative assertions are made.</w:t>
       </w:r>
     </w:p>
     <w:p>
@@ -3039,7 +3557,7 @@
           <w:rFonts w:ascii="Calibri" w:hAnsi="Calibri"/>
           <w:sz w:val="21"/>
         </w:rPr>
-        <w:t>OpenDC-LCA provides a transparent, open-source connection between data-center cooling physics and lifecycle interpretation. Version 1.1 registers evidence, validates functional and physical assumptions, calculates static and temporal impacts, integrates measured load-temperature surfaces, exchanges foreground inventories with openLCA and Brightway, models reliability-driven replacement and maintenance, propagates screening uncertainty, and emits machine-readable audit findings through a command line, Python API, and local GUI. The package exactly reconstructed all 24 released normalized totals tested from the Microsoft/Nature study, with a maximum absolute numerical difference of 1.42 × 10⁻¹⁴ percentage points. Its climate and measurement-surface demonstrations show how public data and laboratory measurements can be connected to annual environmental indicators, while their evidence labels prevent synthetic values from becoming technology claims.</w:t>
+        <w:t>OpenDC-LCA converts heterogeneous cooling, grid, server, construction and data- quality evidence into conditional, auditable lifecycle comparisons. It exactly reconstructed 24 released Microsoft/Nature totals and then exposed a result that a single reference scenario cannot show: cold plate and one-phase immersion cross near 60.8 kg CO2e MWh−1 within the observed U.S. state range. Across that range, the embodied share rose from about 4% to 57-58%, shifting the limiting evidence from operational electricity toward servers and replacement. Forty-eight public server records spanned 465-2,503 kg CO2e of manufacturing emissions, while selected lower-impact steel and cement routes showed approximately 50-60% cradle-to-gate GHG leverage per kilogram.</w:t>
       </w:r>
     </w:p>
     <w:p>
@@ -3048,7 +3566,7 @@
           <w:rFonts w:ascii="Calibri" w:hAnsi="Calibri"/>
           <w:sz w:val="21"/>
         </w:rPr>
-        <w:t>The central contribution is thus methodological: transparent calculations are paired with explicit evidence requirements. The framework is ready for community use as a screening, teaching, reproducibility, and experimental design tool. Decision-grade cooling comparisons now require reviewed performance surfaces and compatible lifecycle inventories, not additional software architecture.</w:t>
+        <w:t>These findings support three conclusions. First, cooling rankings should be reported as decision surfaces with crossover conditions, not universal league tables. Second, decarbonized operation makes server performance, manufacturing, lifetime and architecture-specific material quantities first-order LCA data. Third, contribution-weighted data quality can convert an LCA into a prioritized experimental and data-acquisition program. OpenDC-LCA operationalizes these principles through traceable source registration, temporal performance maps, reliability, openLCA/Brightway exchange and machine-readable claim gates. The remaining barrier to a public decision-grade benchmark is evidence: harmonized bills of quantities, measured operating surfaces, time- and watershed-resolved factors, and independent critical review.</w:t>
       </w:r>
     </w:p>
     <w:p>
@@ -3436,6 +3954,865 @@
           <w:sz w:val="21"/>
         </w:rPr>
         <w:t>https://www.usgs.gov/national-hydrography/watershed-boundary-dataset</w:t>
+      </w:r>
+    </w:p>
+    <w:p>
+      <w:pPr>
+        <w:pStyle w:val="ListNumber"/>
+      </w:pPr>
+      <w:r>
+        <w:rPr>
+          <w:rFonts w:ascii="Calibri" w:hAnsi="Calibri"/>
+          <w:sz w:val="21"/>
+        </w:rPr>
+        <w:t>Masanet, E., Shehabi, A., Lei, N., Smith, S. &amp; Koomey, J. Recalibrating</w:t>
+      </w:r>
+    </w:p>
+    <w:p>
+      <w:r>
+        <w:rPr>
+          <w:rFonts w:ascii="Calibri" w:hAnsi="Calibri"/>
+          <w:sz w:val="21"/>
+        </w:rPr>
+        <w:t xml:space="preserve">global data center energy-use estimates. </w:t>
+      </w:r>
+      <w:r>
+        <w:rPr>
+          <w:rFonts w:ascii="Calibri" w:hAnsi="Calibri"/>
+          <w:i/>
+          <w:sz w:val="21"/>
+        </w:rPr>
+        <w:t>Science</w:t>
+      </w:r>
+      <w:r>
+        <w:rPr>
+          <w:rFonts w:ascii="Calibri" w:hAnsi="Calibri"/>
+          <w:sz w:val="21"/>
+        </w:rPr>
+        <w:t xml:space="preserve"> </w:t>
+      </w:r>
+      <w:r>
+        <w:rPr>
+          <w:rFonts w:ascii="Calibri" w:hAnsi="Calibri"/>
+          <w:b/>
+          <w:sz w:val="21"/>
+        </w:rPr>
+        <w:t>367</w:t>
+      </w:r>
+      <w:r>
+        <w:rPr>
+          <w:rFonts w:ascii="Calibri" w:hAnsi="Calibri"/>
+          <w:sz w:val="21"/>
+        </w:rPr>
+        <w:t>, 984-986 (2020). https://doi.org/10.1126/science.aba3758</w:t>
+      </w:r>
+    </w:p>
+    <w:p>
+      <w:pPr>
+        <w:pStyle w:val="ListNumber"/>
+      </w:pPr>
+      <w:r>
+        <w:rPr>
+          <w:rFonts w:ascii="Calibri" w:hAnsi="Calibri"/>
+          <w:sz w:val="21"/>
+        </w:rPr>
+        <w:t>International Energy Agency. Data centres and data transmission networks.</w:t>
+      </w:r>
+    </w:p>
+    <w:p>
+      <w:r>
+        <w:rPr>
+          <w:rFonts w:ascii="Calibri" w:hAnsi="Calibri"/>
+          <w:sz w:val="21"/>
+        </w:rPr>
+        <w:t>https://www.iea.org/energy-system/buildings/data-centres-and-data-transmission-networks</w:t>
+      </w:r>
+    </w:p>
+    <w:p>
+      <w:pPr>
+        <w:pStyle w:val="ListNumber"/>
+      </w:pPr>
+      <w:r>
+        <w:rPr>
+          <w:rFonts w:ascii="Calibri" w:hAnsi="Calibri"/>
+          <w:sz w:val="21"/>
+        </w:rPr>
+        <w:t>Khalaj, A. H. &amp; Halgamuge, S. K. A review on efficient thermal management</w:t>
+      </w:r>
+    </w:p>
+    <w:p>
+      <w:r>
+        <w:rPr>
+          <w:rFonts w:ascii="Calibri" w:hAnsi="Calibri"/>
+          <w:sz w:val="21"/>
+        </w:rPr>
+        <w:t xml:space="preserve">of air- and liquid-cooled data centers. </w:t>
+      </w:r>
+      <w:r>
+        <w:rPr>
+          <w:rFonts w:ascii="Calibri" w:hAnsi="Calibri"/>
+          <w:i/>
+          <w:sz w:val="21"/>
+        </w:rPr>
+        <w:t>Applied Energy</w:t>
+      </w:r>
+      <w:r>
+        <w:rPr>
+          <w:rFonts w:ascii="Calibri" w:hAnsi="Calibri"/>
+          <w:sz w:val="21"/>
+        </w:rPr>
+        <w:t xml:space="preserve"> </w:t>
+      </w:r>
+      <w:r>
+        <w:rPr>
+          <w:rFonts w:ascii="Calibri" w:hAnsi="Calibri"/>
+          <w:b/>
+          <w:sz w:val="21"/>
+        </w:rPr>
+        <w:t>205</w:t>
+      </w:r>
+      <w:r>
+        <w:rPr>
+          <w:rFonts w:ascii="Calibri" w:hAnsi="Calibri"/>
+          <w:sz w:val="21"/>
+        </w:rPr>
+        <w:t>, 1165-1184 (2017). https://doi.org/10.1016/j.apenergy.2017.08.037</w:t>
+      </w:r>
+    </w:p>
+    <w:p>
+      <w:pPr>
+        <w:pStyle w:val="ListNumber"/>
+      </w:pPr>
+      <w:r>
+        <w:rPr>
+          <w:rFonts w:ascii="Calibri" w:hAnsi="Calibri"/>
+          <w:sz w:val="21"/>
+        </w:rPr>
+        <w:t>Xu, S. et al. Thermal management and energy consumption in air, liquid,</w:t>
+      </w:r>
+    </w:p>
+    <w:p>
+      <w:r>
+        <w:rPr>
+          <w:rFonts w:ascii="Calibri" w:hAnsi="Calibri"/>
+          <w:sz w:val="21"/>
+        </w:rPr>
+        <w:t xml:space="preserve">and free cooling systems for data centers: a review. </w:t>
+      </w:r>
+      <w:r>
+        <w:rPr>
+          <w:rFonts w:ascii="Calibri" w:hAnsi="Calibri"/>
+          <w:i/>
+          <w:sz w:val="21"/>
+        </w:rPr>
+        <w:t>Energies</w:t>
+      </w:r>
+      <w:r>
+        <w:rPr>
+          <w:rFonts w:ascii="Calibri" w:hAnsi="Calibri"/>
+          <w:sz w:val="21"/>
+        </w:rPr>
+        <w:t xml:space="preserve"> </w:t>
+      </w:r>
+      <w:r>
+        <w:rPr>
+          <w:rFonts w:ascii="Calibri" w:hAnsi="Calibri"/>
+          <w:b/>
+          <w:sz w:val="21"/>
+        </w:rPr>
+        <w:t>16</w:t>
+      </w:r>
+      <w:r>
+        <w:rPr>
+          <w:rFonts w:ascii="Calibri" w:hAnsi="Calibri"/>
+          <w:sz w:val="21"/>
+        </w:rPr>
+        <w:t>, 1279 (2023). https://doi.org/10.3390/en16031279</w:t>
+      </w:r>
+    </w:p>
+    <w:p>
+      <w:pPr>
+        <w:pStyle w:val="ListNumber"/>
+      </w:pPr>
+      <w:r>
+        <w:rPr>
+          <w:rFonts w:ascii="Calibri" w:hAnsi="Calibri"/>
+          <w:sz w:val="21"/>
+        </w:rPr>
+        <w:t>Kanbur, B. B. et al. A review of immersion cooling for data centers.</w:t>
+      </w:r>
+    </w:p>
+    <w:p>
+      <w:r>
+        <w:rPr>
+          <w:rFonts w:ascii="Calibri" w:hAnsi="Calibri"/>
+          <w:i/>
+          <w:sz w:val="21"/>
+        </w:rPr>
+        <w:t>International Journal of Refrigeration</w:t>
+      </w:r>
+      <w:r>
+        <w:rPr>
+          <w:rFonts w:ascii="Calibri" w:hAnsi="Calibri"/>
+          <w:sz w:val="21"/>
+        </w:rPr>
+        <w:t xml:space="preserve"> </w:t>
+      </w:r>
+      <w:r>
+        <w:rPr>
+          <w:rFonts w:ascii="Calibri" w:hAnsi="Calibri"/>
+          <w:b/>
+          <w:sz w:val="21"/>
+        </w:rPr>
+        <w:t>118</w:t>
+      </w:r>
+      <w:r>
+        <w:rPr>
+          <w:rFonts w:ascii="Calibri" w:hAnsi="Calibri"/>
+          <w:sz w:val="21"/>
+        </w:rPr>
+        <w:t>, 290-301 (2020).</w:t>
+      </w:r>
+    </w:p>
+    <w:p>
+      <w:pPr>
+        <w:pStyle w:val="ListNumber"/>
+      </w:pPr>
+      <w:r>
+        <w:rPr>
+          <w:rFonts w:ascii="Calibri" w:hAnsi="Calibri"/>
+          <w:sz w:val="21"/>
+        </w:rPr>
+        <w:t>Ramakrishnan, B. et al. An experimentally validated model of immersion</w:t>
+      </w:r>
+    </w:p>
+    <w:p>
+      <w:r>
+        <w:rPr>
+          <w:rFonts w:ascii="Calibri" w:hAnsi="Calibri"/>
+          <w:sz w:val="21"/>
+        </w:rPr>
+        <w:t xml:space="preserve">cooling for overclocked servers. </w:t>
+      </w:r>
+      <w:r>
+        <w:rPr>
+          <w:rFonts w:ascii="Calibri" w:hAnsi="Calibri"/>
+          <w:i/>
+          <w:sz w:val="21"/>
+        </w:rPr>
+        <w:t>IEEE Transactions on Components, Packaging and Manufacturing Technology</w:t>
+      </w:r>
+      <w:r>
+        <w:rPr>
+          <w:rFonts w:ascii="Calibri" w:hAnsi="Calibri"/>
+          <w:sz w:val="21"/>
+        </w:rPr>
+        <w:t xml:space="preserve"> </w:t>
+      </w:r>
+      <w:r>
+        <w:rPr>
+          <w:rFonts w:ascii="Calibri" w:hAnsi="Calibri"/>
+          <w:b/>
+          <w:sz w:val="21"/>
+        </w:rPr>
+        <w:t>11</w:t>
+      </w:r>
+      <w:r>
+        <w:rPr>
+          <w:rFonts w:ascii="Calibri" w:hAnsi="Calibri"/>
+          <w:sz w:val="21"/>
+        </w:rPr>
+        <w:t>, 1313-1324 (2021). https://doi.org/10.1109/TCPMT.2021.3106026</w:t>
+      </w:r>
+    </w:p>
+    <w:p>
+      <w:pPr>
+        <w:pStyle w:val="ListNumber"/>
+      </w:pPr>
+      <w:r>
+        <w:rPr>
+          <w:rFonts w:ascii="Calibri" w:hAnsi="Calibri"/>
+          <w:sz w:val="21"/>
+        </w:rPr>
+        <w:t>Whitehead, B., Andrews, D., Shah, A. &amp; Maidment, G. Assessing the</w:t>
+      </w:r>
+    </w:p>
+    <w:p>
+      <w:r>
+        <w:rPr>
+          <w:rFonts w:ascii="Calibri" w:hAnsi="Calibri"/>
+          <w:sz w:val="21"/>
+        </w:rPr>
+        <w:t xml:space="preserve">environmental impact of data centres. Part 1: background, energy use and metrics. </w:t>
+      </w:r>
+      <w:r>
+        <w:rPr>
+          <w:rFonts w:ascii="Calibri" w:hAnsi="Calibri"/>
+          <w:i/>
+          <w:sz w:val="21"/>
+        </w:rPr>
+        <w:t>Building and Environment</w:t>
+      </w:r>
+      <w:r>
+        <w:rPr>
+          <w:rFonts w:ascii="Calibri" w:hAnsi="Calibri"/>
+          <w:sz w:val="21"/>
+        </w:rPr>
+        <w:t xml:space="preserve"> </w:t>
+      </w:r>
+      <w:r>
+        <w:rPr>
+          <w:rFonts w:ascii="Calibri" w:hAnsi="Calibri"/>
+          <w:b/>
+          <w:sz w:val="21"/>
+        </w:rPr>
+        <w:t>82</w:t>
+      </w:r>
+      <w:r>
+        <w:rPr>
+          <w:rFonts w:ascii="Calibri" w:hAnsi="Calibri"/>
+          <w:sz w:val="21"/>
+        </w:rPr>
+        <w:t>, 151-159 (2014).</w:t>
+      </w:r>
+    </w:p>
+    <w:p>
+      <w:pPr>
+        <w:pStyle w:val="ListNumber"/>
+      </w:pPr>
+      <w:r>
+        <w:rPr>
+          <w:rFonts w:ascii="Calibri" w:hAnsi="Calibri"/>
+          <w:sz w:val="21"/>
+        </w:rPr>
+        <w:t>Siddik, M. A. B., Shehabi, A. &amp; Marston, L. The environmental footprint</w:t>
+      </w:r>
+    </w:p>
+    <w:p>
+      <w:r>
+        <w:rPr>
+          <w:rFonts w:ascii="Calibri" w:hAnsi="Calibri"/>
+          <w:sz w:val="21"/>
+        </w:rPr>
+        <w:t xml:space="preserve">of data centers in the United States. </w:t>
+      </w:r>
+      <w:r>
+        <w:rPr>
+          <w:rFonts w:ascii="Calibri" w:hAnsi="Calibri"/>
+          <w:i/>
+          <w:sz w:val="21"/>
+        </w:rPr>
+        <w:t>Environmental Research Letters</w:t>
+      </w:r>
+      <w:r>
+        <w:rPr>
+          <w:rFonts w:ascii="Calibri" w:hAnsi="Calibri"/>
+          <w:sz w:val="21"/>
+        </w:rPr>
+        <w:t xml:space="preserve"> </w:t>
+      </w:r>
+      <w:r>
+        <w:rPr>
+          <w:rFonts w:ascii="Calibri" w:hAnsi="Calibri"/>
+          <w:b/>
+          <w:sz w:val="21"/>
+        </w:rPr>
+        <w:t>16</w:t>
+      </w:r>
+      <w:r>
+        <w:rPr>
+          <w:rFonts w:ascii="Calibri" w:hAnsi="Calibri"/>
+          <w:sz w:val="21"/>
+        </w:rPr>
+        <w:t>, 064017 (2021). https://doi.org/10.1088/1748-9326/abfba1</w:t>
+      </w:r>
+    </w:p>
+    <w:p>
+      <w:pPr>
+        <w:pStyle w:val="ListNumber"/>
+      </w:pPr>
+      <w:r>
+        <w:rPr>
+          <w:rFonts w:ascii="Calibri" w:hAnsi="Calibri"/>
+          <w:sz w:val="21"/>
+        </w:rPr>
+        <w:t>Ristic, B., Madani, K. &amp; Makuch, Z. The water footprint of data centers.</w:t>
+      </w:r>
+    </w:p>
+    <w:p>
+      <w:r>
+        <w:rPr>
+          <w:rFonts w:ascii="Calibri" w:hAnsi="Calibri"/>
+          <w:i/>
+          <w:sz w:val="21"/>
+        </w:rPr>
+        <w:t>Sustainability</w:t>
+      </w:r>
+      <w:r>
+        <w:rPr>
+          <w:rFonts w:ascii="Calibri" w:hAnsi="Calibri"/>
+          <w:sz w:val="21"/>
+        </w:rPr>
+        <w:t xml:space="preserve"> </w:t>
+      </w:r>
+      <w:r>
+        <w:rPr>
+          <w:rFonts w:ascii="Calibri" w:hAnsi="Calibri"/>
+          <w:b/>
+          <w:sz w:val="21"/>
+        </w:rPr>
+        <w:t>7</w:t>
+      </w:r>
+      <w:r>
+        <w:rPr>
+          <w:rFonts w:ascii="Calibri" w:hAnsi="Calibri"/>
+          <w:sz w:val="21"/>
+        </w:rPr>
+        <w:t>, 11260-11284 (2015). https://doi.org/10.3390/su70811260</w:t>
+      </w:r>
+    </w:p>
+    <w:p>
+      <w:pPr>
+        <w:pStyle w:val="ListNumber"/>
+      </w:pPr>
+      <w:r>
+        <w:rPr>
+          <w:rFonts w:ascii="Calibri" w:hAnsi="Calibri"/>
+          <w:sz w:val="21"/>
+        </w:rPr>
+        <w:t>Isler-Kaya, G., Colpan, C. O. &amp; Kizilkan, O. Life cycle assessment of a</w:t>
+      </w:r>
+    </w:p>
+    <w:p>
+      <w:r>
+        <w:rPr>
+          <w:rFonts w:ascii="Calibri" w:hAnsi="Calibri"/>
+          <w:sz w:val="21"/>
+        </w:rPr>
+        <w:t xml:space="preserve">data center cooling system. </w:t>
+      </w:r>
+      <w:r>
+        <w:rPr>
+          <w:rFonts w:ascii="Calibri" w:hAnsi="Calibri"/>
+          <w:i/>
+          <w:sz w:val="21"/>
+        </w:rPr>
+        <w:t>Energy and Buildings</w:t>
+      </w:r>
+      <w:r>
+        <w:rPr>
+          <w:rFonts w:ascii="Calibri" w:hAnsi="Calibri"/>
+          <w:sz w:val="21"/>
+        </w:rPr>
+        <w:t xml:space="preserve"> </w:t>
+      </w:r>
+      <w:r>
+        <w:rPr>
+          <w:rFonts w:ascii="Calibri" w:hAnsi="Calibri"/>
+          <w:b/>
+          <w:sz w:val="21"/>
+        </w:rPr>
+        <w:t>295</w:t>
+      </w:r>
+      <w:r>
+        <w:rPr>
+          <w:rFonts w:ascii="Calibri" w:hAnsi="Calibri"/>
+          <w:sz w:val="21"/>
+        </w:rPr>
+        <w:t>, 113006 (2023). https://doi.org/10.1016/j.enbuild.2023.113006</w:t>
+      </w:r>
+    </w:p>
+    <w:p>
+      <w:pPr>
+        <w:pStyle w:val="ListNumber"/>
+      </w:pPr>
+      <w:r>
+        <w:rPr>
+          <w:rFonts w:ascii="Calibri" w:hAnsi="Calibri"/>
+          <w:sz w:val="21"/>
+        </w:rPr>
+        <w:t>Wenzel, H. et al. Comparative life cycle assessment of wet cooling towers.</w:t>
+      </w:r>
+    </w:p>
+    <w:p>
+      <w:r>
+        <w:rPr>
+          <w:rFonts w:ascii="Calibri" w:hAnsi="Calibri"/>
+          <w:i/>
+          <w:sz w:val="21"/>
+        </w:rPr>
+        <w:t>Journal of Industrial Ecology</w:t>
+      </w:r>
+      <w:r>
+        <w:rPr>
+          <w:rFonts w:ascii="Calibri" w:hAnsi="Calibri"/>
+          <w:sz w:val="21"/>
+        </w:rPr>
+        <w:t xml:space="preserve"> </w:t>
+      </w:r>
+      <w:r>
+        <w:rPr>
+          <w:rFonts w:ascii="Calibri" w:hAnsi="Calibri"/>
+          <w:b/>
+          <w:sz w:val="21"/>
+        </w:rPr>
+        <w:t>27</w:t>
+      </w:r>
+      <w:r>
+        <w:rPr>
+          <w:rFonts w:ascii="Calibri" w:hAnsi="Calibri"/>
+          <w:sz w:val="21"/>
+        </w:rPr>
+        <w:t xml:space="preserve"> (2023). https://doi.org/10.1111/jiec.13396</w:t>
+      </w:r>
+    </w:p>
+    <w:p>
+      <w:pPr>
+        <w:pStyle w:val="ListNumber"/>
+      </w:pPr>
+      <w:r>
+        <w:rPr>
+          <w:rFonts w:ascii="Calibri" w:hAnsi="Calibri"/>
+          <w:sz w:val="21"/>
+        </w:rPr>
+        <w:t>Cleaner grid or smarter cooling? A life cycle perspective on data center</w:t>
+      </w:r>
+    </w:p>
+    <w:p>
+      <w:r>
+        <w:rPr>
+          <w:rFonts w:ascii="Calibri" w:hAnsi="Calibri"/>
+          <w:sz w:val="21"/>
+        </w:rPr>
+        <w:t xml:space="preserve">cooling strategies. </w:t>
+      </w:r>
+      <w:r>
+        <w:rPr>
+          <w:rFonts w:ascii="Calibri" w:hAnsi="Calibri"/>
+          <w:i/>
+          <w:sz w:val="21"/>
+        </w:rPr>
+        <w:t>Cleaner Engineering and Technology</w:t>
+      </w:r>
+      <w:r>
+        <w:rPr>
+          <w:rFonts w:ascii="Calibri" w:hAnsi="Calibri"/>
+          <w:sz w:val="21"/>
+        </w:rPr>
+        <w:t xml:space="preserve"> (2025). https://doi.org/10.1016/j.cles.2025.100223</w:t>
+      </w:r>
+    </w:p>
+    <w:p>
+      <w:pPr>
+        <w:pStyle w:val="ListNumber"/>
+      </w:pPr>
+      <w:r>
+        <w:rPr>
+          <w:rFonts w:ascii="Calibri" w:hAnsi="Calibri"/>
+          <w:sz w:val="21"/>
+        </w:rPr>
+        <w:t>Boyd, S. B., Horvath, A. &amp; Dornfeld, D. Life-cycle assessment of</w:t>
+      </w:r>
+    </w:p>
+    <w:p>
+      <w:r>
+        <w:rPr>
+          <w:rFonts w:ascii="Calibri" w:hAnsi="Calibri"/>
+          <w:sz w:val="21"/>
+        </w:rPr>
+        <w:t xml:space="preserve">computational logic produced from 1995 through 2010. </w:t>
+      </w:r>
+      <w:r>
+        <w:rPr>
+          <w:rFonts w:ascii="Calibri" w:hAnsi="Calibri"/>
+          <w:i/>
+          <w:sz w:val="21"/>
+        </w:rPr>
+        <w:t>Environmental Science &amp; Technology</w:t>
+      </w:r>
+      <w:r>
+        <w:rPr>
+          <w:rFonts w:ascii="Calibri" w:hAnsi="Calibri"/>
+          <w:sz w:val="21"/>
+        </w:rPr>
+        <w:t xml:space="preserve"> </w:t>
+      </w:r>
+      <w:r>
+        <w:rPr>
+          <w:rFonts w:ascii="Calibri" w:hAnsi="Calibri"/>
+          <w:b/>
+          <w:sz w:val="21"/>
+        </w:rPr>
+        <w:t>47</w:t>
+      </w:r>
+      <w:r>
+        <w:rPr>
+          <w:rFonts w:ascii="Calibri" w:hAnsi="Calibri"/>
+          <w:sz w:val="21"/>
+        </w:rPr>
+        <w:t>, 2947-2954 (2013). https://doi.org/10.1021/es303012r</w:t>
+      </w:r>
+    </w:p>
+    <w:p>
+      <w:pPr>
+        <w:pStyle w:val="ListNumber"/>
+      </w:pPr>
+      <w:r>
+        <w:rPr>
+          <w:rFonts w:ascii="Calibri" w:hAnsi="Calibri"/>
+          <w:sz w:val="21"/>
+        </w:rPr>
+        <w:t>Malmodin, J. &amp; Lundén, D. The energy and carbon footprint of the global</w:t>
+      </w:r>
+    </w:p>
+    <w:p>
+      <w:r>
+        <w:rPr>
+          <w:rFonts w:ascii="Calibri" w:hAnsi="Calibri"/>
+          <w:sz w:val="21"/>
+        </w:rPr>
+        <w:t xml:space="preserve">ICT and E&amp;M sectors 2010-2015. </w:t>
+      </w:r>
+      <w:r>
+        <w:rPr>
+          <w:rFonts w:ascii="Calibri" w:hAnsi="Calibri"/>
+          <w:i/>
+          <w:sz w:val="21"/>
+        </w:rPr>
+        <w:t>Sustainability</w:t>
+      </w:r>
+      <w:r>
+        <w:rPr>
+          <w:rFonts w:ascii="Calibri" w:hAnsi="Calibri"/>
+          <w:sz w:val="21"/>
+        </w:rPr>
+        <w:t xml:space="preserve"> </w:t>
+      </w:r>
+      <w:r>
+        <w:rPr>
+          <w:rFonts w:ascii="Calibri" w:hAnsi="Calibri"/>
+          <w:b/>
+          <w:sz w:val="21"/>
+        </w:rPr>
+        <w:t>10</w:t>
+      </w:r>
+      <w:r>
+        <w:rPr>
+          <w:rFonts w:ascii="Calibri" w:hAnsi="Calibri"/>
+          <w:sz w:val="21"/>
+        </w:rPr>
+        <w:t>, 3027 (2018). https://doi.org/10.3390/su10093027</w:t>
+      </w:r>
+    </w:p>
+    <w:p>
+      <w:pPr>
+        <w:pStyle w:val="ListNumber"/>
+      </w:pPr>
+      <w:r>
+        <w:rPr>
+          <w:rFonts w:ascii="Calibri" w:hAnsi="Calibri"/>
+          <w:sz w:val="21"/>
+        </w:rPr>
+        <w:t>Boulay, A.-M. et al. The WULCA consensus characterization model for water</w:t>
+      </w:r>
+    </w:p>
+    <w:p>
+      <w:r>
+        <w:rPr>
+          <w:rFonts w:ascii="Calibri" w:hAnsi="Calibri"/>
+          <w:sz w:val="21"/>
+        </w:rPr>
+        <w:t xml:space="preserve">scarcity footprints: assessing impacts of water consumption based on available water remaining (AWARE). </w:t>
+      </w:r>
+      <w:r>
+        <w:rPr>
+          <w:rFonts w:ascii="Calibri" w:hAnsi="Calibri"/>
+          <w:i/>
+          <w:sz w:val="21"/>
+        </w:rPr>
+        <w:t>International Journal of Life Cycle Assessment</w:t>
+      </w:r>
+      <w:r>
+        <w:rPr>
+          <w:rFonts w:ascii="Calibri" w:hAnsi="Calibri"/>
+          <w:sz w:val="21"/>
+        </w:rPr>
+        <w:t xml:space="preserve"> </w:t>
+      </w:r>
+      <w:r>
+        <w:rPr>
+          <w:rFonts w:ascii="Calibri" w:hAnsi="Calibri"/>
+          <w:b/>
+          <w:sz w:val="21"/>
+        </w:rPr>
+        <w:t>23</w:t>
+      </w:r>
+      <w:r>
+        <w:rPr>
+          <w:rFonts w:ascii="Calibri" w:hAnsi="Calibri"/>
+          <w:sz w:val="21"/>
+        </w:rPr>
+        <w:t>, 368-378 (2018). https://doi.org/10.1007/s11367-017-1333-8</w:t>
+      </w:r>
+    </w:p>
+    <w:p>
+      <w:pPr>
+        <w:pStyle w:val="ListNumber"/>
+      </w:pPr>
+      <w:r>
+        <w:rPr>
+          <w:rFonts w:ascii="Calibri" w:hAnsi="Calibri"/>
+          <w:sz w:val="21"/>
+        </w:rPr>
+        <w:t>Boulay, A.-M. et al. Analysis of water use impact assessment methods.</w:t>
+      </w:r>
+    </w:p>
+    <w:p>
+      <w:r>
+        <w:rPr>
+          <w:rFonts w:ascii="Calibri" w:hAnsi="Calibri"/>
+          <w:i/>
+          <w:sz w:val="21"/>
+        </w:rPr>
+        <w:t>Journal of Industrial Ecology</w:t>
+      </w:r>
+      <w:r>
+        <w:rPr>
+          <w:rFonts w:ascii="Calibri" w:hAnsi="Calibri"/>
+          <w:sz w:val="21"/>
+        </w:rPr>
+        <w:t xml:space="preserve"> </w:t>
+      </w:r>
+      <w:r>
+        <w:rPr>
+          <w:rFonts w:ascii="Calibri" w:hAnsi="Calibri"/>
+          <w:b/>
+          <w:sz w:val="21"/>
+        </w:rPr>
+        <w:t>25</w:t>
+      </w:r>
+      <w:r>
+        <w:rPr>
+          <w:rFonts w:ascii="Calibri" w:hAnsi="Calibri"/>
+          <w:sz w:val="21"/>
+        </w:rPr>
+        <w:t xml:space="preserve"> (2021). https://doi.org/10.1111/jiec.13173</w:t>
+      </w:r>
+    </w:p>
+    <w:p>
+      <w:pPr>
+        <w:pStyle w:val="ListNumber"/>
+      </w:pPr>
+      <w:r>
+        <w:rPr>
+          <w:rFonts w:ascii="Calibri" w:hAnsi="Calibri"/>
+          <w:sz w:val="21"/>
+        </w:rPr>
+        <w:t>Life-cycle environmental assessment of progressive chiller systems for</w:t>
+      </w:r>
+    </w:p>
+    <w:p>
+      <w:r>
+        <w:rPr>
+          <w:rFonts w:ascii="Calibri" w:hAnsi="Calibri"/>
+          <w:sz w:val="21"/>
+        </w:rPr>
+        <w:t xml:space="preserve">data centers. </w:t>
+      </w:r>
+      <w:r>
+        <w:rPr>
+          <w:rFonts w:ascii="Calibri" w:hAnsi="Calibri"/>
+          <w:i/>
+          <w:sz w:val="21"/>
+        </w:rPr>
+        <w:t>Building Simulation</w:t>
+      </w:r>
+      <w:r>
+        <w:rPr>
+          <w:rFonts w:ascii="Calibri" w:hAnsi="Calibri"/>
+          <w:sz w:val="21"/>
+        </w:rPr>
+        <w:t xml:space="preserve"> (2024). https://doi.org/10.1007/s12273-024-1167-9</w:t>
+      </w:r>
+    </w:p>
+    <w:p>
+      <w:pPr>
+        <w:pStyle w:val="ListNumber"/>
+      </w:pPr>
+      <w:r>
+        <w:rPr>
+          <w:rFonts w:ascii="Calibri" w:hAnsi="Calibri"/>
+          <w:sz w:val="21"/>
+        </w:rPr>
+        <w:t>Hourly performance and environmental assessment of data-center cooling in</w:t>
+      </w:r>
+    </w:p>
+    <w:p>
+      <w:r>
+        <w:rPr>
+          <w:rFonts w:ascii="Calibri" w:hAnsi="Calibri"/>
+          <w:sz w:val="21"/>
+        </w:rPr>
+        <w:t xml:space="preserve">hot-arid climates. </w:t>
+      </w:r>
+      <w:r>
+        <w:rPr>
+          <w:rFonts w:ascii="Calibri" w:hAnsi="Calibri"/>
+          <w:i/>
+          <w:sz w:val="21"/>
+        </w:rPr>
+        <w:t>Applied Thermal Engineering</w:t>
+      </w:r>
+      <w:r>
+        <w:rPr>
+          <w:rFonts w:ascii="Calibri" w:hAnsi="Calibri"/>
+          <w:sz w:val="21"/>
+        </w:rPr>
+        <w:t xml:space="preserve"> (2025). https://doi.org/10.1016/j.applthermaleng.2025.126802</w:t>
+      </w:r>
+    </w:p>
+    <w:p>
+      <w:pPr>
+        <w:pStyle w:val="ListNumber"/>
+      </w:pPr>
+      <w:r>
+        <w:rPr>
+          <w:rFonts w:ascii="Calibri" w:hAnsi="Calibri"/>
+          <w:sz w:val="21"/>
+        </w:rPr>
+        <w:t>Mutel, C. Brightway: an open source framework for life cycle assessment.</w:t>
+      </w:r>
+    </w:p>
+    <w:p>
+      <w:r>
+        <w:rPr>
+          <w:rFonts w:ascii="Calibri" w:hAnsi="Calibri"/>
+          <w:i/>
+          <w:sz w:val="21"/>
+        </w:rPr>
+        <w:t>Journal of Open Source Software</w:t>
+      </w:r>
+      <w:r>
+        <w:rPr>
+          <w:rFonts w:ascii="Calibri" w:hAnsi="Calibri"/>
+          <w:sz w:val="21"/>
+        </w:rPr>
+        <w:t xml:space="preserve"> </w:t>
+      </w:r>
+      <w:r>
+        <w:rPr>
+          <w:rFonts w:ascii="Calibri" w:hAnsi="Calibri"/>
+          <w:b/>
+          <w:sz w:val="21"/>
+        </w:rPr>
+        <w:t>2</w:t>
+      </w:r>
+      <w:r>
+        <w:rPr>
+          <w:rFonts w:ascii="Calibri" w:hAnsi="Calibri"/>
+          <w:sz w:val="21"/>
+        </w:rPr>
+        <w:t>, 236 (2017). https://doi.org/10.21105/joss.00236</w:t>
       </w:r>
     </w:p>
     <w:sectPr>

</xml_diff>

<commit_message>
Update manuscript for practitioner-ready v1.1.0
</commit_message>
<xml_diff>
--- a/paper/OpenDC-LCA_manuscript.docx
+++ b/paper/OpenDC-LCA_manuscript.docx
@@ -87,7 +87,7 @@
           <w:rFonts w:ascii="Calibri" w:hAnsi="Calibri"/>
           <w:sz w:val="21"/>
         </w:rPr>
-        <w:t>Liquid cooling can reduce data-center operating energy and water use, yet the preferred architecture depends on electricity supply, compute performance, hardware and fluid inventories, service life, climate, and the functional unit used for comparison. Existing studies establish the importance of these effects but are difficult to update or transfer because foreground bills of materials and background processes are often proprietary, operational performance is represented by annual averages, water consumption is rarely scarcity-weighted, and data-quality assessments are not connected to measurement priorities. We present OpenDC-LCA, an open-source, evidence-governed research layer that couples data-center cooling physics to general life-cycle assessment (LCA) tools while preserving source identity, functional unit, geography, transformation equations, uncertainty, and evidence status. The framework supports openLCA JSON-LD and Brightway interoperability, hourly weather-load-performance integration, discrete and reliability-driven replacement, uncertainty analysis, and a machine-readable claim gate. We use released Microsoft/WSP results, EPA eGRID 2023, 48 Boavizta server product-carbon-footprint records, selected ÖKOBAUDAT construction processes, NOAA weather data, and the released Microsoft pedigree assessment to demonstrate analyses that cannot be obtained from any source alone. All 24 released normalized totals were independently reconciled to floating-point precision. Re-basing the released greenhouse-gas contributions across 51 eGRID state records identified a cold-plate/one-phase-immersion crossover near 61 kg CO2e MWh−1: cold plate was lower only for Vermont among the observed states, whereas two-phase immersion remained lowest under the released model. Across the state range, embodied contributions increased from approximately 4% to 57-58% as electricity intensity declined. A contribution-weighted pedigree diagnostic ranked use-phase performance first and server inventories next as evidence-improvement priorities. Public server records showed a manufacturing median of 1,215 kg CO2e per server and a 465-2,503 kg CO2e range. ÖKOBAUDAT unit-process comparisons indicated 60% lower A1-A3 GHG for high-scrap electric-arc-furnace steel than a blast-furnace route and 50% lower GHG for CEM III than CEM II/A cement, but facility propagation is blocked until quantities are disclosed. The results show that open data can support new, decision-relevant deductions when incompatible units and evidence limits are not hidden. OpenDC-LCA complements rather than replaces openLCA or Brightway by supplying the cooling-specific engineering, evidence lineage, and claim governance needed for reproducible comparative research.</w:t>
+        <w:t>Liquid cooling can reduce data-center operating energy and water use, yet the preferred architecture depends on electricity supply, compute performance, hardware and fluid inventories, service life, climate, and the functional unit used for comparison. Existing studies establish the importance of these effects but are difficult to update or transfer because foreground bills of materials and background processes are often proprietary, operational performance is represented by annual averages, water consumption is rarely scarcity-weighted, and data-quality assessments are not connected to measurement priorities. We present OpenDC-LCA, an open-source, evidence-governed research layer that couples data-center cooling physics to general life-cycle assessment (LCA) tools while preserving source identity, functional unit, geography, transformation equations, uncertainty, and evidence status. A guided practitioner workflow converts a compact facility, cooling, electricity, water, equipment, and source record into the governed scenario schema and returns both a plain-language report and machine-readable results with contribution breakdowns, audit findings, evidence level, and next-data requirements. The framework supports openLCA JSON-LD and Brightway interoperability, hourly weather-load-performance integration, discrete and reliability-driven replacement, uncertainty analysis, and a machine-readable claim gate. We use released Microsoft/WSP results, EPA eGRID 2023, 48 Boavizta server product-carbon-footprint records, selected ÖKOBAUDAT construction processes, NOAA weather data, and the released Microsoft pedigree assessment to demonstrate analyses that cannot be obtained from any source alone. All 24 released normalized totals were independently reconciled to floating-point precision. Re-basing the released greenhouse-gas contributions across 51 eGRID state records identified a cold-plate/one-phase-immersion crossover near 61 kg CO2e MWh−1: cold plate was lower only for Vermont among the observed states, whereas two-phase immersion remained lowest under the released model. Across the state range, embodied contributions increased from approximately 4% to 57-58% as electricity intensity declined. A contribution-weighted pedigree diagnostic ranked use-phase performance first and server inventories next as evidence-improvement priorities. Public server records showed a manufacturing median of 1,215 kg CO2e per server and a 465-2,503 kg CO2e range. ÖKOBAUDAT unit-process comparisons indicated 60% lower A1-A3 GHG for high-scrap electric-arc-furnace steel than a blast-furnace route and 50% lower GHG for CEM III than CEM II/A cement, but facility propagation is blocked until quantities are disclosed. The results show that open data can support new, decision-relevant deductions when incompatible units and evidence limits are not hidden. OpenDC-LCA complements rather than replaces openLCA or Brightway by supplying the cooling-specific engineering, evidence lineage, and claim governance needed for reproducible comparative research.</w:t>
       </w:r>
     </w:p>
     <w:p>
@@ -542,7 +542,7 @@
           <w:rFonts w:ascii="Calibri" w:hAnsi="Calibri"/>
           <w:sz w:val="21"/>
         </w:rPr>
-        <w:t>The framework is implemented in Python 3.10 or later and distributed under the MIT License [4]. Version 1.1 exposes validated scenario analysis, performance-map summarization, scientific audit functions, report generation, a local browser-based GUI, complete openLCA JSON-LD process exchange, and Brightway database-write mappings. The GUI binds to the local host by default and does not alter the data model or calculation path.</w:t>
+        <w:t>The framework is implemented in Python 3.10 or later and distributed under the MIT License [4]. Version 1.1.0 exposes validated scenario analysis, performance-map summarization, scientific audit functions, report generation, a local browser-based GUI, complete openLCA JSON-LD process exchange, and Brightway database-write mappings. For first-time users, a compact input contract requests IT capacity, utilization, PUE, facility lifetime, onsite water, three electricity factors, optional aggregate cooling equipment, and a citable source record. The software expands this record into the governed scenario schema before calculation; it does not maintain a separate simplified model. The resulting practitioner report includes annual and per-IT-MWh impacts, contributions, automated evidence classification, warnings or blockers, and the specific evidence required to strengthen the study. The GUI binds to the local host by default and does not alter the data model or calculation path.</w:t>
       </w:r>
     </w:p>
     <w:p>
@@ -3389,6 +3389,775 @@
     </w:p>
     <w:p>
       <w:pPr>
+        <w:pStyle w:val="Heading2"/>
+      </w:pPr>
+      <w:r>
+        <w:t>4.8. Practitioner workflow and release verification</w:t>
+      </w:r>
+    </w:p>
+    <w:p>
+      <w:r>
+        <w:rPr>
+          <w:rFonts w:ascii="Calibri" w:hAnsi="Calibri"/>
+          <w:sz w:val="21"/>
+        </w:rPr>
+        <w:t>The v1.1.0 practitioner path reduces the minimum viable screening study to the input-output contract in Table 2. It is available through four command-line operations (</w:t>
+      </w:r>
+      <w:r>
+        <w:rPr>
+          <w:rFonts w:ascii="Courier New" w:hAnsi="Courier New"/>
+          <w:color w:val="17324D"/>
+          <w:sz w:val="20"/>
+        </w:rPr>
+        <w:t>capabilities</w:t>
+      </w:r>
+      <w:r>
+        <w:rPr>
+          <w:rFonts w:ascii="Calibri" w:hAnsi="Calibri"/>
+          <w:sz w:val="21"/>
+        </w:rPr>
+        <w:t xml:space="preserve">, </w:t>
+      </w:r>
+      <w:r>
+        <w:rPr>
+          <w:rFonts w:ascii="Courier New" w:hAnsi="Courier New"/>
+          <w:color w:val="17324D"/>
+          <w:sz w:val="20"/>
+        </w:rPr>
+        <w:t>new-study</w:t>
+      </w:r>
+      <w:r>
+        <w:rPr>
+          <w:rFonts w:ascii="Calibri" w:hAnsi="Calibri"/>
+          <w:sz w:val="21"/>
+        </w:rPr>
+        <w:t xml:space="preserve">, </w:t>
+      </w:r>
+      <w:r>
+        <w:rPr>
+          <w:rFonts w:ascii="Courier New" w:hAnsi="Courier New"/>
+          <w:color w:val="17324D"/>
+          <w:sz w:val="20"/>
+        </w:rPr>
+        <w:t>prepare-study</w:t>
+      </w:r>
+      <w:r>
+        <w:rPr>
+          <w:rFonts w:ascii="Calibri" w:hAnsi="Calibri"/>
+          <w:sz w:val="21"/>
+        </w:rPr>
+        <w:t xml:space="preserve">, and </w:t>
+      </w:r>
+      <w:r>
+        <w:rPr>
+          <w:rFonts w:ascii="Courier New" w:hAnsi="Courier New"/>
+          <w:color w:val="17324D"/>
+          <w:sz w:val="20"/>
+        </w:rPr>
+        <w:t>practitioner-report</w:t>
+      </w:r>
+      <w:r>
+        <w:rPr>
+          <w:rFonts w:ascii="Calibri" w:hAnsi="Calibri"/>
+          <w:sz w:val="21"/>
+        </w:rPr>
+        <w:t>), corresponding Python API calls, and the guided local interface. Both practitioner interfaces first create the full governed scenario and then call the same analysis and audit functions used by the advanced workflow. Thus, ease of entry does not bypass provenance, unit, boundary, or evidence checks.</w:t>
+      </w:r>
+    </w:p>
+    <w:p>
+      <w:pPr>
+        <w:pStyle w:val="Caption"/>
+        <w:keepNext/>
+      </w:pPr>
+      <w:r>
+        <w:rPr>
+          <w:rFonts w:ascii="Calibri" w:hAnsi="Calibri"/>
+          <w:sz w:val="18"/>
+        </w:rPr>
+        <w:t>Table 2. Compact practitioner input-output contract in OpenDC-LCA v1.1.0.</w:t>
+      </w:r>
+    </w:p>
+    <w:tbl>
+      <w:tblPr>
+        <w:tblStyle w:val="TableGrid"/>
+        <w:tblW w:type="dxa" w:w="9360"/>
+        <w:tblLayout w:type="fixed"/>
+        <w:tblLook w:firstColumn="1" w:firstRow="1" w:lastColumn="0" w:lastRow="0" w:noHBand="0" w:noVBand="1" w:val="04A0"/>
+        <w:tblInd w:w="120" w:type="dxa"/>
+      </w:tblPr>
+      <w:tblGrid>
+        <w:gridCol w:w="2340"/>
+        <w:gridCol w:w="2340"/>
+        <w:gridCol w:w="2340"/>
+        <w:gridCol w:w="2340"/>
+      </w:tblGrid>
+      <w:tr>
+        <w:trPr>
+          <w:tblHeader w:val="true"/>
+        </w:trPr>
+        <w:tc>
+          <w:tcPr>
+            <w:tcW w:type="dxa" w:w="2340"/>
+            <w:vAlign w:val="center"/>
+            <w:shd w:fill="1F4E79"/>
+            <w:tcMar>
+              <w:top w:w="80" w:type="dxa"/>
+              <w:start w:w="120" w:type="dxa"/>
+              <w:bottom w:w="80" w:type="dxa"/>
+              <w:end w:w="120" w:type="dxa"/>
+            </w:tcMar>
+          </w:tcPr>
+          <w:p>
+            <w:pPr>
+              <w:spacing w:after="0" w:line="240" w:lineRule="auto"/>
+              <w:jc w:val="left"/>
+            </w:pPr>
+            <w:r>
+              <w:rPr>
+                <w:rFonts w:ascii="Calibri" w:hAnsi="Calibri"/>
+                <w:b/>
+                <w:color w:val="FFFFFF"/>
+                <w:sz w:val="18"/>
+              </w:rPr>
+              <w:t>Stage</w:t>
+            </w:r>
+          </w:p>
+        </w:tc>
+        <w:tc>
+          <w:tcPr>
+            <w:tcW w:type="dxa" w:w="2340"/>
+            <w:vAlign w:val="center"/>
+            <w:shd w:fill="1F4E79"/>
+            <w:tcMar>
+              <w:top w:w="80" w:type="dxa"/>
+              <w:start w:w="120" w:type="dxa"/>
+              <w:bottom w:w="80" w:type="dxa"/>
+              <w:end w:w="120" w:type="dxa"/>
+            </w:tcMar>
+          </w:tcPr>
+          <w:p>
+            <w:pPr>
+              <w:spacing w:after="0" w:line="240" w:lineRule="auto"/>
+              <w:jc w:val="left"/>
+            </w:pPr>
+            <w:r>
+              <w:rPr>
+                <w:rFonts w:ascii="Calibri" w:hAnsi="Calibri"/>
+                <w:b/>
+                <w:color w:val="FFFFFF"/>
+                <w:sz w:val="18"/>
+              </w:rPr>
+              <w:t>User-supplied information</w:t>
+            </w:r>
+          </w:p>
+        </w:tc>
+        <w:tc>
+          <w:tcPr>
+            <w:tcW w:type="dxa" w:w="2340"/>
+            <w:vAlign w:val="center"/>
+            <w:shd w:fill="1F4E79"/>
+            <w:tcMar>
+              <w:top w:w="80" w:type="dxa"/>
+              <w:start w:w="120" w:type="dxa"/>
+              <w:bottom w:w="80" w:type="dxa"/>
+              <w:end w:w="120" w:type="dxa"/>
+            </w:tcMar>
+          </w:tcPr>
+          <w:p>
+            <w:pPr>
+              <w:spacing w:after="0" w:line="240" w:lineRule="auto"/>
+              <w:jc w:val="left"/>
+            </w:pPr>
+            <w:r>
+              <w:rPr>
+                <w:rFonts w:ascii="Calibri" w:hAnsi="Calibri"/>
+                <w:b/>
+                <w:color w:val="FFFFFF"/>
+                <w:sz w:val="18"/>
+              </w:rPr>
+              <w:t>Machine action</w:t>
+            </w:r>
+          </w:p>
+        </w:tc>
+        <w:tc>
+          <w:tcPr>
+            <w:tcW w:type="dxa" w:w="2340"/>
+            <w:vAlign w:val="center"/>
+            <w:shd w:fill="1F4E79"/>
+            <w:tcMar>
+              <w:top w:w="80" w:type="dxa"/>
+              <w:start w:w="120" w:type="dxa"/>
+              <w:bottom w:w="80" w:type="dxa"/>
+              <w:end w:w="120" w:type="dxa"/>
+            </w:tcMar>
+          </w:tcPr>
+          <w:p>
+            <w:pPr>
+              <w:spacing w:after="0" w:line="240" w:lineRule="auto"/>
+              <w:jc w:val="left"/>
+            </w:pPr>
+            <w:r>
+              <w:rPr>
+                <w:rFonts w:ascii="Calibri" w:hAnsi="Calibri"/>
+                <w:b/>
+                <w:color w:val="FFFFFF"/>
+                <w:sz w:val="18"/>
+              </w:rPr>
+              <w:t>Principal output</w:t>
+            </w:r>
+          </w:p>
+        </w:tc>
+      </w:tr>
+      <w:tr>
+        <w:tc>
+          <w:tcPr>
+            <w:tcW w:type="dxa" w:w="2340"/>
+            <w:vAlign w:val="center"/>
+            <w:tcMar>
+              <w:top w:w="80" w:type="dxa"/>
+              <w:start w:w="120" w:type="dxa"/>
+              <w:bottom w:w="80" w:type="dxa"/>
+              <w:end w:w="120" w:type="dxa"/>
+            </w:tcMar>
+          </w:tcPr>
+          <w:p>
+            <w:pPr>
+              <w:spacing w:after="0" w:line="240" w:lineRule="auto"/>
+              <w:jc w:val="left"/>
+            </w:pPr>
+            <w:r>
+              <w:rPr>
+                <w:rFonts w:ascii="Calibri" w:hAnsi="Calibri"/>
+                <w:sz w:val="18"/>
+              </w:rPr>
+              <w:t>Define facility</w:t>
+            </w:r>
+          </w:p>
+        </w:tc>
+        <w:tc>
+          <w:tcPr>
+            <w:tcW w:type="dxa" w:w="2340"/>
+            <w:vAlign w:val="center"/>
+            <w:tcMar>
+              <w:top w:w="80" w:type="dxa"/>
+              <w:start w:w="120" w:type="dxa"/>
+              <w:bottom w:w="80" w:type="dxa"/>
+              <w:end w:w="120" w:type="dxa"/>
+            </w:tcMar>
+          </w:tcPr>
+          <w:p>
+            <w:pPr>
+              <w:spacing w:after="0" w:line="240" w:lineRule="auto"/>
+              <w:jc w:val="left"/>
+            </w:pPr>
+            <w:r>
+              <w:rPr>
+                <w:rFonts w:ascii="Calibri" w:hAnsi="Calibri"/>
+                <w:sz w:val="18"/>
+              </w:rPr>
+              <w:t>Study name, cooling architecture, geography, reference year, IT capacity, capacity factor, PUE, lifetime and onsite water</w:t>
+            </w:r>
+          </w:p>
+        </w:tc>
+        <w:tc>
+          <w:tcPr>
+            <w:tcW w:type="dxa" w:w="2340"/>
+            <w:vAlign w:val="center"/>
+            <w:tcMar>
+              <w:top w:w="80" w:type="dxa"/>
+              <w:start w:w="120" w:type="dxa"/>
+              <w:bottom w:w="80" w:type="dxa"/>
+              <w:end w:w="120" w:type="dxa"/>
+            </w:tcMar>
+          </w:tcPr>
+          <w:p>
+            <w:pPr>
+              <w:spacing w:after="0" w:line="240" w:lineRule="auto"/>
+              <w:jc w:val="left"/>
+            </w:pPr>
+            <w:r>
+              <w:rPr>
+                <w:rFonts w:ascii="Calibri" w:hAnsi="Calibri"/>
+                <w:sz w:val="18"/>
+              </w:rPr>
+              <w:t>Validate physical ranges and compute annual IT and facility electricity</w:t>
+            </w:r>
+          </w:p>
+        </w:tc>
+        <w:tc>
+          <w:tcPr>
+            <w:tcW w:type="dxa" w:w="2340"/>
+            <w:vAlign w:val="center"/>
+            <w:tcMar>
+              <w:top w:w="80" w:type="dxa"/>
+              <w:start w:w="120" w:type="dxa"/>
+              <w:bottom w:w="80" w:type="dxa"/>
+              <w:end w:w="120" w:type="dxa"/>
+            </w:tcMar>
+          </w:tcPr>
+          <w:p>
+            <w:pPr>
+              <w:spacing w:after="0" w:line="240" w:lineRule="auto"/>
+              <w:jc w:val="left"/>
+            </w:pPr>
+            <w:r>
+              <w:rPr>
+                <w:rFonts w:ascii="Calibri" w:hAnsi="Calibri"/>
+                <w:sz w:val="18"/>
+              </w:rPr>
+              <w:t>Transparent operating basis</w:t>
+            </w:r>
+          </w:p>
+        </w:tc>
+      </w:tr>
+      <w:tr>
+        <w:tc>
+          <w:tcPr>
+            <w:tcW w:type="dxa" w:w="2340"/>
+            <w:vAlign w:val="center"/>
+            <w:tcMar>
+              <w:top w:w="80" w:type="dxa"/>
+              <w:start w:w="120" w:type="dxa"/>
+              <w:bottom w:w="80" w:type="dxa"/>
+              <w:end w:w="120" w:type="dxa"/>
+            </w:tcMar>
+          </w:tcPr>
+          <w:p>
+            <w:pPr>
+              <w:spacing w:after="0" w:line="240" w:lineRule="auto"/>
+              <w:jc w:val="left"/>
+            </w:pPr>
+            <w:r>
+              <w:rPr>
+                <w:rFonts w:ascii="Calibri" w:hAnsi="Calibri"/>
+                <w:sz w:val="18"/>
+              </w:rPr>
+              <w:t>Add electricity</w:t>
+            </w:r>
+          </w:p>
+        </w:tc>
+        <w:tc>
+          <w:tcPr>
+            <w:tcW w:type="dxa" w:w="2340"/>
+            <w:vAlign w:val="center"/>
+            <w:tcMar>
+              <w:top w:w="80" w:type="dxa"/>
+              <w:start w:w="120" w:type="dxa"/>
+              <w:bottom w:w="80" w:type="dxa"/>
+              <w:end w:w="120" w:type="dxa"/>
+            </w:tcMar>
+          </w:tcPr>
+          <w:p>
+            <w:pPr>
+              <w:spacing w:after="0" w:line="240" w:lineRule="auto"/>
+              <w:jc w:val="left"/>
+            </w:pPr>
+            <w:r>
+              <w:rPr>
+                <w:rFonts w:ascii="Calibri" w:hAnsi="Calibri"/>
+                <w:sz w:val="18"/>
+              </w:rPr>
+              <w:t>Location-based GHG, primary-energy and blue-water factors with compatible accounting basis</w:t>
+            </w:r>
+          </w:p>
+        </w:tc>
+        <w:tc>
+          <w:tcPr>
+            <w:tcW w:type="dxa" w:w="2340"/>
+            <w:vAlign w:val="center"/>
+            <w:tcMar>
+              <w:top w:w="80" w:type="dxa"/>
+              <w:start w:w="120" w:type="dxa"/>
+              <w:bottom w:w="80" w:type="dxa"/>
+              <w:end w:w="120" w:type="dxa"/>
+            </w:tcMar>
+          </w:tcPr>
+          <w:p>
+            <w:pPr>
+              <w:spacing w:after="0" w:line="240" w:lineRule="auto"/>
+              <w:jc w:val="left"/>
+            </w:pPr>
+            <w:r>
+              <w:rPr>
+                <w:rFonts w:ascii="Calibri" w:hAnsi="Calibri"/>
+                <w:sz w:val="18"/>
+              </w:rPr>
+              <w:t>Apply factors to annual facility electricity</w:t>
+            </w:r>
+          </w:p>
+        </w:tc>
+        <w:tc>
+          <w:tcPr>
+            <w:tcW w:type="dxa" w:w="2340"/>
+            <w:vAlign w:val="center"/>
+            <w:tcMar>
+              <w:top w:w="80" w:type="dxa"/>
+              <w:start w:w="120" w:type="dxa"/>
+              <w:bottom w:w="80" w:type="dxa"/>
+              <w:end w:w="120" w:type="dxa"/>
+            </w:tcMar>
+          </w:tcPr>
+          <w:p>
+            <w:pPr>
+              <w:spacing w:after="0" w:line="240" w:lineRule="auto"/>
+              <w:jc w:val="left"/>
+            </w:pPr>
+            <w:r>
+              <w:rPr>
+                <w:rFonts w:ascii="Calibri" w:hAnsi="Calibri"/>
+                <w:sz w:val="18"/>
+              </w:rPr>
+              <w:t>Annual and per-IT-MWh operational impacts</w:t>
+            </w:r>
+          </w:p>
+        </w:tc>
+      </w:tr>
+      <w:tr>
+        <w:tc>
+          <w:tcPr>
+            <w:tcW w:type="dxa" w:w="2340"/>
+            <w:vAlign w:val="center"/>
+            <w:tcMar>
+              <w:top w:w="80" w:type="dxa"/>
+              <w:start w:w="120" w:type="dxa"/>
+              <w:bottom w:w="80" w:type="dxa"/>
+              <w:end w:w="120" w:type="dxa"/>
+            </w:tcMar>
+          </w:tcPr>
+          <w:p>
+            <w:pPr>
+              <w:spacing w:after="0" w:line="240" w:lineRule="auto"/>
+              <w:jc w:val="left"/>
+            </w:pPr>
+            <w:r>
+              <w:rPr>
+                <w:rFonts w:ascii="Calibri" w:hAnsi="Calibri"/>
+                <w:sz w:val="18"/>
+              </w:rPr>
+              <w:t>Add equipment, if known</w:t>
+            </w:r>
+          </w:p>
+        </w:tc>
+        <w:tc>
+          <w:tcPr>
+            <w:tcW w:type="dxa" w:w="2340"/>
+            <w:vAlign w:val="center"/>
+            <w:tcMar>
+              <w:top w:w="80" w:type="dxa"/>
+              <w:start w:w="120" w:type="dxa"/>
+              <w:bottom w:w="80" w:type="dxa"/>
+              <w:end w:w="120" w:type="dxa"/>
+            </w:tcMar>
+          </w:tcPr>
+          <w:p>
+            <w:pPr>
+              <w:spacing w:after="0" w:line="240" w:lineRule="auto"/>
+              <w:jc w:val="left"/>
+            </w:pPr>
+            <w:r>
+              <w:rPr>
+                <w:rFonts w:ascii="Calibri" w:hAnsi="Calibri"/>
+                <w:sz w:val="18"/>
+              </w:rPr>
+              <w:t>Quantity, service life, production and end-of-life impacts</w:t>
+            </w:r>
+          </w:p>
+        </w:tc>
+        <w:tc>
+          <w:tcPr>
+            <w:tcW w:type="dxa" w:w="2340"/>
+            <w:vAlign w:val="center"/>
+            <w:tcMar>
+              <w:top w:w="80" w:type="dxa"/>
+              <w:start w:w="120" w:type="dxa"/>
+              <w:bottom w:w="80" w:type="dxa"/>
+              <w:end w:w="120" w:type="dxa"/>
+            </w:tcMar>
+          </w:tcPr>
+          <w:p>
+            <w:pPr>
+              <w:spacing w:after="0" w:line="240" w:lineRule="auto"/>
+              <w:jc w:val="left"/>
+            </w:pPr>
+            <w:r>
+              <w:rPr>
+                <w:rFonts w:ascii="Calibri" w:hAnsi="Calibri"/>
+                <w:sz w:val="18"/>
+              </w:rPr>
+              <w:t>Annualize production and replacement over the study period</w:t>
+            </w:r>
+          </w:p>
+        </w:tc>
+        <w:tc>
+          <w:tcPr>
+            <w:tcW w:type="dxa" w:w="2340"/>
+            <w:vAlign w:val="center"/>
+            <w:tcMar>
+              <w:top w:w="80" w:type="dxa"/>
+              <w:start w:w="120" w:type="dxa"/>
+              <w:bottom w:w="80" w:type="dxa"/>
+              <w:end w:w="120" w:type="dxa"/>
+            </w:tcMar>
+          </w:tcPr>
+          <w:p>
+            <w:pPr>
+              <w:spacing w:after="0" w:line="240" w:lineRule="auto"/>
+              <w:jc w:val="left"/>
+            </w:pPr>
+            <w:r>
+              <w:rPr>
+                <w:rFonts w:ascii="Calibri" w:hAnsi="Calibri"/>
+                <w:sz w:val="18"/>
+              </w:rPr>
+              <w:t>Operational-plus-equipment totals and contribution shares</w:t>
+            </w:r>
+          </w:p>
+        </w:tc>
+      </w:tr>
+      <w:tr>
+        <w:tc>
+          <w:tcPr>
+            <w:tcW w:type="dxa" w:w="2340"/>
+            <w:vAlign w:val="center"/>
+            <w:tcMar>
+              <w:top w:w="80" w:type="dxa"/>
+              <w:start w:w="120" w:type="dxa"/>
+              <w:bottom w:w="80" w:type="dxa"/>
+              <w:end w:w="120" w:type="dxa"/>
+            </w:tcMar>
+          </w:tcPr>
+          <w:p>
+            <w:pPr>
+              <w:spacing w:after="0" w:line="240" w:lineRule="auto"/>
+              <w:jc w:val="left"/>
+            </w:pPr>
+            <w:r>
+              <w:rPr>
+                <w:rFonts w:ascii="Calibri" w:hAnsi="Calibri"/>
+                <w:sz w:val="18"/>
+              </w:rPr>
+              <w:t>Register evidence</w:t>
+            </w:r>
+          </w:p>
+        </w:tc>
+        <w:tc>
+          <w:tcPr>
+            <w:tcW w:type="dxa" w:w="2340"/>
+            <w:vAlign w:val="center"/>
+            <w:tcMar>
+              <w:top w:w="80" w:type="dxa"/>
+              <w:start w:w="120" w:type="dxa"/>
+              <w:bottom w:w="80" w:type="dxa"/>
+              <w:end w:w="120" w:type="dxa"/>
+            </w:tcMar>
+          </w:tcPr>
+          <w:p>
+            <w:pPr>
+              <w:spacing w:after="0" w:line="240" w:lineRule="auto"/>
+              <w:jc w:val="left"/>
+            </w:pPr>
+            <w:r>
+              <w:rPr>
+                <w:rFonts w:ascii="Calibri" w:hAnsi="Calibri"/>
+                <w:sz w:val="18"/>
+              </w:rPr>
+              <w:t>Source ID, title, citation, license, quality, uncertainty, review and confidentiality status</w:t>
+            </w:r>
+          </w:p>
+        </w:tc>
+        <w:tc>
+          <w:tcPr>
+            <w:tcW w:type="dxa" w:w="2340"/>
+            <w:vAlign w:val="center"/>
+            <w:tcMar>
+              <w:top w:w="80" w:type="dxa"/>
+              <w:start w:w="120" w:type="dxa"/>
+              <w:bottom w:w="80" w:type="dxa"/>
+              <w:end w:w="120" w:type="dxa"/>
+            </w:tcMar>
+          </w:tcPr>
+          <w:p>
+            <w:pPr>
+              <w:spacing w:after="0" w:line="240" w:lineRule="auto"/>
+              <w:jc w:val="left"/>
+            </w:pPr>
+            <w:r>
+              <w:rPr>
+                <w:rFonts w:ascii="Calibri" w:hAnsi="Calibri"/>
+                <w:sz w:val="18"/>
+              </w:rPr>
+              <w:t>Preserve metadata in the governed scenario and run the scientific audit</w:t>
+            </w:r>
+          </w:p>
+        </w:tc>
+        <w:tc>
+          <w:tcPr>
+            <w:tcW w:type="dxa" w:w="2340"/>
+            <w:vAlign w:val="center"/>
+            <w:tcMar>
+              <w:top w:w="80" w:type="dxa"/>
+              <w:start w:w="120" w:type="dxa"/>
+              <w:bottom w:w="80" w:type="dxa"/>
+              <w:end w:w="120" w:type="dxa"/>
+            </w:tcMar>
+          </w:tcPr>
+          <w:p>
+            <w:pPr>
+              <w:spacing w:after="0" w:line="240" w:lineRule="auto"/>
+              <w:jc w:val="left"/>
+            </w:pPr>
+            <w:r>
+              <w:rPr>
+                <w:rFonts w:ascii="Calibri" w:hAnsi="Calibri"/>
+                <w:sz w:val="18"/>
+              </w:rPr>
+              <w:t>Traceable evidence level, warnings and blockers</w:t>
+            </w:r>
+          </w:p>
+        </w:tc>
+      </w:tr>
+      <w:tr>
+        <w:tc>
+          <w:tcPr>
+            <w:tcW w:type="dxa" w:w="2340"/>
+            <w:vAlign w:val="center"/>
+            <w:tcMar>
+              <w:top w:w="80" w:type="dxa"/>
+              <w:start w:w="120" w:type="dxa"/>
+              <w:bottom w:w="80" w:type="dxa"/>
+              <w:end w:w="120" w:type="dxa"/>
+            </w:tcMar>
+          </w:tcPr>
+          <w:p>
+            <w:pPr>
+              <w:spacing w:after="0" w:line="240" w:lineRule="auto"/>
+              <w:jc w:val="left"/>
+            </w:pPr>
+            <w:r>
+              <w:rPr>
+                <w:rFonts w:ascii="Calibri" w:hAnsi="Calibri"/>
+                <w:sz w:val="18"/>
+              </w:rPr>
+              <w:t>Export decision record</w:t>
+            </w:r>
+          </w:p>
+        </w:tc>
+        <w:tc>
+          <w:tcPr>
+            <w:tcW w:type="dxa" w:w="2340"/>
+            <w:vAlign w:val="center"/>
+            <w:tcMar>
+              <w:top w:w="80" w:type="dxa"/>
+              <w:start w:w="120" w:type="dxa"/>
+              <w:bottom w:w="80" w:type="dxa"/>
+              <w:end w:w="120" w:type="dxa"/>
+            </w:tcMar>
+          </w:tcPr>
+          <w:p>
+            <w:pPr>
+              <w:spacing w:after="0" w:line="240" w:lineRule="auto"/>
+              <w:jc w:val="left"/>
+            </w:pPr>
+            <w:r>
+              <w:rPr>
+                <w:rFonts w:ascii="Calibri" w:hAnsi="Calibri"/>
+                <w:sz w:val="18"/>
+              </w:rPr>
+              <w:t>No additional input</w:t>
+            </w:r>
+          </w:p>
+        </w:tc>
+        <w:tc>
+          <w:tcPr>
+            <w:tcW w:type="dxa" w:w="2340"/>
+            <w:vAlign w:val="center"/>
+            <w:tcMar>
+              <w:top w:w="80" w:type="dxa"/>
+              <w:start w:w="120" w:type="dxa"/>
+              <w:bottom w:w="80" w:type="dxa"/>
+              <w:end w:w="120" w:type="dxa"/>
+            </w:tcMar>
+          </w:tcPr>
+          <w:p>
+            <w:pPr>
+              <w:spacing w:after="0" w:line="240" w:lineRule="auto"/>
+              <w:jc w:val="left"/>
+            </w:pPr>
+            <w:r>
+              <w:rPr>
+                <w:rFonts w:ascii="Calibri" w:hAnsi="Calibri"/>
+                <w:sz w:val="18"/>
+              </w:rPr>
+              <w:t>Serialize the same calculation and audit result for people and software</w:t>
+            </w:r>
+          </w:p>
+        </w:tc>
+        <w:tc>
+          <w:tcPr>
+            <w:tcW w:type="dxa" w:w="2340"/>
+            <w:vAlign w:val="center"/>
+            <w:tcMar>
+              <w:top w:w="80" w:type="dxa"/>
+              <w:start w:w="120" w:type="dxa"/>
+              <w:bottom w:w="80" w:type="dxa"/>
+              <w:end w:w="120" w:type="dxa"/>
+            </w:tcMar>
+          </w:tcPr>
+          <w:p>
+            <w:pPr>
+              <w:spacing w:after="0" w:line="240" w:lineRule="auto"/>
+              <w:jc w:val="left"/>
+            </w:pPr>
+            <w:r>
+              <w:rPr>
+                <w:rFonts w:ascii="Courier New" w:hAnsi="Courier New"/>
+                <w:color w:val="17324D"/>
+                <w:sz w:val="17"/>
+              </w:rPr>
+              <w:t>PRACTITIONER_REPORT.md</w:t>
+            </w:r>
+            <w:r>
+              <w:rPr>
+                <w:rFonts w:ascii="Calibri" w:hAnsi="Calibri"/>
+                <w:sz w:val="18"/>
+              </w:rPr>
+              <w:t xml:space="preserve">, </w:t>
+            </w:r>
+            <w:r>
+              <w:rPr>
+                <w:rFonts w:ascii="Courier New" w:hAnsi="Courier New"/>
+                <w:color w:val="17324D"/>
+                <w:sz w:val="17"/>
+              </w:rPr>
+              <w:t>practitioner-results.json</w:t>
+            </w:r>
+            <w:r>
+              <w:rPr>
+                <w:rFonts w:ascii="Calibri" w:hAnsi="Calibri"/>
+                <w:sz w:val="18"/>
+              </w:rPr>
+              <w:t>, model version and scenario SHA-256 digest</w:t>
+            </w:r>
+          </w:p>
+        </w:tc>
+      </w:tr>
+    </w:tbl>
+    <w:p>
+      <w:pPr>
+        <w:spacing w:after="40"/>
+      </w:pPr>
+    </w:p>
+    <w:p>
+      <w:r>
+        <w:rPr>
+          <w:rFonts w:ascii="Calibri" w:hAnsi="Calibri"/>
+          <w:sz w:val="21"/>
+        </w:rPr>
+        <w:t>The public release was checked at three levels. First, 40 automated tests cover the calculation engine, provenance and claim gate, performance maps, uncertainty, reports, interoperability, reliability, API, GUI endpoints, and the end-to-end practitioner commands. Second, the wheel was installed in a clean Python 3.12 environment and the practitioner workflow was executed from template creation through report generation. Third, the tagged GitHub release contains both wheel and source-distribution artifacts produced by the release workflow. These checks establish installation and software consistency; they do not constitute ISO critical review or validate user-supplied factors.</w:t>
+      </w:r>
+    </w:p>
+    <w:p>
+      <w:pPr>
         <w:pStyle w:val="Heading1"/>
       </w:pPr>
       <w:r>
@@ -3545,6 +4314,32 @@
     </w:p>
     <w:p>
       <w:pPr>
+        <w:pStyle w:val="Heading2"/>
+      </w:pPr>
+      <w:r>
+        <w:t>5.6. Practitioner use and interpretation boundary</w:t>
+      </w:r>
+    </w:p>
+    <w:p>
+      <w:r>
+        <w:rPr>
+          <w:rFonts w:ascii="Calibri" w:hAnsi="Calibri"/>
+          <w:sz w:val="21"/>
+        </w:rPr>
+        <w:t>The guided workflow makes the framework usable before a complete bill of materials is available, but it labels the consequence. A study without equipment data is identified as operational-only; a zero factor is treated as zero rather than as an undocumented unknown; and omitted fluids, reliability, hourly variation, scarcity characterization, or compute-performance effects remain visible in the capability boundary and next-data list. This is a deliberate adoption strategy: practitioners can obtain a reproducible screening result immediately while receiving an explicit acquisition plan for decision-grade evidence.</w:t>
+      </w:r>
+    </w:p>
+    <w:p>
+      <w:r>
+        <w:rPr>
+          <w:rFonts w:ascii="Calibri" w:hAnsi="Calibri"/>
+          <w:sz w:val="21"/>
+        </w:rPr>
+        <w:t>The human-readable and JSON outputs serve different users without creating two scientific records. The report supports engineering review and procurement discussion, whereas the JSON result supports portfolio aggregation, dashboards, scripted comparisons, and archival. Model version and scenario digest make the result attributable to a specific calculation and governed input. Comparative communication remains conditional on the automated claim gate and, for public assertions, independent critical review.</w:t>
+      </w:r>
+    </w:p>
+    <w:p>
+      <w:pPr>
         <w:pStyle w:val="Heading1"/>
       </w:pPr>
       <w:r>
@@ -3566,7 +4361,7 @@
           <w:rFonts w:ascii="Calibri" w:hAnsi="Calibri"/>
           <w:sz w:val="21"/>
         </w:rPr>
-        <w:t>These findings support three conclusions. First, cooling rankings should be reported as decision surfaces with crossover conditions, not universal league tables. Second, decarbonized operation makes server performance, manufacturing, lifetime and architecture-specific material quantities first-order LCA data. Third, contribution-weighted data quality can convert an LCA into a prioritized experimental and data-acquisition program. OpenDC-LCA operationalizes these principles through traceable source registration, temporal performance maps, reliability, openLCA/Brightway exchange and machine-readable claim gates. The remaining barrier to a public decision-grade benchmark is evidence: harmonized bills of quantities, measured operating surfaces, time- and watershed-resolved factors, and independent critical review.</w:t>
+        <w:t>These findings support three conclusions. First, cooling rankings should be reported as decision surfaces with crossover conditions, not universal league tables. Second, decarbonized operation makes server performance, manufacturing, lifetime and architecture-specific material quantities first-order LCA data. Third, contribution-weighted data quality can convert an LCA into a prioritized experimental and data-acquisition program. OpenDC-LCA operationalizes these principles through traceable source registration, temporal performance maps, reliability, openLCA/Brightway exchange and machine-readable claim gates. The released v1.1.0 package also provides a guided path from a compact practitioner input to a governed scenario, plain-language report, machine-readable result, evidence classification, and next-data plan. This makes the framework usable for screening while preserving a visible boundary between calculated, omitted, and insufficiently supported effects. The remaining barrier to a public decision-grade benchmark is evidence: harmonized bills of quantities, measured operating surfaces, time- and watershed-resolved factors, and independent critical review.</w:t>
       </w:r>
     </w:p>
     <w:p>
@@ -3583,7 +4378,7 @@
           <w:rFonts w:ascii="Calibri" w:hAnsi="Calibri"/>
           <w:sz w:val="21"/>
         </w:rPr>
-        <w:t>OpenDC-LCA version 1.1 source code, examples, documentation, tests, and derived paper tables and figures are available at https://github.com/UARK-NED3/OpenDC-LCA. Provider-native raw files remain local when redistribution permission has not been established. Released Microsoft/Nature model files are available from Zenodo [2]. EPA eGRID and NOAA TMY data are available from their respective public portals [5,6].</w:t>
+        <w:t>OpenDC-LCA version 1.1.0 source code, examples, documentation, tests, and derived paper tables and figures are available at https://github.com/UARK-NED3/OpenDC-LCA. Installable wheel and source archives are preserved in the tagged release at https://github.com/UARK-NED3/OpenDC-LCA/releases/tag/v1.1.0. The repository documents the guided interface, compact input contract, advanced schema, command-line interface, Python API, report fields, and current capability boundary. Provider-native raw files remain local when redistribution permission has not been established. Released Microsoft/Nature model files are available from Zenodo [2]. EPA eGRID and NOAA TMY data are available from their respective public portals [5,6].</w:t>
       </w:r>
     </w:p>
     <w:p>

</xml_diff>

<commit_message>
Expand manuscript for Applied Energy submission
</commit_message>
<xml_diff>
--- a/paper/OpenDC-LCA_manuscript.docx
+++ b/paper/OpenDC-LCA_manuscript.docx
@@ -14,7 +14,7 @@
           <w:color w:val="17324D"/>
           <w:sz w:val="42"/>
         </w:rPr>
-        <w:t>OpenDC-LCA: an evidence-governed framework for transferable life-cycle assessment of data-center cooling</w:t>
+        <w:t>Grid decarbonization changes the lifecycle value and evidence requirements of data-center cooling</w:t>
       </w:r>
     </w:p>
     <w:p>
@@ -87,7 +87,7 @@
           <w:rFonts w:ascii="Calibri" w:hAnsi="Calibri"/>
           <w:sz w:val="21"/>
         </w:rPr>
-        <w:t>Liquid cooling can reduce data-center operating energy and water use, yet the preferred architecture depends on electricity supply, compute performance, hardware and fluid inventories, service life, climate, and the functional unit used for comparison. Existing studies establish the importance of these effects but are difficult to update or transfer because foreground bills of materials and background processes are often proprietary, operational performance is represented by annual averages, water consumption is rarely scarcity-weighted, and data-quality assessments are not connected to measurement priorities. We present OpenDC-LCA, an open-source, evidence-governed research layer that couples data-center cooling physics to general life-cycle assessment (LCA) tools while preserving source identity, functional unit, geography, transformation equations, uncertainty, and evidence status. A guided practitioner workflow converts a compact facility, cooling, electricity, water, equipment, and source record into the governed scenario schema and returns both a plain-language report and machine-readable results with contribution breakdowns, audit findings, evidence level, and next-data requirements. The framework supports openLCA JSON-LD and Brightway interoperability, hourly weather-load-performance integration, discrete and reliability-driven replacement, uncertainty analysis, and a machine-readable claim gate. We use released Microsoft/WSP results, EPA eGRID 2023, 48 Boavizta server product-carbon-footprint records, selected ÖKOBAUDAT construction processes, NOAA weather data, and the released Microsoft pedigree assessment to demonstrate analyses that cannot be obtained from any source alone. All 24 released normalized totals were independently reconciled to floating-point precision. Re-basing the released greenhouse-gas contributions across 51 eGRID state records identified a cold-plate/one-phase-immersion crossover near 61 kg CO2e MWh−1: cold plate was lower only for Vermont among the observed states, whereas two-phase immersion remained lowest under the released model. Across the state range, embodied contributions increased from approximately 4% to 57-58% as electricity intensity declined. A contribution-weighted pedigree diagnostic ranked use-phase performance first and server inventories next as evidence-improvement priorities. Public server records showed a manufacturing median of 1,215 kg CO2e per server and a 465-2,503 kg CO2e range. ÖKOBAUDAT unit-process comparisons indicated 60% lower A1-A3 GHG for high-scrap electric-arc-furnace steel than a blast-furnace route and 50% lower GHG for CEM III than CEM II/A cement, but facility propagation is blocked until quantities are disclosed. The results show that open data can support new, decision-relevant deductions when incompatible units and evidence limits are not hidden. OpenDC-LCA complements rather than replaces openLCA or Brightway by supplying the cooling-specific engineering, evidence lineage, and claim governance needed for reproducible comparative research.</w:t>
+        <w:t>Liquid cooling can reduce data-center operating energy and water use, yet the preferred architecture depends on electricity supply, compute performance, hardware and fluid inventories, service life, climate, and the functional unit used for comparison. Existing studies establish the importance of these effects but are difficult to update or transfer because foreground bills of materials and background processes are often proprietary, operational performance is represented by annual averages, water consumption is rarely scarcity-weighted, and data-quality assessments are not connected to measurement priorities. We present OpenDC-LCA, an open-source, evidence-governed research layer that couples data-center cooling physics to general life-cycle assessment (LCA) tools while preserving source identity, functional unit, geography, transformation equations, uncertainty, and evidence status. A guided practitioner workflow converts a compact facility, cooling, electricity, water, equipment, and source record into the governed scenario schema and returns both a plain-language report and machine-readable results with contribution breakdowns, audit findings, evidence level, and next-data requirements. The framework supports openLCA JSON-LD and Brightway interoperability, hourly weather-load-performance integration, discrete and reliability-driven replacement, uncertainty analysis, and a machine-readable claim gate. We use released Microsoft/WSP results, EPA eGRID 2023, 48 Boavizta server product-carbon-footprint records, selected ÖKOBAUDAT construction processes, NOAA weather data, and the released Microsoft pedigree assessment to demonstrate analyses that cannot be obtained from any source alone. All 24 released normalized totals were independently reconciled to floating-point precision. Re-basing the released greenhouse-gas contributions across 51 eGRID state records identified a cold-plate/one-phase-immersion crossover near 61 kg CO2e MWh−1: cold plate was lower only for Vermont among the observed states, whereas two-phase immersion remained lowest under the released model. Extending the analysis to nine eGRID years and 459 state-year observations showed that the generation-weighted U.S. factor declined from 518 to 348 kg CO2e MWh−1 between 2012 and 2023, lowering the modeled air-cooled result by 30.3% but increasing its embodied share from 6.7% to 9.6%. Two-phase immersion remained lowest in every state-year and under a 0.38-2.06-fold server-inventory stress test, while its released use-phase advantage could deteriorate by a median 6.0% across 2023 states before losing first rank. By contrast, the cold-plate/one-phase ordering could reverse with a median 1.6% change in the cold-plate use-phase term, defining a demanding performance-validation target. Across the state range, embodied contributions increased from approximately 4% to 57-58% as electricity intensity declined. A contribution-weighted pedigree diagnostic ranked use-phase performance first and server inventories next as evidence-improvement priorities. Public server records showed a manufacturing median of 1,215 kg CO2e per server and a 465-2,503 kg CO2e range. ÖKOBAUDAT unit-process comparisons indicated 60% lower A1-A3 GHG for high-scrap electric-arc-furnace steel than a blast-furnace route and 50% lower GHG for CEM III than CEM II/A cement, but facility propagation is blocked until quantities are disclosed. The results show that open data can support new, decision-relevant deductions when incompatible units and evidence limits are not hidden. OpenDC-LCA complements rather than replaces openLCA or Brightway by supplying the cooling-specific engineering, evidence lineage, and claim governance needed for reproducible comparative research.</w:t>
       </w:r>
     </w:p>
     <w:p>
@@ -838,6 +838,24 @@
           <w:rFonts w:ascii="Calibri" w:hAnsi="Calibri"/>
           <w:sz w:val="21"/>
         </w:rPr>
+        <w:t>To evaluate temporal transferability, the same transformation was applied to EPA state total-output factors for 2012, 2014, 2016, and 2018-2023. Factors reported in pounds CO2e MWh−1 before the metric workbook were converted using 0.45359237 kg lb−1. A generation-weighted U.S. factor was recalculated for each release from state generation and emission rates. We then recorded the lowest-GHG architecture, percentage margin to the second-ranked architecture, embodied share, and regret of each alternative for every state-year. This historical analysis represents observed annual electricity-system conditions, not a forecast or marginal-dispatch model.</w:t>
+      </w:r>
+    </w:p>
+    <w:p>
+      <w:r>
+        <w:rPr>
+          <w:rFonts w:ascii="Calibri" w:hAnsi="Calibri"/>
+          <w:sz w:val="21"/>
+        </w:rPr>
+        <w:t>Ranking robustness was expressed as a use-phase break-even multiplier. For example, the multiplier applied to cold-plate use-phase impact that makes its total equal to one-phase immersion is m_CP=(I_1P-I_CP,emb)/ I_CP,use. A value of 0.984 means that a 1.6% reduction in the released cold-plate use-phase term would reverse that pairwise ordering. The analogous multiplier for two-phase immersion measures the degradation that can be tolerated before it loses first rank. These are deterministic break-even tests that define required experimental discrimination; they are not distributions of field performance.</w:t>
+      </w:r>
+    </w:p>
+    <w:p>
+      <w:r>
+        <w:rPr>
+          <w:rFonts w:ascii="Calibri" w:hAnsi="Calibri"/>
+          <w:sz w:val="21"/>
+        </w:rPr>
         <w:t>To translate the released pedigree matrix into a research priority, each component's mean grid-case GHG contribution share \bar{s_c was multiplied by its normalized mean pedigree weakness. With pedigree score q=1 best and q=5 worst,</w:t>
       </w:r>
     </w:p>
@@ -887,7 +905,7 @@
           <w:rFonts w:ascii="Calibri" w:hAnsi="Calibri"/>
           <w:sz w:val="21"/>
         </w:rPr>
-        <w:t xml:space="preserve"> products with total GHG, manufacturing share and lifetime. Manufacturing GHG was calculated as total product GHG multiplied by the reported manufacturing share and was not mixed with the Microsoft Vcore-year results. ÖKOBAUDAT A1-A3 processes were compared within matched product families using 100(1-I_alt/I_base). These per-kilogram reductions were not propagated to a facility because the necessary architecture-specific material quantities are not public.</w:t>
+        <w:t xml:space="preserve"> products with total GHG, manufacturing share and lifetime. Manufacturing GHG was calculated as total product GHG multiplied by the reported manufacturing share. To test ranking robustness without mixing incompatible absolute units, the minimum, quartile, median, and maximum annualized Boavizta values were divided by the empirical median and used only as multiplicative stress factors on the Microsoft compute, storage, and networking contributions. The resulting scenarios are not a probability distribution and do not assert that the public products are interchangeable. ÖKOBAUDAT A1-A3 processes were compared within matched product families using 100(1-I_alt/I_base). These per-kilogram reductions were not propagated to a facility because the necessary architecture-specific material quantities are not public.</w:t>
       </w:r>
     </w:p>
     <w:p>
@@ -1163,7 +1181,7 @@
         <w:pStyle w:val="Heading2"/>
       </w:pPr>
       <w:r>
-        <w:t>3.2. EPA eGRID geographic transfer case</w:t>
+        <w:t>3.2. EPA eGRID geographic and historical transfer cases</w:t>
       </w:r>
     </w:p>
     <w:p>
@@ -1203,6 +1221,15 @@
           <w:sz w:val="21"/>
         </w:rPr>
         <w:t>) [5]. The analysis included 50 states and the District of Columbia. The generation-weighted mean was 348.194 kg CO2e MWh−1 and the observed state range was 23.696-893.079 kg CO2e MWh−1. These are annual, location-based factors; they are not marginal, hourly or market-based. The factors were used only in the affine re-basing of Eq. (7).</w:t>
+      </w:r>
+    </w:p>
+    <w:p>
+      <w:r>
+        <w:rPr>
+          <w:rFonts w:ascii="Calibri" w:hAnsi="Calibri"/>
+          <w:sz w:val="21"/>
+        </w:rPr>
+        <w:t>Historical detailed workbooks supplied the same state fields for 2012, 2014, 2016, and 2018-2022. Together with 2023, the panel contains nine releases and 459 state-year observations. Each year contains 50 states and the District of Columbia after excluding Puerto Rico and national aggregate rows. File name, worksheet field, original unit conversion, generation, and factor are retained for every observation. Cross-year comparisons can be affected by EPA source updates and power-sector accounting revisions in addition to physical grid change, so the panel is interpreted as a sequence of released annual conditions.</w:t>
       </w:r>
     </w:p>
     <w:p>
@@ -1530,7 +1557,7 @@
         <w:pStyle w:val="Heading2"/>
       </w:pPr>
       <w:r>
-        <w:t>4.3. Decarbonization transfers attention from operation to hardware</w:t>
+        <w:t>4.3. Historical decarbonization lowers absolute savings but raises embodied importance</w:t>
       </w:r>
     </w:p>
     <w:p>
@@ -1539,33 +1566,7 @@
           <w:rFonts w:ascii="Calibri" w:hAnsi="Calibri"/>
           <w:sz w:val="21"/>
         </w:rPr>
-        <w:t>At the high end of the eGRID state range, embodied contributions were approximately 4.0-4.2% of total GHG across architectures. At the lowest state factor they increased to 56.9-58.2%. Thus, grid decarbonization does not make cooling architecture irrelevant; it changes the evidence required to judge it. PUE and IT power dominate high-carbon locations, whereas server quantity, server lifetime, overclocking, electronics manufacturing and replacement become co-dominant on low-carbon grids.</w:t>
-      </w:r>
-    </w:p>
-    <w:p>
-      <w:r>
-        <w:rPr>
-          <w:rFonts w:ascii="Calibri" w:hAnsi="Calibri"/>
-          <w:sz w:val="21"/>
-        </w:rPr>
-        <w:t>The released endpoints illustrate the same transition. In the grid case, use phase contributed approximately 90% of mean GHG. In the renewable case, the absolute use-phase term fell sharply while the embodied server terms were unchanged. An operational-only comparison can therefore be directionally useful on a carbon-intensive grid but becomes increasingly incomplete as electricity decarbonizes.</w:t>
-      </w:r>
-    </w:p>
-    <w:p>
-      <w:pPr>
-        <w:pStyle w:val="Heading2"/>
-      </w:pPr>
-      <w:r>
-        <w:t>4.4. Contribution-weighted pedigree scores identify the next evidence</w:t>
-      </w:r>
-    </w:p>
-    <w:p>
-      <w:r>
-        <w:rPr>
-          <w:rFonts w:ascii="Calibri" w:hAnsi="Calibri"/>
-          <w:sz w:val="21"/>
-        </w:rPr>
-        <w:t>The released pedigree assessment alone assigns the weakest average score to networking equipment (3.6/5), followed by storage servers (2.8/5). Weakness alone, however, would prioritize a small contributor. Multiplying weakness by mean GHG contribution changed the order (Figure 4). Use phase ranked first because its 90.3% mean contribution outweighed a relatively good 1.4/5 pedigree score. Storage, networking and compute-server evidence formed the next tier with nearly equal priority indices (0.0127-0.0129).</w:t>
+        <w:t>The generation-weighted U.S. total-output factor declined from 518.0 kg CO2e MWh−1 in 2012 to 348.2 kg CO2e MWh−1 in 2023, a 32.8% reduction, although the trajectory was not monotonic: it increased from 371.5 in 2020 to 387.3 in 2021 before declining again. Applying the same released foreground model reduced the national air-cooled result from 52.66 to 36.68 kg CO2e Vcore−1 yr−1 and the two-phase result from 41.77 to 29.10 kg CO2e Vcore−1 yr−1. The absolute benefit of two-phase relative to air therefore contracted from 10.89 to 7.58 kg CO2e Vcore−1 yr−1, while its percentage benefit remained near 20.7% because both use-phase terms scale with the same electricity-system trajectory.</w:t>
       </w:r>
     </w:p>
     <w:p>
@@ -1577,8 +1578,8 @@
       <w:r>
         <w:drawing>
           <wp:inline xmlns:a="http://schemas.openxmlformats.org/drawingml/2006/main" xmlns:pic="http://schemas.openxmlformats.org/drawingml/2006/picture">
-            <wp:extent cx="5897880" cy="3374064"/>
-            <wp:docPr id="4" name="Picture 4" descr="Figure 4. Contribution-weighted evidence-improvement priority derived from the released Microsoft/WSP grid-case GHG contributions and pedigree matrix. The diagnostic multiplies mean contribution share by normalized pedigree weakness; it is a transparent screening rank, not a formal expected value of information." title="OpenDC-LCA Figure 4"/>
+            <wp:extent cx="5897880" cy="3325749"/>
+            <wp:docPr id="4" name="Picture 4" descr="Figure 4. Historical EPA eGRID state total-output intensities for nine releases between 2012 and 2023. Each dot is a state-year observation; the orange line is the generation-weighted U.S. factor. Blue points fall below the 60.8 kg CO2e MWh−1 cold-plate/one-phase crossover derived from the released Microsoft/WSP foreground model. The panel describes released annual conditions, not a forecast or marginal-emissions trajectory." title="OpenDC-LCA Figure 4"/>
             <wp:cNvGraphicFramePr>
               <a:graphicFrameLocks noChangeAspect="1"/>
             </wp:cNvGraphicFramePr>
@@ -1586,7 +1587,7 @@
               <a:graphicData uri="http://schemas.openxmlformats.org/drawingml/2006/picture">
                 <pic:pic>
                   <pic:nvPicPr>
-                    <pic:cNvPr id="0" name="figure3_data_priority.png"/>
+                    <pic:cNvPr id="0" name="figure6_historical_grid_transition.png"/>
                     <pic:cNvPicPr/>
                   </pic:nvPicPr>
                   <pic:blipFill>
@@ -1598,7 +1599,7 @@
                   <pic:spPr>
                     <a:xfrm>
                       <a:off x="0" y="0"/>
-                      <a:ext cx="5897880" cy="3374064"/>
+                      <a:ext cx="5897880" cy="3325749"/>
                     </a:xfrm>
                     <a:prstGeom prst="rect"/>
                   </pic:spPr>
@@ -1618,7 +1619,7 @@
           <w:rFonts w:ascii="Calibri" w:hAnsi="Calibri"/>
           <w:sz w:val="18"/>
         </w:rPr>
-        <w:t>Figure 4. Contribution-weighted evidence-improvement priority derived from the released Microsoft/WSP grid-case GHG contributions and pedigree matrix. The diagnostic multiplies mean contribution share by normalized pedigree weakness; it is a transparent screening rank, not a formal expected value of information.</w:t>
+        <w:t>Figure 4. Historical EPA eGRID state total-output intensities for nine releases between 2012 and 2023. Each dot is a state-year observation; the orange line is the generation-weighted U.S. factor. Blue points fall below the 60.8 kg CO2e MWh−1 cold-plate/one-phase crossover derived from the released Microsoft/WSP foreground model. The panel describes released annual conditions, not a forecast or marginal-emissions trajectory.</w:t>
       </w:r>
     </w:p>
     <w:p>
@@ -1627,7 +1628,16 @@
           <w:rFonts w:ascii="Calibri" w:hAnsi="Calibri"/>
           <w:sz w:val="21"/>
         </w:rPr>
-        <w:t>This result separates two research programs. Improving measured PUE, IT power, utilization and water response has the greatest present consequence for grid-powered facilities. Improving server inventories—especially storage and networking proxies—becomes the next priority and grows in importance on cleaner grids. Fluid data remain important for toxicity, regulation, leakage and feasibility even though their released climate contribution is small; the priority index is not a complete environmental, health and safety ranking.</w:t>
+        <w:t>Three states—Idaho, Vermont, and Washington—fell below the pairwise crossover in 2012, but only Vermont did so in each subsequent release. This does not indicate monotonic state decarbonization; Idaho and Washington moved above the threshold as their annual generation mix changed. More importantly, two-phase immersion remained the lowest modeled GHG option in all 459 state-year cases. The result separates a sensitive pairwise ordering (cold plate versus one-phase) from the more robust first-ranked architecture under the released assumptions.</w:t>
+      </w:r>
+    </w:p>
+    <w:p>
+      <w:r>
+        <w:rPr>
+          <w:rFonts w:ascii="Calibri" w:hAnsi="Calibri"/>
+          <w:sz w:val="21"/>
+        </w:rPr>
+        <w:t>At the national generation-weighted factor, the embodied share of the air-cooled result increased from 6.7% in 2012 to 9.6% in 2023; the two-phase share increased from 6.8% to 9.7%. The change is modest nationally because the U.S. factor remains well above the low-carbon state range, but it establishes the direction of travel: decarbonization reduces the absolute operational benefit available from cooling and increases the leverage of server lifetime, manufacturing, and replacement.</w:t>
       </w:r>
     </w:p>
     <w:p>
@@ -1635,7 +1645,7 @@
         <w:pStyle w:val="Heading2"/>
       </w:pPr>
       <w:r>
-        <w:t>4.5. Public product and construction data quantify uncertainty and leverage</w:t>
+        <w:t>4.4. Break-even analysis converts close rankings into measurement requirements</w:t>
       </w:r>
     </w:p>
     <w:p>
@@ -1644,7 +1654,7 @@
           <w:rFonts w:ascii="Calibri" w:hAnsi="Calibri"/>
           <w:sz w:val="21"/>
         </w:rPr>
-        <w:t>The 48 usable Boavizta server records yielded manufacturing GHG values from 465 to 2,503 kg CO2e per server, with a median of 1,215 kg CO2e and an interquartile range of 1,146-1,337 kg CO2e (Figure 5). Annualized by the declared four-year lifetime, the median was 304 kg CO2e server−1 yr−1. The approximately 5.4-fold full range is large relative to many reported cooling savings. Because manufacturer PCFs differ in method and configuration, this range is an evidence envelope rather than a product ranking.</w:t>
+        <w:t>Across the 2023 state factors, cold plate would need a median 1.58% reduction in its released use-phase contribution to equal one-phase immersion. The required change ranged from a 1.83% reduction on the most carbon-intensive grid to a 2.61% increase in Vermont, where cold plate was already lower. Consequently, a comparative experiment or field model with combined uncertainty greater than approximately 1-2% cannot resolve the pairwise ordering for most states without stronger evidence.</w:t>
       </w:r>
     </w:p>
     <w:p>
@@ -1656,8 +1666,8 @@
       <w:r>
         <w:drawing>
           <wp:inline xmlns:a="http://schemas.openxmlformats.org/drawingml/2006/main" xmlns:pic="http://schemas.openxmlformats.org/drawingml/2006/picture">
-            <wp:extent cx="5897880" cy="3374064"/>
-            <wp:docPr id="5" name="Picture 5" descr="Figure 5. Distribution of manufacturing GHG for 48 Boavizta `Datacenter/Server` records having total product GHG and manufacturing share. Dashed lines show the 25th percentile, median and 75th percentile. Heterogeneous manufacturer methods and product configurations preclude a product ranking." title="OpenDC-LCA Figure 5"/>
+            <wp:extent cx="5897880" cy="3325749"/>
+            <wp:docPr id="5" name="Picture 5" descr="Figure 5. Use-phase break-even stress tests across 2023 state electricity intensities. The blue curve is the cold-plate use-phase change required to equal one-phase immersion; negative values require improvement. The orange curve is the two-phase use-phase increase tolerated before losing first rank. Embodied terms are held fixed. The analysis defines required discrimination and robustness within the released model, not expected field performance." title="OpenDC-LCA Figure 5"/>
             <wp:cNvGraphicFramePr>
               <a:graphicFrameLocks noChangeAspect="1"/>
             </wp:cNvGraphicFramePr>
@@ -1665,7 +1675,7 @@
               <a:graphicData uri="http://schemas.openxmlformats.org/drawingml/2006/picture">
                 <pic:pic>
                   <pic:nvPicPr>
-                    <pic:cNvPr id="0" name="figure4_server_epd_distribution.png"/>
+                    <pic:cNvPr id="0" name="figure7_performance_robustness.png"/>
                     <pic:cNvPicPr/>
                   </pic:nvPicPr>
                   <pic:blipFill>
@@ -1677,7 +1687,7 @@
                   <pic:spPr>
                     <a:xfrm>
                       <a:off x="0" y="0"/>
-                      <a:ext cx="5897880" cy="3374064"/>
+                      <a:ext cx="5897880" cy="3325749"/>
                     </a:xfrm>
                     <a:prstGeom prst="rect"/>
                   </pic:spPr>
@@ -1697,22 +1707,7 @@
           <w:rFonts w:ascii="Calibri" w:hAnsi="Calibri"/>
           <w:sz w:val="18"/>
         </w:rPr>
-        <w:t xml:space="preserve">Figure 5. Distribution of manufacturing GHG for 48 Boavizta </w:t>
-      </w:r>
-      <w:r>
-        <w:rPr>
-          <w:rFonts w:ascii="Courier New" w:hAnsi="Courier New"/>
-          <w:color w:val="17324D"/>
-          <w:sz w:val="17"/>
-        </w:rPr>
-        <w:t>Datacenter/Server</w:t>
-      </w:r>
-      <w:r>
-        <w:rPr>
-          <w:rFonts w:ascii="Calibri" w:hAnsi="Calibri"/>
-          <w:sz w:val="18"/>
-        </w:rPr>
-        <w:t xml:space="preserve"> records having total product GHG and manufacturing share. Dashed lines show the 25th percentile, median and 75th percentile. Heterogeneous manufacturer methods and product configurations preclude a product ranking.</w:t>
+        <w:t>Figure 5. Use-phase break-even stress tests across 2023 state electricity intensities. The blue curve is the cold-plate use-phase change required to equal one-phase immersion; negative values require improvement. The orange curve is the two-phase use-phase increase tolerated before losing first rank. Embodied terms are held fixed. The analysis defines required discrimination and robustness within the released model, not expected field performance.</w:t>
       </w:r>
     </w:p>
     <w:p>
@@ -1721,7 +1716,50 @@
           <w:rFonts w:ascii="Calibri" w:hAnsi="Calibri"/>
           <w:sz w:val="21"/>
         </w:rPr>
-        <w:t>The selected ÖKOBAUDAT records identified large construction procurement levers (Figure 6). High-scrap electric-arc-furnace galvanized steel had 59.9% lower A1-A3 GHG, 47.9% lower nonrenewable primary energy and 52.0% lower freshwater use than the selected low-scrap blast-furnace profile. CEM III cement had 49.8% lower GHG, 12.1% lower nonrenewable primary energy and 23.5% lower freshwater use than CEM II/A. Their facility significance cannot be calculated without architecture-specific material quantities.</w:t>
+        <w:t>Two-phase immersion exhibited a wider margin. Its released use-phase term could increase by 5.39-13.31% across the state range before another architecture became lower, with a median tolerance of 5.99%. Scaling the Microsoft compute, storage, and networking contributions by 0.38-2.06, corresponding to the minimum-to-maximum annualized Boavizta factors relative to their median, did not change the first-ranked technology in any of the 51 states. The median winner margin increased slightly from 5.13% at the minimum server scale to 5.69% at the maximum because the released two-phase case has favorable server-related contributions. This is a robustness result for the published foreground structure, not evidence that any particular server can be substituted into an immersion system.</w:t>
+      </w:r>
+    </w:p>
+    <w:p>
+      <w:pPr>
+        <w:pStyle w:val="Heading2"/>
+      </w:pPr>
+      <w:r>
+        <w:t>4.5. Decarbonization transfers attention from operation to hardware</w:t>
+      </w:r>
+    </w:p>
+    <w:p>
+      <w:r>
+        <w:rPr>
+          <w:rFonts w:ascii="Calibri" w:hAnsi="Calibri"/>
+          <w:sz w:val="21"/>
+        </w:rPr>
+        <w:t>At the high end of the eGRID state range, embodied contributions were approximately 4.0-4.2% of total GHG across architectures. At the lowest state factor they increased to 56.9-58.2%. Thus, grid decarbonization does not make cooling architecture irrelevant; it changes the evidence required to judge it. PUE and IT power dominate high-carbon locations, whereas server quantity, server lifetime, overclocking, electronics manufacturing and replacement become co-dominant on low-carbon grids.</w:t>
+      </w:r>
+    </w:p>
+    <w:p>
+      <w:r>
+        <w:rPr>
+          <w:rFonts w:ascii="Calibri" w:hAnsi="Calibri"/>
+          <w:sz w:val="21"/>
+        </w:rPr>
+        <w:t>The released endpoints illustrate the same transition. In the grid case, use phase contributed approximately 90% of mean GHG. In the renewable case, the absolute use-phase term fell sharply while the embodied server terms were unchanged. An operational-only comparison can therefore be directionally useful on a carbon-intensive grid but becomes increasingly incomplete as electricity decarbonizes.</w:t>
+      </w:r>
+    </w:p>
+    <w:p>
+      <w:pPr>
+        <w:pStyle w:val="Heading2"/>
+      </w:pPr>
+      <w:r>
+        <w:t>4.6. Contribution-weighted pedigree scores identify the next evidence</w:t>
+      </w:r>
+    </w:p>
+    <w:p>
+      <w:r>
+        <w:rPr>
+          <w:rFonts w:ascii="Calibri" w:hAnsi="Calibri"/>
+          <w:sz w:val="21"/>
+        </w:rPr>
+        <w:t>The released pedigree assessment alone assigns the weakest average score to networking equipment (3.6/5), followed by storage servers (2.8/5). Weakness alone, however, would prioritize a small contributor. Multiplying weakness by mean GHG contribution changed the order (Figure 4). Use phase ranked first because its 90.3% mean contribution outweighed a relatively good 1.4/5 pedigree score. Storage, networking and compute-server evidence formed the next tier with nearly equal priority indices (0.0127-0.0129).</w:t>
       </w:r>
     </w:p>
     <w:p>
@@ -1734,7 +1772,7 @@
         <w:drawing>
           <wp:inline xmlns:a="http://schemas.openxmlformats.org/drawingml/2006/main" xmlns:pic="http://schemas.openxmlformats.org/drawingml/2006/picture">
             <wp:extent cx="5897880" cy="3374064"/>
-            <wp:docPr id="6" name="Picture 6" descr="Figure 6. Selected ÖKOBAUDAT 2024-II A1-A3 GHG factors for baseline and alternative steel and cement routes. The figure identifies unit-process procurement leverage; it does not quantify a data-center reduction because foreground quantities are unavailable." title="OpenDC-LCA Figure 6"/>
+            <wp:docPr id="6" name="Picture 6" descr="Figure 6. Contribution-weighted evidence-improvement priority derived from the released Microsoft/WSP grid-case GHG contributions and pedigree matrix. The diagnostic multiplies mean contribution share by normalized pedigree weakness; it is a transparent screening rank, not a formal expected value of information." title="OpenDC-LCA Figure 6"/>
             <wp:cNvGraphicFramePr>
               <a:graphicFrameLocks noChangeAspect="1"/>
             </wp:cNvGraphicFramePr>
@@ -1742,7 +1780,7 @@
               <a:graphicData uri="http://schemas.openxmlformats.org/drawingml/2006/picture">
                 <pic:pic>
                   <pic:nvPicPr>
-                    <pic:cNvPr id="0" name="figure5_material_levers.png"/>
+                    <pic:cNvPr id="0" name="figure3_data_priority.png"/>
                     <pic:cNvPicPr/>
                   </pic:nvPicPr>
                   <pic:blipFill>
@@ -1774,7 +1812,16 @@
           <w:rFonts w:ascii="Calibri" w:hAnsi="Calibri"/>
           <w:sz w:val="18"/>
         </w:rPr>
-        <w:t>Figure 6. Selected ÖKOBAUDAT 2024-II A1-A3 GHG factors for baseline and alternative steel and cement routes. The figure identifies unit-process procurement leverage; it does not quantify a data-center reduction because foreground quantities are unavailable.</w:t>
+        <w:t>Figure 6. Contribution-weighted evidence-improvement priority derived from the released Microsoft/WSP grid-case GHG contributions and pedigree matrix. The diagnostic multiplies mean contribution share by normalized pedigree weakness; it is a transparent screening rank, not a formal expected value of information.</w:t>
+      </w:r>
+    </w:p>
+    <w:p>
+      <w:r>
+        <w:rPr>
+          <w:rFonts w:ascii="Calibri" w:hAnsi="Calibri"/>
+          <w:sz w:val="21"/>
+        </w:rPr>
+        <w:t>This result separates two research programs. Improving measured PUE, IT power, utilization and water response has the greatest present consequence for grid-powered facilities. Improving server inventories—especially storage and networking proxies—becomes the next priority and grows in importance on cleaner grids. Fluid data remain important for toxicity, regulation, leakage and feasibility even though their released climate contribution is small; the priority index is not a complete environmental, health and safety ranking.</w:t>
       </w:r>
     </w:p>
     <w:p>
@@ -1782,7 +1829,7 @@
         <w:pStyle w:val="Heading2"/>
       </w:pPr>
       <w:r>
-        <w:t>4.6. Temporal and measurement pathways remain validation cases</w:t>
+        <w:t>4.7. Public product and construction data quantify uncertainty and leverage</w:t>
       </w:r>
     </w:p>
     <w:p>
@@ -1791,7 +1838,137 @@
           <w:rFonts w:ascii="Calibri" w:hAnsi="Calibri"/>
           <w:sz w:val="21"/>
         </w:rPr>
-        <w:t>The Fayetteville TMY and assumed temperature-PUE curves produced annual mean PUE values of 1.0907, 1.0529, 1.0406 and 1.0352 for air, cold plate, one-phase and two-phase cases, respectively. These are hypotheses, not technology findings. Likewise, the synthetic measurement surfaces processed 8,760 hourly observations, rejected extrapolation and propagated declared point uncertainty. Their role is to specify exactly how reviewed laboratory data will enter the lifecycle calculation. The resulting climate and surface figures are retained as Supplementary Figures rather than core evidence.</w:t>
+        <w:t>The 48 usable Boavizta server records yielded manufacturing GHG values from 465 to 2,503 kg CO2e per server, with a median of 1,215 kg CO2e and an interquartile range of 1,146-1,337 kg CO2e (Figure 5). Annualized by the declared four-year lifetime, the median was 304 kg CO2e server−1 yr−1. The approximately 5.4-fold full range is large relative to many reported cooling savings. Because manufacturer PCFs differ in method and configuration, this range is an evidence envelope rather than a product ranking.</w:t>
+      </w:r>
+    </w:p>
+    <w:p>
+      <w:pPr>
+        <w:keepNext/>
+        <w:spacing w:before="120" w:after="40"/>
+        <w:jc w:val="center"/>
+      </w:pPr>
+      <w:r>
+        <w:drawing>
+          <wp:inline xmlns:a="http://schemas.openxmlformats.org/drawingml/2006/main" xmlns:pic="http://schemas.openxmlformats.org/drawingml/2006/picture">
+            <wp:extent cx="5897880" cy="3374064"/>
+            <wp:docPr id="7" name="Picture 7" descr="Figure 7. Distribution of manufacturing GHG for 48 Boavizta `Datacenter/Server` records having total product GHG and manufacturing share. Dashed lines show the 25th percentile, median and 75th percentile. Heterogeneous manufacturer methods and product configurations preclude a product ranking." title="OpenDC-LCA Figure 7"/>
+            <wp:cNvGraphicFramePr>
+              <a:graphicFrameLocks noChangeAspect="1"/>
+            </wp:cNvGraphicFramePr>
+            <a:graphic>
+              <a:graphicData uri="http://schemas.openxmlformats.org/drawingml/2006/picture">
+                <pic:pic>
+                  <pic:nvPicPr>
+                    <pic:cNvPr id="0" name="figure4_server_epd_distribution.png"/>
+                    <pic:cNvPicPr/>
+                  </pic:nvPicPr>
+                  <pic:blipFill>
+                    <a:blip r:embed="rId17"/>
+                    <a:stretch>
+                      <a:fillRect/>
+                    </a:stretch>
+                  </pic:blipFill>
+                  <pic:spPr>
+                    <a:xfrm>
+                      <a:off x="0" y="0"/>
+                      <a:ext cx="5897880" cy="3374064"/>
+                    </a:xfrm>
+                    <a:prstGeom prst="rect"/>
+                  </pic:spPr>
+                </pic:pic>
+              </a:graphicData>
+            </a:graphic>
+          </wp:inline>
+        </w:drawing>
+      </w:r>
+    </w:p>
+    <w:p>
+      <w:pPr>
+        <w:pStyle w:val="Caption"/>
+      </w:pPr>
+      <w:r>
+        <w:rPr>
+          <w:rFonts w:ascii="Calibri" w:hAnsi="Calibri"/>
+          <w:sz w:val="18"/>
+        </w:rPr>
+        <w:t xml:space="preserve">Figure 7. Distribution of manufacturing GHG for 48 Boavizta </w:t>
+      </w:r>
+      <w:r>
+        <w:rPr>
+          <w:rFonts w:ascii="Courier New" w:hAnsi="Courier New"/>
+          <w:color w:val="17324D"/>
+          <w:sz w:val="17"/>
+        </w:rPr>
+        <w:t>Datacenter/Server</w:t>
+      </w:r>
+      <w:r>
+        <w:rPr>
+          <w:rFonts w:ascii="Calibri" w:hAnsi="Calibri"/>
+          <w:sz w:val="18"/>
+        </w:rPr>
+        <w:t xml:space="preserve"> records having total product GHG and manufacturing share. Dashed lines show the 25th percentile, median and 75th percentile. Heterogeneous manufacturer methods and product configurations preclude a product ranking.</w:t>
+      </w:r>
+    </w:p>
+    <w:p>
+      <w:r>
+        <w:rPr>
+          <w:rFonts w:ascii="Calibri" w:hAnsi="Calibri"/>
+          <w:sz w:val="21"/>
+        </w:rPr>
+        <w:t>The selected ÖKOBAUDAT records identified large construction procurement levers (Figure 6). High-scrap electric-arc-furnace galvanized steel had 59.9% lower A1-A3 GHG, 47.9% lower nonrenewable primary energy and 52.0% lower freshwater use than the selected low-scrap blast-furnace profile. CEM III cement had 49.8% lower GHG, 12.1% lower nonrenewable primary energy and 23.5% lower freshwater use than CEM II/A. Their facility significance cannot be calculated without architecture-specific material quantities.</w:t>
+      </w:r>
+    </w:p>
+    <w:p>
+      <w:pPr>
+        <w:keepNext/>
+        <w:spacing w:before="120" w:after="40"/>
+        <w:jc w:val="center"/>
+      </w:pPr>
+      <w:r>
+        <w:drawing>
+          <wp:inline xmlns:a="http://schemas.openxmlformats.org/drawingml/2006/main" xmlns:pic="http://schemas.openxmlformats.org/drawingml/2006/picture">
+            <wp:extent cx="5897880" cy="3374064"/>
+            <wp:docPr id="8" name="Picture 8" descr="Figure 8. Selected ÖKOBAUDAT 2024-II A1-A3 GHG factors for baseline and alternative steel and cement routes. The figure identifies unit-process procurement leverage; it does not quantify a data-center reduction because foreground quantities are unavailable." title="OpenDC-LCA Figure 8"/>
+            <wp:cNvGraphicFramePr>
+              <a:graphicFrameLocks noChangeAspect="1"/>
+            </wp:cNvGraphicFramePr>
+            <a:graphic>
+              <a:graphicData uri="http://schemas.openxmlformats.org/drawingml/2006/picture">
+                <pic:pic>
+                  <pic:nvPicPr>
+                    <pic:cNvPr id="0" name="figure5_material_levers.png"/>
+                    <pic:cNvPicPr/>
+                  </pic:nvPicPr>
+                  <pic:blipFill>
+                    <a:blip r:embed="rId18"/>
+                    <a:stretch>
+                      <a:fillRect/>
+                    </a:stretch>
+                  </pic:blipFill>
+                  <pic:spPr>
+                    <a:xfrm>
+                      <a:off x="0" y="0"/>
+                      <a:ext cx="5897880" cy="3374064"/>
+                    </a:xfrm>
+                    <a:prstGeom prst="rect"/>
+                  </pic:spPr>
+                </pic:pic>
+              </a:graphicData>
+            </a:graphic>
+          </wp:inline>
+        </w:drawing>
+      </w:r>
+    </w:p>
+    <w:p>
+      <w:pPr>
+        <w:pStyle w:val="Caption"/>
+      </w:pPr>
+      <w:r>
+        <w:rPr>
+          <w:rFonts w:ascii="Calibri" w:hAnsi="Calibri"/>
+          <w:sz w:val="18"/>
+        </w:rPr>
+        <w:t>Figure 8. Selected ÖKOBAUDAT 2024-II A1-A3 GHG factors for baseline and alternative steel and cement routes. The figure identifies unit-process procurement leverage; it does not quantify a data-center reduction because foreground quantities are unavailable.</w:t>
       </w:r>
     </w:p>
     <w:p>
@@ -1799,7 +1976,24 @@
         <w:pStyle w:val="Heading2"/>
       </w:pPr>
       <w:r>
-        <w:t>4.7. Capability and evidence matrix</w:t>
+        <w:t>4.8. Temporal and measurement pathways remain validation cases</w:t>
+      </w:r>
+    </w:p>
+    <w:p>
+      <w:r>
+        <w:rPr>
+          <w:rFonts w:ascii="Calibri" w:hAnsi="Calibri"/>
+          <w:sz w:val="21"/>
+        </w:rPr>
+        <w:t>The Fayetteville TMY and assumed temperature-PUE curves produced annual mean PUE values of 1.0907, 1.0529, 1.0406 and 1.0352 for air, cold plate, one-phase and two-phase cases, respectively. These are hypotheses, not technology findings. Likewise, the synthetic measurement surfaces processed 8,760 hourly observations, rejected extrapolation and propagated declared point uncertainty. Their role is to specify exactly how reviewed laboratory data will enter the lifecycle calculation. The resulting climate and surface figures are retained as Supplementary Figures rather than core evidence.</w:t>
+      </w:r>
+    </w:p>
+    <w:p>
+      <w:pPr>
+        <w:pStyle w:val="Heading2"/>
+      </w:pPr>
+      <w:r>
+        <w:t>4.9. Capability and evidence matrix</w:t>
       </w:r>
     </w:p>
     <w:p>
@@ -3392,7 +3586,7 @@
         <w:pStyle w:val="Heading2"/>
       </w:pPr>
       <w:r>
-        <w:t>4.8. Practitioner workflow and release verification</w:t>
+        <w:t>4.10. Practitioner workflow and release verification</w:t>
       </w:r>
     </w:p>
     <w:p>
@@ -4187,7 +4381,16 @@
           <w:rFonts w:ascii="Calibri" w:hAnsi="Calibri"/>
           <w:sz w:val="21"/>
         </w:rPr>
-        <w:t>Two-phase immersion did not cross another architecture in the tested state range. That result is stronger within the released model but is not universal. It inherits the paper's assumptions concerning server count and performance, fluid production and loss, cooling-system boundaries, equipment lifetime and regulatory feasibility. A robust comparative claim should therefore report both the observed no-crossover range and the untested assumptions that could create one.</w:t>
+        <w:t>Two-phase immersion did not cross another architecture in the tested state range or in any of the 459 historical state-year cases. It also retained first rank when server-related contributions were scaled across the empirical Boavizta envelope. That result is stronger within the released model but is not universal. It inherits the paper's assumptions concerning server count and performance, fluid production and loss, cooling-system boundaries, equipment lifetime and regulatory feasibility. A robust comparative claim should therefore report both the observed no-crossover range and the untested assumptions that could create one.</w:t>
+      </w:r>
+    </w:p>
+    <w:p>
+      <w:r>
+        <w:rPr>
+          <w:rFonts w:ascii="Calibri" w:hAnsi="Calibri"/>
+          <w:sz w:val="21"/>
+        </w:rPr>
+        <w:t>The break-even analysis adds an energy-engineering interpretation. The median 1.6% cold-plate use-phase improvement required to equal one-phase immersion is comparable to uncertainty that can arise from load, pump and fan power, heat-rejection control, weather, and facility-boundary choices. A close lifecycle ranking is therefore also an experimental-resolution problem. By contrast, the approximately 6% median degradation that two-phase could tolerate before losing first rank is a larger but still testable performance margin. Neither value substitutes for measurement; each specifies how accurate and representative the measurements must be.</w:t>
       </w:r>
     </w:p>
     <w:p>
@@ -4213,6 +4416,15 @@
           <w:rFonts w:ascii="Calibri" w:hAnsi="Calibri"/>
           <w:sz w:val="21"/>
         </w:rPr>
+        <w:t>The historical panel adds a planning implication. Grid decarbonization lowered the absolute two-phase-versus-air benefit from 10.89 to 7.58 kg CO2e per Vcore-year between the 2012 and 2023 generation-weighted conditions even though the relative saving remained nearly constant. Percentage reductions alone can therefore overstate the future system value of an efficiency intervention. Planning should report relative efficiency, absolute avoided impact, and the evolving embodied share together.</w:t>
+      </w:r>
+    </w:p>
+    <w:p>
+      <w:r>
+        <w:rPr>
+          <w:rFonts w:ascii="Calibri" w:hAnsi="Calibri"/>
+          <w:sz w:val="21"/>
+        </w:rPr>
         <w:t>The 5.4-fold range in public Boavizta server manufacturing footprints shows why a single generic server factor is inadequate for low-carbon scenarios. It does not establish a probability distribution or rank products, because the records are heterogeneous. It does establish scale: public foreground dispersion can exceed the differences among cooling options. Reporting a cooling saving to high precision while proxying the servers with one legacy factor creates false confidence. Product-specific bills of materials, functional performance and harmonized product-carbon-footprint rules are thus central research data, not secondary documentation.</w:t>
       </w:r>
     </w:p>
@@ -4291,7 +4503,7 @@
           <w:rFonts w:ascii="Calibri" w:hAnsi="Calibri"/>
           <w:sz w:val="21"/>
         </w:rPr>
-        <w:t>The state analysis is a screening re-basis between two released endpoints, not a 51-state process LCA. It uses annual location-based eGRID factors and omits hourly or marginal emissions, procurement contracts and transmission effects. The exact reconstruction verifies released arithmetic, not licensed ecoinvent or LCA for Experts inventories, confidential bills of materials or measured PUE. The Boavizta sample mixes manufacturers and methods; the ÖKOBAUDAT factors are German product-stage proxies without data-center quantities. The USGS file contains watershed geometry rather than withdrawal, consumption or scarcity characterization, so no watershed-level water claim is made.</w:t>
+        <w:t>The state analysis is a screening re-basis between two released endpoints, not a state-specific process LCA. The nine-year extension contains 459 released state-year observations but still uses annual location-based eGRID factors and omits hourly or marginal emissions, procurement contracts and transmission effects. The exact reconstruction verifies released arithmetic, not licensed ecoinvent or LCA for Experts inventories, confidential bills of materials or measured PUE. The Boavizta sample mixes manufacturers and methods; the ÖKOBAUDAT factors are German product-stage proxies without data-center quantities. The USGS file contains watershed geometry rather than withdrawal, consumption or scarcity characterization, so no watershed-level water claim is made.</w:t>
       </w:r>
     </w:p>
     <w:p>
@@ -4352,7 +4564,7 @@
           <w:rFonts w:ascii="Calibri" w:hAnsi="Calibri"/>
           <w:sz w:val="21"/>
         </w:rPr>
-        <w:t>OpenDC-LCA converts heterogeneous cooling, grid, server, construction and data- quality evidence into conditional, auditable lifecycle comparisons. It exactly reconstructed 24 released Microsoft/Nature totals and then exposed a result that a single reference scenario cannot show: cold plate and one-phase immersion cross near 60.8 kg CO2e MWh−1 within the observed U.S. state range. Across that range, the embodied share rose from about 4% to 57-58%, shifting the limiting evidence from operational electricity toward servers and replacement. Forty-eight public server records spanned 465-2,503 kg CO2e of manufacturing emissions, while selected lower-impact steel and cement routes showed approximately 50-60% cradle-to-gate GHG leverage per kilogram.</w:t>
+        <w:t>OpenDC-LCA converts heterogeneous cooling, grid, server, construction and data- quality evidence into conditional, auditable lifecycle comparisons. It exactly reconstructed 24 released Microsoft/Nature totals and then exposed a result that a single reference scenario cannot show: cold plate and one-phase immersion cross near 60.8 kg CO2e MWh−1 within the observed U.S. state range. Across nine eGRID releases, the generation-weighted factor declined 32.8% and the absolute modeled two-phase-versus-air benefit declined 30.4%, while two-phase retained first rank in all 459 state-year cases. Pairwise cold-plate/one-phase ranking was sensitive to a median 1.6% use-phase change, whereas two-phase tolerated a median 6.0% degradation before losing first rank. Its first rank also persisted across a 0.38-2.06-fold server-inventory stress range. Across that range, the embodied share rose from about 4% to 57-58%, shifting the limiting evidence from operational electricity toward servers and replacement. Forty-eight public server records spanned 465-2,503 kg CO2e of manufacturing emissions, while selected lower-impact steel and cement routes showed approximately 50-60% cradle-to-gate GHG leverage per kilogram.</w:t>
       </w:r>
     </w:p>
     <w:p>
@@ -4550,7 +4762,7 @@
           <w:rFonts w:ascii="Calibri" w:hAnsi="Calibri"/>
           <w:sz w:val="21"/>
         </w:rPr>
-        <w:t>UARK-NED3. OpenDC-LCA version 1.0.0.</w:t>
+        <w:t>UARK-NED3. OpenDC-LCA version 1.1.0.</w:t>
       </w:r>
     </w:p>
     <w:p>

</xml_diff>

<commit_message>
Address manuscript review and correct grid anchoring
</commit_message>
<xml_diff>
--- a/paper/OpenDC-LCA_manuscript.docx
+++ b/paper/OpenDC-LCA_manuscript.docx
@@ -14,7 +14,7 @@
           <w:color w:val="17324D"/>
           <w:sz w:val="42"/>
         </w:rPr>
-        <w:t>Grid decarbonization changes the lifecycle value and evidence requirements of data-center cooling</w:t>
+        <w:t>Grid decarbonization changes the lifecycle greenhouse-gas value and evidence requirements of data-center cooling</w:t>
       </w:r>
     </w:p>
     <w:p>
@@ -87,7 +87,7 @@
           <w:rFonts w:ascii="Calibri" w:hAnsi="Calibri"/>
           <w:sz w:val="21"/>
         </w:rPr>
-        <w:t>Liquid cooling can reduce data-center operating energy and water use, yet the preferred architecture depends on electricity supply, compute performance, hardware and fluid inventories, service life, climate, and the functional unit used for comparison. Existing studies establish the importance of these effects but are difficult to update or transfer because foreground bills of materials and background processes are often proprietary, operational performance is represented by annual averages, water consumption is rarely scarcity-weighted, and data-quality assessments are not connected to measurement priorities. We present OpenDC-LCA, an open-source, evidence-governed research layer that couples data-center cooling physics to general life-cycle assessment (LCA) tools while preserving source identity, functional unit, geography, transformation equations, uncertainty, and evidence status. A guided practitioner workflow converts a compact facility, cooling, electricity, water, equipment, and source record into the governed scenario schema and returns both a plain-language report and machine-readable results with contribution breakdowns, audit findings, evidence level, and next-data requirements. The framework supports openLCA JSON-LD and Brightway interoperability, hourly weather-load-performance integration, discrete and reliability-driven replacement, uncertainty analysis, and a machine-readable claim gate. We use released Microsoft/WSP results, EPA eGRID 2023, 48 Boavizta server product-carbon-footprint records, selected ÖKOBAUDAT construction processes, NOAA weather data, and the released Microsoft pedigree assessment to demonstrate analyses that cannot be obtained from any source alone. All 24 released normalized totals were independently reconciled to floating-point precision. Re-basing the released greenhouse-gas contributions across 51 eGRID state records identified a cold-plate/one-phase-immersion crossover near 61 kg CO2e MWh−1: cold plate was lower only for Vermont among the observed states, whereas two-phase immersion remained lowest under the released model. Extending the analysis to nine eGRID years and 459 state-year observations showed that the generation-weighted U.S. factor declined from 518 to 348 kg CO2e MWh−1 between 2012 and 2023, lowering the modeled air-cooled result by 30.3% but increasing its embodied share from 6.7% to 9.6%. Two-phase immersion remained lowest in every state-year and under a 0.38-2.06-fold server-inventory stress test, while its released use-phase advantage could deteriorate by a median 6.0% across 2023 states before losing first rank. By contrast, the cold-plate/one-phase ordering could reverse with a median 1.6% change in the cold-plate use-phase term, defining a demanding performance-validation target. Across the state range, embodied contributions increased from approximately 4% to 57-58% as electricity intensity declined. A contribution-weighted pedigree diagnostic ranked use-phase performance first and server inventories next as evidence-improvement priorities. Public server records showed a manufacturing median of 1,215 kg CO2e per server and a 465-2,503 kg CO2e range. ÖKOBAUDAT unit-process comparisons indicated 60% lower A1-A3 GHG for high-scrap electric-arc-furnace steel than a blast-furnace route and 50% lower GHG for CEM III than CEM II/A cement, but facility propagation is blocked until quantities are disclosed. The results show that open data can support new, decision-relevant deductions when incompatible units and evidence limits are not hidden. OpenDC-LCA complements rather than replaces openLCA or Brightway by supplying the cooling-specific engineering, evidence lineage, and claim governance needed for reproducible comparative research.</w:t>
+        <w:t>Cooling choices alter data-center operating energy, hardware requirements and lifecycle burdens, but published rankings are difficult to transfer across electricity systems and functional units. We present OpenDC-LCA, an open-source foreground and evidence-governance layer for reproducible data-center cooling LCA. It preserves source identity, functional unit, geography, transformation equations and evidence status while connecting static lifecycle models to hourly performance, replacement, openLCA and Brightway. We audited 24 released Microsoft/WSP normalized results and combined their Vcore-year foreground model with its released GaBi electricity endpoints (6.13 and 524.89 kg CO2e MWh−1), nine EPA eGRID releases, 48 Boavizta server records, selected ÖKOBAUDAT processes and a published pedigree matrix. Holding the released foreground model fixed, the cold-plate/one-phase-immersion crossover occurred at 96.7 kg CO2e MWh−1; Vermont was the only 2023 state below it. Across 459 controlled state-year electricity-factor scenarios, two-phase immersion retained the lowest modeled greenhouse-gas total. The generation-weighted U.S. factor fell 32.8% from 2012 to 2023, reducing the modeled absolute two-phase-versus-air benefit from 7.49 to 5.26 kg CO2e Vcore−1 yr−1 while increasing the air-cooled embodied share from 9.7% to 13.8%. A deterministic break-even test found that a median 1.38% reduction in the cold-plate use-phase term would equal one-phase immersion across 2023 states; this is a performance-discrimination target, not a confidence interval. Server-footprint and construction-process data identify potentially influential inputs but cannot be propagated without architecture-specific quantities and functional-performance mappings. The study demonstrates how open evidence can expose conditional rankings and prioritize measurements without presenting secondary-data scenarios as independent LCAs or field validation.</w:t>
       </w:r>
     </w:p>
     <w:p>
@@ -404,7 +404,7 @@
           <w:rFonts w:ascii="Calibri" w:hAnsi="Calibri"/>
           <w:sz w:val="21"/>
         </w:rPr>
-        <w:t>independently reconstruct the released Microsoft/WSP results and use them</w:t>
+        <w:t>independently audit the arithmetic of the released Microsoft/WSP results and use them</w:t>
       </w:r>
     </w:p>
     <w:p>
@@ -550,7 +550,7 @@
         <w:pStyle w:val="Heading2"/>
       </w:pPr>
       <w:r>
-        <w:t>2.2. Goal, functional unit, and system boundary</w:t>
+        <w:t>2.2. Goal, functional units, and system boundary</w:t>
       </w:r>
     </w:p>
     <w:p>
@@ -559,7 +559,7 @@
           <w:rFonts w:ascii="Calibri" w:hAnsi="Calibri"/>
           <w:sz w:val="21"/>
         </w:rPr>
-        <w:t>The present functional unit is one MWh of electricity delivered to IT equipment (</w:t>
+        <w:t>The software's default practitioner functional unit is one MWh of electricity delivered to IT equipment (</w:t>
       </w:r>
       <w:r>
         <w:rPr>
@@ -574,7 +574,7 @@
           <w:rFonts w:ascii="Calibri" w:hAnsi="Calibri"/>
           <w:sz w:val="21"/>
         </w:rPr>
-        <w:t>). This denominator is valid only when the alternatives provide equivalent computational service, utilization, reliability, and hardware life. If cooling changes compute performance, throttling, server configuration, or replacement, an IT-energy denominator alone is insufficient and absolute results plus a service-based unit should be reported.</w:t>
+        <w:t>). It supports facility screening only when alternatives provide equivalent computational service, utilization, reliability and hardware life. The secondary Microsoft/WSP analysis is a separate research case and retains its published functional unit of one Vcore-year. We do not convert between IT MWh and Vcore-year because the public files do not provide a workload-specific, architecture-independent mapping between electricity and useful computation. Results in these two units are therefore reported in separate analyses and are never numerically combined. If cooling changes throttling, server configuration, compute throughput or replacement, an IT-energy denominator alone is insufficient and a reviewed service-based unit is required.</w:t>
       </w:r>
     </w:p>
     <w:p>
@@ -788,7 +788,7 @@
           <w:rFonts w:ascii="Calibri" w:hAnsi="Calibri"/>
           <w:sz w:val="21"/>
         </w:rPr>
-        <w:t>The Microsoft/WSP normalized GHG workbook reports use-phase and embodied contributions for a U.S. grid case and a 100% renewable case. To test geographic transferability without asserting access to the proprietary background model, we used an affine re-basing. For technology j, eGRID state s, and the generation-weighted national eGRID factor EF_US,</w:t>
+        <w:t>The Microsoft/WSP normalized GHG workbook reports use-phase and embodied contributions for a U.S. grid case and a 100% renewable case. The accompanying detailed workbook identifies these background electricity results as 524.893 kg CO2e MWh−1 for U.S. average electricity and 6.133 kg CO2e MWh−1 for U.S. average wind under IPCC AR5 GTP100 excluding biogenic carbon. To test electricity-system sensitivity without asserting access to the proprietary process network, we used an affine interpolation or extrapolation between these released anchors. For technology j, external electricity factor EF_s, grid anchor EF_G, and renewable anchor EF_R,</w:t>
       </w:r>
     </w:p>
     <w:p>
@@ -804,7 +804,7 @@
           <w:color w:val="17324D"/>
           <w:sz w:val="21"/>
         </w:rPr>
-        <w:t>I_j,s = I_j,RE + (I_j,grid - I_j,RE) EF_s / EF_US                       (7)</w:t>
+        <w:t>I_j,s = I_j,R + (I_j,G - I_j,R) (EF_s - EF_R) / (EF_G - EF_R)          (7)</w:t>
       </w:r>
     </w:p>
     <w:p>
@@ -813,7 +813,7 @@
           <w:rFonts w:ascii="Calibri" w:hAnsi="Calibri"/>
           <w:sz w:val="21"/>
         </w:rPr>
-        <w:t>The published grid and renewable endpoints are therefore reproduced at ratios one and zero, respectively. This is a screening transformation, not a claim that all upstream electricity impacts scale with direct eGRID CO2e. State records with missing or nonpositive generation were excluded. The crossover between technologies a and b follows by equating the two affine relationships:</w:t>
+        <w:t>The two published electricity endpoints are therefore reproduced exactly, without forcing the Microsoft grid case to equal the lower 2023 eGRID national factor. This is a controlled screening transformation, not a claim that all upstream electricity impacts scale with eGRID total-output CO2e. State records with missing or nonpositive generation were excluded. The crossover between technologies a and b follows by equating the two affine relationships:</w:t>
       </w:r>
     </w:p>
     <w:p>
@@ -829,7 +829,7 @@
           <w:color w:val="17324D"/>
           <w:sz w:val="21"/>
         </w:rPr>
-        <w:t>EF*_(a,b) = EF_US (I_b,RE - I_a,RE) / [(I_a,grid-I_a,RE) - (I_b,grid-I_b,RE)]  (8)</w:t>
+        <w:t>EF* = EF_R + (EF_G-EF_R)(I_b,R-I_a,R)/[(I_a,G-I_a,R)-(I_b,G-I_b,R)]   (8)</w:t>
       </w:r>
     </w:p>
     <w:p>
@@ -838,7 +838,7 @@
           <w:rFonts w:ascii="Calibri" w:hAnsi="Calibri"/>
           <w:sz w:val="21"/>
         </w:rPr>
-        <w:t>To evaluate temporal transferability, the same transformation was applied to EPA state total-output factors for 2012, 2014, 2016, and 2018-2023. Factors reported in pounds CO2e MWh−1 before the metric workbook were converted using 0.45359237 kg lb−1. A generation-weighted U.S. factor was recalculated for each release from state generation and emission rates. We then recorded the lowest-GHG architecture, percentage margin to the second-ranked architecture, embodied share, and regret of each alternative for every state-year. This historical analysis represents observed annual electricity-system conditions, not a forecast or marginal-dispatch model.</w:t>
+        <w:t>To evaluate temporal sensitivity, the same transformation was applied to EPA state total-output factors for 2012, 2014, 2016, and 2018-2023. Factors reported in pounds CO2e MWh−1 before the metric workbook were converted using 0.45359237 kg lb−1. A generation-weighted U.S. factor was recalculated for each release from state generation and emission rates. We then recorded the lowest-GHG architecture, percentage margin to the second-ranked architecture, embodied share, and regret of each alternative for every state-year. The 459 rows are controlled evaluations of one fixed foreground model at observed annual electricity factors, not 459 independent LCAs or statistical replicates. State total-output factors describe in-state generation and are not consumption-based factors; imports, exports, contractual procurement, hourly dispatch and transmission are outside the analysis.</w:t>
       </w:r>
     </w:p>
     <w:p>
@@ -1173,7 +1173,7 @@
           <w:rFonts w:ascii="Calibri" w:hAnsi="Calibri"/>
           <w:sz w:val="21"/>
         </w:rPr>
-        <w:t>The validation case used the source data and model archive released with Alissa et al. [1,2]. The tested claim was limited: for each architecture, electricity scenario, and impact category, did the released normalized total equal the sum of the seven released contributions for use phase, building, server, rack or tank, cable, supporting equipment, and cooling fluid? The audit covered four architectures, two electricity scenarios, and three metrics, for 24 totals. It did not independently recreate licensed background inventories, manufacturer data, confidential bills of materials, measured PUE values, or the complete virtual-core model.</w:t>
+        <w:t>The arithmetic-consistency case used the source data and model archive released with Alissa et al. [1,2]. The tested claim was limited: for each architecture, electricity scenario, and impact category, did the released normalized total equal the sum of the seven released contributions for use phase, building, server, rack or tank, cable, supporting equipment, and cooling fluid? The audit covered four architectures, two electricity scenarios, and three metrics, for 24 totals. It did not independently recreate licensed background inventories, manufacturer data, confidential bills of materials, measured PUE values, or the complete virtual-core model.</w:t>
       </w:r>
     </w:p>
     <w:p>
@@ -1229,7 +1229,7 @@
           <w:rFonts w:ascii="Calibri" w:hAnsi="Calibri"/>
           <w:sz w:val="21"/>
         </w:rPr>
-        <w:t>Historical detailed workbooks supplied the same state fields for 2012, 2014, 2016, and 2018-2022. Together with 2023, the panel contains nine releases and 459 state-year observations. Each year contains 50 states and the District of Columbia after excluding Puerto Rico and national aggregate rows. File name, worksheet field, original unit conversion, generation, and factor are retained for every observation. Cross-year comparisons can be affected by EPA source updates and power-sector accounting revisions in addition to physical grid change, so the panel is interpreted as a sequence of released annual conditions.</w:t>
+        <w:t>Historical detailed workbooks supplied the same state fields for 2012, 2014, 2016, and 2018-2022. Together with 2023, the panel contains nine releases and 459 state-year electricity-factor records. Each year contains 50 states and the District of Columbia after excluding Puerto Rico and national aggregate rows. File name, worksheet field, original unit conversion, generation, and factor are retained for every observation. Cross-year comparisons can be affected by EPA source updates and power-sector accounting revisions in addition to physical grid change, so the panel is interpreted as a sequence of released annual conditions. Because the state total-output rate represents generation within the state, it should not be interpreted as the consumption mix of a data center located there.</w:t>
       </w:r>
     </w:p>
     <w:p>
@@ -1421,7 +1421,7 @@
         <w:drawing>
           <wp:inline xmlns:a="http://schemas.openxmlformats.org/drawingml/2006/main" xmlns:pic="http://schemas.openxmlformats.org/drawingml/2006/picture">
             <wp:extent cx="5897880" cy="3409603"/>
-            <wp:docPr id="2" name="Picture 2" descr="Figure 2. Reconstructed reductions relative to the air-cooled case for the grid scenario in the released Microsoft/Nature source data. Values are derived from published normalized component contributions and validate arithmetic consistency, not proprietary background inventories or foreground bills of materials." title="OpenDC-LCA Figure 2"/>
+            <wp:docPr id="2" name="Picture 2" descr="Figure 2. Reconciled reductions relative to the air-cooled case for the grid scenario in the released Microsoft/Nature source data. Values are derived from published normalized component contributions and audit arithmetic consistency; they do not validate proprietary background inventories, foreground bills of materials or field performance." title="OpenDC-LCA Figure 2"/>
             <wp:cNvGraphicFramePr>
               <a:graphicFrameLocks noChangeAspect="1"/>
             </wp:cNvGraphicFramePr>
@@ -1461,7 +1461,7 @@
           <w:rFonts w:ascii="Calibri" w:hAnsi="Calibri"/>
           <w:sz w:val="18"/>
         </w:rPr>
-        <w:t>Figure 2. Reconstructed reductions relative to the air-cooled case for the grid scenario in the released Microsoft/Nature source data. Values are derived from published normalized component contributions and validate arithmetic consistency, not proprietary background inventories or foreground bills of materials.</w:t>
+        <w:t>Figure 2. Reconciled reductions relative to the air-cooled case for the grid scenario in the released Microsoft/Nature source data. Values are derived from published normalized component contributions and audit arithmetic consistency; they do not validate proprietary background inventories, foreground bills of materials or field performance.</w:t>
       </w:r>
     </w:p>
     <w:p>
@@ -1487,7 +1487,7 @@
           <w:rFonts w:ascii="Calibri" w:hAnsi="Calibri"/>
           <w:sz w:val="21"/>
         </w:rPr>
-        <w:t>Figure 3 applies Eq. (7) to the 51 eGRID state/DC records. The modeled cold-plate and one-phase totals intersect at 60.8 kg CO2e MWh−1, within the observed 23.7-893.1 kg CO2e MWh−1 state range. Cold plate was lower than one-phase immersion only for Vermont (23.7 kg CO2e MWh−1); one-phase was lower for the other 50 records. At the Arkansas factor (452.9 kg CO2e MWh−1), one-phase was lower than cold plate by 0.617 kg CO2e Vcore−1 yr−1. Two-phase immersion remained the lowest-GHG architecture in all 51 re-based cases under the released assumptions.</w:t>
+        <w:t>Figure 3 applies Eq. (7) to the 51 eGRID state/DC records. The modeled cold-plate and one-phase totals intersect at 96.7 kg CO2e MWh−1, within the observed 23.7-893.1 kg CO2e MWh−1 state range. Cold plate was lower than one-phase immersion only for Vermont (23.7 kg CO2e MWh−1); one-phase was lower for the other 50 records. At the Arkansas factor (452.9 kg CO2e MWh−1), one-phase was lower than cold plate by 0.376 kg CO2e Vcore−1 yr−1. Two-phase immersion remained the lowest-GHG architecture in all 51 re-based cases under the released assumptions.</w:t>
       </w:r>
     </w:p>
     <w:p>
@@ -1500,7 +1500,7 @@
         <w:drawing>
           <wp:inline xmlns:a="http://schemas.openxmlformats.org/drawingml/2006/main" xmlns:pic="http://schemas.openxmlformats.org/drawingml/2006/picture">
             <wp:extent cx="5897880" cy="3372417"/>
-            <wp:docPr id="3" name="Picture 3" descr="Figure 3. Screening re-basing of the released Microsoft/WSP GHG contributions across EPA eGRID 2023 state total-output intensities. The vertical dashed line marks the cold-plate/one-phase crossover near 61 kg CO2e MWh−1. Lines connect state scenarios and do not represent a dynamic grid trajectory. Two-phase immersion remains lowest under the released foreground assumptions." title="OpenDC-LCA Figure 3"/>
+            <wp:docPr id="3" name="Picture 3" descr="Figure 3. Screening re-basing of the released Microsoft/WSP GHG contributions across EPA eGRID 2023 state total-output intensities. The vertical dashed line marks the cold-plate/one-phase crossover near 96.7 kg CO2e MWh−1. Lines connect state scenarios and do not represent a dynamic grid trajectory. Two-phase immersion remains lowest under the released foreground assumptions." title="OpenDC-LCA Figure 3"/>
             <wp:cNvGraphicFramePr>
               <a:graphicFrameLocks noChangeAspect="1"/>
             </wp:cNvGraphicFramePr>
@@ -1540,7 +1540,7 @@
           <w:rFonts w:ascii="Calibri" w:hAnsi="Calibri"/>
           <w:sz w:val="18"/>
         </w:rPr>
-        <w:t>Figure 3. Screening re-basing of the released Microsoft/WSP GHG contributions across EPA eGRID 2023 state total-output intensities. The vertical dashed line marks the cold-plate/one-phase crossover near 61 kg CO2e MWh−1. Lines connect state scenarios and do not represent a dynamic grid trajectory. Two-phase immersion remains lowest under the released foreground assumptions.</w:t>
+        <w:t>Figure 3. Screening re-basing of the released Microsoft/WSP GHG contributions across EPA eGRID 2023 state total-output intensities. The vertical dashed line marks the cold-plate/one-phase crossover near 96.7 kg CO2e MWh−1. Lines connect state scenarios and do not represent a dynamic grid trajectory. Two-phase immersion remains lowest under the released foreground assumptions.</w:t>
       </w:r>
     </w:p>
     <w:p>
@@ -1566,7 +1566,7 @@
           <w:rFonts w:ascii="Calibri" w:hAnsi="Calibri"/>
           <w:sz w:val="21"/>
         </w:rPr>
-        <w:t>The generation-weighted U.S. total-output factor declined from 518.0 kg CO2e MWh−1 in 2012 to 348.2 kg CO2e MWh−1 in 2023, a 32.8% reduction, although the trajectory was not monotonic: it increased from 371.5 in 2020 to 387.3 in 2021 before declining again. Applying the same released foreground model reduced the national air-cooled result from 52.66 to 36.68 kg CO2e Vcore−1 yr−1 and the two-phase result from 41.77 to 29.10 kg CO2e Vcore−1 yr−1. The absolute benefit of two-phase relative to air therefore contracted from 10.89 to 7.58 kg CO2e Vcore−1 yr−1, while its percentage benefit remained near 20.7% because both use-phase terms scale with the same electricity-system trajectory.</w:t>
+        <w:t>The generation-weighted U.S. total-output factor declined from 518.0 kg CO2e MWh−1 in 2012 to 348.2 kg CO2e MWh−1 in 2023, a 32.8% reduction, although the trajectory was not monotonic: it increased from 371.5 in 2020 to 387.3 in 2021 before declining again. Applying the same released foreground model reduced the national air-cooled result from 36.25 to 25.52 kg CO2e Vcore−1 yr−1 and the two-phase result from 28.76 to 20.26 kg CO2e Vcore−1 yr−1. The absolute benefit of two-phase relative to air therefore contracted from 7.49 to 5.26 kg CO2e Vcore−1 yr−1, while its percentage benefit remained near 20.6% because both use-phase terms scale with the same electricity-system trajectory.</w:t>
       </w:r>
     </w:p>
     <w:p>
@@ -1579,7 +1579,7 @@
         <w:drawing>
           <wp:inline xmlns:a="http://schemas.openxmlformats.org/drawingml/2006/main" xmlns:pic="http://schemas.openxmlformats.org/drawingml/2006/picture">
             <wp:extent cx="5897880" cy="3325749"/>
-            <wp:docPr id="4" name="Picture 4" descr="Figure 4. Historical EPA eGRID state total-output intensities for nine releases between 2012 and 2023. Each dot is a state-year observation; the orange line is the generation-weighted U.S. factor. Blue points fall below the 60.8 kg CO2e MWh−1 cold-plate/one-phase crossover derived from the released Microsoft/WSP foreground model. The panel describes released annual conditions, not a forecast or marginal-emissions trajectory." title="OpenDC-LCA Figure 4"/>
+            <wp:docPr id="4" name="Picture 4" descr="Figure 4. Historical EPA eGRID state total-output intensities for nine releases between 2012 and 2023. Each dot is a state-year electricity-factor scenario; the orange line is the generation-weighted U.S. factor. Blue points fall below the 96.7 kg CO2e MWh−1 cold-plate/one-phase crossover derived from the released Microsoft/WSP foreground model. The panel describes released annual generation conditions, not consumption, a forecast, marginal emissions or independent LCAs." title="OpenDC-LCA Figure 4"/>
             <wp:cNvGraphicFramePr>
               <a:graphicFrameLocks noChangeAspect="1"/>
             </wp:cNvGraphicFramePr>
@@ -1619,7 +1619,7 @@
           <w:rFonts w:ascii="Calibri" w:hAnsi="Calibri"/>
           <w:sz w:val="18"/>
         </w:rPr>
-        <w:t>Figure 4. Historical EPA eGRID state total-output intensities for nine releases between 2012 and 2023. Each dot is a state-year observation; the orange line is the generation-weighted U.S. factor. Blue points fall below the 60.8 kg CO2e MWh−1 cold-plate/one-phase crossover derived from the released Microsoft/WSP foreground model. The panel describes released annual conditions, not a forecast or marginal-emissions trajectory.</w:t>
+        <w:t>Figure 4. Historical EPA eGRID state total-output intensities for nine releases between 2012 and 2023. Each dot is a state-year electricity-factor scenario; the orange line is the generation-weighted U.S. factor. Blue points fall below the 96.7 kg CO2e MWh−1 cold-plate/one-phase crossover derived from the released Microsoft/WSP foreground model. The panel describes released annual generation conditions, not consumption, a forecast, marginal emissions or independent LCAs.</w:t>
       </w:r>
     </w:p>
     <w:p>
@@ -1628,7 +1628,7 @@
           <w:rFonts w:ascii="Calibri" w:hAnsi="Calibri"/>
           <w:sz w:val="21"/>
         </w:rPr>
-        <w:t>Three states—Idaho, Vermont, and Washington—fell below the pairwise crossover in 2012, but only Vermont did so in each subsequent release. This does not indicate monotonic state decarbonization; Idaho and Washington moved above the threshold as their annual generation mix changed. More importantly, two-phase immersion remained the lowest modeled GHG option in all 459 state-year cases. The result separates a sensitive pairwise ordering (cold plate versus one-phase) from the more robust first-ranked architecture under the released assumptions.</w:t>
+        <w:t>Three states fell below the pairwise crossover in 2012, compared with between one and three states in every analyzed release and only Vermont in 2023. This does not indicate monotonic state decarbonization because annual state generation mixes changed in both directions. More importantly, two-phase immersion remained the lowest modeled GHG option in all 459 controlled electricity-factor scenarios. The scenario count is coverage of the tested factor space, not statistical replication. The result separates a sensitive pairwise ordering (cold plate versus one-phase) from the more robust first-ranked architecture under the released assumptions.</w:t>
       </w:r>
     </w:p>
     <w:p>
@@ -1637,7 +1637,7 @@
           <w:rFonts w:ascii="Calibri" w:hAnsi="Calibri"/>
           <w:sz w:val="21"/>
         </w:rPr>
-        <w:t>At the national generation-weighted factor, the embodied share of the air-cooled result increased from 6.7% in 2012 to 9.6% in 2023; the two-phase share increased from 6.8% to 9.7%. The change is modest nationally because the U.S. factor remains well above the low-carbon state range, but it establishes the direction of travel: decarbonization reduces the absolute operational benefit available from cooling and increases the leverage of server lifetime, manufacturing, and replacement.</w:t>
+        <w:t>At the national generation-weighted factor, the embodied share of the air-cooled result increased from 9.7% in 2012 to 13.8% in 2023; the two-phase share increased from 9.8% to 13.9%. The change is modest nationally because the U.S. factor remains well above the low-carbon state range, but it establishes the direction of travel: decarbonization reduces the absolute operational benefit available from cooling and increases the leverage of server lifetime, manufacturing, and replacement.</w:t>
       </w:r>
     </w:p>
     <w:p>
@@ -1654,7 +1654,7 @@
           <w:rFonts w:ascii="Calibri" w:hAnsi="Calibri"/>
           <w:sz w:val="21"/>
         </w:rPr>
-        <w:t>Across the 2023 state factors, cold plate would need a median 1.58% reduction in its released use-phase contribution to equal one-phase immersion. The required change ranged from a 1.83% reduction on the most carbon-intensive grid to a 2.61% increase in Vermont, where cold plate was already lower. Consequently, a comparative experiment or field model with combined uncertainty greater than approximately 1-2% cannot resolve the pairwise ordering for most states without stronger evidence.</w:t>
+        <w:t>Across the 2023 state factors, cold plate would need a median 1.38% reduction in its released use-phase contribution to equal one-phase immersion. The required change ranged from a 1.76% reduction on the most carbon-intensive grid to a 6.01% increase in Vermont, where cold plate was already lower. These deterministic thresholds specify the performance separation that an experiment must test. They do not establish the uncertainty needed to resolve the ranking; that requires joint propagation of measurement, foreground, electricity, lifetime, correlation and model-form uncertainty.</w:t>
       </w:r>
     </w:p>
     <w:p>
@@ -1716,7 +1716,7 @@
           <w:rFonts w:ascii="Calibri" w:hAnsi="Calibri"/>
           <w:sz w:val="21"/>
         </w:rPr>
-        <w:t>Two-phase immersion exhibited a wider margin. Its released use-phase term could increase by 5.39-13.31% across the state range before another architecture became lower, with a median tolerance of 5.99%. Scaling the Microsoft compute, storage, and networking contributions by 0.38-2.06, corresponding to the minimum-to-maximum annualized Boavizta factors relative to their median, did not change the first-ranked technology in any of the 51 states. The median winner margin increased slightly from 5.13% at the minimum server scale to 5.69% at the maximum because the released two-phase case has favorable server-related contributions. This is a robustness result for the published foreground structure, not evidence that any particular server can be substituted into an immersion system.</w:t>
+        <w:t>Two-phase immersion exhibited a wider margin. Its released use-phase term could increase by 5.57-17.87% across the state range before another architecture became lower, with a median tolerance of 6.46%. Scaling the Microsoft compute, storage, and networking contributions by 0.38-2.06, corresponding to the minimum-to-maximum annualized Boavizta factors relative to their median, did not change the first-ranked technology in any of the 51 states. The median winner margin increased slightly from 5.17% at the minimum server scale to 5.82% at the maximum because the released two-phase case has favorable server-related contributions. This is a robustness result for the published foreground structure. Because compute, storage and networking were scaled together, it is not an architecture-specific server substitution and does not capture server count, throughput, configuration, lifetime or separate product-class effects.</w:t>
       </w:r>
     </w:p>
     <w:p>
@@ -1759,7 +1759,7 @@
           <w:rFonts w:ascii="Calibri" w:hAnsi="Calibri"/>
           <w:sz w:val="21"/>
         </w:rPr>
-        <w:t>The released pedigree assessment alone assigns the weakest average score to networking equipment (3.6/5), followed by storage servers (2.8/5). Weakness alone, however, would prioritize a small contributor. Multiplying weakness by mean GHG contribution changed the order (Figure 4). Use phase ranked first because its 90.3% mean contribution outweighed a relatively good 1.4/5 pedigree score. Storage, networking and compute-server evidence formed the next tier with nearly equal priority indices (0.0127-0.0129).</w:t>
+        <w:t>The released pedigree assessment alone assigns the weakest average score to networking equipment (3.6/5), followed by storage servers (2.8/5). Weakness alone, however, would prioritize a small contributor. Multiplying weakness by mean GHG contribution changed the order (Figure 6). Use phase ranked first because its 90.3% mean contribution outweighed a relatively good 1.4/5 pedigree score. Storage, networking and compute-server evidence formed the next tier with nearly equal priority indices (0.0127-0.0129).</w:t>
       </w:r>
     </w:p>
     <w:p>
@@ -1838,7 +1838,7 @@
           <w:rFonts w:ascii="Calibri" w:hAnsi="Calibri"/>
           <w:sz w:val="21"/>
         </w:rPr>
-        <w:t>The 48 usable Boavizta server records yielded manufacturing GHG values from 465 to 2,503 kg CO2e per server, with a median of 1,215 kg CO2e and an interquartile range of 1,146-1,337 kg CO2e (Figure 5). Annualized by the declared four-year lifetime, the median was 304 kg CO2e server−1 yr−1. The approximately 5.4-fold full range is large relative to many reported cooling savings. Because manufacturer PCFs differ in method and configuration, this range is an evidence envelope rather than a product ranking.</w:t>
+        <w:t>The 48 usable Boavizta server records yielded manufacturing GHG values from 465 to 2,503 kg CO2e per server, with a median of 1,215 kg CO2e and an interquartile range of 1,146-1,337 kg CO2e (Figure 7). Annualized by the declared four-year lifetime, the median was 304 kg CO2e server−1 yr−1. The approximately 5.4-fold full range is large relative to many reported cooling savings. Because manufacturer PCFs differ in method and configuration, this range is an evidence envelope rather than a product ranking.</w:t>
       </w:r>
     </w:p>
     <w:p>
@@ -1915,7 +1915,7 @@
           <w:rFonts w:ascii="Calibri" w:hAnsi="Calibri"/>
           <w:sz w:val="21"/>
         </w:rPr>
-        <w:t>The selected ÖKOBAUDAT records identified large construction procurement levers (Figure 6). High-scrap electric-arc-furnace galvanized steel had 59.9% lower A1-A3 GHG, 47.9% lower nonrenewable primary energy and 52.0% lower freshwater use than the selected low-scrap blast-furnace profile. CEM III cement had 49.8% lower GHG, 12.1% lower nonrenewable primary energy and 23.5% lower freshwater use than CEM II/A. Their facility significance cannot be calculated without architecture-specific material quantities.</w:t>
+        <w:t>The selected ÖKOBAUDAT records identified large construction procurement levers (Figure 8). High-scrap electric-arc-furnace galvanized steel had 59.9% lower A1-A3 GHG, 47.9% lower nonrenewable primary energy and 52.0% lower freshwater use than the selected low-scrap blast-furnace profile. CEM III cement had 49.8% lower GHG, 12.1% lower nonrenewable primary energy and 23.5% lower freshwater use than CEM II/A. Their facility significance cannot be calculated without architecture-specific material quantities.</w:t>
       </w:r>
     </w:p>
     <w:p>
@@ -1976,7 +1976,7 @@
         <w:pStyle w:val="Heading2"/>
       </w:pPr>
       <w:r>
-        <w:t>4.8. Temporal and measurement pathways remain validation cases</w:t>
+        <w:t>4.8. Temporal and measurement pathways remain demonstrations</w:t>
       </w:r>
     </w:p>
     <w:p>
@@ -1993,7 +1993,7 @@
         <w:pStyle w:val="Heading2"/>
       </w:pPr>
       <w:r>
-        <w:t>4.9. Capability and evidence matrix</w:t>
+        <w:t>4.9. Software implementation and verification</w:t>
       </w:r>
     </w:p>
     <w:p>
@@ -2002,1591 +2002,32 @@
           <w:rFonts w:ascii="Calibri" w:hAnsi="Calibri"/>
           <w:sz w:val="21"/>
         </w:rPr>
-        <w:t>Table 1 summarizes the implemented functions and the evidence required for their defensible use. The distinguishing contribution is the continuity from data registration through physics-informed temporal integration to an explicit claim gate. Numerical outputs remain available for inspection even when the audit blocks a comparative conclusion.</w:t>
+        <w:t>The public package implements the governed input schema, static and temporal calculations, bounded performance-surface interpolation, replacement, screening uncertainty, openLCA/Brightway exchange and a comparative-claim audit. The command-line, Python and local graphical interfaces call the same calculation path and emit a human-readable report plus machine-readable results. Detailed input-output fields, installation commands, interface screens, capability matrices and release checks are provided in the repository and Supplementary Information rather than repeated in the main article.</w:t>
+      </w:r>
+    </w:p>
+    <w:p>
+      <w:r>
+        <w:rPr>
+          <w:rFonts w:ascii="Calibri" w:hAnsi="Calibri"/>
+          <w:sz w:val="21"/>
+        </w:rPr>
+        <w:t>Forty-two automated tests exercise the calculation engine, provenance rules, performance maps, interoperability, reliability and practitioner workflow. The distribution was also installed in a clean Python environment and run from template creation through report generation. These checks establish software consistency; they do not constitute ISO critical review, empirical performance validation or validation of user-supplied factors.</w:t>
       </w:r>
     </w:p>
     <w:p>
       <w:pPr>
-        <w:pStyle w:val="Caption"/>
-        <w:keepNext/>
+        <w:pStyle w:val="Heading1"/>
       </w:pPr>
       <w:r>
-        <w:rPr>
-          <w:rFonts w:ascii="Calibri" w:hAnsi="Calibri"/>
-          <w:sz w:val="18"/>
-        </w:rPr>
-        <w:t>Table 1. OpenDC-LCA capability and evidence matrix.</w:t>
-      </w:r>
-    </w:p>
-    <w:tbl>
-      <w:tblPr>
-        <w:tblStyle w:val="TableGrid"/>
-        <w:tblW w:type="dxa" w:w="9360"/>
-        <w:tblLayout w:type="fixed"/>
-        <w:tblLook w:firstColumn="1" w:firstRow="1" w:lastColumn="0" w:lastRow="0" w:noHBand="0" w:noVBand="1" w:val="04A0"/>
-        <w:tblInd w:w="120" w:type="dxa"/>
-      </w:tblPr>
-      <w:tblGrid>
-        <w:gridCol w:w="1450"/>
-        <w:gridCol w:w="1750"/>
-        <w:gridCol w:w="1650"/>
-        <w:gridCol w:w="1650"/>
-        <w:gridCol w:w="1850"/>
-        <w:gridCol w:w="1010"/>
-      </w:tblGrid>
-      <w:tr>
-        <w:trPr>
-          <w:tblHeader w:val="true"/>
-        </w:trPr>
-        <w:tc>
-          <w:tcPr>
-            <w:tcW w:type="dxa" w:w="1450"/>
-            <w:vAlign w:val="center"/>
-            <w:shd w:fill="1F4E79"/>
-            <w:tcMar>
-              <w:top w:w="80" w:type="dxa"/>
-              <w:start w:w="120" w:type="dxa"/>
-              <w:bottom w:w="80" w:type="dxa"/>
-              <w:end w:w="120" w:type="dxa"/>
-            </w:tcMar>
-          </w:tcPr>
-          <w:p>
-            <w:pPr>
-              <w:spacing w:after="0" w:line="240" w:lineRule="auto"/>
-              <w:jc w:val="left"/>
-            </w:pPr>
-            <w:r>
-              <w:rPr>
-                <w:rFonts w:ascii="Calibri" w:hAnsi="Calibri"/>
-                <w:b/>
-                <w:color w:val="FFFFFF"/>
-                <w:sz w:val="15"/>
-              </w:rPr>
-              <w:t>Capability</w:t>
-            </w:r>
-          </w:p>
-        </w:tc>
-        <w:tc>
-          <w:tcPr>
-            <w:tcW w:type="dxa" w:w="1750"/>
-            <w:vAlign w:val="center"/>
-            <w:shd w:fill="1F4E79"/>
-            <w:tcMar>
-              <w:top w:w="80" w:type="dxa"/>
-              <w:start w:w="120" w:type="dxa"/>
-              <w:bottom w:w="80" w:type="dxa"/>
-              <w:end w:w="120" w:type="dxa"/>
-            </w:tcMar>
-          </w:tcPr>
-          <w:p>
-            <w:pPr>
-              <w:spacing w:after="0" w:line="240" w:lineRule="auto"/>
-              <w:jc w:val="left"/>
-            </w:pPr>
-            <w:r>
-              <w:rPr>
-                <w:rFonts w:ascii="Calibri" w:hAnsi="Calibri"/>
-                <w:b/>
-                <w:color w:val="FFFFFF"/>
-                <w:sz w:val="15"/>
-              </w:rPr>
-              <w:t>Input</w:t>
-            </w:r>
-          </w:p>
-        </w:tc>
-        <w:tc>
-          <w:tcPr>
-            <w:tcW w:type="dxa" w:w="1650"/>
-            <w:vAlign w:val="center"/>
-            <w:shd w:fill="1F4E79"/>
-            <w:tcMar>
-              <w:top w:w="80" w:type="dxa"/>
-              <w:start w:w="120" w:type="dxa"/>
-              <w:bottom w:w="80" w:type="dxa"/>
-              <w:end w:w="120" w:type="dxa"/>
-            </w:tcMar>
-          </w:tcPr>
-          <w:p>
-            <w:pPr>
-              <w:spacing w:after="0" w:line="240" w:lineRule="auto"/>
-              <w:jc w:val="left"/>
-            </w:pPr>
-            <w:r>
-              <w:rPr>
-                <w:rFonts w:ascii="Calibri" w:hAnsi="Calibri"/>
-                <w:b/>
-                <w:color w:val="FFFFFF"/>
-                <w:sz w:val="15"/>
-              </w:rPr>
-              <w:t>Method</w:t>
-            </w:r>
-          </w:p>
-        </w:tc>
-        <w:tc>
-          <w:tcPr>
-            <w:tcW w:type="dxa" w:w="1650"/>
-            <w:vAlign w:val="center"/>
-            <w:shd w:fill="1F4E79"/>
-            <w:tcMar>
-              <w:top w:w="80" w:type="dxa"/>
-              <w:start w:w="120" w:type="dxa"/>
-              <w:bottom w:w="80" w:type="dxa"/>
-              <w:end w:w="120" w:type="dxa"/>
-            </w:tcMar>
-          </w:tcPr>
-          <w:p>
-            <w:pPr>
-              <w:spacing w:after="0" w:line="240" w:lineRule="auto"/>
-              <w:jc w:val="left"/>
-            </w:pPr>
-            <w:r>
-              <w:rPr>
-                <w:rFonts w:ascii="Calibri" w:hAnsi="Calibri"/>
-                <w:b/>
-                <w:color w:val="FFFFFF"/>
-                <w:sz w:val="15"/>
-              </w:rPr>
-              <w:t>Output</w:t>
-            </w:r>
-          </w:p>
-        </w:tc>
-        <w:tc>
-          <w:tcPr>
-            <w:tcW w:type="dxa" w:w="1850"/>
-            <w:vAlign w:val="center"/>
-            <w:shd w:fill="1F4E79"/>
-            <w:tcMar>
-              <w:top w:w="80" w:type="dxa"/>
-              <w:start w:w="120" w:type="dxa"/>
-              <w:bottom w:w="80" w:type="dxa"/>
-              <w:end w:w="120" w:type="dxa"/>
-            </w:tcMar>
-          </w:tcPr>
-          <w:p>
-            <w:pPr>
-              <w:spacing w:after="0" w:line="240" w:lineRule="auto"/>
-              <w:jc w:val="left"/>
-            </w:pPr>
-            <w:r>
-              <w:rPr>
-                <w:rFonts w:ascii="Calibri" w:hAnsi="Calibri"/>
-                <w:b/>
-                <w:color w:val="FFFFFF"/>
-                <w:sz w:val="15"/>
-              </w:rPr>
-              <w:t>Evidence requirement</w:t>
-            </w:r>
-          </w:p>
-        </w:tc>
-        <w:tc>
-          <w:tcPr>
-            <w:tcW w:type="dxa" w:w="1010"/>
-            <w:vAlign w:val="center"/>
-            <w:shd w:fill="1F4E79"/>
-            <w:tcMar>
-              <w:top w:w="80" w:type="dxa"/>
-              <w:start w:w="120" w:type="dxa"/>
-              <w:bottom w:w="80" w:type="dxa"/>
-              <w:end w:w="120" w:type="dxa"/>
-            </w:tcMar>
-          </w:tcPr>
-          <w:p>
-            <w:pPr>
-              <w:spacing w:after="0" w:line="240" w:lineRule="auto"/>
-              <w:jc w:val="left"/>
-            </w:pPr>
-            <w:r>
-              <w:rPr>
-                <w:rFonts w:ascii="Calibri" w:hAnsi="Calibri"/>
-                <w:b/>
-                <w:color w:val="FFFFFF"/>
-                <w:sz w:val="15"/>
-              </w:rPr>
-              <w:t>Status</w:t>
-            </w:r>
-          </w:p>
-        </w:tc>
-      </w:tr>
-      <w:tr>
-        <w:tc>
-          <w:tcPr>
-            <w:tcW w:type="dxa" w:w="1450"/>
-            <w:vAlign w:val="center"/>
-            <w:tcMar>
-              <w:top w:w="80" w:type="dxa"/>
-              <w:start w:w="120" w:type="dxa"/>
-              <w:bottom w:w="80" w:type="dxa"/>
-              <w:end w:w="120" w:type="dxa"/>
-            </w:tcMar>
-          </w:tcPr>
-          <w:p>
-            <w:pPr>
-              <w:spacing w:after="0" w:line="240" w:lineRule="auto"/>
-              <w:jc w:val="left"/>
-            </w:pPr>
-            <w:r>
-              <w:rPr>
-                <w:rFonts w:ascii="Calibri" w:hAnsi="Calibri"/>
-                <w:sz w:val="15"/>
-              </w:rPr>
-              <w:t>Source registration</w:t>
-            </w:r>
-          </w:p>
-        </w:tc>
-        <w:tc>
-          <w:tcPr>
-            <w:tcW w:type="dxa" w:w="1750"/>
-            <w:vAlign w:val="center"/>
-            <w:tcMar>
-              <w:top w:w="80" w:type="dxa"/>
-              <w:start w:w="120" w:type="dxa"/>
-              <w:bottom w:w="80" w:type="dxa"/>
-              <w:end w:w="120" w:type="dxa"/>
-            </w:tcMar>
-          </w:tcPr>
-          <w:p>
-            <w:pPr>
-              <w:spacing w:after="0" w:line="240" w:lineRule="auto"/>
-              <w:jc w:val="left"/>
-            </w:pPr>
-            <w:r>
-              <w:rPr>
-                <w:rFonts w:ascii="Calibri" w:hAnsi="Calibri"/>
-                <w:sz w:val="15"/>
-              </w:rPr>
-              <w:t>Provider, ID, version, geography, unit, boundary, license</w:t>
-            </w:r>
-          </w:p>
-        </w:tc>
-        <w:tc>
-          <w:tcPr>
-            <w:tcW w:type="dxa" w:w="1650"/>
-            <w:vAlign w:val="center"/>
-            <w:tcMar>
-              <w:top w:w="80" w:type="dxa"/>
-              <w:start w:w="120" w:type="dxa"/>
-              <w:bottom w:w="80" w:type="dxa"/>
-              <w:end w:w="120" w:type="dxa"/>
-            </w:tcMar>
-          </w:tcPr>
-          <w:p>
-            <w:pPr>
-              <w:spacing w:after="0" w:line="240" w:lineRule="auto"/>
-              <w:jc w:val="left"/>
-            </w:pPr>
-            <w:r>
-              <w:rPr>
-                <w:rFonts w:ascii="Calibri" w:hAnsi="Calibri"/>
-                <w:sz w:val="15"/>
-              </w:rPr>
-              <w:t>Schema validation and checksum manifest</w:t>
-            </w:r>
-          </w:p>
-        </w:tc>
-        <w:tc>
-          <w:tcPr>
-            <w:tcW w:type="dxa" w:w="1650"/>
-            <w:vAlign w:val="center"/>
-            <w:tcMar>
-              <w:top w:w="80" w:type="dxa"/>
-              <w:start w:w="120" w:type="dxa"/>
-              <w:bottom w:w="80" w:type="dxa"/>
-              <w:end w:w="120" w:type="dxa"/>
-            </w:tcMar>
-          </w:tcPr>
-          <w:p>
-            <w:pPr>
-              <w:spacing w:after="0" w:line="240" w:lineRule="auto"/>
-              <w:jc w:val="left"/>
-            </w:pPr>
-            <w:r>
-              <w:rPr>
-                <w:rFonts w:ascii="Calibri" w:hAnsi="Calibri"/>
-                <w:sz w:val="15"/>
-              </w:rPr>
-              <w:t>Traceable record</w:t>
-            </w:r>
-          </w:p>
-        </w:tc>
-        <w:tc>
-          <w:tcPr>
-            <w:tcW w:type="dxa" w:w="1850"/>
-            <w:vAlign w:val="center"/>
-            <w:tcMar>
-              <w:top w:w="80" w:type="dxa"/>
-              <w:start w:w="120" w:type="dxa"/>
-              <w:bottom w:w="80" w:type="dxa"/>
-              <w:end w:w="120" w:type="dxa"/>
-            </w:tcMar>
-          </w:tcPr>
-          <w:p>
-            <w:pPr>
-              <w:spacing w:after="0" w:line="240" w:lineRule="auto"/>
-              <w:jc w:val="left"/>
-            </w:pPr>
-            <w:r>
-              <w:rPr>
-                <w:rFonts w:ascii="Calibri" w:hAnsi="Calibri"/>
-                <w:sz w:val="15"/>
-              </w:rPr>
-              <w:t>Complete metadata and redistribution review</w:t>
-            </w:r>
-          </w:p>
-        </w:tc>
-        <w:tc>
-          <w:tcPr>
-            <w:tcW w:type="dxa" w:w="1010"/>
-            <w:vAlign w:val="center"/>
-            <w:tcMar>
-              <w:top w:w="80" w:type="dxa"/>
-              <w:start w:w="120" w:type="dxa"/>
-              <w:bottom w:w="80" w:type="dxa"/>
-              <w:end w:w="120" w:type="dxa"/>
-            </w:tcMar>
-          </w:tcPr>
-          <w:p>
-            <w:pPr>
-              <w:spacing w:after="0" w:line="240" w:lineRule="auto"/>
-              <w:jc w:val="left"/>
-            </w:pPr>
-            <w:r>
-              <w:rPr>
-                <w:rFonts w:ascii="Calibri" w:hAnsi="Calibri"/>
-                <w:sz w:val="15"/>
-              </w:rPr>
-              <w:t>Implemented</w:t>
-            </w:r>
-          </w:p>
-        </w:tc>
-      </w:tr>
-      <w:tr>
-        <w:tc>
-          <w:tcPr>
-            <w:tcW w:type="dxa" w:w="1450"/>
-            <w:vAlign w:val="center"/>
-            <w:tcMar>
-              <w:top w:w="80" w:type="dxa"/>
-              <w:start w:w="120" w:type="dxa"/>
-              <w:bottom w:w="80" w:type="dxa"/>
-              <w:end w:w="120" w:type="dxa"/>
-            </w:tcMar>
-          </w:tcPr>
-          <w:p>
-            <w:pPr>
-              <w:spacing w:after="0" w:line="240" w:lineRule="auto"/>
-              <w:jc w:val="left"/>
-            </w:pPr>
-            <w:r>
-              <w:rPr>
-                <w:rFonts w:ascii="Calibri" w:hAnsi="Calibri"/>
-                <w:sz w:val="15"/>
-              </w:rPr>
-              <w:t>Static lifecycle screening</w:t>
-            </w:r>
-          </w:p>
-        </w:tc>
-        <w:tc>
-          <w:tcPr>
-            <w:tcW w:type="dxa" w:w="1750"/>
-            <w:vAlign w:val="center"/>
-            <w:tcMar>
-              <w:top w:w="80" w:type="dxa"/>
-              <w:start w:w="120" w:type="dxa"/>
-              <w:bottom w:w="80" w:type="dxa"/>
-              <w:end w:w="120" w:type="dxa"/>
-            </w:tcMar>
-          </w:tcPr>
-          <w:p>
-            <w:pPr>
-              <w:spacing w:after="0" w:line="240" w:lineRule="auto"/>
-              <w:jc w:val="left"/>
-            </w:pPr>
-            <w:r>
-              <w:rPr>
-                <w:rFonts w:ascii="Calibri" w:hAnsi="Calibri"/>
-                <w:sz w:val="15"/>
-              </w:rPr>
-              <w:t>Energy, PUE, grid factors, equipment, fluids, water</w:t>
-            </w:r>
-          </w:p>
-        </w:tc>
-        <w:tc>
-          <w:tcPr>
-            <w:tcW w:type="dxa" w:w="1650"/>
-            <w:vAlign w:val="center"/>
-            <w:tcMar>
-              <w:top w:w="80" w:type="dxa"/>
-              <w:start w:w="120" w:type="dxa"/>
-              <w:bottom w:w="80" w:type="dxa"/>
-              <w:end w:w="120" w:type="dxa"/>
-            </w:tcMar>
-          </w:tcPr>
-          <w:p>
-            <w:pPr>
-              <w:spacing w:after="0" w:line="240" w:lineRule="auto"/>
-              <w:jc w:val="left"/>
-            </w:pPr>
-            <w:r>
-              <w:rPr>
-                <w:rFonts w:ascii="Calibri" w:hAnsi="Calibri"/>
-                <w:sz w:val="15"/>
-              </w:rPr>
-              <w:t>Annual energy balance and lifecycle annualization</w:t>
-            </w:r>
-          </w:p>
-        </w:tc>
-        <w:tc>
-          <w:tcPr>
-            <w:tcW w:type="dxa" w:w="1650"/>
-            <w:vAlign w:val="center"/>
-            <w:tcMar>
-              <w:top w:w="80" w:type="dxa"/>
-              <w:start w:w="120" w:type="dxa"/>
-              <w:bottom w:w="80" w:type="dxa"/>
-              <w:end w:w="120" w:type="dxa"/>
-            </w:tcMar>
-          </w:tcPr>
-          <w:p>
-            <w:pPr>
-              <w:spacing w:after="0" w:line="240" w:lineRule="auto"/>
-              <w:jc w:val="left"/>
-            </w:pPr>
-            <w:r>
-              <w:rPr>
-                <w:rFonts w:ascii="Calibri" w:hAnsi="Calibri"/>
-                <w:sz w:val="15"/>
-              </w:rPr>
-              <w:t>Absolute and normalized impacts</w:t>
-            </w:r>
-          </w:p>
-        </w:tc>
-        <w:tc>
-          <w:tcPr>
-            <w:tcW w:type="dxa" w:w="1850"/>
-            <w:vAlign w:val="center"/>
-            <w:tcMar>
-              <w:top w:w="80" w:type="dxa"/>
-              <w:start w:w="120" w:type="dxa"/>
-              <w:bottom w:w="80" w:type="dxa"/>
-              <w:end w:w="120" w:type="dxa"/>
-            </w:tcMar>
-          </w:tcPr>
-          <w:p>
-            <w:pPr>
-              <w:spacing w:after="0" w:line="240" w:lineRule="auto"/>
-              <w:jc w:val="left"/>
-            </w:pPr>
-            <w:r>
-              <w:rPr>
-                <w:rFonts w:ascii="Calibri" w:hAnsi="Calibri"/>
-                <w:sz w:val="15"/>
-              </w:rPr>
-              <w:t>Compatible unit and boundary</w:t>
-            </w:r>
-          </w:p>
-        </w:tc>
-        <w:tc>
-          <w:tcPr>
-            <w:tcW w:type="dxa" w:w="1010"/>
-            <w:vAlign w:val="center"/>
-            <w:tcMar>
-              <w:top w:w="80" w:type="dxa"/>
-              <w:start w:w="120" w:type="dxa"/>
-              <w:bottom w:w="80" w:type="dxa"/>
-              <w:end w:w="120" w:type="dxa"/>
-            </w:tcMar>
-          </w:tcPr>
-          <w:p>
-            <w:pPr>
-              <w:spacing w:after="0" w:line="240" w:lineRule="auto"/>
-              <w:jc w:val="left"/>
-            </w:pPr>
-            <w:r>
-              <w:rPr>
-                <w:rFonts w:ascii="Calibri" w:hAnsi="Calibri"/>
-                <w:sz w:val="15"/>
-              </w:rPr>
-              <w:t>Implemented</w:t>
-            </w:r>
-          </w:p>
-        </w:tc>
-      </w:tr>
-      <w:tr>
-        <w:tc>
-          <w:tcPr>
-            <w:tcW w:type="dxa" w:w="1450"/>
-            <w:vAlign w:val="center"/>
-            <w:tcMar>
-              <w:top w:w="80" w:type="dxa"/>
-              <w:start w:w="120" w:type="dxa"/>
-              <w:bottom w:w="80" w:type="dxa"/>
-              <w:end w:w="120" w:type="dxa"/>
-            </w:tcMar>
-          </w:tcPr>
-          <w:p>
-            <w:pPr>
-              <w:spacing w:after="0" w:line="240" w:lineRule="auto"/>
-              <w:jc w:val="left"/>
-            </w:pPr>
-            <w:r>
-              <w:rPr>
-                <w:rFonts w:ascii="Calibri" w:hAnsi="Calibri"/>
-                <w:sz w:val="15"/>
-              </w:rPr>
-              <w:t>Temporal operation</w:t>
-            </w:r>
-          </w:p>
-        </w:tc>
-        <w:tc>
-          <w:tcPr>
-            <w:tcW w:type="dxa" w:w="1750"/>
-            <w:vAlign w:val="center"/>
-            <w:tcMar>
-              <w:top w:w="80" w:type="dxa"/>
-              <w:start w:w="120" w:type="dxa"/>
-              <w:bottom w:w="80" w:type="dxa"/>
-              <w:end w:w="120" w:type="dxa"/>
-            </w:tcMar>
-          </w:tcPr>
-          <w:p>
-            <w:pPr>
-              <w:spacing w:after="0" w:line="240" w:lineRule="auto"/>
-              <w:jc w:val="left"/>
-            </w:pPr>
-            <w:r>
-              <w:rPr>
-                <w:rFonts w:ascii="Calibri" w:hAnsi="Calibri"/>
-                <w:sz w:val="15"/>
-              </w:rPr>
-              <w:t>Hourly weather, workload, grid and cooling response</w:t>
-            </w:r>
-          </w:p>
-        </w:tc>
-        <w:tc>
-          <w:tcPr>
-            <w:tcW w:type="dxa" w:w="1650"/>
-            <w:vAlign w:val="center"/>
-            <w:tcMar>
-              <w:top w:w="80" w:type="dxa"/>
-              <w:start w:w="120" w:type="dxa"/>
-              <w:bottom w:w="80" w:type="dxa"/>
-              <w:end w:w="120" w:type="dxa"/>
-            </w:tcMar>
-          </w:tcPr>
-          <w:p>
-            <w:pPr>
-              <w:spacing w:after="0" w:line="240" w:lineRule="auto"/>
-              <w:jc w:val="left"/>
-            </w:pPr>
-            <w:r>
-              <w:rPr>
-                <w:rFonts w:ascii="Calibri" w:hAnsi="Calibri"/>
-                <w:sz w:val="15"/>
-              </w:rPr>
-              <w:t>Hourly alignment and integration</w:t>
-            </w:r>
-          </w:p>
-        </w:tc>
-        <w:tc>
-          <w:tcPr>
-            <w:tcW w:type="dxa" w:w="1650"/>
-            <w:vAlign w:val="center"/>
-            <w:tcMar>
-              <w:top w:w="80" w:type="dxa"/>
-              <w:start w:w="120" w:type="dxa"/>
-              <w:bottom w:w="80" w:type="dxa"/>
-              <w:end w:w="120" w:type="dxa"/>
-            </w:tcMar>
-          </w:tcPr>
-          <w:p>
-            <w:pPr>
-              <w:spacing w:after="0" w:line="240" w:lineRule="auto"/>
-              <w:jc w:val="left"/>
-            </w:pPr>
-            <w:r>
-              <w:rPr>
-                <w:rFonts w:ascii="Calibri" w:hAnsi="Calibri"/>
-                <w:sz w:val="15"/>
-              </w:rPr>
-              <w:t>PUE, energy, water, operational GHG</w:t>
-            </w:r>
-          </w:p>
-        </w:tc>
-        <w:tc>
-          <w:tcPr>
-            <w:tcW w:type="dxa" w:w="1850"/>
-            <w:vAlign w:val="center"/>
-            <w:tcMar>
-              <w:top w:w="80" w:type="dxa"/>
-              <w:start w:w="120" w:type="dxa"/>
-              <w:bottom w:w="80" w:type="dxa"/>
-              <w:end w:w="120" w:type="dxa"/>
-            </w:tcMar>
-          </w:tcPr>
-          <w:p>
-            <w:pPr>
-              <w:spacing w:after="0" w:line="240" w:lineRule="auto"/>
-              <w:jc w:val="left"/>
-            </w:pPr>
-            <w:r>
-              <w:rPr>
-                <w:rFonts w:ascii="Calibri" w:hAnsi="Calibri"/>
-                <w:sz w:val="15"/>
-              </w:rPr>
-              <w:t>Full coverage and accounting basis</w:t>
-            </w:r>
-          </w:p>
-        </w:tc>
-        <w:tc>
-          <w:tcPr>
-            <w:tcW w:type="dxa" w:w="1010"/>
-            <w:vAlign w:val="center"/>
-            <w:tcMar>
-              <w:top w:w="80" w:type="dxa"/>
-              <w:start w:w="120" w:type="dxa"/>
-              <w:bottom w:w="80" w:type="dxa"/>
-              <w:end w:w="120" w:type="dxa"/>
-            </w:tcMar>
-          </w:tcPr>
-          <w:p>
-            <w:pPr>
-              <w:spacing w:after="0" w:line="240" w:lineRule="auto"/>
-              <w:jc w:val="left"/>
-            </w:pPr>
-            <w:r>
-              <w:rPr>
-                <w:rFonts w:ascii="Calibri" w:hAnsi="Calibri"/>
-                <w:sz w:val="15"/>
-              </w:rPr>
-              <w:t>Implemented</w:t>
-            </w:r>
-          </w:p>
-        </w:tc>
-      </w:tr>
-      <w:tr>
-        <w:tc>
-          <w:tcPr>
-            <w:tcW w:type="dxa" w:w="1450"/>
-            <w:vAlign w:val="center"/>
-            <w:tcMar>
-              <w:top w:w="80" w:type="dxa"/>
-              <w:start w:w="120" w:type="dxa"/>
-              <w:bottom w:w="80" w:type="dxa"/>
-              <w:end w:w="120" w:type="dxa"/>
-            </w:tcMar>
-          </w:tcPr>
-          <w:p>
-            <w:pPr>
-              <w:spacing w:after="0" w:line="240" w:lineRule="auto"/>
-              <w:jc w:val="left"/>
-            </w:pPr>
-            <w:r>
-              <w:rPr>
-                <w:rFonts w:ascii="Calibri" w:hAnsi="Calibri"/>
-                <w:sz w:val="15"/>
-              </w:rPr>
-              <w:t>Performance surface</w:t>
-            </w:r>
-          </w:p>
-        </w:tc>
-        <w:tc>
-          <w:tcPr>
-            <w:tcW w:type="dxa" w:w="1750"/>
-            <w:vAlign w:val="center"/>
-            <w:tcMar>
-              <w:top w:w="80" w:type="dxa"/>
-              <w:start w:w="120" w:type="dxa"/>
-              <w:bottom w:w="80" w:type="dxa"/>
-              <w:end w:w="120" w:type="dxa"/>
-            </w:tcMar>
-          </w:tcPr>
-          <w:p>
-            <w:pPr>
-              <w:spacing w:after="0" w:line="240" w:lineRule="auto"/>
-              <w:jc w:val="left"/>
-            </w:pPr>
-            <w:r>
-              <w:rPr>
-                <w:rFonts w:ascii="Calibri" w:hAnsi="Calibri"/>
-                <w:sz w:val="15"/>
-              </w:rPr>
-              <w:t>Load-temperature grid, uncertainty, source IDs</w:t>
-            </w:r>
-          </w:p>
-        </w:tc>
-        <w:tc>
-          <w:tcPr>
-            <w:tcW w:type="dxa" w:w="1650"/>
-            <w:vAlign w:val="center"/>
-            <w:tcMar>
-              <w:top w:w="80" w:type="dxa"/>
-              <w:start w:w="120" w:type="dxa"/>
-              <w:bottom w:w="80" w:type="dxa"/>
-              <w:end w:w="120" w:type="dxa"/>
-            </w:tcMar>
-          </w:tcPr>
-          <w:p>
-            <w:pPr>
-              <w:spacing w:after="0" w:line="240" w:lineRule="auto"/>
-              <w:jc w:val="left"/>
-            </w:pPr>
-            <w:r>
-              <w:rPr>
-                <w:rFonts w:ascii="Calibri" w:hAnsi="Calibri"/>
-                <w:sz w:val="15"/>
-              </w:rPr>
-              <w:t>Bounded bilinear interpolation</w:t>
-            </w:r>
-          </w:p>
-        </w:tc>
-        <w:tc>
-          <w:tcPr>
-            <w:tcW w:type="dxa" w:w="1650"/>
-            <w:vAlign w:val="center"/>
-            <w:tcMar>
-              <w:top w:w="80" w:type="dxa"/>
-              <w:start w:w="120" w:type="dxa"/>
-              <w:bottom w:w="80" w:type="dxa"/>
-              <w:end w:w="120" w:type="dxa"/>
-            </w:tcMar>
-          </w:tcPr>
-          <w:p>
-            <w:pPr>
-              <w:spacing w:after="0" w:line="240" w:lineRule="auto"/>
-              <w:jc w:val="left"/>
-            </w:pPr>
-            <w:r>
-              <w:rPr>
-                <w:rFonts w:ascii="Calibri" w:hAnsi="Calibri"/>
-                <w:sz w:val="15"/>
-              </w:rPr>
-              <w:t>Hourly cooling response</w:t>
-            </w:r>
-          </w:p>
-        </w:tc>
-        <w:tc>
-          <w:tcPr>
-            <w:tcW w:type="dxa" w:w="1850"/>
-            <w:vAlign w:val="center"/>
-            <w:tcMar>
-              <w:top w:w="80" w:type="dxa"/>
-              <w:start w:w="120" w:type="dxa"/>
-              <w:bottom w:w="80" w:type="dxa"/>
-              <w:end w:w="120" w:type="dxa"/>
-            </w:tcMar>
-          </w:tcPr>
-          <w:p>
-            <w:pPr>
-              <w:spacing w:after="0" w:line="240" w:lineRule="auto"/>
-              <w:jc w:val="left"/>
-            </w:pPr>
-            <w:r>
-              <w:rPr>
-                <w:rFonts w:ascii="Calibri" w:hAnsi="Calibri"/>
-                <w:sz w:val="15"/>
-              </w:rPr>
-              <w:t>Reviewed measurements; no extrapolation</w:t>
-            </w:r>
-          </w:p>
-        </w:tc>
-        <w:tc>
-          <w:tcPr>
-            <w:tcW w:type="dxa" w:w="1010"/>
-            <w:vAlign w:val="center"/>
-            <w:tcMar>
-              <w:top w:w="80" w:type="dxa"/>
-              <w:start w:w="120" w:type="dxa"/>
-              <w:bottom w:w="80" w:type="dxa"/>
-              <w:end w:w="120" w:type="dxa"/>
-            </w:tcMar>
-          </w:tcPr>
-          <w:p>
-            <w:pPr>
-              <w:spacing w:after="0" w:line="240" w:lineRule="auto"/>
-              <w:jc w:val="left"/>
-            </w:pPr>
-            <w:r>
-              <w:rPr>
-                <w:rFonts w:ascii="Calibri" w:hAnsi="Calibri"/>
-                <w:sz w:val="15"/>
-              </w:rPr>
-              <w:t>Implemented</w:t>
-            </w:r>
-          </w:p>
-        </w:tc>
-      </w:tr>
-      <w:tr>
-        <w:tc>
-          <w:tcPr>
-            <w:tcW w:type="dxa" w:w="1450"/>
-            <w:vAlign w:val="center"/>
-            <w:tcMar>
-              <w:top w:w="80" w:type="dxa"/>
-              <w:start w:w="120" w:type="dxa"/>
-              <w:bottom w:w="80" w:type="dxa"/>
-              <w:end w:w="120" w:type="dxa"/>
-            </w:tcMar>
-          </w:tcPr>
-          <w:p>
-            <w:pPr>
-              <w:spacing w:after="0" w:line="240" w:lineRule="auto"/>
-              <w:jc w:val="left"/>
-            </w:pPr>
-            <w:r>
-              <w:rPr>
-                <w:rFonts w:ascii="Calibri" w:hAnsi="Calibri"/>
-                <w:sz w:val="15"/>
-              </w:rPr>
-              <w:t>Inventory exchange</w:t>
-            </w:r>
-          </w:p>
-        </w:tc>
-        <w:tc>
-          <w:tcPr>
-            <w:tcW w:type="dxa" w:w="1750"/>
-            <w:vAlign w:val="center"/>
-            <w:tcMar>
-              <w:top w:w="80" w:type="dxa"/>
-              <w:start w:w="120" w:type="dxa"/>
-              <w:bottom w:w="80" w:type="dxa"/>
-              <w:end w:w="120" w:type="dxa"/>
-            </w:tcMar>
-          </w:tcPr>
-          <w:p>
-            <w:pPr>
-              <w:spacing w:after="0" w:line="240" w:lineRule="auto"/>
-              <w:jc w:val="left"/>
-            </w:pPr>
-            <w:r>
-              <w:rPr>
-                <w:rFonts w:ascii="Calibri" w:hAnsi="Calibri"/>
-                <w:sz w:val="15"/>
-              </w:rPr>
-              <w:t>openLCA JSON-LD processes or OpenDC-LCA scenario</w:t>
-            </w:r>
-          </w:p>
-        </w:tc>
-        <w:tc>
-          <w:tcPr>
-            <w:tcW w:type="dxa" w:w="1650"/>
-            <w:vAlign w:val="center"/>
-            <w:tcMar>
-              <w:top w:w="80" w:type="dxa"/>
-              <w:start w:w="120" w:type="dxa"/>
-              <w:bottom w:w="80" w:type="dxa"/>
-              <w:end w:w="120" w:type="dxa"/>
-            </w:tcMar>
-          </w:tcPr>
-          <w:p>
-            <w:pPr>
-              <w:spacing w:after="0" w:line="240" w:lineRule="auto"/>
-              <w:jc w:val="left"/>
-            </w:pPr>
-            <w:r>
-              <w:rPr>
-                <w:rFonts w:ascii="Calibri" w:hAnsi="Calibri"/>
-                <w:sz w:val="15"/>
-              </w:rPr>
-              <w:t>Exchange-preserving import/export and Brightway mapping</w:t>
-            </w:r>
-          </w:p>
-        </w:tc>
-        <w:tc>
-          <w:tcPr>
-            <w:tcW w:type="dxa" w:w="1650"/>
-            <w:vAlign w:val="center"/>
-            <w:tcMar>
-              <w:top w:w="80" w:type="dxa"/>
-              <w:start w:w="120" w:type="dxa"/>
-              <w:bottom w:w="80" w:type="dxa"/>
-              <w:end w:w="120" w:type="dxa"/>
-            </w:tcMar>
-          </w:tcPr>
-          <w:p>
-            <w:pPr>
-              <w:spacing w:after="0" w:line="240" w:lineRule="auto"/>
-              <w:jc w:val="left"/>
-            </w:pPr>
-            <w:r>
-              <w:rPr>
-                <w:rFonts w:ascii="Calibri" w:hAnsi="Calibri"/>
-                <w:sz w:val="15"/>
-              </w:rPr>
-              <w:t>Foreground process network</w:t>
-            </w:r>
-          </w:p>
-        </w:tc>
-        <w:tc>
-          <w:tcPr>
-            <w:tcW w:type="dxa" w:w="1850"/>
-            <w:vAlign w:val="center"/>
-            <w:tcMar>
-              <w:top w:w="80" w:type="dxa"/>
-              <w:start w:w="120" w:type="dxa"/>
-              <w:bottom w:w="80" w:type="dxa"/>
-              <w:end w:w="120" w:type="dxa"/>
-            </w:tcMar>
-          </w:tcPr>
-          <w:p>
-            <w:pPr>
-              <w:spacing w:after="0" w:line="240" w:lineRule="auto"/>
-              <w:jc w:val="left"/>
-            </w:pPr>
-            <w:r>
-              <w:rPr>
-                <w:rFonts w:ascii="Calibri" w:hAnsi="Calibri"/>
-                <w:sz w:val="15"/>
-              </w:rPr>
-              <w:t>Flow, provider, unit, system-model and LCIA compatibility review</w:t>
-            </w:r>
-          </w:p>
-        </w:tc>
-        <w:tc>
-          <w:tcPr>
-            <w:tcW w:type="dxa" w:w="1010"/>
-            <w:vAlign w:val="center"/>
-            <w:tcMar>
-              <w:top w:w="80" w:type="dxa"/>
-              <w:start w:w="120" w:type="dxa"/>
-              <w:bottom w:w="80" w:type="dxa"/>
-              <w:end w:w="120" w:type="dxa"/>
-            </w:tcMar>
-          </w:tcPr>
-          <w:p>
-            <w:pPr>
-              <w:spacing w:after="0" w:line="240" w:lineRule="auto"/>
-              <w:jc w:val="left"/>
-            </w:pPr>
-            <w:r>
-              <w:rPr>
-                <w:rFonts w:ascii="Calibri" w:hAnsi="Calibri"/>
-                <w:sz w:val="15"/>
-              </w:rPr>
-              <w:t>Implemented</w:t>
-            </w:r>
-          </w:p>
-        </w:tc>
-      </w:tr>
-      <w:tr>
-        <w:tc>
-          <w:tcPr>
-            <w:tcW w:type="dxa" w:w="1450"/>
-            <w:vAlign w:val="center"/>
-            <w:tcMar>
-              <w:top w:w="80" w:type="dxa"/>
-              <w:start w:w="120" w:type="dxa"/>
-              <w:bottom w:w="80" w:type="dxa"/>
-              <w:end w:w="120" w:type="dxa"/>
-            </w:tcMar>
-          </w:tcPr>
-          <w:p>
-            <w:pPr>
-              <w:spacing w:after="0" w:line="240" w:lineRule="auto"/>
-              <w:jc w:val="left"/>
-            </w:pPr>
-            <w:r>
-              <w:rPr>
-                <w:rFonts w:ascii="Calibri" w:hAnsi="Calibri"/>
-                <w:sz w:val="15"/>
-              </w:rPr>
-              <w:t>Reliability</w:t>
-            </w:r>
-          </w:p>
-        </w:tc>
-        <w:tc>
-          <w:tcPr>
-            <w:tcW w:type="dxa" w:w="1750"/>
-            <w:vAlign w:val="center"/>
-            <w:tcMar>
-              <w:top w:w="80" w:type="dxa"/>
-              <w:start w:w="120" w:type="dxa"/>
-              <w:bottom w:w="80" w:type="dxa"/>
-              <w:end w:w="120" w:type="dxa"/>
-            </w:tcMar>
-          </w:tcPr>
-          <w:p>
-            <w:pPr>
-              <w:spacing w:after="0" w:line="240" w:lineRule="auto"/>
-              <w:jc w:val="left"/>
-            </w:pPr>
-            <w:r>
-              <w:rPr>
-                <w:rFonts w:ascii="Calibri" w:hAnsi="Calibri"/>
-                <w:sz w:val="15"/>
-              </w:rPr>
-              <w:t>Weibull/Arrhenius parameters, maintenance and downtime</w:t>
-            </w:r>
-          </w:p>
-        </w:tc>
-        <w:tc>
-          <w:tcPr>
-            <w:tcW w:type="dxa" w:w="1650"/>
-            <w:vAlign w:val="center"/>
-            <w:tcMar>
-              <w:top w:w="80" w:type="dxa"/>
-              <w:start w:w="120" w:type="dxa"/>
-              <w:bottom w:w="80" w:type="dxa"/>
-              <w:end w:w="120" w:type="dxa"/>
-            </w:tcMar>
-          </w:tcPr>
-          <w:p>
-            <w:pPr>
-              <w:spacing w:after="0" w:line="240" w:lineRule="auto"/>
-              <w:jc w:val="left"/>
-            </w:pPr>
-            <w:r>
-              <w:rPr>
-                <w:rFonts w:ascii="Calibri" w:hAnsi="Calibri"/>
-                <w:sz w:val="15"/>
-              </w:rPr>
-              <w:t>Renewal equation and lifecycle annualization</w:t>
-            </w:r>
-          </w:p>
-        </w:tc>
-        <w:tc>
-          <w:tcPr>
-            <w:tcW w:type="dxa" w:w="1650"/>
-            <w:vAlign w:val="center"/>
-            <w:tcMar>
-              <w:top w:w="80" w:type="dxa"/>
-              <w:start w:w="120" w:type="dxa"/>
-              <w:bottom w:w="80" w:type="dxa"/>
-              <w:end w:w="120" w:type="dxa"/>
-            </w:tcMar>
-          </w:tcPr>
-          <w:p>
-            <w:pPr>
-              <w:spacing w:after="0" w:line="240" w:lineRule="auto"/>
-              <w:jc w:val="left"/>
-            </w:pPr>
-            <w:r>
-              <w:rPr>
-                <w:rFonts w:ascii="Calibri" w:hAnsi="Calibri"/>
-                <w:sz w:val="15"/>
-              </w:rPr>
-              <w:t>Expected failures, replacements, downtime and impacts</w:t>
-            </w:r>
-          </w:p>
-        </w:tc>
-        <w:tc>
-          <w:tcPr>
-            <w:tcW w:type="dxa" w:w="1850"/>
-            <w:vAlign w:val="center"/>
-            <w:tcMar>
-              <w:top w:w="80" w:type="dxa"/>
-              <w:start w:w="120" w:type="dxa"/>
-              <w:bottom w:w="80" w:type="dxa"/>
-              <w:end w:w="120" w:type="dxa"/>
-            </w:tcMar>
-          </w:tcPr>
-          <w:p>
-            <w:pPr>
-              <w:spacing w:after="0" w:line="240" w:lineRule="auto"/>
-              <w:jc w:val="left"/>
-            </w:pPr>
-            <w:r>
-              <w:rPr>
-                <w:rFonts w:ascii="Calibri" w:hAnsi="Calibri"/>
-                <w:sz w:val="15"/>
-              </w:rPr>
-              <w:t>Empirical failure model and uncertainty</w:t>
-            </w:r>
-          </w:p>
-        </w:tc>
-        <w:tc>
-          <w:tcPr>
-            <w:tcW w:type="dxa" w:w="1010"/>
-            <w:vAlign w:val="center"/>
-            <w:tcMar>
-              <w:top w:w="80" w:type="dxa"/>
-              <w:start w:w="120" w:type="dxa"/>
-              <w:bottom w:w="80" w:type="dxa"/>
-              <w:end w:w="120" w:type="dxa"/>
-            </w:tcMar>
-          </w:tcPr>
-          <w:p>
-            <w:pPr>
-              <w:spacing w:after="0" w:line="240" w:lineRule="auto"/>
-              <w:jc w:val="left"/>
-            </w:pPr>
-            <w:r>
-              <w:rPr>
-                <w:rFonts w:ascii="Calibri" w:hAnsi="Calibri"/>
-                <w:sz w:val="15"/>
-              </w:rPr>
-              <w:t>Implemented</w:t>
-            </w:r>
-          </w:p>
-        </w:tc>
-      </w:tr>
-      <w:tr>
-        <w:tc>
-          <w:tcPr>
-            <w:tcW w:type="dxa" w:w="1450"/>
-            <w:vAlign w:val="center"/>
-            <w:tcMar>
-              <w:top w:w="80" w:type="dxa"/>
-              <w:start w:w="120" w:type="dxa"/>
-              <w:bottom w:w="80" w:type="dxa"/>
-              <w:end w:w="120" w:type="dxa"/>
-            </w:tcMar>
-          </w:tcPr>
-          <w:p>
-            <w:pPr>
-              <w:spacing w:after="0" w:line="240" w:lineRule="auto"/>
-              <w:jc w:val="left"/>
-            </w:pPr>
-            <w:r>
-              <w:rPr>
-                <w:rFonts w:ascii="Calibri" w:hAnsi="Calibri"/>
-                <w:sz w:val="15"/>
-              </w:rPr>
-              <w:t>Uncertainty and sensitivity</w:t>
-            </w:r>
-          </w:p>
-        </w:tc>
-        <w:tc>
-          <w:tcPr>
-            <w:tcW w:type="dxa" w:w="1750"/>
-            <w:vAlign w:val="center"/>
-            <w:tcMar>
-              <w:top w:w="80" w:type="dxa"/>
-              <w:start w:w="120" w:type="dxa"/>
-              <w:bottom w:w="80" w:type="dxa"/>
-              <w:end w:w="120" w:type="dxa"/>
-            </w:tcMar>
-          </w:tcPr>
-          <w:p>
-            <w:pPr>
-              <w:spacing w:after="0" w:line="240" w:lineRule="auto"/>
-              <w:jc w:val="left"/>
-            </w:pPr>
-            <w:r>
-              <w:rPr>
-                <w:rFonts w:ascii="Calibri" w:hAnsi="Calibri"/>
-                <w:sz w:val="15"/>
-              </w:rPr>
-              <w:t>Distributions, seed and perturbations</w:t>
-            </w:r>
-          </w:p>
-        </w:tc>
-        <w:tc>
-          <w:tcPr>
-            <w:tcW w:type="dxa" w:w="1650"/>
-            <w:vAlign w:val="center"/>
-            <w:tcMar>
-              <w:top w:w="80" w:type="dxa"/>
-              <w:start w:w="120" w:type="dxa"/>
-              <w:bottom w:w="80" w:type="dxa"/>
-              <w:end w:w="120" w:type="dxa"/>
-            </w:tcMar>
-          </w:tcPr>
-          <w:p>
-            <w:pPr>
-              <w:spacing w:after="0" w:line="240" w:lineRule="auto"/>
-              <w:jc w:val="left"/>
-            </w:pPr>
-            <w:r>
-              <w:rPr>
-                <w:rFonts w:ascii="Calibri" w:hAnsi="Calibri"/>
-                <w:sz w:val="15"/>
-              </w:rPr>
-              <w:t>Monte Carlo and elasticity</w:t>
-            </w:r>
-          </w:p>
-        </w:tc>
-        <w:tc>
-          <w:tcPr>
-            <w:tcW w:type="dxa" w:w="1650"/>
-            <w:vAlign w:val="center"/>
-            <w:tcMar>
-              <w:top w:w="80" w:type="dxa"/>
-              <w:start w:w="120" w:type="dxa"/>
-              <w:bottom w:w="80" w:type="dxa"/>
-              <w:end w:w="120" w:type="dxa"/>
-            </w:tcMar>
-          </w:tcPr>
-          <w:p>
-            <w:pPr>
-              <w:spacing w:after="0" w:line="240" w:lineRule="auto"/>
-              <w:jc w:val="left"/>
-            </w:pPr>
-            <w:r>
-              <w:rPr>
-                <w:rFonts w:ascii="Calibri" w:hAnsi="Calibri"/>
-                <w:sz w:val="15"/>
-              </w:rPr>
-              <w:t>Intervals and ranked drivers</w:t>
-            </w:r>
-          </w:p>
-        </w:tc>
-        <w:tc>
-          <w:tcPr>
-            <w:tcW w:type="dxa" w:w="1850"/>
-            <w:vAlign w:val="center"/>
-            <w:tcMar>
-              <w:top w:w="80" w:type="dxa"/>
-              <w:start w:w="120" w:type="dxa"/>
-              <w:bottom w:w="80" w:type="dxa"/>
-              <w:end w:w="120" w:type="dxa"/>
-            </w:tcMar>
-          </w:tcPr>
-          <w:p>
-            <w:pPr>
-              <w:spacing w:after="0" w:line="240" w:lineRule="auto"/>
-              <w:jc w:val="left"/>
-            </w:pPr>
-            <w:r>
-              <w:rPr>
-                <w:rFonts w:ascii="Calibri" w:hAnsi="Calibri"/>
-                <w:sz w:val="15"/>
-              </w:rPr>
-              <w:t>Distribution and correlation review</w:t>
-            </w:r>
-          </w:p>
-        </w:tc>
-        <w:tc>
-          <w:tcPr>
-            <w:tcW w:type="dxa" w:w="1010"/>
-            <w:vAlign w:val="center"/>
-            <w:tcMar>
-              <w:top w:w="80" w:type="dxa"/>
-              <w:start w:w="120" w:type="dxa"/>
-              <w:bottom w:w="80" w:type="dxa"/>
-              <w:end w:w="120" w:type="dxa"/>
-            </w:tcMar>
-          </w:tcPr>
-          <w:p>
-            <w:pPr>
-              <w:spacing w:after="0" w:line="240" w:lineRule="auto"/>
-              <w:jc w:val="left"/>
-            </w:pPr>
-            <w:r>
-              <w:rPr>
-                <w:rFonts w:ascii="Calibri" w:hAnsi="Calibri"/>
-                <w:sz w:val="15"/>
-              </w:rPr>
-              <w:t>Screening</w:t>
-            </w:r>
-          </w:p>
-        </w:tc>
-      </w:tr>
-      <w:tr>
-        <w:tc>
-          <w:tcPr>
-            <w:tcW w:type="dxa" w:w="1450"/>
-            <w:vAlign w:val="center"/>
-            <w:tcMar>
-              <w:top w:w="80" w:type="dxa"/>
-              <w:start w:w="120" w:type="dxa"/>
-              <w:bottom w:w="80" w:type="dxa"/>
-              <w:end w:w="120" w:type="dxa"/>
-            </w:tcMar>
-          </w:tcPr>
-          <w:p>
-            <w:pPr>
-              <w:spacing w:after="0" w:line="240" w:lineRule="auto"/>
-              <w:jc w:val="left"/>
-            </w:pPr>
-            <w:r>
-              <w:rPr>
-                <w:rFonts w:ascii="Calibri" w:hAnsi="Calibri"/>
-                <w:sz w:val="15"/>
-              </w:rPr>
-              <w:t>Scientific claim gate</w:t>
-            </w:r>
-          </w:p>
-        </w:tc>
-        <w:tc>
-          <w:tcPr>
-            <w:tcW w:type="dxa" w:w="1750"/>
-            <w:vAlign w:val="center"/>
-            <w:tcMar>
-              <w:top w:w="80" w:type="dxa"/>
-              <w:start w:w="120" w:type="dxa"/>
-              <w:bottom w:w="80" w:type="dxa"/>
-              <w:end w:w="120" w:type="dxa"/>
-            </w:tcMar>
-          </w:tcPr>
-          <w:p>
-            <w:pPr>
-              <w:spacing w:after="0" w:line="240" w:lineRule="auto"/>
-              <w:jc w:val="left"/>
-            </w:pPr>
-            <w:r>
-              <w:rPr>
-                <w:rFonts w:ascii="Calibri" w:hAnsi="Calibri"/>
-                <w:sz w:val="15"/>
-              </w:rPr>
-              <w:t>Scenario, sources, evidence status and intent</w:t>
-            </w:r>
-          </w:p>
-        </w:tc>
-        <w:tc>
-          <w:tcPr>
-            <w:tcW w:type="dxa" w:w="1650"/>
-            <w:vAlign w:val="center"/>
-            <w:tcMar>
-              <w:top w:w="80" w:type="dxa"/>
-              <w:start w:w="120" w:type="dxa"/>
-              <w:bottom w:w="80" w:type="dxa"/>
-              <w:end w:w="120" w:type="dxa"/>
-            </w:tcMar>
-          </w:tcPr>
-          <w:p>
-            <w:pPr>
-              <w:spacing w:after="0" w:line="240" w:lineRule="auto"/>
-              <w:jc w:val="left"/>
-            </w:pPr>
-            <w:r>
-              <w:rPr>
-                <w:rFonts w:ascii="Calibri" w:hAnsi="Calibri"/>
-                <w:sz w:val="15"/>
-              </w:rPr>
-              <w:t>Automated blockers and warnings</w:t>
-            </w:r>
-          </w:p>
-        </w:tc>
-        <w:tc>
-          <w:tcPr>
-            <w:tcW w:type="dxa" w:w="1650"/>
-            <w:vAlign w:val="center"/>
-            <w:tcMar>
-              <w:top w:w="80" w:type="dxa"/>
-              <w:start w:w="120" w:type="dxa"/>
-              <w:bottom w:w="80" w:type="dxa"/>
-              <w:end w:w="120" w:type="dxa"/>
-            </w:tcMar>
-          </w:tcPr>
-          <w:p>
-            <w:pPr>
-              <w:spacing w:after="0" w:line="240" w:lineRule="auto"/>
-              <w:jc w:val="left"/>
-            </w:pPr>
-            <w:r>
-              <w:rPr>
-                <w:rFonts w:ascii="Calibri" w:hAnsi="Calibri"/>
-                <w:sz w:val="15"/>
-              </w:rPr>
-              <w:t>Reviewable findings</w:t>
-            </w:r>
-          </w:p>
-        </w:tc>
-        <w:tc>
-          <w:tcPr>
-            <w:tcW w:type="dxa" w:w="1850"/>
-            <w:vAlign w:val="center"/>
-            <w:tcMar>
-              <w:top w:w="80" w:type="dxa"/>
-              <w:start w:w="120" w:type="dxa"/>
-              <w:bottom w:w="80" w:type="dxa"/>
-              <w:end w:w="120" w:type="dxa"/>
-            </w:tcMar>
-          </w:tcPr>
-          <w:p>
-            <w:pPr>
-              <w:spacing w:after="0" w:line="240" w:lineRule="auto"/>
-              <w:jc w:val="left"/>
-            </w:pPr>
-            <w:r>
-              <w:rPr>
-                <w:rFonts w:ascii="Calibri" w:hAnsi="Calibri"/>
-                <w:sz w:val="15"/>
-              </w:rPr>
-              <w:t>Independent critical review for public claims</w:t>
-            </w:r>
-          </w:p>
-        </w:tc>
-        <w:tc>
-          <w:tcPr>
-            <w:tcW w:type="dxa" w:w="1010"/>
-            <w:vAlign w:val="center"/>
-            <w:tcMar>
-              <w:top w:w="80" w:type="dxa"/>
-              <w:start w:w="120" w:type="dxa"/>
-              <w:bottom w:w="80" w:type="dxa"/>
-              <w:end w:w="120" w:type="dxa"/>
-            </w:tcMar>
-          </w:tcPr>
-          <w:p>
-            <w:pPr>
-              <w:spacing w:after="0" w:line="240" w:lineRule="auto"/>
-              <w:jc w:val="left"/>
-            </w:pPr>
-            <w:r>
-              <w:rPr>
-                <w:rFonts w:ascii="Calibri" w:hAnsi="Calibri"/>
-                <w:sz w:val="15"/>
-              </w:rPr>
-              <w:t>Implemented</w:t>
-            </w:r>
-          </w:p>
-        </w:tc>
-      </w:tr>
-      <w:tr>
-        <w:tc>
-          <w:tcPr>
-            <w:tcW w:type="dxa" w:w="1450"/>
-            <w:vAlign w:val="center"/>
-            <w:tcMar>
-              <w:top w:w="80" w:type="dxa"/>
-              <w:start w:w="120" w:type="dxa"/>
-              <w:bottom w:w="80" w:type="dxa"/>
-              <w:end w:w="120" w:type="dxa"/>
-            </w:tcMar>
-          </w:tcPr>
-          <w:p>
-            <w:pPr>
-              <w:spacing w:after="0" w:line="240" w:lineRule="auto"/>
-              <w:jc w:val="left"/>
-            </w:pPr>
-            <w:r>
-              <w:rPr>
-                <w:rFonts w:ascii="Calibri" w:hAnsi="Calibri"/>
-                <w:sz w:val="15"/>
-              </w:rPr>
-              <w:t>Access</w:t>
-            </w:r>
-          </w:p>
-        </w:tc>
-        <w:tc>
-          <w:tcPr>
-            <w:tcW w:type="dxa" w:w="1750"/>
-            <w:vAlign w:val="center"/>
-            <w:tcMar>
-              <w:top w:w="80" w:type="dxa"/>
-              <w:start w:w="120" w:type="dxa"/>
-              <w:bottom w:w="80" w:type="dxa"/>
-              <w:end w:w="120" w:type="dxa"/>
-            </w:tcMar>
-          </w:tcPr>
-          <w:p>
-            <w:pPr>
-              <w:spacing w:after="0" w:line="240" w:lineRule="auto"/>
-              <w:jc w:val="left"/>
-            </w:pPr>
-            <w:r>
-              <w:rPr>
-                <w:rFonts w:ascii="Calibri" w:hAnsi="Calibri"/>
-                <w:sz w:val="15"/>
-              </w:rPr>
-              <w:t>JSON or CSV</w:t>
-            </w:r>
-          </w:p>
-        </w:tc>
-        <w:tc>
-          <w:tcPr>
-            <w:tcW w:type="dxa" w:w="1650"/>
-            <w:vAlign w:val="center"/>
-            <w:tcMar>
-              <w:top w:w="80" w:type="dxa"/>
-              <w:start w:w="120" w:type="dxa"/>
-              <w:bottom w:w="80" w:type="dxa"/>
-              <w:end w:w="120" w:type="dxa"/>
-            </w:tcMar>
-          </w:tcPr>
-          <w:p>
-            <w:pPr>
-              <w:spacing w:after="0" w:line="240" w:lineRule="auto"/>
-              <w:jc w:val="left"/>
-            </w:pPr>
-            <w:r>
-              <w:rPr>
-                <w:rFonts w:ascii="Calibri" w:hAnsi="Calibri"/>
-                <w:sz w:val="15"/>
-              </w:rPr>
-              <w:t>Shared engine through CLI, API and local GUI</w:t>
-            </w:r>
-          </w:p>
-        </w:tc>
-        <w:tc>
-          <w:tcPr>
-            <w:tcW w:type="dxa" w:w="1650"/>
-            <w:vAlign w:val="center"/>
-            <w:tcMar>
-              <w:top w:w="80" w:type="dxa"/>
-              <w:start w:w="120" w:type="dxa"/>
-              <w:bottom w:w="80" w:type="dxa"/>
-              <w:end w:w="120" w:type="dxa"/>
-            </w:tcMar>
-          </w:tcPr>
-          <w:p>
-            <w:pPr>
-              <w:spacing w:after="0" w:line="240" w:lineRule="auto"/>
-              <w:jc w:val="left"/>
-            </w:pPr>
-            <w:r>
-              <w:rPr>
-                <w:rFonts w:ascii="Calibri" w:hAnsi="Calibri"/>
-                <w:sz w:val="15"/>
-              </w:rPr>
-              <w:t>JSON, tables, figures and reports</w:t>
-            </w:r>
-          </w:p>
-        </w:tc>
-        <w:tc>
-          <w:tcPr>
-            <w:tcW w:type="dxa" w:w="1850"/>
-            <w:vAlign w:val="center"/>
-            <w:tcMar>
-              <w:top w:w="80" w:type="dxa"/>
-              <w:start w:w="120" w:type="dxa"/>
-              <w:bottom w:w="80" w:type="dxa"/>
-              <w:end w:w="120" w:type="dxa"/>
-            </w:tcMar>
-          </w:tcPr>
-          <w:p>
-            <w:pPr>
-              <w:spacing w:after="0" w:line="240" w:lineRule="auto"/>
-              <w:jc w:val="left"/>
-            </w:pPr>
-            <w:r>
-              <w:rPr>
-                <w:rFonts w:ascii="Calibri" w:hAnsi="Calibri"/>
-                <w:sz w:val="15"/>
-              </w:rPr>
-              <w:t>Same model version across interfaces</w:t>
-            </w:r>
-          </w:p>
-        </w:tc>
-        <w:tc>
-          <w:tcPr>
-            <w:tcW w:type="dxa" w:w="1010"/>
-            <w:vAlign w:val="center"/>
-            <w:tcMar>
-              <w:top w:w="80" w:type="dxa"/>
-              <w:start w:w="120" w:type="dxa"/>
-              <w:bottom w:w="80" w:type="dxa"/>
-              <w:end w:w="120" w:type="dxa"/>
-            </w:tcMar>
-          </w:tcPr>
-          <w:p>
-            <w:pPr>
-              <w:spacing w:after="0" w:line="240" w:lineRule="auto"/>
-              <w:jc w:val="left"/>
-            </w:pPr>
-            <w:r>
-              <w:rPr>
-                <w:rFonts w:ascii="Calibri" w:hAnsi="Calibri"/>
-                <w:sz w:val="15"/>
-              </w:rPr>
-              <w:t>Implemented</w:t>
-            </w:r>
-          </w:p>
-        </w:tc>
-      </w:tr>
-    </w:tbl>
-    <w:p>
-      <w:pPr>
-        <w:spacing w:after="40"/>
-      </w:pPr>
+        <w:t>5. Discussion</w:t>
+      </w:r>
     </w:p>
     <w:p>
       <w:pPr>
         <w:pStyle w:val="Heading2"/>
       </w:pPr>
       <w:r>
-        <w:t>4.10. Practitioner workflow and release verification</w:t>
+        <w:t>5.1. The technology ranking is conditional, not universal</w:t>
       </w:r>
     </w:p>
     <w:p>
@@ -3595,751 +2036,69 @@
           <w:rFonts w:ascii="Calibri" w:hAnsi="Calibri"/>
           <w:sz w:val="21"/>
         </w:rPr>
-        <w:t>The v1.1.0 practitioner path reduces the minimum viable screening study to the input-output contract in Table 2. It is available through four command-line operations (</w:t>
-      </w:r>
-      <w:r>
-        <w:rPr>
-          <w:rFonts w:ascii="Courier New" w:hAnsi="Courier New"/>
-          <w:color w:val="17324D"/>
-          <w:sz w:val="20"/>
-        </w:rPr>
-        <w:t>capabilities</w:t>
-      </w:r>
+        <w:t>The geographic screening exposes a decision boundary that is hidden by a single national-average scenario. Cold plate and one-phase immersion cross at 96.7 kg CO2e MWh−1: a small difference in their non-use-phase terms reverses the ordering once grid emissions are sufficiently low. The practical take-home message is not that Vermont should select cold plates. The affine transfer holds the released foreground model fixed and changes only the electricity-dependent term. Rather, the finding demonstrates that a cooling ranking must be reported together with its grid range, foreground assumptions and crossover conditions. The same principle applies to climate, workload, water stress and equipment lifetime.</w:t>
+      </w:r>
+    </w:p>
+    <w:p>
       <w:r>
         <w:rPr>
           <w:rFonts w:ascii="Calibri" w:hAnsi="Calibri"/>
           <w:sz w:val="21"/>
         </w:rPr>
-        <w:t xml:space="preserve">, </w:t>
-      </w:r>
-      <w:r>
-        <w:rPr>
-          <w:rFonts w:ascii="Courier New" w:hAnsi="Courier New"/>
-          <w:color w:val="17324D"/>
-          <w:sz w:val="20"/>
-        </w:rPr>
-        <w:t>new-study</w:t>
-      </w:r>
+        <w:t>Two-phase immersion did not cross another architecture in the tested state range or in any of the 459 electricity-factor scenarios. It also retained first rank when server-related contributions were scaled across the empirical Boavizta envelope. That result is stronger within the released model but is not universal. It inherits the paper's assumptions concerning server count and performance, fluid production and loss, cooling-system boundaries, equipment lifetime and regulatory feasibility. A robust comparative claim should therefore report both the observed no-crossover range and the untested assumptions that could create one.</w:t>
+      </w:r>
+    </w:p>
+    <w:p>
       <w:r>
         <w:rPr>
           <w:rFonts w:ascii="Calibri" w:hAnsi="Calibri"/>
           <w:sz w:val="21"/>
         </w:rPr>
-        <w:t xml:space="preserve">, </w:t>
-      </w:r>
-      <w:r>
-        <w:rPr>
-          <w:rFonts w:ascii="Courier New" w:hAnsi="Courier New"/>
-          <w:color w:val="17324D"/>
-          <w:sz w:val="20"/>
-        </w:rPr>
-        <w:t>prepare-study</w:t>
-      </w:r>
-      <w:r>
-        <w:rPr>
-          <w:rFonts w:ascii="Calibri" w:hAnsi="Calibri"/>
-          <w:sz w:val="21"/>
-        </w:rPr>
-        <w:t xml:space="preserve">, and </w:t>
-      </w:r>
-      <w:r>
-        <w:rPr>
-          <w:rFonts w:ascii="Courier New" w:hAnsi="Courier New"/>
-          <w:color w:val="17324D"/>
-          <w:sz w:val="20"/>
-        </w:rPr>
-        <w:t>practitioner-report</w:t>
-      </w:r>
-      <w:r>
-        <w:rPr>
-          <w:rFonts w:ascii="Calibri" w:hAnsi="Calibri"/>
-          <w:sz w:val="21"/>
-        </w:rPr>
-        <w:t>), corresponding Python API calls, and the guided local interface. Both practitioner interfaces first create the full governed scenario and then call the same analysis and audit functions used by the advanced workflow. Thus, ease of entry does not bypass provenance, unit, boundary, or evidence checks.</w:t>
+        <w:t>The break-even analysis adds an energy-engineering interpretation. The median 1.38% cold-plate use-phase improvement required to equal one-phase immersion is small relative to plausible changes in load, pump and fan power, heat-rejection control, weather and facility-boundary choices. A close lifecycle ranking is therefore also an experimental-discrimination problem. By contrast, the 6.46% median degradation that two-phase could tolerate before losing first rank is a larger but still testable performance margin. Neither threshold is an uncertainty interval or substitutes for joint uncertainty propagation and measurement.</w:t>
       </w:r>
     </w:p>
     <w:p>
       <w:pPr>
-        <w:pStyle w:val="Caption"/>
-        <w:keepNext/>
+        <w:pStyle w:val="Heading2"/>
       </w:pPr>
       <w:r>
+        <w:t>5.2. Decarbonization changes the research question</w:t>
+      </w:r>
+    </w:p>
+    <w:p>
+      <w:r>
         <w:rPr>
           <w:rFonts w:ascii="Calibri" w:hAnsi="Calibri"/>
-          <w:sz w:val="18"/>
-        </w:rPr>
-        <w:t>Table 2. Compact practitioner input-output contract in OpenDC-LCA v1.1.0.</w:t>
+          <w:sz w:val="21"/>
+        </w:rPr>
+        <w:t>At the highest observed state grid intensity, embodied terms supplied only about 4% of the re-based total; at the lowest, they supplied 57-58%. This transition changes what constitutes adequate evidence. On a carbon-intensive grid, improved PUE, reduced IT power and water-aware heat rejection are the largest near-term levers. On a low-carbon grid, the comparison becomes increasingly sensitive to useful computation per server, server count, manufacturing, lifetime and replacement. Operational efficiency and embodied impact are therefore not competing narratives but successive constraints along a decarbonization pathway.</w:t>
       </w:r>
     </w:p>
-    <w:tbl>
-      <w:tblPr>
-        <w:tblStyle w:val="TableGrid"/>
-        <w:tblW w:type="dxa" w:w="9360"/>
-        <w:tblLayout w:type="fixed"/>
-        <w:tblLook w:firstColumn="1" w:firstRow="1" w:lastColumn="0" w:lastRow="0" w:noHBand="0" w:noVBand="1" w:val="04A0"/>
-        <w:tblInd w:w="120" w:type="dxa"/>
-      </w:tblPr>
-      <w:tblGrid>
-        <w:gridCol w:w="2340"/>
-        <w:gridCol w:w="2340"/>
-        <w:gridCol w:w="2340"/>
-        <w:gridCol w:w="2340"/>
-      </w:tblGrid>
-      <w:tr>
-        <w:trPr>
-          <w:tblHeader w:val="true"/>
-        </w:trPr>
-        <w:tc>
-          <w:tcPr>
-            <w:tcW w:type="dxa" w:w="2340"/>
-            <w:vAlign w:val="center"/>
-            <w:shd w:fill="1F4E79"/>
-            <w:tcMar>
-              <w:top w:w="80" w:type="dxa"/>
-              <w:start w:w="120" w:type="dxa"/>
-              <w:bottom w:w="80" w:type="dxa"/>
-              <w:end w:w="120" w:type="dxa"/>
-            </w:tcMar>
-          </w:tcPr>
-          <w:p>
-            <w:pPr>
-              <w:spacing w:after="0" w:line="240" w:lineRule="auto"/>
-              <w:jc w:val="left"/>
-            </w:pPr>
-            <w:r>
-              <w:rPr>
-                <w:rFonts w:ascii="Calibri" w:hAnsi="Calibri"/>
-                <w:b/>
-                <w:color w:val="FFFFFF"/>
-                <w:sz w:val="18"/>
-              </w:rPr>
-              <w:t>Stage</w:t>
-            </w:r>
-          </w:p>
-        </w:tc>
-        <w:tc>
-          <w:tcPr>
-            <w:tcW w:type="dxa" w:w="2340"/>
-            <w:vAlign w:val="center"/>
-            <w:shd w:fill="1F4E79"/>
-            <w:tcMar>
-              <w:top w:w="80" w:type="dxa"/>
-              <w:start w:w="120" w:type="dxa"/>
-              <w:bottom w:w="80" w:type="dxa"/>
-              <w:end w:w="120" w:type="dxa"/>
-            </w:tcMar>
-          </w:tcPr>
-          <w:p>
-            <w:pPr>
-              <w:spacing w:after="0" w:line="240" w:lineRule="auto"/>
-              <w:jc w:val="left"/>
-            </w:pPr>
-            <w:r>
-              <w:rPr>
-                <w:rFonts w:ascii="Calibri" w:hAnsi="Calibri"/>
-                <w:b/>
-                <w:color w:val="FFFFFF"/>
-                <w:sz w:val="18"/>
-              </w:rPr>
-              <w:t>User-supplied information</w:t>
-            </w:r>
-          </w:p>
-        </w:tc>
-        <w:tc>
-          <w:tcPr>
-            <w:tcW w:type="dxa" w:w="2340"/>
-            <w:vAlign w:val="center"/>
-            <w:shd w:fill="1F4E79"/>
-            <w:tcMar>
-              <w:top w:w="80" w:type="dxa"/>
-              <w:start w:w="120" w:type="dxa"/>
-              <w:bottom w:w="80" w:type="dxa"/>
-              <w:end w:w="120" w:type="dxa"/>
-            </w:tcMar>
-          </w:tcPr>
-          <w:p>
-            <w:pPr>
-              <w:spacing w:after="0" w:line="240" w:lineRule="auto"/>
-              <w:jc w:val="left"/>
-            </w:pPr>
-            <w:r>
-              <w:rPr>
-                <w:rFonts w:ascii="Calibri" w:hAnsi="Calibri"/>
-                <w:b/>
-                <w:color w:val="FFFFFF"/>
-                <w:sz w:val="18"/>
-              </w:rPr>
-              <w:t>Machine action</w:t>
-            </w:r>
-          </w:p>
-        </w:tc>
-        <w:tc>
-          <w:tcPr>
-            <w:tcW w:type="dxa" w:w="2340"/>
-            <w:vAlign w:val="center"/>
-            <w:shd w:fill="1F4E79"/>
-            <w:tcMar>
-              <w:top w:w="80" w:type="dxa"/>
-              <w:start w:w="120" w:type="dxa"/>
-              <w:bottom w:w="80" w:type="dxa"/>
-              <w:end w:w="120" w:type="dxa"/>
-            </w:tcMar>
-          </w:tcPr>
-          <w:p>
-            <w:pPr>
-              <w:spacing w:after="0" w:line="240" w:lineRule="auto"/>
-              <w:jc w:val="left"/>
-            </w:pPr>
-            <w:r>
-              <w:rPr>
-                <w:rFonts w:ascii="Calibri" w:hAnsi="Calibri"/>
-                <w:b/>
-                <w:color w:val="FFFFFF"/>
-                <w:sz w:val="18"/>
-              </w:rPr>
-              <w:t>Principal output</w:t>
-            </w:r>
-          </w:p>
-        </w:tc>
-      </w:tr>
-      <w:tr>
-        <w:tc>
-          <w:tcPr>
-            <w:tcW w:type="dxa" w:w="2340"/>
-            <w:vAlign w:val="center"/>
-            <w:tcMar>
-              <w:top w:w="80" w:type="dxa"/>
-              <w:start w:w="120" w:type="dxa"/>
-              <w:bottom w:w="80" w:type="dxa"/>
-              <w:end w:w="120" w:type="dxa"/>
-            </w:tcMar>
-          </w:tcPr>
-          <w:p>
-            <w:pPr>
-              <w:spacing w:after="0" w:line="240" w:lineRule="auto"/>
-              <w:jc w:val="left"/>
-            </w:pPr>
-            <w:r>
-              <w:rPr>
-                <w:rFonts w:ascii="Calibri" w:hAnsi="Calibri"/>
-                <w:sz w:val="18"/>
-              </w:rPr>
-              <w:t>Define facility</w:t>
-            </w:r>
-          </w:p>
-        </w:tc>
-        <w:tc>
-          <w:tcPr>
-            <w:tcW w:type="dxa" w:w="2340"/>
-            <w:vAlign w:val="center"/>
-            <w:tcMar>
-              <w:top w:w="80" w:type="dxa"/>
-              <w:start w:w="120" w:type="dxa"/>
-              <w:bottom w:w="80" w:type="dxa"/>
-              <w:end w:w="120" w:type="dxa"/>
-            </w:tcMar>
-          </w:tcPr>
-          <w:p>
-            <w:pPr>
-              <w:spacing w:after="0" w:line="240" w:lineRule="auto"/>
-              <w:jc w:val="left"/>
-            </w:pPr>
-            <w:r>
-              <w:rPr>
-                <w:rFonts w:ascii="Calibri" w:hAnsi="Calibri"/>
-                <w:sz w:val="18"/>
-              </w:rPr>
-              <w:t>Study name, cooling architecture, geography, reference year, IT capacity, capacity factor, PUE, lifetime and onsite water</w:t>
-            </w:r>
-          </w:p>
-        </w:tc>
-        <w:tc>
-          <w:tcPr>
-            <w:tcW w:type="dxa" w:w="2340"/>
-            <w:vAlign w:val="center"/>
-            <w:tcMar>
-              <w:top w:w="80" w:type="dxa"/>
-              <w:start w:w="120" w:type="dxa"/>
-              <w:bottom w:w="80" w:type="dxa"/>
-              <w:end w:w="120" w:type="dxa"/>
-            </w:tcMar>
-          </w:tcPr>
-          <w:p>
-            <w:pPr>
-              <w:spacing w:after="0" w:line="240" w:lineRule="auto"/>
-              <w:jc w:val="left"/>
-            </w:pPr>
-            <w:r>
-              <w:rPr>
-                <w:rFonts w:ascii="Calibri" w:hAnsi="Calibri"/>
-                <w:sz w:val="18"/>
-              </w:rPr>
-              <w:t>Validate physical ranges and compute annual IT and facility electricity</w:t>
-            </w:r>
-          </w:p>
-        </w:tc>
-        <w:tc>
-          <w:tcPr>
-            <w:tcW w:type="dxa" w:w="2340"/>
-            <w:vAlign w:val="center"/>
-            <w:tcMar>
-              <w:top w:w="80" w:type="dxa"/>
-              <w:start w:w="120" w:type="dxa"/>
-              <w:bottom w:w="80" w:type="dxa"/>
-              <w:end w:w="120" w:type="dxa"/>
-            </w:tcMar>
-          </w:tcPr>
-          <w:p>
-            <w:pPr>
-              <w:spacing w:after="0" w:line="240" w:lineRule="auto"/>
-              <w:jc w:val="left"/>
-            </w:pPr>
-            <w:r>
-              <w:rPr>
-                <w:rFonts w:ascii="Calibri" w:hAnsi="Calibri"/>
-                <w:sz w:val="18"/>
-              </w:rPr>
-              <w:t>Transparent operating basis</w:t>
-            </w:r>
-          </w:p>
-        </w:tc>
-      </w:tr>
-      <w:tr>
-        <w:tc>
-          <w:tcPr>
-            <w:tcW w:type="dxa" w:w="2340"/>
-            <w:vAlign w:val="center"/>
-            <w:tcMar>
-              <w:top w:w="80" w:type="dxa"/>
-              <w:start w:w="120" w:type="dxa"/>
-              <w:bottom w:w="80" w:type="dxa"/>
-              <w:end w:w="120" w:type="dxa"/>
-            </w:tcMar>
-          </w:tcPr>
-          <w:p>
-            <w:pPr>
-              <w:spacing w:after="0" w:line="240" w:lineRule="auto"/>
-              <w:jc w:val="left"/>
-            </w:pPr>
-            <w:r>
-              <w:rPr>
-                <w:rFonts w:ascii="Calibri" w:hAnsi="Calibri"/>
-                <w:sz w:val="18"/>
-              </w:rPr>
-              <w:t>Add electricity</w:t>
-            </w:r>
-          </w:p>
-        </w:tc>
-        <w:tc>
-          <w:tcPr>
-            <w:tcW w:type="dxa" w:w="2340"/>
-            <w:vAlign w:val="center"/>
-            <w:tcMar>
-              <w:top w:w="80" w:type="dxa"/>
-              <w:start w:w="120" w:type="dxa"/>
-              <w:bottom w:w="80" w:type="dxa"/>
-              <w:end w:w="120" w:type="dxa"/>
-            </w:tcMar>
-          </w:tcPr>
-          <w:p>
-            <w:pPr>
-              <w:spacing w:after="0" w:line="240" w:lineRule="auto"/>
-              <w:jc w:val="left"/>
-            </w:pPr>
-            <w:r>
-              <w:rPr>
-                <w:rFonts w:ascii="Calibri" w:hAnsi="Calibri"/>
-                <w:sz w:val="18"/>
-              </w:rPr>
-              <w:t>Location-based GHG, primary-energy and blue-water factors with compatible accounting basis</w:t>
-            </w:r>
-          </w:p>
-        </w:tc>
-        <w:tc>
-          <w:tcPr>
-            <w:tcW w:type="dxa" w:w="2340"/>
-            <w:vAlign w:val="center"/>
-            <w:tcMar>
-              <w:top w:w="80" w:type="dxa"/>
-              <w:start w:w="120" w:type="dxa"/>
-              <w:bottom w:w="80" w:type="dxa"/>
-              <w:end w:w="120" w:type="dxa"/>
-            </w:tcMar>
-          </w:tcPr>
-          <w:p>
-            <w:pPr>
-              <w:spacing w:after="0" w:line="240" w:lineRule="auto"/>
-              <w:jc w:val="left"/>
-            </w:pPr>
-            <w:r>
-              <w:rPr>
-                <w:rFonts w:ascii="Calibri" w:hAnsi="Calibri"/>
-                <w:sz w:val="18"/>
-              </w:rPr>
-              <w:t>Apply factors to annual facility electricity</w:t>
-            </w:r>
-          </w:p>
-        </w:tc>
-        <w:tc>
-          <w:tcPr>
-            <w:tcW w:type="dxa" w:w="2340"/>
-            <w:vAlign w:val="center"/>
-            <w:tcMar>
-              <w:top w:w="80" w:type="dxa"/>
-              <w:start w:w="120" w:type="dxa"/>
-              <w:bottom w:w="80" w:type="dxa"/>
-              <w:end w:w="120" w:type="dxa"/>
-            </w:tcMar>
-          </w:tcPr>
-          <w:p>
-            <w:pPr>
-              <w:spacing w:after="0" w:line="240" w:lineRule="auto"/>
-              <w:jc w:val="left"/>
-            </w:pPr>
-            <w:r>
-              <w:rPr>
-                <w:rFonts w:ascii="Calibri" w:hAnsi="Calibri"/>
-                <w:sz w:val="18"/>
-              </w:rPr>
-              <w:t>Annual and per-IT-MWh operational impacts</w:t>
-            </w:r>
-          </w:p>
-        </w:tc>
-      </w:tr>
-      <w:tr>
-        <w:tc>
-          <w:tcPr>
-            <w:tcW w:type="dxa" w:w="2340"/>
-            <w:vAlign w:val="center"/>
-            <w:tcMar>
-              <w:top w:w="80" w:type="dxa"/>
-              <w:start w:w="120" w:type="dxa"/>
-              <w:bottom w:w="80" w:type="dxa"/>
-              <w:end w:w="120" w:type="dxa"/>
-            </w:tcMar>
-          </w:tcPr>
-          <w:p>
-            <w:pPr>
-              <w:spacing w:after="0" w:line="240" w:lineRule="auto"/>
-              <w:jc w:val="left"/>
-            </w:pPr>
-            <w:r>
-              <w:rPr>
-                <w:rFonts w:ascii="Calibri" w:hAnsi="Calibri"/>
-                <w:sz w:val="18"/>
-              </w:rPr>
-              <w:t>Add equipment, if known</w:t>
-            </w:r>
-          </w:p>
-        </w:tc>
-        <w:tc>
-          <w:tcPr>
-            <w:tcW w:type="dxa" w:w="2340"/>
-            <w:vAlign w:val="center"/>
-            <w:tcMar>
-              <w:top w:w="80" w:type="dxa"/>
-              <w:start w:w="120" w:type="dxa"/>
-              <w:bottom w:w="80" w:type="dxa"/>
-              <w:end w:w="120" w:type="dxa"/>
-            </w:tcMar>
-          </w:tcPr>
-          <w:p>
-            <w:pPr>
-              <w:spacing w:after="0" w:line="240" w:lineRule="auto"/>
-              <w:jc w:val="left"/>
-            </w:pPr>
-            <w:r>
-              <w:rPr>
-                <w:rFonts w:ascii="Calibri" w:hAnsi="Calibri"/>
-                <w:sz w:val="18"/>
-              </w:rPr>
-              <w:t>Quantity, service life, production and end-of-life impacts</w:t>
-            </w:r>
-          </w:p>
-        </w:tc>
-        <w:tc>
-          <w:tcPr>
-            <w:tcW w:type="dxa" w:w="2340"/>
-            <w:vAlign w:val="center"/>
-            <w:tcMar>
-              <w:top w:w="80" w:type="dxa"/>
-              <w:start w:w="120" w:type="dxa"/>
-              <w:bottom w:w="80" w:type="dxa"/>
-              <w:end w:w="120" w:type="dxa"/>
-            </w:tcMar>
-          </w:tcPr>
-          <w:p>
-            <w:pPr>
-              <w:spacing w:after="0" w:line="240" w:lineRule="auto"/>
-              <w:jc w:val="left"/>
-            </w:pPr>
-            <w:r>
-              <w:rPr>
-                <w:rFonts w:ascii="Calibri" w:hAnsi="Calibri"/>
-                <w:sz w:val="18"/>
-              </w:rPr>
-              <w:t>Annualize production and replacement over the study period</w:t>
-            </w:r>
-          </w:p>
-        </w:tc>
-        <w:tc>
-          <w:tcPr>
-            <w:tcW w:type="dxa" w:w="2340"/>
-            <w:vAlign w:val="center"/>
-            <w:tcMar>
-              <w:top w:w="80" w:type="dxa"/>
-              <w:start w:w="120" w:type="dxa"/>
-              <w:bottom w:w="80" w:type="dxa"/>
-              <w:end w:w="120" w:type="dxa"/>
-            </w:tcMar>
-          </w:tcPr>
-          <w:p>
-            <w:pPr>
-              <w:spacing w:after="0" w:line="240" w:lineRule="auto"/>
-              <w:jc w:val="left"/>
-            </w:pPr>
-            <w:r>
-              <w:rPr>
-                <w:rFonts w:ascii="Calibri" w:hAnsi="Calibri"/>
-                <w:sz w:val="18"/>
-              </w:rPr>
-              <w:t>Operational-plus-equipment totals and contribution shares</w:t>
-            </w:r>
-          </w:p>
-        </w:tc>
-      </w:tr>
-      <w:tr>
-        <w:tc>
-          <w:tcPr>
-            <w:tcW w:type="dxa" w:w="2340"/>
-            <w:vAlign w:val="center"/>
-            <w:tcMar>
-              <w:top w:w="80" w:type="dxa"/>
-              <w:start w:w="120" w:type="dxa"/>
-              <w:bottom w:w="80" w:type="dxa"/>
-              <w:end w:w="120" w:type="dxa"/>
-            </w:tcMar>
-          </w:tcPr>
-          <w:p>
-            <w:pPr>
-              <w:spacing w:after="0" w:line="240" w:lineRule="auto"/>
-              <w:jc w:val="left"/>
-            </w:pPr>
-            <w:r>
-              <w:rPr>
-                <w:rFonts w:ascii="Calibri" w:hAnsi="Calibri"/>
-                <w:sz w:val="18"/>
-              </w:rPr>
-              <w:t>Register evidence</w:t>
-            </w:r>
-          </w:p>
-        </w:tc>
-        <w:tc>
-          <w:tcPr>
-            <w:tcW w:type="dxa" w:w="2340"/>
-            <w:vAlign w:val="center"/>
-            <w:tcMar>
-              <w:top w:w="80" w:type="dxa"/>
-              <w:start w:w="120" w:type="dxa"/>
-              <w:bottom w:w="80" w:type="dxa"/>
-              <w:end w:w="120" w:type="dxa"/>
-            </w:tcMar>
-          </w:tcPr>
-          <w:p>
-            <w:pPr>
-              <w:spacing w:after="0" w:line="240" w:lineRule="auto"/>
-              <w:jc w:val="left"/>
-            </w:pPr>
-            <w:r>
-              <w:rPr>
-                <w:rFonts w:ascii="Calibri" w:hAnsi="Calibri"/>
-                <w:sz w:val="18"/>
-              </w:rPr>
-              <w:t>Source ID, title, citation, license, quality, uncertainty, review and confidentiality status</w:t>
-            </w:r>
-          </w:p>
-        </w:tc>
-        <w:tc>
-          <w:tcPr>
-            <w:tcW w:type="dxa" w:w="2340"/>
-            <w:vAlign w:val="center"/>
-            <w:tcMar>
-              <w:top w:w="80" w:type="dxa"/>
-              <w:start w:w="120" w:type="dxa"/>
-              <w:bottom w:w="80" w:type="dxa"/>
-              <w:end w:w="120" w:type="dxa"/>
-            </w:tcMar>
-          </w:tcPr>
-          <w:p>
-            <w:pPr>
-              <w:spacing w:after="0" w:line="240" w:lineRule="auto"/>
-              <w:jc w:val="left"/>
-            </w:pPr>
-            <w:r>
-              <w:rPr>
-                <w:rFonts w:ascii="Calibri" w:hAnsi="Calibri"/>
-                <w:sz w:val="18"/>
-              </w:rPr>
-              <w:t>Preserve metadata in the governed scenario and run the scientific audit</w:t>
-            </w:r>
-          </w:p>
-        </w:tc>
-        <w:tc>
-          <w:tcPr>
-            <w:tcW w:type="dxa" w:w="2340"/>
-            <w:vAlign w:val="center"/>
-            <w:tcMar>
-              <w:top w:w="80" w:type="dxa"/>
-              <w:start w:w="120" w:type="dxa"/>
-              <w:bottom w:w="80" w:type="dxa"/>
-              <w:end w:w="120" w:type="dxa"/>
-            </w:tcMar>
-          </w:tcPr>
-          <w:p>
-            <w:pPr>
-              <w:spacing w:after="0" w:line="240" w:lineRule="auto"/>
-              <w:jc w:val="left"/>
-            </w:pPr>
-            <w:r>
-              <w:rPr>
-                <w:rFonts w:ascii="Calibri" w:hAnsi="Calibri"/>
-                <w:sz w:val="18"/>
-              </w:rPr>
-              <w:t>Traceable evidence level, warnings and blockers</w:t>
-            </w:r>
-          </w:p>
-        </w:tc>
-      </w:tr>
-      <w:tr>
-        <w:tc>
-          <w:tcPr>
-            <w:tcW w:type="dxa" w:w="2340"/>
-            <w:vAlign w:val="center"/>
-            <w:tcMar>
-              <w:top w:w="80" w:type="dxa"/>
-              <w:start w:w="120" w:type="dxa"/>
-              <w:bottom w:w="80" w:type="dxa"/>
-              <w:end w:w="120" w:type="dxa"/>
-            </w:tcMar>
-          </w:tcPr>
-          <w:p>
-            <w:pPr>
-              <w:spacing w:after="0" w:line="240" w:lineRule="auto"/>
-              <w:jc w:val="left"/>
-            </w:pPr>
-            <w:r>
-              <w:rPr>
-                <w:rFonts w:ascii="Calibri" w:hAnsi="Calibri"/>
-                <w:sz w:val="18"/>
-              </w:rPr>
-              <w:t>Export decision record</w:t>
-            </w:r>
-          </w:p>
-        </w:tc>
-        <w:tc>
-          <w:tcPr>
-            <w:tcW w:type="dxa" w:w="2340"/>
-            <w:vAlign w:val="center"/>
-            <w:tcMar>
-              <w:top w:w="80" w:type="dxa"/>
-              <w:start w:w="120" w:type="dxa"/>
-              <w:bottom w:w="80" w:type="dxa"/>
-              <w:end w:w="120" w:type="dxa"/>
-            </w:tcMar>
-          </w:tcPr>
-          <w:p>
-            <w:pPr>
-              <w:spacing w:after="0" w:line="240" w:lineRule="auto"/>
-              <w:jc w:val="left"/>
-            </w:pPr>
-            <w:r>
-              <w:rPr>
-                <w:rFonts w:ascii="Calibri" w:hAnsi="Calibri"/>
-                <w:sz w:val="18"/>
-              </w:rPr>
-              <w:t>No additional input</w:t>
-            </w:r>
-          </w:p>
-        </w:tc>
-        <w:tc>
-          <w:tcPr>
-            <w:tcW w:type="dxa" w:w="2340"/>
-            <w:vAlign w:val="center"/>
-            <w:tcMar>
-              <w:top w:w="80" w:type="dxa"/>
-              <w:start w:w="120" w:type="dxa"/>
-              <w:bottom w:w="80" w:type="dxa"/>
-              <w:end w:w="120" w:type="dxa"/>
-            </w:tcMar>
-          </w:tcPr>
-          <w:p>
-            <w:pPr>
-              <w:spacing w:after="0" w:line="240" w:lineRule="auto"/>
-              <w:jc w:val="left"/>
-            </w:pPr>
-            <w:r>
-              <w:rPr>
-                <w:rFonts w:ascii="Calibri" w:hAnsi="Calibri"/>
-                <w:sz w:val="18"/>
-              </w:rPr>
-              <w:t>Serialize the same calculation and audit result for people and software</w:t>
-            </w:r>
-          </w:p>
-        </w:tc>
-        <w:tc>
-          <w:tcPr>
-            <w:tcW w:type="dxa" w:w="2340"/>
-            <w:vAlign w:val="center"/>
-            <w:tcMar>
-              <w:top w:w="80" w:type="dxa"/>
-              <w:start w:w="120" w:type="dxa"/>
-              <w:bottom w:w="80" w:type="dxa"/>
-              <w:end w:w="120" w:type="dxa"/>
-            </w:tcMar>
-          </w:tcPr>
-          <w:p>
-            <w:pPr>
-              <w:spacing w:after="0" w:line="240" w:lineRule="auto"/>
-              <w:jc w:val="left"/>
-            </w:pPr>
-            <w:r>
-              <w:rPr>
-                <w:rFonts w:ascii="Courier New" w:hAnsi="Courier New"/>
-                <w:color w:val="17324D"/>
-                <w:sz w:val="17"/>
-              </w:rPr>
-              <w:t>PRACTITIONER_REPORT.md</w:t>
-            </w:r>
-            <w:r>
-              <w:rPr>
-                <w:rFonts w:ascii="Calibri" w:hAnsi="Calibri"/>
-                <w:sz w:val="18"/>
-              </w:rPr>
-              <w:t xml:space="preserve">, </w:t>
-            </w:r>
-            <w:r>
-              <w:rPr>
-                <w:rFonts w:ascii="Courier New" w:hAnsi="Courier New"/>
-                <w:color w:val="17324D"/>
-                <w:sz w:val="17"/>
-              </w:rPr>
-              <w:t>practitioner-results.json</w:t>
-            </w:r>
-            <w:r>
-              <w:rPr>
-                <w:rFonts w:ascii="Calibri" w:hAnsi="Calibri"/>
-                <w:sz w:val="18"/>
-              </w:rPr>
-              <w:t>, model version and scenario SHA-256 digest</w:t>
-            </w:r>
-          </w:p>
-        </w:tc>
-      </w:tr>
-    </w:tbl>
+    <w:p>
+      <w:r>
+        <w:rPr>
+          <w:rFonts w:ascii="Calibri" w:hAnsi="Calibri"/>
+          <w:sz w:val="21"/>
+        </w:rPr>
+        <w:t>The historical panel adds a planning implication. Grid decarbonization lowered the absolute two-phase-versus-air benefit from 7.49 to 5.26 kg CO2e per Vcore-year between the 2012 and 2023 generation-weighted conditions even though the relative saving remained nearly constant. Percentage reductions alone can therefore overstate the future system value of an efficiency intervention. Planning should report relative efficiency, absolute avoided impact, and the evolving embodied share together.</w:t>
+      </w:r>
+    </w:p>
+    <w:p>
+      <w:r>
+        <w:rPr>
+          <w:rFonts w:ascii="Calibri" w:hAnsi="Calibri"/>
+          <w:sz w:val="21"/>
+        </w:rPr>
+        <w:t>The 5.4-fold range in public Boavizta server manufacturing footprints shows why a single generic server factor is inadequate for low-carbon scenarios. It does not establish a probability distribution or rank products, because the records are heterogeneous. It does establish scale: public foreground dispersion can exceed the differences among cooling options. Reporting a cooling saving to high precision while proxying the servers with one legacy factor creates false confidence. Product-specific bills of materials, functional performance and harmonized product-carbon-footprint rules are thus central research data, not secondary documentation.</w:t>
+      </w:r>
+    </w:p>
     <w:p>
       <w:pPr>
-        <w:spacing w:after="40"/>
+        <w:pStyle w:val="Heading2"/>
       </w:pPr>
+      <w:r>
+        <w:t>5.3. Evidence priority links LCA to experiments and procurement</w:t>
+      </w:r>
     </w:p>
     <w:p>
       <w:r>
@@ -4347,7 +2106,112 @@
           <w:rFonts w:ascii="Calibri" w:hAnsi="Calibri"/>
           <w:sz w:val="21"/>
         </w:rPr>
-        <w:t>The public release was checked at three levels. First, 40 automated tests cover the calculation engine, provenance and claim gate, performance maps, uncertainty, reports, interoperability, reliability, API, GUI endpoints, and the end-to-end practitioner commands. Second, the wheel was installed in a clean Python 3.12 environment and the practitioner workflow was executed from template creation through report generation. Third, the tagged GitHub release contains both wheel and source-distribution artifacts produced by the release workflow. These checks establish installation and software consistency; they do not constitute ISO critical review or validate user-supplied factors.</w:t>
+        <w:t>The contribution-weighted pedigree analysis provides an actionable measurement sequence. Present grid-powered comparisons should first improve hourly IT and cooling electricity, utilization, part-load parasitics and on-site water response. Storage, networking and compute-server inventories form the next evidence tier. As grids decarbonize, this second tier moves upward. This ranking is intentionally transparent and can be replaced by formal value-of- information analysis when parameter distributions and decision losses become available.</w:t>
+      </w:r>
+    </w:p>
+    <w:p>
+      <w:r>
+        <w:rPr>
+          <w:rFonts w:ascii="Calibri" w:hAnsi="Calibri"/>
+          <w:sz w:val="21"/>
+        </w:rPr>
+        <w:t>For electronics-cooling laboratories, the immediate contribution is a shared performance-map protocol spanning heat load, ambient and coolant temperature, flow, pressure drop, pump and fan power, heat-rejection power, water, duration, uncertainty and calibration lineage. A complete bounded surface permits annual integration without extrapolation. Comparative experiments should use a common heat-load emulator and heat-rejection boundary and should separate IT-integral fan power from facility parasitics. Those measurements would replace the present synthetic fixtures through the same data contract.</w:t>
+      </w:r>
+    </w:p>
+    <w:p>
+      <w:r>
+        <w:rPr>
+          <w:rFonts w:ascii="Calibri" w:hAnsi="Calibri"/>
+          <w:sz w:val="21"/>
+        </w:rPr>
+        <w:t>The ÖKOBAUDAT comparison identifies a complementary procurement pathway. Selected lower-impact steel and cement routes reduced cradle-to-gate GHG by approximately 50-60% per kilogram. Whether this matters more than cooling equipment or server replacement depends on an architecture-specific bill of quantities, which is currently absent. The appropriate next step is therefore not to apply the percentages to an assumed facility, but to obtain reviewed quantities and preserve product geography, unit and module boundary.</w:t>
+      </w:r>
+    </w:p>
+    <w:p>
+      <w:pPr>
+        <w:pStyle w:val="Heading2"/>
+      </w:pPr>
+      <w:r>
+        <w:t>5.4. Role relative to openLCA and Brightway</w:t>
+      </w:r>
+    </w:p>
+    <w:p>
+      <w:r>
+        <w:rPr>
+          <w:rFonts w:ascii="Calibri" w:hAnsi="Calibri"/>
+          <w:sz w:val="21"/>
+        </w:rPr>
+        <w:t>OpenDC-LCA is not a replacement for openLCA or Brightway [3,32]. Those platforms manage process networks, databases and impact assessment. The contribution here is a data-center-specific foreground and evidence layer: cooling-performance surfaces, hourly operation, reliability and replacement, functional-unit controls, source lineage and a comparative-claim gate. The interoperability functions preserve identifiers and expose missing providers or impact methods rather than silently treating an imported archive as a complete product system.</w:t>
+      </w:r>
+    </w:p>
+    <w:p>
+      <w:r>
+        <w:rPr>
+          <w:rFonts w:ascii="Calibri" w:hAnsi="Calibri"/>
+          <w:sz w:val="21"/>
+        </w:rPr>
+        <w:t>This separation also explains why the downloaded GLAD hydrogen inventories and USLCI database were not forced into the reported totals. They are relevant to backup power and equipment supply chains, but numerical combination without provider linking, a shared system model and a selected LCIA method would create an apparently comprehensive but irreproducible result. Evidence registration, successful exchange and impact calculation are three distinct stages.</w:t>
+      </w:r>
+    </w:p>
+    <w:p>
+      <w:pPr>
+        <w:pStyle w:val="Heading2"/>
+      </w:pPr>
+      <w:r>
+        <w:t>5.5. Limitations and decision-grade next steps</w:t>
+      </w:r>
+    </w:p>
+    <w:p>
+      <w:r>
+        <w:rPr>
+          <w:rFonts w:ascii="Calibri" w:hAnsi="Calibri"/>
+          <w:sz w:val="21"/>
+        </w:rPr>
+        <w:t>The state analysis is a screening re-basis between two released endpoints, not a state-specific process LCA. The nine-year extension evaluates one fixed foreground model at 459 state-year total-output factors. These factors describe production, not electricity consumption, and omit imports, exports, hourly or marginal emissions, procurement contracts and transmission effects. The exact reconciliation audits released arithmetic, not licensed ecoinvent or LCA for Experts inventories, confidential bills of materials or measured PUE. The Boavizta sample mixes manufacturers and methods; the ÖKOBAUDAT factors are German product-stage proxies without data-center quantities. The USGS file contains watershed geometry rather than withdrawal, consumption or scarcity characterization, so no watershed-level water claim is made.</w:t>
+      </w:r>
+    </w:p>
+    <w:p>
+      <w:r>
+        <w:rPr>
+          <w:rFonts w:ascii="Calibri" w:hAnsi="Calibri"/>
+          <w:sz w:val="21"/>
+        </w:rPr>
+        <w:t>The temporal examples use TMY weather and declared hypothetical or synthetic performance curves. They exclude humidity-sensitive heat rejection, extreme events and correlated measurement or model-form error. Reliability results are expectations from Weibull renewal and optional Arrhenius acceleration; they exclude redundancy, dependent failures and repair queues. Vcore-year improves on rack- or facility-level comparisons but does not fully represent useful computation, workload quality or rebound effects. Automated checks cannot replace an ISO-aligned critical review.</w:t>
+      </w:r>
+    </w:p>
+    <w:p>
+      <w:r>
+        <w:rPr>
+          <w:rFonts w:ascii="Calibri" w:hAnsi="Calibri"/>
+          <w:sz w:val="21"/>
+        </w:rPr>
+        <w:t>Four additions would enable a decision-grade multi-location comparison: (i) reviewed architecture-specific performance surfaces and water measurements; (ii) server, network, storage, facility and cooling-system bills of quantities with uncertainty and lifetime data; (iii) hourly electricity and watershed scarcity characterization; and (iv) harmonized background product systems in openLCA or Brightway. Dr. Nutter's independent review should assess the recorded methodological decisions, dataset mappings and claim-gate findings as a coherent package before public comparative assertions are made.</w:t>
+      </w:r>
+    </w:p>
+    <w:p>
+      <w:pPr>
+        <w:pStyle w:val="Heading2"/>
+      </w:pPr>
+      <w:r>
+        <w:t>5.6. Practitioner use and interpretation boundary</w:t>
+      </w:r>
+    </w:p>
+    <w:p>
+      <w:r>
+        <w:rPr>
+          <w:rFonts w:ascii="Calibri" w:hAnsi="Calibri"/>
+          <w:sz w:val="21"/>
+        </w:rPr>
+        <w:t>The guided workflow makes the framework usable before a complete bill of materials is available, but it labels the consequence. A study without equipment data is identified as operational-only; a zero factor is treated as zero rather than as an undocumented unknown; and omitted fluids, reliability, hourly variation, scarcity characterization, or compute-performance effects remain visible in the capability boundary and next-data list. This is a deliberate adoption strategy: practitioners can obtain a reproducible screening result immediately while receiving an explicit acquisition plan for decision-grade evidence.</w:t>
+      </w:r>
+    </w:p>
+    <w:p>
+      <w:r>
+        <w:rPr>
+          <w:rFonts w:ascii="Calibri" w:hAnsi="Calibri"/>
+          <w:sz w:val="21"/>
+        </w:rPr>
+        <w:t>The human-readable and JSON outputs serve different users without creating two scientific records. The report supports engineering review and procurement discussion, whereas the JSON result supports portfolio aggregation, dashboards, scripted comparisons, and archival. Model version and scenario digest make the result attributable to a specific calculation and governed input. Comparative communication remains conditional on the automated claim gate and, for public assertions, independent critical review.</w:t>
       </w:r>
     </w:p>
     <w:p>
@@ -4355,15 +2219,16 @@
         <w:pStyle w:val="Heading1"/>
       </w:pPr>
       <w:r>
-        <w:t>5. Discussion</w:t>
+        <w:t>6. Conclusions</w:t>
       </w:r>
     </w:p>
     <w:p>
-      <w:pPr>
-        <w:pStyle w:val="Heading2"/>
-      </w:pPr>
-      <w:r>
-        <w:t>5.1. The technology ranking is conditional, not universal</w:t>
+      <w:r>
+        <w:rPr>
+          <w:rFonts w:ascii="Calibri" w:hAnsi="Calibri"/>
+          <w:sz w:val="21"/>
+        </w:rPr>
+        <w:t>OpenDC-LCA converts heterogeneous cooling, grid, server, construction and data- quality evidence into conditional, auditable lifecycle comparisons. It reconciled the arithmetic of 24 released Microsoft/Nature totals and then exposed a result that a single reference scenario cannot show: cold plate and one-phase immersion cross near 96.7 kg CO2e MWh−1 within the observed U.S. state range. Across nine eGRID releases, the generation-weighted factor declined 32.8% and the absolute modeled two-phase-versus-air benefit declined 29.8%, while two-phase retained first rank in all 459 controlled electricity-factor scenarios. Pairwise cold-plate/one-phase ranking was sensitive to a median 1.38% use-phase change, whereas two-phase tolerated a median 6.46% degradation before losing first rank. Its first rank also persisted across a 0.38-2.06-fold server-inventory stress range. Across that range, the embodied share rose from about 4% to 57-58%, shifting the limiting evidence from operational electricity toward servers and replacement. Forty-eight public server records spanned 465-2,503 kg CO2e of manufacturing emissions, while selected lower-impact steel and cement routes showed approximately 50-60% cradle-to-gate GHG leverage per kilogram.</w:t>
       </w:r>
     </w:p>
     <w:p>
@@ -4372,182 +2237,7 @@
           <w:rFonts w:ascii="Calibri" w:hAnsi="Calibri"/>
           <w:sz w:val="21"/>
         </w:rPr>
-        <w:t>The geographic screening exposes a decision boundary that is hidden by a single national-average scenario. Cold plate and one-phase immersion cross at 60.8 kg CO2e MWh−1: a small difference in their non-use-phase terms reverses the ordering once grid emissions are sufficiently low. The practical take-home message is not that Vermont should select cold plates. The affine transfer holds the released foreground model fixed and changes only the electricity-dependent term. Rather, the finding demonstrates that a cooling ranking must be reported together with its grid range, foreground assumptions and crossover conditions. The same principle applies to climate, workload, water stress and equipment lifetime.</w:t>
-      </w:r>
-    </w:p>
-    <w:p>
-      <w:r>
-        <w:rPr>
-          <w:rFonts w:ascii="Calibri" w:hAnsi="Calibri"/>
-          <w:sz w:val="21"/>
-        </w:rPr>
-        <w:t>Two-phase immersion did not cross another architecture in the tested state range or in any of the 459 historical state-year cases. It also retained first rank when server-related contributions were scaled across the empirical Boavizta envelope. That result is stronger within the released model but is not universal. It inherits the paper's assumptions concerning server count and performance, fluid production and loss, cooling-system boundaries, equipment lifetime and regulatory feasibility. A robust comparative claim should therefore report both the observed no-crossover range and the untested assumptions that could create one.</w:t>
-      </w:r>
-    </w:p>
-    <w:p>
-      <w:r>
-        <w:rPr>
-          <w:rFonts w:ascii="Calibri" w:hAnsi="Calibri"/>
-          <w:sz w:val="21"/>
-        </w:rPr>
-        <w:t>The break-even analysis adds an energy-engineering interpretation. The median 1.6% cold-plate use-phase improvement required to equal one-phase immersion is comparable to uncertainty that can arise from load, pump and fan power, heat-rejection control, weather, and facility-boundary choices. A close lifecycle ranking is therefore also an experimental-resolution problem. By contrast, the approximately 6% median degradation that two-phase could tolerate before losing first rank is a larger but still testable performance margin. Neither value substitutes for measurement; each specifies how accurate and representative the measurements must be.</w:t>
-      </w:r>
-    </w:p>
-    <w:p>
-      <w:pPr>
-        <w:pStyle w:val="Heading2"/>
-      </w:pPr>
-      <w:r>
-        <w:t>5.2. Decarbonization changes the research question</w:t>
-      </w:r>
-    </w:p>
-    <w:p>
-      <w:r>
-        <w:rPr>
-          <w:rFonts w:ascii="Calibri" w:hAnsi="Calibri"/>
-          <w:sz w:val="21"/>
-        </w:rPr>
-        <w:t>At the highest observed state grid intensity, embodied terms supplied only about 4% of the re-based total; at the lowest, they supplied 57-58%. This transition changes what constitutes adequate evidence. On a carbon-intensive grid, improved PUE, reduced IT power and water-aware heat rejection are the largest near-term levers. On a low-carbon grid, the comparison becomes increasingly sensitive to useful computation per server, server count, manufacturing, lifetime and replacement. Operational efficiency and embodied impact are therefore not competing narratives but successive constraints along a decarbonization pathway.</w:t>
-      </w:r>
-    </w:p>
-    <w:p>
-      <w:r>
-        <w:rPr>
-          <w:rFonts w:ascii="Calibri" w:hAnsi="Calibri"/>
-          <w:sz w:val="21"/>
-        </w:rPr>
-        <w:t>The historical panel adds a planning implication. Grid decarbonization lowered the absolute two-phase-versus-air benefit from 10.89 to 7.58 kg CO2e per Vcore-year between the 2012 and 2023 generation-weighted conditions even though the relative saving remained nearly constant. Percentage reductions alone can therefore overstate the future system value of an efficiency intervention. Planning should report relative efficiency, absolute avoided impact, and the evolving embodied share together.</w:t>
-      </w:r>
-    </w:p>
-    <w:p>
-      <w:r>
-        <w:rPr>
-          <w:rFonts w:ascii="Calibri" w:hAnsi="Calibri"/>
-          <w:sz w:val="21"/>
-        </w:rPr>
-        <w:t>The 5.4-fold range in public Boavizta server manufacturing footprints shows why a single generic server factor is inadequate for low-carbon scenarios. It does not establish a probability distribution or rank products, because the records are heterogeneous. It does establish scale: public foreground dispersion can exceed the differences among cooling options. Reporting a cooling saving to high precision while proxying the servers with one legacy factor creates false confidence. Product-specific bills of materials, functional performance and harmonized product-carbon-footprint rules are thus central research data, not secondary documentation.</w:t>
-      </w:r>
-    </w:p>
-    <w:p>
-      <w:pPr>
-        <w:pStyle w:val="Heading2"/>
-      </w:pPr>
-      <w:r>
-        <w:t>5.3. Evidence priority links LCA to experiments and procurement</w:t>
-      </w:r>
-    </w:p>
-    <w:p>
-      <w:r>
-        <w:rPr>
-          <w:rFonts w:ascii="Calibri" w:hAnsi="Calibri"/>
-          <w:sz w:val="21"/>
-        </w:rPr>
-        <w:t>The contribution-weighted pedigree analysis provides an actionable measurement sequence. Present grid-powered comparisons should first improve hourly IT and cooling electricity, utilization, part-load parasitics and on-site water response. Storage, networking and compute-server inventories form the next evidence tier. As grids decarbonize, this second tier moves upward. This ranking is intentionally transparent and can be replaced by formal value-of- information analysis when parameter distributions and decision losses become available.</w:t>
-      </w:r>
-    </w:p>
-    <w:p>
-      <w:r>
-        <w:rPr>
-          <w:rFonts w:ascii="Calibri" w:hAnsi="Calibri"/>
-          <w:sz w:val="21"/>
-        </w:rPr>
-        <w:t>For electronics-cooling laboratories, the immediate contribution is a shared performance-map protocol spanning heat load, ambient and coolant temperature, flow, pressure drop, pump and fan power, heat-rejection power, water, duration, uncertainty and calibration lineage. A complete bounded surface permits annual integration without extrapolation. Comparative experiments should use a common heat-load emulator and heat-rejection boundary and should separate IT-integral fan power from facility parasitics. Those measurements would replace the present synthetic fixtures through the same data contract.</w:t>
-      </w:r>
-    </w:p>
-    <w:p>
-      <w:r>
-        <w:rPr>
-          <w:rFonts w:ascii="Calibri" w:hAnsi="Calibri"/>
-          <w:sz w:val="21"/>
-        </w:rPr>
-        <w:t>The ÖKOBAUDAT comparison identifies a complementary procurement pathway. Selected lower-impact steel and cement routes reduced cradle-to-gate GHG by approximately 50-60% per kilogram. Whether this matters more than cooling equipment or server replacement depends on an architecture-specific bill of quantities, which is currently absent. The appropriate next step is therefore not to apply the percentages to an assumed facility, but to obtain reviewed quantities and preserve product geography, unit and module boundary.</w:t>
-      </w:r>
-    </w:p>
-    <w:p>
-      <w:pPr>
-        <w:pStyle w:val="Heading2"/>
-      </w:pPr>
-      <w:r>
-        <w:t>5.4. Role relative to openLCA and Brightway</w:t>
-      </w:r>
-    </w:p>
-    <w:p>
-      <w:r>
-        <w:rPr>
-          <w:rFonts w:ascii="Calibri" w:hAnsi="Calibri"/>
-          <w:sz w:val="21"/>
-        </w:rPr>
-        <w:t>OpenDC-LCA is not a replacement for openLCA or Brightway [3,32]. Those platforms manage process networks, databases and impact assessment. The contribution here is a data-center-specific foreground and evidence layer: cooling-performance surfaces, hourly operation, reliability and replacement, functional-unit controls, source lineage and a comparative-claim gate. The interoperability functions preserve identifiers and expose missing providers or impact methods rather than silently treating an imported archive as a complete product system.</w:t>
-      </w:r>
-    </w:p>
-    <w:p>
-      <w:r>
-        <w:rPr>
-          <w:rFonts w:ascii="Calibri" w:hAnsi="Calibri"/>
-          <w:sz w:val="21"/>
-        </w:rPr>
-        <w:t>This separation also explains why the downloaded GLAD hydrogen inventories and USLCI database were not forced into the reported totals. They are relevant to backup power and equipment supply chains, but numerical combination without provider linking, a shared system model and a selected LCIA method would create an apparently comprehensive but irreproducible result. Evidence registration, successful exchange and impact calculation are three distinct stages.</w:t>
-      </w:r>
-    </w:p>
-    <w:p>
-      <w:pPr>
-        <w:pStyle w:val="Heading2"/>
-      </w:pPr>
-      <w:r>
-        <w:t>5.5. Limitations and decision-grade next steps</w:t>
-      </w:r>
-    </w:p>
-    <w:p>
-      <w:r>
-        <w:rPr>
-          <w:rFonts w:ascii="Calibri" w:hAnsi="Calibri"/>
-          <w:sz w:val="21"/>
-        </w:rPr>
-        <w:t>The state analysis is a screening re-basis between two released endpoints, not a state-specific process LCA. The nine-year extension contains 459 released state-year observations but still uses annual location-based eGRID factors and omits hourly or marginal emissions, procurement contracts and transmission effects. The exact reconstruction verifies released arithmetic, not licensed ecoinvent or LCA for Experts inventories, confidential bills of materials or measured PUE. The Boavizta sample mixes manufacturers and methods; the ÖKOBAUDAT factors are German product-stage proxies without data-center quantities. The USGS file contains watershed geometry rather than withdrawal, consumption or scarcity characterization, so no watershed-level water claim is made.</w:t>
-      </w:r>
-    </w:p>
-    <w:p>
-      <w:r>
-        <w:rPr>
-          <w:rFonts w:ascii="Calibri" w:hAnsi="Calibri"/>
-          <w:sz w:val="21"/>
-        </w:rPr>
-        <w:t>The temporal examples use TMY weather and declared hypothetical or synthetic performance curves. They exclude humidity-sensitive heat rejection, extreme events and correlated measurement or model-form error. Reliability results are expectations from Weibull renewal and optional Arrhenius acceleration; they exclude redundancy, dependent failures and repair queues. Vcore-year improves on rack- or facility-level comparisons but does not fully represent useful computation, workload quality or rebound effects. Automated checks cannot replace an ISO-aligned critical review.</w:t>
-      </w:r>
-    </w:p>
-    <w:p>
-      <w:r>
-        <w:rPr>
-          <w:rFonts w:ascii="Calibri" w:hAnsi="Calibri"/>
-          <w:sz w:val="21"/>
-        </w:rPr>
-        <w:t>Four additions would enable a decision-grade multi-location comparison: (i) reviewed architecture-specific performance surfaces and water measurements; (ii) server, network, storage, facility and cooling-system bills of quantities with uncertainty and lifetime data; (iii) hourly electricity and watershed scarcity characterization; and (iv) harmonized background product systems in openLCA or Brightway. Dr. Nutter's independent review should assess the recorded methodological decisions, dataset mappings and claim-gate findings as a coherent package before public comparative assertions are made.</w:t>
-      </w:r>
-    </w:p>
-    <w:p>
-      <w:pPr>
-        <w:pStyle w:val="Heading2"/>
-      </w:pPr>
-      <w:r>
-        <w:t>5.6. Practitioner use and interpretation boundary</w:t>
-      </w:r>
-    </w:p>
-    <w:p>
-      <w:r>
-        <w:rPr>
-          <w:rFonts w:ascii="Calibri" w:hAnsi="Calibri"/>
-          <w:sz w:val="21"/>
-        </w:rPr>
-        <w:t>The guided workflow makes the framework usable before a complete bill of materials is available, but it labels the consequence. A study without equipment data is identified as operational-only; a zero factor is treated as zero rather than as an undocumented unknown; and omitted fluids, reliability, hourly variation, scarcity characterization, or compute-performance effects remain visible in the capability boundary and next-data list. This is a deliberate adoption strategy: practitioners can obtain a reproducible screening result immediately while receiving an explicit acquisition plan for decision-grade evidence.</w:t>
-      </w:r>
-    </w:p>
-    <w:p>
-      <w:r>
-        <w:rPr>
-          <w:rFonts w:ascii="Calibri" w:hAnsi="Calibri"/>
-          <w:sz w:val="21"/>
-        </w:rPr>
-        <w:t>The human-readable and JSON outputs serve different users without creating two scientific records. The report supports engineering review and procurement discussion, whereas the JSON result supports portfolio aggregation, dashboards, scripted comparisons, and archival. Model version and scenario digest make the result attributable to a specific calculation and governed input. Comparative communication remains conditional on the automated claim gate and, for public assertions, independent critical review.</w:t>
+        <w:t>These findings support three conclusions. First, cooling rankings should be reported as decision surfaces with crossover conditions, not universal league tables. Second, decarbonized operation makes server performance, manufacturing, lifetime and architecture-specific material quantities first-order LCA data. Third, contribution-weighted data quality can convert an LCA into a prioritized experimental and data-acquisition program. OpenDC-LCA operationalizes these principles through traceable source registration, temporal performance maps, reliability, openLCA/Brightway exchange and machine-readable claim gates. The released v1.1.0 package also provides a guided path from a compact practitioner input to a governed scenario, plain-language report, machine-readable result, evidence classification, and next-data plan. This makes the framework usable for screening while preserving a visible boundary between calculated, omitted, and insufficiently supported effects. The remaining barrier to a public decision-grade benchmark is evidence: harmonized bills of quantities, measured operating surfaces, time- and watershed-resolved factors, and independent critical review.</w:t>
       </w:r>
     </w:p>
     <w:p>
@@ -4555,7 +2245,7 @@
         <w:pStyle w:val="Heading1"/>
       </w:pPr>
       <w:r>
-        <w:t>6. Conclusions</w:t>
+        <w:t>Data and code availability</w:t>
       </w:r>
     </w:p>
     <w:p>
@@ -4564,16 +2254,7 @@
           <w:rFonts w:ascii="Calibri" w:hAnsi="Calibri"/>
           <w:sz w:val="21"/>
         </w:rPr>
-        <w:t>OpenDC-LCA converts heterogeneous cooling, grid, server, construction and data- quality evidence into conditional, auditable lifecycle comparisons. It exactly reconstructed 24 released Microsoft/Nature totals and then exposed a result that a single reference scenario cannot show: cold plate and one-phase immersion cross near 60.8 kg CO2e MWh−1 within the observed U.S. state range. Across nine eGRID releases, the generation-weighted factor declined 32.8% and the absolute modeled two-phase-versus-air benefit declined 30.4%, while two-phase retained first rank in all 459 state-year cases. Pairwise cold-plate/one-phase ranking was sensitive to a median 1.6% use-phase change, whereas two-phase tolerated a median 6.0% degradation before losing first rank. Its first rank also persisted across a 0.38-2.06-fold server-inventory stress range. Across that range, the embodied share rose from about 4% to 57-58%, shifting the limiting evidence from operational electricity toward servers and replacement. Forty-eight public server records spanned 465-2,503 kg CO2e of manufacturing emissions, while selected lower-impact steel and cement routes showed approximately 50-60% cradle-to-gate GHG leverage per kilogram.</w:t>
-      </w:r>
-    </w:p>
-    <w:p>
-      <w:r>
-        <w:rPr>
-          <w:rFonts w:ascii="Calibri" w:hAnsi="Calibri"/>
-          <w:sz w:val="21"/>
-        </w:rPr>
-        <w:t>These findings support three conclusions. First, cooling rankings should be reported as decision surfaces with crossover conditions, not universal league tables. Second, decarbonized operation makes server performance, manufacturing, lifetime and architecture-specific material quantities first-order LCA data. Third, contribution-weighted data quality can convert an LCA into a prioritized experimental and data-acquisition program. OpenDC-LCA operationalizes these principles through traceable source registration, temporal performance maps, reliability, openLCA/Brightway exchange and machine-readable claim gates. The released v1.1.0 package also provides a guided path from a compact practitioner input to a governed scenario, plain-language report, machine-readable result, evidence classification, and next-data plan. This makes the framework usable for screening while preserving a visible boundary between calculated, omitted, and insufficiently supported effects. The remaining barrier to a public decision-grade benchmark is evidence: harmonized bills of quantities, measured operating surfaces, time- and watershed-resolved factors, and independent critical review.</w:t>
+        <w:t>OpenDC-LCA version 1.1.0 source code, examples, documentation, tests, and derived paper tables and figures are available at https://github.com/UARK-NED3/OpenDC-LCA. Installable wheel and source archives are preserved in the tagged release at https://github.com/UARK-NED3/OpenDC-LCA/releases/tag/v1.1.0. The repository documents the guided interface, compact input contract, advanced schema, command-line interface, Python API, report fields, and current capability boundary. Provider-native raw files remain local when redistribution permission has not been established. Released Microsoft/Nature model files are available from Zenodo [2]. EPA eGRID and NOAA TMY data are available from their respective public portals [5,6].</w:t>
       </w:r>
     </w:p>
     <w:p>
@@ -4581,16 +2262,24 @@
         <w:pStyle w:val="Heading1"/>
       </w:pPr>
       <w:r>
-        <w:t>Data and code availability</w:t>
+        <w:t>Author contributions</w:t>
       </w:r>
     </w:p>
     <w:p>
       <w:r>
         <w:rPr>
           <w:rFonts w:ascii="Calibri" w:hAnsi="Calibri"/>
+          <w:b/>
           <w:sz w:val="21"/>
         </w:rPr>
-        <w:t>OpenDC-LCA version 1.1.0 source code, examples, documentation, tests, and derived paper tables and figures are available at https://github.com/UARK-NED3/OpenDC-LCA. Installable wheel and source archives are preserved in the tagged release at https://github.com/UARK-NED3/OpenDC-LCA/releases/tag/v1.1.0. The repository documents the guided interface, compact input contract, advanced schema, command-line interface, Python API, report fields, and current capability boundary. Provider-native raw files remain local when redistribution permission has not been established. Released Microsoft/Nature model files are available from Zenodo [2]. EPA eGRID and NOAA TMY data are available from their respective public portals [5,6].</w:t>
+        <w:t>Draft taxonomy for confirmation:</w:t>
+      </w:r>
+      <w:r>
+        <w:rPr>
+          <w:rFonts w:ascii="Calibri" w:hAnsi="Calibri"/>
+          <w:sz w:val="21"/>
+        </w:rPr>
+        <w:t xml:space="preserve"> Han Hu: conceptualization, methodology, software supervision, thermal-management domain analysis, writing, and visualization. Darin W. Nutter: LCA methodology review, validation, critical review, and manuscript revision. Contributions must be confirmed before submission.</w:t>
       </w:r>
     </w:p>
     <w:p>
@@ -4598,24 +2287,16 @@
         <w:pStyle w:val="Heading1"/>
       </w:pPr>
       <w:r>
-        <w:t>Author contributions</w:t>
+        <w:t>Competing interests</w:t>
       </w:r>
     </w:p>
     <w:p>
       <w:r>
         <w:rPr>
           <w:rFonts w:ascii="Calibri" w:hAnsi="Calibri"/>
-          <w:b/>
           <w:sz w:val="21"/>
         </w:rPr>
-        <w:t>Draft taxonomy for confirmation:</w:t>
-      </w:r>
-      <w:r>
-        <w:rPr>
-          <w:rFonts w:ascii="Calibri" w:hAnsi="Calibri"/>
-          <w:sz w:val="21"/>
-        </w:rPr>
-        <w:t xml:space="preserve"> Han Hu: conceptualization, methodology, software supervision, thermal-management domain analysis, writing, and visualization. Darin W. Nutter: LCA methodology review, validation, critical review, and manuscript revision. Contributions must be confirmed before submission.</w:t>
+        <w:t>The authors must complete and approve the journal-specific competing-interest statement before submission.</w:t>
       </w:r>
     </w:p>
     <w:p>
@@ -4623,7 +2304,7 @@
         <w:pStyle w:val="Heading1"/>
       </w:pPr>
       <w:r>
-        <w:t>Competing interests</w:t>
+        <w:t>Acknowledgments</w:t>
       </w:r>
     </w:p>
     <w:p>
@@ -4632,7 +2313,7 @@
           <w:rFonts w:ascii="Calibri" w:hAnsi="Calibri"/>
           <w:sz w:val="21"/>
         </w:rPr>
-        <w:t>The authors must complete and approve the journal-specific competing-interest statement before submission.</w:t>
+        <w:t>Funding, facility, student-contributor, and data-provider acknowledgments must be confirmed before submission.</w:t>
       </w:r>
     </w:p>
     <w:p>
@@ -4640,23 +2321,6 @@
         <w:pStyle w:val="Heading1"/>
       </w:pPr>
       <w:r>
-        <w:t>Acknowledgments</w:t>
-      </w:r>
-    </w:p>
-    <w:p>
-      <w:r>
-        <w:rPr>
-          <w:rFonts w:ascii="Calibri" w:hAnsi="Calibri"/>
-          <w:sz w:val="21"/>
-        </w:rPr>
-        <w:t>Funding, facility, student-contributor, and data-provider acknowledgments must be confirmed before submission.</w:t>
-      </w:r>
-    </w:p>
-    <w:p>
-      <w:pPr>
-        <w:pStyle w:val="Heading1"/>
-      </w:pPr>
-      <w:r>
         <w:t>References</w:t>
       </w:r>
     </w:p>
@@ -5438,10 +3102,17 @@
           <w:rFonts w:ascii="Calibri" w:hAnsi="Calibri"/>
           <w:sz w:val="21"/>
         </w:rPr>
-        <w:t>Wenzel, H. et al. Comparative life cycle assessment of wet cooling towers.</w:t>
+        <w:t>Wenzel, P. M. &amp; Radgen, P. Extending effectiveness to efficiency:</w:t>
       </w:r>
     </w:p>
     <w:p>
+      <w:r>
+        <w:rPr>
+          <w:rFonts w:ascii="Calibri" w:hAnsi="Calibri"/>
+          <w:sz w:val="21"/>
+        </w:rPr>
+        <w:t xml:space="preserve">Comparing energy and environmental assessment methods for a wet cooling tower. </w:t>
+      </w:r>
       <w:r>
         <w:rPr>
           <w:rFonts w:ascii="Calibri" w:hAnsi="Calibri"/>
@@ -5470,7 +3141,7 @@
           <w:rFonts w:ascii="Calibri" w:hAnsi="Calibri"/>
           <w:sz w:val="21"/>
         </w:rPr>
-        <w:t xml:space="preserve"> (2023). https://doi.org/10.1111/jiec.13396</w:t>
+        <w:t>, 693-706 (2023). https://doi.org/10.1111/jiec.13396</w:t>
       </w:r>
     </w:p>
     <w:p>
@@ -5482,7 +3153,7 @@
           <w:rFonts w:ascii="Calibri" w:hAnsi="Calibri"/>
           <w:sz w:val="21"/>
         </w:rPr>
-        <w:t>Cleaner grid or smarter cooling? A life cycle perspective on data center</w:t>
+        <w:t>Zhang, M., Carbajales-Dale, M., Ma, X., Guo, L. &amp; Fan, C. Cleaner grid or</w:t>
       </w:r>
     </w:p>
     <w:p>
@@ -5491,7 +3162,7 @@
           <w:rFonts w:ascii="Calibri" w:hAnsi="Calibri"/>
           <w:sz w:val="21"/>
         </w:rPr>
-        <w:t xml:space="preserve">cooling strategies. </w:t>
+        <w:t xml:space="preserve">smarter cooling? Environmental impact trade-offs of a data center using the life cycle assessment method. </w:t>
       </w:r>
       <w:r>
         <w:rPr>
@@ -5499,14 +3170,29 @@
           <w:i/>
           <w:sz w:val="21"/>
         </w:rPr>
-        <w:t>Cleaner Engineering and Technology</w:t>
+        <w:t>Cleaner Energy Systems</w:t>
       </w:r>
       <w:r>
         <w:rPr>
           <w:rFonts w:ascii="Calibri" w:hAnsi="Calibri"/>
           <w:sz w:val="21"/>
         </w:rPr>
-        <w:t xml:space="preserve"> (2025). https://doi.org/10.1016/j.cles.2025.100223</w:t>
+        <w:t xml:space="preserve"> </w:t>
+      </w:r>
+      <w:r>
+        <w:rPr>
+          <w:rFonts w:ascii="Calibri" w:hAnsi="Calibri"/>
+          <w:b/>
+          <w:sz w:val="21"/>
+        </w:rPr>
+        <w:t>12</w:t>
+      </w:r>
+      <w:r>
+        <w:rPr>
+          <w:rFonts w:ascii="Calibri" w:hAnsi="Calibri"/>
+          <w:sz w:val="21"/>
+        </w:rPr>
+        <w:t>, 100223 (2025). https://doi.org/10.1016/j.cles.2025.100223</w:t>
       </w:r>
     </w:p>
     <w:p>
@@ -5715,7 +3401,7 @@
           <w:rFonts w:ascii="Calibri" w:hAnsi="Calibri"/>
           <w:sz w:val="21"/>
         </w:rPr>
-        <w:t>Life-cycle environmental assessment of progressive chiller systems for</w:t>
+        <w:t>Zhang, Y., Li, H. &amp; Wang, S. Energy performance analysis of multi-chiller</w:t>
       </w:r>
     </w:p>
     <w:p>
@@ -5724,7 +3410,7 @@
           <w:rFonts w:ascii="Calibri" w:hAnsi="Calibri"/>
           <w:sz w:val="21"/>
         </w:rPr>
-        <w:t xml:space="preserve">data centers. </w:t>
+        <w:t xml:space="preserve">cooling systems for data centers concerning progressive loading throughout the lifecycle under typical climates. </w:t>
       </w:r>
       <w:r>
         <w:rPr>
@@ -5739,7 +3425,22 @@
           <w:rFonts w:ascii="Calibri" w:hAnsi="Calibri"/>
           <w:sz w:val="21"/>
         </w:rPr>
-        <w:t xml:space="preserve"> (2024). https://doi.org/10.1007/s12273-024-1167-9</w:t>
+        <w:t xml:space="preserve"> </w:t>
+      </w:r>
+      <w:r>
+        <w:rPr>
+          <w:rFonts w:ascii="Calibri" w:hAnsi="Calibri"/>
+          <w:b/>
+          <w:sz w:val="21"/>
+        </w:rPr>
+        <w:t>17</w:t>
+      </w:r>
+      <w:r>
+        <w:rPr>
+          <w:rFonts w:ascii="Calibri" w:hAnsi="Calibri"/>
+          <w:sz w:val="21"/>
+        </w:rPr>
+        <w:t>, 1693-1708 (2024). https://doi.org/10.1007/s12273-024-1167-9</w:t>
       </w:r>
     </w:p>
     <w:p>
@@ -5751,7 +3452,7 @@
           <w:rFonts w:ascii="Calibri" w:hAnsi="Calibri"/>
           <w:sz w:val="21"/>
         </w:rPr>
-        <w:t>Hourly performance and environmental assessment of data-center cooling in</w:t>
+        <w:t>Karimi, L. et al. Energy and water dynamics in data center cooling:</w:t>
       </w:r>
     </w:p>
     <w:p>
@@ -5760,7 +3461,7 @@
           <w:rFonts w:ascii="Calibri" w:hAnsi="Calibri"/>
           <w:sz w:val="21"/>
         </w:rPr>
-        <w:t xml:space="preserve">hot-arid climates. </w:t>
+        <w:t xml:space="preserve">Insights from a modeling study in hot-arid climates. </w:t>
       </w:r>
       <w:r>
         <w:rPr>
@@ -5775,7 +3476,22 @@
           <w:rFonts w:ascii="Calibri" w:hAnsi="Calibri"/>
           <w:sz w:val="21"/>
         </w:rPr>
-        <w:t xml:space="preserve"> (2025). https://doi.org/10.1016/j.applthermaleng.2025.126802</w:t>
+        <w:t xml:space="preserve"> </w:t>
+      </w:r>
+      <w:r>
+        <w:rPr>
+          <w:rFonts w:ascii="Calibri" w:hAnsi="Calibri"/>
+          <w:b/>
+          <w:sz w:val="21"/>
+        </w:rPr>
+        <w:t>276</w:t>
+      </w:r>
+      <w:r>
+        <w:rPr>
+          <w:rFonts w:ascii="Calibri" w:hAnsi="Calibri"/>
+          <w:sz w:val="21"/>
+        </w:rPr>
+        <w:t>, 126802 (2025). https://doi.org/10.1016/j.applthermaleng.2025.126802</w:t>
       </w:r>
     </w:p>
     <w:p>

</xml_diff>

<commit_message>
Audit eGRID scope and compare assessment methods
</commit_message>
<xml_diff>
--- a/paper/OpenDC-LCA_manuscript.docx
+++ b/paper/OpenDC-LCA_manuscript.docx
@@ -87,7 +87,7 @@
           <w:rFonts w:ascii="Calibri" w:hAnsi="Calibri"/>
           <w:sz w:val="21"/>
         </w:rPr>
-        <w:t>Cooling choices alter data-center operating energy, hardware requirements and lifecycle burdens, but published rankings are difficult to transfer across electricity systems and functional units. We present OpenDC-LCA, an open-source foreground and evidence-governance layer for reproducible data-center cooling LCA. It preserves source identity, functional unit, geography, transformation equations and evidence status while connecting static lifecycle models to hourly performance, replacement, openLCA and Brightway. We audited 24 released Microsoft/WSP normalized results and combined their Vcore-year foreground model with its released GaBi electricity endpoints (6.13 and 524.89 kg CO2e MWh−1), nine EPA eGRID releases, 48 Boavizta server records, selected ÖKOBAUDAT processes and a published pedigree matrix. Holding the released foreground model fixed, the cold-plate/one-phase-immersion crossover occurred at 96.7 kg CO2e MWh−1; Vermont was the only 2023 state below it. Across 459 controlled state-year electricity-factor scenarios, two-phase immersion retained the lowest modeled greenhouse-gas total. The generation-weighted U.S. factor fell 32.8% from 2012 to 2023, reducing the modeled absolute two-phase-versus-air benefit from 7.49 to 5.26 kg CO2e Vcore−1 yr−1 while increasing the air-cooled embodied share from 9.7% to 13.8%. A deterministic break-even test found that a median 1.38% reduction in the cold-plate use-phase term would equal one-phase immersion across 2023 states; this is a performance-discrimination target, not a confidence interval. Server-footprint and construction-process data identify potentially influential inputs but cannot be propagated without architecture-specific quantities and functional-performance mappings. The study demonstrates how open evidence can expose conditional rankings and prioritize measurements without presenting secondary-data scenarios as independent LCAs or field validation.</w:t>
+        <w:t>Cooling choices alter data-center operating energy, hardware requirements and lifecycle burdens, but published rankings are difficult to transfer across electricity systems and functional units. We present OpenDC-LCA, an open-source foreground and evidence-governance layer for reproducible data-center cooling LCA. It preserves source identity, functional unit, geography, transformation equations and evidence status while connecting static lifecycle models to hourly performance, replacement, openLCA and Brightway. We audited 24 released Microsoft/WSP normalized results and combined their Vcore-year foreground model with its released GaBi electricity endpoints (6.13 and 524.89 kg CO2e MWh−1), nine EPA eGRID releases, 48 Boavizta server records, selected ÖKOBAUDAT processes and a published pedigree matrix. Holding the released foreground model fixed, the cold-plate/one-phase-immersion crossover occurred at 96.7 kg CO2e MWh−1; Vermont was the only 2023 state below it. Across 459 controlled state-year electricity-factor scenarios, two-phase immersion retained the lowest modeled greenhouse-gas total. The EPA U.S. aggregate factor fell 32.5% from 2012 to 2023, reducing the modeled absolute two-phase-versus-air benefit from 7.49 to 5.28 kg CO2e Vcore−1 yr−1 while increasing the air-cooled embodied share from 9.7% to 13.8%. A deterministic break-even test found that a median 1.38% reduction in the cold-plate use-phase term would equal one-phase immersion across 2023 states; this is a performance-discrimination target, not a confidence interval. Server-footprint and construction-process data identify potentially influential inputs but cannot be propagated without architecture-specific quantities and functional-performance mappings. The study demonstrates how open evidence can expose conditional rankings and prioritize measurements without presenting secondary-data scenarios as independent LCAs or field validation.</w:t>
       </w:r>
     </w:p>
     <w:p>
@@ -838,7 +838,22 @@
           <w:rFonts w:ascii="Calibri" w:hAnsi="Calibri"/>
           <w:sz w:val="21"/>
         </w:rPr>
-        <w:t>To evaluate temporal sensitivity, the same transformation was applied to EPA state total-output factors for 2012, 2014, 2016, and 2018-2023. Factors reported in pounds CO2e MWh−1 before the metric workbook were converted using 0.45359237 kg lb−1. A generation-weighted U.S. factor was recalculated for each release from state generation and emission rates. We then recorded the lowest-GHG architecture, percentage margin to the second-ranked architecture, embodied share, and regret of each alternative for every state-year. The 459 rows are controlled evaluations of one fixed foreground model at observed annual electricity factors, not 459 independent LCAs or statistical replicates. State total-output factors describe in-state generation and are not consumption-based factors; imports, exports, contractual procurement, hourly dispatch and transmission are outside the analysis.</w:t>
+        <w:t xml:space="preserve">To evaluate temporal sensitivity, the same transformation was applied to EPA state total-output factors for 2012, 2014, 2016, and 2018-2023. Factors reported in pounds CO2e MWh−1 before the metric workbook were converted using 0.45359237 kg lb−1. The provider-published U.S. aggregate factor was taken from each release's </w:t>
+      </w:r>
+      <w:r>
+        <w:rPr>
+          <w:rFonts w:ascii="Courier New" w:hAnsi="Courier New"/>
+          <w:color w:val="17324D"/>
+          <w:sz w:val="20"/>
+        </w:rPr>
+        <w:t>USyy!USC2ERTA</w:t>
+      </w:r>
+      <w:r>
+        <w:rPr>
+          <w:rFonts w:ascii="Calibri" w:hAnsi="Calibri"/>
+          <w:sz w:val="21"/>
+        </w:rPr>
+        <w:t xml:space="preserve"> field. As a scope audit, a second national factor was reconstructed from the included state factors and generation. We then recorded the lowest-GHG architecture, percentage margin to the second-ranked architecture, embodied share, and regret of each alternative for every state-year. The 459 rows are controlled evaluations of one fixed foreground model at observed annual electricity factors, not 459 independent LCAs or statistical replicates. State total-output factors describe in-state generation and are not consumption-based factors; imports, exports, contractual procurement, hourly dispatch and transmission are outside the analysis.</w:t>
       </w:r>
     </w:p>
     <w:p>
@@ -1220,7 +1235,7 @@
           <w:rFonts w:ascii="Calibri" w:hAnsi="Calibri"/>
           <w:sz w:val="21"/>
         </w:rPr>
-        <w:t>) [5]. The analysis included 50 states and the District of Columbia. The generation-weighted mean was 348.194 kg CO2e MWh−1 and the observed state range was 23.696-893.079 kg CO2e MWh−1. These are annual, location-based factors; they are not marginal, hourly or market-based. The factors were used only in the affine re-basing of Eq. (7).</w:t>
+        <w:t>) [5]. The analysis included 50 states and the District of Columbia. The state-generation-weighted mean was 348.194 kg CO2e MWh−1 and the observed state range was 23.696-893.079 kg CO2e MWh−1. These are annual, location-based factors; they are not marginal, hourly or market-based. The factors were used only in the affine re-basing of Eq. (7).</w:t>
       </w:r>
     </w:p>
     <w:p>
@@ -1229,7 +1244,22 @@
           <w:rFonts w:ascii="Calibri" w:hAnsi="Calibri"/>
           <w:sz w:val="21"/>
         </w:rPr>
-        <w:t>Historical detailed workbooks supplied the same state fields for 2012, 2014, 2016, and 2018-2022. Together with 2023, the panel contains nine releases and 459 state-year electricity-factor records. Each year contains 50 states and the District of Columbia after excluding Puerto Rico and national aggregate rows. File name, worksheet field, original unit conversion, generation, and factor are retained for every observation. Cross-year comparisons can be affected by EPA source updates and power-sector accounting revisions in addition to physical grid change, so the panel is interpreted as a sequence of released annual conditions. Because the state total-output rate represents generation within the state, it should not be interpreted as the consumption mix of a data center located there.</w:t>
+        <w:t xml:space="preserve">Historical detailed workbooks supplied the same state fields for 2012, 2014, 2016, and 2018-2022. Together with 2023, the panel contains nine releases and 459 state-year electricity-factor records. Each year contains 50 states and the District of Columbia after excluding Puerto Rico and national aggregate rows. File name, worksheet field, original unit conversion, generation, and factor are retained for every observation. Cross-year comparisons can be affected by EPA source updates and power-sector accounting revisions in addition to physical grid change, so the panel is interpreted as a sequence of released annual conditions. The </w:t>
+      </w:r>
+      <w:r>
+        <w:rPr>
+          <w:rFonts w:ascii="Courier New" w:hAnsi="Courier New"/>
+          <w:color w:val="17324D"/>
+          <w:sz w:val="20"/>
+        </w:rPr>
+        <w:t>USyy</w:t>
+      </w:r>
+      <w:r>
+        <w:rPr>
+          <w:rFonts w:ascii="Calibri" w:hAnsi="Calibri"/>
+          <w:sz w:val="21"/>
+        </w:rPr>
+        <w:t xml:space="preserve"> worksheet in each release supplied the official U.S. aggregate factor used for the national trajectory. Because the state total-output rate represents generation within the state, it should not be interpreted as the consumption mix of a data center located there.</w:t>
       </w:r>
     </w:p>
     <w:p>
@@ -1566,7 +1596,7 @@
           <w:rFonts w:ascii="Calibri" w:hAnsi="Calibri"/>
           <w:sz w:val="21"/>
         </w:rPr>
-        <w:t>The generation-weighted U.S. total-output factor declined from 518.0 kg CO2e MWh−1 in 2012 to 348.2 kg CO2e MWh−1 in 2023, a 32.8% reduction, although the trajectory was not monotonic: it increased from 371.5 in 2020 to 387.3 in 2021 before declining again. Applying the same released foreground model reduced the national air-cooled result from 36.25 to 25.52 kg CO2e Vcore−1 yr−1 and the two-phase result from 28.76 to 20.26 kg CO2e Vcore−1 yr−1. The absolute benefit of two-phase relative to air therefore contracted from 7.49 to 5.26 kg CO2e Vcore−1 yr−1, while its percentage benefit remained near 20.6% because both use-phase terms scale with the same electricity-system trajectory.</w:t>
+        <w:t>The EPA U.S. total-output factor declined from 518.0 kg CO2e MWh−1 in 2012 to 349.7 kg CO2e MWh−1 in 2023, a 32.5% reduction, although the trajectory was not monotonic: it increased from 373.1 in 2020 to 388.7 in 2021 before declining again. Applying the same released foreground model reduced the national air-cooled result from 36.25 to 25.61 kg CO2e Vcore−1 yr−1 and the two-phase result from 28.76 to 20.33 kg CO2e Vcore−1 yr−1. The absolute benefit of two-phase relative to air therefore contracted from 7.49 to 5.28 kg CO2e Vcore−1 yr−1, while its percentage benefit remained near 20.6% because both use-phase terms scale with the same electricity-system trajectory.</w:t>
       </w:r>
     </w:p>
     <w:p>
@@ -1579,7 +1609,7 @@
         <w:drawing>
           <wp:inline xmlns:a="http://schemas.openxmlformats.org/drawingml/2006/main" xmlns:pic="http://schemas.openxmlformats.org/drawingml/2006/picture">
             <wp:extent cx="5897880" cy="3325749"/>
-            <wp:docPr id="4" name="Picture 4" descr="Figure 4. Historical EPA eGRID state total-output intensities for nine releases between 2012 and 2023. Each dot is a state-year electricity-factor scenario; the orange line is the generation-weighted U.S. factor. Blue points fall below the 96.7 kg CO2e MWh−1 cold-plate/one-phase crossover derived from the released Microsoft/WSP foreground model. The panel describes released annual generation conditions, not consumption, a forecast, marginal emissions or independent LCAs." title="OpenDC-LCA Figure 4"/>
+            <wp:docPr id="4" name="Picture 4" descr="Figure 4. Historical EPA eGRID state total-output intensities for nine releases between 2012 and 2023. Each dot is a state-year electricity-factor scenario; the orange line is the provider-published U.S. aggregate. Blue points fall below the 96.7 kg CO2e MWh−1 cold-plate/one-phase crossover derived from the released Microsoft/WSP foreground model. The panel describes released annual generation conditions, not consumption, a forecast, marginal emissions or independent LCAs." title="OpenDC-LCA Figure 4"/>
             <wp:cNvGraphicFramePr>
               <a:graphicFrameLocks noChangeAspect="1"/>
             </wp:cNvGraphicFramePr>
@@ -1619,7 +1649,7 @@
           <w:rFonts w:ascii="Calibri" w:hAnsi="Calibri"/>
           <w:sz w:val="18"/>
         </w:rPr>
-        <w:t>Figure 4. Historical EPA eGRID state total-output intensities for nine releases between 2012 and 2023. Each dot is a state-year electricity-factor scenario; the orange line is the generation-weighted U.S. factor. Blue points fall below the 96.7 kg CO2e MWh−1 cold-plate/one-phase crossover derived from the released Microsoft/WSP foreground model. The panel describes released annual generation conditions, not consumption, a forecast, marginal emissions or independent LCAs.</w:t>
+        <w:t>Figure 4. Historical EPA eGRID state total-output intensities for nine releases between 2012 and 2023. Each dot is a state-year electricity-factor scenario; the orange line is the provider-published U.S. aggregate. Blue points fall below the 96.7 kg CO2e MWh−1 cold-plate/one-phase crossover derived from the released Microsoft/WSP foreground model. The panel describes released annual generation conditions, not consumption, a forecast, marginal emissions or independent LCAs.</w:t>
       </w:r>
     </w:p>
     <w:p>
@@ -1637,7 +1667,31 @@
           <w:rFonts w:ascii="Calibri" w:hAnsi="Calibri"/>
           <w:sz w:val="21"/>
         </w:rPr>
-        <w:t>At the national generation-weighted factor, the embodied share of the air-cooled result increased from 9.7% in 2012 to 13.8% in 2023; the two-phase share increased from 9.8% to 13.9%. The change is modest nationally because the U.S. factor remains well above the low-carbon state range, but it establishes the direction of travel: decarbonization reduces the absolute operational benefit available from cooling and increases the leverage of server lifetime, manufacturing, and replacement.</w:t>
+        <w:t xml:space="preserve">The state-based reconstruction matched the provider U.S. aggregate to within 0.00002% from 2012 through 2018. From 2019 through 2023 it was 0.32-0.43% lower and covered 99.55-99.58% of official U.S. generation because the 50-state-plus-DC panel excluded Puerto Rico while the </w:t>
+      </w:r>
+      <w:r>
+        <w:rPr>
+          <w:rFonts w:ascii="Courier New" w:hAnsi="Courier New"/>
+          <w:color w:val="17324D"/>
+          <w:sz w:val="20"/>
+        </w:rPr>
+        <w:t>USyy</w:t>
+      </w:r>
+      <w:r>
+        <w:rPr>
+          <w:rFonts w:ascii="Calibri" w:hAnsi="Calibri"/>
+          <w:sz w:val="21"/>
+        </w:rPr>
+        <w:t xml:space="preserve"> aggregate included the full provider scope. The official aggregate is therefore used for the national trajectory; the state-only reconstruction is retained as a scope audit rather than treated as an error.</w:t>
+      </w:r>
+    </w:p>
+    <w:p>
+      <w:r>
+        <w:rPr>
+          <w:rFonts w:ascii="Calibri" w:hAnsi="Calibri"/>
+          <w:sz w:val="21"/>
+        </w:rPr>
+        <w:t>At the national aggregate factor, the embodied share of the air-cooled result increased from 9.7% in 2012 to 13.8% in 2023; the two-phase share increased from 9.8% to 13.9%. The change is modest nationally because the U.S. factor remains well above the low-carbon state range, but it establishes the direction of travel: decarbonization reduces the absolute operational benefit available from cooling and increases the leverage of server lifetime, manufacturing, and replacement.</w:t>
       </w:r>
     </w:p>
     <w:p>
@@ -1993,7 +2047,7 @@
         <w:pStyle w:val="Heading2"/>
       </w:pPr>
       <w:r>
-        <w:t>4.9. Software implementation and verification</w:t>
+        <w:t>4.9. Comparison with conventional assessment scopes</w:t>
       </w:r>
     </w:p>
     <w:p>
@@ -2002,16 +2056,742 @@
           <w:rFonts w:ascii="Calibri" w:hAnsi="Calibri"/>
           <w:sz w:val="21"/>
         </w:rPr>
-        <w:t>The public package implements the governed input schema, static and temporal calculations, bounded performance-surface interpolation, replacement, screening uncertainty, openLCA/Brightway exchange and a comparative-claim audit. The command-line, Python and local graphical interfaces call the same calculation path and emit a human-readable report plus machine-readable results. Detailed input-output fields, installation commands, interface screens, capability matrices and release checks are provided in the repository and Supplementary Information rather than repeated in the main article.</w:t>
+        <w:t>Table 1 applies four increasingly complete assessment scopes to the same released case. PUE alone cannot be recovered from normalized lifecycle totals and, even when measured, does not represent hardware or functional-performance differences. An operational-GHG comparison identifies two-phase as the lowest use-phase case at the Microsoft grid endpoint but cannot expose the cold-plate/one-phase crossover because that boundary depends on unequal non-use-phase contributions. A static cradle-to-grave result adds those contributions and shows cold plate 0.452 kg CO2e Vcore−1 yr−1 above one-phase at the Microsoft grid endpoint, but one grid point does not reveal where that ordering reverses. The factor-swept evidence analysis exposes the 96.7 kg CO2e MWh−1 boundary, the increasing embodied share, and the evidence needed to interpret both.</w:t>
       </w:r>
     </w:p>
     <w:p>
+      <w:pPr>
+        <w:pStyle w:val="Caption"/>
+        <w:keepNext/>
+      </w:pPr>
+      <w:r>
+        <w:rPr>
+          <w:rFonts w:ascii="Calibri" w:hAnsi="Calibri"/>
+          <w:sz w:val="18"/>
+        </w:rPr>
+        <w:t>Table 1. Results and information lost under progressively broader assessment scopes.</w:t>
+      </w:r>
+    </w:p>
+    <w:tbl>
+      <w:tblPr>
+        <w:tblStyle w:val="TableGrid"/>
+        <w:tblW w:type="dxa" w:w="9360"/>
+        <w:tblLayout w:type="fixed"/>
+        <w:tblLook w:firstColumn="1" w:firstRow="1" w:lastColumn="0" w:lastRow="0" w:noHBand="0" w:noVBand="1" w:val="04A0"/>
+        <w:tblInd w:w="120" w:type="dxa"/>
+      </w:tblPr>
+      <w:tblGrid>
+        <w:gridCol w:w="1872"/>
+        <w:gridCol w:w="1872"/>
+        <w:gridCol w:w="1872"/>
+        <w:gridCol w:w="1872"/>
+        <w:gridCol w:w="1872"/>
+      </w:tblGrid>
+      <w:tr>
+        <w:trPr>
+          <w:tblHeader w:val="true"/>
+          <w:cantSplit w:val="true"/>
+        </w:trPr>
+        <w:tc>
+          <w:tcPr>
+            <w:tcW w:type="dxa" w:w="1872"/>
+            <w:vAlign w:val="center"/>
+            <w:shd w:fill="1F4E79"/>
+            <w:tcMar>
+              <w:top w:w="80" w:type="dxa"/>
+              <w:start w:w="120" w:type="dxa"/>
+              <w:bottom w:w="80" w:type="dxa"/>
+              <w:end w:w="120" w:type="dxa"/>
+            </w:tcMar>
+          </w:tcPr>
+          <w:p>
+            <w:pPr>
+              <w:spacing w:after="0" w:line="240" w:lineRule="auto"/>
+              <w:jc w:val="left"/>
+            </w:pPr>
+            <w:r>
+              <w:rPr>
+                <w:rFonts w:ascii="Calibri" w:hAnsi="Calibri"/>
+                <w:b/>
+                <w:color w:val="FFFFFF"/>
+                <w:sz w:val="18"/>
+              </w:rPr>
+              <w:t>Assessment scope</w:t>
+            </w:r>
+          </w:p>
+        </w:tc>
+        <w:tc>
+          <w:tcPr>
+            <w:tcW w:type="dxa" w:w="1872"/>
+            <w:vAlign w:val="center"/>
+            <w:shd w:fill="1F4E79"/>
+            <w:tcMar>
+              <w:top w:w="80" w:type="dxa"/>
+              <w:start w:w="120" w:type="dxa"/>
+              <w:bottom w:w="80" w:type="dxa"/>
+              <w:end w:w="120" w:type="dxa"/>
+            </w:tcMar>
+          </w:tcPr>
+          <w:p>
+            <w:pPr>
+              <w:spacing w:after="0" w:line="240" w:lineRule="auto"/>
+              <w:jc w:val="left"/>
+            </w:pPr>
+            <w:r>
+              <w:rPr>
+                <w:rFonts w:ascii="Calibri" w:hAnsi="Calibri"/>
+                <w:b/>
+                <w:color w:val="FFFFFF"/>
+                <w:sz w:val="18"/>
+              </w:rPr>
+              <w:t>Result recovered from the released case</w:t>
+            </w:r>
+          </w:p>
+        </w:tc>
+        <w:tc>
+          <w:tcPr>
+            <w:tcW w:type="dxa" w:w="1872"/>
+            <w:vAlign w:val="center"/>
+            <w:shd w:fill="1F4E79"/>
+            <w:tcMar>
+              <w:top w:w="80" w:type="dxa"/>
+              <w:start w:w="120" w:type="dxa"/>
+              <w:bottom w:w="80" w:type="dxa"/>
+              <w:end w:w="120" w:type="dxa"/>
+            </w:tcMar>
+          </w:tcPr>
+          <w:p>
+            <w:pPr>
+              <w:spacing w:after="0" w:line="240" w:lineRule="auto"/>
+              <w:jc w:val="left"/>
+            </w:pPr>
+            <w:r>
+              <w:rPr>
+                <w:rFonts w:ascii="Calibri" w:hAnsi="Calibri"/>
+                <w:b/>
+                <w:color w:val="FFFFFF"/>
+                <w:sz w:val="18"/>
+              </w:rPr>
+              <w:t>Crossover</w:t>
+            </w:r>
+          </w:p>
+        </w:tc>
+        <w:tc>
+          <w:tcPr>
+            <w:tcW w:type="dxa" w:w="1872"/>
+            <w:vAlign w:val="center"/>
+            <w:shd w:fill="1F4E79"/>
+            <w:tcMar>
+              <w:top w:w="80" w:type="dxa"/>
+              <w:start w:w="120" w:type="dxa"/>
+              <w:bottom w:w="80" w:type="dxa"/>
+              <w:end w:w="120" w:type="dxa"/>
+            </w:tcMar>
+          </w:tcPr>
+          <w:p>
+            <w:pPr>
+              <w:spacing w:after="0" w:line="240" w:lineRule="auto"/>
+              <w:jc w:val="left"/>
+            </w:pPr>
+            <w:r>
+              <w:rPr>
+                <w:rFonts w:ascii="Calibri" w:hAnsi="Calibri"/>
+                <w:b/>
+                <w:color w:val="FFFFFF"/>
+                <w:sz w:val="18"/>
+              </w:rPr>
+              <w:t>Embodied transition</w:t>
+            </w:r>
+          </w:p>
+        </w:tc>
+        <w:tc>
+          <w:tcPr>
+            <w:tcW w:type="dxa" w:w="1872"/>
+            <w:vAlign w:val="center"/>
+            <w:shd w:fill="1F4E79"/>
+            <w:tcMar>
+              <w:top w:w="80" w:type="dxa"/>
+              <w:start w:w="120" w:type="dxa"/>
+              <w:bottom w:w="80" w:type="dxa"/>
+              <w:end w:w="120" w:type="dxa"/>
+            </w:tcMar>
+          </w:tcPr>
+          <w:p>
+            <w:pPr>
+              <w:spacing w:after="0" w:line="240" w:lineRule="auto"/>
+              <w:jc w:val="left"/>
+            </w:pPr>
+            <w:r>
+              <w:rPr>
+                <w:rFonts w:ascii="Calibri" w:hAnsi="Calibri"/>
+                <w:b/>
+                <w:color w:val="FFFFFF"/>
+                <w:sz w:val="18"/>
+              </w:rPr>
+              <w:t>Evidence priority</w:t>
+            </w:r>
+          </w:p>
+        </w:tc>
+      </w:tr>
+      <w:tr>
+        <w:trPr>
+          <w:cantSplit w:val="true"/>
+        </w:trPr>
+        <w:tc>
+          <w:tcPr>
+            <w:tcW w:type="dxa" w:w="1872"/>
+            <w:vAlign w:val="center"/>
+            <w:tcMar>
+              <w:top w:w="80" w:type="dxa"/>
+              <w:start w:w="120" w:type="dxa"/>
+              <w:bottom w:w="80" w:type="dxa"/>
+              <w:end w:w="120" w:type="dxa"/>
+            </w:tcMar>
+          </w:tcPr>
+          <w:p>
+            <w:pPr>
+              <w:spacing w:after="0" w:line="240" w:lineRule="auto"/>
+              <w:jc w:val="left"/>
+            </w:pPr>
+            <w:r>
+              <w:rPr>
+                <w:rFonts w:ascii="Calibri" w:hAnsi="Calibri"/>
+                <w:sz w:val="18"/>
+              </w:rPr>
+              <w:t>PUE only</w:t>
+            </w:r>
+          </w:p>
+        </w:tc>
+        <w:tc>
+          <w:tcPr>
+            <w:tcW w:type="dxa" w:w="1872"/>
+            <w:vAlign w:val="center"/>
+            <w:tcMar>
+              <w:top w:w="80" w:type="dxa"/>
+              <w:start w:w="120" w:type="dxa"/>
+              <w:bottom w:w="80" w:type="dxa"/>
+              <w:end w:w="120" w:type="dxa"/>
+            </w:tcMar>
+          </w:tcPr>
+          <w:p>
+            <w:pPr>
+              <w:spacing w:after="0" w:line="240" w:lineRule="auto"/>
+              <w:jc w:val="left"/>
+            </w:pPr>
+            <w:r>
+              <w:rPr>
+                <w:rFonts w:ascii="Calibri" w:hAnsi="Calibri"/>
+                <w:sz w:val="18"/>
+              </w:rPr>
+              <w:t>Not recoverable from normalized LCA totals; requires measured PUE at equivalent useful computation</w:t>
+            </w:r>
+          </w:p>
+        </w:tc>
+        <w:tc>
+          <w:tcPr>
+            <w:tcW w:type="dxa" w:w="1872"/>
+            <w:vAlign w:val="center"/>
+            <w:tcMar>
+              <w:top w:w="80" w:type="dxa"/>
+              <w:start w:w="120" w:type="dxa"/>
+              <w:bottom w:w="80" w:type="dxa"/>
+              <w:end w:w="120" w:type="dxa"/>
+            </w:tcMar>
+          </w:tcPr>
+          <w:p>
+            <w:pPr>
+              <w:spacing w:after="0" w:line="240" w:lineRule="auto"/>
+              <w:jc w:val="left"/>
+            </w:pPr>
+            <w:r>
+              <w:rPr>
+                <w:rFonts w:ascii="Calibri" w:hAnsi="Calibri"/>
+                <w:sz w:val="18"/>
+              </w:rPr>
+              <w:t>No</w:t>
+            </w:r>
+          </w:p>
+        </w:tc>
+        <w:tc>
+          <w:tcPr>
+            <w:tcW w:type="dxa" w:w="1872"/>
+            <w:vAlign w:val="center"/>
+            <w:tcMar>
+              <w:top w:w="80" w:type="dxa"/>
+              <w:start w:w="120" w:type="dxa"/>
+              <w:bottom w:w="80" w:type="dxa"/>
+              <w:end w:w="120" w:type="dxa"/>
+            </w:tcMar>
+          </w:tcPr>
+          <w:p>
+            <w:pPr>
+              <w:spacing w:after="0" w:line="240" w:lineRule="auto"/>
+              <w:jc w:val="left"/>
+            </w:pPr>
+            <w:r>
+              <w:rPr>
+                <w:rFonts w:ascii="Calibri" w:hAnsi="Calibri"/>
+                <w:sz w:val="18"/>
+              </w:rPr>
+              <w:t>No</w:t>
+            </w:r>
+          </w:p>
+        </w:tc>
+        <w:tc>
+          <w:tcPr>
+            <w:tcW w:type="dxa" w:w="1872"/>
+            <w:vAlign w:val="center"/>
+            <w:tcMar>
+              <w:top w:w="80" w:type="dxa"/>
+              <w:start w:w="120" w:type="dxa"/>
+              <w:bottom w:w="80" w:type="dxa"/>
+              <w:end w:w="120" w:type="dxa"/>
+            </w:tcMar>
+          </w:tcPr>
+          <w:p>
+            <w:pPr>
+              <w:spacing w:after="0" w:line="240" w:lineRule="auto"/>
+              <w:jc w:val="left"/>
+            </w:pPr>
+            <w:r>
+              <w:rPr>
+                <w:rFonts w:ascii="Calibri" w:hAnsi="Calibri"/>
+                <w:sz w:val="18"/>
+              </w:rPr>
+              <w:t>No</w:t>
+            </w:r>
+          </w:p>
+        </w:tc>
+      </w:tr>
+      <w:tr>
+        <w:trPr>
+          <w:cantSplit w:val="true"/>
+        </w:trPr>
+        <w:tc>
+          <w:tcPr>
+            <w:tcW w:type="dxa" w:w="1872"/>
+            <w:vAlign w:val="center"/>
+            <w:tcMar>
+              <w:top w:w="80" w:type="dxa"/>
+              <w:start w:w="120" w:type="dxa"/>
+              <w:bottom w:w="80" w:type="dxa"/>
+              <w:end w:w="120" w:type="dxa"/>
+            </w:tcMar>
+          </w:tcPr>
+          <w:p>
+            <w:pPr>
+              <w:spacing w:after="0" w:line="240" w:lineRule="auto"/>
+              <w:jc w:val="left"/>
+            </w:pPr>
+            <w:r>
+              <w:rPr>
+                <w:rFonts w:ascii="Calibri" w:hAnsi="Calibri"/>
+                <w:sz w:val="18"/>
+              </w:rPr>
+              <w:t>Operational GHG only</w:t>
+            </w:r>
+          </w:p>
+        </w:tc>
+        <w:tc>
+          <w:tcPr>
+            <w:tcW w:type="dxa" w:w="1872"/>
+            <w:vAlign w:val="center"/>
+            <w:tcMar>
+              <w:top w:w="80" w:type="dxa"/>
+              <w:start w:w="120" w:type="dxa"/>
+              <w:bottom w:w="80" w:type="dxa"/>
+              <w:end w:w="120" w:type="dxa"/>
+            </w:tcMar>
+          </w:tcPr>
+          <w:p>
+            <w:pPr>
+              <w:spacing w:after="0" w:line="240" w:lineRule="auto"/>
+              <w:jc w:val="left"/>
+            </w:pPr>
+            <w:r>
+              <w:rPr>
+                <w:rFonts w:ascii="Calibri" w:hAnsi="Calibri"/>
+                <w:sz w:val="18"/>
+              </w:rPr>
+              <w:t>Two-phase has the lowest released use-phase term at the Microsoft grid endpoint</w:t>
+            </w:r>
+          </w:p>
+        </w:tc>
+        <w:tc>
+          <w:tcPr>
+            <w:tcW w:type="dxa" w:w="1872"/>
+            <w:vAlign w:val="center"/>
+            <w:tcMar>
+              <w:top w:w="80" w:type="dxa"/>
+              <w:start w:w="120" w:type="dxa"/>
+              <w:bottom w:w="80" w:type="dxa"/>
+              <w:end w:w="120" w:type="dxa"/>
+            </w:tcMar>
+          </w:tcPr>
+          <w:p>
+            <w:pPr>
+              <w:spacing w:after="0" w:line="240" w:lineRule="auto"/>
+              <w:jc w:val="left"/>
+            </w:pPr>
+            <w:r>
+              <w:rPr>
+                <w:rFonts w:ascii="Calibri" w:hAnsi="Calibri"/>
+                <w:sz w:val="18"/>
+              </w:rPr>
+              <w:t>No embodied crossover</w:t>
+            </w:r>
+          </w:p>
+        </w:tc>
+        <w:tc>
+          <w:tcPr>
+            <w:tcW w:type="dxa" w:w="1872"/>
+            <w:vAlign w:val="center"/>
+            <w:tcMar>
+              <w:top w:w="80" w:type="dxa"/>
+              <w:start w:w="120" w:type="dxa"/>
+              <w:bottom w:w="80" w:type="dxa"/>
+              <w:end w:w="120" w:type="dxa"/>
+            </w:tcMar>
+          </w:tcPr>
+          <w:p>
+            <w:pPr>
+              <w:spacing w:after="0" w:line="240" w:lineRule="auto"/>
+              <w:jc w:val="left"/>
+            </w:pPr>
+            <w:r>
+              <w:rPr>
+                <w:rFonts w:ascii="Calibri" w:hAnsi="Calibri"/>
+                <w:sz w:val="18"/>
+              </w:rPr>
+              <w:t>No</w:t>
+            </w:r>
+          </w:p>
+        </w:tc>
+        <w:tc>
+          <w:tcPr>
+            <w:tcW w:type="dxa" w:w="1872"/>
+            <w:vAlign w:val="center"/>
+            <w:tcMar>
+              <w:top w:w="80" w:type="dxa"/>
+              <w:start w:w="120" w:type="dxa"/>
+              <w:bottom w:w="80" w:type="dxa"/>
+              <w:end w:w="120" w:type="dxa"/>
+            </w:tcMar>
+          </w:tcPr>
+          <w:p>
+            <w:pPr>
+              <w:spacing w:after="0" w:line="240" w:lineRule="auto"/>
+              <w:jc w:val="left"/>
+            </w:pPr>
+            <w:r>
+              <w:rPr>
+                <w:rFonts w:ascii="Calibri" w:hAnsi="Calibri"/>
+                <w:sz w:val="18"/>
+              </w:rPr>
+              <w:t>No</w:t>
+            </w:r>
+          </w:p>
+        </w:tc>
+      </w:tr>
+      <w:tr>
+        <w:trPr>
+          <w:cantSplit w:val="true"/>
+        </w:trPr>
+        <w:tc>
+          <w:tcPr>
+            <w:tcW w:type="dxa" w:w="1872"/>
+            <w:vAlign w:val="center"/>
+            <w:tcMar>
+              <w:top w:w="80" w:type="dxa"/>
+              <w:start w:w="120" w:type="dxa"/>
+              <w:bottom w:w="80" w:type="dxa"/>
+              <w:end w:w="120" w:type="dxa"/>
+            </w:tcMar>
+          </w:tcPr>
+          <w:p>
+            <w:pPr>
+              <w:spacing w:after="0" w:line="240" w:lineRule="auto"/>
+              <w:jc w:val="left"/>
+            </w:pPr>
+            <w:r>
+              <w:rPr>
+                <w:rFonts w:ascii="Calibri" w:hAnsi="Calibri"/>
+                <w:sz w:val="18"/>
+              </w:rPr>
+              <w:t>Static cradle-to-grave LCA at one grid</w:t>
+            </w:r>
+          </w:p>
+        </w:tc>
+        <w:tc>
+          <w:tcPr>
+            <w:tcW w:type="dxa" w:w="1872"/>
+            <w:vAlign w:val="center"/>
+            <w:tcMar>
+              <w:top w:w="80" w:type="dxa"/>
+              <w:start w:w="120" w:type="dxa"/>
+              <w:bottom w:w="80" w:type="dxa"/>
+              <w:end w:w="120" w:type="dxa"/>
+            </w:tcMar>
+          </w:tcPr>
+          <w:p>
+            <w:pPr>
+              <w:spacing w:after="0" w:line="240" w:lineRule="auto"/>
+              <w:jc w:val="left"/>
+            </w:pPr>
+            <w:r>
+              <w:rPr>
+                <w:rFonts w:ascii="Calibri" w:hAnsi="Calibri"/>
+                <w:sz w:val="18"/>
+              </w:rPr>
+              <w:t>Two-phase lowest; cold plate minus one-phase = 0.452 kg CO2e Vcore−1 yr−1</w:t>
+            </w:r>
+          </w:p>
+        </w:tc>
+        <w:tc>
+          <w:tcPr>
+            <w:tcW w:type="dxa" w:w="1872"/>
+            <w:vAlign w:val="center"/>
+            <w:tcMar>
+              <w:top w:w="80" w:type="dxa"/>
+              <w:start w:w="120" w:type="dxa"/>
+              <w:bottom w:w="80" w:type="dxa"/>
+              <w:end w:w="120" w:type="dxa"/>
+            </w:tcMar>
+          </w:tcPr>
+          <w:p>
+            <w:pPr>
+              <w:spacing w:after="0" w:line="240" w:lineRule="auto"/>
+              <w:jc w:val="left"/>
+            </w:pPr>
+            <w:r>
+              <w:rPr>
+                <w:rFonts w:ascii="Calibri" w:hAnsi="Calibri"/>
+                <w:sz w:val="18"/>
+              </w:rPr>
+              <w:t>Not from one point</w:t>
+            </w:r>
+          </w:p>
+        </w:tc>
+        <w:tc>
+          <w:tcPr>
+            <w:tcW w:type="dxa" w:w="1872"/>
+            <w:vAlign w:val="center"/>
+            <w:tcMar>
+              <w:top w:w="80" w:type="dxa"/>
+              <w:start w:w="120" w:type="dxa"/>
+              <w:bottom w:w="80" w:type="dxa"/>
+              <w:end w:w="120" w:type="dxa"/>
+            </w:tcMar>
+          </w:tcPr>
+          <w:p>
+            <w:pPr>
+              <w:spacing w:after="0" w:line="240" w:lineRule="auto"/>
+              <w:jc w:val="left"/>
+            </w:pPr>
+            <w:r>
+              <w:rPr>
+                <w:rFonts w:ascii="Calibri" w:hAnsi="Calibri"/>
+                <w:sz w:val="18"/>
+              </w:rPr>
+              <w:t>Not from one point</w:t>
+            </w:r>
+          </w:p>
+        </w:tc>
+        <w:tc>
+          <w:tcPr>
+            <w:tcW w:type="dxa" w:w="1872"/>
+            <w:vAlign w:val="center"/>
+            <w:tcMar>
+              <w:top w:w="80" w:type="dxa"/>
+              <w:start w:w="120" w:type="dxa"/>
+              <w:bottom w:w="80" w:type="dxa"/>
+              <w:end w:w="120" w:type="dxa"/>
+            </w:tcMar>
+          </w:tcPr>
+          <w:p>
+            <w:pPr>
+              <w:spacing w:after="0" w:line="240" w:lineRule="auto"/>
+              <w:jc w:val="left"/>
+            </w:pPr>
+            <w:r>
+              <w:rPr>
+                <w:rFonts w:ascii="Calibri" w:hAnsi="Calibri"/>
+                <w:sz w:val="18"/>
+              </w:rPr>
+              <w:t>Contribution only</w:t>
+            </w:r>
+          </w:p>
+        </w:tc>
+      </w:tr>
+      <w:tr>
+        <w:trPr>
+          <w:cantSplit w:val="true"/>
+        </w:trPr>
+        <w:tc>
+          <w:tcPr>
+            <w:tcW w:type="dxa" w:w="1872"/>
+            <w:vAlign w:val="center"/>
+            <w:tcMar>
+              <w:top w:w="80" w:type="dxa"/>
+              <w:start w:w="120" w:type="dxa"/>
+              <w:bottom w:w="80" w:type="dxa"/>
+              <w:end w:w="120" w:type="dxa"/>
+            </w:tcMar>
+          </w:tcPr>
+          <w:p>
+            <w:pPr>
+              <w:spacing w:after="0" w:line="240" w:lineRule="auto"/>
+              <w:jc w:val="left"/>
+            </w:pPr>
+            <w:r>
+              <w:rPr>
+                <w:rFonts w:ascii="Calibri" w:hAnsi="Calibri"/>
+                <w:sz w:val="18"/>
+              </w:rPr>
+              <w:t>OpenDC-LCA factor-swept evidence analysis</w:t>
+            </w:r>
+          </w:p>
+        </w:tc>
+        <w:tc>
+          <w:tcPr>
+            <w:tcW w:type="dxa" w:w="1872"/>
+            <w:vAlign w:val="center"/>
+            <w:tcMar>
+              <w:top w:w="80" w:type="dxa"/>
+              <w:start w:w="120" w:type="dxa"/>
+              <w:bottom w:w="80" w:type="dxa"/>
+              <w:end w:w="120" w:type="dxa"/>
+            </w:tcMar>
+          </w:tcPr>
+          <w:p>
+            <w:pPr>
+              <w:spacing w:after="0" w:line="240" w:lineRule="auto"/>
+              <w:jc w:val="left"/>
+            </w:pPr>
+            <w:r>
+              <w:rPr>
+                <w:rFonts w:ascii="Calibri" w:hAnsi="Calibri"/>
+                <w:sz w:val="18"/>
+              </w:rPr>
+              <w:t>Cold-plate/one-phase crossover = 96.7 kg CO2e MWh−1; two-phase lowest in tested scenarios</w:t>
+            </w:r>
+          </w:p>
+        </w:tc>
+        <w:tc>
+          <w:tcPr>
+            <w:tcW w:type="dxa" w:w="1872"/>
+            <w:vAlign w:val="center"/>
+            <w:tcMar>
+              <w:top w:w="80" w:type="dxa"/>
+              <w:start w:w="120" w:type="dxa"/>
+              <w:bottom w:w="80" w:type="dxa"/>
+              <w:end w:w="120" w:type="dxa"/>
+            </w:tcMar>
+          </w:tcPr>
+          <w:p>
+            <w:pPr>
+              <w:spacing w:after="0" w:line="240" w:lineRule="auto"/>
+              <w:jc w:val="left"/>
+            </w:pPr>
+            <w:r>
+              <w:rPr>
+                <w:rFonts w:ascii="Calibri" w:hAnsi="Calibri"/>
+                <w:sz w:val="18"/>
+              </w:rPr>
+              <w:t>Yes</w:t>
+            </w:r>
+          </w:p>
+        </w:tc>
+        <w:tc>
+          <w:tcPr>
+            <w:tcW w:type="dxa" w:w="1872"/>
+            <w:vAlign w:val="center"/>
+            <w:tcMar>
+              <w:top w:w="80" w:type="dxa"/>
+              <w:start w:w="120" w:type="dxa"/>
+              <w:bottom w:w="80" w:type="dxa"/>
+              <w:end w:w="120" w:type="dxa"/>
+            </w:tcMar>
+          </w:tcPr>
+          <w:p>
+            <w:pPr>
+              <w:spacing w:after="0" w:line="240" w:lineRule="auto"/>
+              <w:jc w:val="left"/>
+            </w:pPr>
+            <w:r>
+              <w:rPr>
+                <w:rFonts w:ascii="Calibri" w:hAnsi="Calibri"/>
+                <w:sz w:val="18"/>
+              </w:rPr>
+              <w:t>Yes</w:t>
+            </w:r>
+          </w:p>
+        </w:tc>
+        <w:tc>
+          <w:tcPr>
+            <w:tcW w:type="dxa" w:w="1872"/>
+            <w:vAlign w:val="center"/>
+            <w:tcMar>
+              <w:top w:w="80" w:type="dxa"/>
+              <w:start w:w="120" w:type="dxa"/>
+              <w:bottom w:w="80" w:type="dxa"/>
+              <w:end w:w="120" w:type="dxa"/>
+            </w:tcMar>
+          </w:tcPr>
+          <w:p>
+            <w:pPr>
+              <w:spacing w:after="0" w:line="240" w:lineRule="auto"/>
+              <w:jc w:val="left"/>
+            </w:pPr>
+            <w:r>
+              <w:rPr>
+                <w:rFonts w:ascii="Calibri" w:hAnsi="Calibri"/>
+                <w:sz w:val="18"/>
+              </w:rPr>
+              <w:t>Contribution x pedigree weakness</w:t>
+            </w:r>
+          </w:p>
+        </w:tc>
+      </w:tr>
+    </w:tbl>
+    <w:p>
+      <w:pPr>
+        <w:spacing w:after="40"/>
+      </w:pPr>
+    </w:p>
+    <w:p>
       <w:r>
         <w:rPr>
           <w:rFonts w:ascii="Calibri" w:hAnsi="Calibri"/>
           <w:sz w:val="21"/>
         </w:rPr>
-        <w:t>Forty-two automated tests exercise the calculation engine, provenance rules, performance maps, interoperability, reliability and practitioner workflow. The distribution was also installed in a clean Python environment and run from template creation through report generation. These checks establish software consistency; they do not constitute ISO critical review, empirical performance validation or validation of user-supplied factors.</w:t>
+        <w:t>The comparison is not an argument against PUE or general LCA engines. It shows which additional question becomes answerable when functional-unit controls, bounded scenario transformations, provenance and evidence quality are layered onto the same lifecycle foreground.</w:t>
+      </w:r>
+    </w:p>
+    <w:p>
+      <w:pPr>
+        <w:pStyle w:val="Heading2"/>
+      </w:pPr>
+      <w:r>
+        <w:t>4.10. Software implementation and verification</w:t>
+      </w:r>
+    </w:p>
+    <w:p>
+      <w:r>
+        <w:rPr>
+          <w:rFonts w:ascii="Calibri" w:hAnsi="Calibri"/>
+          <w:sz w:val="21"/>
+        </w:rPr>
+        <w:t>The public package implements the governed input schema, static and temporal calculations, bounded performance-surface interpolation, replacement, screening uncertainty, openLCA/Brightway exchange and a comparative-claim audit. The command-line, Python and local graphical interfaces call the same calculation path and emit a human-readable report plus machine-readable results. Detailed input-output fields, installation commands, interface screens, capability matrices and release checks are provided in the repository and Supplementary Information rather than repeated in the main article.</w:t>
+      </w:r>
+    </w:p>
+    <w:p>
+      <w:r>
+        <w:rPr>
+          <w:rFonts w:ascii="Calibri" w:hAnsi="Calibri"/>
+          <w:sz w:val="21"/>
+        </w:rPr>
+        <w:t>Forty-three automated tests exercise the calculation engine, provenance rules, performance maps, interoperability, reliability and practitioner workflow. The distribution was also installed in a clean Python environment and run from template creation through report generation. These checks establish software consistency; they do not constitute ISO critical review, empirical performance validation or validation of user-supplied factors.</w:t>
       </w:r>
     </w:p>
     <w:p>
@@ -2080,7 +2860,7 @@
           <w:rFonts w:ascii="Calibri" w:hAnsi="Calibri"/>
           <w:sz w:val="21"/>
         </w:rPr>
-        <w:t>The historical panel adds a planning implication. Grid decarbonization lowered the absolute two-phase-versus-air benefit from 7.49 to 5.26 kg CO2e per Vcore-year between the 2012 and 2023 generation-weighted conditions even though the relative saving remained nearly constant. Percentage reductions alone can therefore overstate the future system value of an efficiency intervention. Planning should report relative efficiency, absolute avoided impact, and the evolving embodied share together.</w:t>
+        <w:t>The historical panel adds a planning implication. Grid decarbonization lowered the absolute two-phase-versus-air benefit from 7.49 to 5.28 kg CO2e per Vcore-year between the 2012 and 2023 generation-weighted conditions even though the relative saving remained nearly constant. Percentage reductions alone can therefore overstate the future system value of an efficiency intervention. Planning should report relative efficiency, absolute avoided impact, and the evolving embodied share together.</w:t>
       </w:r>
     </w:p>
     <w:p>
@@ -2228,7 +3008,7 @@
           <w:rFonts w:ascii="Calibri" w:hAnsi="Calibri"/>
           <w:sz w:val="21"/>
         </w:rPr>
-        <w:t>OpenDC-LCA converts heterogeneous cooling, grid, server, construction and data- quality evidence into conditional, auditable lifecycle comparisons. It reconciled the arithmetic of 24 released Microsoft/Nature totals and then exposed a result that a single reference scenario cannot show: cold plate and one-phase immersion cross near 96.7 kg CO2e MWh−1 within the observed U.S. state range. Across nine eGRID releases, the generation-weighted factor declined 32.8% and the absolute modeled two-phase-versus-air benefit declined 29.8%, while two-phase retained first rank in all 459 controlled electricity-factor scenarios. Pairwise cold-plate/one-phase ranking was sensitive to a median 1.38% use-phase change, whereas two-phase tolerated a median 6.46% degradation before losing first rank. Its first rank also persisted across a 0.38-2.06-fold server-inventory stress range. Across that range, the embodied share rose from about 4% to 57-58%, shifting the limiting evidence from operational electricity toward servers and replacement. Forty-eight public server records spanned 465-2,503 kg CO2e of manufacturing emissions, while selected lower-impact steel and cement routes showed approximately 50-60% cradle-to-gate GHG leverage per kilogram.</w:t>
+        <w:t>OpenDC-LCA converts heterogeneous cooling, grid, server, construction and data- quality evidence into conditional, auditable lifecycle comparisons. It reconciled the arithmetic of 24 released Microsoft/Nature totals and then exposed a result that a single reference scenario cannot show: cold plate and one-phase immersion cross near 96.7 kg CO2e MWh−1 within the observed U.S. state range. Across nine eGRID releases, the provider U.S. factor declined 32.5% and the absolute modeled two-phase-versus-air benefit declined 29.5%, while two-phase retained first rank in all 459 controlled electricity-factor scenarios. Pairwise cold-plate/one-phase ranking was sensitive to a median 1.38% use-phase change, whereas two-phase tolerated a median 6.46% degradation before losing first rank. Its first rank also persisted across a 0.38-2.06-fold server-inventory stress range. Across that range, the embodied share rose from about 4% to 57-58%, shifting the limiting evidence from operational electricity toward servers and replacement. Forty-eight public server records spanned 465-2,503 kg CO2e of manufacturing emissions, while selected lower-impact steel and cement routes showed approximately 50-60% cradle-to-gate GHG leverage per kilogram.</w:t>
       </w:r>
     </w:p>
     <w:p>

</xml_diff>

<commit_message>
Checkpoint prior submission-readiness revision
</commit_message>
<xml_diff>
--- a/paper/OpenDC-LCA_manuscript.docx
+++ b/paper/OpenDC-LCA_manuscript.docx
@@ -62,7 +62,7 @@
           <w:color w:val="60758A"/>
           <w:sz w:val="19"/>
         </w:rPr>
-        <w:t>Draft for coauthor review. Authorship, order, contributions, target journal, and corresponding-author information must be confirmed before submission.</w:t>
+        <w:t>Pre-submission draft for coauthor review.</w:t>
       </w:r>
     </w:p>
     <w:p>
@@ -87,7 +87,7 @@
           <w:rFonts w:ascii="Calibri" w:hAnsi="Calibri"/>
           <w:sz w:val="21"/>
         </w:rPr>
-        <w:t>Cooling life-cycle assessments (LCAs) are reported as technology rankings even though electricity accounting, useful-computation equivalence, system boundaries, and foreground data vary among studies. We present OpenDC-LCA, an open-source evidence layer connecting data-center cooling engineering to LCA tools while retaining source identity, functional unit, transformation limits, and claim status. We reconciled all 24 normalized totals released with a Microsoft/WSP hyperscale cooling study, reconstructed nine U.S. EPA eGRID years to a common AR5 GWP100 basis, and evaluated anchor coverage, boundary mismatch, functional-unit sensitivity, and joint assumption stress. The harmonized U.S. generation rate declined 32.46%, from 517.73 kg CO2e/MWh in 2012 to 349.67 kg CO2e/MWh in 2023; changing historical GWP bases altered any annual national rate by at most 0.248 kg CO2e/MWh. In contrast, 137 of 459 state-year rates lay outside the two released electricity anchors. The cold-plate/single-phase-immersion crossover occurred at 96.7 kg CO2e/MWh, but the sole 2023 state below it disappeared when a transparent 75 kg CO2e/MWh upstream-boundary allowance was applied. Two-phase immersion ranked first in every deterministic state-year screen, yet its U.S. first-rank frequency fell from 99.3% to 56.2% across narrow-to-wide declared stress envelopes. A median 5.50% adverse correction to its impact per equivalent useful computation erased first rank. These frequencies are sensitivity diagnostics, not probabilities. The results show that the national decarbonization trend is robust, whereas local cooling rankings depend on boundary and service-equivalence evidence. OpenDC-LCA converts those dependencies into explicit data-acquisition priorities rather than hiding them inside a universal league table.</w:t>
+        <w:t>Life-cycle assessments (LCAs) of data-center cooling often report rankings despite differences in electricity accounting, useful-computation equivalence, boundaries, and foreground data. OpenDC-LCA links cooling engineering and LCA tools. We reconciled 24 released totals from a Microsoft/WSP study, reconstructed nine U.S. EPA eGRID years on a common AR5 GWP100 basis, and tested anchor coverage, boundary mismatch, functional-unit equivalence, assumption blocks, dependence, and numerical convergence. The harmonized U.S. generation rate declined 32.46%, from 517.73 kg CO2e/MWh in 2012 to 349.67 kg CO2e/MWh in 2023; GWP-basis harmonization changed any annual national rate by at most 0.248 kg CO2e/MWh. Yet 137 of 459 state-year rates lay outside the released electricity anchors. The cold-plate/single-phase crossover was 96.7 kg CO2e/MWh. The only 2023 state below it lost that ordering after an exact 73.01 kg CO2e/MWh additive boundary test. Two-phase immersion ranked first in every deterministic state-year screen, but its U.S. first-rank frequency fell from 99.19% to 55.05% across narrow-to-wide all-block zero-correlation stress designs. In the wide design it rose from 55.05% with independent architecture errors to 100% with common-mode errors; embodied variation caused the largest one-block rank loss. A median 5.50% adverse useful-computation correction also erased first rank. These frequencies describe stress designs, not probabilities. The national decarbonization trend is stable, whereas cooling rankings depend on boundary, foreground, dependence, and service-equivalence evidence. OpenDC-LCA converts those dependencies into traceable data requirements rather than a universal league table.</w:t>
       </w:r>
     </w:p>
     <w:p>
@@ -155,7 +155,7 @@
         <w:pStyle w:val="Heading2"/>
       </w:pPr>
       <w:r>
-        <w:t>1.2. What existing data-center LCAs establish</w:t>
+        <w:t>1.2. What existing data-center LCAs show</w:t>
       </w:r>
     </w:p>
     <w:p>
@@ -173,7 +173,7 @@
           <w:rFonts w:ascii="Calibri" w:hAnsi="Calibri"/>
           <w:sz w:val="21"/>
         </w:rPr>
-        <w:t>Alissa et al. published the most comprehensive public hyperscale comparison of air, cold-plate, single-phase immersion, and two-phase immersion [14]. Their cradle-to-grave model included buildings, support equipment, servers, racks or tanks, cables, cooling fluids, use-phase electricity and water, replacement, and end of life. The use of Vcore-year as the functional unit was a major advance because it allowed packing density and cooling-enabled computation to enter the comparison. The accompanying archive includes normalized contributions, equations, uncertainty material, and a pedigree assessment [15]. It does not, however, disclose every licensed background process, architecture-specific bill of quantities, or a transferable mapping from electricity to workload performance.</w:t>
+        <w:t>Alissa et al. published the most detailed public hyperscale comparison of air, cold-plate, single-phase immersion, and two-phase immersion [14]. Their cradle-to-grave model included buildings, support equipment, servers, racks or tanks, cables, cooling fluids, use-phase electricity and water, replacement, and end of life. The use of Vcore-year as the functional unit was a major advance because it allowed packing density and cooling-enabled computation to enter the comparison. The accompanying archive includes normalized contributions, equations, uncertainty material, and a pedigree assessment [15]. It does not, however, disclose every licensed background process, architecture-specific bill of quantities, or a transferable mapping from electricity to workload performance.</w:t>
       </w:r>
     </w:p>
     <w:p>
@@ -182,7 +182,7 @@
           <w:rFonts w:ascii="Calibri" w:hAnsi="Calibri"/>
           <w:sz w:val="21"/>
         </w:rPr>
-        <w:t>Recent LCA work confirms that electricity decarbonization and cooling efficiency are complementary but can shift impacts among categories [16]. Manufacturer and ICT studies also show wide dispersion in embodied server impacts [17,18]. Together, these studies establish the need for lifecycle assessment while exposing a transferability problem: a static result at one grid, one performance assumption, and one database system cannot be treated as a universal cooling ranking.</w:t>
+        <w:t>Recent LCA work confirms that electricity decarbonization and cooling efficiency are complementary but can shift impacts among categories [16]. Manufacturer and ICT studies also show wide dispersion in embodied server impacts [17,18]. Together, these studies show the need for lifecycle assessment while exposing a transferability problem: a static result at one grid, one performance assumption, and one database system cannot be treated as a universal cooling ranking.</w:t>
       </w:r>
     </w:p>
     <w:p>
@@ -235,6 +235,15 @@
           <w:sz w:val="21"/>
         </w:rPr>
         <w:t>Data-quality assessment is therefore not a decorative appendix. EPA guidance emphasizes reproducible documentation at flow and process levels [29]. Decision analysis goes further: value-of-information methods prioritize data whose resolution is expected to change a decision, rather than simply improving every weak input [30]. This distinction is important for electronics-cooling laboratories. A parameter may have poor pedigree but negligible decision leverage; a seemingly precise PUE difference may be decisive if two lifecycle alternatives are nearly tied.</w:t>
+      </w:r>
+    </w:p>
+    <w:p>
+      <w:r>
+        <w:rPr>
+          <w:rFonts w:ascii="Calibri" w:hAnsi="Calibri"/>
+          <w:sz w:val="21"/>
+        </w:rPr>
+        <w:t>The review standard also depends on the claim. ISO 14040 and ISO 14044 define the LCA framework and requirements, whereas ISO 14071:2024 specifies critical review processes and reviewer competencies, with particular relevance to comparative assertions intended for public disclosure [42,43]. Code tests, data checks, and coauthor review can strengthen traceability, but none is a substitute for an independent critical review.</w:t>
       </w:r>
     </w:p>
     <w:p>
@@ -650,11 +659,10 @@
         <w:tblInd w:w="120" w:type="dxa"/>
       </w:tblPr>
       <w:tblGrid>
-        <w:gridCol w:w="1300"/>
-        <w:gridCol w:w="1150"/>
-        <w:gridCol w:w="2300"/>
-        <w:gridCol w:w="3000"/>
-        <w:gridCol w:w="1610"/>
+        <w:gridCol w:w="2340"/>
+        <w:gridCol w:w="2340"/>
+        <w:gridCol w:w="2340"/>
+        <w:gridCol w:w="2340"/>
       </w:tblGrid>
       <w:tr>
         <w:trPr>
@@ -663,7 +671,7 @@
         </w:trPr>
         <w:tc>
           <w:tcPr>
-            <w:tcW w:type="dxa" w:w="1300"/>
+            <w:tcW w:type="dxa" w:w="2340"/>
             <w:vAlign w:val="center"/>
             <w:shd w:fill="1F4E79"/>
             <w:tcMar>
@@ -685,41 +693,13 @@
                 <w:color w:val="FFFFFF"/>
                 <w:sz w:val="18"/>
               </w:rPr>
-              <w:t>Source</w:t>
+              <w:t>Source and evidence used</w:t>
             </w:r>
           </w:p>
         </w:tc>
         <w:tc>
           <w:tcPr>
-            <w:tcW w:type="dxa" w:w="1150"/>
-            <w:vAlign w:val="center"/>
-            <w:shd w:fill="1F4E79"/>
-            <w:tcMar>
-              <w:top w:w="80" w:type="dxa"/>
-              <w:start w:w="120" w:type="dxa"/>
-              <w:bottom w:w="80" w:type="dxa"/>
-              <w:end w:w="120" w:type="dxa"/>
-            </w:tcMar>
-          </w:tcPr>
-          <w:p>
-            <w:pPr>
-              <w:spacing w:after="0" w:line="240" w:lineRule="auto"/>
-              <w:jc w:val="left"/>
-            </w:pPr>
-            <w:r>
-              <w:rPr>
-                <w:rFonts w:ascii="Calibri" w:hAnsi="Calibri"/>
-                <w:b/>
-                <w:color w:val="FFFFFF"/>
-                <w:sz w:val="18"/>
-              </w:rPr>
-              <w:t>Records used</w:t>
-            </w:r>
-          </w:p>
-        </w:tc>
-        <w:tc>
-          <w:tcPr>
-            <w:tcW w:type="dxa" w:w="2300"/>
+            <w:tcW w:type="dxa" w:w="2340"/>
             <w:vAlign w:val="center"/>
             <w:shd w:fill="1F4E79"/>
             <w:tcMar>
@@ -747,7 +727,7 @@
         </w:tc>
         <w:tc>
           <w:tcPr>
-            <w:tcW w:type="dxa" w:w="3000"/>
+            <w:tcW w:type="dxa" w:w="2340"/>
             <w:vAlign w:val="center"/>
             <w:shd w:fill="1F4E79"/>
             <w:tcMar>
@@ -769,13 +749,13 @@
                 <w:color w:val="FFFFFF"/>
                 <w:sz w:val="18"/>
               </w:rPr>
-              <w:t>Why not used more broadly</w:t>
+              <w:t>Boundary or transfer limit</w:t>
             </w:r>
           </w:p>
         </w:tc>
         <w:tc>
           <w:tcPr>
-            <w:tcW w:type="dxa" w:w="1610"/>
+            <w:tcW w:type="dxa" w:w="2340"/>
             <w:vAlign w:val="center"/>
             <w:shd w:fill="1F4E79"/>
             <w:tcMar>
@@ -797,7 +777,7 @@
                 <w:color w:val="FFFFFF"/>
                 <w:sz w:val="18"/>
               </w:rPr>
-              <w:t>Evidence class</w:t>
+              <w:t>Claim class</w:t>
             </w:r>
           </w:p>
         </w:tc>
@@ -808,7 +788,7 @@
         </w:trPr>
         <w:tc>
           <w:tcPr>
-            <w:tcW w:type="dxa" w:w="1300"/>
+            <w:tcW w:type="dxa" w:w="2340"/>
             <w:vAlign w:val="center"/>
             <w:tcMar>
               <w:top w:w="80" w:type="dxa"/>
@@ -827,13 +807,13 @@
                 <w:rFonts w:ascii="Calibri" w:hAnsi="Calibri"/>
                 <w:sz w:val="18"/>
               </w:rPr>
-              <w:t>Microsoft/WSP Nature archive [14,15]</w:t>
+              <w:t>Microsoft/WSP archive: 24 totals, component tables, 2 electricity anchors, pedigree records [14,15]</w:t>
             </w:r>
           </w:p>
         </w:tc>
         <w:tc>
           <w:tcPr>
-            <w:tcW w:type="dxa" w:w="1150"/>
+            <w:tcW w:type="dxa" w:w="2340"/>
             <w:vAlign w:val="center"/>
             <w:tcMar>
               <w:top w:w="80" w:type="dxa"/>
@@ -852,38 +832,13 @@
                 <w:rFonts w:ascii="Calibri" w:hAnsi="Calibri"/>
                 <w:sz w:val="18"/>
               </w:rPr>
-              <w:t>24 normalized totals; component tables; 2 electricity anchors; pedigree records</w:t>
+              <w:t>Arithmetic reconstruction, foreground contribution model, crossover and stress analyses</w:t>
             </w:r>
           </w:p>
         </w:tc>
         <w:tc>
           <w:tcPr>
-            <w:tcW w:type="dxa" w:w="2300"/>
-            <w:vAlign w:val="center"/>
-            <w:tcMar>
-              <w:top w:w="80" w:type="dxa"/>
-              <w:start w:w="120" w:type="dxa"/>
-              <w:bottom w:w="80" w:type="dxa"/>
-              <w:end w:w="120" w:type="dxa"/>
-            </w:tcMar>
-          </w:tcPr>
-          <w:p>
-            <w:pPr>
-              <w:spacing w:after="0" w:line="240" w:lineRule="auto"/>
-              <w:jc w:val="left"/>
-            </w:pPr>
-            <w:r>
-              <w:rPr>
-                <w:rFonts w:ascii="Calibri" w:hAnsi="Calibri"/>
-                <w:sz w:val="18"/>
-              </w:rPr>
-              <w:t>Arithmetic reconstruction, foreground contribution model, crossover and stress analysis</w:t>
-            </w:r>
-          </w:p>
-        </w:tc>
-        <w:tc>
-          <w:tcPr>
-            <w:tcW w:type="dxa" w:w="3000"/>
+            <w:tcW w:type="dxa" w:w="2340"/>
             <w:vAlign w:val="center"/>
             <w:tcMar>
               <w:top w:w="80" w:type="dxa"/>
@@ -908,7 +863,7 @@
         </w:tc>
         <w:tc>
           <w:tcPr>
-            <w:tcW w:type="dxa" w:w="1610"/>
+            <w:tcW w:type="dxa" w:w="2340"/>
             <w:vAlign w:val="center"/>
             <w:tcMar>
               <w:top w:w="80" w:type="dxa"/>
@@ -938,7 +893,7 @@
         </w:trPr>
         <w:tc>
           <w:tcPr>
-            <w:tcW w:type="dxa" w:w="1300"/>
+            <w:tcW w:type="dxa" w:w="2340"/>
             <w:vAlign w:val="center"/>
             <w:tcMar>
               <w:top w:w="80" w:type="dxa"/>
@@ -957,13 +912,13 @@
                 <w:rFonts w:ascii="Calibri" w:hAnsi="Calibri"/>
                 <w:sz w:val="18"/>
               </w:rPr>
-              <w:t>EPA eGRID 2012-2023 [34,35]</w:t>
+              <w:t>EPA eGRID: 459 state/DC-year rows and 9 U.S. aggregates [34,35]</w:t>
             </w:r>
           </w:p>
         </w:tc>
         <w:tc>
           <w:tcPr>
-            <w:tcW w:type="dxa" w:w="1150"/>
+            <w:tcW w:type="dxa" w:w="2340"/>
             <w:vAlign w:val="center"/>
             <w:tcMar>
               <w:top w:w="80" w:type="dxa"/>
@@ -982,38 +937,13 @@
                 <w:rFonts w:ascii="Calibri" w:hAnsi="Calibri"/>
                 <w:sz w:val="18"/>
               </w:rPr>
-              <w:t>459 state/DC-year rows; 9 U.S. aggregates</w:t>
+              <w:t>Common-basis generation-rate scenarios and historical trend</w:t>
             </w:r>
           </w:p>
         </w:tc>
         <w:tc>
           <w:tcPr>
-            <w:tcW w:type="dxa" w:w="2300"/>
-            <w:vAlign w:val="center"/>
-            <w:tcMar>
-              <w:top w:w="80" w:type="dxa"/>
-              <w:start w:w="120" w:type="dxa"/>
-              <w:bottom w:w="80" w:type="dxa"/>
-              <w:end w:w="120" w:type="dxa"/>
-            </w:tcMar>
-          </w:tcPr>
-          <w:p>
-            <w:pPr>
-              <w:spacing w:after="0" w:line="240" w:lineRule="auto"/>
-              <w:jc w:val="left"/>
-            </w:pPr>
-            <w:r>
-              <w:rPr>
-                <w:rFonts w:ascii="Calibri" w:hAnsi="Calibri"/>
-                <w:sz w:val="18"/>
-              </w:rPr>
-              <w:t>Harmonized generation-rate scenarios and historical trend</w:t>
-            </w:r>
-          </w:p>
-        </w:tc>
-        <w:tc>
-          <w:tcPr>
-            <w:tcW w:type="dxa" w:w="3000"/>
+            <w:tcW w:type="dxa" w:w="2340"/>
             <w:vAlign w:val="center"/>
             <w:tcMar>
               <w:top w:w="80" w:type="dxa"/>
@@ -1038,7 +968,7 @@
         </w:tc>
         <w:tc>
           <w:tcPr>
-            <w:tcW w:type="dxa" w:w="1610"/>
+            <w:tcW w:type="dxa" w:w="2340"/>
             <w:vAlign w:val="center"/>
             <w:tcMar>
               <w:top w:w="80" w:type="dxa"/>
@@ -1068,7 +998,7 @@
         </w:trPr>
         <w:tc>
           <w:tcPr>
-            <w:tcW w:type="dxa" w:w="1300"/>
+            <w:tcW w:type="dxa" w:w="2340"/>
             <w:vAlign w:val="center"/>
             <w:tcMar>
               <w:top w:w="80" w:type="dxa"/>
@@ -1087,13 +1017,13 @@
                 <w:rFonts w:ascii="Calibri" w:hAnsi="Calibri"/>
                 <w:sz w:val="18"/>
               </w:rPr>
-              <w:t>Boavizta [36]</w:t>
+              <w:t>Boavizta: 48 server PCF records [36]</w:t>
             </w:r>
           </w:p>
         </w:tc>
         <w:tc>
           <w:tcPr>
-            <w:tcW w:type="dxa" w:w="1150"/>
+            <w:tcW w:type="dxa" w:w="2340"/>
             <w:vAlign w:val="center"/>
             <w:tcMar>
               <w:top w:w="80" w:type="dxa"/>
@@ -1112,13 +1042,13 @@
                 <w:rFonts w:ascii="Calibri" w:hAnsi="Calibri"/>
                 <w:sz w:val="18"/>
               </w:rPr>
-              <w:t>48 server PCF records</w:t>
+              <w:t>Server-manufacturing dispersion and common-scaling stress</w:t>
             </w:r>
           </w:p>
         </w:tc>
         <w:tc>
           <w:tcPr>
-            <w:tcW w:type="dxa" w:w="2300"/>
+            <w:tcW w:type="dxa" w:w="2340"/>
             <w:vAlign w:val="center"/>
             <w:tcMar>
               <w:top w:w="80" w:type="dxa"/>
@@ -1137,38 +1067,13 @@
                 <w:rFonts w:ascii="Calibri" w:hAnsi="Calibri"/>
                 <w:sz w:val="18"/>
               </w:rPr>
-              <w:t>Empirical scale for server-manufacturing stress and dispersion</w:t>
+              <w:t>Products, configurations, PCRs, lifetimes, and performance are heterogeneous</w:t>
             </w:r>
           </w:p>
         </w:tc>
         <w:tc>
           <w:tcPr>
-            <w:tcW w:type="dxa" w:w="3000"/>
-            <w:vAlign w:val="center"/>
-            <w:tcMar>
-              <w:top w:w="80" w:type="dxa"/>
-              <w:start w:w="120" w:type="dxa"/>
-              <w:bottom w:w="80" w:type="dxa"/>
-              <w:end w:w="120" w:type="dxa"/>
-            </w:tcMar>
-          </w:tcPr>
-          <w:p>
-            <w:pPr>
-              <w:spacing w:after="0" w:line="240" w:lineRule="auto"/>
-              <w:jc w:val="left"/>
-            </w:pPr>
-            <w:r>
-              <w:rPr>
-                <w:rFonts w:ascii="Calibri" w:hAnsi="Calibri"/>
-                <w:sz w:val="18"/>
-              </w:rPr>
-              <w:t>Heterogeneous products, configurations, PCRs, lifetimes, and functional performance</w:t>
-            </w:r>
-          </w:p>
-        </w:tc>
-        <w:tc>
-          <w:tcPr>
-            <w:tcW w:type="dxa" w:w="1610"/>
+            <w:tcW w:type="dxa" w:w="2340"/>
             <w:vAlign w:val="center"/>
             <w:tcMar>
               <w:top w:w="80" w:type="dxa"/>
@@ -1198,7 +1103,7 @@
         </w:trPr>
         <w:tc>
           <w:tcPr>
-            <w:tcW w:type="dxa" w:w="1300"/>
+            <w:tcW w:type="dxa" w:w="2340"/>
             <w:vAlign w:val="center"/>
             <w:tcMar>
               <w:top w:w="80" w:type="dxa"/>
@@ -1217,13 +1122,13 @@
                 <w:rFonts w:ascii="Calibri" w:hAnsi="Calibri"/>
                 <w:sz w:val="18"/>
               </w:rPr>
-              <w:t>ÖKOBAUDAT 2024-II [37]</w:t>
+              <w:t>ÖKOBAUDAT: 6 selected A1-A3 processes [37]</w:t>
             </w:r>
           </w:p>
         </w:tc>
         <w:tc>
           <w:tcPr>
-            <w:tcW w:type="dxa" w:w="1150"/>
+            <w:tcW w:type="dxa" w:w="2340"/>
             <w:vAlign w:val="center"/>
             <w:tcMar>
               <w:top w:w="80" w:type="dxa"/>
@@ -1242,13 +1147,13 @@
                 <w:rFonts w:ascii="Calibri" w:hAnsi="Calibri"/>
                 <w:sz w:val="18"/>
               </w:rPr>
-              <w:t>6 selected A1-A3 processes</w:t>
+              <w:t>Matched steel- and cement-route procurement levers</w:t>
             </w:r>
           </w:p>
         </w:tc>
         <w:tc>
           <w:tcPr>
-            <w:tcW w:type="dxa" w:w="2300"/>
+            <w:tcW w:type="dxa" w:w="2340"/>
             <w:vAlign w:val="center"/>
             <w:tcMar>
               <w:top w:w="80" w:type="dxa"/>
@@ -1267,38 +1172,13 @@
                 <w:rFonts w:ascii="Calibri" w:hAnsi="Calibri"/>
                 <w:sz w:val="18"/>
               </w:rPr>
-              <w:t>Matched steel and cement procurement levers</w:t>
+              <w:t>German generic factors require architecture-specific bills of quantities</w:t>
             </w:r>
           </w:p>
         </w:tc>
         <w:tc>
           <w:tcPr>
-            <w:tcW w:type="dxa" w:w="3000"/>
-            <w:vAlign w:val="center"/>
-            <w:tcMar>
-              <w:top w:w="80" w:type="dxa"/>
-              <w:start w:w="120" w:type="dxa"/>
-              <w:bottom w:w="80" w:type="dxa"/>
-              <w:end w:w="120" w:type="dxa"/>
-            </w:tcMar>
-          </w:tcPr>
-          <w:p>
-            <w:pPr>
-              <w:spacing w:after="0" w:line="240" w:lineRule="auto"/>
-              <w:jc w:val="left"/>
-            </w:pPr>
-            <w:r>
-              <w:rPr>
-                <w:rFonts w:ascii="Calibri" w:hAnsi="Calibri"/>
-                <w:sz w:val="18"/>
-              </w:rPr>
-              <w:t>German generic factors cannot be propagated without an architecture-specific bill of quantities</w:t>
-            </w:r>
-          </w:p>
-        </w:tc>
-        <w:tc>
-          <w:tcPr>
-            <w:tcW w:type="dxa" w:w="1610"/>
+            <w:tcW w:type="dxa" w:w="2340"/>
             <w:vAlign w:val="center"/>
             <w:tcMar>
               <w:top w:w="80" w:type="dxa"/>
@@ -1328,7 +1208,7 @@
         </w:trPr>
         <w:tc>
           <w:tcPr>
-            <w:tcW w:type="dxa" w:w="1300"/>
+            <w:tcW w:type="dxa" w:w="2340"/>
             <w:vAlign w:val="center"/>
             <w:tcMar>
               <w:top w:w="80" w:type="dxa"/>
@@ -1347,13 +1227,13 @@
                 <w:rFonts w:ascii="Calibri" w:hAnsi="Calibri"/>
                 <w:sz w:val="18"/>
               </w:rPr>
-              <w:t>NOAA TMY [38]</w:t>
+              <w:t>NOAA TMY: 8,760 Fayetteville weather rows [38]</w:t>
             </w:r>
           </w:p>
         </w:tc>
         <w:tc>
           <w:tcPr>
-            <w:tcW w:type="dxa" w:w="1150"/>
+            <w:tcW w:type="dxa" w:w="2340"/>
             <w:vAlign w:val="center"/>
             <w:tcMar>
               <w:top w:w="80" w:type="dxa"/>
@@ -1372,13 +1252,13 @@
                 <w:rFonts w:ascii="Calibri" w:hAnsi="Calibri"/>
                 <w:sz w:val="18"/>
               </w:rPr>
-              <w:t>8,760 hourly weather rows for Fayetteville example</w:t>
+              <w:t>Performance-map and hourly-integration software test</w:t>
             </w:r>
           </w:p>
         </w:tc>
         <w:tc>
           <w:tcPr>
-            <w:tcW w:type="dxa" w:w="2300"/>
+            <w:tcW w:type="dxa" w:w="2340"/>
             <w:vAlign w:val="center"/>
             <w:tcMar>
               <w:top w:w="80" w:type="dxa"/>
@@ -1397,38 +1277,13 @@
                 <w:rFonts w:ascii="Calibri" w:hAnsi="Calibri"/>
                 <w:sz w:val="18"/>
               </w:rPr>
-              <w:t>Software and performance-map integration test</w:t>
+              <w:t>No measured four-architecture cooling surface is available</w:t>
             </w:r>
           </w:p>
         </w:tc>
         <w:tc>
           <w:tcPr>
-            <w:tcW w:type="dxa" w:w="3000"/>
-            <w:vAlign w:val="center"/>
-            <w:tcMar>
-              <w:top w:w="80" w:type="dxa"/>
-              <w:start w:w="120" w:type="dxa"/>
-              <w:bottom w:w="80" w:type="dxa"/>
-              <w:end w:w="120" w:type="dxa"/>
-            </w:tcMar>
-          </w:tcPr>
-          <w:p>
-            <w:pPr>
-              <w:spacing w:after="0" w:line="240" w:lineRule="auto"/>
-              <w:jc w:val="left"/>
-            </w:pPr>
-            <w:r>
-              <w:rPr>
-                <w:rFonts w:ascii="Calibri" w:hAnsi="Calibri"/>
-                <w:sz w:val="18"/>
-              </w:rPr>
-              <w:t>No measured architecture-specific cooling surface is available</w:t>
-            </w:r>
-          </w:p>
-        </w:tc>
-        <w:tc>
-          <w:tcPr>
-            <w:tcW w:type="dxa" w:w="1610"/>
+            <w:tcW w:type="dxa" w:w="2340"/>
             <w:vAlign w:val="center"/>
             <w:tcMar>
               <w:top w:w="80" w:type="dxa"/>
@@ -1458,7 +1313,7 @@
         </w:trPr>
         <w:tc>
           <w:tcPr>
-            <w:tcW w:type="dxa" w:w="1300"/>
+            <w:tcW w:type="dxa" w:w="2340"/>
             <w:vAlign w:val="center"/>
             <w:tcMar>
               <w:top w:w="80" w:type="dxa"/>
@@ -1477,13 +1332,13 @@
                 <w:rFonts w:ascii="Calibri" w:hAnsi="Calibri"/>
                 <w:sz w:val="18"/>
               </w:rPr>
-              <w:t>USLCI, seven GLAD hydrogen archives [39,40]</w:t>
+              <w:t>USLCI and 7 GLAD hydrogen archives [39,40]</w:t>
             </w:r>
           </w:p>
         </w:tc>
         <w:tc>
           <w:tcPr>
-            <w:tcW w:type="dxa" w:w="1150"/>
+            <w:tcW w:type="dxa" w:w="2340"/>
             <w:vAlign w:val="center"/>
             <w:tcMar>
               <w:top w:w="80" w:type="dxa"/>
@@ -1502,13 +1357,13 @@
                 <w:rFonts w:ascii="Calibri" w:hAnsi="Calibri"/>
                 <w:sz w:val="18"/>
               </w:rPr>
-              <w:t>Registered/exchange-tested inventories</w:t>
+              <w:t>Exchange and interoperability tests</w:t>
             </w:r>
           </w:p>
         </w:tc>
         <w:tc>
           <w:tcPr>
-            <w:tcW w:type="dxa" w:w="2300"/>
+            <w:tcW w:type="dxa" w:w="2340"/>
             <w:vAlign w:val="center"/>
             <w:tcMar>
               <w:top w:w="80" w:type="dxa"/>
@@ -1527,38 +1382,13 @@
                 <w:rFonts w:ascii="Calibri" w:hAnsi="Calibri"/>
                 <w:sz w:val="18"/>
               </w:rPr>
-              <w:t>Interoperability and future backup-power/equipment mapping</w:t>
+              <w:t>Product-system links, allocation, providers, and LCIA methods are unresolved</w:t>
             </w:r>
           </w:p>
         </w:tc>
         <w:tc>
           <w:tcPr>
-            <w:tcW w:type="dxa" w:w="3000"/>
-            <w:vAlign w:val="center"/>
-            <w:tcMar>
-              <w:top w:w="80" w:type="dxa"/>
-              <w:start w:w="120" w:type="dxa"/>
-              <w:bottom w:w="80" w:type="dxa"/>
-              <w:end w:w="120" w:type="dxa"/>
-            </w:tcMar>
-          </w:tcPr>
-          <w:p>
-            <w:pPr>
-              <w:spacing w:after="0" w:line="240" w:lineRule="auto"/>
-              <w:jc w:val="left"/>
-            </w:pPr>
-            <w:r>
-              <w:rPr>
-                <w:rFonts w:ascii="Calibri" w:hAnsi="Calibri"/>
-                <w:sz w:val="18"/>
-              </w:rPr>
-              <w:t>Provider linking, common product system, allocation, and LCIA method are unresolved</w:t>
-            </w:r>
-          </w:p>
-        </w:tc>
-        <w:tc>
-          <w:tcPr>
-            <w:tcW w:type="dxa" w:w="1610"/>
+            <w:tcW w:type="dxa" w:w="2340"/>
             <w:vAlign w:val="center"/>
             <w:tcMar>
               <w:top w:w="80" w:type="dxa"/>
@@ -1588,7 +1418,7 @@
         </w:trPr>
         <w:tc>
           <w:tcPr>
-            <w:tcW w:type="dxa" w:w="1300"/>
+            <w:tcW w:type="dxa" w:w="2340"/>
             <w:vAlign w:val="center"/>
             <w:tcMar>
               <w:top w:w="80" w:type="dxa"/>
@@ -1607,38 +1437,13 @@
                 <w:rFonts w:ascii="Calibri" w:hAnsi="Calibri"/>
                 <w:sz w:val="18"/>
               </w:rPr>
-              <w:t>USGS watershed boundary [41]</w:t>
+              <w:t>USGS watershed boundary: HU12 geometry [41]</w:t>
             </w:r>
           </w:p>
         </w:tc>
         <w:tc>
           <w:tcPr>
-            <w:tcW w:type="dxa" w:w="1150"/>
-            <w:vAlign w:val="center"/>
-            <w:tcMar>
-              <w:top w:w="80" w:type="dxa"/>
-              <w:start w:w="120" w:type="dxa"/>
-              <w:bottom w:w="80" w:type="dxa"/>
-              <w:end w:w="120" w:type="dxa"/>
-            </w:tcMar>
-          </w:tcPr>
-          <w:p>
-            <w:pPr>
-              <w:spacing w:after="0" w:line="240" w:lineRule="auto"/>
-              <w:jc w:val="left"/>
-            </w:pPr>
-            <w:r>
-              <w:rPr>
-                <w:rFonts w:ascii="Calibri" w:hAnsi="Calibri"/>
-                <w:sz w:val="18"/>
-              </w:rPr>
-              <w:t>HU12 geometry</w:t>
-            </w:r>
-          </w:p>
-        </w:tc>
-        <w:tc>
-          <w:tcPr>
-            <w:tcW w:type="dxa" w:w="2300"/>
+            <w:tcW w:type="dxa" w:w="2340"/>
             <w:vAlign w:val="center"/>
             <w:tcMar>
               <w:top w:w="80" w:type="dxa"/>
@@ -1663,7 +1468,7 @@
         </w:tc>
         <w:tc>
           <w:tcPr>
-            <w:tcW w:type="dxa" w:w="3000"/>
+            <w:tcW w:type="dxa" w:w="2340"/>
             <w:vAlign w:val="center"/>
             <w:tcMar>
               <w:top w:w="80" w:type="dxa"/>
@@ -1688,7 +1493,7 @@
         </w:tc>
         <w:tc>
           <w:tcPr>
-            <w:tcW w:type="dxa" w:w="1610"/>
+            <w:tcW w:type="dxa" w:w="2340"/>
             <w:vAlign w:val="center"/>
             <w:tcMar>
               <w:top w:w="80" w:type="dxa"/>
@@ -2060,7 +1865,7 @@
           <w:rFonts w:ascii="Calibri" w:hAnsi="Calibri"/>
           <w:sz w:val="21"/>
         </w:rPr>
-        <w:t>Because an upstream lifecycle difference between eGRID and the GaBi anchors cannot be estimated from the released files, we did not assign a best value. Instead, we added transparent allowances of 0, 25, 50, 75, and 100 kg CO2e/MWh to every 2023 eGRID rate and recomputed architecture order. This is a boundary-mismatch stress, not an uncertainty distribution or estimate of upstream emissions.</w:t>
+        <w:t>Because an upstream lifecycle difference between eGRID and the GaBi anchors cannot be estimated from the released files, we did not assign a best value. Instead, we added transparent allowances of 0, 25, 50, 75, and 100 kg CO2e/MWh to every 2023 eGRID rate and recomputed architecture order. This is a boundary-mismatch stress, not an uncertainty distribution or estimate of upstream emissions. We also calculated the exact additive value that moves the lowest 2023 state rate to the cold-plate/single-phase crossover, (g^*-min(g_s)).</w:t>
       </w:r>
     </w:p>
     <w:p>
@@ -2102,7 +1907,7 @@
         <w:pStyle w:val="Heading2"/>
       </w:pPr>
       <w:r>
-        <w:t>2.8. Joint assumption-stress ensembles</w:t>
+        <w:t>2.8. Assumption-block and dependence stress designs</w:t>
       </w:r>
     </w:p>
     <w:p>
@@ -2111,7 +1916,7 @@
           <w:rFonts w:ascii="Calibri" w:hAnsi="Calibri"/>
           <w:sz w:val="21"/>
         </w:rPr>
-        <w:t>Deterministic break-even values do not propagate interacting assumptions. We therefore ran seeded, 20,000-iteration triangular stress ensembles for the 2023 U.S. generation factor and the lowest-carbon 2023 state. A shared grid multiplier was drawn for each iteration. Technology-specific multipliers were then drawn for use phase, embodied contribution, and impact per equivalent service. Three declared envelopes were used (Table 2).</w:t>
+        <w:t>Deterministic break-even values do not propagate interacting assumptions. We therefore ran seeded, 20,000-iteration triangular stress designs for the 2023 U.S. generation factor and the lowest-carbon 2023 state. The headline design used one shared grid multiplier and independent technology-specific multipliers for use phase, embodied contribution, and impact per equivalent service. It is the all-block, zero-correlation member of the dependence analysis described below. Three declared envelopes were used (Table 2).</w:t>
       </w:r>
     </w:p>
     <w:p>
@@ -2136,12 +1941,10 @@
         <w:tblInd w:w="120" w:type="dxa"/>
       </w:tblPr>
       <w:tblGrid>
-        <w:gridCol w:w="1450"/>
-        <w:gridCol w:w="1750"/>
-        <w:gridCol w:w="1650"/>
-        <w:gridCol w:w="1650"/>
-        <w:gridCol w:w="1850"/>
-        <w:gridCol w:w="1010"/>
+        <w:gridCol w:w="2340"/>
+        <w:gridCol w:w="2340"/>
+        <w:gridCol w:w="2340"/>
+        <w:gridCol w:w="2340"/>
       </w:tblGrid>
       <w:tr>
         <w:trPr>
@@ -2150,7 +1953,7 @@
         </w:trPr>
         <w:tc>
           <w:tcPr>
-            <w:tcW w:type="dxa" w:w="1450"/>
+            <w:tcW w:type="dxa" w:w="2340"/>
             <w:vAlign w:val="center"/>
             <w:shd w:fill="1F4E79"/>
             <w:tcMar>
@@ -2170,7 +1973,7 @@
                 <w:rFonts w:ascii="Calibri" w:hAnsi="Calibri"/>
                 <w:b/>
                 <w:color w:val="FFFFFF"/>
-                <w:sz w:val="15"/>
+                <w:sz w:val="18"/>
               </w:rPr>
               <w:t>Envelope</w:t>
             </w:r>
@@ -2178,7 +1981,7 @@
         </w:tc>
         <w:tc>
           <w:tcPr>
-            <w:tcW w:type="dxa" w:w="1750"/>
+            <w:tcW w:type="dxa" w:w="2340"/>
             <w:vAlign w:val="center"/>
             <w:shd w:fill="1F4E79"/>
             <w:tcMar>
@@ -2198,15 +2001,15 @@
                 <w:rFonts w:ascii="Calibri" w:hAnsi="Calibri"/>
                 <w:b/>
                 <w:color w:val="FFFFFF"/>
-                <w:sz w:val="15"/>
+                <w:sz w:val="18"/>
               </w:rPr>
-              <w:t>Grid rate</w:t>
+              <w:t>Grid, use, and service half-width</w:t>
             </w:r>
           </w:p>
         </w:tc>
         <w:tc>
           <w:tcPr>
-            <w:tcW w:type="dxa" w:w="1650"/>
+            <w:tcW w:type="dxa" w:w="2340"/>
             <w:vAlign w:val="center"/>
             <w:shd w:fill="1F4E79"/>
             <w:tcMar>
@@ -2226,15 +2029,15 @@
                 <w:rFonts w:ascii="Calibri" w:hAnsi="Calibri"/>
                 <w:b/>
                 <w:color w:val="FFFFFF"/>
-                <w:sz w:val="15"/>
+                <w:sz w:val="18"/>
               </w:rPr>
-              <w:t>Use phase</w:t>
+              <w:t>Embodied half-width</w:t>
             </w:r>
           </w:p>
         </w:tc>
         <w:tc>
           <w:tcPr>
-            <w:tcW w:type="dxa" w:w="1650"/>
+            <w:tcW w:type="dxa" w:w="2340"/>
             <w:vAlign w:val="center"/>
             <w:shd w:fill="1F4E79"/>
             <w:tcMar>
@@ -2254,65 +2057,9 @@
                 <w:rFonts w:ascii="Calibri" w:hAnsi="Calibri"/>
                 <w:b/>
                 <w:color w:val="FFFFFF"/>
-                <w:sz w:val="15"/>
+                <w:sz w:val="18"/>
               </w:rPr>
-              <w:t>Embodied</w:t>
-            </w:r>
-          </w:p>
-        </w:tc>
-        <w:tc>
-          <w:tcPr>
-            <w:tcW w:type="dxa" w:w="1850"/>
-            <w:vAlign w:val="center"/>
-            <w:shd w:fill="1F4E79"/>
-            <w:tcMar>
-              <w:top w:w="80" w:type="dxa"/>
-              <w:start w:w="120" w:type="dxa"/>
-              <w:bottom w:w="80" w:type="dxa"/>
-              <w:end w:w="120" w:type="dxa"/>
-            </w:tcMar>
-          </w:tcPr>
-          <w:p>
-            <w:pPr>
-              <w:spacing w:after="0" w:line="240" w:lineRule="auto"/>
-              <w:jc w:val="left"/>
-            </w:pPr>
-            <w:r>
-              <w:rPr>
-                <w:rFonts w:ascii="Calibri" w:hAnsi="Calibri"/>
-                <w:b/>
-                <w:color w:val="FFFFFF"/>
-                <w:sz w:val="15"/>
-              </w:rPr>
-              <w:t>Service equivalence</w:t>
-            </w:r>
-          </w:p>
-        </w:tc>
-        <w:tc>
-          <w:tcPr>
-            <w:tcW w:type="dxa" w:w="1010"/>
-            <w:vAlign w:val="center"/>
-            <w:shd w:fill="1F4E79"/>
-            <w:tcMar>
-              <w:top w:w="80" w:type="dxa"/>
-              <w:start w:w="120" w:type="dxa"/>
-              <w:bottom w:w="80" w:type="dxa"/>
-              <w:end w:w="120" w:type="dxa"/>
-            </w:tcMar>
-          </w:tcPr>
-          <w:p>
-            <w:pPr>
-              <w:spacing w:after="0" w:line="240" w:lineRule="auto"/>
-              <w:jc w:val="left"/>
-            </w:pPr>
-            <w:r>
-              <w:rPr>
-                <w:rFonts w:ascii="Calibri" w:hAnsi="Calibri"/>
-                <w:b/>
-                <w:color w:val="FFFFFF"/>
-                <w:sz w:val="15"/>
-              </w:rPr>
-              <w:t>Interpretation</w:t>
+              <w:t>Purpose</w:t>
             </w:r>
           </w:p>
         </w:tc>
@@ -2323,7 +2070,7 @@
         </w:trPr>
         <w:tc>
           <w:tcPr>
-            <w:tcW w:type="dxa" w:w="1450"/>
+            <w:tcW w:type="dxa" w:w="2340"/>
             <w:vAlign w:val="center"/>
             <w:tcMar>
               <w:top w:w="80" w:type="dxa"/>
@@ -2340,7 +2087,7 @@
             <w:r>
               <w:rPr>
                 <w:rFonts w:ascii="Calibri" w:hAnsi="Calibri"/>
-                <w:sz w:val="15"/>
+                <w:sz w:val="18"/>
               </w:rPr>
               <w:t>Narrow</w:t>
             </w:r>
@@ -2348,7 +2095,7 @@
         </w:tc>
         <w:tc>
           <w:tcPr>
-            <w:tcW w:type="dxa" w:w="1750"/>
+            <w:tcW w:type="dxa" w:w="2340"/>
             <w:vAlign w:val="center"/>
             <w:tcMar>
               <w:top w:w="80" w:type="dxa"/>
@@ -2365,7 +2112,7 @@
             <w:r>
               <w:rPr>
                 <w:rFonts w:ascii="Calibri" w:hAnsi="Calibri"/>
-                <w:sz w:val="15"/>
+                <w:sz w:val="18"/>
               </w:rPr>
               <w:t>±2%</w:t>
             </w:r>
@@ -2373,7 +2120,7 @@
         </w:tc>
         <w:tc>
           <w:tcPr>
-            <w:tcW w:type="dxa" w:w="1650"/>
+            <w:tcW w:type="dxa" w:w="2340"/>
             <w:vAlign w:val="center"/>
             <w:tcMar>
               <w:top w:w="80" w:type="dxa"/>
@@ -2390,15 +2137,15 @@
             <w:r>
               <w:rPr>
                 <w:rFonts w:ascii="Calibri" w:hAnsi="Calibri"/>
-                <w:sz w:val="15"/>
+                <w:sz w:val="18"/>
               </w:rPr>
-              <w:t>±2%</w:t>
+              <w:t>±20%</w:t>
             </w:r>
           </w:p>
         </w:tc>
         <w:tc>
           <w:tcPr>
-            <w:tcW w:type="dxa" w:w="1650"/>
+            <w:tcW w:type="dxa" w:w="2340"/>
             <w:vAlign w:val="center"/>
             <w:tcMar>
               <w:top w:w="80" w:type="dxa"/>
@@ -2415,15 +2162,20 @@
             <w:r>
               <w:rPr>
                 <w:rFonts w:ascii="Calibri" w:hAnsi="Calibri"/>
-                <w:sz w:val="15"/>
+                <w:sz w:val="18"/>
               </w:rPr>
-              <w:t>±20%</w:t>
+              <w:t>Numerical stability near released values</w:t>
             </w:r>
           </w:p>
         </w:tc>
+      </w:tr>
+      <w:tr>
+        <w:trPr>
+          <w:cantSplit w:val="true"/>
+        </w:trPr>
         <w:tc>
           <w:tcPr>
-            <w:tcW w:type="dxa" w:w="1850"/>
+            <w:tcW w:type="dxa" w:w="2340"/>
             <w:vAlign w:val="center"/>
             <w:tcMar>
               <w:top w:w="80" w:type="dxa"/>
@@ -2440,15 +2192,15 @@
             <w:r>
               <w:rPr>
                 <w:rFonts w:ascii="Calibri" w:hAnsi="Calibri"/>
-                <w:sz w:val="15"/>
+                <w:sz w:val="18"/>
               </w:rPr>
-              <w:t>±2%</w:t>
+              <w:t>Screening</w:t>
             </w:r>
           </w:p>
         </w:tc>
         <w:tc>
           <w:tcPr>
-            <w:tcW w:type="dxa" w:w="1010"/>
+            <w:tcW w:type="dxa" w:w="2340"/>
             <w:vAlign w:val="center"/>
             <w:tcMar>
               <w:top w:w="80" w:type="dxa"/>
@@ -2465,20 +2217,15 @@
             <w:r>
               <w:rPr>
                 <w:rFonts w:ascii="Calibri" w:hAnsi="Calibri"/>
-                <w:sz w:val="15"/>
+                <w:sz w:val="18"/>
               </w:rPr>
-              <w:t>Numerical stability near released values</w:t>
+              <w:t>±5%</w:t>
             </w:r>
           </w:p>
         </w:tc>
-      </w:tr>
-      <w:tr>
-        <w:trPr>
-          <w:cantSplit w:val="true"/>
-        </w:trPr>
         <w:tc>
           <w:tcPr>
-            <w:tcW w:type="dxa" w:w="1450"/>
+            <w:tcW w:type="dxa" w:w="2340"/>
             <w:vAlign w:val="center"/>
             <w:tcMar>
               <w:top w:w="80" w:type="dxa"/>
@@ -2495,15 +2242,15 @@
             <w:r>
               <w:rPr>
                 <w:rFonts w:ascii="Calibri" w:hAnsi="Calibri"/>
-                <w:sz w:val="15"/>
+                <w:sz w:val="18"/>
               </w:rPr>
-              <w:t>Screening</w:t>
+              <w:t>±50%</w:t>
             </w:r>
           </w:p>
         </w:tc>
         <w:tc>
           <w:tcPr>
-            <w:tcW w:type="dxa" w:w="1750"/>
+            <w:tcW w:type="dxa" w:w="2340"/>
             <w:vAlign w:val="center"/>
             <w:tcMar>
               <w:top w:w="80" w:type="dxa"/>
@@ -2520,15 +2267,20 @@
             <w:r>
               <w:rPr>
                 <w:rFonts w:ascii="Calibri" w:hAnsi="Calibri"/>
-                <w:sz w:val="15"/>
+                <w:sz w:val="18"/>
               </w:rPr>
-              <w:t>±5%</w:t>
+              <w:t>Intermediate declared stress; not a fitted range</w:t>
             </w:r>
           </w:p>
         </w:tc>
+      </w:tr>
+      <w:tr>
+        <w:trPr>
+          <w:cantSplit w:val="true"/>
+        </w:trPr>
         <w:tc>
           <w:tcPr>
-            <w:tcW w:type="dxa" w:w="1650"/>
+            <w:tcW w:type="dxa" w:w="2340"/>
             <w:vAlign w:val="center"/>
             <w:tcMar>
               <w:top w:w="80" w:type="dxa"/>
@@ -2545,15 +2297,15 @@
             <w:r>
               <w:rPr>
                 <w:rFonts w:ascii="Calibri" w:hAnsi="Calibri"/>
-                <w:sz w:val="15"/>
+                <w:sz w:val="18"/>
               </w:rPr>
-              <w:t>±5%</w:t>
+              <w:t>Wide</w:t>
             </w:r>
           </w:p>
         </w:tc>
         <w:tc>
           <w:tcPr>
-            <w:tcW w:type="dxa" w:w="1650"/>
+            <w:tcW w:type="dxa" w:w="2340"/>
             <w:vAlign w:val="center"/>
             <w:tcMar>
               <w:top w:w="80" w:type="dxa"/>
@@ -2570,15 +2322,15 @@
             <w:r>
               <w:rPr>
                 <w:rFonts w:ascii="Calibri" w:hAnsi="Calibri"/>
-                <w:sz w:val="15"/>
+                <w:sz w:val="18"/>
               </w:rPr>
-              <w:t>±50%</w:t>
+              <w:t>±10%</w:t>
             </w:r>
           </w:p>
         </w:tc>
         <w:tc>
           <w:tcPr>
-            <w:tcW w:type="dxa" w:w="1850"/>
+            <w:tcW w:type="dxa" w:w="2340"/>
             <w:vAlign w:val="center"/>
             <w:tcMar>
               <w:top w:w="80" w:type="dxa"/>
@@ -2595,15 +2347,15 @@
             <w:r>
               <w:rPr>
                 <w:rFonts w:ascii="Calibri" w:hAnsi="Calibri"/>
-                <w:sz w:val="15"/>
+                <w:sz w:val="18"/>
               </w:rPr>
-              <w:t>±5%</w:t>
+              <w:t>±100%</w:t>
             </w:r>
           </w:p>
         </w:tc>
         <w:tc>
           <w:tcPr>
-            <w:tcW w:type="dxa" w:w="1010"/>
+            <w:tcW w:type="dxa" w:w="2340"/>
             <w:vAlign w:val="center"/>
             <w:tcMar>
               <w:top w:w="80" w:type="dxa"/>
@@ -2620,162 +2372,7 @@
             <w:r>
               <w:rPr>
                 <w:rFonts w:ascii="Calibri" w:hAnsi="Calibri"/>
-                <w:sz w:val="15"/>
-              </w:rPr>
-              <w:t>Plausible engineering/model stress without fitted distributions</w:t>
-            </w:r>
-          </w:p>
-        </w:tc>
-      </w:tr>
-      <w:tr>
-        <w:trPr>
-          <w:cantSplit w:val="true"/>
-        </w:trPr>
-        <w:tc>
-          <w:tcPr>
-            <w:tcW w:type="dxa" w:w="1450"/>
-            <w:vAlign w:val="center"/>
-            <w:tcMar>
-              <w:top w:w="80" w:type="dxa"/>
-              <w:start w:w="120" w:type="dxa"/>
-              <w:bottom w:w="80" w:type="dxa"/>
-              <w:end w:w="120" w:type="dxa"/>
-            </w:tcMar>
-          </w:tcPr>
-          <w:p>
-            <w:pPr>
-              <w:spacing w:after="0" w:line="240" w:lineRule="auto"/>
-              <w:jc w:val="left"/>
-            </w:pPr>
-            <w:r>
-              <w:rPr>
-                <w:rFonts w:ascii="Calibri" w:hAnsi="Calibri"/>
-                <w:sz w:val="15"/>
-              </w:rPr>
-              <w:t>Wide</w:t>
-            </w:r>
-          </w:p>
-        </w:tc>
-        <w:tc>
-          <w:tcPr>
-            <w:tcW w:type="dxa" w:w="1750"/>
-            <w:vAlign w:val="center"/>
-            <w:tcMar>
-              <w:top w:w="80" w:type="dxa"/>
-              <w:start w:w="120" w:type="dxa"/>
-              <w:bottom w:w="80" w:type="dxa"/>
-              <w:end w:w="120" w:type="dxa"/>
-            </w:tcMar>
-          </w:tcPr>
-          <w:p>
-            <w:pPr>
-              <w:spacing w:after="0" w:line="240" w:lineRule="auto"/>
-              <w:jc w:val="left"/>
-            </w:pPr>
-            <w:r>
-              <w:rPr>
-                <w:rFonts w:ascii="Calibri" w:hAnsi="Calibri"/>
-                <w:sz w:val="15"/>
-              </w:rPr>
-              <w:t>±10%</w:t>
-            </w:r>
-          </w:p>
-        </w:tc>
-        <w:tc>
-          <w:tcPr>
-            <w:tcW w:type="dxa" w:w="1650"/>
-            <w:vAlign w:val="center"/>
-            <w:tcMar>
-              <w:top w:w="80" w:type="dxa"/>
-              <w:start w:w="120" w:type="dxa"/>
-              <w:bottom w:w="80" w:type="dxa"/>
-              <w:end w:w="120" w:type="dxa"/>
-            </w:tcMar>
-          </w:tcPr>
-          <w:p>
-            <w:pPr>
-              <w:spacing w:after="0" w:line="240" w:lineRule="auto"/>
-              <w:jc w:val="left"/>
-            </w:pPr>
-            <w:r>
-              <w:rPr>
-                <w:rFonts w:ascii="Calibri" w:hAnsi="Calibri"/>
-                <w:sz w:val="15"/>
-              </w:rPr>
-              <w:t>±10%</w:t>
-            </w:r>
-          </w:p>
-        </w:tc>
-        <w:tc>
-          <w:tcPr>
-            <w:tcW w:type="dxa" w:w="1650"/>
-            <w:vAlign w:val="center"/>
-            <w:tcMar>
-              <w:top w:w="80" w:type="dxa"/>
-              <w:start w:w="120" w:type="dxa"/>
-              <w:bottom w:w="80" w:type="dxa"/>
-              <w:end w:w="120" w:type="dxa"/>
-            </w:tcMar>
-          </w:tcPr>
-          <w:p>
-            <w:pPr>
-              <w:spacing w:after="0" w:line="240" w:lineRule="auto"/>
-              <w:jc w:val="left"/>
-            </w:pPr>
-            <w:r>
-              <w:rPr>
-                <w:rFonts w:ascii="Calibri" w:hAnsi="Calibri"/>
-                <w:sz w:val="15"/>
-              </w:rPr>
-              <w:t>±100%</w:t>
-            </w:r>
-          </w:p>
-        </w:tc>
-        <w:tc>
-          <w:tcPr>
-            <w:tcW w:type="dxa" w:w="1850"/>
-            <w:vAlign w:val="center"/>
-            <w:tcMar>
-              <w:top w:w="80" w:type="dxa"/>
-              <w:start w:w="120" w:type="dxa"/>
-              <w:bottom w:w="80" w:type="dxa"/>
-              <w:end w:w="120" w:type="dxa"/>
-            </w:tcMar>
-          </w:tcPr>
-          <w:p>
-            <w:pPr>
-              <w:spacing w:after="0" w:line="240" w:lineRule="auto"/>
-              <w:jc w:val="left"/>
-            </w:pPr>
-            <w:r>
-              <w:rPr>
-                <w:rFonts w:ascii="Calibri" w:hAnsi="Calibri"/>
-                <w:sz w:val="15"/>
-              </w:rPr>
-              <w:t>±10%</w:t>
-            </w:r>
-          </w:p>
-        </w:tc>
-        <w:tc>
-          <w:tcPr>
-            <w:tcW w:type="dxa" w:w="1010"/>
-            <w:vAlign w:val="center"/>
-            <w:tcMar>
-              <w:top w:w="80" w:type="dxa"/>
-              <w:start w:w="120" w:type="dxa"/>
-              <w:bottom w:w="80" w:type="dxa"/>
-              <w:end w:w="120" w:type="dxa"/>
-            </w:tcMar>
-          </w:tcPr>
-          <w:p>
-            <w:pPr>
-              <w:spacing w:after="0" w:line="240" w:lineRule="auto"/>
-              <w:jc w:val="left"/>
-            </w:pPr>
-            <w:r>
-              <w:rPr>
-                <w:rFonts w:ascii="Calibri" w:hAnsi="Calibri"/>
-                <w:sz w:val="15"/>
+                <w:sz w:val="18"/>
               </w:rPr>
               <w:t>Deliberately severe robustness test</w:t>
             </w:r>
@@ -2794,7 +2391,16 @@
           <w:rFonts w:ascii="Calibri" w:hAnsi="Calibri"/>
           <w:sz w:val="21"/>
         </w:rPr>
-        <w:t>The triangular mode was 1.0 and the random seed was 20250730. The resulting rank frequencies describe the declared perturbation design. They are not posterior probabilities, confidence levels, or a substitute for empirical uncertainty distributions and correlations.</w:t>
+        <w:t>The triangular mode was 1.0 and the base seed was 20250730. A stable hash of the context, envelope, active block, and dependence case generated a separate seed for every design, so output does not depend on loop order. We then repeated the stress with grid only, use phase only, embodied contribution only, service equivalence only, and all four blocks active. Technology-specific multipliers were coupled with a Gaussian copula at declared latent correlations of 0, 0.5, and 1 while retaining the same triangular marginals. These correlations are not measurements. Rank frequencies describe the declared designs; they are not posterior probabilities, confidence levels, or a substitute for empirical uncertainty distributions.</w:t>
+      </w:r>
+    </w:p>
+    <w:p>
+      <w:r>
+        <w:rPr>
+          <w:rFonts w:ascii="Calibri" w:hAnsi="Calibri"/>
+          <w:sz w:val="21"/>
+        </w:rPr>
+        <w:t>Numerical convergence was checked with nested 5,000-, 20,000-, and 80,000-draw runs using the same scenario seeds. The binomial Monte Carlo standard error is reported only as integration precision within each declared design. It is not a confidence interval for cooling performance or a remedy for unsupported input distributions.</w:t>
       </w:r>
     </w:p>
     <w:p>
@@ -2929,7 +2535,7 @@
           <w:rFonts w:ascii="Calibri" w:hAnsi="Calibri"/>
           <w:sz w:val="21"/>
         </w:rPr>
-        <w:t>The audit checks source identity, duplicate identifiers, physical values, functional unit, boundary, uncertainty disclosure, evidence class, and intent to make a comparative assertion. Synthetic results cannot pass a public-claim gate. A public comparison additionally requires consistent boundaries, quantified uncertainty, and critical review consistent with ISO 14040 and 14044 [42]. Automated checks assist but do not constitute ISO conformity or independent review.</w:t>
+        <w:t>The audit checks source identity, duplicate identifiers, physical values, functional unit, boundary, uncertainty disclosure, evidence class, and intent to make a comparative assertion. Synthetic results cannot pass a public-claim gate. A public comparison additionally requires consistent boundaries, quantified uncertainty, and critical review consistent with ISO 14040, ISO 14044, and ISO 14071 [42,43]. Automated checks assist but do not constitute ISO conformity or independent review.</w:t>
       </w:r>
     </w:p>
     <w:p>
@@ -2954,7 +2560,7 @@
           <w:rFonts w:ascii="Calibri" w:hAnsi="Calibri"/>
           <w:sz w:val="21"/>
         </w:rPr>
-        <w:t>All 24 released combinations of architecture, electricity scenario, and impact metric reconciled to the sum of the published contributions at workbook precision. Under the released U.S. grid case, two-phase immersion reduced GHG 20.66%, primary energy 20.00%, and blue water 46.78% relative to air cooling. The arithmetic result establishes that the public normalized table is internally reusable. It does not establish that the original inventories, quantities, or performance assumptions are independently valid.</w:t>
+        <w:t>All 24 released combinations of architecture, electricity scenario, and impact metric reconciled to the sum of the published contributions at workbook precision. Under the released U.S. grid case, two-phase immersion reduced GHG 20.66%, primary energy 20.00%, and blue water 46.78% relative to air cooling. The arithmetic result shows that the public normalized table is internally reusable. It does not verify that the original inventories, quantities, or performance assumptions are independently valid.</w:t>
       </w:r>
     </w:p>
     <w:p>
@@ -3130,7 +2736,7 @@
           <w:rFonts w:ascii="Calibri" w:hAnsi="Calibri"/>
           <w:sz w:val="21"/>
         </w:rPr>
-        <w:t>The boundary allowance revealed a sharper limitation. The Vermont cold-plate/single-phase result persisted with 25 and 50 kg CO2e/MWh added to the direct generation rate, but disappeared at 75 and 100 kg CO2e/MWh. Two-phase remained first in 51/51 states across all five allowance levels. This does not estimate the missing upstream inventory. It shows that the headline “one state below the crossover” is conditional on treating methodologically different electricity results as a common numerical index.</w:t>
+        <w:t>The boundary allowance revealed a sharper limitation. The Vermont cold-plate/single-phase result persisted with 25 and 50 kg CO2e/MWh added to the direct generation rate, but disappeared at 75 and 100 kg CO2e/MWh. The analytical clearance was 96.704-23.695 = 73.009 kg CO2e/MWh; 75 kg CO2e/MWh is therefore only the first point in the declared 25-unit grid above the exact threshold, not an estimate of upstream emissions. Two-phase remained first in 51/51 states across all five allowance levels. This does not estimate the missing upstream inventory. It shows that the headline “one state below the crossover” is conditional on treating methodologically different electricity results as a common numerical index.</w:t>
       </w:r>
     </w:p>
     <w:p>
@@ -3138,7 +2744,7 @@
         <w:pStyle w:val="Heading2"/>
       </w:pPr>
       <w:r>
-        <w:t>3.4. Joint stress weakens a deterministic first rank</w:t>
+        <w:t>3.4. Foreground variation and dependence weaken a deterministic first rank</w:t>
       </w:r>
     </w:p>
     <w:p>
@@ -3147,7 +2753,7 @@
           <w:rFonts w:ascii="Calibri" w:hAnsi="Calibri"/>
           <w:sz w:val="21"/>
         </w:rPr>
-        <w:t>Figure 4 consolidates the extrapolation, boundary, joint-stress, and functional-unit diagnostics. Under the 2023 U.S. generation context, two-phase first-rank frequency was 99.33% in the narrow envelope, 75.97% in the screening envelope, and 56.16% in the wide envelope. Cold plate and single-phase gained 18.86% and 24.63%, respectively, in the wide envelope; air cooling gained 0.35%.</w:t>
+        <w:t>Figure 4 consolidates the extrapolation, boundary, zero-correlation all-block stress, and functional-unit diagnostics. Under the 2023 U.S. generation context, two-phase first-rank frequency was 99.19% in the narrow envelope, 76.17% in the screening envelope, and 55.05% in the wide envelope. Cold plate, single-phase, and air cooling had wide-envelope first-rank frequencies of 19.15%, 25.47%, and 0.34%, respectively.</w:t>
       </w:r>
     </w:p>
     <w:p>
@@ -3156,7 +2762,7 @@
           <w:rFonts w:ascii="Calibri" w:hAnsi="Calibri"/>
           <w:sz w:val="21"/>
         </w:rPr>
-        <w:t>Sensitivity was greater at the lowest-carbon state. Two-phase first-rank frequency was 63.19%, 42.55%, and 33.90% in the narrow, screening, and wide envelopes. Even a narrow perturbation matters when use-phase burdens contract and the alternatives are close. These values are not technology-success probabilities. They quantify how frequently a ranking survives a specified assumption design.</w:t>
+        <w:t>Sensitivity was greater at the lowest-carbon state. Two-phase first-rank frequency was 63.03%, 42.72%, and 32.43% in the narrow, screening, and wide envelopes. Even a narrow perturbation matters when use-phase burdens contract and the alternatives are close. These values are not technology-success probabilities. They quantify how frequently a ranking survives a specified assumption design.</w:t>
       </w:r>
     </w:p>
     <w:p>
@@ -3222,11 +2828,12 @@
       </w:r>
     </w:p>
     <w:p>
-      <w:pPr>
-        <w:pStyle w:val="Heading2"/>
-      </w:pPr>
-      <w:r>
-        <w:t>3.5. Server and construction data reveal leverage but not architecture totals</w:t>
+      <w:r>
+        <w:rPr>
+          <w:rFonts w:ascii="Calibri" w:hAnsi="Calibri"/>
+          <w:sz w:val="21"/>
+        </w:rPr>
+        <w:t>The block-and-dependence analysis explains why those frequencies change (Figure 5). Grid-rate variation alone never displaced two-phase in any tested U.S. design. In the screening envelope with independent technology-specific errors, two-phase retained first rank in 98.29% of use-only, 86.75% of embodied-only, and 96.00% of service-only draws; with all blocks active the frequency was 76.17%. The wide-envelope counterparts were 79.52%, 63.36%, 73.90%, and 55.05%. Embodied variation was therefore the largest one-block source of rank loss under the declared marginal widths.</w:t>
       </w:r>
     </w:p>
     <w:p>
@@ -3235,7 +2842,7 @@
           <w:rFonts w:ascii="Calibri" w:hAnsi="Calibri"/>
           <w:sz w:val="21"/>
         </w:rPr>
-        <w:t>The 48 Boavizta server records spanned 465-2,503 kg CO2e/server for manufacturing, a 5.38-fold range. Annualized values spanned 116-626 kg CO2e/server-year. Commonly scaling the released server-related contributions across the empirical 0.38-2.06-fold annualized envelope did not change the deterministic two-phase first rank. That result is a structural stress only: it does not model architecture-specific server count, configuration, throughput, or lifetime.</w:t>
+        <w:t>Dependence was equally important. In the wide all-block design, the U.S. two-phase first-rank frequency increased from 55.05% at zero latent correlation to 64.50% at 0.5 and 100% when technology-specific errors were fully common-mode. The last case does not prove robustness; it shows that common errors preserve relative ordering while independent architecture errors erode it. A rank frequency without a defensible correlation model is therefore under-specified even when every marginal range is disclosed.</w:t>
       </w:r>
     </w:p>
     <w:p>
@@ -3244,33 +2851,7 @@
           <w:rFonts w:ascii="Calibri" w:hAnsi="Calibri"/>
           <w:sz w:val="21"/>
         </w:rPr>
-        <w:t>The selected ÖKOBAUDAT high-scrap electric-arc-furnace galvanized steel record had 59.9% lower A1-A3 GHG, 47.9% lower nonrenewable primary energy, and 52.0% lower freshwater use per kilogram than the selected low-scrap blast-furnace-route record. The selected CEM III cement record had 49.8% lower GHG, 12.1% lower nonrenewable primary energy, and 23.5% lower freshwater use than CEM II/A. These are procurement levers, not data-center reductions. Their facility effect remains unknown until each architecture has a reviewed bill of quantities.</w:t>
-      </w:r>
-    </w:p>
-    <w:p>
-      <w:pPr>
-        <w:pStyle w:val="Heading2"/>
-      </w:pPr>
-      <w:r>
-        <w:t>3.6. Data-priority rank is useful but not invariant</w:t>
-      </w:r>
-    </w:p>
-    <w:p>
-      <w:r>
-        <w:rPr>
-          <w:rFonts w:ascii="Calibri" w:hAnsi="Calibri"/>
-          <w:sz w:val="21"/>
-        </w:rPr>
-        <w:t>Under the base contribution-times-weakness index, use phase was the highest priority, followed by storage, networking, and compute-server evidence. Across the nine alternative exponent combinations, use phase ranked first in eight and in the top three in eight. Networking ranked first once; storage was in the top three in all nine; compute was in the top three in four. The rank of use phase ranged from first to fourth.</w:t>
-      </w:r>
-    </w:p>
-    <w:p>
-      <w:r>
-        <w:rPr>
-          <w:rFonts w:ascii="Calibri" w:hAnsi="Calibri"/>
-          <w:sz w:val="21"/>
-        </w:rPr>
-        <w:t>This sensitivity changes the interpretation of the pedigree result. It supports a near-term measurement sequence—hourly IT and cooling electricity, then server inventories and functional performance—but not a unique value of information. A formal acquisition decision requires empirical parameter distributions, correlations, measurement cost, and the loss associated with a wrong architecture choice [30].</w:t>
+        <w:t>The nested convergence check separated Monte Carlo noise from model-form sensitivity. For the three U.S. envelopes, the 20,000-draw frequencies differed from the 80,000-draw results by 0.06, 0.06, and 0.11 percentage points; the 80,000-draw numerical standard errors were 0.031, 0.151, and 0.176 percentage points. Across both locations and all envelopes, the largest 20,000-to-80,000 difference was 0.709 percentage points, for the low-carbon wide case. These differences are small relative to the 44.14-percentage-point change between the U.S. narrow and wide designs and the 44.95-percentage-point change between zero-correlation and common-mode U.S. wide designs. Sampling noise therefore does not explain the central sensitivity result.</w:t>
       </w:r>
     </w:p>
     <w:p>
@@ -3282,8 +2863,8 @@
       <w:r>
         <w:drawing>
           <wp:inline xmlns:a="http://schemas.openxmlformats.org/drawingml/2006/main" xmlns:pic="http://schemas.openxmlformats.org/drawingml/2006/picture">
-            <wp:extent cx="5897880" cy="3371621"/>
-            <wp:docPr id="5" name="Picture 5" descr="Figure 5. Contribution-weighted pedigree diagnostic from the released Microsoft/WSP model. Use phase leads under the base index, but rank robustness is evaluated separately because the index is heuristic." title="OpenDC-LCA Figure 5"/>
+            <wp:extent cx="5897880" cy="3538728"/>
+            <wp:docPr id="5" name="Picture 5" descr="Figure 5. Assumption-block and dependence diagnostic for the 2023 U.S. generation context. Cells report two-phase first-rank frequency under declared screening and wide triangular marginals. Grid-only variation is shared. Technology-specific use, embodied, and service multipliers use a Gaussian copula with declared latent correlation. These are sensitivity designs, not empirical probabilities." title="OpenDC-LCA Figure 5"/>
             <wp:cNvGraphicFramePr>
               <a:graphicFrameLocks noChangeAspect="1"/>
             </wp:cNvGraphicFramePr>
@@ -3291,7 +2872,7 @@
               <a:graphicData uri="http://schemas.openxmlformats.org/drawingml/2006/picture">
                 <pic:pic>
                   <pic:nvPicPr>
-                    <pic:cNvPr id="0" name="figure3_data_priority.png"/>
+                    <pic:cNvPr id="0" name="figure9_stress_structure.png"/>
                     <pic:cNvPicPr/>
                   </pic:nvPicPr>
                   <pic:blipFill>
@@ -3303,7 +2884,7 @@
                   <pic:spPr>
                     <a:xfrm>
                       <a:off x="0" y="0"/>
-                      <a:ext cx="5897880" cy="3371621"/>
+                      <a:ext cx="5897880" cy="3538728"/>
                     </a:xfrm>
                     <a:prstGeom prst="rect"/>
                   </pic:spPr>
@@ -3323,7 +2904,7 @@
           <w:rFonts w:ascii="Calibri" w:hAnsi="Calibri"/>
           <w:sz w:val="18"/>
         </w:rPr>
-        <w:t>Figure 5. Contribution-weighted pedigree diagnostic from the released Microsoft/WSP model. Use phase leads under the base index, but rank robustness is evaluated separately because the index is heuristic.</w:t>
+        <w:t>Figure 5. Assumption-block and dependence diagnostic for the 2023 U.S. generation context. Cells report two-phase first-rank frequency under declared screening and wide triangular marginals. Grid-only variation is shared. Technology-specific use, embodied, and service multipliers use a Gaussian copula with declared latent correlation. These are sensitivity designs, not empirical probabilities.</w:t>
       </w:r>
     </w:p>
     <w:p>
@@ -3331,7 +2912,7 @@
         <w:pStyle w:val="Heading2"/>
       </w:pPr>
       <w:r>
-        <w:t>3.7. Software consistency and practitioner outputs</w:t>
+        <w:t>3.5. Server and construction data reveal leverage but not architecture totals</w:t>
       </w:r>
     </w:p>
     <w:p>
@@ -3340,7 +2921,59 @@
           <w:rFonts w:ascii="Calibri" w:hAnsi="Calibri"/>
           <w:sz w:val="21"/>
         </w:rPr>
-        <w:t>The current test suite contains 46 passing tests covering calculation, interoperability, reliability, public-data parsing, practitioner workflow, research analysis, GUI/API parity, endpoint reproduction, eGRID harmonization, extrapolation counts, boundary stress, and functional-unit sensitivity. The package was also installed in a clean environment and run from template creation through report generation.</w:t>
+        <w:t>The 48 Boavizta server records spanned 465-2,503 kg CO2e/server for manufacturing, a 5.38-fold range. Annualized values spanned 116-626 kg CO2e/server-year. Commonly scaling the released server-related contributions across the empirical 0.38-2.06-fold annualized envelope did not change the deterministic two-phase first rank. That result is a structural stress only: it does not model architecture-specific server count, configuration, throughput, or lifetime.</w:t>
+      </w:r>
+    </w:p>
+    <w:p>
+      <w:r>
+        <w:rPr>
+          <w:rFonts w:ascii="Calibri" w:hAnsi="Calibri"/>
+          <w:sz w:val="21"/>
+        </w:rPr>
+        <w:t>The selected ÖKOBAUDAT high-scrap electric-arc-furnace galvanized steel record had 59.9% lower A1-A3 GHG, 47.9% lower nonrenewable primary energy, and 52.0% lower freshwater use per kilogram than the selected low-scrap blast-furnace-route record. The selected CEM III cement record had 49.8% lower GHG, 12.1% lower nonrenewable primary energy, and 23.5% lower freshwater use than CEM II/A. These are procurement levers, not data-center reductions. Their facility effect remains unknown until each architecture has a reviewed bill of quantities.</w:t>
+      </w:r>
+    </w:p>
+    <w:p>
+      <w:pPr>
+        <w:pStyle w:val="Heading2"/>
+      </w:pPr>
+      <w:r>
+        <w:t>3.6. Data-priority rank is useful but not invariant</w:t>
+      </w:r>
+    </w:p>
+    <w:p>
+      <w:r>
+        <w:rPr>
+          <w:rFonts w:ascii="Calibri" w:hAnsi="Calibri"/>
+          <w:sz w:val="21"/>
+        </w:rPr>
+        <w:t>Under the base contribution-times-weakness index, use phase was the highest priority, followed by storage, networking, and compute-server evidence. Across the nine alternative exponent combinations, use phase ranked first in eight and in the top three in eight. Networking ranked first once; storage was in the top three in all nine; compute was in the top three in four. The rank of use phase ranged from first to fourth.</w:t>
+      </w:r>
+    </w:p>
+    <w:p>
+      <w:r>
+        <w:rPr>
+          <w:rFonts w:ascii="Calibri" w:hAnsi="Calibri"/>
+          <w:sz w:val="21"/>
+        </w:rPr>
+        <w:t>This sensitivity changes the interpretation of the pedigree result. It supports a near-term measurement sequence—hourly IT and cooling electricity, then server inventories and functional performance—but not a unique value of information. A formal acquisition decision requires empirical parameter distributions, correlations, measurement cost, and the loss associated with a wrong architecture choice [30].</w:t>
+      </w:r>
+    </w:p>
+    <w:p>
+      <w:pPr>
+        <w:pStyle w:val="Heading2"/>
+      </w:pPr>
+      <w:r>
+        <w:t>3.7. Software consistency and practitioner outputs</w:t>
+      </w:r>
+    </w:p>
+    <w:p>
+      <w:r>
+        <w:rPr>
+          <w:rFonts w:ascii="Calibri" w:hAnsi="Calibri"/>
+          <w:sz w:val="21"/>
+        </w:rPr>
+        <w:t>With the local evidence archive present, all 49 tests pass. They cover calculation, interoperability, reliability, public-data parsing, practitioner workflow, research analysis, GUI/API parity, endpoint reproduction, eGRID harmonization, extrapolation counts, boundary stress, and functional-unit sensitivity, stress-design determinism, and provenance-integrity checks. In a clone-only clean environment, 41 tests pass and 8 paper-reconstruction tests are skipped explicitly because they require locally held provider files; no dummy data replace those files. The clean install also completed example export, scenario analysis, and practitioner-report generation.</w:t>
       </w:r>
     </w:p>
     <w:p>
@@ -3409,7 +3042,7 @@
           <w:rFonts w:ascii="Calibri" w:hAnsi="Calibri"/>
           <w:sz w:val="21"/>
         </w:rPr>
-        <w:t>The boundary mismatch is qualitatively different. eGRID total-output rates omit upstream fuel supply, infrastructure, imports and transmission, while the GaBi anchors are lifecycle results. The two also use GWP100 and GTP100, respectively. No algebra can make them equivalent without a linked inventory and common LCIA method. The 75 kg CO2e/MWh stress is valuable precisely because it does not pretend to know the missing value: it shows that the local crossover claim is fragile to a plausible scale of unrepresented lifecycle burden, whereas the deterministic two-phase first rank is less sensitive within this single dimension.</w:t>
+        <w:t>The boundary mismatch is qualitatively different. eGRID total-output rates omit upstream fuel supply, infrastructure, imports and transmission, while the GaBi anchors are lifecycle results. The two also use GWP100 and GTP100, respectively. No algebra can make them equivalent without a linked inventory and common LCIA method. The exact 73.009 kg CO2e/MWh clearance and the declared 25-unit stress grid are useful because they do not pretend to know the missing value. They show how large an additive boundary term must be to remove the local crossover while leaving its actual physical magnitude unresolved. The deterministic two-phase first rank is less sensitive within this single dimension.</w:t>
       </w:r>
     </w:p>
     <w:p>
@@ -3426,7 +3059,7 @@
         <w:pStyle w:val="Heading2"/>
       </w:pPr>
       <w:r>
-        <w:t>4.3. Joint uncertainty changes the epistemic status of the result</w:t>
+        <w:t>4.3. Dependence changes the epistemic status of the stress result</w:t>
       </w:r>
     </w:p>
     <w:p>
@@ -3435,7 +3068,7 @@
           <w:rFonts w:ascii="Calibri" w:hAnsi="Calibri"/>
           <w:sz w:val="21"/>
         </w:rPr>
-        <w:t>One-at-a-time break-even analysis is easy to interpret but can overstate robustness when inputs co-vary. The joint stress result does not provide probability because the envelopes are not fitted. It does establish an important negative finding: deterministic survival across 459 grid factors does not imply survival under interacting foreground and functional-unit assumptions. The grid panel explores one dimension repeatedly; it is not 459 replicates of the cooling technologies.</w:t>
+        <w:t>One-at-a-time break-even analysis is easy to interpret but can overstate robustness when inputs co-vary. The stress designs do not provide probability because neither the envelopes nor the copula correlations are fitted. They do yield two negative findings. First, deterministic survival across 459 grid factors does not imply survival under foreground and functional-unit changes; the grid panel explores one dimension repeatedly, not 459 replicates of the cooling technologies. Second, a first-rank frequency is not identified by its marginal ranges alone: the wide all-block value changed from 55.05% to 100% when only the dependence design changed from independent to common-mode.</w:t>
       </w:r>
     </w:p>
     <w:p>
@@ -3444,7 +3077,16 @@
           <w:rFonts w:ascii="Calibri" w:hAnsi="Calibri"/>
           <w:sz w:val="21"/>
         </w:rPr>
-        <w:t>This distinction should guide future experiments. Measured distributions are needed for load-dependent fan, pump, coolant-distribution, and heat-rejection power; server throughput and power; fluid loss; component life; and architecture-specific quantities. Correlations matter: a higher coolant temperature may reduce compressor energy while changing chip leakage, performance, and reliability; higher density may reduce building burden per Vcore while increasing local pumping or repair complexity. Empirical joint distributions would convert the present stress frequency into a defensible probability of rank and enable expected-value-of-information analysis.</w:t>
+        <w:t>The block decomposition also changes the measurement priority. Under the declared U.S. screening and wide designs, embodied-only variation displaced two-phase more often than use-only, service-only, or grid-only variation. That result does not assign real-world variance to embodied inventories. It shows that architecture-specific quantities, server configurations, service lives, and material inventories deserve the same experimental attention as cooling electricity once operational burdens contract.</w:t>
+      </w:r>
+    </w:p>
+    <w:p>
+      <w:r>
+        <w:rPr>
+          <w:rFonts w:ascii="Calibri" w:hAnsi="Calibri"/>
+          <w:sz w:val="21"/>
+        </w:rPr>
+        <w:t>This distinction should guide future experiments. Measured distributions are needed for load-dependent fan, pump, coolant-distribution, and heat-rejection power; server throughput and power; fluid loss; component life; and architecture-specific quantities. Correlations matter: a higher coolant temperature may reduce compressor energy while changing chip leakage, performance, and reliability; higher density may reduce building burden per Vcore while increasing local pumping or repair complexity. Empirical joint distributions would convert the present stress frequency into a defensible probability of rank and support expected-value-of-information analysis.</w:t>
       </w:r>
     </w:p>
     <w:p>
@@ -3740,7 +3382,7 @@
           <w:rFonts w:ascii="Calibri" w:hAnsi="Calibri"/>
           <w:sz w:val="21"/>
         </w:rPr>
-        <w:t>The analysis remains secondary. It does not recreate proprietary background inventories, confidential bills of quantities, the full virtual-core model, or measured hyperscale operation. Equation (8) uses a numerical index across different electricity boundaries and climate metrics. The additive boundary allowance and triangular stress envelopes are diagnostics, not estimates. State total-output rates represent generation rather than consumption and omit imports, contracts, transmission, hourly dispatch, and marginal effects.</w:t>
+        <w:t>The analysis remains secondary. It does not recreate proprietary background inventories, confidential bills of quantities, the full virtual-core model, or measured hyperscale operation. Equation (8) uses a numerical index across different electricity boundaries and climate metrics. The additive boundary allowance, triangular marginals, and Gaussian-copula dependence cases are diagnostics, not estimates. The convergence check limits numerical sampling error within those designs; it does not reduce epistemic uncertainty in the ranges, dependence structure, or foreground model. State total-output rates represent generation rather than consumption and omit imports, contracts, transmission, hourly dispatch, and marginal effects.</w:t>
       </w:r>
     </w:p>
     <w:p>
@@ -3775,7 +3417,7 @@
           <w:rFonts w:ascii="Calibri" w:hAnsi="Calibri"/>
           <w:sz w:val="21"/>
         </w:rPr>
-        <w:t>OpenDC-LCA reframes data-center cooling LCA as an evidence-bounded decision problem. It reconciled 24 released Microsoft/WSP totals, reconstructed nine eGRID releases to a common AR5 GWP100 basis, and quantified extrapolation, electricity-boundary, functional-unit, and joint assumption sensitivity.</w:t>
+        <w:t>OpenDC-LCA treats data-center cooling LCA as an evidence-bounded decision problem. It reconciled 24 released Microsoft/WSP totals, reconstructed nine eGRID releases to a common AR5 GWP100 basis, and quantified extrapolation, electricity-boundary, functional-unit, assumption-block, and dependence sensitivity.</w:t>
       </w:r>
     </w:p>
     <w:p>
@@ -3784,7 +3426,7 @@
           <w:rFonts w:ascii="Calibri" w:hAnsi="Calibri"/>
           <w:sz w:val="21"/>
         </w:rPr>
-        <w:t>Three findings are consequential. First, the U.S. generation-rate decline of 32.46% from 2012 to 2023 is robust to historical eGRID GWP changes; the largest common-basis correction was only 0.248 kg CO2e/MWh. Second, local cooling rankings are less robust: 29.85% of state-year rates fall outside the released anchors, and the sole 2023 cold-plate/single-phase reversal vanishes under a 75 kg CO2e/MWh boundary allowance. Third, deterministic first rank is not uncertainty robustness. Two-phase ranked first in all 459 unperturbed screens, but its U.S. first-rank frequency fell from 99.33% to 56.16% across declared narrow-to-wide stress envelopes, and a median 5.50% adverse useful-computation correction erased first rank.</w:t>
+        <w:t>Four findings follow. First, the U.S. generation-rate decline of 32.46% from 2012 to 2023 is robust to historical eGRID GWP changes; the largest common-basis correction was only 0.248 kg CO2e/MWh. Second, local cooling rankings are less robust: 29.85% of state-year rates fall outside the released anchors, and the sole 2023 cold-plate/single-phase reversal has an exact 73.009 kg CO2e/MWh additive boundary clearance. Third, deterministic first rank is not stress robustness. Two-phase ranked first in all 459 unperturbed screens, but its U.S. first-rank frequency fell from 99.19% to 55.05% across zero-correlation all-block narrow-to-wide designs, and a median 5.50% adverse useful-computation correction erased first rank. Fourth, the stress frequency itself depends on structure: in the wide U.S. all-block design it ranged from 55.05% under independent architecture errors to 100% under fully common-mode errors, while grid-only variation never displaced two-phase.</w:t>
       </w:r>
     </w:p>
     <w:p>
@@ -3810,66 +3452,7 @@
           <w:rFonts w:ascii="Calibri" w:hAnsi="Calibri"/>
           <w:sz w:val="21"/>
         </w:rPr>
-        <w:t>OpenDC-LCA version 1.1.0 source code, examples, documentation, tests, derived tables, and manuscript figures are available at https://github.com/UARK-NED3/OpenDC-LCA. Installable wheel and source archives are available from https://github.com/UARK-NED3/OpenDC-LCA/releases/tag/v1.1.0. A DOI-bearing, immutable archive containing the accepted code commit, derived tables, figures, configuration, and reproducibility manifest will be minted before submission. Provider-native raw files remain local when redistribution permission has not been established. The Microsoft/Nature archive is available from Zenodo [15]; eGRID and NOAA data are available from their public portals [34,35,38].</w:t>
-      </w:r>
-    </w:p>
-    <w:p>
-      <w:pPr>
-        <w:pStyle w:val="Heading1"/>
-      </w:pPr>
-      <w:r>
-        <w:t>Author contributions</w:t>
-      </w:r>
-    </w:p>
-    <w:p>
-      <w:r>
-        <w:rPr>
-          <w:rFonts w:ascii="Calibri" w:hAnsi="Calibri"/>
-          <w:b/>
-          <w:sz w:val="21"/>
-        </w:rPr>
-        <w:t>Draft taxonomy for confirmation:</w:t>
-      </w:r>
-      <w:r>
-        <w:rPr>
-          <w:rFonts w:ascii="Calibri" w:hAnsi="Calibri"/>
-          <w:sz w:val="21"/>
-        </w:rPr>
-        <w:t xml:space="preserve"> Han Hu: conceptualization, methodology, software supervision, thermal-management analysis, writing, and visualization. Darin W. Nutter: LCA methodology, validation strategy, critical review, and manuscript revision. Contributions must be confirmed before submission.</w:t>
-      </w:r>
-    </w:p>
-    <w:p>
-      <w:pPr>
-        <w:pStyle w:val="Heading1"/>
-      </w:pPr>
-      <w:r>
-        <w:t>Competing interests</w:t>
-      </w:r>
-    </w:p>
-    <w:p>
-      <w:r>
-        <w:rPr>
-          <w:rFonts w:ascii="Calibri" w:hAnsi="Calibri"/>
-          <w:sz w:val="21"/>
-        </w:rPr>
-        <w:t>The authors must complete and approve the journal-specific competing-interest statement before submission.</w:t>
-      </w:r>
-    </w:p>
-    <w:p>
-      <w:pPr>
-        <w:pStyle w:val="Heading1"/>
-      </w:pPr>
-      <w:r>
-        <w:t>Acknowledgments</w:t>
-      </w:r>
-    </w:p>
-    <w:p>
-      <w:r>
-        <w:rPr>
-          <w:rFonts w:ascii="Calibri" w:hAnsi="Calibri"/>
-          <w:sz w:val="21"/>
-        </w:rPr>
-        <w:t>Funding, facility, student-contributor, and data-provider acknowledgments must be confirmed before submission.</w:t>
+        <w:t>OpenDC-LCA version 1.1.0 source code, examples, documentation, tests, derived tables, and manuscript figures are available at https://github.com/UARK-NED3/OpenDC-LCA. Installable wheel and source archives are available from https://github.com/UARK-NED3/OpenDC-LCA/releases/tag/v1.1.0. No DOI-bearing archive has yet been minted. The repository commit, analysis metadata, and provider-file checksum manifest identify the current reproducibility state; an immutable archival deposit remains a pre-submission action. Provider-native raw files remain local when redistribution permission has not been established. The Microsoft/Nature archive is available from Zenodo [15]; eGRID and NOAA data are available from their public portals [34,35,38].</w:t>
       </w:r>
     </w:p>
     <w:p>
@@ -5603,7 +5186,7 @@
           <w:rFonts w:ascii="Calibri" w:hAnsi="Calibri"/>
           <w:sz w:val="21"/>
         </w:rPr>
-        <w:t>42. International Organization for Standardization. ISO 14040:2006 and ISO</w:t>
+        <w:t>42. International Organization for Standardization. ISO 14040:2006,</w:t>
       </w:r>
     </w:p>
     <w:p>
@@ -5612,7 +5195,29 @@
           <w:rFonts w:ascii="Calibri" w:hAnsi="Calibri"/>
           <w:sz w:val="21"/>
         </w:rPr>
-        <w:t>14044:2006, Environmental management - Life cycle assessment.</w:t>
+        <w:t>Environmental management - Life cycle assessment - Principles and framework; and ISO 14044:2006, Environmental management - Life cycle assessment - Requirements and guidelines. https://www.iso.org/committee/54854/x/catalogue/; https://www.iso.org/standard/38498.html</w:t>
+      </w:r>
+    </w:p>
+    <w:p>
+      <w:pPr>
+        <w:spacing w:after="60"/>
+        <w:ind w:left="374" w:hanging="288"/>
+      </w:pPr>
+      <w:r>
+        <w:rPr>
+          <w:rFonts w:ascii="Calibri" w:hAnsi="Calibri"/>
+          <w:sz w:val="21"/>
+        </w:rPr>
+        <w:t>43. International Organization for Standardization. ISO 14071:2024,</w:t>
+      </w:r>
+    </w:p>
+    <w:p>
+      <w:r>
+        <w:rPr>
+          <w:rFonts w:ascii="Calibri" w:hAnsi="Calibri"/>
+          <w:sz w:val="21"/>
+        </w:rPr>
+        <w:t>Environmental management - Life cycle assessment - Critical review processes and reviewer competencies (2024). https://www.iso.org/standard/82464.html</w:t>
       </w:r>
     </w:p>
     <w:sectPr>

</xml_diff>

<commit_message>
Revise manuscript as transferability technology assessment
</commit_message>
<xml_diff>
--- a/paper/OpenDC-LCA_manuscript.docx
+++ b/paper/OpenDC-LCA_manuscript.docx
@@ -14,7 +14,7 @@
           <w:color w:val="17324D"/>
           <w:sz w:val="42"/>
         </w:rPr>
-        <w:t>OpenDC-LCA: boundary-aware evidence synthesis for data-center cooling under grid decarbonization</w:t>
+        <w:t>Transferability audit of data-center cooling LCA: lifecycle electricity, functional equivalence, and rank robustness</w:t>
       </w:r>
     </w:p>
     <w:p>
@@ -87,7 +87,7 @@
           <w:rFonts w:ascii="Calibri" w:hAnsi="Calibri"/>
           <w:sz w:val="21"/>
         </w:rPr>
-        <w:t>Life-cycle assessments (LCAs) of data-center cooling often report rankings despite differences in electricity accounting, useful-computation equivalence, boundaries, and foreground data. OpenDC-LCA links cooling engineering and LCA tools. We reconciled 24 released totals from a Microsoft/WSP study, reconstructed nine U.S. EPA eGRID years on a common AR5 GWP100 basis, and tested anchor coverage, boundary mismatch, functional-unit equivalence, assumption blocks, dependence, and numerical convergence. The harmonized U.S. generation rate declined 32.46%, from 517.73 kg CO2e/MWh in 2012 to 349.67 kg CO2e/MWh in 2023; GWP-basis harmonization changed any annual national rate by at most 0.248 kg CO2e/MWh. Yet 137 of 459 state-year rates lay outside the released electricity anchors. The cold-plate/single-phase crossover was 96.7 kg CO2e/MWh. The only 2023 state below it lost that ordering after an exact 73.01 kg CO2e/MWh additive boundary test. Two-phase immersion ranked first in every deterministic state-year screen, but its U.S. first-rank frequency fell from 99.19% to 55.05% across narrow-to-wide all-block zero-correlation stress designs. In the wide design it rose from 55.05% with independent architecture errors to 100% with common-mode errors; embodied variation caused the largest one-block rank loss. A median 5.50% adverse useful-computation correction also erased first rank. These frequencies describe stress designs, not probabilities. The national decarbonization trend is stable, whereas cooling rankings depend on boundary, foreground, dependence, and service-equivalence evidence. OpenDC-LCA converts those dependencies into traceable data requirements rather than a universal league table.</w:t>
+        <w:t>Published data-center cooling LCAs are difficult to transfer across grids and facilities because electricity boundaries, climate methods, useful-computation equivalence, and foreground inventories can differ. This Technology Assessment audits a released Microsoft/WSP comparison and tests which conclusions remain supported after those differences are made explicit. We reconstructed 24 published totals, harmonized nine U.S. EPA eGRID releases to IPCC AR5 GWP100, and calculated 71 non-residual 2023 electricity consumption product systems from the Federal LCA Commons. The source article reports AR5 GWP100, whereas the archived detailed workbook places the two numeric electricity endpoints in GTP100 cells while its corresponding GWP100 cells are blank; comparative use-phase formulas point to those blank F29 cells. Accordingly, cooling totals are retained only as numerical transferability screens. The harmonized national direct-generation factor declined 32.46%, from 517.73 kg CO2e/MWh in 2012 to 349.67 kg CO2e/MWh in 2023. The linked national consumption system yielded 422.93 kg CO2e/MWh, including 53.08 kg CO2e/MWh beyond generation processes; all 10 FERC regions exceeded the 96.70 kg CO2e/MWh numerical cold-plate/single-phase crossover, while 10 of 60 balancing authorities fell below it. The product system nevertheless retained 287 unlinked technosphere inputs, so these are partial linked-system factors, not complete lifecycle benchmarks. Under equal relative bounds, the national first-rank screen failed at a 1.32% all-block half-width; service-equivalence and use-phase thresholds were 2.64% and 2.99%, compared with 22.15% for embodied burden. Thus, an earlier conclusion that embodied variation was dominant was an artifact of assigning it a wider range. The audit supports the national decarbonization trend and identifies the data needed for a valid comparison, but it does not identify a universally preferable cooling architecture.</w:t>
       </w:r>
     </w:p>
     <w:p>
@@ -104,7 +104,7 @@
           <w:rFonts w:ascii="Calibri" w:hAnsi="Calibri"/>
           <w:sz w:val="21"/>
         </w:rPr>
-        <w:t xml:space="preserve"> data center; life-cycle assessment; immersion cooling; grid decarbonization; uncertainty; functional unit; open-source software</w:t>
+        <w:t xml:space="preserve"> data center; life-cycle assessment; technology assessment; lifecycle electricity; functional equivalence; sensitivity analysis; open-source software</w:t>
       </w:r>
     </w:p>
     <w:p>
@@ -138,16 +138,16 @@
           <w:rFonts w:ascii="Calibri" w:hAnsi="Calibri"/>
           <w:sz w:val="21"/>
         </w:rPr>
-        <w:t>These alternatives are not interchangeable heat exchangers. They alter server fans, pumps, coolant distribution units, heat-rejection temperature, fluid inventory, rack or tank construction, packing density, repair procedures, and sometimes achievable clock rate. System experiments have reported materially different coefficient of performance and cost behavior for single- and two-phase immersion over load [6], while recent single-phase tests show that flow direction, coolant viscosity, and water temperature affect chip temperature, thermal resistance, and PUE [7]. Two-phase experiments similarly show that boiling, pressure stability, and condenser performance must be evaluated at server and system levels [8]. A comparison at equal rack count, equal IT electricity, or equal nameplate capacity can therefore compare different computational services.</w:t>
-      </w:r>
-    </w:p>
-    <w:p>
-      <w:r>
-        <w:rPr>
-          <w:rFonts w:ascii="Calibri" w:hAnsi="Calibri"/>
-          <w:sz w:val="21"/>
-        </w:rPr>
-        <w:t>PUE remains useful for facility energy management, but it is not a lifecycle functional unit and does not represent hardware production, cooling-fluid loss, replacement, water scarcity, or useful computation. Cooling selection is therefore an energy-system decision with lifecycle consequences, not a single-metric efficiency contest.</w:t>
+        <w:t>These alternatives are not interchangeable heat exchangers. They alter server fans, pumps, coolant distribution units, heat-rejection temperature, fluid inventory, rack or tank construction, packing density, repair procedures, and sometimes achievable clock rate. System experiments have reported materially different coefficient of performance and cost behavior for single- and two-phase immersion over load [6], while recent single-phase tests show that flow direction, coolant viscosity, and water temperature affect chip temperature, thermal resistance, and PUE [7]. Two-phase experiments similarly show that boiling, pressure stability, and condenser performance must be evaluated at server and system levels [8]. A comparison at equal rack count, equal IT electricity, or equal nameplate capacity risks comparing different computational services.</w:t>
+      </w:r>
+    </w:p>
+    <w:p>
+      <w:r>
+        <w:rPr>
+          <w:rFonts w:ascii="Calibri" w:hAnsi="Calibri"/>
+          <w:sz w:val="21"/>
+        </w:rPr>
+        <w:t>PUE remains useful for facility energy management, but it is not a lifecycle functional unit and does not represent hardware production, cooling-fluid loss, replacement, water scarcity, or useful computation. Cooling selection is an energy-system decision with lifecycle consequences, not a single-metric efficiency contest.</w:t>
       </w:r>
     </w:p>
     <w:p>
@@ -182,7 +182,16 @@
           <w:rFonts w:ascii="Calibri" w:hAnsi="Calibri"/>
           <w:sz w:val="21"/>
         </w:rPr>
-        <w:t>Recent LCA work confirms that electricity decarbonization and cooling efficiency are complementary but can shift impacts among categories [16]. Manufacturer and ICT studies also show wide dispersion in embodied server impacts [17,18]. Together, these studies show the need for lifecycle assessment while exposing a transferability problem: a static result at one grid, one performance assumption, and one database system cannot be treated as a universal cooling ranking.</w:t>
+        <w:t>Recent work has moved closer to architecture- and service-level assessment. d'Orgeval et al. modeled complete data-center configurations and reported performance-normalized results for GPU-based subsets [44]. Wu et al. released and validated a cooling-plant virtual testbed against three months of operating data, with 7.62% mean absolute percentage error for power [45]. These studies provide performance and architecture evidence that a secondary normalized table cannot supply. ITU-T L.1410 likewise treats the functional unit and the rules for comparative ICT analysis as explicit study choices [48].</w:t>
+      </w:r>
+    </w:p>
+    <w:p>
+      <w:r>
+        <w:rPr>
+          <w:rFonts w:ascii="Calibri" w:hAnsi="Calibri"/>
+          <w:sz w:val="21"/>
+        </w:rPr>
+        <w:t>Other LCA work confirms that electricity decarbonization and cooling efficiency are complementary but can shift impacts among categories [16]. Manufacturer and ICT studies also show wide dispersion in embodied server impacts [17,18]. Together, this literature exposes a specific gap: available primary studies do not provide a reusable audit for determining whether a published cooling comparison can be transferred to a different electricity system without changing its method, boundary, or computational service.</w:t>
       </w:r>
     </w:p>
     <w:p>
@@ -225,25 +234,25 @@
           <w:rFonts w:ascii="Calibri" w:hAnsi="Calibri"/>
           <w:sz w:val="21"/>
         </w:rPr>
-        <w:t>LCA uncertainty arises from parameters, scenarios, model form, allocation, system boundary, and incomplete knowledge. Monte Carlo propagation is useful when distributions and correlations are supportable; it becomes misleading when arbitrary ranges are presented as confidence. Reviews recommend separating variability from uncertainty and using sensitivity analysis to identify influential assumptions [27]. Pedigree matrices can communicate reliability, temporal, geographic, and technological representativeness, but the conversion from qualitative scores to uncertainty is itself a modeling choice [28,29].</w:t>
-      </w:r>
-    </w:p>
-    <w:p>
-      <w:r>
-        <w:rPr>
-          <w:rFonts w:ascii="Calibri" w:hAnsi="Calibri"/>
-          <w:sz w:val="21"/>
-        </w:rPr>
-        <w:t>Data-quality assessment is therefore not a decorative appendix. EPA guidance emphasizes reproducible documentation at flow and process levels [29]. Decision analysis goes further: value-of-information methods prioritize data whose resolution is expected to change a decision, rather than simply improving every weak input [30]. This distinction is important for electronics-cooling laboratories. A parameter may have poor pedigree but negligible decision leverage; a seemingly precise PUE difference may be decisive if two lifecycle alternatives are nearly tied.</w:t>
-      </w:r>
-    </w:p>
-    <w:p>
-      <w:r>
-        <w:rPr>
-          <w:rFonts w:ascii="Calibri" w:hAnsi="Calibri"/>
-          <w:sz w:val="21"/>
-        </w:rPr>
-        <w:t>The review standard also depends on the claim. ISO 14040 and ISO 14044 define the LCA framework and requirements, whereas ISO 14071:2024 specifies critical review processes and reviewer competencies, with particular relevance to comparative assertions intended for public disclosure [42,43]. Code tests, data checks, and coauthor review can strengthen traceability, but none is a substitute for an independent critical review.</w:t>
+        <w:t>LCA uncertainty arises from parameters, scenarios, model form, allocation, system boundary, and incomplete knowledge. Monte Carlo propagation is useful when distributions and correlations are supportable; it becomes misleading when arbitrary ranges are presented as confidence. Correlation can materially change propagated uncertainty and cannot be inferred from marginal ranges alone [46]. Reviews recommend separating variability from uncertainty and using sensitivity analysis to identify influential assumptions [27]. Pedigree matrices can communicate reliability, temporal, geographic, and technological representativeness, but the conversion from qualitative scores to uncertainty is itself a modeling choice [28,29].</w:t>
+      </w:r>
+    </w:p>
+    <w:p>
+      <w:r>
+        <w:rPr>
+          <w:rFonts w:ascii="Calibri" w:hAnsi="Calibri"/>
+          <w:sz w:val="21"/>
+        </w:rPr>
+        <w:t>Data-quality assessment is not a decorative appendix. EPA guidance emphasizes reproducible documentation at flow and process levels [29]. Decision analysis goes further: value-of-information methods prioritize data whose resolution is expected to change a decision, rather than simply improving every weak input [30]. This distinction is important for electronics-cooling laboratories. A parameter may have poor pedigree but negligible decision leverage; a seemingly precise PUE difference may be decisive if two lifecycle alternatives are nearly tied.</w:t>
+      </w:r>
+    </w:p>
+    <w:p>
+      <w:r>
+        <w:rPr>
+          <w:rFonts w:ascii="Calibri" w:hAnsi="Calibri"/>
+          <w:sz w:val="21"/>
+        </w:rPr>
+        <w:t>The review standard also depends on the claim. ISO 14040 and ISO 14044 define the LCA framework and requirements, whereas ISO 14071:2024 specifies critical review processes and reviewer competencies, with particular relevance to comparative assertions intended for public disclosure [31,32]. Code tests, data checks, and coauthor review can strengthen traceability, but none is a substitute for an independent critical review.</w:t>
       </w:r>
     </w:p>
     <w:p>
@@ -260,16 +269,16 @@
           <w:rFonts w:ascii="Calibri" w:hAnsi="Calibri"/>
           <w:sz w:val="21"/>
         </w:rPr>
-        <w:t>General engines such as openLCA and Brightway calculate process networks, exchange inventories, and apply LCIA methods [31,32]. They do not determine whether cooling alternatives deliver equivalent computation, whether a performance map covers the operating domain, whether a grid substitution preserves the original electricity boundary, or whether secondary screening results support a public comparative assertion.</w:t>
-      </w:r>
-    </w:p>
-    <w:p>
-      <w:r>
-        <w:rPr>
-          <w:rFonts w:ascii="Calibri" w:hAnsi="Calibri"/>
-          <w:sz w:val="21"/>
-        </w:rPr>
-        <w:t>Five gaps remain at the intersection of cooling engineering and LCA:</w:t>
+        <w:t>General engines such as openLCA and Brightway calculate process networks, exchange inventories, and apply LCIA methods [33,34]. They do not determine whether cooling alternatives deliver equivalent computation, whether a performance map covers the operating domain, whether a grid substitution preserves the original electricity boundary, or whether secondary screening results support a public comparative assertion. Conversely, cooling-plant models can validate operational power without closing lifecycle inventories or comparative-review requirements [45].</w:t>
+      </w:r>
+    </w:p>
+    <w:p>
+      <w:r>
+        <w:rPr>
+          <w:rFonts w:ascii="Calibri" w:hAnsi="Calibri"/>
+          <w:sz w:val="21"/>
+        </w:rPr>
+        <w:t>Four gaps remain at the intersection of cooling engineering and LCA:</w:t>
       </w:r>
     </w:p>
     <w:p>
@@ -304,7 +313,16 @@
           <w:rFonts w:ascii="Calibri" w:hAnsi="Calibri"/>
           <w:sz w:val="21"/>
         </w:rPr>
-        <w:t>2. annual, static results hide grid, weather, and load transferability;</w:t>
+        <w:t>2. common-unit electricity factors can retain incompatible characterization</w:t>
+      </w:r>
+    </w:p>
+    <w:p>
+      <w:r>
+        <w:rPr>
+          <w:rFonts w:ascii="Calibri" w:hAnsi="Calibri"/>
+          <w:sz w:val="21"/>
+        </w:rPr>
+        <w:t>methods and system boundaries;</w:t>
       </w:r>
     </w:p>
     <w:p>
@@ -317,16 +335,16 @@
           <w:rFonts w:ascii="Calibri" w:hAnsi="Calibri"/>
           <w:sz w:val="21"/>
         </w:rPr>
-        <w:t>3. common-unit electricity factors can retain incompatible characterization</w:t>
-      </w:r>
-    </w:p>
-    <w:p>
-      <w:r>
-        <w:rPr>
-          <w:rFonts w:ascii="Calibri" w:hAnsi="Calibri"/>
-          <w:sz w:val="21"/>
-        </w:rPr>
-        <w:t>methods and system boundaries;</w:t>
+        <w:t>3. qualitative data-quality scores do not directly show which measurement</w:t>
+      </w:r>
+    </w:p>
+    <w:p>
+      <w:r>
+        <w:rPr>
+          <w:rFonts w:ascii="Calibri" w:hAnsi="Calibri"/>
+          <w:sz w:val="21"/>
+        </w:rPr>
+        <w:t>could change the technology decision; and</w:t>
       </w:r>
     </w:p>
     <w:p>
@@ -339,16 +357,25 @@
           <w:rFonts w:ascii="Calibri" w:hAnsi="Calibri"/>
           <w:sz w:val="21"/>
         </w:rPr>
-        <w:t>4. qualitative data-quality scores do not directly show which measurement</w:t>
-      </w:r>
-    </w:p>
-    <w:p>
-      <w:r>
-        <w:rPr>
-          <w:rFonts w:ascii="Calibri" w:hAnsi="Calibri"/>
-          <w:sz w:val="21"/>
-        </w:rPr>
-        <w:t>could change the technology decision; and</w:t>
+        <w:t>4. software often produces a number without preserving whether it is</w:t>
+      </w:r>
+    </w:p>
+    <w:p>
+      <w:r>
+        <w:rPr>
+          <w:rFonts w:ascii="Calibri" w:hAnsi="Calibri"/>
+          <w:sz w:val="21"/>
+        </w:rPr>
+        <w:t>reconstructed, screened, empirically supported, or suitable for a comparative claim.</w:t>
+      </w:r>
+    </w:p>
+    <w:p>
+      <w:r>
+        <w:rPr>
+          <w:rFonts w:ascii="Calibri" w:hAnsi="Calibri"/>
+          <w:sz w:val="21"/>
+        </w:rPr>
+        <w:t>This study is a Technology Assessment of the transferability of the released Microsoft/WSP case. Its contributions are:</w:t>
       </w:r>
     </w:p>
     <w:p>
@@ -361,25 +388,16 @@
           <w:rFonts w:ascii="Calibri" w:hAnsi="Calibri"/>
           <w:sz w:val="21"/>
         </w:rPr>
-        <w:t>5. software often produces a number without preserving whether it is</w:t>
-      </w:r>
-    </w:p>
-    <w:p>
-      <w:r>
-        <w:rPr>
-          <w:rFonts w:ascii="Calibri" w:hAnsi="Calibri"/>
-          <w:sz w:val="21"/>
-        </w:rPr>
-        <w:t>reconstructed, screened, empirically supported, or suitable for a comparative claim.</w:t>
-      </w:r>
-    </w:p>
-    <w:p>
-      <w:r>
-        <w:rPr>
-          <w:rFonts w:ascii="Calibri" w:hAnsi="Calibri"/>
-          <w:sz w:val="21"/>
-        </w:rPr>
-        <w:t>This study addresses those gaps with a boundary-aware evidence layer and a secondary analysis of the released Microsoft/WSP case. The specific contributions are:</w:t>
+        <w:t>1. an exact reconstruction of 24 released totals and a cell-level audit that</w:t>
+      </w:r>
+    </w:p>
+    <w:p>
+      <w:r>
+        <w:rPr>
+          <w:rFonts w:ascii="Calibri" w:hAnsi="Calibri"/>
+          <w:sz w:val="21"/>
+        </w:rPr>
+        <w:t>identifies an unresolved GTP100/GWP100 inconsistency in the public archive;</w:t>
       </w:r>
     </w:p>
     <w:p>
@@ -392,16 +410,16 @@
           <w:rFonts w:ascii="Calibri" w:hAnsi="Calibri"/>
           <w:sz w:val="21"/>
         </w:rPr>
-        <w:t>1. exact arithmetic reconstruction of 24 released architecture-scenario-impact</w:t>
-      </w:r>
-    </w:p>
-    <w:p>
-      <w:r>
-        <w:rPr>
-          <w:rFonts w:ascii="Calibri" w:hAnsi="Calibri"/>
-          <w:sz w:val="21"/>
-        </w:rPr>
-        <w:t>totals;</w:t>
+        <w:t>2. a common-basis reconstruction of nine eGRID releases from gas-specific</w:t>
+      </w:r>
+    </w:p>
+    <w:p>
+      <w:r>
+        <w:rPr>
+          <w:rFonts w:ascii="Calibri" w:hAnsi="Calibri"/>
+          <w:sz w:val="21"/>
+        </w:rPr>
+        <w:t>emissions;</w:t>
       </w:r>
     </w:p>
     <w:p>
@@ -414,16 +432,16 @@
           <w:rFonts w:ascii="Calibri" w:hAnsi="Calibri"/>
           <w:sz w:val="21"/>
         </w:rPr>
-        <w:t>2. a common-basis reconstruction of nine eGRID releases from gas-specific</w:t>
-      </w:r>
-    </w:p>
-    <w:p>
-      <w:r>
-        <w:rPr>
-          <w:rFonts w:ascii="Calibri" w:hAnsi="Calibri"/>
-          <w:sz w:val="21"/>
-        </w:rPr>
-        <w:t>emissions rather than comparison of provider CO2e fields with changing GWP conventions;</w:t>
+        <w:t>3. a linked openLCA JSON-LD calculation of 71 Federal LCA Commons 2023</w:t>
+      </w:r>
+    </w:p>
+    <w:p>
+      <w:r>
+        <w:rPr>
+          <w:rFonts w:ascii="Calibri" w:hAnsi="Calibri"/>
+          <w:sz w:val="21"/>
+        </w:rPr>
+        <w:t>consumption systems, with process links, numerical residuals, and unlinked technosphere cutoffs reported rather than hidden;</w:t>
       </w:r>
     </w:p>
     <w:p>
@@ -436,16 +454,16 @@
           <w:rFonts w:ascii="Calibri" w:hAnsi="Calibri"/>
           <w:sz w:val="21"/>
         </w:rPr>
-        <w:t>3. explicit diagnostics for anchor extrapolation, electricity-boundary</w:t>
-      </w:r>
-    </w:p>
-    <w:p>
-      <w:r>
-        <w:rPr>
-          <w:rFonts w:ascii="Calibri" w:hAnsi="Calibri"/>
-          <w:sz w:val="21"/>
-        </w:rPr>
-        <w:t>mismatch, useful-computation equivalence, and joint assumption stress;</w:t>
+        <w:t>4. exact, equal-width, deterministic rank-robustness certificates that</w:t>
+      </w:r>
+    </w:p>
+    <w:p>
+      <w:r>
+        <w:rPr>
+          <w:rFonts w:ascii="Calibri" w:hAnsi="Calibri"/>
+          <w:sz w:val="21"/>
+        </w:rPr>
+        <w:t>distinguish the effects of grid, use phase, embodied burden, and service equivalence without assigning unsupported probabilities; and</w:t>
       </w:r>
     </w:p>
     <w:p>
@@ -458,38 +476,25 @@
           <w:rFonts w:ascii="Calibri" w:hAnsi="Calibri"/>
           <w:sz w:val="21"/>
         </w:rPr>
-        <w:t>4. transparent use of Boavizta, ÖKOBAUDAT, USLCI, GLAD, NOAA, and USGS data</w:t>
-      </w:r>
-    </w:p>
-    <w:p>
-      <w:r>
-        <w:rPr>
-          <w:rFonts w:ascii="Calibri" w:hAnsi="Calibri"/>
-          <w:sz w:val="21"/>
-        </w:rPr>
-        <w:t>according to their supported numerical role; and</w:t>
-      </w:r>
-    </w:p>
-    <w:p>
-      <w:pPr>
-        <w:spacing w:after="60"/>
-        <w:ind w:left="374" w:hanging="288"/>
-      </w:pPr>
-      <w:r>
-        <w:rPr>
-          <w:rFonts w:ascii="Calibri" w:hAnsi="Calibri"/>
-          <w:sz w:val="21"/>
-        </w:rPr>
-        <w:t>5. an open package that emits both results and an evidence/claim classification.</w:t>
-      </w:r>
-    </w:p>
-    <w:p>
-      <w:r>
-        <w:rPr>
-          <w:rFonts w:ascii="Calibri" w:hAnsi="Calibri"/>
-          <w:sz w:val="21"/>
-        </w:rPr>
-        <w:t>The aim is not to independently reproduce a proprietary product system or declare a winning cooling technology. It is to determine which conclusions survive disclosed transformations and which require new measurements.</w:t>
+        <w:t>5. an open comparison validator that blocks incompatible functional units,</w:t>
+      </w:r>
+    </w:p>
+    <w:p>
+      <w:r>
+        <w:rPr>
+          <w:rFonts w:ascii="Calibri" w:hAnsi="Calibri"/>
+          <w:sz w:val="21"/>
+        </w:rPr>
+        <w:t>boundaries, electricity accounting, LCIA methods, or missing field-level lineage, while stating that metadata checks are not physical validation.</w:t>
+      </w:r>
+    </w:p>
+    <w:p>
+      <w:r>
+        <w:rPr>
+          <w:rFonts w:ascii="Calibri" w:hAnsi="Calibri"/>
+          <w:sz w:val="21"/>
+        </w:rPr>
+        <w:t>The aim is not to reconstruct licensed background inventories or declare a winning cooling technology. It is to determine which claims survive a transferability audit and which require primary measurement, complete inventories, or external critical review.</w:t>
       </w:r>
     </w:p>
     <w:p>
@@ -514,7 +519,7 @@
           <w:rFonts w:ascii="Calibri" w:hAnsi="Calibri"/>
           <w:sz w:val="21"/>
         </w:rPr>
-        <w:t>Figure 1 shows the OpenDC-LCA workflow. Every source is registered with provider, version, persistent identifier or URL, geography, reference year, declared unit, boundary, license or redistribution constraint, evidence class, and checksum. The harmonization stage then asks, in order: are the alternatives functionally equivalent; are the units, characterization methods, time, and geography aligned; is the required transformation interpolation or extrapolation; and are uncertainty, correlation, and review status adequate for the proposed claim? The result is classified as reconstructed, screening-transformed, registered/unlinked, or supported by primary decision-grade evidence.</w:t>
+        <w:t>Figure 1 shows the OpenDC-LCA workflow. The repository records source-family metadata and a per-file path, byte count, and SHA-256 checksum. Dataset-specific tables retain the worksheet, field, unit, boundary, and numerical role used in each analysis. This is file-level integrity plus family-level provenance, not a complete flow-level data-lineage graph. The harmonization stage then asks, in order: are the alternatives functionally equivalent; are the units, characterization methods, time, and geography aligned; is the required transformation interpolation or extrapolation; and are uncertainty, correlation, and review status adequate for the proposed claim? The result is classified as reconstructed, screening-transformed, registered/unlinked, or supported by primary decision-grade evidence.</w:t>
       </w:r>
     </w:p>
     <w:p>
@@ -576,7 +581,7 @@
           <w:rFonts w:ascii="Calibri" w:hAnsi="Calibri"/>
           <w:sz w:val="21"/>
         </w:rPr>
-        <w:t>OpenDC-LCA is implemented in Python 3.10 or later and distributed under the MIT License [33]. Version 1.1.0 provides a command-line interface, Python API, local browser GUI, scenario and performance-map schemas, reliability and replacement models, openLCA JSON-LD and Brightway mappings, evidence audits, and human- and machine-readable reports. All interfaces call the same calculation engine.</w:t>
+        <w:t>OpenDC-LCA is implemented in Python 3.10 or later and distributed under the MIT License [35]. The development branch evaluated here extends version 1.1.0 and provides a command-line interface, Python API, local browser GUI, scenario and performance-map schemas, reliability and replacement models, openLCA JSON-LD and Brightway mappings, evidence audits, and human- and machine-readable reports. Its comparison validator checks cross-scenario metadata and field-level source mappings before calculating a comparison. It cannot verify whether a declared source, uncertainty model, or review status is true. All interfaces call the same calculation engine.</w:t>
       </w:r>
     </w:p>
     <w:p>
@@ -912,7 +917,7 @@
                 <w:rFonts w:ascii="Calibri" w:hAnsi="Calibri"/>
                 <w:sz w:val="18"/>
               </w:rPr>
-              <w:t>EPA eGRID: 459 state/DC-year rows and 9 U.S. aggregates [34,35]</w:t>
+              <w:t>EPA eGRID: 459 state/DC-year rows and 9 U.S. aggregates [36,37]</w:t>
             </w:r>
           </w:p>
         </w:tc>
@@ -1017,7 +1022,112 @@
                 <w:rFonts w:ascii="Calibri" w:hAnsi="Calibri"/>
                 <w:sz w:val="18"/>
               </w:rPr>
-              <w:t>Boavizta: 48 server PCF records [36]</w:t>
+              <w:t>Federal LCA Commons U.S. Electricity Baseline 2023 and IPCC GWP method [47]</w:t>
+            </w:r>
+          </w:p>
+        </w:tc>
+        <w:tc>
+          <w:tcPr>
+            <w:tcW w:type="dxa" w:w="2340"/>
+            <w:vAlign w:val="center"/>
+            <w:tcMar>
+              <w:top w:w="80" w:type="dxa"/>
+              <w:start w:w="120" w:type="dxa"/>
+              <w:bottom w:w="80" w:type="dxa"/>
+              <w:end w:w="120" w:type="dxa"/>
+            </w:tcMar>
+          </w:tcPr>
+          <w:p>
+            <w:pPr>
+              <w:spacing w:after="0" w:line="240" w:lineRule="auto"/>
+              <w:jc w:val="left"/>
+            </w:pPr>
+            <w:r>
+              <w:rPr>
+                <w:rFonts w:ascii="Calibri" w:hAnsi="Calibri"/>
+                <w:sz w:val="18"/>
+              </w:rPr>
+              <w:t>Linked consumption-system factors for 60 balancing authorities, 10 FERC regions, and the United States</w:t>
+            </w:r>
+          </w:p>
+        </w:tc>
+        <w:tc>
+          <w:tcPr>
+            <w:tcW w:type="dxa" w:w="2340"/>
+            <w:vAlign w:val="center"/>
+            <w:tcMar>
+              <w:top w:w="80" w:type="dxa"/>
+              <w:start w:w="120" w:type="dxa"/>
+              <w:bottom w:w="80" w:type="dxa"/>
+              <w:end w:w="120" w:type="dxa"/>
+            </w:tcMar>
+          </w:tcPr>
+          <w:p>
+            <w:pPr>
+              <w:spacing w:after="0" w:line="240" w:lineRule="auto"/>
+              <w:jc w:val="left"/>
+            </w:pPr>
+            <w:r>
+              <w:rPr>
+                <w:rFonts w:ascii="Calibri" w:hAnsi="Calibri"/>
+                <w:sz w:val="18"/>
+              </w:rPr>
+              <w:t>Unlinked technosphere inputs remain zero-burden cutoffs; not harmonized with the released cooling foreground</w:t>
+            </w:r>
+          </w:p>
+        </w:tc>
+        <w:tc>
+          <w:tcPr>
+            <w:tcW w:type="dxa" w:w="2340"/>
+            <w:vAlign w:val="center"/>
+            <w:tcMar>
+              <w:top w:w="80" w:type="dxa"/>
+              <w:start w:w="120" w:type="dxa"/>
+              <w:bottom w:w="80" w:type="dxa"/>
+              <w:end w:w="120" w:type="dxa"/>
+            </w:tcMar>
+          </w:tcPr>
+          <w:p>
+            <w:pPr>
+              <w:spacing w:after="0" w:line="240" w:lineRule="auto"/>
+              <w:jc w:val="left"/>
+            </w:pPr>
+            <w:r>
+              <w:rPr>
+                <w:rFonts w:ascii="Calibri" w:hAnsi="Calibri"/>
+                <w:sz w:val="18"/>
+              </w:rPr>
+              <w:t>Partial linked-system screen</w:t>
+            </w:r>
+          </w:p>
+        </w:tc>
+      </w:tr>
+      <w:tr>
+        <w:trPr>
+          <w:cantSplit w:val="true"/>
+        </w:trPr>
+        <w:tc>
+          <w:tcPr>
+            <w:tcW w:type="dxa" w:w="2340"/>
+            <w:vAlign w:val="center"/>
+            <w:tcMar>
+              <w:top w:w="80" w:type="dxa"/>
+              <w:start w:w="120" w:type="dxa"/>
+              <w:bottom w:w="80" w:type="dxa"/>
+              <w:end w:w="120" w:type="dxa"/>
+            </w:tcMar>
+          </w:tcPr>
+          <w:p>
+            <w:pPr>
+              <w:spacing w:after="0" w:line="240" w:lineRule="auto"/>
+              <w:jc w:val="left"/>
+            </w:pPr>
+            <w:r>
+              <w:rPr>
+                <w:rFonts w:ascii="Calibri" w:hAnsi="Calibri"/>
+                <w:sz w:val="18"/>
+              </w:rPr>
+              <w:t>Boavizta: 48 server PCF records [38]</w:t>
             </w:r>
           </w:p>
         </w:tc>
@@ -1122,7 +1232,7 @@
                 <w:rFonts w:ascii="Calibri" w:hAnsi="Calibri"/>
                 <w:sz w:val="18"/>
               </w:rPr>
-              <w:t>ÖKOBAUDAT: 6 selected A1-A3 processes [37]</w:t>
+              <w:t>ÖKOBAUDAT: 6 selected A1-A3 processes [39]</w:t>
             </w:r>
           </w:p>
         </w:tc>
@@ -1227,7 +1337,7 @@
                 <w:rFonts w:ascii="Calibri" w:hAnsi="Calibri"/>
                 <w:sz w:val="18"/>
               </w:rPr>
-              <w:t>NOAA TMY: 8,760 Fayetteville weather rows [38]</w:t>
+              <w:t>NOAA TMY: 8,760 Fayetteville weather rows [40]</w:t>
             </w:r>
           </w:p>
         </w:tc>
@@ -1332,7 +1442,7 @@
                 <w:rFonts w:ascii="Calibri" w:hAnsi="Calibri"/>
                 <w:sz w:val="18"/>
               </w:rPr>
-              <w:t>USLCI and 7 GLAD hydrogen archives [39,40]</w:t>
+              <w:t>USLCI and 7 GLAD hydrogen archives [41,42]</w:t>
             </w:r>
           </w:p>
         </w:tc>
@@ -1437,7 +1547,7 @@
                 <w:rFonts w:ascii="Calibri" w:hAnsi="Calibri"/>
                 <w:sz w:val="18"/>
               </w:rPr>
-              <w:t>USGS watershed boundary: HU12 geometry [41]</w:t>
+              <w:t>USGS watershed boundary: HU12 geometry [43]</w:t>
             </w:r>
           </w:p>
         </w:tc>
@@ -1529,7 +1639,7 @@
           <w:rFonts w:ascii="Calibri" w:hAnsi="Calibri"/>
           <w:sz w:val="21"/>
         </w:rPr>
-        <w:t>Provider-native raw files remain outside the public repository when redistribution permission is unclear. Derived tables retain filenames, worksheets, fields, units, and checksums.</w:t>
+        <w:t>Provider-native raw files remain outside the public repository when redistribution permission is unclear or large upstream archives have not been reviewed for redistribution. Derived tables retain filenames, worksheets, fields, units, and checksums.</w:t>
       </w:r>
     </w:p>
     <w:p>
@@ -1646,7 +1756,7 @@
           <w:rFonts w:ascii="Calibri" w:hAnsi="Calibri"/>
           <w:sz w:val="21"/>
         </w:rPr>
-        <w:t>where q_i is quantity, L_s the study period, and L_i service life. The package also supports a linear screening option. For initial fluid mass m_0, facility life L_f, annual loss m_loss, production factor I_k^fluid, and direct global-warming factor GWP_direct,</w:t>
+        <w:t>where q_i is quantity, L_s the study period, and L_i service life. The package also supports a linear screening option. For initial fluid mass m_0, facility life L_f, annual loss m_loss, production factor I_k^prod, end-of-life factor I_k^EOL, and direct global-warming factor GWP_direct,</w:t>
       </w:r>
     </w:p>
     <w:p>
@@ -1678,16 +1788,16 @@
           <w:color w:val="17324D"/>
           <w:sz w:val="21"/>
         </w:rPr>
-        <w:t>I_k,fluid = m_prod,annual I_k^fluid;   GHG_direct = m_loss GWP_direct   (6)</w:t>
-      </w:r>
-    </w:p>
-    <w:p>
-      <w:r>
-        <w:rPr>
-          <w:rFonts w:ascii="Calibri" w:hAnsi="Calibri"/>
-          <w:sz w:val="21"/>
-        </w:rPr>
-        <w:t>These equations are part of the software engine. The secondary Microsoft/WSP analysis uses the normalized component values released by the authors rather than inventing missing quantities.</w:t>
+        <w:t>I_k,fluid = m_prod,annual I_k^prod + (m_0/L_f) I_k^EOL;  GHG_direct = m_loss GWP_direct   (6)</w:t>
+      </w:r>
+    </w:p>
+    <w:p>
+      <w:r>
+        <w:rPr>
+          <w:rFonts w:ascii="Calibri" w:hAnsi="Calibri"/>
+          <w:sz w:val="21"/>
+        </w:rPr>
+        <w:t>The model assumes that annual losses are replaced, so the charge remains m_0, and that the full remaining charge is treated at facility end of life. Annual purchases and outputs balance as m_0/L_f+m_loss. These equations are part of the software engine. The secondary Microsoft/WSP analysis uses the normalized component values released by the authors rather than inventing missing quantities.</w:t>
       </w:r>
     </w:p>
     <w:p>
@@ -1704,16 +1814,61 @@
           <w:rFonts w:ascii="Calibri" w:hAnsi="Calibri"/>
           <w:sz w:val="21"/>
         </w:rPr>
-        <w:t>For each of four cooling architectures, two electricity cases, and three impact metrics, the released total was recomputed as the sum of use phase, building, compute server, storage server, networking server, rack or tank, cable, support equipment, and cooling-fluid contributions. This 24-cell test is an arithmetic-consistency audit. It does not validate confidential quantities, licensed LCA for Experts or ecoinvent processes, allocation, performance, or field operation.</w:t>
-      </w:r>
-    </w:p>
-    <w:p>
-      <w:r>
-        <w:rPr>
-          <w:rFonts w:ascii="Calibri" w:hAnsi="Calibri"/>
-          <w:sz w:val="21"/>
-        </w:rPr>
-        <w:t>The detailed archive identifies the electricity anchors as 524.893 kg CO2e/MWh for U.S. average electricity and 6.133 kg CO2e/MWh for U.S. average wind under IPCC AR5 GTP100 excluding biogenic carbon. We define a numerical intensity-position index</w:t>
+        <w:t xml:space="preserve">For each of four cooling architectures, two electricity cases, and three impact metrics, the released total was recomputed from the seven aggregate categories in the Nature supplementary workbook </w:t>
+      </w:r>
+      <w:r>
+        <w:rPr>
+          <w:rFonts w:ascii="Courier New" w:hAnsi="Courier New"/>
+          <w:color w:val="17324D"/>
+          <w:sz w:val="20"/>
+        </w:rPr>
+        <w:t>Figure4</w:t>
+      </w:r>
+      <w:r>
+        <w:rPr>
+          <w:rFonts w:ascii="Calibri" w:hAnsi="Calibri"/>
+          <w:sz w:val="21"/>
+        </w:rPr>
+        <w:t xml:space="preserve"> sheet: use phase, building, server, rack/tank, cable, supporting equipment, and fluid impacts. This 24-cell test is an arithmetic-consistency audit. It does not validate confidential quantities, licensed LCA for Experts or ecoinvent processes, allocation, performance, or field operation.</w:t>
+      </w:r>
+    </w:p>
+    <w:p>
+      <w:r>
+        <w:rPr>
+          <w:rFonts w:ascii="Calibri" w:hAnsi="Calibri"/>
+          <w:sz w:val="21"/>
+        </w:rPr>
+        <w:t xml:space="preserve">The public files do not establish one unambiguous climate-method identity for the electricity endpoints. The article reports IPCC AR5 GWP100 [14]. In the archived detailed workbook, the numeric values 524.893 and 6.133 kg CO2e/MWh appear in cells F26 labeled “IPCC AR5 GTP100,” while the GWP100 cells F29 are blank. Direct worksheet-XML inspection further shows that </w:t>
+      </w:r>
+      <w:r>
+        <w:rPr>
+          <w:rFonts w:ascii="Courier New" w:hAnsi="Courier New"/>
+          <w:color w:val="17324D"/>
+          <w:sz w:val="20"/>
+        </w:rPr>
+        <w:t>Comparative results 0% RE!D118</w:t>
+      </w:r>
+      <w:r>
+        <w:rPr>
+          <w:rFonts w:ascii="Calibri" w:hAnsi="Calibri"/>
+          <w:sz w:val="21"/>
+        </w:rPr>
+        <w:t xml:space="preserve"> and </w:t>
+      </w:r>
+      <w:r>
+        <w:rPr>
+          <w:rFonts w:ascii="Courier New" w:hAnsi="Courier New"/>
+          <w:color w:val="17324D"/>
+          <w:sz w:val="20"/>
+        </w:rPr>
+        <w:t>Comparative results 100% RE!D122</w:t>
+      </w:r>
+      <w:r>
+        <w:rPr>
+          <w:rFonts w:ascii="Calibri" w:hAnsi="Calibri"/>
+          <w:sz w:val="21"/>
+        </w:rPr>
+        <w:t xml:space="preserve"> reference the blank F29 cells for conventional and renewable electricity. We treat the two numbers as label-free numerical anchors, not verified GWP100 or GTP100 factors, and define an intensity-position index</w:t>
       </w:r>
     </w:p>
     <w:p>
@@ -1763,7 +1918,22 @@
           <w:rFonts w:ascii="Calibri" w:hAnsi="Calibri"/>
           <w:sz w:val="21"/>
         </w:rPr>
-        <w:t>Equations (7)-(8) reproduce both released endpoints exactly. They are not a background-process substitution. The Microsoft anchors are lifecycle GTP100 results; eGRID rates are direct power-sector GWP100 results. Common units do not remove the characterization and upstream-boundary mismatch. We therefore refer to g_s as a screening index, count all extrapolations, and perform a separate boundary-mismatch stress.</w:t>
+        <w:t xml:space="preserve">Equations (7)-(8) reproduce both numerical endpoints exactly. They are not a background-process substitution. Common units do not resolve the endpoint method identity or the upstream-boundary mismatch with eGRID. In this study, g_s is a screening index and every extrapolation is counted. The slope of each use-phase line has units of MWh/Vcore-year and is reported as an </w:t>
+      </w:r>
+      <w:r>
+        <w:rPr>
+          <w:rFonts w:ascii="Calibri" w:hAnsi="Calibri"/>
+          <w:i/>
+          <w:sz w:val="21"/>
+        </w:rPr>
+        <w:t>implied electricity-response coefficient</w:t>
+      </w:r>
+      <w:r>
+        <w:rPr>
+          <w:rFonts w:ascii="Calibri" w:hAnsi="Calibri"/>
+          <w:sz w:val="21"/>
+        </w:rPr>
+        <w:t>. It is not a measured energy demand because the two endpoint methods are unresolved.</w:t>
       </w:r>
     </w:p>
     <w:p>
@@ -1805,7 +1975,7 @@
           <w:rFonts w:ascii="Calibri" w:hAnsi="Calibri"/>
           <w:sz w:val="21"/>
         </w:rPr>
-        <w:t>EPA changed the GWP values used by eGRID: releases before 2018 used IPCC SAR, 2018-2022 used AR4, and 2023 used AR5 without climate-carbon feedback [34,35]. To remove this avoidable discontinuity, every state and U.S. factor was reconstructed from net generation and gas-specific annual emissions:</w:t>
+        <w:t>EPA changed the GWP values used by eGRID: releases before 2018 used IPCC SAR, 2018-2022 used AR4, and 2023 used AR5 without climate-carbon feedback [36,37]. To remove this avoidable discontinuity, every state and U.S. factor was reconstructed from net generation and gas-specific annual emissions:</w:t>
       </w:r>
     </w:p>
     <w:p>
@@ -1847,7 +2017,81 @@
         <w:pStyle w:val="Heading2"/>
       </w:pPr>
       <w:r>
-        <w:t>2.7. Extrapolation, boundary, and functional-unit diagnostics</w:t>
+        <w:t>2.7. Federal LCA Commons consumption-system calculation</w:t>
+      </w:r>
+    </w:p>
+    <w:p>
+      <w:r>
+        <w:rPr>
+          <w:rFonts w:ascii="Calibri" w:hAnsi="Calibri"/>
+          <w:sz w:val="21"/>
+        </w:rPr>
+        <w:t>The 2023 U.S. Electricity Baseline was downloaded from the Federal LCA Commons as openLCA 2 JSON-LD together with the repository's IPCC GWP method [47]. The inventory contains 947 processes and 142 product systems generated with ElectricityLCI 3.0.0. We retained 71 non-residual, at-user consumption systems: 60 balancing authorities, 10 FERC regions, and the national mix. The matched residual-consumption systems were calculated separately as a market-based accounting sensitivity and were never pooled with the ordinary consumption systems.</w:t>
+      </w:r>
+    </w:p>
+    <w:p>
+      <w:r>
+        <w:rPr>
+          <w:rFonts w:ascii="Calibri" w:hAnsi="Calibri"/>
+          <w:sz w:val="21"/>
+        </w:rPr>
+        <w:t xml:space="preserve">For each product system, process links defined the technosphere coefficients. Activities were solved by fixed-point iteration for the declared target of 1 MWh at user; all exchange and target units were converted through the JSON-LD unit groups. Elementary exchanges were characterized with IPCC AR5-100 category UUID </w:t>
+      </w:r>
+      <w:r>
+        <w:rPr>
+          <w:rFonts w:ascii="Courier New" w:hAnsi="Courier New"/>
+          <w:color w:val="17324D"/>
+          <w:sz w:val="20"/>
+        </w:rPr>
+        <w:t>7d05b807-2caa-3cd9-b55c-399d3b820cbc</w:t>
+      </w:r>
+      <w:r>
+        <w:rPr>
+          <w:rFonts w:ascii="Calibri" w:hAnsi="Calibri"/>
+          <w:sz w:val="21"/>
+        </w:rPr>
+        <w:t>. The calculation reports process count, link count, iteration count, maximum balance residual, impacts from generation processes, and all other linked upstream and infrastructure impacts.</w:t>
+      </w:r>
+    </w:p>
+    <w:p>
+      <w:r>
+        <w:rPr>
+          <w:rFonts w:ascii="Calibri" w:hAnsi="Calibri"/>
+          <w:sz w:val="21"/>
+        </w:rPr>
+        <w:t xml:space="preserve">An input without a product-system provider link was assigned no upstream burden, consistent with the published link structure, and was recorded as a cutoff. The national system contained 287 such exchanges. Because their omitted magnitude was not bounded and the calculation was not independently reproduced in openLCA or Brightway, the resulting factors are termed </w:t>
+      </w:r>
+      <w:r>
+        <w:rPr>
+          <w:rFonts w:ascii="Calibri" w:hAnsi="Calibri"/>
+          <w:i/>
+          <w:sz w:val="21"/>
+        </w:rPr>
+        <w:t>partial linked-system factors</w:t>
+      </w:r>
+      <w:r>
+        <w:rPr>
+          <w:rFonts w:ascii="Calibri" w:hAnsi="Calibri"/>
+          <w:sz w:val="21"/>
+        </w:rPr>
+        <w:t>. They improve on a direct-generation proxy but do not constitute complete lifecycle benchmarks.</w:t>
+      </w:r>
+    </w:p>
+    <w:p>
+      <w:r>
+        <w:rPr>
+          <w:rFonts w:ascii="Calibri" w:hAnsi="Calibri"/>
+          <w:sz w:val="21"/>
+        </w:rPr>
+        <w:t>The provider scope includes trade, transmission and distribution losses, and upstream fuel supply. Generation infrastructure is included only for the provider-specified gas, oil, coal, solar, wind, and geothermal technologies; other generation infrastructure and transmission/distribution infrastructure are outside scope [47]. The very low factors in some hydropower-dominated systems must not be interpreted as complete electricity LCAs.</w:t>
+      </w:r>
+    </w:p>
+    <w:p>
+      <w:pPr>
+        <w:pStyle w:val="Heading2"/>
+      </w:pPr>
+      <w:r>
+        <w:t>2.8. Extrapolation, boundary, and functional-unit diagnostics</w:t>
       </w:r>
     </w:p>
     <w:p>
@@ -1865,7 +2109,7 @@
           <w:rFonts w:ascii="Calibri" w:hAnsi="Calibri"/>
           <w:sz w:val="21"/>
         </w:rPr>
-        <w:t>Because an upstream lifecycle difference between eGRID and the GaBi anchors cannot be estimated from the released files, we did not assign a best value. Instead, we added transparent allowances of 0, 25, 50, 75, and 100 kg CO2e/MWh to every 2023 eGRID rate and recomputed architecture order. This is a boundary-mismatch stress, not an uncertainty distribution or estimate of upstream emissions. We also calculated the exact additive value that moves the lowest 2023 state rate to the cold-plate/single-phase crossover, (g^*-min(g_s)).</w:t>
+        <w:t>The earlier analysis added transparent allowances of 0, 25, 50, 75, and 100 kg CO2e/MWh to every 2023 eGRID rate. Those values were not data-based and are retained only in the Supplementary Information as a diagnostic of the direct generation boundary. The primary boundary analysis instead uses the partial linked-system factors in Section 2.7. We also report the exact numerical clearance between the lowest 2023 direct rate and the cold-plate/single-phase crossover, g^*-\min(g_s), without interpreting it as an upstream estimate.</w:t>
       </w:r>
     </w:p>
     <w:p>
@@ -1907,16 +2151,25 @@
         <w:pStyle w:val="Heading2"/>
       </w:pPr>
       <w:r>
-        <w:t>2.8. Assumption-block and dependence stress designs</w:t>
-      </w:r>
-    </w:p>
-    <w:p>
-      <w:r>
-        <w:rPr>
-          <w:rFonts w:ascii="Calibri" w:hAnsi="Calibri"/>
-          <w:sz w:val="21"/>
-        </w:rPr>
-        <w:t>Deterministic break-even values do not propagate interacting assumptions. We therefore ran seeded, 20,000-iteration triangular stress designs for the 2023 U.S. generation factor and the lowest-carbon 2023 state. The headline design used one shared grid multiplier and independent technology-specific multipliers for use phase, embodied contribution, and impact per equivalent service. It is the all-block, zero-correlation member of the dependence analysis described below. Three declared envelopes were used (Table 2).</w:t>
+        <w:t>2.9. Deterministic rank-robustness and secondary stress designs</w:t>
+      </w:r>
+    </w:p>
+    <w:p>
+      <w:r>
+        <w:rPr>
+          <w:rFonts w:ascii="Calibri" w:hAnsi="Calibri"/>
+          <w:sz w:val="21"/>
+        </w:rPr>
+        <w:t>The main robustness analysis uses equal relative half-widths so that one assumption block is not made influential merely by assigning it a wider range. For every Federal LCA Commons factor, we found the smallest half-width h at which the nominal numerical first rank could be reversed. Five sets were tested: shared grid only; technology-specific use phase only; embodied burden only; service equivalence only; and all four blocks at the same h. The grid multiplier was common and nonnegative. Foreground multipliers could vary in opposite adverse directions for the nominal winner and each competitor. All monotone adverse foreground directions and both shared-grid endpoints were evaluated, and the first crossing was found by bisection. The reported threshold is an exact certificate for the declared box, not a probability or empirical uncertainty interval.</w:t>
+      </w:r>
+    </w:p>
+    <w:p>
+      <w:r>
+        <w:rPr>
+          <w:rFonts w:ascii="Calibri" w:hAnsi="Calibri"/>
+          <w:sz w:val="21"/>
+        </w:rPr>
+        <w:t>For comparison with the earlier screening analysis, we also retained seeded, 20,000-iteration triangular stress designs for the 2023 U.S. generation factor and the lowest-carbon 2023 state. The headline design used one shared grid multiplier and independent technology-specific multipliers for use phase, embodied contribution, and impact per equivalent service. It is the all-block, zero-correlation member of the dependence analysis described below. Three declared envelopes were used (Table 2).</w:t>
       </w:r>
     </w:p>
     <w:p>
@@ -2408,7 +2661,7 @@
         <w:pStyle w:val="Heading2"/>
       </w:pPr>
       <w:r>
-        <w:t>2.9. Server, construction, and data-priority analyses</w:t>
+        <w:t>2.10. Server, construction, and data-priority analyses</w:t>
       </w:r>
     </w:p>
     <w:p>
@@ -2432,7 +2685,7 @@
           <w:rFonts w:ascii="Calibri" w:hAnsi="Calibri"/>
           <w:sz w:val="21"/>
         </w:rPr>
-        <w:t xml:space="preserve"> products with total GHG, manufacturing share, and lifetime. Manufacturing GHG was calculated as total product GHG times manufacturing share and annualized by declared lifetime. The minimum, quartiles, median, and maximum annualized values were divided by the empirical median and used only as common multiplicative stresses on the released compute, storage, and networking contributions. This preserves a unitless scale test without treating different servers as functionally interchangeable.</w:t>
+        <w:t xml:space="preserve"> products with total GHG, manufacturing share, and lifetime. Manufacturing GHG was calculated as total product GHG times manufacturing share and annualized by declared lifetime. The candidate-flow table retains all 55 server records: 48 met the three-field rule, while seven Lenovo records were excluded because manufacturing share was blank. No candidate was silently discarded. The minimum, quartiles, median, and maximum annualized values were divided by the empirical median and used only as common multiplicative stresses on the released compute, storage, and networking contributions. This preserves a unitless scale test without treating different servers as functionally interchangeable.</w:t>
       </w:r>
     </w:p>
     <w:p>
@@ -2508,34 +2761,34 @@
         <w:pStyle w:val="Heading2"/>
       </w:pPr>
       <w:r>
-        <w:t>2.10. Temporal performance, reliability, interoperability, and claims</w:t>
-      </w:r>
-    </w:p>
-    <w:p>
-      <w:r>
-        <w:rPr>
-          <w:rFonts w:ascii="Calibri" w:hAnsi="Calibri"/>
-          <w:sz w:val="21"/>
-        </w:rPr>
-        <w:t>The package can bilinearly interpolate bounded load-weather performance maps and integrate hourly PUE and grid factors. It rejects uncovered operating points unless extrapolation is explicitly enabled. The Fayetteville TMY file and synthetic performance surface are used only in software examples because no measured four-architecture surface was available.</w:t>
-      </w:r>
-    </w:p>
-    <w:p>
-      <w:r>
-        <w:rPr>
-          <w:rFonts w:ascii="Calibri" w:hAnsi="Calibri"/>
-          <w:sz w:val="21"/>
-        </w:rPr>
-        <w:t>Reliability is represented with Weibull failure, F(t)=1-\exp[-(t/\eta)^β], renewal expectation, and optional Arrhenius life acceleration. openLCA JSON-LD and Brightway mappings preserve process and flow identifiers, providers, units, locations, and uncertainty metadata. USLCI and GLAD imports therefore test exchange, not case-model completeness.</w:t>
-      </w:r>
-    </w:p>
-    <w:p>
-      <w:r>
-        <w:rPr>
-          <w:rFonts w:ascii="Calibri" w:hAnsi="Calibri"/>
-          <w:sz w:val="21"/>
-        </w:rPr>
-        <w:t>The audit checks source identity, duplicate identifiers, physical values, functional unit, boundary, uncertainty disclosure, evidence class, and intent to make a comparative assertion. Synthetic results cannot pass a public-claim gate. A public comparison additionally requires consistent boundaries, quantified uncertainty, and critical review consistent with ISO 14040, ISO 14044, and ISO 14071 [42,43]. Automated checks assist but do not constitute ISO conformity or independent review.</w:t>
+        <w:t>2.11. Temporal performance, reliability, interoperability, and claims</w:t>
+      </w:r>
+    </w:p>
+    <w:p>
+      <w:r>
+        <w:rPr>
+          <w:rFonts w:ascii="Calibri" w:hAnsi="Calibri"/>
+          <w:sz w:val="21"/>
+        </w:rPr>
+        <w:t>The package can bilinearly interpolate a bounded IT-load/dry-bulb performance map and integrate its cooling-only partial PUE against hourly conditions using one declared, constant grid factor. Wet-bulb values are schema-checked but are not an interpolation coordinate, and non-cooling facility overhead is outside this partial-PUE calculation. It rejects uncovered operating points; extrapolation is disabled. The Fayetteville TMY file and synthetic performance surface are used only in software examples because no measured four-architecture surface was available.</w:t>
+      </w:r>
+    </w:p>
+    <w:p>
+      <w:r>
+        <w:rPr>
+          <w:rFonts w:ascii="Calibri" w:hAnsi="Calibri"/>
+          <w:sz w:val="21"/>
+        </w:rPr>
+        <w:t>Reliability is represented with Weibull failure, F(t)=1-\exp[-(t/\eta)^β], renewal expectation, and optional Arrhenius life acceleration. openLCA JSON-LD and Brightway mappings preserve process and flow identifiers, providers, units, locations, and uncertainty metadata. USLCI and GLAD imports test exchange, not case-model completeness.</w:t>
+      </w:r>
+    </w:p>
+    <w:p>
+      <w:r>
+        <w:rPr>
+          <w:rFonts w:ascii="Calibri" w:hAnsi="Calibri"/>
+          <w:sz w:val="21"/>
+        </w:rPr>
+        <w:t>The scenario audit checks required metadata, duplicate identifiers, physical values, uncertainty declarations, evidence labels, and comparative intent. The comparison validator additionally requires matching functional units, system boundaries, electricity accounting, allocation and replacement rules, and LCIA methods. For a declared public assertion, each modeled input group must map to a registered source identifier. Synthetic inputs, unquantified uncertainty, and insufficient declared review remain blockers. These checks also reject non-finite numeric inputs, retain the field-to-source map in result manifests, and require a matching inclusion/exclusion record for custom comparative boundaries. They verify metadata consistency only: they cannot authenticate a citation, distribution, review status, physical model, or ISO conformity [31,32].</w:t>
       </w:r>
     </w:p>
     <w:p>
@@ -2551,16 +2804,25 @@
         <w:pStyle w:val="Heading2"/>
       </w:pPr>
       <w:r>
-        <w:t>3.1. Released totals were arithmetically reproducible</w:t>
-      </w:r>
-    </w:p>
-    <w:p>
-      <w:r>
-        <w:rPr>
-          <w:rFonts w:ascii="Calibri" w:hAnsi="Calibri"/>
-          <w:sz w:val="21"/>
-        </w:rPr>
-        <w:t>All 24 released combinations of architecture, electricity scenario, and impact metric reconciled to the sum of the published contributions at workbook precision. Under the released U.S. grid case, two-phase immersion reduced GHG 20.66%, primary energy 20.00%, and blue water 46.78% relative to air cooling. The arithmetic result shows that the public normalized table is internally reusable. It does not verify that the original inventories, quantities, or performance assumptions are independently valid.</w:t>
+        <w:t>3.1. Arithmetic reconstruction exposed an unresolved method identity</w:t>
+      </w:r>
+    </w:p>
+    <w:p>
+      <w:r>
+        <w:rPr>
+          <w:rFonts w:ascii="Calibri" w:hAnsi="Calibri"/>
+          <w:sz w:val="21"/>
+        </w:rPr>
+        <w:t>All 24 released combinations of architecture, electricity scenario, and impact metric reconciled to the seven published Figure-4 contributions at workbook precision. Under the released U.S. grid case, the reconstructed table reports 20.66% lower GHG, 20.00% lower primary energy, and 46.78% lower blue water for two-phase immersion than air cooling. These are reproduced source results, not independent comparisons.</w:t>
+      </w:r>
+    </w:p>
+    <w:p>
+      <w:r>
+        <w:rPr>
+          <w:rFonts w:ascii="Calibri" w:hAnsi="Calibri"/>
+          <w:sz w:val="21"/>
+        </w:rPr>
+        <w:t>The cell-level audit changed their permissible use. The article identifies AR5 GWP100, but the detailed workbook's numeric endpoint cells are labeled AR5 GTP100 and the corresponding GWP100 cells are blank. Comparative use-phase formulas also reference those blank F29 cells. The two numeric endpoints lack a resolved LCIA-method identity in the public archive. The implied use-phase response coefficients were 0.06317, 0.05364, 0.05259, and 0.05006 MWh/Vcore-year for air, cold plate, single-phase, and two-phase, respectively, with zero-intensity intercepts of 0.010-0.013 kg CO2e/Vcore-year. These slopes are useful diagnostics, but they are not independently measured electricity demand.</w:t>
       </w:r>
     </w:p>
     <w:p>
@@ -2573,7 +2835,7 @@
         <w:drawing>
           <wp:inline xmlns:a="http://schemas.openxmlformats.org/drawingml/2006/main" xmlns:pic="http://schemas.openxmlformats.org/drawingml/2006/picture">
             <wp:extent cx="5897880" cy="3408483"/>
-            <wp:docPr id="2" name="Picture 2" descr="Figure 2. Relative reductions versus air cooling obtained by summing the released Microsoft/WSP normalized contributions. All 24 totals were reconciled at workbook precision. This figure reproduces released arithmetic; it does not validate proprietary inventories or field performance." title="OpenDC-LCA Figure 2"/>
+            <wp:docPr id="2" name="Picture 2" descr="Figure 2. Relative reductions versus air cooling obtained by summing the released Microsoft/WSP normalized contributions. All 24 totals were reconciled at workbook precision. This figure reproduces released arithmetic; it does not validate inventories, method identity, or field performance." title="OpenDC-LCA Figure 2"/>
             <wp:cNvGraphicFramePr>
               <a:graphicFrameLocks noChangeAspect="1"/>
             </wp:cNvGraphicFramePr>
@@ -2613,7 +2875,7 @@
           <w:rFonts w:ascii="Calibri" w:hAnsi="Calibri"/>
           <w:sz w:val="18"/>
         </w:rPr>
-        <w:t>Figure 2. Relative reductions versus air cooling obtained by summing the released Microsoft/WSP normalized contributions. All 24 totals were reconciled at workbook precision. This figure reproduces released arithmetic; it does not validate proprietary inventories or field performance.</w:t>
+        <w:t>Figure 2. Relative reductions versus air cooling obtained by summing the released Microsoft/WSP normalized contributions. All 24 totals were reconciled at workbook precision. This figure reproduces released arithmetic; it does not validate inventories, method identity, or field performance.</w:t>
       </w:r>
     </w:p>
     <w:p>
@@ -2621,34 +2883,25 @@
         <w:pStyle w:val="Heading2"/>
       </w:pPr>
       <w:r>
-        <w:t>3.2. Historical grid decarbonization is robust to the eGRID GWP update</w:t>
-      </w:r>
-    </w:p>
-    <w:p>
-      <w:r>
-        <w:rPr>
-          <w:rFonts w:ascii="Calibri" w:hAnsi="Calibri"/>
-          <w:sz w:val="21"/>
-        </w:rPr>
-        <w:t>The common-basis U.S. generation factor declined from 517.731 kg CO2e/MWh in 2012 to 349.667 kg CO2e/MWh in 2023, a 32.462% reduction. The trajectory was not monotonic: the factor rose from 373.097 in 2020 to 388.699 in 2021 before declining. Reconstructing every year with AR5 GWP100 changed the provider-published national rate by no more than 0.248 kg CO2e/MWh, in 2012. Thus, the long-run decline is not an artifact of switching from SAR to AR4 and AR5. The direct CO2-only rate was 348.000 kg/MWh in 2023, confirming that CO2 dominates the eGRID total.</w:t>
-      </w:r>
-    </w:p>
-    <w:p>
-      <w:r>
-        <w:rPr>
-          <w:rFonts w:ascii="Calibri" w:hAnsi="Calibri"/>
-          <w:sz w:val="21"/>
-        </w:rPr>
-        <w:t>The 50-state-plus-DC reconstruction matched the official national total through 2018. From 2019 onward it was 0.32-0.43% lower because the panel covered 99.55-99.58% of the provider U.S. generation after excluding Puerto Rico. This scope audit supports use of the provider U.S. aggregate for the national series.</w:t>
-      </w:r>
-    </w:p>
-    <w:p>
-      <w:r>
-        <w:rPr>
-          <w:rFonts w:ascii="Calibri" w:hAnsi="Calibri"/>
-          <w:sz w:val="21"/>
-        </w:rPr>
-        <w:t>Applying the fixed released foreground model reduced the national air-cooled screen from 36.230 to 25.613 kg CO2e/Vcore-year and the two-phase screen from 28.746 to 20.333. The absolute two-phase-versus-air difference contracted 29.45%, from 7.484 to 5.280 kg CO2e/Vcore-year, while the air-cooled embodied share rose from 9.69% to 13.71%.</w:t>
+        <w:t>3.2. The historical direct-generation trend is insensitive to eGRID's GWP update</w:t>
+      </w:r>
+    </w:p>
+    <w:p>
+      <w:r>
+        <w:rPr>
+          <w:rFonts w:ascii="Calibri" w:hAnsi="Calibri"/>
+          <w:sz w:val="21"/>
+        </w:rPr>
+        <w:t>The common-basis U.S. generation factor declined from 517.731 kg CO2e/MWh in 2012 to 349.667 kg CO2e/MWh in 2023, a 32.462% reduction. The trajectory was not monotonic: the factor rose from 373.097 in 2020 to 388.699 in 2021 before declining. Reconstructing every year with AR5 GWP100 changed the provider-published national rate by no more than 0.248 kg CO2e/MWh, in 2012. The direct CO2-only rate was 348.000 kg/MWh in 2023. Thus, the long-run decline is not an artifact of eGRID's transition from SAR to AR4 and AR5.</w:t>
+      </w:r>
+    </w:p>
+    <w:p>
+      <w:r>
+        <w:rPr>
+          <w:rFonts w:ascii="Calibri" w:hAnsi="Calibri"/>
+          <w:sz w:val="21"/>
+        </w:rPr>
+        <w:t>The 50-state-plus-DC reconstruction matched the official national result through 2018. From 2019 onward it was 0.32-0.43% lower because the panel covered 99.55-99.58% of the provider U.S. generation after excluding Puerto Rico. We retained the provider aggregate for the national series. Across the full panel, 137 of 459 numerical rates lay outside the two released cooling anchors, so 29.85% of the transfers were extrapolations.</w:t>
       </w:r>
     </w:p>
     <w:p>
@@ -2661,7 +2914,7 @@
         <w:drawing>
           <wp:inline xmlns:a="http://schemas.openxmlformats.org/drawingml/2006/main" xmlns:pic="http://schemas.openxmlformats.org/drawingml/2006/picture">
             <wp:extent cx="5897880" cy="3324930"/>
-            <wp:docPr id="3" name="Picture 3" descr="Figure 3. Harmonized AR5-GWP100 eGRID state/DC generation rates for nine releases. Orange denotes the provider U.S. aggregate. Blue points fall below the released-model cold-plate/single-phase crossover. The panel shows generation-rate scenarios, not consumption-based lifecycle electricity or independent state LCAs." title="OpenDC-LCA Figure 3"/>
+            <wp:docPr id="3" name="Picture 3" descr="Figure 3. Harmonized AR5-GWP100 eGRID state/DC generation rates for nine releases. Orange denotes the provider U.S. aggregate. Blue points fall below the released-model numerical cold-plate/single-phase crossover. These are direct-generation scenarios, not consumption LCIs or state cooling LCAs." title="OpenDC-LCA Figure 3"/>
             <wp:cNvGraphicFramePr>
               <a:graphicFrameLocks noChangeAspect="1"/>
             </wp:cNvGraphicFramePr>
@@ -2701,7 +2954,7 @@
           <w:rFonts w:ascii="Calibri" w:hAnsi="Calibri"/>
           <w:sz w:val="18"/>
         </w:rPr>
-        <w:t>Figure 3. Harmonized AR5-GWP100 eGRID state/DC generation rates for nine releases. Orange denotes the provider U.S. aggregate. Blue points fall below the released-model cold-plate/single-phase crossover. The panel shows generation-rate scenarios, not consumption-based lifecycle electricity or independent state LCAs.</w:t>
+        <w:t>Figure 3. Harmonized AR5-GWP100 eGRID state/DC generation rates for nine releases. Orange denotes the provider U.S. aggregate. Blue points fall below the released-model numerical cold-plate/single-phase crossover. These are direct-generation scenarios, not consumption LCIs or state cooling LCAs.</w:t>
       </w:r>
     </w:p>
     <w:p>
@@ -2709,69 +2962,43 @@
         <w:pStyle w:val="Heading2"/>
       </w:pPr>
       <w:r>
-        <w:t>3.3. The local crossover is more sensitive to boundary than to historical GWP convention</w:t>
-      </w:r>
-    </w:p>
-    <w:p>
-      <w:r>
-        <w:rPr>
-          <w:rFonts w:ascii="Calibri" w:hAnsi="Calibri"/>
-          <w:sz w:val="21"/>
-        </w:rPr>
-        <w:t>The cold-plate/single-phase crossover calculated from the two released endpoints was 96.704 kg CO2e/MWh. At unadjusted 2023 eGRID rates, Vermont (23.695 kg CO2e/MWh) was the only state below the crossover; the other 50 state/DC records favored single-phase over cold plate. Arkansas (452.873 kg CO2e/MWh) was well above it. Two-phase remained the deterministic first-ranked architecture in all 51 records.</w:t>
-      </w:r>
-    </w:p>
-    <w:p>
-      <w:r>
-        <w:rPr>
-          <w:rFonts w:ascii="Calibri" w:hAnsi="Calibri"/>
-          <w:sz w:val="21"/>
-        </w:rPr>
-        <w:t>However, the transformation was not interpolation for much of the panel. Across 459 state-years, 322 rates were between the released anchors, one below the wind anchor, and 136 above the grid anchor. Thus 137 records, or 29.85%, required extrapolation. In 2023, 9 of 51 rates (17.65%) exceeded the released grid anchor.</w:t>
-      </w:r>
-    </w:p>
-    <w:p>
-      <w:r>
-        <w:rPr>
-          <w:rFonts w:ascii="Calibri" w:hAnsi="Calibri"/>
-          <w:sz w:val="21"/>
-        </w:rPr>
-        <w:t>The boundary allowance revealed a sharper limitation. The Vermont cold-plate/single-phase result persisted with 25 and 50 kg CO2e/MWh added to the direct generation rate, but disappeared at 75 and 100 kg CO2e/MWh. The analytical clearance was 96.704-23.695 = 73.009 kg CO2e/MWh; 75 kg CO2e/MWh is therefore only the first point in the declared 25-unit grid above the exact threshold, not an estimate of upstream emissions. Two-phase remained first in 51/51 states across all five allowance levels. This does not estimate the missing upstream inventory. It shows that the headline “one state below the crossover” is conditional on treating methodologically different electricity results as a common numerical index.</w:t>
-      </w:r>
-    </w:p>
-    <w:p>
-      <w:pPr>
-        <w:pStyle w:val="Heading2"/>
-      </w:pPr>
-      <w:r>
-        <w:t>3.4. Foreground variation and dependence weaken a deterministic first rank</w:t>
-      </w:r>
-    </w:p>
-    <w:p>
-      <w:r>
-        <w:rPr>
-          <w:rFonts w:ascii="Calibri" w:hAnsi="Calibri"/>
-          <w:sz w:val="21"/>
-        </w:rPr>
-        <w:t>Figure 4 consolidates the extrapolation, boundary, zero-correlation all-block stress, and functional-unit diagnostics. Under the 2023 U.S. generation context, two-phase first-rank frequency was 99.19% in the narrow envelope, 76.17% in the screening envelope, and 55.05% in the wide envelope. Cold plate, single-phase, and air cooling had wide-envelope first-rank frequencies of 19.15%, 25.47%, and 0.34%, respectively.</w:t>
-      </w:r>
-    </w:p>
-    <w:p>
-      <w:r>
-        <w:rPr>
-          <w:rFonts w:ascii="Calibri" w:hAnsi="Calibri"/>
-          <w:sz w:val="21"/>
-        </w:rPr>
-        <w:t>Sensitivity was greater at the lowest-carbon state. Two-phase first-rank frequency was 63.03%, 42.72%, and 32.43% in the narrow, screening, and wide envelopes. Even a narrow perturbation matters when use-phase burdens contract and the alternatives are close. These values are not technology-success probabilities. They quantify how frequently a ranking survives a specified assumption design.</w:t>
-      </w:r>
-    </w:p>
-    <w:p>
-      <w:r>
-        <w:rPr>
-          <w:rFonts w:ascii="Calibri" w:hAnsi="Calibri"/>
-          <w:sz w:val="21"/>
-        </w:rPr>
-        <w:t>The deterministic functional-unit diagnostic reached the same conclusion from another direction. Across 2023 states, the median adverse correction to two-phase impact per equivalent useful computation required to equal the runner-up was 5.503%; the range was 5.236-6.042%. Across all 459 state-years, the median was 5.436%. A useful-computation correction of this magnitude is small enough that server count, throughput, throttling, reliability, and lifetime must be measured rather than assumed for a decision-grade claim.</w:t>
+        <w:t>3.3. Consumption-system factors remove the arbitrary boundary adder but retain documented cutoffs</w:t>
+      </w:r>
+    </w:p>
+    <w:p>
+      <w:r>
+        <w:rPr>
+          <w:rFonts w:ascii="Calibri" w:hAnsi="Calibri"/>
+          <w:sz w:val="21"/>
+        </w:rPr>
+        <w:t>The 71 non-residual Federal LCA Commons systems ranged from 0.921 to 987.844 kg CO2e/MWh. The national linked-system factor was 422.931 kg CO2e/MWh: 369.848 from electricity-generation processes and 53.084 from other linked upstream and infrastructure processes. It exceeded the 2023 national eGRID direct-generation rate by 73.264 kg CO2e/MWh, although the difference also contains consumption-mix, delivery-loss, flow-coverage, and boundary effects and is not an isolated upstream correction.</w:t>
+      </w:r>
+    </w:p>
+    <w:p>
+      <w:r>
+        <w:rPr>
+          <w:rFonts w:ascii="Calibri" w:hAnsi="Calibri"/>
+          <w:sz w:val="21"/>
+        </w:rPr>
+        <w:t>All 10 FERC-region systems exceeded the 96.704 kg CO2e/MWh numerical cold-plate/single-phase crossover; they ranged from 238.897 kg CO2e/MWh for NYISO to 557.110 kg CO2e/MWh for MISO. Ten of 60 balancing-authority systems fell below the crossover, and 15 of all 71 systems exceeded the released high anchor of 524.893 kg CO2e/MWh. The numerical cooling screen placed two-phase first in all 71 systems, but this is not a common-method comparative LCA because the cooling foreground method remains unresolved.</w:t>
+      </w:r>
+    </w:p>
+    <w:p>
+      <w:r>
+        <w:rPr>
+          <w:rFonts w:ascii="Calibri" w:hAnsi="Calibri"/>
+          <w:sz w:val="21"/>
+        </w:rPr>
+        <w:t>The national result converged in five fixed-point iterations with a balance residual of zero at the reporting precision, using 582 processes and 1,174 links. It also contained 287 unlinked technosphere exchanges across 47 processes, including fuels, construction materials, chemicals, and reclaimed water. Their upstream burdens were zero in the linked calculation and were not bounded. The factor is more complete than eGRID direct emissions but still a partial linked-system result.</w:t>
+      </w:r>
+    </w:p>
+    <w:p>
+      <w:r>
+        <w:rPr>
+          <w:rFonts w:ascii="Calibri" w:hAnsi="Calibri"/>
+          <w:sz w:val="21"/>
+        </w:rPr>
+        <w:t>The national residual-consumption system was 455.350 kg CO2e/MWh, comprising 399.934 from generation processes and 55.417 from other linked processes. It was 7.67% above the ordinary consumption-system result. This difference is an electricity-accounting sensitivity, not an uncertainty interval, and the two accounting products were not mixed within any cooling screen.</w:t>
       </w:r>
     </w:p>
     <w:p>
@@ -2783,8 +3010,8 @@
       <w:r>
         <w:drawing>
           <wp:inline xmlns:a="http://schemas.openxmlformats.org/drawingml/2006/main" xmlns:pic="http://schemas.openxmlformats.org/drawingml/2006/picture">
-            <wp:extent cx="5897880" cy="3735324"/>
-            <wp:docPr id="4" name="Picture 4" descr="Figure 4. Robustness diagnostics. (A) Anchor interpolation and extrapolation counts. (B) Cold-plate/single-phase order under a transparent electricity-boundary allowance. (C) U.S. first-rank frequencies under declared joint stress envelopes. (D) two-phase impact-per-service correction required to erase first rank. Stress frequencies are not confidence levels." title="OpenDC-LCA Figure 4"/>
+            <wp:extent cx="5897880" cy="4030218"/>
+            <wp:docPr id="4" name="Picture 4" descr="Figure 4. IPCC AR5-GWP100 partial linked-system electricity factors for 10 FERC regions and the United States. Bars separate generation-process impacts from other linked upstream and infrastructure impacts. Vertical lines show the two released numerical cooling landmarks; they do not create method equivalence." title="OpenDC-LCA Figure 4"/>
             <wp:cNvGraphicFramePr>
               <a:graphicFrameLocks noChangeAspect="1"/>
             </wp:cNvGraphicFramePr>
@@ -2792,7 +3019,7 @@
               <a:graphicData uri="http://schemas.openxmlformats.org/drawingml/2006/picture">
                 <pic:pic>
                   <pic:nvPicPr>
-                    <pic:cNvPr id="0" name="figure8_scope_uncertainty.png"/>
+                    <pic:cNvPr id="0" name="figure10_lifecycle_electricity.png"/>
                     <pic:cNvPicPr/>
                   </pic:nvPicPr>
                   <pic:blipFill>
@@ -2804,7 +3031,7 @@
                   <pic:spPr>
                     <a:xfrm>
                       <a:off x="0" y="0"/>
-                      <a:ext cx="5897880" cy="3735324"/>
+                      <a:ext cx="5897880" cy="4030218"/>
                     </a:xfrm>
                     <a:prstGeom prst="rect"/>
                   </pic:spPr>
@@ -2824,34 +3051,51 @@
           <w:rFonts w:ascii="Calibri" w:hAnsi="Calibri"/>
           <w:sz w:val="18"/>
         </w:rPr>
-        <w:t>Figure 4. Robustness diagnostics. (A) Anchor interpolation and extrapolation counts. (B) Cold-plate/single-phase order under a transparent electricity-boundary allowance. (C) U.S. first-rank frequencies under declared joint stress envelopes. (D) two-phase impact-per-service correction required to erase first rank. Stress frequencies are not confidence levels.</w:t>
-      </w:r>
-    </w:p>
-    <w:p>
-      <w:r>
-        <w:rPr>
-          <w:rFonts w:ascii="Calibri" w:hAnsi="Calibri"/>
-          <w:sz w:val="21"/>
-        </w:rPr>
-        <w:t>The block-and-dependence analysis explains why those frequencies change (Figure 5). Grid-rate variation alone never displaced two-phase in any tested U.S. design. In the screening envelope with independent technology-specific errors, two-phase retained first rank in 98.29% of use-only, 86.75% of embodied-only, and 96.00% of service-only draws; with all blocks active the frequency was 76.17%. The wide-envelope counterparts were 79.52%, 63.36%, 73.90%, and 55.05%. Embodied variation was therefore the largest one-block source of rank loss under the declared marginal widths.</w:t>
-      </w:r>
-    </w:p>
-    <w:p>
-      <w:r>
-        <w:rPr>
-          <w:rFonts w:ascii="Calibri" w:hAnsi="Calibri"/>
-          <w:sz w:val="21"/>
-        </w:rPr>
-        <w:t>Dependence was equally important. In the wide all-block design, the U.S. two-phase first-rank frequency increased from 55.05% at zero latent correlation to 64.50% at 0.5 and 100% when technology-specific errors were fully common-mode. The last case does not prove robustness; it shows that common errors preserve relative ordering while independent architecture errors erode it. A rank frequency without a defensible correlation model is therefore under-specified even when every marginal range is disclosed.</w:t>
-      </w:r>
-    </w:p>
-    <w:p>
-      <w:r>
-        <w:rPr>
-          <w:rFonts w:ascii="Calibri" w:hAnsi="Calibri"/>
-          <w:sz w:val="21"/>
-        </w:rPr>
-        <w:t>The nested convergence check separated Monte Carlo noise from model-form sensitivity. For the three U.S. envelopes, the 20,000-draw frequencies differed from the 80,000-draw results by 0.06, 0.06, and 0.11 percentage points; the 80,000-draw numerical standard errors were 0.031, 0.151, and 0.176 percentage points. Across both locations and all envelopes, the largest 20,000-to-80,000 difference was 0.709 percentage points, for the low-carbon wide case. These differences are small relative to the 44.14-percentage-point change between the U.S. narrow and wide designs and the 44.95-percentage-point change between zero-correlation and common-mode U.S. wide designs. Sampling noise therefore does not explain the central sensitivity result.</w:t>
+        <w:t>Figure 4. IPCC AR5-GWP100 partial linked-system electricity factors for 10 FERC regions and the United States. Bars separate generation-process impacts from other linked upstream and infrastructure impacts. Vertical lines show the two released numerical cooling landmarks; they do not create method equivalence.</w:t>
+      </w:r>
+    </w:p>
+    <w:p>
+      <w:pPr>
+        <w:pStyle w:val="Heading2"/>
+      </w:pPr>
+      <w:r>
+        <w:t>3.4. Equal-width bounds identify service equivalence and use phase as the limiting blocks</w:t>
+      </w:r>
+    </w:p>
+    <w:p>
+      <w:r>
+        <w:rPr>
+          <w:rFonts w:ascii="Calibri" w:hAnsi="Calibri"/>
+          <w:sz w:val="21"/>
+        </w:rPr>
+        <w:t>At the national lifecycle factor, the numerical two-phase first rank could not be reversed by a shared grid-factor change within the tested nonnegative range through a 99.999% half-width. With technology-specific variation, reversal occurred at 2.994% for use phase, 22.154% for embodied burden, and 2.637% for service equivalence. When all four blocks used the same half-width, the first reversal occurred at 1.318%, against single-phase.</w:t>
+      </w:r>
+    </w:p>
+    <w:p>
+      <w:r>
+        <w:rPr>
+          <w:rFonts w:ascii="Calibri" w:hAnsi="Calibri"/>
+          <w:sz w:val="21"/>
+        </w:rPr>
+        <w:t>Across all 71 electricity contexts, the all-block critical half-width ranged from 1.123% at PUD No. 1 of Douglas County to 1.479% at Duke Energy Progress West. At the lowest-carbon system, the critical competitor was cold plate; the embodied-only and service-only thresholds were 2.291% and 2.246%, while use-phase and shared-grid changes did not reverse rank through 99.999%. The ranking is numerically fragile even though it survives every unperturbed electricity factor.</w:t>
+      </w:r>
+    </w:p>
+    <w:p>
+      <w:r>
+        <w:rPr>
+          <w:rFonts w:ascii="Calibri" w:hAnsi="Calibri"/>
+          <w:sz w:val="21"/>
+        </w:rPr>
+        <w:t>This equalized analysis reverses one conclusion from the earlier triangular stress design. Embodied variation had appeared to cause the largest rank loss because its assigned half-width was 10 times those of use phase and service. At equal widths, embodied burden has the largest national one-block tolerance; service equivalence and use phase are limiting. The earlier stress frequencies and their dependence/convergence diagnostics remain in the Supplementary Information as evidence about the chosen design, not the technologies.</w:t>
+      </w:r>
+    </w:p>
+    <w:p>
+      <w:r>
+        <w:rPr>
+          <w:rFonts w:ascii="Calibri" w:hAnsi="Calibri"/>
+          <w:sz w:val="21"/>
+        </w:rPr>
+        <w:t>The one-sided functional-unit diagnostic gives a complementary threshold: across 2023 direct-rate contexts, a 5.24-6.04% adverse correction to two-phase impact per equivalent useful computation would erase its numerical first rank. This is a break-even requirement for future measurements, not an observed performance difference.</w:t>
       </w:r>
     </w:p>
     <w:p>
@@ -2864,7 +3108,7 @@
         <w:drawing>
           <wp:inline xmlns:a="http://schemas.openxmlformats.org/drawingml/2006/main" xmlns:pic="http://schemas.openxmlformats.org/drawingml/2006/picture">
             <wp:extent cx="5897880" cy="3538728"/>
-            <wp:docPr id="5" name="Picture 5" descr="Figure 5. Assumption-block and dependence diagnostic for the 2023 U.S. generation context. Cells report two-phase first-rank frequency under declared screening and wide triangular marginals. Grid-only variation is shared. Technology-specific use, embodied, and service multipliers use a Gaussian copula with declared latent correlation. These are sensitivity designs, not empirical probabilities." title="OpenDC-LCA Figure 5"/>
+            <wp:docPr id="5" name="Picture 5" descr="Figure 5. Deterministic equal-width rank-robustness certificates. (A) National critical half-width by active block. (B) all-block thresholds across 60 balancing authorities, 10 FERC regions, and the national system. Bounds are uncertainty sets, not probability distributions or physical validation." title="OpenDC-LCA Figure 5"/>
             <wp:cNvGraphicFramePr>
               <a:graphicFrameLocks noChangeAspect="1"/>
             </wp:cNvGraphicFramePr>
@@ -2872,7 +3116,7 @@
               <a:graphicData uri="http://schemas.openxmlformats.org/drawingml/2006/picture">
                 <pic:pic>
                   <pic:nvPicPr>
-                    <pic:cNvPr id="0" name="figure9_stress_structure.png"/>
+                    <pic:cNvPr id="0" name="figure11_standardized_robustness.png"/>
                     <pic:cNvPicPr/>
                   </pic:nvPicPr>
                   <pic:blipFill>
@@ -2904,7 +3148,7 @@
           <w:rFonts w:ascii="Calibri" w:hAnsi="Calibri"/>
           <w:sz w:val="18"/>
         </w:rPr>
-        <w:t>Figure 5. Assumption-block and dependence diagnostic for the 2023 U.S. generation context. Cells report two-phase first-rank frequency under declared screening and wide triangular marginals. Grid-only variation is shared. Technology-specific use, embodied, and service multipliers use a Gaussian copula with declared latent correlation. These are sensitivity designs, not empirical probabilities.</w:t>
+        <w:t>Figure 5. Deterministic equal-width rank-robustness certificates. (A) National critical half-width by active block. (B) all-block thresholds across 60 balancing authorities, 10 FERC regions, and the national system. Bounds are uncertainty sets, not probability distributions or physical validation.</w:t>
       </w:r>
     </w:p>
     <w:p>
@@ -2921,7 +3165,22 @@
           <w:rFonts w:ascii="Calibri" w:hAnsi="Calibri"/>
           <w:sz w:val="21"/>
         </w:rPr>
-        <w:t>The 48 Boavizta server records spanned 465-2,503 kg CO2e/server for manufacturing, a 5.38-fold range. Annualized values spanned 116-626 kg CO2e/server-year. Commonly scaling the released server-related contributions across the empirical 0.38-2.06-fold annualized envelope did not change the deterministic two-phase first rank. That result is a structural stress only: it does not model architecture-specific server count, configuration, throughput, or lifetime.</w:t>
+        <w:t xml:space="preserve">Of 55 Boavizta </w:t>
+      </w:r>
+      <w:r>
+        <w:rPr>
+          <w:rFonts w:ascii="Courier New" w:hAnsi="Courier New"/>
+          <w:color w:val="17324D"/>
+          <w:sz w:val="20"/>
+        </w:rPr>
+        <w:t>Datacenter/Server</w:t>
+      </w:r>
+      <w:r>
+        <w:rPr>
+          <w:rFonts w:ascii="Calibri" w:hAnsi="Calibri"/>
+          <w:sz w:val="21"/>
+        </w:rPr>
+        <w:t xml:space="preserve"> candidates, 48 included records spanned 465-2,503 kg CO2e/server for manufacturing, a 5.38-fold range. Annualized values spanned 116-626 kg CO2e/server-year. Commonly scaling the released server-related contributions across the empirical 0.38-2.06-fold annualized envelope did not change the deterministic two-phase first rank. That result is a structural stress only: it does not model architecture-specific server count, configuration, throughput, or lifetime.</w:t>
       </w:r>
     </w:p>
     <w:p>
@@ -2964,25 +3223,25 @@
         <w:pStyle w:val="Heading2"/>
       </w:pPr>
       <w:r>
-        <w:t>3.7. Software consistency and practitioner outputs</w:t>
-      </w:r>
-    </w:p>
-    <w:p>
-      <w:r>
-        <w:rPr>
-          <w:rFonts w:ascii="Calibri" w:hAnsi="Calibri"/>
-          <w:sz w:val="21"/>
-        </w:rPr>
-        <w:t>With the local evidence archive present, all 49 tests pass. They cover calculation, interoperability, reliability, public-data parsing, practitioner workflow, research analysis, GUI/API parity, endpoint reproduction, eGRID harmonization, extrapolation counts, boundary stress, and functional-unit sensitivity, stress-design determinism, and provenance-integrity checks. In a clone-only clean environment, 41 tests pass and 8 paper-reconstruction tests are skipped explicitly because they require locally held provider files; no dummy data replace those files. The clean install also completed example export, scenario analysis, and practitioner-report generation.</w:t>
-      </w:r>
-    </w:p>
-    <w:p>
-      <w:r>
-        <w:rPr>
-          <w:rFonts w:ascii="Calibri" w:hAnsi="Calibri"/>
-          <w:sz w:val="21"/>
-        </w:rPr>
-        <w:t>A practitioner supplies IT capacity, utilization, PUE, facility lifetime, onsite water, location- and market-based electricity factors, optional equipment/fluid inventories, and a citable source record. The package returns annual and per-IT-MWh impacts, contribution breakdowns, evidence classification, warnings or blockers, a scenario digest, model version, and the next-data list. Advanced users can add hourly performance maps, replacement and reliability, and openLCA/Brightway inventories. Software consistency does not validate user inputs or make a screening result decision-grade.</w:t>
+        <w:t>3.7. Software checks and practitioner outputs</w:t>
+      </w:r>
+    </w:p>
+    <w:p>
+      <w:r>
+        <w:rPr>
+          <w:rFonts w:ascii="Calibri" w:hAnsi="Calibri"/>
+          <w:sz w:val="21"/>
+        </w:rPr>
+        <w:t>The full local test suite covers calculation, fluid mass conservation, interoperability, reliability, public-data parsing, practitioner workflow, GUI/API parity, endpoint reconstruction, eGRID harmonization, Federal LCA Commons process-system solution, cutoff reporting, equal-width robustness, comparison incompatibility, field-level lineage, stress-design determinism, and provenance integrity. Paper-reconstruction tests skip explicitly when locally held provider files are absent; no substitute values are inserted.</w:t>
+      </w:r>
+    </w:p>
+    <w:p>
+      <w:r>
+        <w:rPr>
+          <w:rFonts w:ascii="Calibri" w:hAnsi="Calibri"/>
+          <w:sz w:val="21"/>
+        </w:rPr>
+        <w:t>A practitioner supplies IT capacity, utilization, PUE, facility lifetime, onsite water, location- and market-based electricity factors, optional equipment/fluid inventories, and a citable source record. The package returns annual and per-IT-MWh impacts, contribution breakdowns, evidence classification, warnings or blockers, a scenario digest, model version, and the next-data list. Advanced users can add hourly performance maps, replacement and reliability, and openLCA/Brightway inventories. Software consistency does not validate user inputs, the truth of metadata labels, or the physical adequacy of a screening model.</w:t>
       </w:r>
     </w:p>
     <w:p>
@@ -2998,25 +3257,25 @@
         <w:pStyle w:val="Heading2"/>
       </w:pPr>
       <w:r>
-        <w:t>4.1. A cooling ranking should be a decision surface, not a league table</w:t>
-      </w:r>
-    </w:p>
-    <w:p>
-      <w:r>
-        <w:rPr>
-          <w:rFonts w:ascii="Calibri" w:hAnsi="Calibri"/>
-          <w:sz w:val="21"/>
-        </w:rPr>
-        <w:t>The released model produces a clear deterministic ranking at its U.S. grid endpoint, and two-phase remains first in every unperturbed state-year screen. If the analysis ended there, the natural conclusion would be that the ranking is broadly transferable. The robustness diagnostics show why that conclusion is too strong.</w:t>
-      </w:r>
-    </w:p>
-    <w:p>
-      <w:r>
-        <w:rPr>
-          <w:rFonts w:ascii="Calibri" w:hAnsi="Calibri"/>
-          <w:sz w:val="21"/>
-        </w:rPr>
-        <w:t>Cold plate and single-phase cross because their electricity-dependent slopes and non-use-phase intercepts differ. The 96.7 kg CO2e/MWh crossover is a useful engineering result: it identifies where a small operational advantage changes the lifecycle order. It is not a site recommendation because eGRID does not replace the released GaBi electricity process. Similarly, two-phase has a 5-6% deterministic margin in impact per equivalent service, but its first-rank frequency falls sharply once use, embodied, grid, and service assumptions vary together. A decision surface should therefore report at least the base order, crossover, anchor coverage, boundary sensitivity, functional-unit sensitivity, and evidence class.</w:t>
+        <w:t>4.1. The central result is a claim boundary, not a cooling winner</w:t>
+      </w:r>
+    </w:p>
+    <w:p>
+      <w:r>
+        <w:rPr>
+          <w:rFonts w:ascii="Calibri" w:hAnsi="Calibri"/>
+          <w:sz w:val="21"/>
+        </w:rPr>
+        <w:t>The released table and every unperturbed electricity screen place two-phase first. Three independent findings prevent that order from becoming a public comparative conclusion: the archive does not resolve the climate method of the numeric electricity endpoints; the cooling foreground cannot be recalculated under the same AR5 method as the electricity inventories; and useful computation has not been measured across the four architectures. The most important outcome is the boundary between reproduced arithmetic and a physically identified comparison.</w:t>
+      </w:r>
+    </w:p>
+    <w:p>
+      <w:r>
+        <w:rPr>
+          <w:rFonts w:ascii="Calibri" w:hAnsi="Calibri"/>
+          <w:sz w:val="21"/>
+        </w:rPr>
+        <w:t>The 96.704 kg CO2e/MWh cold-plate/single-phase crossover is a property of two released numerical endpoints. It helps locate where their affine lines cross, but it is not an environmental threshold for a real site. Likewise, survival across 71 electricity factors explores one background dimension; it does not provide 71 independent observations of cooling performance. A transferable assessment must report the numerical result together with its functional unit, method identity, system boundary, cutoff structure, robustness definition, and claim status.</w:t>
       </w:r>
     </w:p>
     <w:p>
@@ -3024,34 +3283,25 @@
         <w:pStyle w:val="Heading2"/>
       </w:pPr>
       <w:r>
-        <w:t>4.2. Characterization harmonization solves a smaller problem than boundary alignment</w:t>
-      </w:r>
-    </w:p>
-    <w:p>
-      <w:r>
-        <w:rPr>
-          <w:rFonts w:ascii="Calibri" w:hAnsi="Calibri"/>
-          <w:sz w:val="21"/>
-        </w:rPr>
-        <w:t>Reconstructing the nine eGRID releases to AR5 GWP100 was necessary and reproducible. It also demonstrated that the historical GWP changes have a small numerical effect because power-sector CO2 dominates CH4 and N2O. The 32.46% national decline is robust to this methodological change.</w:t>
-      </w:r>
-    </w:p>
-    <w:p>
-      <w:r>
-        <w:rPr>
-          <w:rFonts w:ascii="Calibri" w:hAnsi="Calibri"/>
-          <w:sz w:val="21"/>
-        </w:rPr>
-        <w:t>The boundary mismatch is qualitatively different. eGRID total-output rates omit upstream fuel supply, infrastructure, imports and transmission, while the GaBi anchors are lifecycle results. The two also use GWP100 and GTP100, respectively. No algebra can make them equivalent without a linked inventory and common LCIA method. The exact 73.009 kg CO2e/MWh clearance and the declared 25-unit stress grid are useful because they do not pretend to know the missing value. They show how large an additive boundary term must be to remove the local crossover while leaving its actual physical magnitude unresolved. The deterministic two-phase first rank is less sensitive within this single dimension.</w:t>
-      </w:r>
-    </w:p>
-    <w:p>
-      <w:r>
-        <w:rPr>
-          <w:rFonts w:ascii="Calibri" w:hAnsi="Calibri"/>
-          <w:sz w:val="21"/>
-        </w:rPr>
-        <w:t>For a decision-grade extension, the correct next step is to replace the intensity index with consumption-based, lifecycle electricity processes calculated under the same LCIA method as the foreground. Location- and market-based cases should be modeled consistently throughout the product system to avoid renewable double counting [19,20].</w:t>
+        <w:t>4.2. Lifecycle electricity materially changes the boundary diagnosis</w:t>
+      </w:r>
+    </w:p>
+    <w:p>
+      <w:r>
+        <w:rPr>
+          <w:rFonts w:ascii="Calibri" w:hAnsi="Calibri"/>
+          <w:sz w:val="21"/>
+        </w:rPr>
+        <w:t>The eGRID reconstruction shows that the 32.46% historical national decline is robust to changing GWP conventions. The Federal LCA Commons calculation then replaces an arbitrary additive boundary allowance with a provider-linked consumption model. At the national point, linked upstream and infrastructure processes add 53.084 kg CO2e/MWh beyond generation processes, and the total is 73.264 kg CO2e/MWh above the eGRID national rate. All FERC regions lie above the numerical cold-plate/single-phase crossover.</w:t>
+      </w:r>
+    </w:p>
+    <w:p>
+      <w:r>
+        <w:rPr>
+          <w:rFonts w:ascii="Calibri" w:hAnsi="Calibri"/>
+          <w:sz w:val="21"/>
+        </w:rPr>
+        <w:t>This is a material advance, but not full harmonization. The difference between the two national factors also reflects delivery losses, consumption versus generation geography, and elementary-flow coverage. More importantly, 287 unlinked technosphere exchanges still carry zero upstream burden. A complete calculation requires those providers to be linked or their omitted impacts to be bounded and independently reproduced. Even then, electricity cannot repair the unresolved cooling-foreground LCIA method. Location- and market-based cases must also remain consistent throughout the product system [19,20]. The 7.67% national difference between ordinary and residual consumption mixes shows that the accounting choice is consequential even before the cooling foreground is harmonized.</w:t>
       </w:r>
     </w:p>
     <w:p>
@@ -3059,34 +3309,34 @@
         <w:pStyle w:val="Heading2"/>
       </w:pPr>
       <w:r>
-        <w:t>4.3. Dependence changes the epistemic status of the stress result</w:t>
-      </w:r>
-    </w:p>
-    <w:p>
-      <w:r>
-        <w:rPr>
-          <w:rFonts w:ascii="Calibri" w:hAnsi="Calibri"/>
-          <w:sz w:val="21"/>
-        </w:rPr>
-        <w:t>One-at-a-time break-even analysis is easy to interpret but can overstate robustness when inputs co-vary. The stress designs do not provide probability because neither the envelopes nor the copula correlations are fitted. They do yield two negative findings. First, deterministic survival across 459 grid factors does not imply survival under foreground and functional-unit changes; the grid panel explores one dimension repeatedly, not 459 replicates of the cooling technologies. Second, a first-rank frequency is not identified by its marginal ranges alone: the wide all-block value changed from 55.05% to 100% when only the dependence design changed from independent to common-mode.</w:t>
-      </w:r>
-    </w:p>
-    <w:p>
-      <w:r>
-        <w:rPr>
-          <w:rFonts w:ascii="Calibri" w:hAnsi="Calibri"/>
-          <w:sz w:val="21"/>
-        </w:rPr>
-        <w:t>The block decomposition also changes the measurement priority. Under the declared U.S. screening and wide designs, embodied-only variation displaced two-phase more often than use-only, service-only, or grid-only variation. That result does not assign real-world variance to embodied inventories. It shows that architecture-specific quantities, server configurations, service lives, and material inventories deserve the same experimental attention as cooling electricity once operational burdens contract.</w:t>
-      </w:r>
-    </w:p>
-    <w:p>
-      <w:r>
-        <w:rPr>
-          <w:rFonts w:ascii="Calibri" w:hAnsi="Calibri"/>
-          <w:sz w:val="21"/>
-        </w:rPr>
-        <w:t>This distinction should guide future experiments. Measured distributions are needed for load-dependent fan, pump, coolant-distribution, and heat-rejection power; server throughput and power; fluid loss; component life; and architecture-specific quantities. Correlations matter: a higher coolant temperature may reduce compressor energy while changing chip leakage, performance, and reliability; higher density may reduce building burden per Vcore while increasing local pumping or repair complexity. Empirical joint distributions would convert the present stress frequency into a defensible probability of rank and support expected-value-of-information analysis.</w:t>
+        <w:t>4.3. Equalized bounds correct an attribution error in the earlier stress design</w:t>
+      </w:r>
+    </w:p>
+    <w:p>
+      <w:r>
+        <w:rPr>
+          <w:rFonts w:ascii="Calibri" w:hAnsi="Calibri"/>
+          <w:sz w:val="21"/>
+        </w:rPr>
+        <w:t>The earlier triangular analysis assigned embodied burden a half-width 10 times the use-phase and service widths. Its conclusion that embodied variation was the largest one-block source of rank loss conflated sensitivity with an arbitrary range choice. The equal-width certificate separates those effects. At the national lifecycle factor, embodied burden can vary by 22.15% before a worst-case one-block reversal, whereas service equivalence and use phase require only 2.64% and 2.99%.</w:t>
+      </w:r>
+    </w:p>
+    <w:p>
+      <w:r>
+        <w:rPr>
+          <w:rFonts w:ascii="Calibri" w:hAnsi="Calibri"/>
+          <w:sz w:val="21"/>
+        </w:rPr>
+        <w:t>The all-block threshold of 1.32% is not a confidence bound. It is the radius of a specified box in which a shared grid multiplier and adverse technology-specific foreground multipliers cannot reverse the numerical first rank. Its value lies in falsifiability: any proposed empirical uncertainty model can be compared against the same bound structure. A probability of rank would additionally require measured marginal distributions and correlations [46].</w:t>
+      </w:r>
+    </w:p>
+    <w:p>
+      <w:r>
+        <w:rPr>
+          <w:rFonts w:ascii="Calibri" w:hAnsi="Calibri"/>
+          <w:sz w:val="21"/>
+        </w:rPr>
+        <w:t>This correction changes the near-term research priority. Measurements should first close functional equivalence and use-phase demand, while bills of quantities and material inventories remain necessary for a common-method lifecycle comparison. The legacy triangular results still demonstrate that dependence assumptions matter, but they do not rank the real-world importance of uncertainty blocks.</w:t>
       </w:r>
     </w:p>
     <w:p>
@@ -3103,7 +3353,7 @@
           <w:rFonts w:ascii="Calibri" w:hAnsi="Calibri"/>
           <w:sz w:val="21"/>
         </w:rPr>
-        <w:t>Vcore-year is more informative than facility area or rack count, but it is still a proxy. Equivalent useful computation depends on workload, accelerator utilization, memory and network constraints, throttling, overclocking, availability, and quality of service. The median 5.50% functional-unit threshold is therefore a central result, not merely a limitation. It defines the resolution required of a comparative experiment.</w:t>
+        <w:t>Vcore-year is more informative than facility area or rack count, but it is still a proxy. Equivalent useful computation depends on workload, accelerator utilization, memory and network constraints, throttling, overclocking, availability, and quality of service. The one-sided 5.50% median threshold and the symmetric 2.64% national service bound are break-even requirements, not measured penalties. They define the approximate resolution required of a comparative experiment. ITU-T L.1410 similarly requires an explicit functional unit and comparative baseline for ICT services [48].</w:t>
       </w:r>
     </w:p>
     <w:p>
@@ -3138,7 +3388,7 @@
           <w:rFonts w:ascii="Calibri" w:hAnsi="Calibri"/>
           <w:sz w:val="21"/>
         </w:rPr>
-        <w:t>This shift explains why the Boavizta and ÖKOBAUDAT datasets matter even though they were not inserted into architecture totals. The 5.38-fold server manufacturing range is larger than many cooling differences, but heterogeneous PCFs cannot be treated as an uncertainty distribution for interchangeable servers. The approximately 50-60% material-route GHG levers are large per kilogram, but kilograms by architecture are missing. The impactful research contribution is therefore a linked foreground dataset: useful computation, server configuration and lifetime, cooling BOM, material route, and measured operation under one functional unit.</w:t>
+        <w:t>This shift explains why the Boavizta and ÖKOBAUDAT datasets matter even though they were not inserted into architecture totals. The 5.38-fold server manufacturing range is larger than many cooling differences, but heterogeneous PCFs cannot be treated as an uncertainty distribution for interchangeable servers. The approximately 50-60% material-route GHG levers are large per kilogram, but kilograms by architecture are missing. The needed research product is a linked foreground dataset: useful computation, server configuration and lifetime, cooling bill of quantities, material route, and measured operation under one functional unit.</w:t>
       </w:r>
     </w:p>
     <w:p>
@@ -3155,7 +3405,7 @@
           <w:rFonts w:ascii="Calibri" w:hAnsi="Calibri"/>
           <w:sz w:val="21"/>
         </w:rPr>
-        <w:t>OpenDC-LCA does not compete with openLCA, Brightway, Temporalis, premise, or bw_timex. Those tools provide process-network calculation, database management, prospective backgrounds, or time-explicit LCA [24-26,31,32]. The contribution here is the cooling-domain contract around them:</w:t>
+        <w:t>OpenDC-LCA does not replace openLCA, Brightway, Temporalis, premise, or bw_timex. Those tools provide process-network calculation, database management, prospective backgrounds, or time-explicit LCA [24-26,33,34]. The assessment layer here adds:</w:t>
       </w:r>
     </w:p>
     <w:p>
@@ -3242,16 +3492,34 @@
           <w:rFonts w:ascii="Calibri" w:hAnsi="Calibri"/>
           <w:sz w:val="21"/>
         </w:rPr>
-        <w:t>6. a claim gate that prevents exchange success from being mistaken for case</w:t>
-      </w:r>
-    </w:p>
-    <w:p>
-      <w:r>
-        <w:rPr>
-          <w:rFonts w:ascii="Calibri" w:hAnsi="Calibri"/>
-          <w:sz w:val="21"/>
-        </w:rPr>
-        <w:t>compatibility.</w:t>
+        <w:t>6. an automated metadata validator that blocks declared comparisons with</w:t>
+      </w:r>
+    </w:p>
+    <w:p>
+      <w:r>
+        <w:rPr>
+          <w:rFonts w:ascii="Calibri" w:hAnsi="Calibri"/>
+          <w:sz w:val="21"/>
+        </w:rPr>
+        <w:t>incompatible methods, boundaries, or source mappings.</w:t>
+      </w:r>
+    </w:p>
+    <w:p>
+      <w:r>
+        <w:rPr>
+          <w:rFonts w:ascii="Calibri" w:hAnsi="Calibri"/>
+          <w:sz w:val="21"/>
+        </w:rPr>
+        <w:t>The validator is deliberately narrower than a scientific review. It trusts the metadata supplied by the user and cannot determine whether a performance map is representative, a distribution is empirical, or an external review occurred. Its role is to catch machine-detectable incompatibilities before calculation, not to authorize a public environmental claim.</w:t>
+      </w:r>
+    </w:p>
+    <w:p>
+      <w:r>
+        <w:rPr>
+          <w:rFonts w:ascii="Calibri" w:hAnsi="Calibri"/>
+          <w:sz w:val="21"/>
+        </w:rPr>
+        <w:t>This role also differs from recent data-center models. AlphaDataCenterCooling provides operational validation of a cooling plant [45], while d'Orgeval et al. compare full data-center architectures and, for a subset, normalize by computational performance [44]. The present work tests whether published secondary LCA results retain their meaning when moved across electricity datasets and claim contexts; it does not duplicate either primary modeling capability.</w:t>
       </w:r>
     </w:p>
     <w:p>
@@ -3277,7 +3545,7 @@
           <w:rFonts w:ascii="Calibri" w:hAnsi="Calibri"/>
           <w:sz w:val="21"/>
         </w:rPr>
-        <w:t>The most useful extension of the Microsoft/WSP work is not another static national scenario. It is a jointly governed evidence package that allows the released model to be updated without weakening its functional-unit insight. Four additions would be particularly valuable:</w:t>
+        <w:t>The most useful extension of the Microsoft/WSP work is not another static national scenario. It is a jointly governed evidence package that allows the released model to be updated without weakening its functional-unit insight. Five additions are needed:</w:t>
       </w:r>
     </w:p>
     <w:p>
@@ -3290,7 +3558,16 @@
           <w:rFonts w:ascii="Calibri" w:hAnsi="Calibri"/>
           <w:sz w:val="21"/>
         </w:rPr>
-        <w:t>1. architecture-specific, anonymized bills of quantities and service lives;</w:t>
+        <w:t>1. the original GWP100 electricity factors or elementary-flow inventories</w:t>
+      </w:r>
+    </w:p>
+    <w:p>
+      <w:r>
+        <w:rPr>
+          <w:rFonts w:ascii="Calibri" w:hAnsi="Calibri"/>
+          <w:sz w:val="21"/>
+        </w:rPr>
+        <w:t>needed to resolve the public workbook's blank F29 cells;</w:t>
       </w:r>
     </w:p>
     <w:p>
@@ -3303,16 +3580,7 @@
           <w:rFonts w:ascii="Calibri" w:hAnsi="Calibri"/>
           <w:sz w:val="21"/>
         </w:rPr>
-        <w:t>2. measured performance surfaces for IT output, server power, facility</w:t>
-      </w:r>
-    </w:p>
-    <w:p>
-      <w:r>
-        <w:rPr>
-          <w:rFonts w:ascii="Calibri" w:hAnsi="Calibri"/>
-          <w:sz w:val="21"/>
-        </w:rPr>
-        <w:t>parasitics, and onsite water across load and weather;</w:t>
+        <w:t>2. architecture-specific, anonymized bills of quantities and service lives;</w:t>
       </w:r>
     </w:p>
     <w:p>
@@ -3325,16 +3593,16 @@
           <w:rFonts w:ascii="Calibri" w:hAnsi="Calibri"/>
           <w:sz w:val="21"/>
         </w:rPr>
-        <w:t>3. a provider-linked lifecycle electricity model under one LCIA method,</w:t>
-      </w:r>
-    </w:p>
-    <w:p>
-      <w:r>
-        <w:rPr>
-          <w:rFonts w:ascii="Calibri" w:hAnsi="Calibri"/>
-          <w:sz w:val="21"/>
-        </w:rPr>
-        <w:t>reported alongside location-, market-, and marginal operational signals;</w:t>
+        <w:t>3. measured performance surfaces for IT output, server power, facility</w:t>
+      </w:r>
+    </w:p>
+    <w:p>
+      <w:r>
+        <w:rPr>
+          <w:rFonts w:ascii="Calibri" w:hAnsi="Calibri"/>
+          <w:sz w:val="21"/>
+        </w:rPr>
+        <w:t>parasitics, and onsite water across load and weather;</w:t>
       </w:r>
     </w:p>
     <w:p>
@@ -3347,120 +3615,16 @@
           <w:rFonts w:ascii="Calibri" w:hAnsi="Calibri"/>
           <w:sz w:val="21"/>
         </w:rPr>
-        <w:t>4. empirical uncertainty and correlation information sufficient for rank</w:t>
-      </w:r>
-    </w:p>
-    <w:p>
-      <w:r>
-        <w:rPr>
-          <w:rFonts w:ascii="Calibri" w:hAnsi="Calibri"/>
-          <w:sz w:val="21"/>
-        </w:rPr>
-        <w:t>probability and value-of-information analysis.</w:t>
-      </w:r>
-    </w:p>
-    <w:p>
-      <w:r>
-        <w:rPr>
-          <w:rFonts w:ascii="Calibri" w:hAnsi="Calibri"/>
-          <w:sz w:val="21"/>
-        </w:rPr>
-        <w:t>OpenDC-LCA supplies schemas, transformations, tests, and claim boundaries for that collaboration. The present results should interest hyperscale authors because they identify exactly which published conclusions are robust: the released arithmetic and national decarbonization trend. They also identify which are conditional: state-level crossovers, deterministic first rank, and the magnitude of embodied leverage.</w:t>
-      </w:r>
-    </w:p>
-    <w:p>
-      <w:pPr>
-        <w:pStyle w:val="Heading2"/>
-      </w:pPr>
-      <w:r>
-        <w:t>4.8. Limitations and submission-grade evidence needs</w:t>
-      </w:r>
-    </w:p>
-    <w:p>
-      <w:r>
-        <w:rPr>
-          <w:rFonts w:ascii="Calibri" w:hAnsi="Calibri"/>
-          <w:sz w:val="21"/>
-        </w:rPr>
-        <w:t>The analysis remains secondary. It does not recreate proprietary background inventories, confidential bills of quantities, the full virtual-core model, or measured hyperscale operation. Equation (8) uses a numerical index across different electricity boundaries and climate metrics. The additive boundary allowance, triangular marginals, and Gaussian-copula dependence cases are diagnostics, not estimates. The convergence check limits numerical sampling error within those designs; it does not reduce epistemic uncertainty in the ranges, dependence structure, or foreground model. State total-output rates represent generation rather than consumption and omit imports, contracts, transmission, hourly dispatch, and marginal effects.</w:t>
-      </w:r>
-    </w:p>
-    <w:p>
-      <w:r>
-        <w:rPr>
-          <w:rFonts w:ascii="Calibri" w:hAnsi="Calibri"/>
-          <w:sz w:val="21"/>
-        </w:rPr>
-        <w:t>The Boavizta sample mixes products and methods. ÖKOBAUDAT records are German generic A1-A3 factors. The TMY and synthetic performance examples validate software pathways, not technology performance. The USGS file provides watershed geometry rather than water consumption or AWARE characterization. Reliability models omit dependent failures, repair queues, redundancy and maintenance logistics unless the user supplies them. A coauthor methodology review is not an independent critical review.</w:t>
-      </w:r>
-    </w:p>
-    <w:p>
-      <w:r>
-        <w:rPr>
-          <w:rFonts w:ascii="Calibri" w:hAnsi="Calibri"/>
-          <w:sz w:val="21"/>
-        </w:rPr>
-        <w:t>Before a public decision-grade comparative assertion, the study needs reviewed primary performance and useful-computation data, architecture bills of quantities, lifecycle-consistent electricity inventories, water-scarcity characterization, empirically supported uncertainty/correlation, and an external critical reviewer. These needs are recorded in the repository rather than obscured by additional proxy scenarios.</w:t>
-      </w:r>
-    </w:p>
-    <w:p>
-      <w:pPr>
-        <w:pStyle w:val="Heading1"/>
-      </w:pPr>
-      <w:r>
-        <w:t>5. Conclusions</w:t>
-      </w:r>
-    </w:p>
-    <w:p>
-      <w:r>
-        <w:rPr>
-          <w:rFonts w:ascii="Calibri" w:hAnsi="Calibri"/>
-          <w:sz w:val="21"/>
-        </w:rPr>
-        <w:t>OpenDC-LCA treats data-center cooling LCA as an evidence-bounded decision problem. It reconciled 24 released Microsoft/WSP totals, reconstructed nine eGRID releases to a common AR5 GWP100 basis, and quantified extrapolation, electricity-boundary, functional-unit, assumption-block, and dependence sensitivity.</w:t>
-      </w:r>
-    </w:p>
-    <w:p>
-      <w:r>
-        <w:rPr>
-          <w:rFonts w:ascii="Calibri" w:hAnsi="Calibri"/>
-          <w:sz w:val="21"/>
-        </w:rPr>
-        <w:t>Four findings follow. First, the U.S. generation-rate decline of 32.46% from 2012 to 2023 is robust to historical eGRID GWP changes; the largest common-basis correction was only 0.248 kg CO2e/MWh. Second, local cooling rankings are less robust: 29.85% of state-year rates fall outside the released anchors, and the sole 2023 cold-plate/single-phase reversal has an exact 73.009 kg CO2e/MWh additive boundary clearance. Third, deterministic first rank is not stress robustness. Two-phase ranked first in all 459 unperturbed screens, but its U.S. first-rank frequency fell from 99.19% to 55.05% across zero-correlation all-block narrow-to-wide designs, and a median 5.50% adverse useful-computation correction erased first rank. Fourth, the stress frequency itself depends on structure: in the wide U.S. all-block design it ranged from 55.05% under independent architecture errors to 100% under fully common-mode errors, while grid-only variation never displaced two-phase.</w:t>
-      </w:r>
-    </w:p>
-    <w:p>
-      <w:r>
-        <w:rPr>
-          <w:rFonts w:ascii="Calibri" w:hAnsi="Calibri"/>
-          <w:sz w:val="21"/>
-        </w:rPr>
-        <w:t>The practical implication is straightforward: publish cooling comparisons with their functional unit, electricity boundary, anchor coverage, crossover, stress envelope, and evidence class. As grids decarbonize, useful computation, server manufacturing and lifetime, cooling-system quantities, and material routes become first-order research data. The package makes those requirements executable through open schemas, source lineage, engineering models, interoperability, and machine-readable claim gates. The next advance must come from linked primary measurements and inventories, not more precise interpretation of incompatible secondary factors.</w:t>
-      </w:r>
-    </w:p>
-    <w:p>
-      <w:pPr>
-        <w:pStyle w:val="Heading1"/>
-      </w:pPr>
-      <w:r>
-        <w:t>Data and code availability</w:t>
-      </w:r>
-    </w:p>
-    <w:p>
-      <w:r>
-        <w:rPr>
-          <w:rFonts w:ascii="Calibri" w:hAnsi="Calibri"/>
-          <w:sz w:val="21"/>
-        </w:rPr>
-        <w:t>OpenDC-LCA version 1.1.0 source code, examples, documentation, tests, derived tables, and manuscript figures are available at https://github.com/UARK-NED3/OpenDC-LCA. Installable wheel and source archives are available from https://github.com/UARK-NED3/OpenDC-LCA/releases/tag/v1.1.0. No DOI-bearing archive has yet been minted. The repository commit, analysis metadata, and provider-file checksum manifest identify the current reproducibility state; an immutable archival deposit remains a pre-submission action. Provider-native raw files remain local when redistribution permission has not been established. The Microsoft/Nature archive is available from Zenodo [15]; eGRID and NOAA data are available from their public portals [34,35,38].</w:t>
-      </w:r>
-    </w:p>
-    <w:p>
-      <w:pPr>
-        <w:pStyle w:val="Heading1"/>
-      </w:pPr>
-      <w:r>
-        <w:t>References</w:t>
+        <w:t>4. a complete provider-linked lifecycle electricity model under the same LCIA</w:t>
+      </w:r>
+    </w:p>
+    <w:p>
+      <w:r>
+        <w:rPr>
+          <w:rFonts w:ascii="Calibri" w:hAnsi="Calibri"/>
+          <w:sz w:val="21"/>
+        </w:rPr>
+        <w:t>method, with cutoffs linked or bounded and location-, market-, and marginal operational signals reported separately; and</w:t>
       </w:r>
     </w:p>
     <w:p>
@@ -3473,46 +3637,129 @@
           <w:rFonts w:ascii="Calibri" w:hAnsi="Calibri"/>
           <w:sz w:val="21"/>
         </w:rPr>
-        <w:t>1. Masanet, E., Shehabi, A., Lei, N., Smith, S. &amp; Koomey, J. Recalibrating</w:t>
-      </w:r>
-    </w:p>
-    <w:p>
-      <w:r>
-        <w:rPr>
-          <w:rFonts w:ascii="Calibri" w:hAnsi="Calibri"/>
-          <w:sz w:val="21"/>
-        </w:rPr>
-        <w:t xml:space="preserve">global data center energy-use estimates. </w:t>
-      </w:r>
-      <w:r>
-        <w:rPr>
-          <w:rFonts w:ascii="Calibri" w:hAnsi="Calibri"/>
-          <w:i/>
-          <w:sz w:val="21"/>
-        </w:rPr>
-        <w:t>Science</w:t>
-      </w:r>
-      <w:r>
-        <w:rPr>
-          <w:rFonts w:ascii="Calibri" w:hAnsi="Calibri"/>
-          <w:sz w:val="21"/>
-        </w:rPr>
-        <w:t xml:space="preserve"> </w:t>
-      </w:r>
-      <w:r>
-        <w:rPr>
-          <w:rFonts w:ascii="Calibri" w:hAnsi="Calibri"/>
-          <w:b/>
-          <w:sz w:val="21"/>
-        </w:rPr>
-        <w:t>367</w:t>
-      </w:r>
-      <w:r>
-        <w:rPr>
-          <w:rFonts w:ascii="Calibri" w:hAnsi="Calibri"/>
-          <w:sz w:val="21"/>
-        </w:rPr>
-        <w:t>, 984-986 (2020). https://doi.org/10.1126/science.aba3758</w:t>
+        <w:t>5. empirical uncertainty and correlation information sufficient for rank</w:t>
+      </w:r>
+    </w:p>
+    <w:p>
+      <w:r>
+        <w:rPr>
+          <w:rFonts w:ascii="Calibri" w:hAnsi="Calibri"/>
+          <w:sz w:val="21"/>
+        </w:rPr>
+        <w:t>probability and value-of-information analysis.</w:t>
+      </w:r>
+    </w:p>
+    <w:p>
+      <w:r>
+        <w:rPr>
+          <w:rFonts w:ascii="Calibri" w:hAnsi="Calibri"/>
+          <w:sz w:val="21"/>
+        </w:rPr>
+        <w:t>OpenDC-LCA supplies schemas, transformations, tests, and claim boundaries for that collaboration. The two conclusions supported independently here are the released arithmetic and the national direct-generation trend. The cooling crossovers, first ranks, and response coefficients remain conditional numerical screens until the five evidence gaps are closed.</w:t>
+      </w:r>
+    </w:p>
+    <w:p>
+      <w:pPr>
+        <w:pStyle w:val="Heading2"/>
+      </w:pPr>
+      <w:r>
+        <w:t>4.8. Limitations and submission-grade evidence needs</w:t>
+      </w:r>
+    </w:p>
+    <w:p>
+      <w:r>
+        <w:rPr>
+          <w:rFonts w:ascii="Calibri" w:hAnsi="Calibri"/>
+          <w:sz w:val="21"/>
+        </w:rPr>
+        <w:t>The analysis remains secondary. It does not recreate proprietary background inventories, confidential bills of quantities, the full virtual-core model, or measured hyperscale operation. Equation (8) uses a numerical axis whose climate-method identity is unresolved in the public archive. The Federal LCA Commons factors contain 287 national unlinked technosphere exchanges; the custom solver has not been independently reproduced in openLCA or Brightway. The additive allowance, triangular marginals, and copula dependence cases are secondary diagnostics, not estimates. The convergence check limits numerical sampling error within those designs; it does not reduce epistemic uncertainty in the ranges, dependence structure, cutoffs, or foreground model. eGRID state rates omit consumption transfers, contracts, hourly dispatch, and marginal effects.</w:t>
+      </w:r>
+    </w:p>
+    <w:p>
+      <w:r>
+        <w:rPr>
+          <w:rFonts w:ascii="Calibri" w:hAnsi="Calibri"/>
+          <w:sz w:val="21"/>
+        </w:rPr>
+        <w:t>The assessment focuses on climate results. It does not provide a boundary-consistent comparison of primary energy, water scarcity, toxicity, resource use, or other impact categories. The Boavizta sample mixes products and methods. ÖKOBAUDAT records are German generic A1-A3 factors. The TMY and synthetic performance examples validate software pathways, not technology performance. The USGS file provides watershed geometry rather than water consumption or AWARE characterization. Reliability models omit dependent failures, repair queues, redundancy and maintenance logistics unless the user supplies them. A coauthor methodology review is not an independent critical review.</w:t>
+      </w:r>
+    </w:p>
+    <w:p>
+      <w:r>
+        <w:rPr>
+          <w:rFonts w:ascii="Calibri" w:hAnsi="Calibri"/>
+          <w:sz w:val="21"/>
+        </w:rPr>
+        <w:t>The evidence supports a methodological Technology Assessment of transferability, not a public assertion that one cooling architecture is environmentally preferable. Such an assertion would require resolved common-method inventories, reviewed primary performance and useful-computation data, architecture bills of quantities, water-scarcity characterization, empirically supported joint uncertainty, and an external critical review panel.</w:t>
+      </w:r>
+    </w:p>
+    <w:p>
+      <w:pPr>
+        <w:pStyle w:val="Heading1"/>
+      </w:pPr>
+      <w:r>
+        <w:t>5. Conclusions</w:t>
+      </w:r>
+    </w:p>
+    <w:p>
+      <w:r>
+        <w:rPr>
+          <w:rFonts w:ascii="Calibri" w:hAnsi="Calibri"/>
+          <w:sz w:val="21"/>
+        </w:rPr>
+        <w:t>This assessment separates three evidence levels that had previously been combined: reproduced source arithmetic, direct-generation trend analysis, and conditional cooling screens. All 24 published totals were arithmetically reproduced, but the public archive does not resolve whether the two numeric electricity endpoints used by the screening axis are AR5 GWP100 or GTP100. Cooling ranks derived from that axis cannot be interpreted as common-method comparative LCA results.</w:t>
+      </w:r>
+    </w:p>
+    <w:p>
+      <w:r>
+        <w:rPr>
+          <w:rFonts w:ascii="Calibri" w:hAnsi="Calibri"/>
+          <w:sz w:val="21"/>
+        </w:rPr>
+        <w:t>The national eGRID generation factor declined 32.46% from 2012 to 2023 after all nine releases were harmonized to AR5 GWP100. The Federal LCA Commons national consumption system yielded 422.93 kg CO2e/MWh, including 53.08 kg CO2e/MWh from linked processes beyond generation, and all 10 FERC systems lay above the 96.70 kg CO2e/MWh numerical crossover. These partial linked-system factors retain documented technosphere cutoffs and require independent calculator verification before benchmark use.</w:t>
+      </w:r>
+    </w:p>
+    <w:p>
+      <w:r>
+        <w:rPr>
+          <w:rFonts w:ascii="Calibri" w:hAnsi="Calibri"/>
+          <w:sz w:val="21"/>
+        </w:rPr>
+        <w:t>Equal-width robustness analysis corrected the earlier attribution of rank loss to embodied variation. At the national lifecycle factor, the first-rank screen failed at 2.64% service-equivalence variation, 2.99% use-phase variation, and 22.15% embodied variation; simultaneous equal-width changes failed at 1.32%. The dominant near-term evidence needs are architecture-resolved useful computation and use-phase demand, followed by complete bills of quantities and common-method inventories.</w:t>
+      </w:r>
+    </w:p>
+    <w:p>
+      <w:r>
+        <w:rPr>
+          <w:rFonts w:ascii="Calibri" w:hAnsi="Calibri"/>
+          <w:sz w:val="21"/>
+        </w:rPr>
+        <w:t>OpenDC-LCA now blocks comparisons with mismatched functional units, boundaries, electricity accounting, LCIA methods, or missing field-level source mappings. That validator catches declared metadata incompatibilities but does not verify the underlying science. The study is suitable as a transferability Technology Assessment; it does not support a public claim of environmental superiority among cooling architectures.</w:t>
+      </w:r>
+    </w:p>
+    <w:p>
+      <w:pPr>
+        <w:pStyle w:val="Heading1"/>
+      </w:pPr>
+      <w:r>
+        <w:t>Data and code availability</w:t>
+      </w:r>
+    </w:p>
+    <w:p>
+      <w:r>
+        <w:rPr>
+          <w:rFonts w:ascii="Calibri" w:hAnsi="Calibri"/>
+          <w:sz w:val="21"/>
+        </w:rPr>
+        <w:t>OpenDC-LCA version 1.1.0 is publicly available at https://github.com/UARK-NED3/OpenDC-LCA and https://github.com/UARK-NED3/OpenDC-LCA/releases/tag/v1.1.0. The development revision evaluated here adds the Federal LCA Commons solver, cutoff reporting, equal-width robustness certificates, and comparison-level metadata checks; it will be tagged and archived before submission. Analysis metadata and the provider-file manifest record file sizes and SHA-256 checksums. Provider-native files remain outside Git when redistribution permission is unclear or a large upstream archive has not been reviewed for redistribution. The Microsoft archive, eGRID files, Federal LCA Commons baseline and method, and NOAA data are available from their public providers [15,36,37,40,47]. No DOI-bearing software archive is available at the time of this draft.</w:t>
+      </w:r>
+    </w:p>
+    <w:p>
+      <w:pPr>
+        <w:pStyle w:val="Heading1"/>
+      </w:pPr>
+      <w:r>
+        <w:t>References</w:t>
       </w:r>
     </w:p>
     <w:p>
@@ -3525,16 +3772,46 @@
           <w:rFonts w:ascii="Calibri" w:hAnsi="Calibri"/>
           <w:sz w:val="21"/>
         </w:rPr>
-        <w:t>2. International Energy Agency. Data centres and data transmission networks.</w:t>
-      </w:r>
-    </w:p>
-    <w:p>
-      <w:r>
-        <w:rPr>
-          <w:rFonts w:ascii="Calibri" w:hAnsi="Calibri"/>
-          <w:sz w:val="21"/>
-        </w:rPr>
-        <w:t>https://www.iea.org/energy-system/buildings/data-centres-and-data-transmission-networks</w:t>
+        <w:t>1. Masanet, E., Shehabi, A., Lei, N., Smith, S. &amp; Koomey, J. Recalibrating</w:t>
+      </w:r>
+    </w:p>
+    <w:p>
+      <w:r>
+        <w:rPr>
+          <w:rFonts w:ascii="Calibri" w:hAnsi="Calibri"/>
+          <w:sz w:val="21"/>
+        </w:rPr>
+        <w:t xml:space="preserve">global data center energy-use estimates. </w:t>
+      </w:r>
+      <w:r>
+        <w:rPr>
+          <w:rFonts w:ascii="Calibri" w:hAnsi="Calibri"/>
+          <w:i/>
+          <w:sz w:val="21"/>
+        </w:rPr>
+        <w:t>Science</w:t>
+      </w:r>
+      <w:r>
+        <w:rPr>
+          <w:rFonts w:ascii="Calibri" w:hAnsi="Calibri"/>
+          <w:sz w:val="21"/>
+        </w:rPr>
+        <w:t xml:space="preserve"> </w:t>
+      </w:r>
+      <w:r>
+        <w:rPr>
+          <w:rFonts w:ascii="Calibri" w:hAnsi="Calibri"/>
+          <w:b/>
+          <w:sz w:val="21"/>
+        </w:rPr>
+        <w:t>367</w:t>
+      </w:r>
+      <w:r>
+        <w:rPr>
+          <w:rFonts w:ascii="Calibri" w:hAnsi="Calibri"/>
+          <w:sz w:val="21"/>
+        </w:rPr>
+        <w:t>, 984-986 (2020). https://doi.org/10.1126/science.aba3758</w:t>
       </w:r>
     </w:p>
     <w:p>
@@ -3547,46 +3824,16 @@
           <w:rFonts w:ascii="Calibri" w:hAnsi="Calibri"/>
           <w:sz w:val="21"/>
         </w:rPr>
-        <w:t>3. Khalaj, A. H. &amp; Halgamuge, S. K. A review on efficient thermal management</w:t>
-      </w:r>
-    </w:p>
-    <w:p>
-      <w:r>
-        <w:rPr>
-          <w:rFonts w:ascii="Calibri" w:hAnsi="Calibri"/>
-          <w:sz w:val="21"/>
-        </w:rPr>
-        <w:t xml:space="preserve">of air- and liquid-cooled data centers. </w:t>
-      </w:r>
-      <w:r>
-        <w:rPr>
-          <w:rFonts w:ascii="Calibri" w:hAnsi="Calibri"/>
-          <w:i/>
-          <w:sz w:val="21"/>
-        </w:rPr>
-        <w:t>Applied Energy</w:t>
-      </w:r>
-      <w:r>
-        <w:rPr>
-          <w:rFonts w:ascii="Calibri" w:hAnsi="Calibri"/>
-          <w:sz w:val="21"/>
-        </w:rPr>
-        <w:t xml:space="preserve"> </w:t>
-      </w:r>
-      <w:r>
-        <w:rPr>
-          <w:rFonts w:ascii="Calibri" w:hAnsi="Calibri"/>
-          <w:b/>
-          <w:sz w:val="21"/>
-        </w:rPr>
-        <w:t>205</w:t>
-      </w:r>
-      <w:r>
-        <w:rPr>
-          <w:rFonts w:ascii="Calibri" w:hAnsi="Calibri"/>
-          <w:sz w:val="21"/>
-        </w:rPr>
-        <w:t>, 1165-1184 (2017). https://doi.org/10.1016/j.apenergy.2017.08.037</w:t>
+        <w:t>2. International Energy Agency. Data centres and data transmission networks.</w:t>
+      </w:r>
+    </w:p>
+    <w:p>
+      <w:r>
+        <w:rPr>
+          <w:rFonts w:ascii="Calibri" w:hAnsi="Calibri"/>
+          <w:sz w:val="21"/>
+        </w:rPr>
+        <w:t>https://www.iea.org/energy-system/buildings/data-centres-and-data-transmission-networks</w:t>
       </w:r>
     </w:p>
     <w:p>
@@ -3599,16 +3846,16 @@
           <w:rFonts w:ascii="Calibri" w:hAnsi="Calibri"/>
           <w:sz w:val="21"/>
         </w:rPr>
-        <w:t>4. Alkrush, A. A., Salem, M. S., Abdelrehim, O. &amp; Hegazi, A. A. Data centers</w:t>
-      </w:r>
-    </w:p>
-    <w:p>
-      <w:r>
-        <w:rPr>
-          <w:rFonts w:ascii="Calibri" w:hAnsi="Calibri"/>
-          <w:sz w:val="21"/>
-        </w:rPr>
-        <w:t xml:space="preserve">cooling: a critical review of techniques, challenges, and energy saving solutions. </w:t>
+        <w:t>3. Khalaj, A. H. &amp; Halgamuge, S. K. A review on efficient thermal management</w:t>
+      </w:r>
+    </w:p>
+    <w:p>
+      <w:r>
+        <w:rPr>
+          <w:rFonts w:ascii="Calibri" w:hAnsi="Calibri"/>
+          <w:sz w:val="21"/>
+        </w:rPr>
+        <w:t xml:space="preserve">of air- and liquid-cooled data centers. </w:t>
       </w:r>
       <w:r>
         <w:rPr>
@@ -3616,7 +3863,7 @@
           <w:i/>
           <w:sz w:val="21"/>
         </w:rPr>
-        <w:t>International Journal of Refrigeration</w:t>
+        <w:t>Applied Energy</w:t>
       </w:r>
       <w:r>
         <w:rPr>
@@ -3631,14 +3878,14 @@
           <w:b/>
           <w:sz w:val="21"/>
         </w:rPr>
-        <w:t>160</w:t>
-      </w:r>
-      <w:r>
-        <w:rPr>
-          <w:rFonts w:ascii="Calibri" w:hAnsi="Calibri"/>
-          <w:sz w:val="21"/>
-        </w:rPr>
-        <w:t>, 246-262 (2024). https://doi.org/10.1016/j.ijrefrig.2024.02.007</w:t>
+        <w:t>205</w:t>
+      </w:r>
+      <w:r>
+        <w:rPr>
+          <w:rFonts w:ascii="Calibri" w:hAnsi="Calibri"/>
+          <w:sz w:val="21"/>
+        </w:rPr>
+        <w:t>, 1165-1184 (2017). https://doi.org/10.1016/j.apenergy.2017.08.037</w:t>
       </w:r>
     </w:p>
     <w:p>
@@ -3651,16 +3898,16 @@
           <w:rFonts w:ascii="Calibri" w:hAnsi="Calibri"/>
           <w:sz w:val="21"/>
         </w:rPr>
-        <w:t>5. Kanbur, B. B., Wu, C., Fan, S. &amp; Duan, F. Two-phase liquid-immersion data</w:t>
-      </w:r>
-    </w:p>
-    <w:p>
-      <w:r>
-        <w:rPr>
-          <w:rFonts w:ascii="Calibri" w:hAnsi="Calibri"/>
-          <w:sz w:val="21"/>
-        </w:rPr>
-        <w:t xml:space="preserve">center cooling system: experimental performance and thermoeconomic analysis. </w:t>
+        <w:t>4. Alkrush, A. A., Salem, M. S., Abdelrehim, O. &amp; Hegazi, A. A. Data centers</w:t>
+      </w:r>
+    </w:p>
+    <w:p>
+      <w:r>
+        <w:rPr>
+          <w:rFonts w:ascii="Calibri" w:hAnsi="Calibri"/>
+          <w:sz w:val="21"/>
+        </w:rPr>
+        <w:t xml:space="preserve">cooling: a critical review of techniques, challenges, and energy saving solutions. </w:t>
       </w:r>
       <w:r>
         <w:rPr>
@@ -3683,14 +3930,14 @@
           <w:b/>
           <w:sz w:val="21"/>
         </w:rPr>
-        <w:t>118</w:t>
-      </w:r>
-      <w:r>
-        <w:rPr>
-          <w:rFonts w:ascii="Calibri" w:hAnsi="Calibri"/>
-          <w:sz w:val="21"/>
-        </w:rPr>
-        <w:t>, 290-301 (2020). https://doi.org/10.1016/j.ijrefrig.2020.05.026</w:t>
+        <w:t>160</w:t>
+      </w:r>
+      <w:r>
+        <w:rPr>
+          <w:rFonts w:ascii="Calibri" w:hAnsi="Calibri"/>
+          <w:sz w:val="21"/>
+        </w:rPr>
+        <w:t>, 246-262 (2024). https://doi.org/10.1016/j.ijrefrig.2024.02.007</w:t>
       </w:r>
     </w:p>
     <w:p>
@@ -3703,16 +3950,16 @@
           <w:rFonts w:ascii="Calibri" w:hAnsi="Calibri"/>
           <w:sz w:val="21"/>
         </w:rPr>
-        <w:t>6. Kanbur, B. B., Wu, C., Fan, S. &amp; Duan, F. System-level experimental</w:t>
-      </w:r>
-    </w:p>
-    <w:p>
-      <w:r>
-        <w:rPr>
-          <w:rFonts w:ascii="Calibri" w:hAnsi="Calibri"/>
-          <w:sz w:val="21"/>
-        </w:rPr>
-        <w:t xml:space="preserve">investigations of direct immersion cooling data center units with thermodynamic and thermoeconomic assessments. </w:t>
+        <w:t>5. Kanbur, B. B., Wu, C., Fan, S. &amp; Duan, F. Two-phase liquid-immersion data</w:t>
+      </w:r>
+    </w:p>
+    <w:p>
+      <w:r>
+        <w:rPr>
+          <w:rFonts w:ascii="Calibri" w:hAnsi="Calibri"/>
+          <w:sz w:val="21"/>
+        </w:rPr>
+        <w:t xml:space="preserve">center cooling system: experimental performance and thermoeconomic analysis. </w:t>
       </w:r>
       <w:r>
         <w:rPr>
@@ -3720,7 +3967,7 @@
           <w:i/>
           <w:sz w:val="21"/>
         </w:rPr>
-        <w:t>Energy</w:t>
+        <w:t>International Journal of Refrigeration</w:t>
       </w:r>
       <w:r>
         <w:rPr>
@@ -3735,14 +3982,14 @@
           <w:b/>
           <w:sz w:val="21"/>
         </w:rPr>
-        <w:t>217</w:t>
-      </w:r>
-      <w:r>
-        <w:rPr>
-          <w:rFonts w:ascii="Calibri" w:hAnsi="Calibri"/>
-          <w:sz w:val="21"/>
-        </w:rPr>
-        <w:t>, 119373 (2021). https://doi.org/10.1016/j.energy.2020.119373</w:t>
+        <w:t>118</w:t>
+      </w:r>
+      <w:r>
+        <w:rPr>
+          <w:rFonts w:ascii="Calibri" w:hAnsi="Calibri"/>
+          <w:sz w:val="21"/>
+        </w:rPr>
+        <w:t>, 290-301 (2020). https://doi.org/10.1016/j.ijrefrig.2020.05.026</w:t>
       </w:r>
     </w:p>
     <w:p>
@@ -3755,16 +4002,16 @@
           <w:rFonts w:ascii="Calibri" w:hAnsi="Calibri"/>
           <w:sz w:val="21"/>
         </w:rPr>
-        <w:t>7. Huang, Y., Liu, B., Xu, S., Bao, C., Zhong, Y. &amp; Zhang, C. Experimental</w:t>
-      </w:r>
-    </w:p>
-    <w:p>
-      <w:r>
-        <w:rPr>
-          <w:rFonts w:ascii="Calibri" w:hAnsi="Calibri"/>
-          <w:sz w:val="21"/>
-        </w:rPr>
-        <w:t xml:space="preserve">study on immersion liquid cooling performance of high-power data center servers. </w:t>
+        <w:t>6. Kanbur, B. B., Wu, C., Fan, S. &amp; Duan, F. System-level experimental</w:t>
+      </w:r>
+    </w:p>
+    <w:p>
+      <w:r>
+        <w:rPr>
+          <w:rFonts w:ascii="Calibri" w:hAnsi="Calibri"/>
+          <w:sz w:val="21"/>
+        </w:rPr>
+        <w:t xml:space="preserve">investigations of direct immersion cooling data center units with thermodynamic and thermoeconomic assessments. </w:t>
       </w:r>
       <w:r>
         <w:rPr>
@@ -3787,14 +4034,14 @@
           <w:b/>
           <w:sz w:val="21"/>
         </w:rPr>
-        <w:t>297</w:t>
-      </w:r>
-      <w:r>
-        <w:rPr>
-          <w:rFonts w:ascii="Calibri" w:hAnsi="Calibri"/>
-          <w:sz w:val="21"/>
-        </w:rPr>
-        <w:t>, 131195 (2024). https://doi.org/10.1016/j.energy.2024.131195</w:t>
+        <w:t>217</w:t>
+      </w:r>
+      <w:r>
+        <w:rPr>
+          <w:rFonts w:ascii="Calibri" w:hAnsi="Calibri"/>
+          <w:sz w:val="21"/>
+        </w:rPr>
+        <w:t>, 119373 (2021). https://doi.org/10.1016/j.energy.2020.119373</w:t>
       </w:r>
     </w:p>
     <w:p>
@@ -3807,16 +4054,16 @@
           <w:rFonts w:ascii="Calibri" w:hAnsi="Calibri"/>
           <w:sz w:val="21"/>
         </w:rPr>
-        <w:t>8. Wu, X. et al. Investigations on heat dissipation performance and overall</w:t>
-      </w:r>
-    </w:p>
-    <w:p>
-      <w:r>
-        <w:rPr>
-          <w:rFonts w:ascii="Calibri" w:hAnsi="Calibri"/>
-          <w:sz w:val="21"/>
-        </w:rPr>
-        <w:t xml:space="preserve">characteristics of two-phase liquid immersion cooling systems for data center. </w:t>
+        <w:t>7. Huang, Y., Liu, B., Xu, S., Bao, C., Zhong, Y. &amp; Zhang, C. Experimental</w:t>
+      </w:r>
+    </w:p>
+    <w:p>
+      <w:r>
+        <w:rPr>
+          <w:rFonts w:ascii="Calibri" w:hAnsi="Calibri"/>
+          <w:sz w:val="21"/>
+        </w:rPr>
+        <w:t xml:space="preserve">study on immersion liquid cooling performance of high-power data center servers. </w:t>
       </w:r>
       <w:r>
         <w:rPr>
@@ -3824,7 +4071,7 @@
           <w:i/>
           <w:sz w:val="21"/>
         </w:rPr>
-        <w:t>International Journal of Heat and Mass Transfer</w:t>
+        <w:t>Energy</w:t>
       </w:r>
       <w:r>
         <w:rPr>
@@ -3839,14 +4086,14 @@
           <w:b/>
           <w:sz w:val="21"/>
         </w:rPr>
-        <w:t>239</w:t>
-      </w:r>
-      <w:r>
-        <w:rPr>
-          <w:rFonts w:ascii="Calibri" w:hAnsi="Calibri"/>
-          <w:sz w:val="21"/>
-        </w:rPr>
-        <w:t>, 126575 (2025). https://doi.org/10.1016/j.ijheatmasstransfer.2024.126575</w:t>
+        <w:t>297</w:t>
+      </w:r>
+      <w:r>
+        <w:rPr>
+          <w:rFonts w:ascii="Calibri" w:hAnsi="Calibri"/>
+          <w:sz w:val="21"/>
+        </w:rPr>
+        <w:t>, 131195 (2024). https://doi.org/10.1016/j.energy.2024.131195</w:t>
       </w:r>
     </w:p>
     <w:p>
@@ -3859,16 +4106,16 @@
           <w:rFonts w:ascii="Calibri" w:hAnsi="Calibri"/>
           <w:sz w:val="21"/>
         </w:rPr>
-        <w:t>9. Whitehead, B., Andrews, D., Shah, A. &amp; Maidment, G. Assessing the</w:t>
-      </w:r>
-    </w:p>
-    <w:p>
-      <w:r>
-        <w:rPr>
-          <w:rFonts w:ascii="Calibri" w:hAnsi="Calibri"/>
-          <w:sz w:val="21"/>
-        </w:rPr>
-        <w:t xml:space="preserve">environmental impact of data centres. Part 1: background, energy use and metrics. </w:t>
+        <w:t>8. Wu, X. et al. Investigations on heat dissipation performance and overall</w:t>
+      </w:r>
+    </w:p>
+    <w:p>
+      <w:r>
+        <w:rPr>
+          <w:rFonts w:ascii="Calibri" w:hAnsi="Calibri"/>
+          <w:sz w:val="21"/>
+        </w:rPr>
+        <w:t xml:space="preserve">characteristics of two-phase liquid immersion cooling systems for data center. </w:t>
       </w:r>
       <w:r>
         <w:rPr>
@@ -3876,7 +4123,7 @@
           <w:i/>
           <w:sz w:val="21"/>
         </w:rPr>
-        <w:t>Building and Environment</w:t>
+        <w:t>International Journal of Heat and Mass Transfer</w:t>
       </w:r>
       <w:r>
         <w:rPr>
@@ -3891,14 +4138,14 @@
           <w:b/>
           <w:sz w:val="21"/>
         </w:rPr>
-        <w:t>82</w:t>
-      </w:r>
-      <w:r>
-        <w:rPr>
-          <w:rFonts w:ascii="Calibri" w:hAnsi="Calibri"/>
-          <w:sz w:val="21"/>
-        </w:rPr>
-        <w:t>, 151-159 (2014). https://doi.org/10.1016/j.buildenv.2014.08.021</w:t>
+        <w:t>239</w:t>
+      </w:r>
+      <w:r>
+        <w:rPr>
+          <w:rFonts w:ascii="Calibri" w:hAnsi="Calibri"/>
+          <w:sz w:val="21"/>
+        </w:rPr>
+        <w:t>, 126575 (2025). https://doi.org/10.1016/j.ijheatmasstransfer.2024.126575</w:t>
       </w:r>
     </w:p>
     <w:p>
@@ -3911,16 +4158,16 @@
           <w:rFonts w:ascii="Calibri" w:hAnsi="Calibri"/>
           <w:sz w:val="21"/>
         </w:rPr>
-        <w:t>10. Siddik, M. A. B., Shehabi, A. &amp; Marston, L. The environmental footprint</w:t>
-      </w:r>
-    </w:p>
-    <w:p>
-      <w:r>
-        <w:rPr>
-          <w:rFonts w:ascii="Calibri" w:hAnsi="Calibri"/>
-          <w:sz w:val="21"/>
-        </w:rPr>
-        <w:t xml:space="preserve">of data centers in the United States. </w:t>
+        <w:t>9. Whitehead, B., Andrews, D., Shah, A. &amp; Maidment, G. Assessing the</w:t>
+      </w:r>
+    </w:p>
+    <w:p>
+      <w:r>
+        <w:rPr>
+          <w:rFonts w:ascii="Calibri" w:hAnsi="Calibri"/>
+          <w:sz w:val="21"/>
+        </w:rPr>
+        <w:t xml:space="preserve">environmental impact of data centres. Part 1: background, energy use and metrics. </w:t>
       </w:r>
       <w:r>
         <w:rPr>
@@ -3928,7 +4175,7 @@
           <w:i/>
           <w:sz w:val="21"/>
         </w:rPr>
-        <w:t>Environmental Research Letters</w:t>
+        <w:t>Building and Environment</w:t>
       </w:r>
       <w:r>
         <w:rPr>
@@ -3943,14 +4190,14 @@
           <w:b/>
           <w:sz w:val="21"/>
         </w:rPr>
-        <w:t>16</w:t>
-      </w:r>
-      <w:r>
-        <w:rPr>
-          <w:rFonts w:ascii="Calibri" w:hAnsi="Calibri"/>
-          <w:sz w:val="21"/>
-        </w:rPr>
-        <w:t>, 064017 (2021). https://doi.org/10.1088/1748-9326/abfba1</w:t>
+        <w:t>82</w:t>
+      </w:r>
+      <w:r>
+        <w:rPr>
+          <w:rFonts w:ascii="Calibri" w:hAnsi="Calibri"/>
+          <w:sz w:val="21"/>
+        </w:rPr>
+        <w:t>, 151-159 (2014). https://doi.org/10.1016/j.buildenv.2014.08.021</w:t>
       </w:r>
     </w:p>
     <w:p>
@@ -3963,17 +4210,24 @@
           <w:rFonts w:ascii="Calibri" w:hAnsi="Calibri"/>
           <w:sz w:val="21"/>
         </w:rPr>
-        <w:t>11. Ristic, B., Madani, K. &amp; Makuch, Z. The water footprint of data centers.</w:t>
-      </w:r>
-    </w:p>
-    <w:p>
+        <w:t>10. Siddik, M. A. B., Shehabi, A. &amp; Marston, L. The environmental footprint</w:t>
+      </w:r>
+    </w:p>
+    <w:p>
+      <w:r>
+        <w:rPr>
+          <w:rFonts w:ascii="Calibri" w:hAnsi="Calibri"/>
+          <w:sz w:val="21"/>
+        </w:rPr>
+        <w:t xml:space="preserve">of data centers in the United States. </w:t>
+      </w:r>
       <w:r>
         <w:rPr>
           <w:rFonts w:ascii="Calibri" w:hAnsi="Calibri"/>
           <w:i/>
           <w:sz w:val="21"/>
         </w:rPr>
-        <w:t>Sustainability</w:t>
+        <w:t>Environmental Research Letters</w:t>
       </w:r>
       <w:r>
         <w:rPr>
@@ -3988,14 +4242,14 @@
           <w:b/>
           <w:sz w:val="21"/>
         </w:rPr>
-        <w:t>7</w:t>
-      </w:r>
-      <w:r>
-        <w:rPr>
-          <w:rFonts w:ascii="Calibri" w:hAnsi="Calibri"/>
-          <w:sz w:val="21"/>
-        </w:rPr>
-        <w:t>, 11260-11284 (2015). https://doi.org/10.3390/su70811260</w:t>
+        <w:t>16</w:t>
+      </w:r>
+      <w:r>
+        <w:rPr>
+          <w:rFonts w:ascii="Calibri" w:hAnsi="Calibri"/>
+          <w:sz w:val="21"/>
+        </w:rPr>
+        <w:t>, 064017 (2021). https://doi.org/10.1088/1748-9326/abfba1</w:t>
       </w:r>
     </w:p>
     <w:p>
@@ -4008,24 +4262,17 @@
           <w:rFonts w:ascii="Calibri" w:hAnsi="Calibri"/>
           <w:sz w:val="21"/>
         </w:rPr>
-        <w:t>12. Isler-Kaya, A. &amp; Karaosmanoglu, F. Life cycle assessment of a</w:t>
-      </w:r>
-    </w:p>
-    <w:p>
-      <w:r>
-        <w:rPr>
-          <w:rFonts w:ascii="Calibri" w:hAnsi="Calibri"/>
-          <w:sz w:val="21"/>
-        </w:rPr>
-        <w:t xml:space="preserve">climate-friendly data center cooling device. </w:t>
-      </w:r>
+        <w:t>11. Ristic, B., Madani, K. &amp; Makuch, Z. The water footprint of data centers.</w:t>
+      </w:r>
+    </w:p>
+    <w:p>
       <w:r>
         <w:rPr>
           <w:rFonts w:ascii="Calibri" w:hAnsi="Calibri"/>
           <w:i/>
           <w:sz w:val="21"/>
         </w:rPr>
-        <w:t>Energy and Buildings</w:t>
+        <w:t>Sustainability</w:t>
       </w:r>
       <w:r>
         <w:rPr>
@@ -4040,14 +4287,14 @@
           <w:b/>
           <w:sz w:val="21"/>
         </w:rPr>
-        <w:t>288</w:t>
-      </w:r>
-      <w:r>
-        <w:rPr>
-          <w:rFonts w:ascii="Calibri" w:hAnsi="Calibri"/>
-          <w:sz w:val="21"/>
-        </w:rPr>
-        <w:t>, 113006 (2023). https://doi.org/10.1016/j.enbuild.2023.113006</w:t>
+        <w:t>7</w:t>
+      </w:r>
+      <w:r>
+        <w:rPr>
+          <w:rFonts w:ascii="Calibri" w:hAnsi="Calibri"/>
+          <w:sz w:val="21"/>
+        </w:rPr>
+        <w:t>, 11260-11284 (2015). https://doi.org/10.3390/su70811260</w:t>
       </w:r>
     </w:p>
     <w:p>
@@ -4060,16 +4307,16 @@
           <w:rFonts w:ascii="Calibri" w:hAnsi="Calibri"/>
           <w:sz w:val="21"/>
         </w:rPr>
-        <w:t>13. Wenzel, P. M. &amp; Radgen, P. Extending effectiveness to efficiency:</w:t>
-      </w:r>
-    </w:p>
-    <w:p>
-      <w:r>
-        <w:rPr>
-          <w:rFonts w:ascii="Calibri" w:hAnsi="Calibri"/>
-          <w:sz w:val="21"/>
-        </w:rPr>
-        <w:t xml:space="preserve">comparing energy and environmental assessment methods for a wet cooling tower. </w:t>
+        <w:t>12. Isler-Kaya, A. &amp; Karaosmanoglu, F. Life cycle assessment of a</w:t>
+      </w:r>
+    </w:p>
+    <w:p>
+      <w:r>
+        <w:rPr>
+          <w:rFonts w:ascii="Calibri" w:hAnsi="Calibri"/>
+          <w:sz w:val="21"/>
+        </w:rPr>
+        <w:t xml:space="preserve">climate-friendly data center cooling device. </w:t>
       </w:r>
       <w:r>
         <w:rPr>
@@ -4077,7 +4324,7 @@
           <w:i/>
           <w:sz w:val="21"/>
         </w:rPr>
-        <w:t>Journal of Industrial Ecology</w:t>
+        <w:t>Energy and Buildings</w:t>
       </w:r>
       <w:r>
         <w:rPr>
@@ -4092,14 +4339,14 @@
           <w:b/>
           <w:sz w:val="21"/>
         </w:rPr>
-        <w:t>27</w:t>
-      </w:r>
-      <w:r>
-        <w:rPr>
-          <w:rFonts w:ascii="Calibri" w:hAnsi="Calibri"/>
-          <w:sz w:val="21"/>
-        </w:rPr>
-        <w:t>, 693-706 (2023). https://doi.org/10.1111/jiec.13396</w:t>
+        <w:t>288</w:t>
+      </w:r>
+      <w:r>
+        <w:rPr>
+          <w:rFonts w:ascii="Calibri" w:hAnsi="Calibri"/>
+          <w:sz w:val="21"/>
+        </w:rPr>
+        <w:t>, 113006 (2023). https://doi.org/10.1016/j.enbuild.2023.113006</w:t>
       </w:r>
     </w:p>
     <w:p>
@@ -4112,16 +4359,16 @@
           <w:rFonts w:ascii="Calibri" w:hAnsi="Calibri"/>
           <w:sz w:val="21"/>
         </w:rPr>
-        <w:t>14. Alissa, H. et al. Using life cycle assessment to drive innovation for</w:t>
-      </w:r>
-    </w:p>
-    <w:p>
-      <w:r>
-        <w:rPr>
-          <w:rFonts w:ascii="Calibri" w:hAnsi="Calibri"/>
-          <w:sz w:val="21"/>
-        </w:rPr>
-        <w:t xml:space="preserve">sustainable cool clouds. </w:t>
+        <w:t>13. Wenzel, P. M. &amp; Radgen, P. Extending effectiveness to efficiency:</w:t>
+      </w:r>
+    </w:p>
+    <w:p>
+      <w:r>
+        <w:rPr>
+          <w:rFonts w:ascii="Calibri" w:hAnsi="Calibri"/>
+          <w:sz w:val="21"/>
+        </w:rPr>
+        <w:t xml:space="preserve">comparing energy and environmental assessment methods for a wet cooling tower. </w:t>
       </w:r>
       <w:r>
         <w:rPr>
@@ -4129,7 +4376,7 @@
           <w:i/>
           <w:sz w:val="21"/>
         </w:rPr>
-        <w:t>Nature</w:t>
+        <w:t>Journal of Industrial Ecology</w:t>
       </w:r>
       <w:r>
         <w:rPr>
@@ -4144,14 +4391,14 @@
           <w:b/>
           <w:sz w:val="21"/>
         </w:rPr>
-        <w:t>641</w:t>
-      </w:r>
-      <w:r>
-        <w:rPr>
-          <w:rFonts w:ascii="Calibri" w:hAnsi="Calibri"/>
-          <w:sz w:val="21"/>
-        </w:rPr>
-        <w:t>, 331-338 (2025). https://doi.org/10.1038/s41586-025-08832-3</w:t>
+        <w:t>27</w:t>
+      </w:r>
+      <w:r>
+        <w:rPr>
+          <w:rFonts w:ascii="Calibri" w:hAnsi="Calibri"/>
+          <w:sz w:val="21"/>
+        </w:rPr>
+        <w:t>, 693-706 (2023). https://doi.org/10.1111/jiec.13396</w:t>
       </w:r>
     </w:p>
     <w:p>
@@ -4164,16 +4411,46 @@
           <w:rFonts w:ascii="Calibri" w:hAnsi="Calibri"/>
           <w:sz w:val="21"/>
         </w:rPr>
-        <w:t>15. Alissa, H. et al. Data and model archive for “Using life cycle assessment</w:t>
-      </w:r>
-    </w:p>
-    <w:p>
-      <w:r>
-        <w:rPr>
-          <w:rFonts w:ascii="Calibri" w:hAnsi="Calibri"/>
-          <w:sz w:val="21"/>
-        </w:rPr>
-        <w:t>to drive innovation for sustainable cool clouds.” Zenodo record 14268168 (2024). https://doi.org/10.5281/zenodo.14268168</w:t>
+        <w:t>14. Alissa, H. et al. Using life cycle assessment to drive innovation for</w:t>
+      </w:r>
+    </w:p>
+    <w:p>
+      <w:r>
+        <w:rPr>
+          <w:rFonts w:ascii="Calibri" w:hAnsi="Calibri"/>
+          <w:sz w:val="21"/>
+        </w:rPr>
+        <w:t xml:space="preserve">sustainable cool clouds. </w:t>
+      </w:r>
+      <w:r>
+        <w:rPr>
+          <w:rFonts w:ascii="Calibri" w:hAnsi="Calibri"/>
+          <w:i/>
+          <w:sz w:val="21"/>
+        </w:rPr>
+        <w:t>Nature</w:t>
+      </w:r>
+      <w:r>
+        <w:rPr>
+          <w:rFonts w:ascii="Calibri" w:hAnsi="Calibri"/>
+          <w:sz w:val="21"/>
+        </w:rPr>
+        <w:t xml:space="preserve"> </w:t>
+      </w:r>
+      <w:r>
+        <w:rPr>
+          <w:rFonts w:ascii="Calibri" w:hAnsi="Calibri"/>
+          <w:b/>
+          <w:sz w:val="21"/>
+        </w:rPr>
+        <w:t>641</w:t>
+      </w:r>
+      <w:r>
+        <w:rPr>
+          <w:rFonts w:ascii="Calibri" w:hAnsi="Calibri"/>
+          <w:sz w:val="21"/>
+        </w:rPr>
+        <w:t>, 331-338 (2025). https://doi.org/10.1038/s41586-025-08832-3</w:t>
       </w:r>
     </w:p>
     <w:p>
@@ -4186,46 +4463,16 @@
           <w:rFonts w:ascii="Calibri" w:hAnsi="Calibri"/>
           <w:sz w:val="21"/>
         </w:rPr>
-        <w:t>16. Zhang, M., Carbajales-Dale, M., Ma, X., Guo, L. &amp; Fan, C. Cleaner grid or</w:t>
-      </w:r>
-    </w:p>
-    <w:p>
-      <w:r>
-        <w:rPr>
-          <w:rFonts w:ascii="Calibri" w:hAnsi="Calibri"/>
-          <w:sz w:val="21"/>
-        </w:rPr>
-        <w:t xml:space="preserve">smarter cooling? Environmental impact trade-offs of a data center using the life cycle assessment method. </w:t>
-      </w:r>
-      <w:r>
-        <w:rPr>
-          <w:rFonts w:ascii="Calibri" w:hAnsi="Calibri"/>
-          <w:i/>
-          <w:sz w:val="21"/>
-        </w:rPr>
-        <w:t>Cleaner Energy Systems</w:t>
-      </w:r>
-      <w:r>
-        <w:rPr>
-          <w:rFonts w:ascii="Calibri" w:hAnsi="Calibri"/>
-          <w:sz w:val="21"/>
-        </w:rPr>
-        <w:t xml:space="preserve"> </w:t>
-      </w:r>
-      <w:r>
-        <w:rPr>
-          <w:rFonts w:ascii="Calibri" w:hAnsi="Calibri"/>
-          <w:b/>
-          <w:sz w:val="21"/>
-        </w:rPr>
-        <w:t>12</w:t>
-      </w:r>
-      <w:r>
-        <w:rPr>
-          <w:rFonts w:ascii="Calibri" w:hAnsi="Calibri"/>
-          <w:sz w:val="21"/>
-        </w:rPr>
-        <w:t>, 100223 (2025). https://doi.org/10.1016/j.cles.2025.100223</w:t>
+        <w:t>15. Alissa, H. et al. Data and model archive for “Using life cycle assessment</w:t>
+      </w:r>
+    </w:p>
+    <w:p>
+      <w:r>
+        <w:rPr>
+          <w:rFonts w:ascii="Calibri" w:hAnsi="Calibri"/>
+          <w:sz w:val="21"/>
+        </w:rPr>
+        <w:t>to drive innovation for sustainable cool clouds.” Zenodo record 14268168 (2024). https://doi.org/10.5281/zenodo.14268168</w:t>
       </w:r>
     </w:p>
     <w:p>
@@ -4238,16 +4485,16 @@
           <w:rFonts w:ascii="Calibri" w:hAnsi="Calibri"/>
           <w:sz w:val="21"/>
         </w:rPr>
-        <w:t>17. Boyd, S. B., Horvath, A. &amp; Dornfeld, D. Life-cycle assessment of</w:t>
-      </w:r>
-    </w:p>
-    <w:p>
-      <w:r>
-        <w:rPr>
-          <w:rFonts w:ascii="Calibri" w:hAnsi="Calibri"/>
-          <w:sz w:val="21"/>
-        </w:rPr>
-        <w:t xml:space="preserve">computational logic produced from 1995 through 2010. </w:t>
+        <w:t>16. Zhang, M., Carbajales-Dale, M., Ma, X., Guo, L. &amp; Fan, C. Cleaner grid or</w:t>
+      </w:r>
+    </w:p>
+    <w:p>
+      <w:r>
+        <w:rPr>
+          <w:rFonts w:ascii="Calibri" w:hAnsi="Calibri"/>
+          <w:sz w:val="21"/>
+        </w:rPr>
+        <w:t xml:space="preserve">smarter cooling? Environmental impact trade-offs of a data center using the life cycle assessment method. </w:t>
       </w:r>
       <w:r>
         <w:rPr>
@@ -4255,7 +4502,7 @@
           <w:i/>
           <w:sz w:val="21"/>
         </w:rPr>
-        <w:t>Environmental Science &amp; Technology</w:t>
+        <w:t>Cleaner Energy Systems</w:t>
       </w:r>
       <w:r>
         <w:rPr>
@@ -4270,14 +4517,14 @@
           <w:b/>
           <w:sz w:val="21"/>
         </w:rPr>
-        <w:t>47</w:t>
-      </w:r>
-      <w:r>
-        <w:rPr>
-          <w:rFonts w:ascii="Calibri" w:hAnsi="Calibri"/>
-          <w:sz w:val="21"/>
-        </w:rPr>
-        <w:t>, 2947-2954 (2013). https://doi.org/10.1021/es303012r</w:t>
+        <w:t>12</w:t>
+      </w:r>
+      <w:r>
+        <w:rPr>
+          <w:rFonts w:ascii="Calibri" w:hAnsi="Calibri"/>
+          <w:sz w:val="21"/>
+        </w:rPr>
+        <w:t>, 100223 (2025). https://doi.org/10.1016/j.cles.2025.100223</w:t>
       </w:r>
     </w:p>
     <w:p>
@@ -4290,16 +4537,16 @@
           <w:rFonts w:ascii="Calibri" w:hAnsi="Calibri"/>
           <w:sz w:val="21"/>
         </w:rPr>
-        <w:t>18. Malmodin, J. &amp; Lundén, D. The energy and carbon footprint of the global</w:t>
-      </w:r>
-    </w:p>
-    <w:p>
-      <w:r>
-        <w:rPr>
-          <w:rFonts w:ascii="Calibri" w:hAnsi="Calibri"/>
-          <w:sz w:val="21"/>
-        </w:rPr>
-        <w:t xml:space="preserve">ICT and E&amp;M sectors 2010-2015. </w:t>
+        <w:t>17. Boyd, S. B., Horvath, A. &amp; Dornfeld, D. Life-cycle assessment of</w:t>
+      </w:r>
+    </w:p>
+    <w:p>
+      <w:r>
+        <w:rPr>
+          <w:rFonts w:ascii="Calibri" w:hAnsi="Calibri"/>
+          <w:sz w:val="21"/>
+        </w:rPr>
+        <w:t xml:space="preserve">computational logic produced from 1995 through 2010. </w:t>
       </w:r>
       <w:r>
         <w:rPr>
@@ -4307,7 +4554,7 @@
           <w:i/>
           <w:sz w:val="21"/>
         </w:rPr>
-        <w:t>Sustainability</w:t>
+        <w:t>Environmental Science &amp; Technology</w:t>
       </w:r>
       <w:r>
         <w:rPr>
@@ -4322,14 +4569,14 @@
           <w:b/>
           <w:sz w:val="21"/>
         </w:rPr>
-        <w:t>10</w:t>
-      </w:r>
-      <w:r>
-        <w:rPr>
-          <w:rFonts w:ascii="Calibri" w:hAnsi="Calibri"/>
-          <w:sz w:val="21"/>
-        </w:rPr>
-        <w:t>, 3027 (2018). https://doi.org/10.3390/su10093027</w:t>
+        <w:t>47</w:t>
+      </w:r>
+      <w:r>
+        <w:rPr>
+          <w:rFonts w:ascii="Calibri" w:hAnsi="Calibri"/>
+          <w:sz w:val="21"/>
+        </w:rPr>
+        <w:t>, 2947-2954 (2013). https://doi.org/10.1021/es303012r</w:t>
       </w:r>
     </w:p>
     <w:p>
@@ -4342,16 +4589,16 @@
           <w:rFonts w:ascii="Calibri" w:hAnsi="Calibri"/>
           <w:sz w:val="21"/>
         </w:rPr>
-        <w:t>19. Holzapfel, P., Bach, V. &amp; Finkbeiner, M. Electricity accounting in life</w:t>
-      </w:r>
-    </w:p>
-    <w:p>
-      <w:r>
-        <w:rPr>
-          <w:rFonts w:ascii="Calibri" w:hAnsi="Calibri"/>
-          <w:sz w:val="21"/>
-        </w:rPr>
-        <w:t xml:space="preserve">cycle assessment: the challenge of double counting. </w:t>
+        <w:t>18. Malmodin, J. &amp; Lundén, D. The energy and carbon footprint of the global</w:t>
+      </w:r>
+    </w:p>
+    <w:p>
+      <w:r>
+        <w:rPr>
+          <w:rFonts w:ascii="Calibri" w:hAnsi="Calibri"/>
+          <w:sz w:val="21"/>
+        </w:rPr>
+        <w:t xml:space="preserve">ICT and E&amp;M sectors 2010-2015. </w:t>
       </w:r>
       <w:r>
         <w:rPr>
@@ -4359,7 +4606,7 @@
           <w:i/>
           <w:sz w:val="21"/>
         </w:rPr>
-        <w:t>International Journal of Life Cycle Assessment</w:t>
+        <w:t>Sustainability</w:t>
       </w:r>
       <w:r>
         <w:rPr>
@@ -4374,14 +4621,14 @@
           <w:b/>
           <w:sz w:val="21"/>
         </w:rPr>
-        <w:t>28</w:t>
-      </w:r>
-      <w:r>
-        <w:rPr>
-          <w:rFonts w:ascii="Calibri" w:hAnsi="Calibri"/>
-          <w:sz w:val="21"/>
-        </w:rPr>
-        <w:t>, 771-787 (2023). https://doi.org/10.1007/s11367-023-02158-w</w:t>
+        <w:t>10</w:t>
+      </w:r>
+      <w:r>
+        <w:rPr>
+          <w:rFonts w:ascii="Calibri" w:hAnsi="Calibri"/>
+          <w:sz w:val="21"/>
+        </w:rPr>
+        <w:t>, 3027 (2018). https://doi.org/10.3390/su10093027</w:t>
       </w:r>
     </w:p>
     <w:p>
@@ -4394,16 +4641,16 @@
           <w:rFonts w:ascii="Calibri" w:hAnsi="Calibri"/>
           <w:sz w:val="21"/>
         </w:rPr>
-        <w:t>20. Holzapfel, P., Bunsen, J., Schmidt-Sierra, I., Bach, V. &amp; Finkbeiner, M.</w:t>
-      </w:r>
-    </w:p>
-    <w:p>
-      <w:r>
-        <w:rPr>
-          <w:rFonts w:ascii="Calibri" w:hAnsi="Calibri"/>
-          <w:sz w:val="21"/>
-        </w:rPr>
-        <w:t xml:space="preserve">Replacing location-based electricity consumption with market-based residual mixes in background data to avoid possible double counting. </w:t>
+        <w:t>19. Holzapfel, P., Bach, V. &amp; Finkbeiner, M. Electricity accounting in life</w:t>
+      </w:r>
+    </w:p>
+    <w:p>
+      <w:r>
+        <w:rPr>
+          <w:rFonts w:ascii="Calibri" w:hAnsi="Calibri"/>
+          <w:sz w:val="21"/>
+        </w:rPr>
+        <w:t xml:space="preserve">cycle assessment: the challenge of double counting. </w:t>
       </w:r>
       <w:r>
         <w:rPr>
@@ -4426,14 +4673,14 @@
           <w:b/>
           <w:sz w:val="21"/>
         </w:rPr>
-        <w:t>29</w:t>
-      </w:r>
-      <w:r>
-        <w:rPr>
-          <w:rFonts w:ascii="Calibri" w:hAnsi="Calibri"/>
-          <w:sz w:val="21"/>
-        </w:rPr>
-        <w:t>, 1279-1289 (2024). https://doi.org/10.1007/s11367-024-02294-x</w:t>
+        <w:t>28</w:t>
+      </w:r>
+      <w:r>
+        <w:rPr>
+          <w:rFonts w:ascii="Calibri" w:hAnsi="Calibri"/>
+          <w:sz w:val="21"/>
+        </w:rPr>
+        <w:t>, 771-787 (2023). https://doi.org/10.1007/s11367-023-02158-w</w:t>
       </w:r>
     </w:p>
     <w:p>
@@ -4446,16 +4693,16 @@
           <w:rFonts w:ascii="Calibri" w:hAnsi="Calibri"/>
           <w:sz w:val="21"/>
         </w:rPr>
-        <w:t>21. Dandres, T., Farrahi Moghaddam, R., Nguyen, K. K., Lemieux, Y., Samson,</w:t>
-      </w:r>
-    </w:p>
-    <w:p>
-      <w:r>
-        <w:rPr>
-          <w:rFonts w:ascii="Calibri" w:hAnsi="Calibri"/>
-          <w:sz w:val="21"/>
-        </w:rPr>
-        <w:t xml:space="preserve">R. &amp; Cheriet, M. Consideration of marginal electricity in real-time minimization of distributed data centre emissions. </w:t>
+        <w:t>20. Holzapfel, P., Bunsen, J., Schmidt-Sierra, I., Bach, V. &amp; Finkbeiner, M.</w:t>
+      </w:r>
+    </w:p>
+    <w:p>
+      <w:r>
+        <w:rPr>
+          <w:rFonts w:ascii="Calibri" w:hAnsi="Calibri"/>
+          <w:sz w:val="21"/>
+        </w:rPr>
+        <w:t xml:space="preserve">Replacing location-based electricity consumption with market-based residual mixes in background data to avoid possible double counting. </w:t>
       </w:r>
       <w:r>
         <w:rPr>
@@ -4463,7 +4710,7 @@
           <w:i/>
           <w:sz w:val="21"/>
         </w:rPr>
-        <w:t>Journal of Cleaner Production</w:t>
+        <w:t>International Journal of Life Cycle Assessment</w:t>
       </w:r>
       <w:r>
         <w:rPr>
@@ -4478,14 +4725,14 @@
           <w:b/>
           <w:sz w:val="21"/>
         </w:rPr>
-        <w:t>143</w:t>
-      </w:r>
-      <w:r>
-        <w:rPr>
-          <w:rFonts w:ascii="Calibri" w:hAnsi="Calibri"/>
-          <w:sz w:val="21"/>
-        </w:rPr>
-        <w:t>, 116-124 (2017). https://doi.org/10.1016/j.jclepro.2016.12.143</w:t>
+        <w:t>29</w:t>
+      </w:r>
+      <w:r>
+        <w:rPr>
+          <w:rFonts w:ascii="Calibri" w:hAnsi="Calibri"/>
+          <w:sz w:val="21"/>
+        </w:rPr>
+        <w:t>, 1279-1289 (2024). https://doi.org/10.1007/s11367-024-02294-x</w:t>
       </w:r>
     </w:p>
     <w:p>
@@ -4498,16 +4745,16 @@
           <w:rFonts w:ascii="Calibri" w:hAnsi="Calibri"/>
           <w:sz w:val="21"/>
         </w:rPr>
-        <w:t>22. Sohn, J., Kalbar, P., Goldstein, B. &amp; Birkved, M. Defining temporally</w:t>
-      </w:r>
-    </w:p>
-    <w:p>
-      <w:r>
-        <w:rPr>
-          <w:rFonts w:ascii="Calibri" w:hAnsi="Calibri"/>
-          <w:sz w:val="21"/>
-        </w:rPr>
-        <w:t xml:space="preserve">dynamic life cycle assessment: a review. </w:t>
+        <w:t>21. Dandres, T., Farrahi Moghaddam, R., Nguyen, K. K., Lemieux, Y., Samson,</w:t>
+      </w:r>
+    </w:p>
+    <w:p>
+      <w:r>
+        <w:rPr>
+          <w:rFonts w:ascii="Calibri" w:hAnsi="Calibri"/>
+          <w:sz w:val="21"/>
+        </w:rPr>
+        <w:t xml:space="preserve">R. &amp; Cheriet, M. Consideration of marginal electricity in real-time minimization of distributed data centre emissions. </w:t>
       </w:r>
       <w:r>
         <w:rPr>
@@ -4515,7 +4762,7 @@
           <w:i/>
           <w:sz w:val="21"/>
         </w:rPr>
-        <w:t>Integrated Environmental Assessment and Management</w:t>
+        <w:t>Journal of Cleaner Production</w:t>
       </w:r>
       <w:r>
         <w:rPr>
@@ -4530,14 +4777,14 @@
           <w:b/>
           <w:sz w:val="21"/>
         </w:rPr>
-        <w:t>16</w:t>
-      </w:r>
-      <w:r>
-        <w:rPr>
-          <w:rFonts w:ascii="Calibri" w:hAnsi="Calibri"/>
-          <w:sz w:val="21"/>
-        </w:rPr>
-        <w:t>, 314-323 (2020). https://doi.org/10.1002/ieam.4235</w:t>
+        <w:t>143</w:t>
+      </w:r>
+      <w:r>
+        <w:rPr>
+          <w:rFonts w:ascii="Calibri" w:hAnsi="Calibri"/>
+          <w:sz w:val="21"/>
+        </w:rPr>
+        <w:t>, 116-124 (2017). https://doi.org/10.1016/j.jclepro.2016.12.143</w:t>
       </w:r>
     </w:p>
     <w:p>
@@ -4550,16 +4797,16 @@
           <w:rFonts w:ascii="Calibri" w:hAnsi="Calibri"/>
           <w:sz w:val="21"/>
         </w:rPr>
-        <w:t>23. Beloin-Saint-Pierre, D. et al. Addressing temporal considerations in life</w:t>
-      </w:r>
-    </w:p>
-    <w:p>
-      <w:r>
-        <w:rPr>
-          <w:rFonts w:ascii="Calibri" w:hAnsi="Calibri"/>
-          <w:sz w:val="21"/>
-        </w:rPr>
-        <w:t xml:space="preserve">cycle assessment. </w:t>
+        <w:t>22. Sohn, J., Kalbar, P., Goldstein, B. &amp; Birkved, M. Defining temporally</w:t>
+      </w:r>
+    </w:p>
+    <w:p>
+      <w:r>
+        <w:rPr>
+          <w:rFonts w:ascii="Calibri" w:hAnsi="Calibri"/>
+          <w:sz w:val="21"/>
+        </w:rPr>
+        <w:t xml:space="preserve">dynamic life cycle assessment: a review. </w:t>
       </w:r>
       <w:r>
         <w:rPr>
@@ -4567,7 +4814,7 @@
           <w:i/>
           <w:sz w:val="21"/>
         </w:rPr>
-        <w:t>Science of the Total Environment</w:t>
+        <w:t>Integrated Environmental Assessment and Management</w:t>
       </w:r>
       <w:r>
         <w:rPr>
@@ -4582,14 +4829,14 @@
           <w:b/>
           <w:sz w:val="21"/>
         </w:rPr>
-        <w:t>743</w:t>
-      </w:r>
-      <w:r>
-        <w:rPr>
-          <w:rFonts w:ascii="Calibri" w:hAnsi="Calibri"/>
-          <w:sz w:val="21"/>
-        </w:rPr>
-        <w:t>, 140700 (2020). https://doi.org/10.1016/j.scitotenv.2020.140700</w:t>
+        <w:t>16</w:t>
+      </w:r>
+      <w:r>
+        <w:rPr>
+          <w:rFonts w:ascii="Calibri" w:hAnsi="Calibri"/>
+          <w:sz w:val="21"/>
+        </w:rPr>
+        <w:t>, 314-323 (2020). https://doi.org/10.1002/ieam.4235</w:t>
       </w:r>
     </w:p>
     <w:p>
@@ -4602,16 +4849,16 @@
           <w:rFonts w:ascii="Calibri" w:hAnsi="Calibri"/>
           <w:sz w:val="21"/>
         </w:rPr>
-        <w:t>24. Cardellini, G., Mutel, C. L., Vial, E. &amp; Muys, B. Temporalis, a generic</w:t>
-      </w:r>
-    </w:p>
-    <w:p>
-      <w:r>
-        <w:rPr>
-          <w:rFonts w:ascii="Calibri" w:hAnsi="Calibri"/>
-          <w:sz w:val="21"/>
-        </w:rPr>
-        <w:t xml:space="preserve">method and tool for dynamic life cycle assessment. </w:t>
+        <w:t>23. Beloin-Saint-Pierre, D. et al. Addressing temporal considerations in life</w:t>
+      </w:r>
+    </w:p>
+    <w:p>
+      <w:r>
+        <w:rPr>
+          <w:rFonts w:ascii="Calibri" w:hAnsi="Calibri"/>
+          <w:sz w:val="21"/>
+        </w:rPr>
+        <w:t xml:space="preserve">cycle assessment. </w:t>
       </w:r>
       <w:r>
         <w:rPr>
@@ -4634,14 +4881,14 @@
           <w:b/>
           <w:sz w:val="21"/>
         </w:rPr>
-        <w:t>645</w:t>
-      </w:r>
-      <w:r>
-        <w:rPr>
-          <w:rFonts w:ascii="Calibri" w:hAnsi="Calibri"/>
-          <w:sz w:val="21"/>
-        </w:rPr>
-        <w:t>, 585-595 (2018). https://doi.org/10.1016/j.scitotenv.2018.07.044</w:t>
+        <w:t>743</w:t>
+      </w:r>
+      <w:r>
+        <w:rPr>
+          <w:rFonts w:ascii="Calibri" w:hAnsi="Calibri"/>
+          <w:sz w:val="21"/>
+        </w:rPr>
+        <w:t>, 140700 (2020). https://doi.org/10.1016/j.scitotenv.2020.140700</w:t>
       </w:r>
     </w:p>
     <w:p>
@@ -4654,16 +4901,16 @@
           <w:rFonts w:ascii="Calibri" w:hAnsi="Calibri"/>
           <w:sz w:val="21"/>
         </w:rPr>
-        <w:t>25. Müller, A. et al. Time-explicit life cycle assessment: a flexible</w:t>
-      </w:r>
-    </w:p>
-    <w:p>
-      <w:r>
-        <w:rPr>
-          <w:rFonts w:ascii="Calibri" w:hAnsi="Calibri"/>
-          <w:sz w:val="21"/>
-        </w:rPr>
-        <w:t xml:space="preserve">framework for coherent consideration of temporal dynamics. </w:t>
+        <w:t>24. Cardellini, G., Mutel, C. L., Vial, E. &amp; Muys, B. Temporalis, a generic</w:t>
+      </w:r>
+    </w:p>
+    <w:p>
+      <w:r>
+        <w:rPr>
+          <w:rFonts w:ascii="Calibri" w:hAnsi="Calibri"/>
+          <w:sz w:val="21"/>
+        </w:rPr>
+        <w:t xml:space="preserve">method and tool for dynamic life cycle assessment. </w:t>
       </w:r>
       <w:r>
         <w:rPr>
@@ -4671,14 +4918,29 @@
           <w:i/>
           <w:sz w:val="21"/>
         </w:rPr>
-        <w:t>International Journal of Life Cycle Assessment</w:t>
-      </w:r>
-      <w:r>
-        <w:rPr>
-          <w:rFonts w:ascii="Calibri" w:hAnsi="Calibri"/>
-          <w:sz w:val="21"/>
-        </w:rPr>
-        <w:t xml:space="preserve"> (2025). https://doi.org/10.1007/s11367-025-02539-3</w:t>
+        <w:t>Science of the Total Environment</w:t>
+      </w:r>
+      <w:r>
+        <w:rPr>
+          <w:rFonts w:ascii="Calibri" w:hAnsi="Calibri"/>
+          <w:sz w:val="21"/>
+        </w:rPr>
+        <w:t xml:space="preserve"> </w:t>
+      </w:r>
+      <w:r>
+        <w:rPr>
+          <w:rFonts w:ascii="Calibri" w:hAnsi="Calibri"/>
+          <w:b/>
+          <w:sz w:val="21"/>
+        </w:rPr>
+        <w:t>645</w:t>
+      </w:r>
+      <w:r>
+        <w:rPr>
+          <w:rFonts w:ascii="Calibri" w:hAnsi="Calibri"/>
+          <w:sz w:val="21"/>
+        </w:rPr>
+        <w:t>, 585-595 (2018). https://doi.org/10.1016/j.scitotenv.2018.07.044</w:t>
       </w:r>
     </w:p>
     <w:p>
@@ -4691,16 +4953,16 @@
           <w:rFonts w:ascii="Calibri" w:hAnsi="Calibri"/>
           <w:sz w:val="21"/>
         </w:rPr>
-        <w:t>26. Diepers, T., Müller, A. &amp; Jakobs, A. bw_timex: a Python package for</w:t>
-      </w:r>
-    </w:p>
-    <w:p>
-      <w:r>
-        <w:rPr>
-          <w:rFonts w:ascii="Calibri" w:hAnsi="Calibri"/>
-          <w:sz w:val="21"/>
-        </w:rPr>
-        <w:t xml:space="preserve">time-explicit life cycle assessment. </w:t>
+        <w:t>25. Müller, A. et al. Time-explicit life cycle assessment: a flexible</w:t>
+      </w:r>
+    </w:p>
+    <w:p>
+      <w:r>
+        <w:rPr>
+          <w:rFonts w:ascii="Calibri" w:hAnsi="Calibri"/>
+          <w:sz w:val="21"/>
+        </w:rPr>
+        <w:t xml:space="preserve">framework for coherent consideration of temporal dynamics. </w:t>
       </w:r>
       <w:r>
         <w:rPr>
@@ -4708,29 +4970,14 @@
           <w:i/>
           <w:sz w:val="21"/>
         </w:rPr>
-        <w:t>Journal of Open Source Software</w:t>
-      </w:r>
-      <w:r>
-        <w:rPr>
-          <w:rFonts w:ascii="Calibri" w:hAnsi="Calibri"/>
-          <w:sz w:val="21"/>
-        </w:rPr>
-        <w:t xml:space="preserve"> </w:t>
-      </w:r>
-      <w:r>
-        <w:rPr>
-          <w:rFonts w:ascii="Calibri" w:hAnsi="Calibri"/>
-          <w:b/>
-          <w:sz w:val="21"/>
-        </w:rPr>
-        <w:t>11</w:t>
-      </w:r>
-      <w:r>
-        <w:rPr>
-          <w:rFonts w:ascii="Calibri" w:hAnsi="Calibri"/>
-          <w:sz w:val="21"/>
-        </w:rPr>
-        <w:t>, 9621 (2026). https://doi.org/10.21105/joss.09621</w:t>
+        <w:t>International Journal of Life Cycle Assessment</w:t>
+      </w:r>
+      <w:r>
+        <w:rPr>
+          <w:rFonts w:ascii="Calibri" w:hAnsi="Calibri"/>
+          <w:sz w:val="21"/>
+        </w:rPr>
+        <w:t xml:space="preserve"> (2025). https://doi.org/10.1007/s11367-025-02539-3</w:t>
       </w:r>
     </w:p>
     <w:p>
@@ -4743,16 +4990,16 @@
           <w:rFonts w:ascii="Calibri" w:hAnsi="Calibri"/>
           <w:sz w:val="21"/>
         </w:rPr>
-        <w:t>27. Michiels, F. &amp; Geeraerd, A. How to decide and visualize whether</w:t>
-      </w:r>
-    </w:p>
-    <w:p>
-      <w:r>
-        <w:rPr>
-          <w:rFonts w:ascii="Calibri" w:hAnsi="Calibri"/>
-          <w:sz w:val="21"/>
-        </w:rPr>
-        <w:t xml:space="preserve">uncertainty or variability is dominating in life cycle assessment results: a systematic review. </w:t>
+        <w:t>26. Diepers, T., Müller, A. &amp; Jakobs, A. bw_timex: a Python package for</w:t>
+      </w:r>
+    </w:p>
+    <w:p>
+      <w:r>
+        <w:rPr>
+          <w:rFonts w:ascii="Calibri" w:hAnsi="Calibri"/>
+          <w:sz w:val="21"/>
+        </w:rPr>
+        <w:t xml:space="preserve">time-explicit life cycle assessment. </w:t>
       </w:r>
       <w:r>
         <w:rPr>
@@ -4760,7 +5007,7 @@
           <w:i/>
           <w:sz w:val="21"/>
         </w:rPr>
-        <w:t>Environmental Modelling &amp; Software</w:t>
+        <w:t>Journal of Open Source Software</w:t>
       </w:r>
       <w:r>
         <w:rPr>
@@ -4775,14 +5022,14 @@
           <w:b/>
           <w:sz w:val="21"/>
         </w:rPr>
-        <w:t>133</w:t>
-      </w:r>
-      <w:r>
-        <w:rPr>
-          <w:rFonts w:ascii="Calibri" w:hAnsi="Calibri"/>
-          <w:sz w:val="21"/>
-        </w:rPr>
-        <w:t>, 104841 (2020). https://doi.org/10.1016/j.envsoft.2020.104841</w:t>
+        <w:t>11</w:t>
+      </w:r>
+      <w:r>
+        <w:rPr>
+          <w:rFonts w:ascii="Calibri" w:hAnsi="Calibri"/>
+          <w:sz w:val="21"/>
+        </w:rPr>
+        <w:t>, 9621 (2026). https://doi.org/10.21105/joss.09621</w:t>
       </w:r>
     </w:p>
     <w:p>
@@ -4795,16 +5042,16 @@
           <w:rFonts w:ascii="Calibri" w:hAnsi="Calibri"/>
           <w:sz w:val="21"/>
         </w:rPr>
-        <w:t>28. Lloyd, S. M. &amp; Ries, R. Characterizing, propagating, and analyzing</w:t>
-      </w:r>
-    </w:p>
-    <w:p>
-      <w:r>
-        <w:rPr>
-          <w:rFonts w:ascii="Calibri" w:hAnsi="Calibri"/>
-          <w:sz w:val="21"/>
-        </w:rPr>
-        <w:t xml:space="preserve">uncertainty in life-cycle assessment: a survey of quantitative approaches. </w:t>
+        <w:t>27. Michiels, F. &amp; Geeraerd, A. How to decide and visualize whether</w:t>
+      </w:r>
+    </w:p>
+    <w:p>
+      <w:r>
+        <w:rPr>
+          <w:rFonts w:ascii="Calibri" w:hAnsi="Calibri"/>
+          <w:sz w:val="21"/>
+        </w:rPr>
+        <w:t xml:space="preserve">uncertainty or variability is dominating in life cycle assessment results: a systematic review. </w:t>
       </w:r>
       <w:r>
         <w:rPr>
@@ -4812,7 +5059,7 @@
           <w:i/>
           <w:sz w:val="21"/>
         </w:rPr>
-        <w:t>Journal of Industrial Ecology</w:t>
+        <w:t>Environmental Modelling &amp; Software</w:t>
       </w:r>
       <w:r>
         <w:rPr>
@@ -4827,14 +5074,14 @@
           <w:b/>
           <w:sz w:val="21"/>
         </w:rPr>
-        <w:t>11</w:t>
-      </w:r>
-      <w:r>
-        <w:rPr>
-          <w:rFonts w:ascii="Calibri" w:hAnsi="Calibri"/>
-          <w:sz w:val="21"/>
-        </w:rPr>
-        <w:t>, 161-179 (2007). https://doi.org/10.1162/jiec.2007.1136</w:t>
+        <w:t>133</w:t>
+      </w:r>
+      <w:r>
+        <w:rPr>
+          <w:rFonts w:ascii="Calibri" w:hAnsi="Calibri"/>
+          <w:sz w:val="21"/>
+        </w:rPr>
+        <w:t>, 104841 (2020). https://doi.org/10.1016/j.envsoft.2020.104841</w:t>
       </w:r>
     </w:p>
     <w:p>
@@ -4847,16 +5094,46 @@
           <w:rFonts w:ascii="Calibri" w:hAnsi="Calibri"/>
           <w:sz w:val="21"/>
         </w:rPr>
-        <w:t>29. Edelen, A. &amp; Ingwersen, W. Guidance on Data Quality Assessment for Life</w:t>
-      </w:r>
-    </w:p>
-    <w:p>
-      <w:r>
-        <w:rPr>
-          <w:rFonts w:ascii="Calibri" w:hAnsi="Calibri"/>
-          <w:sz w:val="21"/>
-        </w:rPr>
-        <w:t>Cycle Inventory Data. U.S. EPA, EPA/600/R-16/096 (2016). https://cfpub.epa.gov/si/si_public_record_report.cfm?Lab=NRMRL&amp;dirEntryId=321834</w:t>
+        <w:t>28. Lloyd, S. M. &amp; Ries, R. Characterizing, propagating, and analyzing</w:t>
+      </w:r>
+    </w:p>
+    <w:p>
+      <w:r>
+        <w:rPr>
+          <w:rFonts w:ascii="Calibri" w:hAnsi="Calibri"/>
+          <w:sz w:val="21"/>
+        </w:rPr>
+        <w:t xml:space="preserve">uncertainty in life-cycle assessment: a survey of quantitative approaches. </w:t>
+      </w:r>
+      <w:r>
+        <w:rPr>
+          <w:rFonts w:ascii="Calibri" w:hAnsi="Calibri"/>
+          <w:i/>
+          <w:sz w:val="21"/>
+        </w:rPr>
+        <w:t>Journal of Industrial Ecology</w:t>
+      </w:r>
+      <w:r>
+        <w:rPr>
+          <w:rFonts w:ascii="Calibri" w:hAnsi="Calibri"/>
+          <w:sz w:val="21"/>
+        </w:rPr>
+        <w:t xml:space="preserve"> </w:t>
+      </w:r>
+      <w:r>
+        <w:rPr>
+          <w:rFonts w:ascii="Calibri" w:hAnsi="Calibri"/>
+          <w:b/>
+          <w:sz w:val="21"/>
+        </w:rPr>
+        <w:t>11</w:t>
+      </w:r>
+      <w:r>
+        <w:rPr>
+          <w:rFonts w:ascii="Calibri" w:hAnsi="Calibri"/>
+          <w:sz w:val="21"/>
+        </w:rPr>
+        <w:t>, 161-179 (2007). https://doi.org/10.1162/jiec.2007.1136</w:t>
       </w:r>
     </w:p>
     <w:p>
@@ -4869,46 +5146,16 @@
           <w:rFonts w:ascii="Calibri" w:hAnsi="Calibri"/>
           <w:sz w:val="21"/>
         </w:rPr>
-        <w:t>30. Marchese, D. C., Bates, M. E., Keisler, J. M., Alcaraz, M. L., Linkov, I.</w:t>
-      </w:r>
-    </w:p>
-    <w:p>
-      <w:r>
-        <w:rPr>
-          <w:rFonts w:ascii="Calibri" w:hAnsi="Calibri"/>
-          <w:sz w:val="21"/>
-        </w:rPr>
-        <w:t xml:space="preserve">&amp; Olivetti, E. A. Value of information analysis for life cycle assessment: uncertain emissions in green manufacturing of electronic tablets. </w:t>
-      </w:r>
-      <w:r>
-        <w:rPr>
-          <w:rFonts w:ascii="Calibri" w:hAnsi="Calibri"/>
-          <w:i/>
-          <w:sz w:val="21"/>
-        </w:rPr>
-        <w:t>Journal of Cleaner Production</w:t>
-      </w:r>
-      <w:r>
-        <w:rPr>
-          <w:rFonts w:ascii="Calibri" w:hAnsi="Calibri"/>
-          <w:sz w:val="21"/>
-        </w:rPr>
-        <w:t xml:space="preserve"> </w:t>
-      </w:r>
-      <w:r>
-        <w:rPr>
-          <w:rFonts w:ascii="Calibri" w:hAnsi="Calibri"/>
-          <w:b/>
-          <w:sz w:val="21"/>
-        </w:rPr>
-        <w:t>197</w:t>
-      </w:r>
-      <w:r>
-        <w:rPr>
-          <w:rFonts w:ascii="Calibri" w:hAnsi="Calibri"/>
-          <w:sz w:val="21"/>
-        </w:rPr>
-        <w:t>, 1540-1545 (2018). https://doi.org/10.1016/j.jclepro.2018.06.113</w:t>
+        <w:t>29. Edelen, A. &amp; Ingwersen, W. Guidance on Data Quality Assessment for Life</w:t>
+      </w:r>
+    </w:p>
+    <w:p>
+      <w:r>
+        <w:rPr>
+          <w:rFonts w:ascii="Calibri" w:hAnsi="Calibri"/>
+          <w:sz w:val="21"/>
+        </w:rPr>
+        <w:t>Cycle Inventory Data. U.S. EPA, EPA/600/R-16/096 (2016). https://cfpub.epa.gov/si/si_public_record_report.cfm?Lab=NRMRL&amp;dirEntryId=321834</w:t>
       </w:r>
     </w:p>
     <w:p>
@@ -4921,16 +5168,46 @@
           <w:rFonts w:ascii="Calibri" w:hAnsi="Calibri"/>
           <w:sz w:val="21"/>
         </w:rPr>
-        <w:t>31. GreenDelta. openLCA: open source life cycle assessment software.</w:t>
-      </w:r>
-    </w:p>
-    <w:p>
-      <w:r>
-        <w:rPr>
-          <w:rFonts w:ascii="Calibri" w:hAnsi="Calibri"/>
-          <w:sz w:val="21"/>
-        </w:rPr>
-        <w:t>https://www.openlca.org/</w:t>
+        <w:t>30. Marchese, D. C., Bates, M. E., Keisler, J. M., Alcaraz, M. L., Linkov, I.</w:t>
+      </w:r>
+    </w:p>
+    <w:p>
+      <w:r>
+        <w:rPr>
+          <w:rFonts w:ascii="Calibri" w:hAnsi="Calibri"/>
+          <w:sz w:val="21"/>
+        </w:rPr>
+        <w:t xml:space="preserve">&amp; Olivetti, E. A. Value of information analysis for life cycle assessment: uncertain emissions in green manufacturing of electronic tablets. </w:t>
+      </w:r>
+      <w:r>
+        <w:rPr>
+          <w:rFonts w:ascii="Calibri" w:hAnsi="Calibri"/>
+          <w:i/>
+          <w:sz w:val="21"/>
+        </w:rPr>
+        <w:t>Journal of Cleaner Production</w:t>
+      </w:r>
+      <w:r>
+        <w:rPr>
+          <w:rFonts w:ascii="Calibri" w:hAnsi="Calibri"/>
+          <w:sz w:val="21"/>
+        </w:rPr>
+        <w:t xml:space="preserve"> </w:t>
+      </w:r>
+      <w:r>
+        <w:rPr>
+          <w:rFonts w:ascii="Calibri" w:hAnsi="Calibri"/>
+          <w:b/>
+          <w:sz w:val="21"/>
+        </w:rPr>
+        <w:t>197</w:t>
+      </w:r>
+      <w:r>
+        <w:rPr>
+          <w:rFonts w:ascii="Calibri" w:hAnsi="Calibri"/>
+          <w:sz w:val="21"/>
+        </w:rPr>
+        <w:t>, 1540-1545 (2018). https://doi.org/10.1016/j.jclepro.2018.06.113</w:t>
       </w:r>
     </w:p>
     <w:p>
@@ -4943,39 +5220,16 @@
           <w:rFonts w:ascii="Calibri" w:hAnsi="Calibri"/>
           <w:sz w:val="21"/>
         </w:rPr>
-        <w:t>32. Mutel, C. Brightway: an open source framework for life cycle assessment.</w:t>
-      </w:r>
-    </w:p>
-    <w:p>
-      <w:r>
-        <w:rPr>
-          <w:rFonts w:ascii="Calibri" w:hAnsi="Calibri"/>
-          <w:i/>
-          <w:sz w:val="21"/>
-        </w:rPr>
-        <w:t>Journal of Open Source Software</w:t>
-      </w:r>
-      <w:r>
-        <w:rPr>
-          <w:rFonts w:ascii="Calibri" w:hAnsi="Calibri"/>
-          <w:sz w:val="21"/>
-        </w:rPr>
-        <w:t xml:space="preserve"> </w:t>
-      </w:r>
-      <w:r>
-        <w:rPr>
-          <w:rFonts w:ascii="Calibri" w:hAnsi="Calibri"/>
-          <w:b/>
-          <w:sz w:val="21"/>
-        </w:rPr>
-        <w:t>2</w:t>
-      </w:r>
-      <w:r>
-        <w:rPr>
-          <w:rFonts w:ascii="Calibri" w:hAnsi="Calibri"/>
-          <w:sz w:val="21"/>
-        </w:rPr>
-        <w:t>, 236 (2017). https://doi.org/10.21105/joss.00236</w:t>
+        <w:t>31. International Organization for Standardization. ISO 14040:2006,</w:t>
+      </w:r>
+    </w:p>
+    <w:p>
+      <w:r>
+        <w:rPr>
+          <w:rFonts w:ascii="Calibri" w:hAnsi="Calibri"/>
+          <w:sz w:val="21"/>
+        </w:rPr>
+        <w:t>Environmental management - Life cycle assessment - Principles and framework; and ISO 14044:2006, Environmental management - Life cycle assessment - Requirements and guidelines. https://www.iso.org/committee/54854/x/catalogue/; https://www.iso.org/standard/38498.html</w:t>
       </w:r>
     </w:p>
     <w:p>
@@ -4988,16 +5242,16 @@
           <w:rFonts w:ascii="Calibri" w:hAnsi="Calibri"/>
           <w:sz w:val="21"/>
         </w:rPr>
-        <w:t>33. UARK-NED3. OpenDC-LCA version 1.1.0.</w:t>
-      </w:r>
-    </w:p>
-    <w:p>
-      <w:r>
-        <w:rPr>
-          <w:rFonts w:ascii="Calibri" w:hAnsi="Calibri"/>
-          <w:sz w:val="21"/>
-        </w:rPr>
-        <w:t>https://github.com/UARK-NED3/OpenDC-LCA</w:t>
+        <w:t>32. International Organization for Standardization. ISO 14071:2024,</w:t>
+      </w:r>
+    </w:p>
+    <w:p>
+      <w:r>
+        <w:rPr>
+          <w:rFonts w:ascii="Calibri" w:hAnsi="Calibri"/>
+          <w:sz w:val="21"/>
+        </w:rPr>
+        <w:t>Environmental management - Life cycle assessment - Critical review processes and reviewer competencies (2024). https://www.iso.org/standard/82464.html</w:t>
       </w:r>
     </w:p>
     <w:p>
@@ -5010,16 +5264,16 @@
           <w:rFonts w:ascii="Calibri" w:hAnsi="Calibri"/>
           <w:sz w:val="21"/>
         </w:rPr>
-        <w:t>34. U.S. Environmental Protection Agency. Emissions &amp; Generation Resource</w:t>
-      </w:r>
-    </w:p>
-    <w:p>
-      <w:r>
-        <w:rPr>
-          <w:rFonts w:ascii="Calibri" w:hAnsi="Calibri"/>
-          <w:sz w:val="21"/>
-        </w:rPr>
-        <w:t>Integrated Database (eGRID), detailed data. https://www.epa.gov/egrid/detailed-data</w:t>
+        <w:t>33. GreenDelta. openLCA: open source life cycle assessment software.</w:t>
+      </w:r>
+    </w:p>
+    <w:p>
+      <w:r>
+        <w:rPr>
+          <w:rFonts w:ascii="Calibri" w:hAnsi="Calibri"/>
+          <w:sz w:val="21"/>
+        </w:rPr>
+        <w:t>https://www.openlca.org/</w:t>
       </w:r>
     </w:p>
     <w:p>
@@ -5032,16 +5286,39 @@
           <w:rFonts w:ascii="Calibri" w:hAnsi="Calibri"/>
           <w:sz w:val="21"/>
         </w:rPr>
-        <w:t>35. U.S. Environmental Protection Agency. Frequent questions about eGRID:</w:t>
-      </w:r>
-    </w:p>
-    <w:p>
-      <w:r>
-        <w:rPr>
-          <w:rFonts w:ascii="Calibri" w:hAnsi="Calibri"/>
-          <w:sz w:val="21"/>
-        </w:rPr>
-        <w:t>global warming potentials and methodology changes. https://www.epa.gov/egrid/frequent-questions-about-egrid</w:t>
+        <w:t>34. Mutel, C. Brightway: an open source framework for life cycle assessment.</w:t>
+      </w:r>
+    </w:p>
+    <w:p>
+      <w:r>
+        <w:rPr>
+          <w:rFonts w:ascii="Calibri" w:hAnsi="Calibri"/>
+          <w:i/>
+          <w:sz w:val="21"/>
+        </w:rPr>
+        <w:t>Journal of Open Source Software</w:t>
+      </w:r>
+      <w:r>
+        <w:rPr>
+          <w:rFonts w:ascii="Calibri" w:hAnsi="Calibri"/>
+          <w:sz w:val="21"/>
+        </w:rPr>
+        <w:t xml:space="preserve"> </w:t>
+      </w:r>
+      <w:r>
+        <w:rPr>
+          <w:rFonts w:ascii="Calibri" w:hAnsi="Calibri"/>
+          <w:b/>
+          <w:sz w:val="21"/>
+        </w:rPr>
+        <w:t>2</w:t>
+      </w:r>
+      <w:r>
+        <w:rPr>
+          <w:rFonts w:ascii="Calibri" w:hAnsi="Calibri"/>
+          <w:sz w:val="21"/>
+        </w:rPr>
+        <w:t>, 236 (2017). https://doi.org/10.21105/joss.00236</w:t>
       </w:r>
     </w:p>
     <w:p>
@@ -5054,16 +5331,16 @@
           <w:rFonts w:ascii="Calibri" w:hAnsi="Calibri"/>
           <w:sz w:val="21"/>
         </w:rPr>
-        <w:t>36. Boavizta. BoaviztAPI data repository.</w:t>
-      </w:r>
-    </w:p>
-    <w:p>
-      <w:r>
-        <w:rPr>
-          <w:rFonts w:ascii="Calibri" w:hAnsi="Calibri"/>
-          <w:sz w:val="21"/>
-        </w:rPr>
-        <w:t>https://github.com/Boavizta/boaviztapi</w:t>
+        <w:t>35. UARK-NED3. OpenDC-LCA version 1.1.0.</w:t>
+      </w:r>
+    </w:p>
+    <w:p>
+      <w:r>
+        <w:rPr>
+          <w:rFonts w:ascii="Calibri" w:hAnsi="Calibri"/>
+          <w:sz w:val="21"/>
+        </w:rPr>
+        <w:t>https://github.com/UARK-NED3/OpenDC-LCA</w:t>
       </w:r>
     </w:p>
     <w:p>
@@ -5076,16 +5353,16 @@
           <w:rFonts w:ascii="Calibri" w:hAnsi="Calibri"/>
           <w:sz w:val="21"/>
         </w:rPr>
-        <w:t>37. Bundesinstitut für Bau-, Stadt- und Raumforschung. ÖKOBAUDAT 2024-II.</w:t>
-      </w:r>
-    </w:p>
-    <w:p>
-      <w:r>
-        <w:rPr>
-          <w:rFonts w:ascii="Calibri" w:hAnsi="Calibri"/>
-          <w:sz w:val="21"/>
-        </w:rPr>
-        <w:t>https://www.oekobaudat.de/</w:t>
+        <w:t>36. U.S. Environmental Protection Agency. Emissions &amp; Generation Resource</w:t>
+      </w:r>
+    </w:p>
+    <w:p>
+      <w:r>
+        <w:rPr>
+          <w:rFonts w:ascii="Calibri" w:hAnsi="Calibri"/>
+          <w:sz w:val="21"/>
+        </w:rPr>
+        <w:t>Integrated Database (eGRID), detailed data. https://www.epa.gov/egrid/detailed-data</w:t>
       </w:r>
     </w:p>
     <w:p>
@@ -5098,16 +5375,16 @@
           <w:rFonts w:ascii="Calibri" w:hAnsi="Calibri"/>
           <w:sz w:val="21"/>
         </w:rPr>
-        <w:t>38. National Centers for Environmental Information. Typical Meteorological</w:t>
-      </w:r>
-    </w:p>
-    <w:p>
-      <w:r>
-        <w:rPr>
-          <w:rFonts w:ascii="Calibri" w:hAnsi="Calibri"/>
-          <w:sz w:val="21"/>
-        </w:rPr>
-        <w:t>Year data. https://www.ncei.noaa.gov/access/typical-meteorological-year/</w:t>
+        <w:t>37. U.S. Environmental Protection Agency. Frequent questions about eGRID:</w:t>
+      </w:r>
+    </w:p>
+    <w:p>
+      <w:r>
+        <w:rPr>
+          <w:rFonts w:ascii="Calibri" w:hAnsi="Calibri"/>
+          <w:sz w:val="21"/>
+        </w:rPr>
+        <w:t>global warming potentials and methodology changes. https://www.epa.gov/egrid/frequent-questions-about-egrid</w:t>
       </w:r>
     </w:p>
     <w:p>
@@ -5120,16 +5397,16 @@
           <w:rFonts w:ascii="Calibri" w:hAnsi="Calibri"/>
           <w:sz w:val="21"/>
         </w:rPr>
-        <w:t>39. National Renewable Energy Laboratory. U.S. Life Cycle Inventory Database,</w:t>
-      </w:r>
-    </w:p>
-    <w:p>
-      <w:r>
-        <w:rPr>
-          <w:rFonts w:ascii="Calibri" w:hAnsi="Calibri"/>
-          <w:sz w:val="21"/>
-        </w:rPr>
-        <w:t>version 1.2026-06.0. Federal LCA Commons. https://www.lcacommons.gov/</w:t>
+        <w:t>38. Boavizta. BoaviztAPI data repository.</w:t>
+      </w:r>
+    </w:p>
+    <w:p>
+      <w:r>
+        <w:rPr>
+          <w:rFonts w:ascii="Calibri" w:hAnsi="Calibri"/>
+          <w:sz w:val="21"/>
+        </w:rPr>
+        <w:t>https://github.com/Boavizta/boaviztapi</w:t>
       </w:r>
     </w:p>
     <w:p>
@@ -5142,16 +5419,16 @@
           <w:rFonts w:ascii="Calibri" w:hAnsi="Calibri"/>
           <w:sz w:val="21"/>
         </w:rPr>
-        <w:t>40. United Nations Environment Programme. Global LCA Data Access network.</w:t>
-      </w:r>
-    </w:p>
-    <w:p>
-      <w:r>
-        <w:rPr>
-          <w:rFonts w:ascii="Calibri" w:hAnsi="Calibri"/>
-          <w:sz w:val="21"/>
-        </w:rPr>
-        <w:t>https://www.globallcadataaccess.org/</w:t>
+        <w:t>39. Bundesinstitut für Bau-, Stadt- und Raumforschung. ÖKOBAUDAT 2024-II.</w:t>
+      </w:r>
+    </w:p>
+    <w:p>
+      <w:r>
+        <w:rPr>
+          <w:rFonts w:ascii="Calibri" w:hAnsi="Calibri"/>
+          <w:sz w:val="21"/>
+        </w:rPr>
+        <w:t>https://www.oekobaudat.de/</w:t>
       </w:r>
     </w:p>
     <w:p>
@@ -5164,16 +5441,16 @@
           <w:rFonts w:ascii="Calibri" w:hAnsi="Calibri"/>
           <w:sz w:val="21"/>
         </w:rPr>
-        <w:t>41. U.S. Geological Survey. Watershed Boundary Dataset.</w:t>
-      </w:r>
-    </w:p>
-    <w:p>
-      <w:r>
-        <w:rPr>
-          <w:rFonts w:ascii="Calibri" w:hAnsi="Calibri"/>
-          <w:sz w:val="21"/>
-        </w:rPr>
-        <w:t>https://www.usgs.gov/national-hydrography/watershed-boundary-dataset</w:t>
+        <w:t>40. National Centers for Environmental Information. Typical Meteorological</w:t>
+      </w:r>
+    </w:p>
+    <w:p>
+      <w:r>
+        <w:rPr>
+          <w:rFonts w:ascii="Calibri" w:hAnsi="Calibri"/>
+          <w:sz w:val="21"/>
+        </w:rPr>
+        <w:t>Year data. https://www.ncei.noaa.gov/access/typical-meteorological-year/</w:t>
       </w:r>
     </w:p>
     <w:p>
@@ -5186,16 +5463,16 @@
           <w:rFonts w:ascii="Calibri" w:hAnsi="Calibri"/>
           <w:sz w:val="21"/>
         </w:rPr>
-        <w:t>42. International Organization for Standardization. ISO 14040:2006,</w:t>
-      </w:r>
-    </w:p>
-    <w:p>
-      <w:r>
-        <w:rPr>
-          <w:rFonts w:ascii="Calibri" w:hAnsi="Calibri"/>
-          <w:sz w:val="21"/>
-        </w:rPr>
-        <w:t>Environmental management - Life cycle assessment - Principles and framework; and ISO 14044:2006, Environmental management - Life cycle assessment - Requirements and guidelines. https://www.iso.org/committee/54854/x/catalogue/; https://www.iso.org/standard/38498.html</w:t>
+        <w:t>41. National Renewable Energy Laboratory. U.S. Life Cycle Inventory Database,</w:t>
+      </w:r>
+    </w:p>
+    <w:p>
+      <w:r>
+        <w:rPr>
+          <w:rFonts w:ascii="Calibri" w:hAnsi="Calibri"/>
+          <w:sz w:val="21"/>
+        </w:rPr>
+        <w:t>version 1.2026-06.0. Federal LCA Commons. https://www.lcacommons.gov/</w:t>
       </w:r>
     </w:p>
     <w:p>
@@ -5208,16 +5485,238 @@
           <w:rFonts w:ascii="Calibri" w:hAnsi="Calibri"/>
           <w:sz w:val="21"/>
         </w:rPr>
-        <w:t>43. International Organization for Standardization. ISO 14071:2024,</w:t>
-      </w:r>
-    </w:p>
-    <w:p>
-      <w:r>
-        <w:rPr>
-          <w:rFonts w:ascii="Calibri" w:hAnsi="Calibri"/>
-          <w:sz w:val="21"/>
-        </w:rPr>
-        <w:t>Environmental management - Life cycle assessment - Critical review processes and reviewer competencies (2024). https://www.iso.org/standard/82464.html</w:t>
+        <w:t>42. United Nations Environment Programme. Global LCA Data Access network.</w:t>
+      </w:r>
+    </w:p>
+    <w:p>
+      <w:r>
+        <w:rPr>
+          <w:rFonts w:ascii="Calibri" w:hAnsi="Calibri"/>
+          <w:sz w:val="21"/>
+        </w:rPr>
+        <w:t>https://www.globallcadataaccess.org/</w:t>
+      </w:r>
+    </w:p>
+    <w:p>
+      <w:pPr>
+        <w:spacing w:after="60"/>
+        <w:ind w:left="374" w:hanging="288"/>
+      </w:pPr>
+      <w:r>
+        <w:rPr>
+          <w:rFonts w:ascii="Calibri" w:hAnsi="Calibri"/>
+          <w:sz w:val="21"/>
+        </w:rPr>
+        <w:t>43. U.S. Geological Survey. Watershed Boundary Dataset.</w:t>
+      </w:r>
+    </w:p>
+    <w:p>
+      <w:r>
+        <w:rPr>
+          <w:rFonts w:ascii="Calibri" w:hAnsi="Calibri"/>
+          <w:sz w:val="21"/>
+        </w:rPr>
+        <w:t>https://www.usgs.gov/national-hydrography/watershed-boundary-dataset</w:t>
+      </w:r>
+    </w:p>
+    <w:p>
+      <w:pPr>
+        <w:spacing w:after="60"/>
+        <w:ind w:left="374" w:hanging="288"/>
+      </w:pPr>
+      <w:r>
+        <w:rPr>
+          <w:rFonts w:ascii="Calibri" w:hAnsi="Calibri"/>
+          <w:sz w:val="21"/>
+        </w:rPr>
+        <w:t>44. d'Orgeval, A., Sheehan, S., Avenas, Q., Assoumou, E. &amp; Sessa, V.</w:t>
+      </w:r>
+    </w:p>
+    <w:p>
+      <w:r>
+        <w:rPr>
+          <w:rFonts w:ascii="Calibri" w:hAnsi="Calibri"/>
+          <w:sz w:val="21"/>
+        </w:rPr>
+        <w:t xml:space="preserve">Generative AI impact assessment through a life cycle analysis of multiple data center typologies. </w:t>
+      </w:r>
+      <w:r>
+        <w:rPr>
+          <w:rFonts w:ascii="Calibri" w:hAnsi="Calibri"/>
+          <w:i/>
+          <w:sz w:val="21"/>
+        </w:rPr>
+        <w:t>Applied Energy</w:t>
+      </w:r>
+      <w:r>
+        <w:rPr>
+          <w:rFonts w:ascii="Calibri" w:hAnsi="Calibri"/>
+          <w:sz w:val="21"/>
+        </w:rPr>
+        <w:t xml:space="preserve"> </w:t>
+      </w:r>
+      <w:r>
+        <w:rPr>
+          <w:rFonts w:ascii="Calibri" w:hAnsi="Calibri"/>
+          <w:b/>
+          <w:sz w:val="21"/>
+        </w:rPr>
+        <w:t>406</w:t>
+      </w:r>
+      <w:r>
+        <w:rPr>
+          <w:rFonts w:ascii="Calibri" w:hAnsi="Calibri"/>
+          <w:sz w:val="21"/>
+        </w:rPr>
+        <w:t>, 127288 (2026). https://doi.org/10.1016/j.apenergy.2025.127288</w:t>
+      </w:r>
+    </w:p>
+    <w:p>
+      <w:pPr>
+        <w:spacing w:after="60"/>
+        <w:ind w:left="374" w:hanging="288"/>
+      </w:pPr>
+      <w:r>
+        <w:rPr>
+          <w:rFonts w:ascii="Calibri" w:hAnsi="Calibri"/>
+          <w:sz w:val="21"/>
+        </w:rPr>
+        <w:t>45. Wu, S., Zheng, W., Wang, Z., Chen, G., Yang, P., Yue, S., Li, D. &amp; Wu, Y.</w:t>
+      </w:r>
+    </w:p>
+    <w:p>
+      <w:r>
+        <w:rPr>
+          <w:rFonts w:ascii="Calibri" w:hAnsi="Calibri"/>
+          <w:sz w:val="21"/>
+        </w:rPr>
+        <w:t xml:space="preserve">AlphaDataCenterCooling: A new computational model for data center cooling system evaluation. </w:t>
+      </w:r>
+      <w:r>
+        <w:rPr>
+          <w:rFonts w:ascii="Calibri" w:hAnsi="Calibri"/>
+          <w:i/>
+          <w:sz w:val="21"/>
+        </w:rPr>
+        <w:t>Applied Energy</w:t>
+      </w:r>
+      <w:r>
+        <w:rPr>
+          <w:rFonts w:ascii="Calibri" w:hAnsi="Calibri"/>
+          <w:sz w:val="21"/>
+        </w:rPr>
+        <w:t xml:space="preserve"> </w:t>
+      </w:r>
+      <w:r>
+        <w:rPr>
+          <w:rFonts w:ascii="Calibri" w:hAnsi="Calibri"/>
+          <w:b/>
+          <w:sz w:val="21"/>
+        </w:rPr>
+        <w:t>380</w:t>
+      </w:r>
+      <w:r>
+        <w:rPr>
+          <w:rFonts w:ascii="Calibri" w:hAnsi="Calibri"/>
+          <w:sz w:val="21"/>
+        </w:rPr>
+        <w:t>, 125100 (2025). https://doi.org/10.1016/j.apenergy.2024.125100</w:t>
+      </w:r>
+    </w:p>
+    <w:p>
+      <w:pPr>
+        <w:spacing w:after="60"/>
+        <w:ind w:left="374" w:hanging="288"/>
+      </w:pPr>
+      <w:r>
+        <w:rPr>
+          <w:rFonts w:ascii="Calibri" w:hAnsi="Calibri"/>
+          <w:sz w:val="21"/>
+        </w:rPr>
+        <w:t>46. Groen, E. A. &amp; Heijungs, R. Ignoring correlation in uncertainty and</w:t>
+      </w:r>
+    </w:p>
+    <w:p>
+      <w:r>
+        <w:rPr>
+          <w:rFonts w:ascii="Calibri" w:hAnsi="Calibri"/>
+          <w:sz w:val="21"/>
+        </w:rPr>
+        <w:t xml:space="preserve">sensitivity analysis in life cycle assessment: what is the risk? </w:t>
+      </w:r>
+      <w:r>
+        <w:rPr>
+          <w:rFonts w:ascii="Calibri" w:hAnsi="Calibri"/>
+          <w:i/>
+          <w:sz w:val="21"/>
+        </w:rPr>
+        <w:t>Environmental Impact Assessment Review</w:t>
+      </w:r>
+      <w:r>
+        <w:rPr>
+          <w:rFonts w:ascii="Calibri" w:hAnsi="Calibri"/>
+          <w:sz w:val="21"/>
+        </w:rPr>
+        <w:t xml:space="preserve"> </w:t>
+      </w:r>
+      <w:r>
+        <w:rPr>
+          <w:rFonts w:ascii="Calibri" w:hAnsi="Calibri"/>
+          <w:b/>
+          <w:sz w:val="21"/>
+        </w:rPr>
+        <w:t>62</w:t>
+      </w:r>
+      <w:r>
+        <w:rPr>
+          <w:rFonts w:ascii="Calibri" w:hAnsi="Calibri"/>
+          <w:sz w:val="21"/>
+        </w:rPr>
+        <w:t>, 98-109 (2017). https://doi.org/10.1016/j.eiar.2016.10.006</w:t>
+      </w:r>
+    </w:p>
+    <w:p>
+      <w:pPr>
+        <w:spacing w:after="60"/>
+        <w:ind w:left="374" w:hanging="288"/>
+      </w:pPr>
+      <w:r>
+        <w:rPr>
+          <w:rFonts w:ascii="Calibri" w:hAnsi="Calibri"/>
+          <w:sz w:val="21"/>
+        </w:rPr>
+        <w:t>47. National Energy Technology Laboratory. U.S. Electricity Baseline, 2023</w:t>
+      </w:r>
+    </w:p>
+    <w:p>
+      <w:r>
+        <w:rPr>
+          <w:rFonts w:ascii="Calibri" w:hAnsi="Calibri"/>
+          <w:sz w:val="21"/>
+        </w:rPr>
+        <w:t>data release, version 03.00.000. Federal LCA Commons (2026). https://www.lcacommons.gov/lca-collaboration/Federal_LCA_Commons/US_electricity_baseline</w:t>
+      </w:r>
+    </w:p>
+    <w:p>
+      <w:pPr>
+        <w:spacing w:after="60"/>
+        <w:ind w:left="374" w:hanging="288"/>
+      </w:pPr>
+      <w:r>
+        <w:rPr>
+          <w:rFonts w:ascii="Calibri" w:hAnsi="Calibri"/>
+          <w:sz w:val="21"/>
+        </w:rPr>
+        <w:t>48. International Telecommunication Union. ITU-T Recommendation L.1410:</w:t>
+      </w:r>
+    </w:p>
+    <w:p>
+      <w:r>
+        <w:rPr>
+          <w:rFonts w:ascii="Calibri" w:hAnsi="Calibri"/>
+          <w:sz w:val="21"/>
+        </w:rPr>
+        <w:t>Methodology for environmental life cycle assessments of information and communication technology goods, networks and services (2024). https://handle.itu.int/11.1002/1000/16010</w:t>
       </w:r>
     </w:p>
     <w:sectPr>

</xml_diff>

<commit_message>
Update manuscript authors and affiliations
</commit_message>
<xml_diff>
--- a/paper/OpenDC-LCA_manuscript.docx
+++ b/paper/OpenDC-LCA_manuscript.docx
@@ -30,7 +30,7 @@
           <w:color w:val="17324D"/>
           <w:sz w:val="22"/>
         </w:rPr>
-        <w:t>Han Hu and Darin W. Nutter</w:t>
+        <w:t>Braden Stevens (1), Pengjiang Xiang (2), Yimin Chen (1), Darin Nutter (1), and Han Hu (1)</w:t>
       </w:r>
     </w:p>
     <w:p>
@@ -46,7 +46,23 @@
           <w:color w:val="17324D"/>
           <w:sz w:val="22"/>
         </w:rPr>
-        <w:t>Department of Mechanical Engineering, University of Arkansas, Fayetteville, Arkansas, USA</w:t>
+        <w:t>(1) Department of Mechanical Engineering, University of Arkansas, Fayetteville, AR 72701, U.S.</w:t>
+      </w:r>
+    </w:p>
+    <w:p>
+      <w:pPr>
+        <w:spacing w:after="60"/>
+        <w:jc w:val="center"/>
+      </w:pPr>
+      <w:r>
+        <w:rPr>
+          <w:rFonts w:ascii="Calibri" w:hAnsi="Calibri"/>
+          <w:b/>
+          <w:i w:val="0"/>
+          <w:color w:val="17324D"/>
+          <w:sz w:val="22"/>
+        </w:rPr>
+        <w:t>(2) Building Technologies Research and Integration Center, Oak Ridge National Laboratory, Oak Ridge, TN 37830, U.S.</w:t>
       </w:r>
     </w:p>
     <w:p>

</xml_diff>

<commit_message>
Add Harrison French author affiliations
</commit_message>
<xml_diff>
--- a/paper/OpenDC-LCA_manuscript.docx
+++ b/paper/OpenDC-LCA_manuscript.docx
@@ -30,7 +30,7 @@
           <w:color w:val="17324D"/>
           <w:sz w:val="22"/>
         </w:rPr>
-        <w:t>Braden Stevens (1), Pengjiang Xiang (1), Yimin Chen (2), Darin Nutter (1), and Han Hu (1)</w:t>
+        <w:t>Braden Stevens (1, 3), Pengjiang Xiang (1, 3), Yimin Chen (2), Darin Nutter (1), and Han Hu (1)</w:t>
       </w:r>
     </w:p>
     <w:p>
@@ -63,6 +63,22 @@
           <w:sz w:val="22"/>
         </w:rPr>
         <w:t>(2) Building Technologies Research and Integration Center, Oak Ridge National Laboratory, Oak Ridge, TN 37830, U.S.</w:t>
+      </w:r>
+    </w:p>
+    <w:p>
+      <w:pPr>
+        <w:spacing w:after="60"/>
+        <w:jc w:val="center"/>
+      </w:pPr>
+      <w:r>
+        <w:rPr>
+          <w:rFonts w:ascii="Calibri" w:hAnsi="Calibri"/>
+          <w:b/>
+          <w:i w:val="0"/>
+          <w:color w:val="17324D"/>
+          <w:sz w:val="22"/>
+        </w:rPr>
+        <w:t>(3) Harrison French &amp; Associates Ltd., Bentonville, AR 72712, U.S.</w:t>
       </w:r>
     </w:p>
     <w:p>

</xml_diff>

<commit_message>
Revise manuscript submission compliance and disclosures
</commit_message>
<xml_diff>
--- a/paper/OpenDC-LCA_manuscript.docx
+++ b/paper/OpenDC-LCA_manuscript.docx
@@ -14,7 +14,7 @@
           <w:color w:val="17324D"/>
           <w:sz w:val="42"/>
         </w:rPr>
-        <w:t>Transferability audit of data-center cooling LCA: lifecycle electricity, functional equivalence, and rank robustness</w:t>
+        <w:t>Transferability audit of data-center cooling life-cycle assessment: lifecycle electricity, functional equivalence, and rank robustness</w:t>
       </w:r>
     </w:p>
     <w:p>
@@ -94,7 +94,7 @@
           <w:color w:val="60758A"/>
           <w:sz w:val="19"/>
         </w:rPr>
-        <w:t>Pre-submission draft for coauthor review.</w:t>
+        <w:t>Corresponding author: Han Hu (hanhu@uark.edu).</w:t>
       </w:r>
     </w:p>
     <w:p>
@@ -119,7 +119,7 @@
           <w:rFonts w:ascii="Calibri" w:hAnsi="Calibri"/>
           <w:sz w:val="21"/>
         </w:rPr>
-        <w:t>Published data-center cooling LCAs are difficult to transfer across grids and facilities because electricity boundaries, climate methods, useful-computation equivalence, and foreground inventories can differ. This Technology Assessment audits a released Microsoft/WSP comparison and tests which conclusions remain supported after those differences are made explicit. We reconstructed 24 published totals, harmonized nine U.S. EPA eGRID releases to IPCC AR5 GWP100, and calculated 71 non-residual 2023 electricity consumption product systems from the Federal LCA Commons. The source article reports AR5 GWP100, whereas the archived detailed workbook places the two numeric electricity endpoints in GTP100 cells while its corresponding GWP100 cells are blank; comparative use-phase formulas point to those blank F29 cells. Accordingly, cooling totals are retained only as numerical transferability screens. The harmonized national direct-generation factor declined 32.46%, from 517.73 kg CO2e/MWh in 2012 to 349.67 kg CO2e/MWh in 2023. The linked national consumption system yielded 422.93 kg CO2e/MWh, including 53.08 kg CO2e/MWh beyond generation processes; all 10 FERC regions exceeded the 96.70 kg CO2e/MWh numerical cold-plate/single-phase crossover, while 10 of 60 balancing authorities fell below it. The product system nevertheless retained 287 unlinked technosphere inputs, so these are partial linked-system factors, not complete lifecycle benchmarks. Under equal relative bounds, the national first-rank screen failed at a 1.32% all-block half-width; service-equivalence and use-phase thresholds were 2.64% and 2.99%, compared with 22.15% for embodied burden. Thus, an earlier conclusion that embodied variation was dominant was an artifact of assigning it a wider range. The audit supports the national decarbonization trend and identifies the data needed for a valid comparison, but it does not identify a universally preferable cooling architecture.</w:t>
+        <w:t>Published data-center cooling life-cycle assessments (LCAs) are difficult to transfer because electricity boundaries, climate methods, useful-computation equivalence, and foreground inventories differ. This Technology Assessment uses OpenDC-LCA, an open-source evidence-audit and comparison-validation tool, to test which conclusions from the released Microsoft/WSP comparison remain supportable. We reconstructed 24 totals, harmonized nine U.S. Environmental Protection Agency Emissions &amp; Generation Resource Integrated Database (eGRID) releases to the Intergovernmental Panel on Climate Change Fifth Assessment Report 100-year global warming potential (AR5 GWP100), and calculated 71 non-residual 2023 Federal LCA Commons electricity-consumption systems. The article reports AR5 GWP100, but its archived workbook places the numeric electricity endpoints in 100-year global temperature-change-potential (GTP100) cells while the corresponding GWP100 cells are blank; formulas point to those blank cells. We therefore retain cooling totals only as numerical transferability screens. The harmonized national direct-generation factor declined 32.46%, from 517.73 to 349.67 kg carbon dioxide equivalent per megawatt-hour between 2012 and 2023. The partial linked national consumption system yielded 422.93 kg carbon dioxide equivalent per megawatt-hour but retained 287 unlinked technosphere inputs. Under equal relative bounds, the first-rank screen failed at a 1.32% all-block half-width; service-equivalence and use-phase thresholds were 2.64% and 2.99%, compared with 22.15% for embodied burden. This result reverses an earlier attribution of rank sensitivity to embodied variation. The audit supports the decline in generation-related greenhouse-gas intensity and identifies decision-critical data, but it does not identify a universally preferable cooling architecture.</w:t>
       </w:r>
     </w:p>
     <w:p>
@@ -136,7 +136,7 @@
           <w:rFonts w:ascii="Calibri" w:hAnsi="Calibri"/>
           <w:sz w:val="21"/>
         </w:rPr>
-        <w:t xml:space="preserve"> data center; life-cycle assessment; technology assessment; lifecycle electricity; functional equivalence; sensitivity analysis; open-source software</w:t>
+        <w:t xml:space="preserve"> data center; life-cycle assessment; energy efficiency; lifecycle electricity; functional equivalence; sensitivity analysis; open-source software</w:t>
       </w:r>
     </w:p>
     <w:p>
@@ -161,16 +161,16 @@
           <w:rFonts w:ascii="Calibri" w:hAnsi="Calibri"/>
           <w:sz w:val="21"/>
         </w:rPr>
-        <w:t>Data centers couple rapidly changing computing hardware to long-lived buildings, electrical systems, cooling plants, and regional energy and water systems. Global data-center electricity estimates remain uncertain, but the scale and growth of cloud and artificial-intelligence workloads make energy efficiency and supply decarbonization simultaneous design constraints [1,2]. At the equipment level, increasing processor heat flux and rack density are driving a transition from room air cooling toward rear-door heat exchangers, direct-to-chip cold plates, and single- or two-phase immersion [3-5].</w:t>
-      </w:r>
-    </w:p>
-    <w:p>
-      <w:r>
-        <w:rPr>
-          <w:rFonts w:ascii="Calibri" w:hAnsi="Calibri"/>
-          <w:sz w:val="21"/>
-        </w:rPr>
-        <w:t>These alternatives are not interchangeable heat exchangers. They alter server fans, pumps, coolant distribution units, heat-rejection temperature, fluid inventory, rack or tank construction, packing density, repair procedures, and sometimes achievable clock rate. System experiments have reported materially different coefficient of performance and cost behavior for single- and two-phase immersion over load [6], while recent single-phase tests show that flow direction, coolant viscosity, and water temperature affect chip temperature, thermal resistance, and PUE [7]. Two-phase experiments similarly show that boiling, pressure stability, and condenser performance must be evaluated at server and system levels [8]. A comparison at equal rack count, equal IT electricity, or equal nameplate capacity risks comparing different computational services.</w:t>
+        <w:t>Data centers couple rapidly changing computing hardware to long-lived buildings, electrical systems, cooling plants, and regional energy and water systems. Global data-center electricity estimates remain uncertain, but the scale and growth of cloud and artificial intelligence (AI) workloads make energy efficiency and electricity-supply emissions simultaneous design constraints [1,2]. At the equipment level, increasing processor heat flux and rack density are driving a transition from room air cooling toward rear-door heat exchangers, direct-to-chip cold plates, and single- or two-phase immersion [3-5].</w:t>
+      </w:r>
+    </w:p>
+    <w:p>
+      <w:r>
+        <w:rPr>
+          <w:rFonts w:ascii="Calibri" w:hAnsi="Calibri"/>
+          <w:sz w:val="21"/>
+        </w:rPr>
+        <w:t>These alternatives are not interchangeable heat exchangers. They alter server fans, pumps, coolant distribution units, heat-rejection temperature, fluid inventory, rack or tank construction, packing density, repair procedures, and sometimes achievable clock rate. System experiments have reported materially different coefficient of performance and cost behavior for single- and two-phase immersion over load [6], while recent single-phase tests show that flow direction, coolant viscosity, and water temperature affect chip temperature, thermal resistance, and power usage effectiveness (PUE) [7]. Two-phase experiments similarly show that boiling, pressure stability, and condenser performance must be evaluated at server and system levels [8]. A comparison at equal rack count, equal IT electricity, or equal nameplate capacity risks comparing different computational services.</w:t>
       </w:r>
     </w:p>
     <w:p>
@@ -187,7 +187,7 @@
         <w:pStyle w:val="Heading2"/>
       </w:pPr>
       <w:r>
-        <w:t>1.2. What existing data-center LCAs show</w:t>
+        <w:t>1.2. Existing data-center LCAs</w:t>
       </w:r>
     </w:p>
     <w:p>
@@ -214,16 +214,16 @@
           <w:rFonts w:ascii="Calibri" w:hAnsi="Calibri"/>
           <w:sz w:val="21"/>
         </w:rPr>
-        <w:t>Recent work has moved closer to architecture- and service-level assessment. d'Orgeval et al. modeled complete data-center configurations and reported performance-normalized results for GPU-based subsets [44]. Wu et al. released and validated a cooling-plant virtual testbed against three months of operating data, with 7.62% mean absolute percentage error for power [45]. These studies provide performance and architecture evidence that a secondary normalized table cannot supply. ITU-T L.1410 likewise treats the functional unit and the rules for comparative ICT analysis as explicit study choices [48].</w:t>
-      </w:r>
-    </w:p>
-    <w:p>
-      <w:r>
-        <w:rPr>
-          <w:rFonts w:ascii="Calibri" w:hAnsi="Calibri"/>
-          <w:sz w:val="21"/>
-        </w:rPr>
-        <w:t>Other LCA work confirms that electricity decarbonization and cooling efficiency are complementary but can shift impacts among categories [16]. Manufacturer and ICT studies also show wide dispersion in embodied server impacts [17,18]. Together, this literature exposes a specific gap: available primary studies do not provide a reusable audit for determining whether a published cooling comparison can be transferred to a different electricity system without changing its method, boundary, or computational service.</w:t>
+        <w:t>Recent work has moved closer to architecture- and service-level assessment. d'Orgeval et al. modeled complete data-center configurations and reported performance-normalized results for GPU-based subsets [16]. Wu et al. released and validated a cooling-plant virtual testbed against three months of operating data, with 7.62% mean absolute percentage error for power [17]. These studies provide performance and architecture evidence that a secondary normalized table cannot supply. ITU-T L.1410 likewise treats the functional unit and the rules for comparative ICT analysis as explicit study choices [18].</w:t>
+      </w:r>
+    </w:p>
+    <w:p>
+      <w:r>
+        <w:rPr>
+          <w:rFonts w:ascii="Calibri" w:hAnsi="Calibri"/>
+          <w:sz w:val="21"/>
+        </w:rPr>
+        <w:t>Other LCA work confirms that changes in electricity-generation emissions and cooling efficiency are complementary but can shift impacts among categories [19]. Manufacturer and ICT studies also show wide dispersion in embodied server impacts [20,21]. Together, this literature exposes a specific gap: available primary studies do not provide a reusable audit for determining whether a published cooling comparison can be transferred to a different electricity system without changing its method, boundary, or computational service.</w:t>
       </w:r>
     </w:p>
     <w:p>
@@ -240,16 +240,16 @@
           <w:rFonts w:ascii="Calibri" w:hAnsi="Calibri"/>
           <w:sz w:val="21"/>
         </w:rPr>
-        <w:t>Electricity is not a scalar independent of method. Attributional LCA usually requires a consumption mix with upstream generation, transmission, and other indirect processes, whereas eGRID state total-output rates describe direct emissions from in-state generation. Location-based, market-based, and marginal factors answer different questions. Combining location- and market-based accounting inconsistently can double count renewable attributes [19,20]. Average rates can also fail to represent the effect of workload shifting; Dandres et al. found that average and marginal electricity signals can lead to different real-time data-center decisions [21].</w:t>
-      </w:r>
-    </w:p>
-    <w:p>
-      <w:r>
-        <w:rPr>
-          <w:rFonts w:ascii="Calibri" w:hAnsi="Calibri"/>
-          <w:sz w:val="21"/>
-        </w:rPr>
-        <w:t>Time enters at several levels: cooling performance varies with load and weather; grid composition varies hourly and over years; equipment is replaced at discrete times; and background technologies evolve. Dynamic-LCA reviews distinguish temporal inventory, characterization, and prospective background change [22,23]. Open tools such as Temporalis and, more recently, bw_timex show how temporal information can be propagated through process networks [24-26]. For cooling, hourly operation is necessary but insufficient: the grid method, geography, and upstream boundary must also be aligned. A weather file cannot repair an incompatible electricity inventory.</w:t>
+        <w:t>Electricity is not a scalar independent of method. Attributional LCA usually requires a consumption mix with upstream generation, transmission, and other indirect processes, whereas eGRID state total-output rates describe direct emissions from in-state generation. Location-based, market-based, and marginal factors answer different questions. Combining location- and market-based accounting inconsistently can double count renewable attributes [22,23]. Average rates can also fail to represent the effect of workload shifting; Dandres et al. found that average and marginal electricity signals can lead to different real-time data-center decisions [24].</w:t>
+      </w:r>
+    </w:p>
+    <w:p>
+      <w:r>
+        <w:rPr>
+          <w:rFonts w:ascii="Calibri" w:hAnsi="Calibri"/>
+          <w:sz w:val="21"/>
+        </w:rPr>
+        <w:t>Time enters at several levels: cooling performance varies with load and weather; grid composition varies hourly and over years; equipment is replaced at discrete times; and background technologies evolve. Dynamic-LCA reviews distinguish temporal inventory, characterization, and prospective background change [25,26]. Open tools such as Temporalis and, more recently, bw_timex show how temporal information can be propagated through process networks [27-29]. For cooling, hourly operation is necessary but insufficient: the grid method, geography, and upstream boundary must also be aligned. A weather file cannot repair an incompatible electricity inventory.</w:t>
       </w:r>
     </w:p>
     <w:p>
@@ -266,25 +266,25 @@
           <w:rFonts w:ascii="Calibri" w:hAnsi="Calibri"/>
           <w:sz w:val="21"/>
         </w:rPr>
-        <w:t>LCA uncertainty arises from parameters, scenarios, model form, allocation, system boundary, and incomplete knowledge. Monte Carlo propagation is useful when distributions and correlations are supportable; it becomes misleading when arbitrary ranges are presented as confidence. Correlation can materially change propagated uncertainty and cannot be inferred from marginal ranges alone [46]. Reviews recommend separating variability from uncertainty and using sensitivity analysis to identify influential assumptions [27]. Pedigree matrices can communicate reliability, temporal, geographic, and technological representativeness, but the conversion from qualitative scores to uncertainty is itself a modeling choice [28,29].</w:t>
-      </w:r>
-    </w:p>
-    <w:p>
-      <w:r>
-        <w:rPr>
-          <w:rFonts w:ascii="Calibri" w:hAnsi="Calibri"/>
-          <w:sz w:val="21"/>
-        </w:rPr>
-        <w:t>Data-quality assessment is not a decorative appendix. EPA guidance emphasizes reproducible documentation at flow and process levels [29]. Decision analysis goes further: value-of-information methods prioritize data whose resolution is expected to change a decision, rather than simply improving every weak input [30]. This distinction is important for electronics-cooling laboratories. A parameter may have poor pedigree but negligible decision leverage; a seemingly precise PUE difference may be decisive if two lifecycle alternatives are nearly tied.</w:t>
-      </w:r>
-    </w:p>
-    <w:p>
-      <w:r>
-        <w:rPr>
-          <w:rFonts w:ascii="Calibri" w:hAnsi="Calibri"/>
-          <w:sz w:val="21"/>
-        </w:rPr>
-        <w:t>The review standard also depends on the claim. ISO 14040 and ISO 14044 define the LCA framework and requirements, whereas ISO 14071:2024 specifies critical review processes and reviewer competencies, with particular relevance to comparative assertions intended for public disclosure [31,32]. Code tests, data checks, and coauthor review can strengthen traceability, but none is a substitute for an independent critical review.</w:t>
+        <w:t>LCA uncertainty arises from parameters, scenarios, model form, allocation, system boundary, and incomplete knowledge. Monte Carlo propagation is useful when distributions and correlations are supportable; it becomes misleading when arbitrary ranges are presented as confidence. Correlation can materially change propagated uncertainty and cannot be inferred from marginal ranges alone [30]. Reviews recommend separating variability from uncertainty and using sensitivity analysis to identify influential assumptions [31]. Pedigree matrices can communicate reliability, temporal, geographic, and technological representativeness, but the conversion from qualitative scores to uncertainty is itself a modeling choice [32,33].</w:t>
+      </w:r>
+    </w:p>
+    <w:p>
+      <w:r>
+        <w:rPr>
+          <w:rFonts w:ascii="Calibri" w:hAnsi="Calibri"/>
+          <w:sz w:val="21"/>
+        </w:rPr>
+        <w:t>Data-quality assessment is not a decorative appendix. EPA guidance emphasizes reproducible documentation at flow and process levels [33]. Decision analysis goes further: value-of-information methods prioritize data whose resolution is expected to change a decision, rather than simply improving every weak input [34]. This distinction is important for electronics-cooling laboratories. A parameter may have poor pedigree but negligible decision leverage; a seemingly precise PUE difference may be decisive if two lifecycle alternatives are nearly tied.</w:t>
+      </w:r>
+    </w:p>
+    <w:p>
+      <w:r>
+        <w:rPr>
+          <w:rFonts w:ascii="Calibri" w:hAnsi="Calibri"/>
+          <w:sz w:val="21"/>
+        </w:rPr>
+        <w:t>The review standard also depends on the claim. ISO 14040 and ISO 14044 define the LCA framework and requirements, whereas ISO 14071:2024 specifies critical review processes and reviewer competencies, with particular relevance to comparative assertions intended for public disclosure [35,36]. Code tests, data checks, and coauthor review can strengthen traceability, but none is a substitute for an independent critical review.</w:t>
       </w:r>
     </w:p>
     <w:p>
@@ -301,7 +301,7 @@
           <w:rFonts w:ascii="Calibri" w:hAnsi="Calibri"/>
           <w:sz w:val="21"/>
         </w:rPr>
-        <w:t>General engines such as openLCA and Brightway calculate process networks, exchange inventories, and apply LCIA methods [33,34]. They do not determine whether cooling alternatives deliver equivalent computation, whether a performance map covers the operating domain, whether a grid substitution preserves the original electricity boundary, or whether secondary screening results support a public comparative assertion. Conversely, cooling-plant models can validate operational power without closing lifecycle inventories or comparative-review requirements [45].</w:t>
+        <w:t>General engines such as openLCA and Brightway calculate process networks, exchange inventories, and apply life-cycle impact assessment (LCIA) methods [37,38]. They do not determine whether cooling alternatives deliver equivalent computation, whether a performance map covers the operating domain, whether a grid substitution preserves the original electricity boundary, or whether secondary screening results support a public comparative assertion. Conversely, cooling-plant models can validate operational power without closing lifecycle inventories or comparative-review requirements [17].</w:t>
       </w:r>
     </w:p>
     <w:p>
@@ -407,7 +407,7 @@
           <w:rFonts w:ascii="Calibri" w:hAnsi="Calibri"/>
           <w:sz w:val="21"/>
         </w:rPr>
-        <w:t>This study is a Technology Assessment of the transferability of the released Microsoft/WSP case. Its contributions are:</w:t>
+        <w:t>This study is a technology assessment of the transferability of the released Microsoft/WSP case. Its contributions are:</w:t>
       </w:r>
     </w:p>
     <w:p>
@@ -464,7 +464,7 @@
           <w:rFonts w:ascii="Calibri" w:hAnsi="Calibri"/>
           <w:sz w:val="21"/>
         </w:rPr>
-        <w:t>3. a linked openLCA JSON-LD calculation of 71 Federal LCA Commons 2023</w:t>
+        <w:t>3. an openLCA-compatible JSON-LD calculation of 71 Federal LCA Commons 2023</w:t>
       </w:r>
     </w:p>
     <w:p>
@@ -508,7 +508,7 @@
           <w:rFonts w:ascii="Calibri" w:hAnsi="Calibri"/>
           <w:sz w:val="21"/>
         </w:rPr>
-        <w:t>5. an open comparison validator that blocks incompatible functional units,</w:t>
+        <w:t>5. the open-source OpenDC-LCA comparison validator, which blocks incompatible functional units,</w:t>
       </w:r>
     </w:p>
     <w:p>
@@ -518,6 +518,15 @@
           <w:sz w:val="21"/>
         </w:rPr>
         <w:t>boundaries, electricity accounting, LCIA methods, or missing field-level lineage, while stating that metadata checks are not physical validation.</w:t>
+      </w:r>
+    </w:p>
+    <w:p>
+      <w:r>
+        <w:rPr>
+          <w:rFonts w:ascii="Calibri" w:hAnsi="Calibri"/>
+          <w:sz w:val="21"/>
+        </w:rPr>
+        <w:t>Together, the reconstruction addresses the missing public arithmetic in gap 1; the harmonization and linked-system calculations expose the method and boundary conflicts in gap 2; the rank-robustness certificates identify the measurements with decision leverage in gap 3; and the OpenDC-LCA validator preserves the evidence class needed to prevent gap 4. OpenDC-LCA is therefore the reproducible implementation of this assessment layer, not a replacement for the process-network engines openLCA or Brightway.</w:t>
       </w:r>
     </w:p>
     <w:p>
@@ -551,7 +560,7 @@
           <w:rFonts w:ascii="Calibri" w:hAnsi="Calibri"/>
           <w:sz w:val="21"/>
         </w:rPr>
-        <w:t>Figure 1 shows the OpenDC-LCA workflow. The repository records source-family metadata and a per-file path, byte count, and SHA-256 checksum. Dataset-specific tables retain the worksheet, field, unit, boundary, and numerical role used in each analysis. This is file-level integrity plus family-level provenance, not a complete flow-level data-lineage graph. The harmonization stage then asks, in order: are the alternatives functionally equivalent; are the units, characterization methods, time, and geography aligned; is the required transformation interpolation or extrapolation; and are uncertainty, correlation, and review status adequate for the proposed claim? The result is classified as reconstructed, screening-transformed, registered/unlinked, or supported by primary decision-grade evidence.</w:t>
+        <w:t>Figure 1 shows the workflow of OpenDC-LCA, an open-source data-center cooling life-cycle assessment tool. The repository records source-family metadata and a per-file path, byte count, and SHA-256 checksum. Dataset-specific tables retain the worksheet, field, unit, boundary, and numerical role used in each analysis. This is file-level integrity plus family-level provenance, not a complete flow-level data-lineage graph. The harmonization stage asks the following questions in order: (1) are the alternatives functionally equivalent; (2) are the units, characterization methods, time, and geography aligned; (3) is the required transformation interpolation or extrapolation; and (4) are uncertainty, correlation, and review status adequate for the proposed claim? The result is classified as reconstructed, screening-transformed, registered/unlinked, or supported by primary decision-grade evidence.</w:t>
       </w:r>
     </w:p>
     <w:p>
@@ -564,7 +573,7 @@
         <w:drawing>
           <wp:inline xmlns:a="http://schemas.openxmlformats.org/drawingml/2006/main" xmlns:pic="http://schemas.openxmlformats.org/drawingml/2006/picture">
             <wp:extent cx="5897880" cy="3538728"/>
-            <wp:docPr id="1" name="Picture 1" descr="Figure 1. OpenDC-LCA evidence-to-decision architecture. Inputs are assigned a numerical role before calculation. The harmonization spine makes functional equivalence, method alignment, extrapolation, uncertainty, and claim status explicit. Outputs combine the numerical result with its evidence class and next-data requirement." title="OpenDC-LCA Figure 1"/>
+            <wp:docPr id="1" name="Picture 1" descr="Figure 1. OpenDC-LCA evidence-to-decision architecture. Inputs are assigned a numerical role before calculation. The harmonization spine makes functional equivalence, method alignment, extrapolation, uncertainty, and claim status explicit. Outputs combine the numerical result with its evidence class and next-data requirement. The diagram layout was developed with assistance from OpenAI Codex and was reviewed and edited by the authors." title="OpenDC-LCA Figure 1"/>
             <wp:cNvGraphicFramePr>
               <a:graphicFrameLocks noChangeAspect="1"/>
             </wp:cNvGraphicFramePr>
@@ -604,16 +613,16 @@
           <w:rFonts w:ascii="Calibri" w:hAnsi="Calibri"/>
           <w:sz w:val="18"/>
         </w:rPr>
-        <w:t>Figure 1. OpenDC-LCA evidence-to-decision architecture. Inputs are assigned a numerical role before calculation. The harmonization spine makes functional equivalence, method alignment, extrapolation, uncertainty, and claim status explicit. Outputs combine the numerical result with its evidence class and next-data requirement.</w:t>
-      </w:r>
-    </w:p>
-    <w:p>
-      <w:r>
-        <w:rPr>
-          <w:rFonts w:ascii="Calibri" w:hAnsi="Calibri"/>
-          <w:sz w:val="21"/>
-        </w:rPr>
-        <w:t>OpenDC-LCA is implemented in Python 3.10 or later and distributed under the MIT License [35]. The development branch evaluated here extends version 1.1.0 and provides a command-line interface, Python API, local browser GUI, scenario and performance-map schemas, reliability and replacement models, openLCA JSON-LD and Brightway mappings, evidence audits, and human- and machine-readable reports. Its comparison validator checks cross-scenario metadata and field-level source mappings before calculating a comparison. It cannot verify whether a declared source, uncertainty model, or review status is true. All interfaces call the same calculation engine.</w:t>
+        <w:t>Figure 1. OpenDC-LCA evidence-to-decision architecture. Inputs are assigned a numerical role before calculation. The harmonization spine makes functional equivalence, method alignment, extrapolation, uncertainty, and claim status explicit. Outputs combine the numerical result with its evidence class and next-data requirement. The diagram layout was developed with assistance from OpenAI Codex and was reviewed and edited by the authors.</w:t>
+      </w:r>
+    </w:p>
+    <w:p>
+      <w:r>
+        <w:rPr>
+          <w:rFonts w:ascii="Calibri" w:hAnsi="Calibri"/>
+          <w:sz w:val="21"/>
+        </w:rPr>
+        <w:t>OpenDC-LCA is implemented in Python 3.10 or later and distributed under the MIT License [39]. The development branch evaluated here extends version 1.1.0 and provides a command-line interface, Python API, local browser GUI, scenario and performance-map schemas, reliability and replacement models, openLCA JSON-LD and Brightway mappings, evidence audits, and human- and machine-readable reports. Its comparison validator checks cross-scenario metadata and field-level source mappings before calculating a comparison. It cannot verify whether a declared source, uncertainty model, or review status is true. All interfaces call the same calculation engine.</w:t>
       </w:r>
     </w:p>
     <w:p>
@@ -949,7 +958,7 @@
                 <w:rFonts w:ascii="Calibri" w:hAnsi="Calibri"/>
                 <w:sz w:val="18"/>
               </w:rPr>
-              <w:t>EPA eGRID: 459 state/DC-year rows and 9 U.S. aggregates [36,37]</w:t>
+              <w:t>EPA eGRID: 459 state/DC-year rows and 9 U.S. aggregates [40,41]</w:t>
             </w:r>
           </w:p>
         </w:tc>
@@ -1054,7 +1063,7 @@
                 <w:rFonts w:ascii="Calibri" w:hAnsi="Calibri"/>
                 <w:sz w:val="18"/>
               </w:rPr>
-              <w:t>Federal LCA Commons U.S. Electricity Baseline 2023 and IPCC GWP method [47]</w:t>
+              <w:t>Federal LCA Commons U.S. Electricity Baseline 2023 and IPCC GWP method [42]</w:t>
             </w:r>
           </w:p>
         </w:tc>
@@ -1159,7 +1168,7 @@
                 <w:rFonts w:ascii="Calibri" w:hAnsi="Calibri"/>
                 <w:sz w:val="18"/>
               </w:rPr>
-              <w:t>Boavizta: 48 server PCF records [38]</w:t>
+              <w:t>Boavizta: 48 server PCF records [43]</w:t>
             </w:r>
           </w:p>
         </w:tc>
@@ -1264,7 +1273,7 @@
                 <w:rFonts w:ascii="Calibri" w:hAnsi="Calibri"/>
                 <w:sz w:val="18"/>
               </w:rPr>
-              <w:t>ÖKOBAUDAT: 6 selected A1-A3 processes [39]</w:t>
+              <w:t>ÖKOBAUDAT: 6 selected A1-A3 processes [44]</w:t>
             </w:r>
           </w:p>
         </w:tc>
@@ -1369,7 +1378,7 @@
                 <w:rFonts w:ascii="Calibri" w:hAnsi="Calibri"/>
                 <w:sz w:val="18"/>
               </w:rPr>
-              <w:t>NOAA TMY: 8,760 Fayetteville weather rows [40]</w:t>
+              <w:t>NOAA TMY: 8,760 Fayetteville weather rows [45]</w:t>
             </w:r>
           </w:p>
         </w:tc>
@@ -1474,7 +1483,7 @@
                 <w:rFonts w:ascii="Calibri" w:hAnsi="Calibri"/>
                 <w:sz w:val="18"/>
               </w:rPr>
-              <w:t>USLCI and 7 GLAD hydrogen archives [41,42]</w:t>
+              <w:t>USLCI and 7 GLAD hydrogen archives [46,47]</w:t>
             </w:r>
           </w:p>
         </w:tc>
@@ -1579,7 +1588,7 @@
                 <w:rFonts w:ascii="Calibri" w:hAnsi="Calibri"/>
                 <w:sz w:val="18"/>
               </w:rPr>
-              <w:t>USGS watershed boundary: HU12 geometry [43]</w:t>
+              <w:t>USGS watershed boundary: HU12 geometry [48]</w:t>
             </w:r>
           </w:p>
         </w:tc>
@@ -2007,7 +2016,7 @@
           <w:rFonts w:ascii="Calibri" w:hAnsi="Calibri"/>
           <w:sz w:val="21"/>
         </w:rPr>
-        <w:t>EPA changed the GWP values used by eGRID: releases before 2018 used IPCC SAR, 2018-2022 used AR4, and 2023 used AR5 without climate-carbon feedback [36,37]. To remove this avoidable discontinuity, every state and U.S. factor was reconstructed from net generation and gas-specific annual emissions:</w:t>
+        <w:t>EPA changed the GWP values used by eGRID: releases before 2018 used IPCC SAR, 2018-2022 used AR4, and 2023 used AR5 without climate-carbon feedback [40,41]. To remove this avoidable discontinuity, every state and U.S. factor was reconstructed from net generation and gas-specific annual emissions:</w:t>
       </w:r>
     </w:p>
     <w:p>
@@ -2058,7 +2067,7 @@
           <w:rFonts w:ascii="Calibri" w:hAnsi="Calibri"/>
           <w:sz w:val="21"/>
         </w:rPr>
-        <w:t>The 2023 U.S. Electricity Baseline was downloaded from the Federal LCA Commons as openLCA 2 JSON-LD together with the repository's IPCC GWP method [47]. The inventory contains 947 processes and 142 product systems generated with ElectricityLCI 3.0.0. We retained 71 non-residual, at-user consumption systems: 60 balancing authorities, 10 FERC regions, and the national mix. The matched residual-consumption systems were calculated separately as a market-based accounting sensitivity and were never pooled with the ordinary consumption systems.</w:t>
+        <w:t>The 2023 U.S. Electricity Baseline was downloaded from the Federal LCA Commons as openLCA 2 JSON-LD together with the repository's IPCC GWP method [42]. The inventory contains 947 processes and 142 product systems generated with ElectricityLCI 3.0.0. We retained 71 non-residual, at-user consumption systems: 60 balancing authorities, 10 FERC regions, and the national mix. The matched residual-consumption systems were calculated separately as a market-based accounting sensitivity and were never pooled with the ordinary consumption systems.</w:t>
       </w:r>
     </w:p>
     <w:p>
@@ -2115,7 +2124,7 @@
           <w:rFonts w:ascii="Calibri" w:hAnsi="Calibri"/>
           <w:sz w:val="21"/>
         </w:rPr>
-        <w:t>The provider scope includes trade, transmission and distribution losses, and upstream fuel supply. Generation infrastructure is included only for the provider-specified gas, oil, coal, solar, wind, and geothermal technologies; other generation infrastructure and transmission/distribution infrastructure are outside scope [47]. The very low factors in some hydropower-dominated systems must not be interpreted as complete electricity LCAs.</w:t>
+        <w:t>The provider scope includes trade, transmission and distribution losses, and upstream fuel supply. Generation infrastructure is included only for the provider-specified gas, oil, coal, solar, wind, and geothermal technologies; other generation infrastructure and transmission/distribution infrastructure are outside scope [42]. The very low factors in some hydropower-dominated systems must not be interpreted as complete electricity LCAs.</w:t>
       </w:r>
     </w:p>
     <w:p>
@@ -2820,7 +2829,16 @@
           <w:rFonts w:ascii="Calibri" w:hAnsi="Calibri"/>
           <w:sz w:val="21"/>
         </w:rPr>
-        <w:t>The scenario audit checks required metadata, duplicate identifiers, physical values, uncertainty declarations, evidence labels, and comparative intent. The comparison validator additionally requires matching functional units, system boundaries, electricity accounting, allocation and replacement rules, and LCIA methods. For a declared public assertion, each modeled input group must map to a registered source identifier. Synthetic inputs, unquantified uncertainty, and insufficient declared review remain blockers. These checks also reject non-finite numeric inputs, retain the field-to-source map in result manifests, and require a matching inclusion/exclusion record for custom comparative boundaries. They verify metadata consistency only: they cannot authenticate a citation, distribution, review status, physical model, or ISO conformity [31,32].</w:t>
+        <w:t>The scenario audit checks required metadata, duplicate identifiers, physical values, uncertainty declarations, evidence labels, and comparative intent. The comparison validator additionally requires matching functional units, system boundaries, electricity accounting, allocation and replacement rules, and LCIA methods. For a declared public assertion, each modeled input group must map to a registered source identifier. Synthetic inputs, unquantified uncertainty, and insufficient declared review remain blockers. These checks also reject non-finite numeric inputs, retain the field-to-source map in result manifests, and require a matching inclusion/exclusion record for custom comparative boundaries. They verify metadata consistency only: they cannot authenticate a citation, distribution, review status, physical model, or ISO conformity [35,36].</w:t>
+      </w:r>
+    </w:p>
+    <w:p>
+      <w:r>
+        <w:rPr>
+          <w:rFonts w:ascii="Calibri" w:hAnsi="Calibri"/>
+          <w:sz w:val="21"/>
+        </w:rPr>
+        <w:t>OpenAI Codex (OpenAI) was used in a supporting role during software development and review, test generation, plotting-code review, and manuscript organization and language editing. It did not provide primary data or serve as an evidence source. Reported numerical results were regenerated with the version-controlled deterministic workflows described above and checked against the cited sources and automated tests under author supervision.</w:t>
       </w:r>
     </w:p>
     <w:p>
@@ -2933,7 +2951,7 @@
           <w:rFonts w:ascii="Calibri" w:hAnsi="Calibri"/>
           <w:sz w:val="21"/>
         </w:rPr>
-        <w:t>The 50-state-plus-DC reconstruction matched the official national result through 2018. From 2019 onward it was 0.32-0.43% lower because the panel covered 99.55-99.58% of the provider U.S. generation after excluding Puerto Rico. We retained the provider aggregate for the national series. Across the full panel, 137 of 459 numerical rates lay outside the two released cooling anchors, so 29.85% of the transfers were extrapolations.</w:t>
+        <w:t>The 50-state-plus-DC reconstruction matched the official national result through 2018. From 2019 onward it was 0.32-0.43% lower because the panel covered 99.55-99.58% of the provider U.S. generation after excluding Puerto Rico. We retained the provider aggregate for the national series. In Figure 3, the orange polyline connects the reported provider U.S. aggregate direct-generation rate for each release year; it is not fitted to the state/DC points. Across the full panel, 137 of 459 numerical rates lay outside the two released cooling anchors, so 29.85% of the transfers were extrapolations.</w:t>
       </w:r>
     </w:p>
     <w:p>
@@ -2946,7 +2964,7 @@
         <w:drawing>
           <wp:inline xmlns:a="http://schemas.openxmlformats.org/drawingml/2006/main" xmlns:pic="http://schemas.openxmlformats.org/drawingml/2006/picture">
             <wp:extent cx="5897880" cy="3324930"/>
-            <wp:docPr id="3" name="Picture 3" descr="Figure 3. Harmonized AR5-GWP100 eGRID state/DC generation rates for nine releases. Orange denotes the provider U.S. aggregate. Blue points fall below the released-model numerical cold-plate/single-phase crossover. These are direct-generation scenarios, not consumption LCIs or state cooling LCAs." title="OpenDC-LCA Figure 3"/>
+            <wp:docPr id="3" name="Picture 3" descr="Figure 3. Harmonized AR5-GWP100 eGRID state/DC generation rates for nine releases, with electricity intensity on the horizontal axis in kg CO2e/MWh. The orange polyline connects the reported provider U.S. aggregate for each year; blue points fall below the released-model numerical cold-plate/single-phase crossover. These are direct-generation scenarios, not consumption LCIs or state cooling LCAs." title="OpenDC-LCA Figure 3"/>
             <wp:cNvGraphicFramePr>
               <a:graphicFrameLocks noChangeAspect="1"/>
             </wp:cNvGraphicFramePr>
@@ -2986,7 +3004,7 @@
           <w:rFonts w:ascii="Calibri" w:hAnsi="Calibri"/>
           <w:sz w:val="18"/>
         </w:rPr>
-        <w:t>Figure 3. Harmonized AR5-GWP100 eGRID state/DC generation rates for nine releases. Orange denotes the provider U.S. aggregate. Blue points fall below the released-model numerical cold-plate/single-phase crossover. These are direct-generation scenarios, not consumption LCIs or state cooling LCAs.</w:t>
+        <w:t>Figure 3. Harmonized AR5-GWP100 eGRID state/DC generation rates for nine releases, with electricity intensity on the horizontal axis in kg CO2e/MWh. The orange polyline connects the reported provider U.S. aggregate for each year; blue points fall below the released-model numerical cold-plate/single-phase crossover. These are direct-generation scenarios, not consumption LCIs or state cooling LCAs.</w:t>
       </w:r>
     </w:p>
     <w:p>
@@ -3043,7 +3061,7 @@
         <w:drawing>
           <wp:inline xmlns:a="http://schemas.openxmlformats.org/drawingml/2006/main" xmlns:pic="http://schemas.openxmlformats.org/drawingml/2006/picture">
             <wp:extent cx="5897880" cy="4030218"/>
-            <wp:docPr id="4" name="Picture 4" descr="Figure 4. IPCC AR5-GWP100 partial linked-system electricity factors for 10 FERC regions and the United States. Bars separate generation-process impacts from other linked upstream and infrastructure impacts. Vertical lines show the two released numerical cooling landmarks; they do not create method equivalence." title="OpenDC-LCA Figure 4"/>
+            <wp:docPr id="4" name="Picture 4" descr="Figure 4. IPCC AR5-GWP100 partial linked-system electricity factors for 10 FERC regions and the United States. The horizontal axis is kg CO2e/MWh delivered at the user. Bars separate generation-process impacts from other linked upstream and infrastructure impacts. The green dashed line marks the 96.704 kg CO2e/MWh cold-plate/single-phase numerical crossover; the purple dashed line marks the 524.893 kg CO2e/MWh released high numerical anchor. Neither line creates method equivalence." title="OpenDC-LCA Figure 4"/>
             <wp:cNvGraphicFramePr>
               <a:graphicFrameLocks noChangeAspect="1"/>
             </wp:cNvGraphicFramePr>
@@ -3083,7 +3101,7 @@
           <w:rFonts w:ascii="Calibri" w:hAnsi="Calibri"/>
           <w:sz w:val="18"/>
         </w:rPr>
-        <w:t>Figure 4. IPCC AR5-GWP100 partial linked-system electricity factors for 10 FERC regions and the United States. Bars separate generation-process impacts from other linked upstream and infrastructure impacts. Vertical lines show the two released numerical cooling landmarks; they do not create method equivalence.</w:t>
+        <w:t>Figure 4. IPCC AR5-GWP100 partial linked-system electricity factors for 10 FERC regions and the United States. The horizontal axis is kg CO2e/MWh delivered at the user. Bars separate generation-process impacts from other linked upstream and infrastructure impacts. The green dashed line marks the 96.704 kg CO2e/MWh cold-plate/single-phase numerical crossover; the purple dashed line marks the 524.893 kg CO2e/MWh released high numerical anchor. Neither line creates method equivalence.</w:t>
       </w:r>
     </w:p>
     <w:p>
@@ -3247,7 +3265,7 @@
           <w:rFonts w:ascii="Calibri" w:hAnsi="Calibri"/>
           <w:sz w:val="21"/>
         </w:rPr>
-        <w:t>This sensitivity changes the interpretation of the pedigree result. It supports a near-term measurement sequence—hourly IT and cooling electricity, then server inventories and functional performance—but not a unique value of information. A formal acquisition decision requires empirical parameter distributions, correlations, measurement cost, and the loss associated with a wrong architecture choice [30].</w:t>
+        <w:t>This sensitivity changes the interpretation of the pedigree result. It supports a near-term measurement sequence—hourly IT and cooling electricity, then server inventories and functional performance—but not a unique value of information. A formal acquisition decision requires empirical parameter distributions, correlations, measurement cost, and the loss associated with a wrong architecture choice [34].</w:t>
       </w:r>
     </w:p>
     <w:p>
@@ -3333,7 +3351,7 @@
           <w:rFonts w:ascii="Calibri" w:hAnsi="Calibri"/>
           <w:sz w:val="21"/>
         </w:rPr>
-        <w:t>This is a material advance, but not full harmonization. The difference between the two national factors also reflects delivery losses, consumption versus generation geography, and elementary-flow coverage. More importantly, 287 unlinked technosphere exchanges still carry zero upstream burden. A complete calculation requires those providers to be linked or their omitted impacts to be bounded and independently reproduced. Even then, electricity cannot repair the unresolved cooling-foreground LCIA method. Location- and market-based cases must also remain consistent throughout the product system [19,20]. The 7.67% national difference between ordinary and residual consumption mixes shows that the accounting choice is consequential even before the cooling foreground is harmonized.</w:t>
+        <w:t>This is a material advance, but not full harmonization. The difference between the two national factors also reflects delivery losses, consumption versus generation geography, and elementary-flow coverage. More importantly, 287 unlinked technosphere exchanges still carry zero upstream burden. A complete calculation requires those providers to be linked or their omitted impacts to be bounded and independently reproduced. Even then, electricity cannot repair the unresolved cooling-foreground LCIA method. Location- and market-based cases must also remain consistent throughout the product system [22,23]. The 7.67% national difference between ordinary and residual consumption mixes shows that the accounting choice is consequential even before the cooling foreground is harmonized.</w:t>
       </w:r>
     </w:p>
     <w:p>
@@ -3359,7 +3377,7 @@
           <w:rFonts w:ascii="Calibri" w:hAnsi="Calibri"/>
           <w:sz w:val="21"/>
         </w:rPr>
-        <w:t>The all-block threshold of 1.32% is not a confidence bound. It is the radius of a specified box in which a shared grid multiplier and adverse technology-specific foreground multipliers cannot reverse the numerical first rank. Its value lies in falsifiability: any proposed empirical uncertainty model can be compared against the same bound structure. A probability of rank would additionally require measured marginal distributions and correlations [46].</w:t>
+        <w:t>The all-block threshold of 1.32% is not a confidence bound. It is the radius of a specified box in which a shared grid multiplier and adverse technology-specific foreground multipliers cannot reverse the numerical first rank. Its value lies in falsifiability: any proposed empirical uncertainty model can be compared against the same bound structure. A probability of rank would additionally require measured marginal distributions and correlations [30].</w:t>
       </w:r>
     </w:p>
     <w:p>
@@ -3385,7 +3403,7 @@
           <w:rFonts w:ascii="Calibri" w:hAnsi="Calibri"/>
           <w:sz w:val="21"/>
         </w:rPr>
-        <w:t>Vcore-year is more informative than facility area or rack count, but it is still a proxy. Equivalent useful computation depends on workload, accelerator utilization, memory and network constraints, throttling, overclocking, availability, and quality of service. The one-sided 5.50% median threshold and the symmetric 2.64% national service bound are break-even requirements, not measured penalties. They define the approximate resolution required of a comparative experiment. ITU-T L.1410 similarly requires an explicit functional unit and comparative baseline for ICT services [48].</w:t>
+        <w:t>Vcore-year is more informative than facility area or rack count, but it is still a proxy. Equivalent useful computation depends on workload, accelerator utilization, memory and network constraints, throttling, overclocking, availability, and quality of service. The one-sided 5.50% median threshold and the symmetric 2.64% national service bound are break-even requirements, not measured penalties. They define the approximate resolution required of a comparative experiment. ITU-T L.1410 similarly requires an explicit functional unit and comparative baseline for ICT services [18].</w:t>
       </w:r>
     </w:p>
     <w:p>
@@ -3402,7 +3420,7 @@
         <w:pStyle w:val="Heading2"/>
       </w:pPr>
       <w:r>
-        <w:t>4.5. Decarbonization changes the value of evidence</w:t>
+        <w:t>4.5. Declining grid-emission intensity changes the value of evidence</w:t>
       </w:r>
     </w:p>
     <w:p>
@@ -3437,7 +3455,7 @@
           <w:rFonts w:ascii="Calibri" w:hAnsi="Calibri"/>
           <w:sz w:val="21"/>
         </w:rPr>
-        <w:t>OpenDC-LCA does not replace openLCA, Brightway, Temporalis, premise, or bw_timex. Those tools provide process-network calculation, database management, prospective backgrounds, or time-explicit LCA [24-26,33,34]. The assessment layer here adds:</w:t>
+        <w:t>OpenDC-LCA does not replace openLCA, Brightway, Temporalis, premise, or bw_timex. Those tools provide process-network calculation, database management, prospective backgrounds, or time-explicit LCA [27-29,37,38]. The assessment layer here adds:</w:t>
       </w:r>
     </w:p>
     <w:p>
@@ -3551,7 +3569,7 @@
           <w:rFonts w:ascii="Calibri" w:hAnsi="Calibri"/>
           <w:sz w:val="21"/>
         </w:rPr>
-        <w:t>This role also differs from recent data-center models. AlphaDataCenterCooling provides operational validation of a cooling plant [45], while d'Orgeval et al. compare full data-center architectures and, for a subset, normalize by computational performance [44]. The present work tests whether published secondary LCA results retain their meaning when moved across electricity datasets and claim contexts; it does not duplicate either primary modeling capability.</w:t>
+        <w:t>This role also differs from recent data-center models. AlphaDataCenterCooling provides operational validation of a cooling plant [17], while d'Orgeval et al. compare full data-center architectures and, for a subset, normalize by computational performance [16]. The present work tests whether published secondary LCA results retain their meaning when moved across electricity datasets and claim contexts; it does not duplicate either primary modeling capability.</w:t>
       </w:r>
     </w:p>
     <w:p>
@@ -3748,7 +3766,7 @@
           <w:rFonts w:ascii="Calibri" w:hAnsi="Calibri"/>
           <w:sz w:val="21"/>
         </w:rPr>
-        <w:t>The national eGRID generation factor declined 32.46% from 2012 to 2023 after all nine releases were harmonized to AR5 GWP100. The Federal LCA Commons national consumption system yielded 422.93 kg CO2e/MWh, including 53.08 kg CO2e/MWh from linked processes beyond generation, and all 10 FERC systems lay above the 96.70 kg CO2e/MWh numerical crossover. These partial linked-system factors retain documented technosphere cutoffs and require independent calculator verification before benchmark use.</w:t>
+        <w:t>The national eGRID generation factor declined 32.46% from 2012 to 2023 after all nine releases were harmonized to AR5 GWP100. The Federal LCA Commons national consumption system yielded 422.93 kg CO2e/MWh, including 53.08 kg CO2e/MWh from linked processes beyond generation, and all 10 FERC regions lay above the 96.70 kg CO2e/MWh numerical crossover. These partial linked-system factors retain documented technosphere cutoffs and require independent calculator verification before benchmark use.</w:t>
       </w:r>
     </w:p>
     <w:p>
@@ -3766,7 +3784,7 @@
           <w:rFonts w:ascii="Calibri" w:hAnsi="Calibri"/>
           <w:sz w:val="21"/>
         </w:rPr>
-        <w:t>OpenDC-LCA now blocks comparisons with mismatched functional units, boundaries, electricity accounting, LCIA methods, or missing field-level source mappings. That validator catches declared metadata incompatibilities but does not verify the underlying science. The study is suitable as a transferability Technology Assessment; it does not support a public claim of environmental superiority among cooling architectures.</w:t>
+        <w:t>The OpenDC-LCA validator rejects configured comparisons whose declared metadata contain mismatched functional units, boundaries, electricity accounting, LCIA methods, or missing field-level source mappings. This check detects declared incompatibilities but does not verify the underlying science. The study is suitable as a transferability Technology Assessment; it does not support a public claim of environmental superiority among cooling architectures.</w:t>
       </w:r>
     </w:p>
     <w:p>
@@ -3783,7 +3801,58 @@
           <w:rFonts w:ascii="Calibri" w:hAnsi="Calibri"/>
           <w:sz w:val="21"/>
         </w:rPr>
-        <w:t>OpenDC-LCA version 1.1.0 is publicly available at https://github.com/UARK-NED3/OpenDC-LCA and https://github.com/UARK-NED3/OpenDC-LCA/releases/tag/v1.1.0. The development revision evaluated here adds the Federal LCA Commons solver, cutoff reporting, equal-width robustness certificates, and comparison-level metadata checks; it will be tagged and archived before submission. Analysis metadata and the provider-file manifest record file sizes and SHA-256 checksums. Provider-native files remain outside Git when redistribution permission is unclear or a large upstream archive has not been reviewed for redistribution. The Microsoft archive, eGRID files, Federal LCA Commons baseline and method, and NOAA data are available from their public providers [15,36,37,40,47]. No DOI-bearing software archive is available at the time of this draft.</w:t>
+        <w:t>OpenDC-LCA version 1.1.0 is publicly available at https://github.com/UARK-NED3/OpenDC-LCA and https://github.com/UARK-NED3/OpenDC-LCA/releases/tag/v1.1.0. The development revision evaluated here adds the Federal LCA Commons solver, cutoff reporting, equal-width robustness certificates, and comparison-level metadata checks; it will be tagged and archived before submission. Analysis metadata and the provider-file manifest record file sizes and SHA-256 checksums. Provider-native files remain outside Git when redistribution permission is unclear or a large upstream archive has not been reviewed for redistribution. The Microsoft archive, eGRID files, Federal LCA Commons baseline and method, and NOAA data are available from their public providers [15,40-42,45]. No DOI-bearing software archive is available at the time of this draft.</w:t>
+      </w:r>
+    </w:p>
+    <w:p>
+      <w:pPr>
+        <w:pStyle w:val="Heading1"/>
+      </w:pPr>
+      <w:r>
+        <w:t>Competing interests</w:t>
+      </w:r>
+    </w:p>
+    <w:p>
+      <w:r>
+        <w:rPr>
+          <w:rFonts w:ascii="Calibri" w:hAnsi="Calibri"/>
+          <w:sz w:val="21"/>
+        </w:rPr>
+        <w:t>Braden Stevens and Pengjiang Xiang are full-time employees of Harrison French &amp; Associates Ltd.</w:t>
+      </w:r>
+    </w:p>
+    <w:p>
+      <w:pPr>
+        <w:pStyle w:val="Heading1"/>
+      </w:pPr>
+      <w:r>
+        <w:t>Ethics statement</w:t>
+      </w:r>
+    </w:p>
+    <w:p>
+      <w:r>
+        <w:rPr>
+          <w:rFonts w:ascii="Calibri" w:hAnsi="Calibri"/>
+          <w:sz w:val="21"/>
+        </w:rPr>
+        <w:t>This secondary study used public or author-held engineering datasets and did not involve human participants or animals; research-ethics approval was not required.</w:t>
+      </w:r>
+    </w:p>
+    <w:p>
+      <w:pPr>
+        <w:pStyle w:val="Heading1"/>
+      </w:pPr>
+      <w:r>
+        <w:t>Declaration of generative AI and AI-assisted technologies in the manuscript preparation process</w:t>
+      </w:r>
+    </w:p>
+    <w:p>
+      <w:r>
+        <w:rPr>
+          <w:rFonts w:ascii="Calibri" w:hAnsi="Calibri"/>
+          <w:sz w:val="21"/>
+        </w:rPr>
+        <w:t>During preparation of this work, the authors used OpenAI Codex to support code review, test development, figure-code review, manuscript organization, and language editing. The authors reviewed and edited the resulting material, verified the reported calculations and cited sources, and take full responsibility for the content of the article.</w:t>
       </w:r>
     </w:p>
     <w:p>
@@ -3865,7 +3934,7 @@
           <w:rFonts w:ascii="Calibri" w:hAnsi="Calibri"/>
           <w:sz w:val="21"/>
         </w:rPr>
-        <w:t>https://www.iea.org/energy-system/buildings/data-centres-and-data-transmission-networks</w:t>
+        <w:t>https://www.iea.org/energy-system/buildings/data-centres-and-data-transmission-networks (accessed 11 August 2026).</w:t>
       </w:r>
     </w:p>
     <w:p>
@@ -4517,16 +4586,16 @@
           <w:rFonts w:ascii="Calibri" w:hAnsi="Calibri"/>
           <w:sz w:val="21"/>
         </w:rPr>
-        <w:t>16. Zhang, M., Carbajales-Dale, M., Ma, X., Guo, L. &amp; Fan, C. Cleaner grid or</w:t>
-      </w:r>
-    </w:p>
-    <w:p>
-      <w:r>
-        <w:rPr>
-          <w:rFonts w:ascii="Calibri" w:hAnsi="Calibri"/>
-          <w:sz w:val="21"/>
-        </w:rPr>
-        <w:t xml:space="preserve">smarter cooling? Environmental impact trade-offs of a data center using the life cycle assessment method. </w:t>
+        <w:t>16. d'Orgeval, A., Sheehan, S., Avenas, Q., Assoumou, E. &amp; Sessa, V.</w:t>
+      </w:r>
+    </w:p>
+    <w:p>
+      <w:r>
+        <w:rPr>
+          <w:rFonts w:ascii="Calibri" w:hAnsi="Calibri"/>
+          <w:sz w:val="21"/>
+        </w:rPr>
+        <w:t xml:space="preserve">Generative AI impact assessment through a life cycle analysis of multiple data center typologies. </w:t>
       </w:r>
       <w:r>
         <w:rPr>
@@ -4534,7 +4603,7 @@
           <w:i/>
           <w:sz w:val="21"/>
         </w:rPr>
-        <w:t>Cleaner Energy Systems</w:t>
+        <w:t>Applied Energy</w:t>
       </w:r>
       <w:r>
         <w:rPr>
@@ -4549,14 +4618,14 @@
           <w:b/>
           <w:sz w:val="21"/>
         </w:rPr>
-        <w:t>12</w:t>
-      </w:r>
-      <w:r>
-        <w:rPr>
-          <w:rFonts w:ascii="Calibri" w:hAnsi="Calibri"/>
-          <w:sz w:val="21"/>
-        </w:rPr>
-        <w:t>, 100223 (2025). https://doi.org/10.1016/j.cles.2025.100223</w:t>
+        <w:t>406</w:t>
+      </w:r>
+      <w:r>
+        <w:rPr>
+          <w:rFonts w:ascii="Calibri" w:hAnsi="Calibri"/>
+          <w:sz w:val="21"/>
+        </w:rPr>
+        <w:t>, 127288 (2026). https://doi.org/10.1016/j.apenergy.2025.127288</w:t>
       </w:r>
     </w:p>
     <w:p>
@@ -4569,16 +4638,16 @@
           <w:rFonts w:ascii="Calibri" w:hAnsi="Calibri"/>
           <w:sz w:val="21"/>
         </w:rPr>
-        <w:t>17. Boyd, S. B., Horvath, A. &amp; Dornfeld, D. Life-cycle assessment of</w:t>
-      </w:r>
-    </w:p>
-    <w:p>
-      <w:r>
-        <w:rPr>
-          <w:rFonts w:ascii="Calibri" w:hAnsi="Calibri"/>
-          <w:sz w:val="21"/>
-        </w:rPr>
-        <w:t xml:space="preserve">computational logic produced from 1995 through 2010. </w:t>
+        <w:t>17. Wu, S., Zheng, W., Wang, Z., Chen, G., Yang, P., Yue, S., Li, D. &amp; Wu, Y.</w:t>
+      </w:r>
+    </w:p>
+    <w:p>
+      <w:r>
+        <w:rPr>
+          <w:rFonts w:ascii="Calibri" w:hAnsi="Calibri"/>
+          <w:sz w:val="21"/>
+        </w:rPr>
+        <w:t xml:space="preserve">AlphaDataCenterCooling: A new computational model for data center cooling system evaluation. </w:t>
       </w:r>
       <w:r>
         <w:rPr>
@@ -4586,7 +4655,7 @@
           <w:i/>
           <w:sz w:val="21"/>
         </w:rPr>
-        <w:t>Environmental Science &amp; Technology</w:t>
+        <w:t>Applied Energy</w:t>
       </w:r>
       <w:r>
         <w:rPr>
@@ -4601,14 +4670,14 @@
           <w:b/>
           <w:sz w:val="21"/>
         </w:rPr>
-        <w:t>47</w:t>
-      </w:r>
-      <w:r>
-        <w:rPr>
-          <w:rFonts w:ascii="Calibri" w:hAnsi="Calibri"/>
-          <w:sz w:val="21"/>
-        </w:rPr>
-        <w:t>, 2947-2954 (2013). https://doi.org/10.1021/es303012r</w:t>
+        <w:t>380</w:t>
+      </w:r>
+      <w:r>
+        <w:rPr>
+          <w:rFonts w:ascii="Calibri" w:hAnsi="Calibri"/>
+          <w:sz w:val="21"/>
+        </w:rPr>
+        <w:t>, 125100 (2025). https://doi.org/10.1016/j.apenergy.2024.125100</w:t>
       </w:r>
     </w:p>
     <w:p>
@@ -4621,46 +4690,16 @@
           <w:rFonts w:ascii="Calibri" w:hAnsi="Calibri"/>
           <w:sz w:val="21"/>
         </w:rPr>
-        <w:t>18. Malmodin, J. &amp; Lundén, D. The energy and carbon footprint of the global</w:t>
-      </w:r>
-    </w:p>
-    <w:p>
-      <w:r>
-        <w:rPr>
-          <w:rFonts w:ascii="Calibri" w:hAnsi="Calibri"/>
-          <w:sz w:val="21"/>
-        </w:rPr>
-        <w:t xml:space="preserve">ICT and E&amp;M sectors 2010-2015. </w:t>
-      </w:r>
-      <w:r>
-        <w:rPr>
-          <w:rFonts w:ascii="Calibri" w:hAnsi="Calibri"/>
-          <w:i/>
-          <w:sz w:val="21"/>
-        </w:rPr>
-        <w:t>Sustainability</w:t>
-      </w:r>
-      <w:r>
-        <w:rPr>
-          <w:rFonts w:ascii="Calibri" w:hAnsi="Calibri"/>
-          <w:sz w:val="21"/>
-        </w:rPr>
-        <w:t xml:space="preserve"> </w:t>
-      </w:r>
-      <w:r>
-        <w:rPr>
-          <w:rFonts w:ascii="Calibri" w:hAnsi="Calibri"/>
-          <w:b/>
-          <w:sz w:val="21"/>
-        </w:rPr>
-        <w:t>10</w:t>
-      </w:r>
-      <w:r>
-        <w:rPr>
-          <w:rFonts w:ascii="Calibri" w:hAnsi="Calibri"/>
-          <w:sz w:val="21"/>
-        </w:rPr>
-        <w:t>, 3027 (2018). https://doi.org/10.3390/su10093027</w:t>
+        <w:t>18. International Telecommunication Union. ITU-T Recommendation L.1410:</w:t>
+      </w:r>
+    </w:p>
+    <w:p>
+      <w:r>
+        <w:rPr>
+          <w:rFonts w:ascii="Calibri" w:hAnsi="Calibri"/>
+          <w:sz w:val="21"/>
+        </w:rPr>
+        <w:t>Methodology for environmental life cycle assessments of information and communication technology goods, networks and services (2024). https://handle.itu.int/11.1002/1000/16010</w:t>
       </w:r>
     </w:p>
     <w:p>
@@ -4673,16 +4712,16 @@
           <w:rFonts w:ascii="Calibri" w:hAnsi="Calibri"/>
           <w:sz w:val="21"/>
         </w:rPr>
-        <w:t>19. Holzapfel, P., Bach, V. &amp; Finkbeiner, M. Electricity accounting in life</w:t>
-      </w:r>
-    </w:p>
-    <w:p>
-      <w:r>
-        <w:rPr>
-          <w:rFonts w:ascii="Calibri" w:hAnsi="Calibri"/>
-          <w:sz w:val="21"/>
-        </w:rPr>
-        <w:t xml:space="preserve">cycle assessment: the challenge of double counting. </w:t>
+        <w:t>19. Zhang, M., Carbajales-Dale, M., Ma, X., Guo, L. &amp; Fan, C. Cleaner grid or</w:t>
+      </w:r>
+    </w:p>
+    <w:p>
+      <w:r>
+        <w:rPr>
+          <w:rFonts w:ascii="Calibri" w:hAnsi="Calibri"/>
+          <w:sz w:val="21"/>
+        </w:rPr>
+        <w:t xml:space="preserve">smarter cooling? Environmental impact trade-offs of a data center using the life cycle assessment method. </w:t>
       </w:r>
       <w:r>
         <w:rPr>
@@ -4690,7 +4729,7 @@
           <w:i/>
           <w:sz w:val="21"/>
         </w:rPr>
-        <w:t>International Journal of Life Cycle Assessment</w:t>
+        <w:t>Cleaner Energy Systems</w:t>
       </w:r>
       <w:r>
         <w:rPr>
@@ -4705,14 +4744,14 @@
           <w:b/>
           <w:sz w:val="21"/>
         </w:rPr>
-        <w:t>28</w:t>
-      </w:r>
-      <w:r>
-        <w:rPr>
-          <w:rFonts w:ascii="Calibri" w:hAnsi="Calibri"/>
-          <w:sz w:val="21"/>
-        </w:rPr>
-        <w:t>, 771-787 (2023). https://doi.org/10.1007/s11367-023-02158-w</w:t>
+        <w:t>12</w:t>
+      </w:r>
+      <w:r>
+        <w:rPr>
+          <w:rFonts w:ascii="Calibri" w:hAnsi="Calibri"/>
+          <w:sz w:val="21"/>
+        </w:rPr>
+        <w:t>, 100223 (2025). https://doi.org/10.1016/j.cles.2025.100223</w:t>
       </w:r>
     </w:p>
     <w:p>
@@ -4725,16 +4764,16 @@
           <w:rFonts w:ascii="Calibri" w:hAnsi="Calibri"/>
           <w:sz w:val="21"/>
         </w:rPr>
-        <w:t>20. Holzapfel, P., Bunsen, J., Schmidt-Sierra, I., Bach, V. &amp; Finkbeiner, M.</w:t>
-      </w:r>
-    </w:p>
-    <w:p>
-      <w:r>
-        <w:rPr>
-          <w:rFonts w:ascii="Calibri" w:hAnsi="Calibri"/>
-          <w:sz w:val="21"/>
-        </w:rPr>
-        <w:t xml:space="preserve">Replacing location-based electricity consumption with market-based residual mixes in background data to avoid possible double counting. </w:t>
+        <w:t>20. Boyd, S. B., Horvath, A. &amp; Dornfeld, D. Life-cycle assessment of</w:t>
+      </w:r>
+    </w:p>
+    <w:p>
+      <w:r>
+        <w:rPr>
+          <w:rFonts w:ascii="Calibri" w:hAnsi="Calibri"/>
+          <w:sz w:val="21"/>
+        </w:rPr>
+        <w:t xml:space="preserve">computational logic produced from 1995 through 2010. </w:t>
       </w:r>
       <w:r>
         <w:rPr>
@@ -4742,7 +4781,7 @@
           <w:i/>
           <w:sz w:val="21"/>
         </w:rPr>
-        <w:t>International Journal of Life Cycle Assessment</w:t>
+        <w:t>Environmental Science &amp; Technology</w:t>
       </w:r>
       <w:r>
         <w:rPr>
@@ -4757,14 +4796,14 @@
           <w:b/>
           <w:sz w:val="21"/>
         </w:rPr>
-        <w:t>29</w:t>
-      </w:r>
-      <w:r>
-        <w:rPr>
-          <w:rFonts w:ascii="Calibri" w:hAnsi="Calibri"/>
-          <w:sz w:val="21"/>
-        </w:rPr>
-        <w:t>, 1279-1289 (2024). https://doi.org/10.1007/s11367-024-02294-x</w:t>
+        <w:t>47</w:t>
+      </w:r>
+      <w:r>
+        <w:rPr>
+          <w:rFonts w:ascii="Calibri" w:hAnsi="Calibri"/>
+          <w:sz w:val="21"/>
+        </w:rPr>
+        <w:t>, 2947-2954 (2013). https://doi.org/10.1021/es303012r</w:t>
       </w:r>
     </w:p>
     <w:p>
@@ -4777,16 +4816,16 @@
           <w:rFonts w:ascii="Calibri" w:hAnsi="Calibri"/>
           <w:sz w:val="21"/>
         </w:rPr>
-        <w:t>21. Dandres, T., Farrahi Moghaddam, R., Nguyen, K. K., Lemieux, Y., Samson,</w:t>
-      </w:r>
-    </w:p>
-    <w:p>
-      <w:r>
-        <w:rPr>
-          <w:rFonts w:ascii="Calibri" w:hAnsi="Calibri"/>
-          <w:sz w:val="21"/>
-        </w:rPr>
-        <w:t xml:space="preserve">R. &amp; Cheriet, M. Consideration of marginal electricity in real-time minimization of distributed data centre emissions. </w:t>
+        <w:t>21. Malmodin, J. &amp; Lundén, D. The energy and carbon footprint of the global</w:t>
+      </w:r>
+    </w:p>
+    <w:p>
+      <w:r>
+        <w:rPr>
+          <w:rFonts w:ascii="Calibri" w:hAnsi="Calibri"/>
+          <w:sz w:val="21"/>
+        </w:rPr>
+        <w:t xml:space="preserve">ICT and E&amp;M sectors 2010-2015. </w:t>
       </w:r>
       <w:r>
         <w:rPr>
@@ -4794,7 +4833,7 @@
           <w:i/>
           <w:sz w:val="21"/>
         </w:rPr>
-        <w:t>Journal of Cleaner Production</w:t>
+        <w:t>Sustainability</w:t>
       </w:r>
       <w:r>
         <w:rPr>
@@ -4809,14 +4848,14 @@
           <w:b/>
           <w:sz w:val="21"/>
         </w:rPr>
-        <w:t>143</w:t>
-      </w:r>
-      <w:r>
-        <w:rPr>
-          <w:rFonts w:ascii="Calibri" w:hAnsi="Calibri"/>
-          <w:sz w:val="21"/>
-        </w:rPr>
-        <w:t>, 116-124 (2017). https://doi.org/10.1016/j.jclepro.2016.12.143</w:t>
+        <w:t>10</w:t>
+      </w:r>
+      <w:r>
+        <w:rPr>
+          <w:rFonts w:ascii="Calibri" w:hAnsi="Calibri"/>
+          <w:sz w:val="21"/>
+        </w:rPr>
+        <w:t>, 3027 (2018). https://doi.org/10.3390/su10093027</w:t>
       </w:r>
     </w:p>
     <w:p>
@@ -4829,16 +4868,16 @@
           <w:rFonts w:ascii="Calibri" w:hAnsi="Calibri"/>
           <w:sz w:val="21"/>
         </w:rPr>
-        <w:t>22. Sohn, J., Kalbar, P., Goldstein, B. &amp; Birkved, M. Defining temporally</w:t>
-      </w:r>
-    </w:p>
-    <w:p>
-      <w:r>
-        <w:rPr>
-          <w:rFonts w:ascii="Calibri" w:hAnsi="Calibri"/>
-          <w:sz w:val="21"/>
-        </w:rPr>
-        <w:t xml:space="preserve">dynamic life cycle assessment: a review. </w:t>
+        <w:t>22. Holzapfel, P., Bach, V. &amp; Finkbeiner, M. Electricity accounting in life</w:t>
+      </w:r>
+    </w:p>
+    <w:p>
+      <w:r>
+        <w:rPr>
+          <w:rFonts w:ascii="Calibri" w:hAnsi="Calibri"/>
+          <w:sz w:val="21"/>
+        </w:rPr>
+        <w:t xml:space="preserve">cycle assessment: the challenge of double counting. </w:t>
       </w:r>
       <w:r>
         <w:rPr>
@@ -4846,7 +4885,7 @@
           <w:i/>
           <w:sz w:val="21"/>
         </w:rPr>
-        <w:t>Integrated Environmental Assessment and Management</w:t>
+        <w:t>International Journal of Life Cycle Assessment</w:t>
       </w:r>
       <w:r>
         <w:rPr>
@@ -4861,14 +4900,14 @@
           <w:b/>
           <w:sz w:val="21"/>
         </w:rPr>
-        <w:t>16</w:t>
-      </w:r>
-      <w:r>
-        <w:rPr>
-          <w:rFonts w:ascii="Calibri" w:hAnsi="Calibri"/>
-          <w:sz w:val="21"/>
-        </w:rPr>
-        <w:t>, 314-323 (2020). https://doi.org/10.1002/ieam.4235</w:t>
+        <w:t>28</w:t>
+      </w:r>
+      <w:r>
+        <w:rPr>
+          <w:rFonts w:ascii="Calibri" w:hAnsi="Calibri"/>
+          <w:sz w:val="21"/>
+        </w:rPr>
+        <w:t>, 771-787 (2023). https://doi.org/10.1007/s11367-023-02158-w</w:t>
       </w:r>
     </w:p>
     <w:p>
@@ -4881,16 +4920,16 @@
           <w:rFonts w:ascii="Calibri" w:hAnsi="Calibri"/>
           <w:sz w:val="21"/>
         </w:rPr>
-        <w:t>23. Beloin-Saint-Pierre, D. et al. Addressing temporal considerations in life</w:t>
-      </w:r>
-    </w:p>
-    <w:p>
-      <w:r>
-        <w:rPr>
-          <w:rFonts w:ascii="Calibri" w:hAnsi="Calibri"/>
-          <w:sz w:val="21"/>
-        </w:rPr>
-        <w:t xml:space="preserve">cycle assessment. </w:t>
+        <w:t>23. Holzapfel, P., Bunsen, J., Schmidt-Sierra, I., Bach, V. &amp; Finkbeiner, M.</w:t>
+      </w:r>
+    </w:p>
+    <w:p>
+      <w:r>
+        <w:rPr>
+          <w:rFonts w:ascii="Calibri" w:hAnsi="Calibri"/>
+          <w:sz w:val="21"/>
+        </w:rPr>
+        <w:t xml:space="preserve">Replacing location-based electricity consumption with market-based residual mixes in background data to avoid possible double counting. </w:t>
       </w:r>
       <w:r>
         <w:rPr>
@@ -4898,7 +4937,7 @@
           <w:i/>
           <w:sz w:val="21"/>
         </w:rPr>
-        <w:t>Science of the Total Environment</w:t>
+        <w:t>International Journal of Life Cycle Assessment</w:t>
       </w:r>
       <w:r>
         <w:rPr>
@@ -4913,14 +4952,14 @@
           <w:b/>
           <w:sz w:val="21"/>
         </w:rPr>
-        <w:t>743</w:t>
-      </w:r>
-      <w:r>
-        <w:rPr>
-          <w:rFonts w:ascii="Calibri" w:hAnsi="Calibri"/>
-          <w:sz w:val="21"/>
-        </w:rPr>
-        <w:t>, 140700 (2020). https://doi.org/10.1016/j.scitotenv.2020.140700</w:t>
+        <w:t>29</w:t>
+      </w:r>
+      <w:r>
+        <w:rPr>
+          <w:rFonts w:ascii="Calibri" w:hAnsi="Calibri"/>
+          <w:sz w:val="21"/>
+        </w:rPr>
+        <w:t>, 1279-1289 (2024). https://doi.org/10.1007/s11367-024-02294-x</w:t>
       </w:r>
     </w:p>
     <w:p>
@@ -4933,16 +4972,16 @@
           <w:rFonts w:ascii="Calibri" w:hAnsi="Calibri"/>
           <w:sz w:val="21"/>
         </w:rPr>
-        <w:t>24. Cardellini, G., Mutel, C. L., Vial, E. &amp; Muys, B. Temporalis, a generic</w:t>
-      </w:r>
-    </w:p>
-    <w:p>
-      <w:r>
-        <w:rPr>
-          <w:rFonts w:ascii="Calibri" w:hAnsi="Calibri"/>
-          <w:sz w:val="21"/>
-        </w:rPr>
-        <w:t xml:space="preserve">method and tool for dynamic life cycle assessment. </w:t>
+        <w:t>24. Dandres, T., Farrahi Moghaddam, R., Nguyen, K. K., Lemieux, Y., Samson,</w:t>
+      </w:r>
+    </w:p>
+    <w:p>
+      <w:r>
+        <w:rPr>
+          <w:rFonts w:ascii="Calibri" w:hAnsi="Calibri"/>
+          <w:sz w:val="21"/>
+        </w:rPr>
+        <w:t xml:space="preserve">R. &amp; Cheriet, M. Consideration of marginal electricity in real-time minimization of distributed data centre emissions. </w:t>
       </w:r>
       <w:r>
         <w:rPr>
@@ -4950,7 +4989,7 @@
           <w:i/>
           <w:sz w:val="21"/>
         </w:rPr>
-        <w:t>Science of the Total Environment</w:t>
+        <w:t>Journal of Cleaner Production</w:t>
       </w:r>
       <w:r>
         <w:rPr>
@@ -4965,14 +5004,14 @@
           <w:b/>
           <w:sz w:val="21"/>
         </w:rPr>
-        <w:t>645</w:t>
-      </w:r>
-      <w:r>
-        <w:rPr>
-          <w:rFonts w:ascii="Calibri" w:hAnsi="Calibri"/>
-          <w:sz w:val="21"/>
-        </w:rPr>
-        <w:t>, 585-595 (2018). https://doi.org/10.1016/j.scitotenv.2018.07.044</w:t>
+        <w:t>143</w:t>
+      </w:r>
+      <w:r>
+        <w:rPr>
+          <w:rFonts w:ascii="Calibri" w:hAnsi="Calibri"/>
+          <w:sz w:val="21"/>
+        </w:rPr>
+        <w:t>, 116-124 (2017). https://doi.org/10.1016/j.jclepro.2016.12.143</w:t>
       </w:r>
     </w:p>
     <w:p>
@@ -4985,16 +5024,16 @@
           <w:rFonts w:ascii="Calibri" w:hAnsi="Calibri"/>
           <w:sz w:val="21"/>
         </w:rPr>
-        <w:t>25. Müller, A. et al. Time-explicit life cycle assessment: a flexible</w:t>
-      </w:r>
-    </w:p>
-    <w:p>
-      <w:r>
-        <w:rPr>
-          <w:rFonts w:ascii="Calibri" w:hAnsi="Calibri"/>
-          <w:sz w:val="21"/>
-        </w:rPr>
-        <w:t xml:space="preserve">framework for coherent consideration of temporal dynamics. </w:t>
+        <w:t>25. Sohn, J., Kalbar, P., Goldstein, B. &amp; Birkved, M. Defining temporally</w:t>
+      </w:r>
+    </w:p>
+    <w:p>
+      <w:r>
+        <w:rPr>
+          <w:rFonts w:ascii="Calibri" w:hAnsi="Calibri"/>
+          <w:sz w:val="21"/>
+        </w:rPr>
+        <w:t xml:space="preserve">dynamic life cycle assessment: a review. </w:t>
       </w:r>
       <w:r>
         <w:rPr>
@@ -5002,14 +5041,29 @@
           <w:i/>
           <w:sz w:val="21"/>
         </w:rPr>
-        <w:t>International Journal of Life Cycle Assessment</w:t>
-      </w:r>
-      <w:r>
-        <w:rPr>
-          <w:rFonts w:ascii="Calibri" w:hAnsi="Calibri"/>
-          <w:sz w:val="21"/>
-        </w:rPr>
-        <w:t xml:space="preserve"> (2025). https://doi.org/10.1007/s11367-025-02539-3</w:t>
+        <w:t>Integrated Environmental Assessment and Management</w:t>
+      </w:r>
+      <w:r>
+        <w:rPr>
+          <w:rFonts w:ascii="Calibri" w:hAnsi="Calibri"/>
+          <w:sz w:val="21"/>
+        </w:rPr>
+        <w:t xml:space="preserve"> </w:t>
+      </w:r>
+      <w:r>
+        <w:rPr>
+          <w:rFonts w:ascii="Calibri" w:hAnsi="Calibri"/>
+          <w:b/>
+          <w:sz w:val="21"/>
+        </w:rPr>
+        <w:t>16</w:t>
+      </w:r>
+      <w:r>
+        <w:rPr>
+          <w:rFonts w:ascii="Calibri" w:hAnsi="Calibri"/>
+          <w:sz w:val="21"/>
+        </w:rPr>
+        <w:t>, 314-323 (2020). https://doi.org/10.1002/ieam.4235</w:t>
       </w:r>
     </w:p>
     <w:p>
@@ -5022,16 +5076,16 @@
           <w:rFonts w:ascii="Calibri" w:hAnsi="Calibri"/>
           <w:sz w:val="21"/>
         </w:rPr>
-        <w:t>26. Diepers, T., Müller, A. &amp; Jakobs, A. bw_timex: a Python package for</w:t>
-      </w:r>
-    </w:p>
-    <w:p>
-      <w:r>
-        <w:rPr>
-          <w:rFonts w:ascii="Calibri" w:hAnsi="Calibri"/>
-          <w:sz w:val="21"/>
-        </w:rPr>
-        <w:t xml:space="preserve">time-explicit life cycle assessment. </w:t>
+        <w:t>26. Beloin-Saint-Pierre, D. et al. Addressing temporal considerations in life</w:t>
+      </w:r>
+    </w:p>
+    <w:p>
+      <w:r>
+        <w:rPr>
+          <w:rFonts w:ascii="Calibri" w:hAnsi="Calibri"/>
+          <w:sz w:val="21"/>
+        </w:rPr>
+        <w:t xml:space="preserve">cycle assessment. </w:t>
       </w:r>
       <w:r>
         <w:rPr>
@@ -5039,7 +5093,7 @@
           <w:i/>
           <w:sz w:val="21"/>
         </w:rPr>
-        <w:t>Journal of Open Source Software</w:t>
+        <w:t>Science of the Total Environment</w:t>
       </w:r>
       <w:r>
         <w:rPr>
@@ -5054,14 +5108,14 @@
           <w:b/>
           <w:sz w:val="21"/>
         </w:rPr>
-        <w:t>11</w:t>
-      </w:r>
-      <w:r>
-        <w:rPr>
-          <w:rFonts w:ascii="Calibri" w:hAnsi="Calibri"/>
-          <w:sz w:val="21"/>
-        </w:rPr>
-        <w:t>, 9621 (2026). https://doi.org/10.21105/joss.09621</w:t>
+        <w:t>743</w:t>
+      </w:r>
+      <w:r>
+        <w:rPr>
+          <w:rFonts w:ascii="Calibri" w:hAnsi="Calibri"/>
+          <w:sz w:val="21"/>
+        </w:rPr>
+        <w:t>, 140700 (2020). https://doi.org/10.1016/j.scitotenv.2020.140700</w:t>
       </w:r>
     </w:p>
     <w:p>
@@ -5074,16 +5128,16 @@
           <w:rFonts w:ascii="Calibri" w:hAnsi="Calibri"/>
           <w:sz w:val="21"/>
         </w:rPr>
-        <w:t>27. Michiels, F. &amp; Geeraerd, A. How to decide and visualize whether</w:t>
-      </w:r>
-    </w:p>
-    <w:p>
-      <w:r>
-        <w:rPr>
-          <w:rFonts w:ascii="Calibri" w:hAnsi="Calibri"/>
-          <w:sz w:val="21"/>
-        </w:rPr>
-        <w:t xml:space="preserve">uncertainty or variability is dominating in life cycle assessment results: a systematic review. </w:t>
+        <w:t>27. Cardellini, G., Mutel, C. L., Vial, E. &amp; Muys, B. Temporalis, a generic</w:t>
+      </w:r>
+    </w:p>
+    <w:p>
+      <w:r>
+        <w:rPr>
+          <w:rFonts w:ascii="Calibri" w:hAnsi="Calibri"/>
+          <w:sz w:val="21"/>
+        </w:rPr>
+        <w:t xml:space="preserve">method and tool for dynamic life cycle assessment. </w:t>
       </w:r>
       <w:r>
         <w:rPr>
@@ -5091,7 +5145,7 @@
           <w:i/>
           <w:sz w:val="21"/>
         </w:rPr>
-        <w:t>Environmental Modelling &amp; Software</w:t>
+        <w:t>Science of the Total Environment</w:t>
       </w:r>
       <w:r>
         <w:rPr>
@@ -5106,14 +5160,14 @@
           <w:b/>
           <w:sz w:val="21"/>
         </w:rPr>
-        <w:t>133</w:t>
-      </w:r>
-      <w:r>
-        <w:rPr>
-          <w:rFonts w:ascii="Calibri" w:hAnsi="Calibri"/>
-          <w:sz w:val="21"/>
-        </w:rPr>
-        <w:t>, 104841 (2020). https://doi.org/10.1016/j.envsoft.2020.104841</w:t>
+        <w:t>645</w:t>
+      </w:r>
+      <w:r>
+        <w:rPr>
+          <w:rFonts w:ascii="Calibri" w:hAnsi="Calibri"/>
+          <w:sz w:val="21"/>
+        </w:rPr>
+        <w:t>, 585-595 (2018). https://doi.org/10.1016/j.scitotenv.2018.07.044</w:t>
       </w:r>
     </w:p>
     <w:p>
@@ -5126,16 +5180,16 @@
           <w:rFonts w:ascii="Calibri" w:hAnsi="Calibri"/>
           <w:sz w:val="21"/>
         </w:rPr>
-        <w:t>28. Lloyd, S. M. &amp; Ries, R. Characterizing, propagating, and analyzing</w:t>
-      </w:r>
-    </w:p>
-    <w:p>
-      <w:r>
-        <w:rPr>
-          <w:rFonts w:ascii="Calibri" w:hAnsi="Calibri"/>
-          <w:sz w:val="21"/>
-        </w:rPr>
-        <w:t xml:space="preserve">uncertainty in life-cycle assessment: a survey of quantitative approaches. </w:t>
+        <w:t>28. Müller, A. et al. Time-explicit life cycle assessment: a flexible</w:t>
+      </w:r>
+    </w:p>
+    <w:p>
+      <w:r>
+        <w:rPr>
+          <w:rFonts w:ascii="Calibri" w:hAnsi="Calibri"/>
+          <w:sz w:val="21"/>
+        </w:rPr>
+        <w:t xml:space="preserve">framework for coherent consideration of temporal dynamics. </w:t>
       </w:r>
       <w:r>
         <w:rPr>
@@ -5143,29 +5197,14 @@
           <w:i/>
           <w:sz w:val="21"/>
         </w:rPr>
-        <w:t>Journal of Industrial Ecology</w:t>
-      </w:r>
-      <w:r>
-        <w:rPr>
-          <w:rFonts w:ascii="Calibri" w:hAnsi="Calibri"/>
-          <w:sz w:val="21"/>
-        </w:rPr>
-        <w:t xml:space="preserve"> </w:t>
-      </w:r>
-      <w:r>
-        <w:rPr>
-          <w:rFonts w:ascii="Calibri" w:hAnsi="Calibri"/>
-          <w:b/>
-          <w:sz w:val="21"/>
-        </w:rPr>
-        <w:t>11</w:t>
-      </w:r>
-      <w:r>
-        <w:rPr>
-          <w:rFonts w:ascii="Calibri" w:hAnsi="Calibri"/>
-          <w:sz w:val="21"/>
-        </w:rPr>
-        <w:t>, 161-179 (2007). https://doi.org/10.1162/jiec.2007.1136</w:t>
+        <w:t>International Journal of Life Cycle Assessment</w:t>
+      </w:r>
+      <w:r>
+        <w:rPr>
+          <w:rFonts w:ascii="Calibri" w:hAnsi="Calibri"/>
+          <w:sz w:val="21"/>
+        </w:rPr>
+        <w:t xml:space="preserve"> (2025). https://doi.org/10.1007/s11367-025-02539-3</w:t>
       </w:r>
     </w:p>
     <w:p>
@@ -5178,16 +5217,46 @@
           <w:rFonts w:ascii="Calibri" w:hAnsi="Calibri"/>
           <w:sz w:val="21"/>
         </w:rPr>
-        <w:t>29. Edelen, A. &amp; Ingwersen, W. Guidance on Data Quality Assessment for Life</w:t>
-      </w:r>
-    </w:p>
-    <w:p>
-      <w:r>
-        <w:rPr>
-          <w:rFonts w:ascii="Calibri" w:hAnsi="Calibri"/>
-          <w:sz w:val="21"/>
-        </w:rPr>
-        <w:t>Cycle Inventory Data. U.S. EPA, EPA/600/R-16/096 (2016). https://cfpub.epa.gov/si/si_public_record_report.cfm?Lab=NRMRL&amp;dirEntryId=321834</w:t>
+        <w:t>29. Diepers, T., Müller, A. &amp; Jakobs, A. bw_timex: a Python package for</w:t>
+      </w:r>
+    </w:p>
+    <w:p>
+      <w:r>
+        <w:rPr>
+          <w:rFonts w:ascii="Calibri" w:hAnsi="Calibri"/>
+          <w:sz w:val="21"/>
+        </w:rPr>
+        <w:t xml:space="preserve">time-explicit life cycle assessment. </w:t>
+      </w:r>
+      <w:r>
+        <w:rPr>
+          <w:rFonts w:ascii="Calibri" w:hAnsi="Calibri"/>
+          <w:i/>
+          <w:sz w:val="21"/>
+        </w:rPr>
+        <w:t>Journal of Open Source Software</w:t>
+      </w:r>
+      <w:r>
+        <w:rPr>
+          <w:rFonts w:ascii="Calibri" w:hAnsi="Calibri"/>
+          <w:sz w:val="21"/>
+        </w:rPr>
+        <w:t xml:space="preserve"> </w:t>
+      </w:r>
+      <w:r>
+        <w:rPr>
+          <w:rFonts w:ascii="Calibri" w:hAnsi="Calibri"/>
+          <w:b/>
+          <w:sz w:val="21"/>
+        </w:rPr>
+        <w:t>11</w:t>
+      </w:r>
+      <w:r>
+        <w:rPr>
+          <w:rFonts w:ascii="Calibri" w:hAnsi="Calibri"/>
+          <w:sz w:val="21"/>
+        </w:rPr>
+        <w:t>, 9621 (2026). https://doi.org/10.21105/joss.09621</w:t>
       </w:r>
     </w:p>
     <w:p>
@@ -5200,16 +5269,16 @@
           <w:rFonts w:ascii="Calibri" w:hAnsi="Calibri"/>
           <w:sz w:val="21"/>
         </w:rPr>
-        <w:t>30. Marchese, D. C., Bates, M. E., Keisler, J. M., Alcaraz, M. L., Linkov, I.</w:t>
-      </w:r>
-    </w:p>
-    <w:p>
-      <w:r>
-        <w:rPr>
-          <w:rFonts w:ascii="Calibri" w:hAnsi="Calibri"/>
-          <w:sz w:val="21"/>
-        </w:rPr>
-        <w:t xml:space="preserve">&amp; Olivetti, E. A. Value of information analysis for life cycle assessment: uncertain emissions in green manufacturing of electronic tablets. </w:t>
+        <w:t>30. Groen, E. A. &amp; Heijungs, R. Ignoring correlation in uncertainty and</w:t>
+      </w:r>
+    </w:p>
+    <w:p>
+      <w:r>
+        <w:rPr>
+          <w:rFonts w:ascii="Calibri" w:hAnsi="Calibri"/>
+          <w:sz w:val="21"/>
+        </w:rPr>
+        <w:t xml:space="preserve">sensitivity analysis in life cycle assessment: what is the risk? </w:t>
       </w:r>
       <w:r>
         <w:rPr>
@@ -5217,7 +5286,7 @@
           <w:i/>
           <w:sz w:val="21"/>
         </w:rPr>
-        <w:t>Journal of Cleaner Production</w:t>
+        <w:t>Environmental Impact Assessment Review</w:t>
       </w:r>
       <w:r>
         <w:rPr>
@@ -5232,14 +5301,14 @@
           <w:b/>
           <w:sz w:val="21"/>
         </w:rPr>
-        <w:t>197</w:t>
-      </w:r>
-      <w:r>
-        <w:rPr>
-          <w:rFonts w:ascii="Calibri" w:hAnsi="Calibri"/>
-          <w:sz w:val="21"/>
-        </w:rPr>
-        <w:t>, 1540-1545 (2018). https://doi.org/10.1016/j.jclepro.2018.06.113</w:t>
+        <w:t>62</w:t>
+      </w:r>
+      <w:r>
+        <w:rPr>
+          <w:rFonts w:ascii="Calibri" w:hAnsi="Calibri"/>
+          <w:sz w:val="21"/>
+        </w:rPr>
+        <w:t>, 98-109 (2017). https://doi.org/10.1016/j.eiar.2016.10.006</w:t>
       </w:r>
     </w:p>
     <w:p>
@@ -5252,16 +5321,46 @@
           <w:rFonts w:ascii="Calibri" w:hAnsi="Calibri"/>
           <w:sz w:val="21"/>
         </w:rPr>
-        <w:t>31. International Organization for Standardization. ISO 14040:2006,</w:t>
-      </w:r>
-    </w:p>
-    <w:p>
-      <w:r>
-        <w:rPr>
-          <w:rFonts w:ascii="Calibri" w:hAnsi="Calibri"/>
-          <w:sz w:val="21"/>
-        </w:rPr>
-        <w:t>Environmental management - Life cycle assessment - Principles and framework; and ISO 14044:2006, Environmental management - Life cycle assessment - Requirements and guidelines. https://www.iso.org/committee/54854/x/catalogue/; https://www.iso.org/standard/38498.html</w:t>
+        <w:t>31. Michiels, F. &amp; Geeraerd, A. How to decide and visualize whether</w:t>
+      </w:r>
+    </w:p>
+    <w:p>
+      <w:r>
+        <w:rPr>
+          <w:rFonts w:ascii="Calibri" w:hAnsi="Calibri"/>
+          <w:sz w:val="21"/>
+        </w:rPr>
+        <w:t xml:space="preserve">uncertainty or variability is dominating in life cycle assessment results: a systematic review. </w:t>
+      </w:r>
+      <w:r>
+        <w:rPr>
+          <w:rFonts w:ascii="Calibri" w:hAnsi="Calibri"/>
+          <w:i/>
+          <w:sz w:val="21"/>
+        </w:rPr>
+        <w:t>Environmental Modelling &amp; Software</w:t>
+      </w:r>
+      <w:r>
+        <w:rPr>
+          <w:rFonts w:ascii="Calibri" w:hAnsi="Calibri"/>
+          <w:sz w:val="21"/>
+        </w:rPr>
+        <w:t xml:space="preserve"> </w:t>
+      </w:r>
+      <w:r>
+        <w:rPr>
+          <w:rFonts w:ascii="Calibri" w:hAnsi="Calibri"/>
+          <w:b/>
+          <w:sz w:val="21"/>
+        </w:rPr>
+        <w:t>133</w:t>
+      </w:r>
+      <w:r>
+        <w:rPr>
+          <w:rFonts w:ascii="Calibri" w:hAnsi="Calibri"/>
+          <w:sz w:val="21"/>
+        </w:rPr>
+        <w:t>, 104841 (2020). https://doi.org/10.1016/j.envsoft.2020.104841</w:t>
       </w:r>
     </w:p>
     <w:p>
@@ -5274,16 +5373,46 @@
           <w:rFonts w:ascii="Calibri" w:hAnsi="Calibri"/>
           <w:sz w:val="21"/>
         </w:rPr>
-        <w:t>32. International Organization for Standardization. ISO 14071:2024,</w:t>
-      </w:r>
-    </w:p>
-    <w:p>
-      <w:r>
-        <w:rPr>
-          <w:rFonts w:ascii="Calibri" w:hAnsi="Calibri"/>
-          <w:sz w:val="21"/>
-        </w:rPr>
-        <w:t>Environmental management - Life cycle assessment - Critical review processes and reviewer competencies (2024). https://www.iso.org/standard/82464.html</w:t>
+        <w:t>32. Lloyd, S. M. &amp; Ries, R. Characterizing, propagating, and analyzing</w:t>
+      </w:r>
+    </w:p>
+    <w:p>
+      <w:r>
+        <w:rPr>
+          <w:rFonts w:ascii="Calibri" w:hAnsi="Calibri"/>
+          <w:sz w:val="21"/>
+        </w:rPr>
+        <w:t xml:space="preserve">uncertainty in life-cycle assessment: a survey of quantitative approaches. </w:t>
+      </w:r>
+      <w:r>
+        <w:rPr>
+          <w:rFonts w:ascii="Calibri" w:hAnsi="Calibri"/>
+          <w:i/>
+          <w:sz w:val="21"/>
+        </w:rPr>
+        <w:t>Journal of Industrial Ecology</w:t>
+      </w:r>
+      <w:r>
+        <w:rPr>
+          <w:rFonts w:ascii="Calibri" w:hAnsi="Calibri"/>
+          <w:sz w:val="21"/>
+        </w:rPr>
+        <w:t xml:space="preserve"> </w:t>
+      </w:r>
+      <w:r>
+        <w:rPr>
+          <w:rFonts w:ascii="Calibri" w:hAnsi="Calibri"/>
+          <w:b/>
+          <w:sz w:val="21"/>
+        </w:rPr>
+        <w:t>11</w:t>
+      </w:r>
+      <w:r>
+        <w:rPr>
+          <w:rFonts w:ascii="Calibri" w:hAnsi="Calibri"/>
+          <w:sz w:val="21"/>
+        </w:rPr>
+        <w:t>, 161-179 (2007). https://doi.org/10.1162/jiec.2007.1136</w:t>
       </w:r>
     </w:p>
     <w:p>
@@ -5296,16 +5425,16 @@
           <w:rFonts w:ascii="Calibri" w:hAnsi="Calibri"/>
           <w:sz w:val="21"/>
         </w:rPr>
-        <w:t>33. GreenDelta. openLCA: open source life cycle assessment software.</w:t>
-      </w:r>
-    </w:p>
-    <w:p>
-      <w:r>
-        <w:rPr>
-          <w:rFonts w:ascii="Calibri" w:hAnsi="Calibri"/>
-          <w:sz w:val="21"/>
-        </w:rPr>
-        <w:t>https://www.openlca.org/</w:t>
+        <w:t>33. Edelen, A. &amp; Ingwersen, W. Guidance on Data Quality Assessment for Life</w:t>
+      </w:r>
+    </w:p>
+    <w:p>
+      <w:r>
+        <w:rPr>
+          <w:rFonts w:ascii="Calibri" w:hAnsi="Calibri"/>
+          <w:sz w:val="21"/>
+        </w:rPr>
+        <w:t>Cycle Inventory Data. U.S. EPA, EPA/600/R-16/096 (2016). https://cfpub.epa.gov/si/si_public_record_report.cfm?Lab=NRMRL&amp;dirEntryId=321834</w:t>
       </w:r>
     </w:p>
     <w:p>
@@ -5318,17 +5447,24 @@
           <w:rFonts w:ascii="Calibri" w:hAnsi="Calibri"/>
           <w:sz w:val="21"/>
         </w:rPr>
-        <w:t>34. Mutel, C. Brightway: an open source framework for life cycle assessment.</w:t>
-      </w:r>
-    </w:p>
-    <w:p>
+        <w:t>34. Marchese, D. C., Bates, M. E., Keisler, J. M., Alcaraz, M. L., Linkov, I.</w:t>
+      </w:r>
+    </w:p>
+    <w:p>
+      <w:r>
+        <w:rPr>
+          <w:rFonts w:ascii="Calibri" w:hAnsi="Calibri"/>
+          <w:sz w:val="21"/>
+        </w:rPr>
+        <w:t xml:space="preserve">&amp; Olivetti, E. A. Value of information analysis for life cycle assessment: uncertain emissions in green manufacturing of electronic tablets. </w:t>
+      </w:r>
       <w:r>
         <w:rPr>
           <w:rFonts w:ascii="Calibri" w:hAnsi="Calibri"/>
           <w:i/>
           <w:sz w:val="21"/>
         </w:rPr>
-        <w:t>Journal of Open Source Software</w:t>
+        <w:t>Journal of Cleaner Production</w:t>
       </w:r>
       <w:r>
         <w:rPr>
@@ -5343,14 +5479,14 @@
           <w:b/>
           <w:sz w:val="21"/>
         </w:rPr>
-        <w:t>2</w:t>
-      </w:r>
-      <w:r>
-        <w:rPr>
-          <w:rFonts w:ascii="Calibri" w:hAnsi="Calibri"/>
-          <w:sz w:val="21"/>
-        </w:rPr>
-        <w:t>, 236 (2017). https://doi.org/10.21105/joss.00236</w:t>
+        <w:t>197</w:t>
+      </w:r>
+      <w:r>
+        <w:rPr>
+          <w:rFonts w:ascii="Calibri" w:hAnsi="Calibri"/>
+          <w:sz w:val="21"/>
+        </w:rPr>
+        <w:t>, 1540-1545 (2018). https://doi.org/10.1016/j.jclepro.2018.06.113</w:t>
       </w:r>
     </w:p>
     <w:p>
@@ -5363,16 +5499,16 @@
           <w:rFonts w:ascii="Calibri" w:hAnsi="Calibri"/>
           <w:sz w:val="21"/>
         </w:rPr>
-        <w:t>35. UARK-NED3. OpenDC-LCA version 1.1.0.</w:t>
-      </w:r>
-    </w:p>
-    <w:p>
-      <w:r>
-        <w:rPr>
-          <w:rFonts w:ascii="Calibri" w:hAnsi="Calibri"/>
-          <w:sz w:val="21"/>
-        </w:rPr>
-        <w:t>https://github.com/UARK-NED3/OpenDC-LCA</w:t>
+        <w:t>35. International Organization for Standardization. ISO 14040:2006,</w:t>
+      </w:r>
+    </w:p>
+    <w:p>
+      <w:r>
+        <w:rPr>
+          <w:rFonts w:ascii="Calibri" w:hAnsi="Calibri"/>
+          <w:sz w:val="21"/>
+        </w:rPr>
+        <w:t>Environmental management - Life cycle assessment - Principles and framework; and ISO 14044:2006, Environmental management - Life cycle assessment - Requirements and guidelines. https://www.iso.org/committee/54854/x/catalogue/; https://www.iso.org/standard/38498.html (accessed 11 August 2026).</w:t>
       </w:r>
     </w:p>
     <w:p>
@@ -5385,16 +5521,16 @@
           <w:rFonts w:ascii="Calibri" w:hAnsi="Calibri"/>
           <w:sz w:val="21"/>
         </w:rPr>
-        <w:t>36. U.S. Environmental Protection Agency. Emissions &amp; Generation Resource</w:t>
-      </w:r>
-    </w:p>
-    <w:p>
-      <w:r>
-        <w:rPr>
-          <w:rFonts w:ascii="Calibri" w:hAnsi="Calibri"/>
-          <w:sz w:val="21"/>
-        </w:rPr>
-        <w:t>Integrated Database (eGRID), detailed data. https://www.epa.gov/egrid/detailed-data</w:t>
+        <w:t>36. International Organization for Standardization. ISO 14071:2024,</w:t>
+      </w:r>
+    </w:p>
+    <w:p>
+      <w:r>
+        <w:rPr>
+          <w:rFonts w:ascii="Calibri" w:hAnsi="Calibri"/>
+          <w:sz w:val="21"/>
+        </w:rPr>
+        <w:t>Environmental management - Life cycle assessment - Critical review processes and reviewer competencies (2024). https://www.iso.org/standard/82464.html (accessed 11 August 2026).</w:t>
       </w:r>
     </w:p>
     <w:p>
@@ -5407,16 +5543,16 @@
           <w:rFonts w:ascii="Calibri" w:hAnsi="Calibri"/>
           <w:sz w:val="21"/>
         </w:rPr>
-        <w:t>37. U.S. Environmental Protection Agency. Frequent questions about eGRID:</w:t>
-      </w:r>
-    </w:p>
-    <w:p>
-      <w:r>
-        <w:rPr>
-          <w:rFonts w:ascii="Calibri" w:hAnsi="Calibri"/>
-          <w:sz w:val="21"/>
-        </w:rPr>
-        <w:t>global warming potentials and methodology changes. https://www.epa.gov/egrid/frequent-questions-about-egrid</w:t>
+        <w:t>37. GreenDelta. openLCA: open source life cycle assessment software.</w:t>
+      </w:r>
+    </w:p>
+    <w:p>
+      <w:r>
+        <w:rPr>
+          <w:rFonts w:ascii="Calibri" w:hAnsi="Calibri"/>
+          <w:sz w:val="21"/>
+        </w:rPr>
+        <w:t>https://www.openlca.org/ (accessed 11 August 2026).</w:t>
       </w:r>
     </w:p>
     <w:p>
@@ -5429,16 +5565,39 @@
           <w:rFonts w:ascii="Calibri" w:hAnsi="Calibri"/>
           <w:sz w:val="21"/>
         </w:rPr>
-        <w:t>38. Boavizta. BoaviztAPI data repository.</w:t>
-      </w:r>
-    </w:p>
-    <w:p>
-      <w:r>
-        <w:rPr>
-          <w:rFonts w:ascii="Calibri" w:hAnsi="Calibri"/>
-          <w:sz w:val="21"/>
-        </w:rPr>
-        <w:t>https://github.com/Boavizta/boaviztapi</w:t>
+        <w:t>38. Mutel, C. Brightway: an open source framework for life cycle assessment.</w:t>
+      </w:r>
+    </w:p>
+    <w:p>
+      <w:r>
+        <w:rPr>
+          <w:rFonts w:ascii="Calibri" w:hAnsi="Calibri"/>
+          <w:i/>
+          <w:sz w:val="21"/>
+        </w:rPr>
+        <w:t>Journal of Open Source Software</w:t>
+      </w:r>
+      <w:r>
+        <w:rPr>
+          <w:rFonts w:ascii="Calibri" w:hAnsi="Calibri"/>
+          <w:sz w:val="21"/>
+        </w:rPr>
+        <w:t xml:space="preserve"> </w:t>
+      </w:r>
+      <w:r>
+        <w:rPr>
+          <w:rFonts w:ascii="Calibri" w:hAnsi="Calibri"/>
+          <w:b/>
+          <w:sz w:val="21"/>
+        </w:rPr>
+        <w:t>2</w:t>
+      </w:r>
+      <w:r>
+        <w:rPr>
+          <w:rFonts w:ascii="Calibri" w:hAnsi="Calibri"/>
+          <w:sz w:val="21"/>
+        </w:rPr>
+        <w:t>, 236 (2017). https://doi.org/10.21105/joss.00236</w:t>
       </w:r>
     </w:p>
     <w:p>
@@ -5451,16 +5610,16 @@
           <w:rFonts w:ascii="Calibri" w:hAnsi="Calibri"/>
           <w:sz w:val="21"/>
         </w:rPr>
-        <w:t>39. Bundesinstitut für Bau-, Stadt- und Raumforschung. ÖKOBAUDAT 2024-II.</w:t>
-      </w:r>
-    </w:p>
-    <w:p>
-      <w:r>
-        <w:rPr>
-          <w:rFonts w:ascii="Calibri" w:hAnsi="Calibri"/>
-          <w:sz w:val="21"/>
-        </w:rPr>
-        <w:t>https://www.oekobaudat.de/</w:t>
+        <w:t>39. UARK-NED3. OpenDC-LCA version 1.1.0.</w:t>
+      </w:r>
+    </w:p>
+    <w:p>
+      <w:r>
+        <w:rPr>
+          <w:rFonts w:ascii="Calibri" w:hAnsi="Calibri"/>
+          <w:sz w:val="21"/>
+        </w:rPr>
+        <w:t>https://github.com/UARK-NED3/OpenDC-LCA (accessed 11 August 2026).</w:t>
       </w:r>
     </w:p>
     <w:p>
@@ -5473,16 +5632,16 @@
           <w:rFonts w:ascii="Calibri" w:hAnsi="Calibri"/>
           <w:sz w:val="21"/>
         </w:rPr>
-        <w:t>40. National Centers for Environmental Information. Typical Meteorological</w:t>
-      </w:r>
-    </w:p>
-    <w:p>
-      <w:r>
-        <w:rPr>
-          <w:rFonts w:ascii="Calibri" w:hAnsi="Calibri"/>
-          <w:sz w:val="21"/>
-        </w:rPr>
-        <w:t>Year data. https://www.ncei.noaa.gov/access/typical-meteorological-year/</w:t>
+        <w:t>40. U.S. Environmental Protection Agency. Emissions &amp; Generation Resource</w:t>
+      </w:r>
+    </w:p>
+    <w:p>
+      <w:r>
+        <w:rPr>
+          <w:rFonts w:ascii="Calibri" w:hAnsi="Calibri"/>
+          <w:sz w:val="21"/>
+        </w:rPr>
+        <w:t>Integrated Database (eGRID), detailed data. https://www.epa.gov/egrid/detailed-data (accessed 11 August 2026).</w:t>
       </w:r>
     </w:p>
     <w:p>
@@ -5495,16 +5654,16 @@
           <w:rFonts w:ascii="Calibri" w:hAnsi="Calibri"/>
           <w:sz w:val="21"/>
         </w:rPr>
-        <w:t>41. National Renewable Energy Laboratory. U.S. Life Cycle Inventory Database,</w:t>
-      </w:r>
-    </w:p>
-    <w:p>
-      <w:r>
-        <w:rPr>
-          <w:rFonts w:ascii="Calibri" w:hAnsi="Calibri"/>
-          <w:sz w:val="21"/>
-        </w:rPr>
-        <w:t>version 1.2026-06.0. Federal LCA Commons. https://www.lcacommons.gov/</w:t>
+        <w:t>41. U.S. Environmental Protection Agency. Frequent questions about eGRID:</w:t>
+      </w:r>
+    </w:p>
+    <w:p>
+      <w:r>
+        <w:rPr>
+          <w:rFonts w:ascii="Calibri" w:hAnsi="Calibri"/>
+          <w:sz w:val="21"/>
+        </w:rPr>
+        <w:t>global warming potentials and methodology changes. https://www.epa.gov/egrid/frequent-questions-about-egrid (accessed 11 August 2026).</w:t>
       </w:r>
     </w:p>
     <w:p>
@@ -5517,16 +5676,16 @@
           <w:rFonts w:ascii="Calibri" w:hAnsi="Calibri"/>
           <w:sz w:val="21"/>
         </w:rPr>
-        <w:t>42. United Nations Environment Programme. Global LCA Data Access network.</w:t>
-      </w:r>
-    </w:p>
-    <w:p>
-      <w:r>
-        <w:rPr>
-          <w:rFonts w:ascii="Calibri" w:hAnsi="Calibri"/>
-          <w:sz w:val="21"/>
-        </w:rPr>
-        <w:t>https://www.globallcadataaccess.org/</w:t>
+        <w:t>42. National Energy Technology Laboratory. U.S. Electricity Baseline, 2023</w:t>
+      </w:r>
+    </w:p>
+    <w:p>
+      <w:r>
+        <w:rPr>
+          <w:rFonts w:ascii="Calibri" w:hAnsi="Calibri"/>
+          <w:sz w:val="21"/>
+        </w:rPr>
+        <w:t>data release, version 03.00.000. Federal LCA Commons (2026). https://www.lcacommons.gov/lca-collaboration/Federal_LCA_Commons/US_electricity_baseline (accessed 11 August 2026).</w:t>
       </w:r>
     </w:p>
     <w:p>
@@ -5539,16 +5698,16 @@
           <w:rFonts w:ascii="Calibri" w:hAnsi="Calibri"/>
           <w:sz w:val="21"/>
         </w:rPr>
-        <w:t>43. U.S. Geological Survey. Watershed Boundary Dataset.</w:t>
-      </w:r>
-    </w:p>
-    <w:p>
-      <w:r>
-        <w:rPr>
-          <w:rFonts w:ascii="Calibri" w:hAnsi="Calibri"/>
-          <w:sz w:val="21"/>
-        </w:rPr>
-        <w:t>https://www.usgs.gov/national-hydrography/watershed-boundary-dataset</w:t>
+        <w:t>43. Boavizta. BoaviztAPI data repository.</w:t>
+      </w:r>
+    </w:p>
+    <w:p>
+      <w:r>
+        <w:rPr>
+          <w:rFonts w:ascii="Calibri" w:hAnsi="Calibri"/>
+          <w:sz w:val="21"/>
+        </w:rPr>
+        <w:t>https://github.com/Boavizta/boaviztapi (accessed 11 August 2026).</w:t>
       </w:r>
     </w:p>
     <w:p>
@@ -5561,46 +5720,16 @@
           <w:rFonts w:ascii="Calibri" w:hAnsi="Calibri"/>
           <w:sz w:val="21"/>
         </w:rPr>
-        <w:t>44. d'Orgeval, A., Sheehan, S., Avenas, Q., Assoumou, E. &amp; Sessa, V.</w:t>
-      </w:r>
-    </w:p>
-    <w:p>
-      <w:r>
-        <w:rPr>
-          <w:rFonts w:ascii="Calibri" w:hAnsi="Calibri"/>
-          <w:sz w:val="21"/>
-        </w:rPr>
-        <w:t xml:space="preserve">Generative AI impact assessment through a life cycle analysis of multiple data center typologies. </w:t>
-      </w:r>
-      <w:r>
-        <w:rPr>
-          <w:rFonts w:ascii="Calibri" w:hAnsi="Calibri"/>
-          <w:i/>
-          <w:sz w:val="21"/>
-        </w:rPr>
-        <w:t>Applied Energy</w:t>
-      </w:r>
-      <w:r>
-        <w:rPr>
-          <w:rFonts w:ascii="Calibri" w:hAnsi="Calibri"/>
-          <w:sz w:val="21"/>
-        </w:rPr>
-        <w:t xml:space="preserve"> </w:t>
-      </w:r>
-      <w:r>
-        <w:rPr>
-          <w:rFonts w:ascii="Calibri" w:hAnsi="Calibri"/>
-          <w:b/>
-          <w:sz w:val="21"/>
-        </w:rPr>
-        <w:t>406</w:t>
-      </w:r>
-      <w:r>
-        <w:rPr>
-          <w:rFonts w:ascii="Calibri" w:hAnsi="Calibri"/>
-          <w:sz w:val="21"/>
-        </w:rPr>
-        <w:t>, 127288 (2026). https://doi.org/10.1016/j.apenergy.2025.127288</w:t>
+        <w:t>44. Bundesinstitut für Bau-, Stadt- und Raumforschung. ÖKOBAUDAT 2024-II.</w:t>
+      </w:r>
+    </w:p>
+    <w:p>
+      <w:r>
+        <w:rPr>
+          <w:rFonts w:ascii="Calibri" w:hAnsi="Calibri"/>
+          <w:sz w:val="21"/>
+        </w:rPr>
+        <w:t>https://www.oekobaudat.de/ (accessed 11 August 2026).</w:t>
       </w:r>
     </w:p>
     <w:p>
@@ -5613,46 +5742,16 @@
           <w:rFonts w:ascii="Calibri" w:hAnsi="Calibri"/>
           <w:sz w:val="21"/>
         </w:rPr>
-        <w:t>45. Wu, S., Zheng, W., Wang, Z., Chen, G., Yang, P., Yue, S., Li, D. &amp; Wu, Y.</w:t>
-      </w:r>
-    </w:p>
-    <w:p>
-      <w:r>
-        <w:rPr>
-          <w:rFonts w:ascii="Calibri" w:hAnsi="Calibri"/>
-          <w:sz w:val="21"/>
-        </w:rPr>
-        <w:t xml:space="preserve">AlphaDataCenterCooling: A new computational model for data center cooling system evaluation. </w:t>
-      </w:r>
-      <w:r>
-        <w:rPr>
-          <w:rFonts w:ascii="Calibri" w:hAnsi="Calibri"/>
-          <w:i/>
-          <w:sz w:val="21"/>
-        </w:rPr>
-        <w:t>Applied Energy</w:t>
-      </w:r>
-      <w:r>
-        <w:rPr>
-          <w:rFonts w:ascii="Calibri" w:hAnsi="Calibri"/>
-          <w:sz w:val="21"/>
-        </w:rPr>
-        <w:t xml:space="preserve"> </w:t>
-      </w:r>
-      <w:r>
-        <w:rPr>
-          <w:rFonts w:ascii="Calibri" w:hAnsi="Calibri"/>
-          <w:b/>
-          <w:sz w:val="21"/>
-        </w:rPr>
-        <w:t>380</w:t>
-      </w:r>
-      <w:r>
-        <w:rPr>
-          <w:rFonts w:ascii="Calibri" w:hAnsi="Calibri"/>
-          <w:sz w:val="21"/>
-        </w:rPr>
-        <w:t>, 125100 (2025). https://doi.org/10.1016/j.apenergy.2024.125100</w:t>
+        <w:t>45. National Centers for Environmental Information. Typical Meteorological</w:t>
+      </w:r>
+    </w:p>
+    <w:p>
+      <w:r>
+        <w:rPr>
+          <w:rFonts w:ascii="Calibri" w:hAnsi="Calibri"/>
+          <w:sz w:val="21"/>
+        </w:rPr>
+        <w:t>Year data. https://www.ncei.noaa.gov/access/typical-meteorological-year/ (accessed 11 August 2026).</w:t>
       </w:r>
     </w:p>
     <w:p>
@@ -5665,46 +5764,16 @@
           <w:rFonts w:ascii="Calibri" w:hAnsi="Calibri"/>
           <w:sz w:val="21"/>
         </w:rPr>
-        <w:t>46. Groen, E. A. &amp; Heijungs, R. Ignoring correlation in uncertainty and</w:t>
-      </w:r>
-    </w:p>
-    <w:p>
-      <w:r>
-        <w:rPr>
-          <w:rFonts w:ascii="Calibri" w:hAnsi="Calibri"/>
-          <w:sz w:val="21"/>
-        </w:rPr>
-        <w:t xml:space="preserve">sensitivity analysis in life cycle assessment: what is the risk? </w:t>
-      </w:r>
-      <w:r>
-        <w:rPr>
-          <w:rFonts w:ascii="Calibri" w:hAnsi="Calibri"/>
-          <w:i/>
-          <w:sz w:val="21"/>
-        </w:rPr>
-        <w:t>Environmental Impact Assessment Review</w:t>
-      </w:r>
-      <w:r>
-        <w:rPr>
-          <w:rFonts w:ascii="Calibri" w:hAnsi="Calibri"/>
-          <w:sz w:val="21"/>
-        </w:rPr>
-        <w:t xml:space="preserve"> </w:t>
-      </w:r>
-      <w:r>
-        <w:rPr>
-          <w:rFonts w:ascii="Calibri" w:hAnsi="Calibri"/>
-          <w:b/>
-          <w:sz w:val="21"/>
-        </w:rPr>
-        <w:t>62</w:t>
-      </w:r>
-      <w:r>
-        <w:rPr>
-          <w:rFonts w:ascii="Calibri" w:hAnsi="Calibri"/>
-          <w:sz w:val="21"/>
-        </w:rPr>
-        <w:t>, 98-109 (2017). https://doi.org/10.1016/j.eiar.2016.10.006</w:t>
+        <w:t>46. National Renewable Energy Laboratory. U.S. Life Cycle Inventory Database,</w:t>
+      </w:r>
+    </w:p>
+    <w:p>
+      <w:r>
+        <w:rPr>
+          <w:rFonts w:ascii="Calibri" w:hAnsi="Calibri"/>
+          <w:sz w:val="21"/>
+        </w:rPr>
+        <w:t>version 1.2026-06.0. Federal LCA Commons. https://www.lcacommons.gov/ (accessed 11 August 2026).</w:t>
       </w:r>
     </w:p>
     <w:p>
@@ -5717,16 +5786,16 @@
           <w:rFonts w:ascii="Calibri" w:hAnsi="Calibri"/>
           <w:sz w:val="21"/>
         </w:rPr>
-        <w:t>47. National Energy Technology Laboratory. U.S. Electricity Baseline, 2023</w:t>
-      </w:r>
-    </w:p>
-    <w:p>
-      <w:r>
-        <w:rPr>
-          <w:rFonts w:ascii="Calibri" w:hAnsi="Calibri"/>
-          <w:sz w:val="21"/>
-        </w:rPr>
-        <w:t>data release, version 03.00.000. Federal LCA Commons (2026). https://www.lcacommons.gov/lca-collaboration/Federal_LCA_Commons/US_electricity_baseline</w:t>
+        <w:t>47. United Nations Environment Programme. Global LCA Data Access network.</w:t>
+      </w:r>
+    </w:p>
+    <w:p>
+      <w:r>
+        <w:rPr>
+          <w:rFonts w:ascii="Calibri" w:hAnsi="Calibri"/>
+          <w:sz w:val="21"/>
+        </w:rPr>
+        <w:t>https://www.globallcadataaccess.org/ (accessed 11 August 2026).</w:t>
       </w:r>
     </w:p>
     <w:p>
@@ -5739,16 +5808,16 @@
           <w:rFonts w:ascii="Calibri" w:hAnsi="Calibri"/>
           <w:sz w:val="21"/>
         </w:rPr>
-        <w:t>48. International Telecommunication Union. ITU-T Recommendation L.1410:</w:t>
-      </w:r>
-    </w:p>
-    <w:p>
-      <w:r>
-        <w:rPr>
-          <w:rFonts w:ascii="Calibri" w:hAnsi="Calibri"/>
-          <w:sz w:val="21"/>
-        </w:rPr>
-        <w:t>Methodology for environmental life cycle assessments of information and communication technology goods, networks and services (2024). https://handle.itu.int/11.1002/1000/16010</w:t>
+        <w:t>48. U.S. Geological Survey. Watershed Boundary Dataset.</w:t>
+      </w:r>
+    </w:p>
+    <w:p>
+      <w:r>
+        <w:rPr>
+          <w:rFonts w:ascii="Calibri" w:hAnsi="Calibri"/>
+          <w:sz w:val="21"/>
+        </w:rPr>
+        <w:t>https://www.usgs.gov/national-hydrography/watershed-boundary-dataset (accessed 11 August 2026).</w:t>
       </w:r>
     </w:p>
     <w:sectPr>

</xml_diff>

<commit_message>
Use concise noun-phrase section headings
</commit_message>
<xml_diff>
--- a/paper/OpenDC-LCA_manuscript.docx
+++ b/paper/OpenDC-LCA_manuscript.docx
@@ -152,7 +152,7 @@
         <w:pStyle w:val="Heading2"/>
       </w:pPr>
       <w:r>
-        <w:t>1.1. Cooling is an energy-system and lifecycle decision</w:t>
+        <w:t>1.1. Cooling-system lifecycle context</w:t>
       </w:r>
     </w:p>
     <w:p>
@@ -187,7 +187,7 @@
         <w:pStyle w:val="Heading2"/>
       </w:pPr>
       <w:r>
-        <w:t>1.2. Existing data-center LCAs</w:t>
+        <w:t>1.2. Data-center LCA literature</w:t>
       </w:r>
     </w:p>
     <w:p>
@@ -231,7 +231,7 @@
         <w:pStyle w:val="Heading2"/>
       </w:pPr>
       <w:r>
-        <w:t>1.3. Electricity accounting, time, and geography</w:t>
+        <w:t>1.3. Temporal and geographic electricity accounting</w:t>
       </w:r>
     </w:p>
     <w:p>
@@ -257,7 +257,7 @@
         <w:pStyle w:val="Heading2"/>
       </w:pPr>
       <w:r>
-        <w:t>1.4. Data quality, uncertainty, and the decision value of evidence</w:t>
+        <w:t>1.4. Data quality, uncertainty, and decision value</w:t>
       </w:r>
     </w:p>
     <w:p>
@@ -292,7 +292,7 @@
         <w:pStyle w:val="Heading2"/>
       </w:pPr>
       <w:r>
-        <w:t>1.5. Research gap and contribution</w:t>
+        <w:t>1.5. Research gap and contributions</w:t>
       </w:r>
     </w:p>
     <w:p>
@@ -551,7 +551,7 @@
         <w:pStyle w:val="Heading2"/>
       </w:pPr>
       <w:r>
-        <w:t>2.1. Evidence-to-decision architecture</w:t>
+        <w:t>2.1. Evidence-to-decision framework</w:t>
       </w:r>
     </w:p>
     <w:p>
@@ -671,7 +671,7 @@
         <w:pStyle w:val="Heading2"/>
       </w:pPr>
       <w:r>
-        <w:t>2.3. Dataset roles and inclusion logic</w:t>
+        <w:t>2.3. Dataset roles and inclusion criteria</w:t>
       </w:r>
     </w:p>
     <w:p>
@@ -1688,7 +1688,7 @@
         <w:pStyle w:val="Heading2"/>
       </w:pPr>
       <w:r>
-        <w:t>2.4. Static energy, equipment, fluid, and replacement calculations</w:t>
+        <w:t>2.4. Static lifecycle calculations</w:t>
       </w:r>
     </w:p>
     <w:p>
@@ -1846,7 +1846,7 @@
         <w:pStyle w:val="Heading2"/>
       </w:pPr>
       <w:r>
-        <w:t>2.5. Released-model reconstruction and electricity-intensity index</w:t>
+        <w:t>2.5. Released-model reconstruction</w:t>
       </w:r>
     </w:p>
     <w:p>
@@ -2007,7 +2007,7 @@
         <w:pStyle w:val="Heading2"/>
       </w:pPr>
       <w:r>
-        <w:t>2.6. Common-basis eGRID reconstruction</w:t>
+        <w:t>2.6. eGRID harmonization</w:t>
       </w:r>
     </w:p>
     <w:p>
@@ -2058,7 +2058,7 @@
         <w:pStyle w:val="Heading2"/>
       </w:pPr>
       <w:r>
-        <w:t>2.7. Federal LCA Commons consumption-system calculation</w:t>
+        <w:t>2.7. Federal LCA Commons electricity accounting</w:t>
       </w:r>
     </w:p>
     <w:p>
@@ -2132,7 +2132,7 @@
         <w:pStyle w:val="Heading2"/>
       </w:pPr>
       <w:r>
-        <w:t>2.8. Extrapolation, boundary, and functional-unit diagnostics</w:t>
+        <w:t>2.8. Transferability diagnostics</w:t>
       </w:r>
     </w:p>
     <w:p>
@@ -2192,7 +2192,7 @@
         <w:pStyle w:val="Heading2"/>
       </w:pPr>
       <w:r>
-        <w:t>2.9. Deterministic rank-robustness and secondary stress designs</w:t>
+        <w:t>2.9. Rank-robustness and stress analyses</w:t>
       </w:r>
     </w:p>
     <w:p>
@@ -2802,7 +2802,7 @@
         <w:pStyle w:val="Heading2"/>
       </w:pPr>
       <w:r>
-        <w:t>2.11. Temporal performance, reliability, interoperability, and claims</w:t>
+        <w:t>2.11. Temporal performance and software controls</w:t>
       </w:r>
     </w:p>
     <w:p>
@@ -2854,7 +2854,7 @@
         <w:pStyle w:val="Heading2"/>
       </w:pPr>
       <w:r>
-        <w:t>3.1. Arithmetic reconstruction exposed an unresolved method identity</w:t>
+        <w:t>3.1. Released-model method identity</w:t>
       </w:r>
     </w:p>
     <w:p>
@@ -2933,7 +2933,7 @@
         <w:pStyle w:val="Heading2"/>
       </w:pPr>
       <w:r>
-        <w:t>3.2. The historical direct-generation trend is insensitive to eGRID's GWP update</w:t>
+        <w:t>3.2. Historical generation-emission intensity</w:t>
       </w:r>
     </w:p>
     <w:p>
@@ -3012,7 +3012,7 @@
         <w:pStyle w:val="Heading2"/>
       </w:pPr>
       <w:r>
-        <w:t>3.3. Consumption-system factors remove the arbitrary boundary adder but retain documented cutoffs</w:t>
+        <w:t>3.3. Lifecycle electricity factors</w:t>
       </w:r>
     </w:p>
     <w:p>
@@ -3109,7 +3109,7 @@
         <w:pStyle w:val="Heading2"/>
       </w:pPr>
       <w:r>
-        <w:t>3.4. Equal-width bounds identify service equivalence and use phase as the limiting blocks</w:t>
+        <w:t>3.4. Rank-robustness thresholds</w:t>
       </w:r>
     </w:p>
     <w:p>
@@ -3206,7 +3206,7 @@
         <w:pStyle w:val="Heading2"/>
       </w:pPr>
       <w:r>
-        <w:t>3.5. Server and construction data reveal leverage but not architecture totals</w:t>
+        <w:t>3.5. Server and construction evidence</w:t>
       </w:r>
     </w:p>
     <w:p>
@@ -3247,7 +3247,7 @@
         <w:pStyle w:val="Heading2"/>
       </w:pPr>
       <w:r>
-        <w:t>3.6. Data-priority rank is useful but not invariant</w:t>
+        <w:t>3.6. Data-priority sensitivity</w:t>
       </w:r>
     </w:p>
     <w:p>
@@ -3273,7 +3273,7 @@
         <w:pStyle w:val="Heading2"/>
       </w:pPr>
       <w:r>
-        <w:t>3.7. Software checks and practitioner outputs</w:t>
+        <w:t>3.7. Software verification and practitioner outputs</w:t>
       </w:r>
     </w:p>
     <w:p>
@@ -3307,7 +3307,7 @@
         <w:pStyle w:val="Heading2"/>
       </w:pPr>
       <w:r>
-        <w:t>4.1. The central result is a claim boundary, not a cooling winner</w:t>
+        <w:t>4.1. Comparative claim boundaries</w:t>
       </w:r>
     </w:p>
     <w:p>
@@ -3333,7 +3333,7 @@
         <w:pStyle w:val="Heading2"/>
       </w:pPr>
       <w:r>
-        <w:t>4.2. Lifecycle electricity materially changes the boundary diagnosis</w:t>
+        <w:t>4.2. Electricity-system boundaries</w:t>
       </w:r>
     </w:p>
     <w:p>
@@ -3359,7 +3359,7 @@
         <w:pStyle w:val="Heading2"/>
       </w:pPr>
       <w:r>
-        <w:t>4.3. Equalized bounds correct an attribution error in the earlier stress design</w:t>
+        <w:t>4.3. Robustness-bound design</w:t>
       </w:r>
     </w:p>
     <w:p>
@@ -3394,7 +3394,7 @@
         <w:pStyle w:val="Heading2"/>
       </w:pPr>
       <w:r>
-        <w:t>4.4. Useful computation is the decisive experimental bridge</w:t>
+        <w:t>4.4. Functional equivalence</w:t>
       </w:r>
     </w:p>
     <w:p>
@@ -3420,7 +3420,7 @@
         <w:pStyle w:val="Heading2"/>
       </w:pPr>
       <w:r>
-        <w:t>4.5. Declining grid-emission intensity changes the value of evidence</w:t>
+        <w:t>4.5. Grid decarbonization and evidence priorities</w:t>
       </w:r>
     </w:p>
     <w:p>
@@ -3446,7 +3446,7 @@
         <w:pStyle w:val="Heading2"/>
       </w:pPr>
       <w:r>
-        <w:t>4.6. Role relative to openLCA, Brightway, and dynamic-LCA tools</w:t>
+        <w:t>4.6. Relationship to LCA software</w:t>
       </w:r>
     </w:p>
     <w:p>
@@ -3586,7 +3586,7 @@
         <w:pStyle w:val="Heading2"/>
       </w:pPr>
       <w:r>
-        <w:t>4.7. Implications for hyperscale practitioners and the Microsoft study</w:t>
+        <w:t>4.7. Hyperscale applications</w:t>
       </w:r>
     </w:p>
     <w:p>
@@ -3713,7 +3713,7 @@
         <w:pStyle w:val="Heading2"/>
       </w:pPr>
       <w:r>
-        <w:t>4.8. Limitations and submission-grade evidence needs</w:t>
+        <w:t>4.8. Limitations and evidence requirements</w:t>
       </w:r>
     </w:p>
     <w:p>

</xml_diff>

<commit_message>
Avoid colons and semicolons in manuscript prose
</commit_message>
<xml_diff>
--- a/paper/OpenDC-LCA_manuscript.docx
+++ b/paper/OpenDC-LCA_manuscript.docx
@@ -14,7 +14,7 @@
           <w:color w:val="17324D"/>
           <w:sz w:val="42"/>
         </w:rPr>
-        <w:t>Transferability audit of data-center cooling life-cycle assessment: lifecycle electricity, functional equivalence, and rank robustness</w:t>
+        <w:t>Transferability audit of data-center cooling life-cycle assessment considering lifecycle electricity, functional equivalence, and rank robustness</w:t>
       </w:r>
     </w:p>
     <w:p>
@@ -94,7 +94,7 @@
           <w:color w:val="60758A"/>
           <w:sz w:val="19"/>
         </w:rPr>
-        <w:t>Corresponding author: Han Hu (hanhu@uark.edu).</w:t>
+        <w:t>The corresponding author is Han Hu (hanhu@uark.edu).</w:t>
       </w:r>
     </w:p>
     <w:p>
@@ -119,7 +119,7 @@
           <w:rFonts w:ascii="Calibri" w:hAnsi="Calibri"/>
           <w:sz w:val="21"/>
         </w:rPr>
-        <w:t>Published data-center cooling life-cycle assessments (LCAs) are difficult to transfer because electricity boundaries, climate methods, useful-computation equivalence, and foreground inventories differ. This Technology Assessment uses OpenDC-LCA, an open-source evidence-audit and comparison-validation tool, to test which conclusions from the released Microsoft/WSP comparison remain supportable. We reconstructed 24 totals, harmonized nine U.S. Environmental Protection Agency Emissions &amp; Generation Resource Integrated Database (eGRID) releases to the Intergovernmental Panel on Climate Change Fifth Assessment Report 100-year global warming potential (AR5 GWP100), and calculated 71 non-residual 2023 Federal LCA Commons electricity-consumption systems. The article reports AR5 GWP100, but its archived workbook places the numeric electricity endpoints in 100-year global temperature-change-potential (GTP100) cells while the corresponding GWP100 cells are blank; formulas point to those blank cells. We therefore retain cooling totals only as numerical transferability screens. The harmonized national direct-generation factor declined 32.46%, from 517.73 to 349.67 kg carbon dioxide equivalent per megawatt-hour between 2012 and 2023. The partial linked national consumption system yielded 422.93 kg carbon dioxide equivalent per megawatt-hour but retained 287 unlinked technosphere inputs. Under equal relative bounds, the first-rank screen failed at a 1.32% all-block half-width; service-equivalence and use-phase thresholds were 2.64% and 2.99%, compared with 22.15% for embodied burden. This result reverses an earlier attribution of rank sensitivity to embodied variation. The audit supports the decline in generation-related greenhouse-gas intensity and identifies decision-critical data, but it does not identify a universally preferable cooling architecture.</w:t>
+        <w:t>Published data-center cooling life-cycle assessments (LCAs) are difficult to transfer because electricity boundaries, climate methods, useful-computation equivalence, and foreground inventories differ. This Technology Assessment uses OpenDC-LCA, an open-source evidence-audit and comparison-validation tool, to test which conclusions from the released Microsoft/WSP comparison remain supportable. We reconstructed 24 totals, harmonized nine U.S. Environmental Protection Agency Emissions &amp; Generation Resource Integrated Database (eGRID) releases to the Intergovernmental Panel on Climate Change Fifth Assessment Report 100-year global warming potential (AR5 GWP100), and calculated 71 non-residual 2023 Federal LCA Commons electricity-consumption systems. The article reports AR5 GWP100, but its archived workbook places the numeric electricity endpoints in 100-year global temperature-change-potential (GTP100) cells while the corresponding GWP100 cells are blank. Formulas point to those blank cells. We therefore retain cooling totals only as numerical transferability screens. The harmonized national direct-generation factor declined 32.46%, from 517.73 to 349.67 kg carbon dioxide equivalent per megawatt-hour between 2012 and 2023. The partial linked national consumption system yielded 422.93 kg carbon dioxide equivalent per megawatt-hour but retained 287 unlinked technosphere inputs. Under equal relative bounds, the first-rank screen failed at a 1.32% all-block half-width. Service-equivalence and use-phase thresholds were 2.64% and 2.99%, compared with 22.15% for embodied burden. This result reverses an earlier attribution of rank sensitivity to embodied variation. The audit supports the decline in generation-related greenhouse-gas intensity and identifies decision-critical data, but it does not identify a universally preferable cooling architecture.</w:t>
       </w:r>
     </w:p>
     <w:p>
@@ -129,14 +129,14 @@
           <w:b/>
           <w:sz w:val="21"/>
         </w:rPr>
-        <w:t>Keywords:</w:t>
-      </w:r>
-      <w:r>
-        <w:rPr>
-          <w:rFonts w:ascii="Calibri" w:hAnsi="Calibri"/>
-          <w:sz w:val="21"/>
-        </w:rPr>
-        <w:t xml:space="preserve"> data center; life-cycle assessment; energy efficiency; lifecycle electricity; functional equivalence; sensitivity analysis; open-source software</w:t>
+        <w:t>Keywords</w:t>
+      </w:r>
+      <w:r>
+        <w:rPr>
+          <w:rFonts w:ascii="Calibri" w:hAnsi="Calibri"/>
+          <w:sz w:val="21"/>
+        </w:rPr>
+        <w:t xml:space="preserve">  data center, life-cycle assessment, energy efficiency, lifecycle electricity, functional equivalence, sensitivity analysis, open-source software</w:t>
       </w:r>
     </w:p>
     <w:p>
@@ -223,7 +223,7 @@
           <w:rFonts w:ascii="Calibri" w:hAnsi="Calibri"/>
           <w:sz w:val="21"/>
         </w:rPr>
-        <w:t>Other LCA work confirms that changes in electricity-generation emissions and cooling efficiency are complementary but can shift impacts among categories [19]. Manufacturer and ICT studies also show wide dispersion in embodied server impacts [20,21]. Together, this literature exposes a specific gap: available primary studies do not provide a reusable audit for determining whether a published cooling comparison can be transferred to a different electricity system without changing its method, boundary, or computational service.</w:t>
+        <w:t>Other LCA work confirms that changes in electricity-generation emissions and cooling efficiency are complementary but can shift impacts among categories [19]. Manufacturer and ICT studies also show wide dispersion in embodied server impacts [20,21]. Together, this literature exposes a specific gap. Available primary studies do not provide a reusable audit for determining whether a published cooling comparison can be transferred to a different electricity system without changing its method, boundary, or computational service.</w:t>
       </w:r>
     </w:p>
     <w:p>
@@ -240,7 +240,7 @@
           <w:rFonts w:ascii="Calibri" w:hAnsi="Calibri"/>
           <w:sz w:val="21"/>
         </w:rPr>
-        <w:t>Electricity is not a scalar independent of method. Attributional LCA usually requires a consumption mix with upstream generation, transmission, and other indirect processes, whereas eGRID state total-output rates describe direct emissions from in-state generation. Location-based, market-based, and marginal factors answer different questions. Combining location- and market-based accounting inconsistently can double count renewable attributes [22,23]. Average rates can also fail to represent the effect of workload shifting; Dandres et al. found that average and marginal electricity signals can lead to different real-time data-center decisions [24].</w:t>
+        <w:t>Electricity is not a scalar independent of method. Attributional LCA usually requires a consumption mix with upstream generation, transmission, and other indirect processes, whereas eGRID state total-output rates describe direct emissions from in-state generation. Location-based, market-based, and marginal factors answer different questions. Combining location- and market-based accounting inconsistently can double count renewable attributes [22,23]. Average rates can also fail to represent the effect of workload shifting. Dandres et al. found that average and marginal electricity signals can lead to different real-time data-center decisions [24].</w:t>
       </w:r>
     </w:p>
     <w:p>
@@ -249,7 +249,7 @@
           <w:rFonts w:ascii="Calibri" w:hAnsi="Calibri"/>
           <w:sz w:val="21"/>
         </w:rPr>
-        <w:t>Time enters at several levels: cooling performance varies with load and weather; grid composition varies hourly and over years; equipment is replaced at discrete times; and background technologies evolve. Dynamic-LCA reviews distinguish temporal inventory, characterization, and prospective background change [25,26]. Open tools such as Temporalis and, more recently, bw_timex show how temporal information can be propagated through process networks [27-29]. For cooling, hourly operation is necessary but insufficient: the grid method, geography, and upstream boundary must also be aligned. A weather file cannot repair an incompatible electricity inventory.</w:t>
+        <w:t>Time affects i) cooling performance across load and weather, ii) hourly and long-term grid composition, iii) discrete equipment replacement, and iv) background technology. Dynamic-LCA reviews distinguish temporal inventory, characterization, and prospective background change [25,26]. Open tools such as Temporalis and, more recently, bw_timex show how temporal information can be propagated through process networks [27-29]. For cooling, hourly operation is necessary but insufficient. The grid method, geography, and upstream boundary must also be aligned. A weather file cannot repair an incompatible electricity inventory.</w:t>
       </w:r>
     </w:p>
     <w:p>
@@ -266,7 +266,7 @@
           <w:rFonts w:ascii="Calibri" w:hAnsi="Calibri"/>
           <w:sz w:val="21"/>
         </w:rPr>
-        <w:t>LCA uncertainty arises from parameters, scenarios, model form, allocation, system boundary, and incomplete knowledge. Monte Carlo propagation is useful when distributions and correlations are supportable; it becomes misleading when arbitrary ranges are presented as confidence. Correlation can materially change propagated uncertainty and cannot be inferred from marginal ranges alone [30]. Reviews recommend separating variability from uncertainty and using sensitivity analysis to identify influential assumptions [31]. Pedigree matrices can communicate reliability, temporal, geographic, and technological representativeness, but the conversion from qualitative scores to uncertainty is itself a modeling choice [32,33].</w:t>
+        <w:t>LCA uncertainty arises from parameters, scenarios, model form, allocation, system boundary, and incomplete knowledge. Monte Carlo propagation is useful when distributions and correlations are supportable. It becomes misleading when arbitrary ranges are presented as confidence. Correlation can materially change propagated uncertainty and cannot be inferred from marginal ranges alone [30]. Reviews recommend separating variability from uncertainty and using sensitivity analysis to identify influential assumptions [31]. Pedigree matrices can communicate reliability, temporal, geographic, and technological representativeness, but the conversion from qualitative scores to uncertainty is itself a modeling choice [32,33].</w:t>
       </w:r>
     </w:p>
     <w:p>
@@ -275,7 +275,7 @@
           <w:rFonts w:ascii="Calibri" w:hAnsi="Calibri"/>
           <w:sz w:val="21"/>
         </w:rPr>
-        <w:t>Data-quality assessment is not a decorative appendix. EPA guidance emphasizes reproducible documentation at flow and process levels [33]. Decision analysis goes further: value-of-information methods prioritize data whose resolution is expected to change a decision, rather than simply improving every weak input [34]. This distinction is important for electronics-cooling laboratories. A parameter may have poor pedigree but negligible decision leverage; a seemingly precise PUE difference may be decisive if two lifecycle alternatives are nearly tied.</w:t>
+        <w:t>Data-quality assessment is not a decorative appendix. EPA guidance emphasizes reproducible documentation at flow and process levels [33]. Decision analysis goes further. Value-of-information methods prioritize data whose resolution is expected to change a decision, rather than simply improving every weak input [34]. This distinction is important for electronics-cooling laboratories. A parameter may have poor pedigree but negligible decision leverage. By contrast, a seemingly precise PUE difference may be decisive if two lifecycle alternatives are nearly tied.</w:t>
       </w:r>
     </w:p>
     <w:p>
@@ -284,7 +284,7 @@
           <w:rFonts w:ascii="Calibri" w:hAnsi="Calibri"/>
           <w:sz w:val="21"/>
         </w:rPr>
-        <w:t>The review standard also depends on the claim. ISO 14040 and ISO 14044 define the LCA framework and requirements, whereas ISO 14071:2024 specifies critical review processes and reviewer competencies, with particular relevance to comparative assertions intended for public disclosure [35,36]. Code tests, data checks, and coauthor review can strengthen traceability, but none is a substitute for an independent critical review.</w:t>
+        <w:t>The review standard also depends on the claim. ISO 14040 and ISO 14044 define the LCA framework and requirements, whereas ISO 14071 (2024) specifies critical review processes and reviewer competencies, with particular relevance to comparative assertions intended for public disclosure [35,36]. Code tests, data checks, and coauthor review can strengthen traceability, but none is a substitute for an independent critical review.</w:t>
       </w:r>
     </w:p>
     <w:p>
@@ -310,20 +310,16 @@
           <w:rFonts w:ascii="Calibri" w:hAnsi="Calibri"/>
           <w:sz w:val="21"/>
         </w:rPr>
-        <w:t>Four gaps remain at the intersection of cooling engineering and LCA:</w:t>
+        <w:t>Four gaps remain at the intersection of cooling engineering and LCA. First, published normalized totals cannot be transparently updated when foreground quantities and licensed process mappings are incomplete. Second, common-unit electricity factors can retain incompatible characterization methods and system boundaries. Third, qualitative data-quality scores do not directly show which measurement could change the technology decision. Fourth, software often produces a number without preserving whether it is reconstructed, screened, empirically supported, or suitable for a comparative claim.</w:t>
       </w:r>
     </w:p>
     <w:p>
-      <w:pPr>
-        <w:spacing w:after="60"/>
-        <w:ind w:left="374" w:hanging="288"/>
-      </w:pPr>
-      <w:r>
-        <w:rPr>
-          <w:rFonts w:ascii="Calibri" w:hAnsi="Calibri"/>
-          <w:sz w:val="21"/>
-        </w:rPr>
-        <w:t>1. published normalized totals cannot be transparently updated when foreground</w:t>
+      <w:r>
+        <w:rPr>
+          <w:rFonts w:ascii="Calibri" w:hAnsi="Calibri"/>
+          <w:sz w:val="21"/>
+        </w:rPr>
+        <w:t>This study is a technology assessment of the transferability of the released Microsoft/WSP case. It makes five contributions. First, it reconstructs 24 released totals and audits the workbook cells to identify an unresolved GTP100/GWP100 inconsistency in the public archive. Second, it harmonizes nine eGRID releases from gas-specific emissions. Third, it calculates 71 Federal LCA Commons 2023 consumption systems with an openLCA-compatible JSON-LD workflow and reports process links, numerical residuals, and unlinked technosphere cutoffs rather than hiding them. Fourth, it derives exact, equal-width, deterministic rank-robustness certificates that distinguish the effects of grid, use phase, embodied burden, and service equivalence without assigning unsupported probabilities. Finally, it provides the open-source OpenDC-LCA comparison validator, which blocks incompatible functional units, boundaries, electricity accounting, LCIA methods, or missing field-level lineage while stating that metadata checks are not physical validation.</w:t>
       </w:r>
     </w:p>
     <w:p>
@@ -332,201 +328,7 @@
           <w:rFonts w:ascii="Calibri" w:hAnsi="Calibri"/>
           <w:sz w:val="21"/>
         </w:rPr>
-        <w:t>quantities and licensed process mappings are incomplete;</w:t>
-      </w:r>
-    </w:p>
-    <w:p>
-      <w:pPr>
-        <w:spacing w:after="60"/>
-        <w:ind w:left="374" w:hanging="288"/>
-      </w:pPr>
-      <w:r>
-        <w:rPr>
-          <w:rFonts w:ascii="Calibri" w:hAnsi="Calibri"/>
-          <w:sz w:val="21"/>
-        </w:rPr>
-        <w:t>2. common-unit electricity factors can retain incompatible characterization</w:t>
-      </w:r>
-    </w:p>
-    <w:p>
-      <w:r>
-        <w:rPr>
-          <w:rFonts w:ascii="Calibri" w:hAnsi="Calibri"/>
-          <w:sz w:val="21"/>
-        </w:rPr>
-        <w:t>methods and system boundaries;</w:t>
-      </w:r>
-    </w:p>
-    <w:p>
-      <w:pPr>
-        <w:spacing w:after="60"/>
-        <w:ind w:left="374" w:hanging="288"/>
-      </w:pPr>
-      <w:r>
-        <w:rPr>
-          <w:rFonts w:ascii="Calibri" w:hAnsi="Calibri"/>
-          <w:sz w:val="21"/>
-        </w:rPr>
-        <w:t>3. qualitative data-quality scores do not directly show which measurement</w:t>
-      </w:r>
-    </w:p>
-    <w:p>
-      <w:r>
-        <w:rPr>
-          <w:rFonts w:ascii="Calibri" w:hAnsi="Calibri"/>
-          <w:sz w:val="21"/>
-        </w:rPr>
-        <w:t>could change the technology decision; and</w:t>
-      </w:r>
-    </w:p>
-    <w:p>
-      <w:pPr>
-        <w:spacing w:after="60"/>
-        <w:ind w:left="374" w:hanging="288"/>
-      </w:pPr>
-      <w:r>
-        <w:rPr>
-          <w:rFonts w:ascii="Calibri" w:hAnsi="Calibri"/>
-          <w:sz w:val="21"/>
-        </w:rPr>
-        <w:t>4. software often produces a number without preserving whether it is</w:t>
-      </w:r>
-    </w:p>
-    <w:p>
-      <w:r>
-        <w:rPr>
-          <w:rFonts w:ascii="Calibri" w:hAnsi="Calibri"/>
-          <w:sz w:val="21"/>
-        </w:rPr>
-        <w:t>reconstructed, screened, empirically supported, or suitable for a comparative claim.</w:t>
-      </w:r>
-    </w:p>
-    <w:p>
-      <w:r>
-        <w:rPr>
-          <w:rFonts w:ascii="Calibri" w:hAnsi="Calibri"/>
-          <w:sz w:val="21"/>
-        </w:rPr>
-        <w:t>This study is a technology assessment of the transferability of the released Microsoft/WSP case. Its contributions are:</w:t>
-      </w:r>
-    </w:p>
-    <w:p>
-      <w:pPr>
-        <w:spacing w:after="60"/>
-        <w:ind w:left="374" w:hanging="288"/>
-      </w:pPr>
-      <w:r>
-        <w:rPr>
-          <w:rFonts w:ascii="Calibri" w:hAnsi="Calibri"/>
-          <w:sz w:val="21"/>
-        </w:rPr>
-        <w:t>1. an exact reconstruction of 24 released totals and a cell-level audit that</w:t>
-      </w:r>
-    </w:p>
-    <w:p>
-      <w:r>
-        <w:rPr>
-          <w:rFonts w:ascii="Calibri" w:hAnsi="Calibri"/>
-          <w:sz w:val="21"/>
-        </w:rPr>
-        <w:t>identifies an unresolved GTP100/GWP100 inconsistency in the public archive;</w:t>
-      </w:r>
-    </w:p>
-    <w:p>
-      <w:pPr>
-        <w:spacing w:after="60"/>
-        <w:ind w:left="374" w:hanging="288"/>
-      </w:pPr>
-      <w:r>
-        <w:rPr>
-          <w:rFonts w:ascii="Calibri" w:hAnsi="Calibri"/>
-          <w:sz w:val="21"/>
-        </w:rPr>
-        <w:t>2. a common-basis reconstruction of nine eGRID releases from gas-specific</w:t>
-      </w:r>
-    </w:p>
-    <w:p>
-      <w:r>
-        <w:rPr>
-          <w:rFonts w:ascii="Calibri" w:hAnsi="Calibri"/>
-          <w:sz w:val="21"/>
-        </w:rPr>
-        <w:t>emissions;</w:t>
-      </w:r>
-    </w:p>
-    <w:p>
-      <w:pPr>
-        <w:spacing w:after="60"/>
-        <w:ind w:left="374" w:hanging="288"/>
-      </w:pPr>
-      <w:r>
-        <w:rPr>
-          <w:rFonts w:ascii="Calibri" w:hAnsi="Calibri"/>
-          <w:sz w:val="21"/>
-        </w:rPr>
-        <w:t>3. an openLCA-compatible JSON-LD calculation of 71 Federal LCA Commons 2023</w:t>
-      </w:r>
-    </w:p>
-    <w:p>
-      <w:r>
-        <w:rPr>
-          <w:rFonts w:ascii="Calibri" w:hAnsi="Calibri"/>
-          <w:sz w:val="21"/>
-        </w:rPr>
-        <w:t>consumption systems, with process links, numerical residuals, and unlinked technosphere cutoffs reported rather than hidden;</w:t>
-      </w:r>
-    </w:p>
-    <w:p>
-      <w:pPr>
-        <w:spacing w:after="60"/>
-        <w:ind w:left="374" w:hanging="288"/>
-      </w:pPr>
-      <w:r>
-        <w:rPr>
-          <w:rFonts w:ascii="Calibri" w:hAnsi="Calibri"/>
-          <w:sz w:val="21"/>
-        </w:rPr>
-        <w:t>4. exact, equal-width, deterministic rank-robustness certificates that</w:t>
-      </w:r>
-    </w:p>
-    <w:p>
-      <w:r>
-        <w:rPr>
-          <w:rFonts w:ascii="Calibri" w:hAnsi="Calibri"/>
-          <w:sz w:val="21"/>
-        </w:rPr>
-        <w:t>distinguish the effects of grid, use phase, embodied burden, and service equivalence without assigning unsupported probabilities; and</w:t>
-      </w:r>
-    </w:p>
-    <w:p>
-      <w:pPr>
-        <w:spacing w:after="60"/>
-        <w:ind w:left="374" w:hanging="288"/>
-      </w:pPr>
-      <w:r>
-        <w:rPr>
-          <w:rFonts w:ascii="Calibri" w:hAnsi="Calibri"/>
-          <w:sz w:val="21"/>
-        </w:rPr>
-        <w:t>5. the open-source OpenDC-LCA comparison validator, which blocks incompatible functional units,</w:t>
-      </w:r>
-    </w:p>
-    <w:p>
-      <w:r>
-        <w:rPr>
-          <w:rFonts w:ascii="Calibri" w:hAnsi="Calibri"/>
-          <w:sz w:val="21"/>
-        </w:rPr>
-        <w:t>boundaries, electricity accounting, LCIA methods, or missing field-level lineage, while stating that metadata checks are not physical validation.</w:t>
-      </w:r>
-    </w:p>
-    <w:p>
-      <w:r>
-        <w:rPr>
-          <w:rFonts w:ascii="Calibri" w:hAnsi="Calibri"/>
-          <w:sz w:val="21"/>
-        </w:rPr>
-        <w:t>Together, the reconstruction addresses the missing public arithmetic in gap 1; the harmonization and linked-system calculations expose the method and boundary conflicts in gap 2; the rank-robustness certificates identify the measurements with decision leverage in gap 3; and the OpenDC-LCA validator preserves the evidence class needed to prevent gap 4. OpenDC-LCA is therefore the reproducible implementation of this assessment layer, not a replacement for the process-network engines openLCA or Brightway.</w:t>
+        <w:t>Together, the reconstruction addresses the missing public arithmetic in gap 1. The harmonization and linked-system calculations expose the method and boundary conflicts in gap 2. The rank-robustness certificates identify the measurements with decision leverage in gap 3. The OpenDC-LCA validator preserves the evidence class needed to prevent gap 4. OpenDC-LCA is therefore the reproducible implementation of this assessment layer, not a replacement for the process-network engines openLCA or Brightway.</w:t>
       </w:r>
     </w:p>
     <w:p>
@@ -560,7 +362,7 @@
           <w:rFonts w:ascii="Calibri" w:hAnsi="Calibri"/>
           <w:sz w:val="21"/>
         </w:rPr>
-        <w:t>Figure 1 shows the workflow of OpenDC-LCA, an open-source data-center cooling life-cycle assessment tool. The repository records source-family metadata and a per-file path, byte count, and SHA-256 checksum. Dataset-specific tables retain the worksheet, field, unit, boundary, and numerical role used in each analysis. This is file-level integrity plus family-level provenance, not a complete flow-level data-lineage graph. The harmonization stage asks the following questions in order: (1) are the alternatives functionally equivalent; (2) are the units, characterization methods, time, and geography aligned; (3) is the required transformation interpolation or extrapolation; and (4) are uncertainty, correlation, and review status adequate for the proposed claim? The result is classified as reconstructed, screening-transformed, registered/unlinked, or supported by primary decision-grade evidence.</w:t>
+        <w:t>Figure 1 shows the workflow of OpenDC-LCA, an open-source data-center cooling life-cycle assessment tool. The repository records source-family metadata and a per-file path, byte count, and SHA-256 checksum. Dataset-specific tables retain the worksheet, field, unit, boundary, and numerical role used in each analysis. This is file-level integrity plus family-level provenance, not a complete flow-level data-lineage graph. The harmonization stage asks four questions in order. These questions determine i) whether the alternatives are functionally equivalent, ii) whether the units, characterization methods, time, and geography are aligned, iii) whether the required transformation is interpolation or extrapolation, and iv) whether uncertainty, correlation, and review status are adequate for the proposed claim. The result is classified as reconstructed, screening-transformed, registered/unlinked, or supported by primary decision-grade evidence.</w:t>
       </w:r>
     </w:p>
     <w:p>
@@ -663,7 +465,7 @@
           <w:rFonts w:ascii="Calibri" w:hAnsi="Calibri"/>
           <w:sz w:val="21"/>
         </w:rPr>
-        <w:t>The package supports a cooling-system cradle-to-grave boundary and a broader facility cradle-to-grave boundary. The former includes cooling and heat-rejection equipment, fluids, represented maintenance and replacement, operation, and end of life. The latter can also include building, electrical, and IT assets. Common systems may be excluded only when their quantity, performance, lifetime, and end-of-life treatment are unchanged. Onsite water and electricity-supply-chain water are reported separately; location- and market-based electricity are not merged.</w:t>
+        <w:t>The package supports a cooling-system cradle-to-grave boundary and a broader facility cradle-to-grave boundary. The former includes cooling and heat-rejection equipment, fluids, represented maintenance and replacement, operation, and end of life. The latter can also include building, electrical, and IT assets. Common systems may be excluded only when their quantity, performance, lifetime, and end-of-life treatment are unchanged. Onsite water and electricity-supply-chain water are reported separately. Location- and market-based electricity are not merged.</w:t>
       </w:r>
     </w:p>
     <w:p>
@@ -680,7 +482,7 @@
           <w:rFonts w:ascii="Calibri" w:hAnsi="Calibri"/>
           <w:sz w:val="21"/>
         </w:rPr>
-        <w:t>Table 1 states how each downloaded source enters this study. This is an important methodological control: being readable by the software does not make a dataset compatible with the case model.</w:t>
+        <w:t>Table 1 states how each downloaded source enters this study. This is an important methodological control. Readability by the software does not make a dataset compatible with the case model.</w:t>
       </w:r>
     </w:p>
     <w:p>
@@ -853,7 +655,7 @@
                 <w:rFonts w:ascii="Calibri" w:hAnsi="Calibri"/>
                 <w:sz w:val="18"/>
               </w:rPr>
-              <w:t>Microsoft/WSP archive: 24 totals, component tables, 2 electricity anchors, pedigree records [14,15]</w:t>
+              <w:t>Microsoft/WSP archive with 24 totals, component tables, 2 electricity anchors, and pedigree records [14,15]</w:t>
             </w:r>
           </w:p>
         </w:tc>
@@ -958,7 +760,7 @@
                 <w:rFonts w:ascii="Calibri" w:hAnsi="Calibri"/>
                 <w:sz w:val="18"/>
               </w:rPr>
-              <w:t>EPA eGRID: 459 state/DC-year rows and 9 U.S. aggregates [40,41]</w:t>
+              <w:t>EPA eGRID with 459 state/DC-year rows and 9 U.S. aggregates [40,41]</w:t>
             </w:r>
           </w:p>
         </w:tc>
@@ -1113,7 +915,7 @@
                 <w:rFonts w:ascii="Calibri" w:hAnsi="Calibri"/>
                 <w:sz w:val="18"/>
               </w:rPr>
-              <w:t>Unlinked technosphere inputs remain zero-burden cutoffs; not harmonized with the released cooling foreground</w:t>
+              <w:t>Unlinked technosphere inputs remain zero-burden cutoffs and are not harmonized with the released cooling foreground</w:t>
             </w:r>
           </w:p>
         </w:tc>
@@ -1168,7 +970,7 @@
                 <w:rFonts w:ascii="Calibri" w:hAnsi="Calibri"/>
                 <w:sz w:val="18"/>
               </w:rPr>
-              <w:t>Boavizta: 48 server PCF records [43]</w:t>
+              <w:t>Boavizta with 48 server PCF records [43]</w:t>
             </w:r>
           </w:p>
         </w:tc>
@@ -1273,7 +1075,7 @@
                 <w:rFonts w:ascii="Calibri" w:hAnsi="Calibri"/>
                 <w:sz w:val="18"/>
               </w:rPr>
-              <w:t>ÖKOBAUDAT: 6 selected A1-A3 processes [44]</w:t>
+              <w:t>ÖKOBAUDAT with 6 selected A1-A3 processes [44]</w:t>
             </w:r>
           </w:p>
         </w:tc>
@@ -1378,7 +1180,7 @@
                 <w:rFonts w:ascii="Calibri" w:hAnsi="Calibri"/>
                 <w:sz w:val="18"/>
               </w:rPr>
-              <w:t>NOAA TMY: 8,760 Fayetteville weather rows [45]</w:t>
+              <w:t>NOAA TMY with 8,760 Fayetteville weather rows [45]</w:t>
             </w:r>
           </w:p>
         </w:tc>
@@ -1588,7 +1390,7 @@
                 <w:rFonts w:ascii="Calibri" w:hAnsi="Calibri"/>
                 <w:sz w:val="18"/>
               </w:rPr>
-              <w:t>USGS watershed boundary: HU12 geometry [48]</w:t>
+              <w:t>USGS watershed boundary with HU12 geometry [48]</w:t>
             </w:r>
           </w:p>
         </w:tc>
@@ -1772,7 +1574,7 @@
           <w:rFonts w:ascii="Calibri" w:hAnsi="Calibri"/>
           <w:sz w:val="21"/>
         </w:rPr>
-        <w:t>Equipment production and end-of-life burdens are annualized with discrete replacement:</w:t>
+        <w:t>Equipment production and end-of-life burdens are annualized with discrete replacement according to</w:t>
       </w:r>
     </w:p>
     <w:p>
@@ -1829,7 +1631,7 @@
           <w:color w:val="17324D"/>
           <w:sz w:val="21"/>
         </w:rPr>
-        <w:t>I_k,fluid = m_prod,annual I_k^prod + (m_0/L_f) I_k^EOL;  GHG_direct = m_loss GWP_direct   (6)</w:t>
+        <w:t>I_k,fluid = m_prod,annual I_k^prod + (m_0/L_f) I_k^EOL    and    GHG_direct = m_loss GWP_direct   (6)</w:t>
       </w:r>
     </w:p>
     <w:p>
@@ -1870,7 +1672,7 @@
           <w:rFonts w:ascii="Calibri" w:hAnsi="Calibri"/>
           <w:sz w:val="21"/>
         </w:rPr>
-        <w:t xml:space="preserve"> sheet: use phase, building, server, rack/tank, cable, supporting equipment, and fluid impacts. This 24-cell test is an arithmetic-consistency audit. It does not validate confidential quantities, licensed LCA for Experts or ecoinvent processes, allocation, performance, or field operation.</w:t>
+        <w:t xml:space="preserve"> sheet. These categories are use phase, building, server, rack/tank, cable, supporting equipment, and fluid impacts. This 24-cell test is an arithmetic-consistency audit. It does not validate confidential quantities, licensed LCA for Experts or ecoinvent processes, allocation, performance, or field operation.</w:t>
       </w:r>
     </w:p>
     <w:p>
@@ -1983,7 +1785,7 @@
           <w:rFonts w:ascii="Calibri" w:hAnsi="Calibri"/>
           <w:sz w:val="21"/>
         </w:rPr>
-        <w:t>The crossover of technologies a and b follows from equality in Eq. (8):</w:t>
+        <w:t>The crossover of technologies a and b follows from equality in Eq. (8).</w:t>
       </w:r>
     </w:p>
     <w:p>
@@ -2016,7 +1818,7 @@
           <w:rFonts w:ascii="Calibri" w:hAnsi="Calibri"/>
           <w:sz w:val="21"/>
         </w:rPr>
-        <w:t>EPA changed the GWP values used by eGRID: releases before 2018 used IPCC SAR, 2018-2022 used AR4, and 2023 used AR5 without climate-carbon feedback [40,41]. To remove this avoidable discontinuity, every state and U.S. factor was reconstructed from net generation and gas-specific annual emissions:</w:t>
+        <w:t>EPA changed the GWP values used by eGRID. Releases before 2018 used IPCC SAR, 2018-2022 used AR4, and 2023 used AR5 without climate-carbon feedback [40,41]. To remove this avoidable discontinuity, every state and U.S. factor was reconstructed from net generation and gas-specific annual emissions as follows.</w:t>
       </w:r>
     </w:p>
     <w:p>
@@ -2041,7 +1843,7 @@
           <w:rFonts w:ascii="Calibri" w:hAnsi="Calibri"/>
           <w:sz w:val="21"/>
         </w:rPr>
-        <w:t>where CO2 is reported in short tons, CH4 and N2O in pounds, E_y in MWh, and the final factor converts pounds to kilograms. The provider-published CO2e rate was retained as a comparison. The provider U.S. aggregate, rather than the 50-state-plus-DC reconstruction, was used for national results. Puerto Rico was excluded from the state/DC panel; the resulting scope coverage was reported for each year.</w:t>
+        <w:t>where CO2 is reported in short tons, CH4 and N2O in pounds, E_y in MWh, and the final factor converts pounds to kilograms. The provider-published CO2e rate was retained as a comparison. The provider U.S. aggregate, rather than the 50-state-plus-DC reconstruction, was used for national results. Puerto Rico was excluded from the state/DC panel. The resulting scope coverage was reported for each year.</w:t>
       </w:r>
     </w:p>
     <w:p>
@@ -2067,7 +1869,7 @@
           <w:rFonts w:ascii="Calibri" w:hAnsi="Calibri"/>
           <w:sz w:val="21"/>
         </w:rPr>
-        <w:t>The 2023 U.S. Electricity Baseline was downloaded from the Federal LCA Commons as openLCA 2 JSON-LD together with the repository's IPCC GWP method [42]. The inventory contains 947 processes and 142 product systems generated with ElectricityLCI 3.0.0. We retained 71 non-residual, at-user consumption systems: 60 balancing authorities, 10 FERC regions, and the national mix. The matched residual-consumption systems were calculated separately as a market-based accounting sensitivity and were never pooled with the ordinary consumption systems.</w:t>
+        <w:t>The 2023 U.S. Electricity Baseline was downloaded from the Federal LCA Commons as openLCA 2 JSON-LD together with the repository's IPCC GWP method [42]. The inventory contains 947 processes and 142 product systems generated with ElectricityLCI 3.0.0. We retained 71 non-residual, at-user consumption systems, consisting of 60 balancing authorities, 10 FERC regions, and the national mix. The matched residual-consumption systems were calculated separately as a market-based accounting sensitivity and were never pooled with the ordinary consumption systems.</w:t>
       </w:r>
     </w:p>
     <w:p>
@@ -2076,7 +1878,7 @@
           <w:rFonts w:ascii="Calibri" w:hAnsi="Calibri"/>
           <w:sz w:val="21"/>
         </w:rPr>
-        <w:t xml:space="preserve">For each product system, process links defined the technosphere coefficients. Activities were solved by fixed-point iteration for the declared target of 1 MWh at user; all exchange and target units were converted through the JSON-LD unit groups. Elementary exchanges were characterized with IPCC AR5-100 category UUID </w:t>
+        <w:t xml:space="preserve">For each product system, process links defined the technosphere coefficients. Activities were solved by fixed-point iteration for the declared target of 1 MWh at user. All exchange and target units were converted through the JSON-LD unit groups. Elementary exchanges were characterized with IPCC AR5-100 category UUID </w:t>
       </w:r>
       <w:r>
         <w:rPr>
@@ -2124,7 +1926,7 @@
           <w:rFonts w:ascii="Calibri" w:hAnsi="Calibri"/>
           <w:sz w:val="21"/>
         </w:rPr>
-        <w:t>The provider scope includes trade, transmission and distribution losses, and upstream fuel supply. Generation infrastructure is included only for the provider-specified gas, oil, coal, solar, wind, and geothermal technologies; other generation infrastructure and transmission/distribution infrastructure are outside scope [42]. The very low factors in some hydropower-dominated systems must not be interpreted as complete electricity LCAs.</w:t>
+        <w:t>The provider scope includes trade, transmission and distribution losses, and upstream fuel supply. Generation infrastructure is included only for the provider-specified gas, oil, coal, solar, wind, and geothermal technologies. other generation infrastructure and transmission/distribution infrastructure are outside scope [42]. The very low factors in some hydropower-dominated systems must not be interpreted as complete electricity LCAs.</w:t>
       </w:r>
     </w:p>
     <w:p>
@@ -2201,7 +2003,7 @@
           <w:rFonts w:ascii="Calibri" w:hAnsi="Calibri"/>
           <w:sz w:val="21"/>
         </w:rPr>
-        <w:t>The main robustness analysis uses equal relative half-widths so that one assumption block is not made influential merely by assigning it a wider range. For every Federal LCA Commons factor, we found the smallest half-width h at which the nominal numerical first rank could be reversed. Five sets were tested: shared grid only; technology-specific use phase only; embodied burden only; service equivalence only; and all four blocks at the same h. The grid multiplier was common and nonnegative. Foreground multipliers could vary in opposite adverse directions for the nominal winner and each competitor. All monotone adverse foreground directions and both shared-grid endpoints were evaluated, and the first crossing was found by bisection. The reported threshold is an exact certificate for the declared box, not a probability or empirical uncertainty interval.</w:t>
+        <w:t>The main robustness analysis uses equal relative half-widths so that one assumption block is not made influential merely by assigning it a wider range. For every Federal LCA Commons factor, we found the smallest half-width h at which the nominal numerical first rank could be reversed. Five sets were tested, namely i) shared grid only, ii) technology-specific use phase only, iii) embodied burden only, iv) service equivalence only, and v) all four blocks at the same h. The grid multiplier was common and nonnegative. Foreground multipliers could vary in opposite adverse directions for the nominal winner and each competitor. All monotone adverse foreground directions and both shared-grid endpoints were evaluated, and the first crossing was found by bisection. The reported threshold is an exact certificate for the declared box, not a probability or empirical uncertainty interval.</w:t>
       </w:r>
     </w:p>
     <w:p>
@@ -2563,7 +2365,7 @@
                 <w:rFonts w:ascii="Calibri" w:hAnsi="Calibri"/>
                 <w:sz w:val="18"/>
               </w:rPr>
-              <w:t>Intermediate declared stress; not a fitted range</w:t>
+              <w:t>Intermediate declared stress, not a fitted range</w:t>
             </w:r>
           </w:p>
         </w:tc>
@@ -2685,7 +2487,7 @@
           <w:rFonts w:ascii="Calibri" w:hAnsi="Calibri"/>
           <w:sz w:val="21"/>
         </w:rPr>
-        <w:t>The triangular mode was 1.0 and the base seed was 20250730. A stable hash of the context, envelope, active block, and dependence case generated a separate seed for every design, so output does not depend on loop order. We then repeated the stress with grid only, use phase only, embodied contribution only, service equivalence only, and all four blocks active. Technology-specific multipliers were coupled with a Gaussian copula at declared latent correlations of 0, 0.5, and 1 while retaining the same triangular marginals. These correlations are not measurements. Rank frequencies describe the declared designs; they are not posterior probabilities, confidence levels, or a substitute for empirical uncertainty distributions.</w:t>
+        <w:t>The triangular mode was 1.0 and the base seed was 20250730. A stable hash of the context, envelope, active block, and dependence case generated a separate seed for every design, so output does not depend on loop order. We then repeated the stress with grid only, use phase only, embodied contribution only, service equivalence only, and all four blocks active. Technology-specific multipliers were coupled with a Gaussian copula at declared latent correlations of 0, 0.5, and 1 while retaining the same triangular marginals. These correlations are not measurements. Rank frequencies describe the declared designs. They are not posterior probabilities, confidence levels, or a substitute for empirical uncertainty distributions.</w:t>
       </w:r>
     </w:p>
     <w:p>
@@ -2726,7 +2528,7 @@
           <w:rFonts w:ascii="Calibri" w:hAnsi="Calibri"/>
           <w:sz w:val="21"/>
         </w:rPr>
-        <w:t xml:space="preserve"> products with total GHG, manufacturing share, and lifetime. Manufacturing GHG was calculated as total product GHG times manufacturing share and annualized by declared lifetime. The candidate-flow table retains all 55 server records: 48 met the three-field rule, while seven Lenovo records were excluded because manufacturing share was blank. No candidate was silently discarded. The minimum, quartiles, median, and maximum annualized values were divided by the empirical median and used only as common multiplicative stresses on the released compute, storage, and networking contributions. This preserves a unitless scale test without treating different servers as functionally interchangeable.</w:t>
+        <w:t xml:space="preserve"> products with total GHG, manufacturing share, and lifetime. Manufacturing GHG was calculated as total product GHG times manufacturing share and annualized by declared lifetime. The candidate-flow table retains all 55 server records. Of these records, 48 met the three-field rule, while seven Lenovo records were excluded because manufacturing share was blank. No candidate was silently discarded. The minimum, quartiles, median, and maximum annualized values were divided by the empirical median and used only as common multiplicative stresses on the released compute, storage, and networking contributions. This preserves a unitless scale test without treating different servers as functionally interchangeable.</w:t>
       </w:r>
     </w:p>
     <w:p>
@@ -2735,7 +2537,7 @@
           <w:rFonts w:ascii="Calibri" w:hAnsi="Calibri"/>
           <w:sz w:val="21"/>
         </w:rPr>
-        <w:t>Selected ÖKOBAUDAT A1-A3 steel and cement records were compared within product families:</w:t>
+        <w:t>Selected ÖKOBAUDAT A1-A3 steel and cement records were compared within product families according to</w:t>
       </w:r>
     </w:p>
     <w:p>
@@ -2769,7 +2571,7 @@
           <w:rFonts w:ascii="Calibri" w:hAnsi="Calibri"/>
           <w:sz w:val="21"/>
         </w:rPr>
-        <w:t>For data priority, released pedigree scores were averaged by component and combined with mean GHG contribution share S_c:</w:t>
+        <w:t>For data priority, released pedigree scores were averaged by component and combined with mean GHG contribution share S_c according to</w:t>
       </w:r>
     </w:p>
     <w:p>
@@ -2811,7 +2613,7 @@
           <w:rFonts w:ascii="Calibri" w:hAnsi="Calibri"/>
           <w:sz w:val="21"/>
         </w:rPr>
-        <w:t>The package can bilinearly interpolate a bounded IT-load/dry-bulb performance map and integrate its cooling-only partial PUE against hourly conditions using one declared, constant grid factor. Wet-bulb values are schema-checked but are not an interpolation coordinate, and non-cooling facility overhead is outside this partial-PUE calculation. It rejects uncovered operating points; extrapolation is disabled. The Fayetteville TMY file and synthetic performance surface are used only in software examples because no measured four-architecture surface was available.</w:t>
+        <w:t>The package can bilinearly interpolate a bounded IT-load/dry-bulb performance map and integrate its cooling-only partial PUE against hourly conditions using one declared, constant grid factor. Wet-bulb values are schema-checked but are not an interpolation coordinate, and non-cooling facility overhead is outside this partial-PUE calculation. It rejects uncovered operating points, and extrapolation is disabled. The Fayetteville TMY file and synthetic performance surface are used only in software examples because no measured four-architecture surface was available.</w:t>
       </w:r>
     </w:p>
     <w:p>
@@ -2829,7 +2631,7 @@
           <w:rFonts w:ascii="Calibri" w:hAnsi="Calibri"/>
           <w:sz w:val="21"/>
         </w:rPr>
-        <w:t>The scenario audit checks required metadata, duplicate identifiers, physical values, uncertainty declarations, evidence labels, and comparative intent. The comparison validator additionally requires matching functional units, system boundaries, electricity accounting, allocation and replacement rules, and LCIA methods. For a declared public assertion, each modeled input group must map to a registered source identifier. Synthetic inputs, unquantified uncertainty, and insufficient declared review remain blockers. These checks also reject non-finite numeric inputs, retain the field-to-source map in result manifests, and require a matching inclusion/exclusion record for custom comparative boundaries. They verify metadata consistency only: they cannot authenticate a citation, distribution, review status, physical model, or ISO conformity [35,36].</w:t>
+        <w:t>The scenario audit checks required metadata, duplicate identifiers, physical values, uncertainty declarations, evidence labels, and comparative intent. The comparison validator additionally requires matching functional units, system boundaries, electricity accounting, allocation and replacement rules, and LCIA methods. For a declared public assertion, each modeled input group must map to a registered source identifier. Synthetic inputs, unquantified uncertainty, and insufficient declared review remain blockers. These checks also reject non-finite numeric inputs, retain the field-to-source map in result manifests, and require a matching inclusion/exclusion record for custom comparative boundaries. They verify metadata consistency only and cannot authenticate a citation, distribution, review status, physical model, or ISO conformity [35,36].</w:t>
       </w:r>
     </w:p>
     <w:p>
@@ -2885,7 +2687,7 @@
         <w:drawing>
           <wp:inline xmlns:a="http://schemas.openxmlformats.org/drawingml/2006/main" xmlns:pic="http://schemas.openxmlformats.org/drawingml/2006/picture">
             <wp:extent cx="5897880" cy="3408483"/>
-            <wp:docPr id="2" name="Picture 2" descr="Figure 2. Relative reductions versus air cooling obtained by summing the released Microsoft/WSP normalized contributions. All 24 totals were reconciled at workbook precision. This figure reproduces released arithmetic; it does not validate inventories, method identity, or field performance." title="OpenDC-LCA Figure 2"/>
+            <wp:docPr id="2" name="Picture 2" descr="Figure 2. Relative reductions versus air cooling obtained by summing the released Microsoft/WSP normalized contributions. All 24 totals were reconciled at workbook precision. This figure reproduces released arithmetic. It does not validate inventories, method identity, or field performance." title="OpenDC-LCA Figure 2"/>
             <wp:cNvGraphicFramePr>
               <a:graphicFrameLocks noChangeAspect="1"/>
             </wp:cNvGraphicFramePr>
@@ -2925,7 +2727,7 @@
           <w:rFonts w:ascii="Calibri" w:hAnsi="Calibri"/>
           <w:sz w:val="18"/>
         </w:rPr>
-        <w:t>Figure 2. Relative reductions versus air cooling obtained by summing the released Microsoft/WSP normalized contributions. All 24 totals were reconciled at workbook precision. This figure reproduces released arithmetic; it does not validate inventories, method identity, or field performance.</w:t>
+        <w:t>Figure 2. Relative reductions versus air cooling obtained by summing the released Microsoft/WSP normalized contributions. All 24 totals were reconciled at workbook precision. This figure reproduces released arithmetic. It does not validate inventories, method identity, or field performance.</w:t>
       </w:r>
     </w:p>
     <w:p>
@@ -2942,7 +2744,7 @@
           <w:rFonts w:ascii="Calibri" w:hAnsi="Calibri"/>
           <w:sz w:val="21"/>
         </w:rPr>
-        <w:t>The common-basis U.S. generation factor declined from 517.731 kg CO2e/MWh in 2012 to 349.667 kg CO2e/MWh in 2023, a 32.462% reduction. The trajectory was not monotonic: the factor rose from 373.097 in 2020 to 388.699 in 2021 before declining. Reconstructing every year with AR5 GWP100 changed the provider-published national rate by no more than 0.248 kg CO2e/MWh, in 2012. The direct CO2-only rate was 348.000 kg/MWh in 2023. Thus, the long-run decline is not an artifact of eGRID's transition from SAR to AR4 and AR5.</w:t>
+        <w:t>The common-basis U.S. generation factor declined from 517.731 kg CO2e/MWh in 2012 to 349.667 kg CO2e/MWh in 2023, a 32.462% reduction. The trajectory was not monotonic. The factor rose from 373.097 in 2020 to 388.699 in 2021 before declining. Reconstructing every year with AR5 GWP100 changed the provider-published national rate by no more than 0.248 kg CO2e/MWh, in 2012. The direct CO2-only rate was 348.000 kg/MWh in 2023. Thus, the long-run decline is not an artifact of eGRID's transition from SAR to AR4 and AR5.</w:t>
       </w:r>
     </w:p>
     <w:p>
@@ -2951,7 +2753,7 @@
           <w:rFonts w:ascii="Calibri" w:hAnsi="Calibri"/>
           <w:sz w:val="21"/>
         </w:rPr>
-        <w:t>The 50-state-plus-DC reconstruction matched the official national result through 2018. From 2019 onward it was 0.32-0.43% lower because the panel covered 99.55-99.58% of the provider U.S. generation after excluding Puerto Rico. We retained the provider aggregate for the national series. In Figure 3, the orange polyline connects the reported provider U.S. aggregate direct-generation rate for each release year; it is not fitted to the state/DC points. Across the full panel, 137 of 459 numerical rates lay outside the two released cooling anchors, so 29.85% of the transfers were extrapolations.</w:t>
+        <w:t>The 50-state-plus-DC reconstruction matched the official national result through 2018. From 2019 onward it was 0.32-0.43% lower because the panel covered 99.55-99.58% of the provider U.S. generation after excluding Puerto Rico. We retained the provider aggregate for the national series. In Figure 3, the orange polyline connects the reported provider U.S. aggregate direct-generation rate for each release year. It is not fitted to the state/DC points. Across the full panel, 137 of 459 numerical rates lay outside the two released cooling anchors, so 29.85% of the transfers were extrapolations.</w:t>
       </w:r>
     </w:p>
     <w:p>
@@ -2964,7 +2766,7 @@
         <w:drawing>
           <wp:inline xmlns:a="http://schemas.openxmlformats.org/drawingml/2006/main" xmlns:pic="http://schemas.openxmlformats.org/drawingml/2006/picture">
             <wp:extent cx="5897880" cy="3324930"/>
-            <wp:docPr id="3" name="Picture 3" descr="Figure 3. Harmonized AR5-GWP100 eGRID state/DC generation rates for nine releases, with electricity intensity on the horizontal axis in kg CO2e/MWh. The orange polyline connects the reported provider U.S. aggregate for each year; blue points fall below the released-model numerical cold-plate/single-phase crossover. These are direct-generation scenarios, not consumption LCIs or state cooling LCAs." title="OpenDC-LCA Figure 3"/>
+            <wp:docPr id="3" name="Picture 3" descr="Figure 3. Harmonized AR5-GWP100 eGRID state/DC generation rates for nine releases, with electricity intensity on the horizontal axis in kg CO2e/MWh. The orange polyline connects the reported provider U.S. aggregate for each year. Blue points fall below the released-model numerical cold-plate/single-phase crossover. These are direct-generation scenarios, not consumption LCIs or state cooling LCAs." title="OpenDC-LCA Figure 3"/>
             <wp:cNvGraphicFramePr>
               <a:graphicFrameLocks noChangeAspect="1"/>
             </wp:cNvGraphicFramePr>
@@ -3004,7 +2806,7 @@
           <w:rFonts w:ascii="Calibri" w:hAnsi="Calibri"/>
           <w:sz w:val="18"/>
         </w:rPr>
-        <w:t>Figure 3. Harmonized AR5-GWP100 eGRID state/DC generation rates for nine releases, with electricity intensity on the horizontal axis in kg CO2e/MWh. The orange polyline connects the reported provider U.S. aggregate for each year; blue points fall below the released-model numerical cold-plate/single-phase crossover. These are direct-generation scenarios, not consumption LCIs or state cooling LCAs.</w:t>
+        <w:t>Figure 3. Harmonized AR5-GWP100 eGRID state/DC generation rates for nine releases, with electricity intensity on the horizontal axis in kg CO2e/MWh. The orange polyline connects the reported provider U.S. aggregate for each year. Blue points fall below the released-model numerical cold-plate/single-phase crossover. These are direct-generation scenarios, not consumption LCIs or state cooling LCAs.</w:t>
       </w:r>
     </w:p>
     <w:p>
@@ -3021,7 +2823,7 @@
           <w:rFonts w:ascii="Calibri" w:hAnsi="Calibri"/>
           <w:sz w:val="21"/>
         </w:rPr>
-        <w:t>The 71 non-residual Federal LCA Commons systems ranged from 0.921 to 987.844 kg CO2e/MWh. The national linked-system factor was 422.931 kg CO2e/MWh: 369.848 from electricity-generation processes and 53.084 from other linked upstream and infrastructure processes. It exceeded the 2023 national eGRID direct-generation rate by 73.264 kg CO2e/MWh, although the difference also contains consumption-mix, delivery-loss, flow-coverage, and boundary effects and is not an isolated upstream correction.</w:t>
+        <w:t>The 71 non-residual Federal LCA Commons systems ranged from 0.921 to 987.844 kg CO2e/MWh. The national linked-system factor was 422.931 kg CO2e/MWh. It comprised 369.848 from electricity-generation processes and 53.084 from other linked upstream and infrastructure processes. It exceeded the 2023 national eGRID direct-generation rate by 73.264 kg CO2e/MWh, although the difference also contains consumption-mix, delivery-loss, flow-coverage, and boundary effects and is not an isolated upstream correction.</w:t>
       </w:r>
     </w:p>
     <w:p>
@@ -3030,7 +2832,7 @@
           <w:rFonts w:ascii="Calibri" w:hAnsi="Calibri"/>
           <w:sz w:val="21"/>
         </w:rPr>
-        <w:t>All 10 FERC-region systems exceeded the 96.704 kg CO2e/MWh numerical cold-plate/single-phase crossover; they ranged from 238.897 kg CO2e/MWh for NYISO to 557.110 kg CO2e/MWh for MISO. Ten of 60 balancing-authority systems fell below the crossover, and 15 of all 71 systems exceeded the released high anchor of 524.893 kg CO2e/MWh. The numerical cooling screen placed two-phase first in all 71 systems, but this is not a common-method comparative LCA because the cooling foreground method remains unresolved.</w:t>
+        <w:t>All 10 FERC-region systems exceeded the 96.704 kg CO2e/MWh numerical cold-plate/single-phase crossover. Their factors ranged from 238.897 kg CO2e/MWh for NYISO to 557.110 kg CO2e/MWh for MISO. Ten of 60 balancing-authority systems fell below the crossover, and 15 of all 71 systems exceeded the released high anchor of 524.893 kg CO2e/MWh. The numerical cooling screen placed two-phase first in all 71 systems, but this is not a common-method comparative LCA because the cooling foreground method remains unresolved.</w:t>
       </w:r>
     </w:p>
     <w:p>
@@ -3061,7 +2863,7 @@
         <w:drawing>
           <wp:inline xmlns:a="http://schemas.openxmlformats.org/drawingml/2006/main" xmlns:pic="http://schemas.openxmlformats.org/drawingml/2006/picture">
             <wp:extent cx="5897880" cy="4030218"/>
-            <wp:docPr id="4" name="Picture 4" descr="Figure 4. IPCC AR5-GWP100 partial linked-system electricity factors for 10 FERC regions and the United States. The horizontal axis is kg CO2e/MWh delivered at the user. Bars separate generation-process impacts from other linked upstream and infrastructure impacts. The green dashed line marks the 96.704 kg CO2e/MWh cold-plate/single-phase numerical crossover; the purple dashed line marks the 524.893 kg CO2e/MWh released high numerical anchor. Neither line creates method equivalence." title="OpenDC-LCA Figure 4"/>
+            <wp:docPr id="4" name="Picture 4" descr="Figure 4. IPCC AR5-GWP100 partial linked-system electricity factors for 10 FERC regions and the United States. The horizontal axis is kg CO2e/MWh delivered at the user. Bars separate generation-process impacts from other linked upstream and infrastructure impacts. The green dashed line marks the 96.704 kg CO2e/MWh cold-plate/single-phase numerical crossover. The purple dashed line marks the 524.893 kg CO2e/MWh released high numerical anchor. Neither line creates method equivalence." title="OpenDC-LCA Figure 4"/>
             <wp:cNvGraphicFramePr>
               <a:graphicFrameLocks noChangeAspect="1"/>
             </wp:cNvGraphicFramePr>
@@ -3101,7 +2903,7 @@
           <w:rFonts w:ascii="Calibri" w:hAnsi="Calibri"/>
           <w:sz w:val="18"/>
         </w:rPr>
-        <w:t>Figure 4. IPCC AR5-GWP100 partial linked-system electricity factors for 10 FERC regions and the United States. The horizontal axis is kg CO2e/MWh delivered at the user. Bars separate generation-process impacts from other linked upstream and infrastructure impacts. The green dashed line marks the 96.704 kg CO2e/MWh cold-plate/single-phase numerical crossover; the purple dashed line marks the 524.893 kg CO2e/MWh released high numerical anchor. Neither line creates method equivalence.</w:t>
+        <w:t>Figure 4. IPCC AR5-GWP100 partial linked-system electricity factors for 10 FERC regions and the United States. The horizontal axis is kg CO2e/MWh delivered at the user. Bars separate generation-process impacts from other linked upstream and infrastructure impacts. The green dashed line marks the 96.704 kg CO2e/MWh cold-plate/single-phase numerical crossover. The purple dashed line marks the 524.893 kg CO2e/MWh released high numerical anchor. Neither line creates method equivalence.</w:t>
       </w:r>
     </w:p>
     <w:p>
@@ -3127,7 +2929,7 @@
           <w:rFonts w:ascii="Calibri" w:hAnsi="Calibri"/>
           <w:sz w:val="21"/>
         </w:rPr>
-        <w:t>Across all 71 electricity contexts, the all-block critical half-width ranged from 1.123% at PUD No. 1 of Douglas County to 1.479% at Duke Energy Progress West. At the lowest-carbon system, the critical competitor was cold plate; the embodied-only and service-only thresholds were 2.291% and 2.246%, while use-phase and shared-grid changes did not reverse rank through 99.999%. The ranking is numerically fragile even though it survives every unperturbed electricity factor.</w:t>
+        <w:t>Across all 71 electricity contexts, the all-block critical half-width ranged from 1.123% at PUD No. 1 of Douglas County to 1.479% at Duke Energy Progress West. At the lowest-carbon system, the critical competitor was cold plate. the embodied-only and service-only thresholds were 2.291% and 2.246%, while use-phase and shared-grid changes did not reverse rank through 99.999%. The ranking is numerically fragile even though it survives every unperturbed electricity factor.</w:t>
       </w:r>
     </w:p>
     <w:p>
@@ -3136,7 +2938,7 @@
           <w:rFonts w:ascii="Calibri" w:hAnsi="Calibri"/>
           <w:sz w:val="21"/>
         </w:rPr>
-        <w:t>This equalized analysis reverses one conclusion from the earlier triangular stress design. Embodied variation had appeared to cause the largest rank loss because its assigned half-width was 10 times those of use phase and service. At equal widths, embodied burden has the largest national one-block tolerance; service equivalence and use phase are limiting. The earlier stress frequencies and their dependence/convergence diagnostics remain in the Supplementary Information as evidence about the chosen design, not the technologies.</w:t>
+        <w:t>This equalized analysis reverses one conclusion from the earlier triangular stress design. Embodied variation had appeared to cause the largest rank loss because its assigned half-width was 10 times those of use phase and service. At equal widths, embodied burden has the largest national one-block tolerance. service equivalence and use phase are limiting. The earlier stress frequencies and their dependence/convergence diagnostics remain in the Supplementary Information as evidence about the chosen design, not the technologies.</w:t>
       </w:r>
     </w:p>
     <w:p>
@@ -3145,7 +2947,7 @@
           <w:rFonts w:ascii="Calibri" w:hAnsi="Calibri"/>
           <w:sz w:val="21"/>
         </w:rPr>
-        <w:t>The one-sided functional-unit diagnostic gives a complementary threshold: across 2023 direct-rate contexts, a 5.24-6.04% adverse correction to two-phase impact per equivalent useful computation would erase its numerical first rank. This is a break-even requirement for future measurements, not an observed performance difference.</w:t>
+        <w:t>The one-sided functional-unit diagnostic gives a complementary threshold. across 2023 direct-rate contexts, a 5.24-6.04% adverse correction to two-phase impact per equivalent useful computation would erase its numerical first rank. This is a break-even requirement for future measurements, not an observed performance difference.</w:t>
       </w:r>
     </w:p>
     <w:p>
@@ -3230,7 +3032,7 @@
           <w:rFonts w:ascii="Calibri" w:hAnsi="Calibri"/>
           <w:sz w:val="21"/>
         </w:rPr>
-        <w:t xml:space="preserve"> candidates, 48 included records spanned 465-2,503 kg CO2e/server for manufacturing, a 5.38-fold range. Annualized values spanned 116-626 kg CO2e/server-year. Commonly scaling the released server-related contributions across the empirical 0.38-2.06-fold annualized envelope did not change the deterministic two-phase first rank. That result is a structural stress only: it does not model architecture-specific server count, configuration, throughput, or lifetime.</w:t>
+        <w:t xml:space="preserve"> candidates, 48 included records spanned 465-2,503 kg CO2e/server for manufacturing, a 5.38-fold range. Annualized values spanned 116-626 kg CO2e/server-year. Commonly scaling the released server-related contributions across the empirical 0.38-2.06-fold annualized envelope did not change the deterministic two-phase first rank. That result is a structural stress only. it does not model architecture-specific server count, configuration, throughput, or lifetime.</w:t>
       </w:r>
     </w:p>
     <w:p>
@@ -3256,7 +3058,7 @@
           <w:rFonts w:ascii="Calibri" w:hAnsi="Calibri"/>
           <w:sz w:val="21"/>
         </w:rPr>
-        <w:t>Under the base contribution-times-weakness index, use phase was the highest priority, followed by storage, networking, and compute-server evidence. Across the nine alternative exponent combinations, use phase ranked first in eight and in the top three in eight. Networking ranked first once; storage was in the top three in all nine; compute was in the top three in four. The rank of use phase ranged from first to fourth.</w:t>
+        <w:t>Under the base contribution-times-weakness index, use phase was the highest priority, followed by storage, networking, and compute-server evidence. Across the nine alternative exponent combinations, use phase ranked first in eight and in the top three in eight. Networking ranked first once. Storage was in the top three in all nine. Compute was in the top three in four. The rank of use phase ranged from first to fourth.</w:t>
       </w:r>
     </w:p>
     <w:p>
@@ -3282,7 +3084,7 @@
           <w:rFonts w:ascii="Calibri" w:hAnsi="Calibri"/>
           <w:sz w:val="21"/>
         </w:rPr>
-        <w:t>The full local test suite covers calculation, fluid mass conservation, interoperability, reliability, public-data parsing, practitioner workflow, GUI/API parity, endpoint reconstruction, eGRID harmonization, Federal LCA Commons process-system solution, cutoff reporting, equal-width robustness, comparison incompatibility, field-level lineage, stress-design determinism, and provenance integrity. Paper-reconstruction tests skip explicitly when locally held provider files are absent; no substitute values are inserted.</w:t>
+        <w:t>The full local test suite covers calculation, fluid mass conservation, interoperability, reliability, public-data parsing, practitioner workflow, GUI/API parity, endpoint reconstruction, eGRID harmonization, Federal LCA Commons process-system solution, cutoff reporting, equal-width robustness, comparison incompatibility, field-level lineage, stress-design determinism, and provenance integrity. Paper-reconstruction tests skip explicitly when locally held provider files are absent. No substitute values are inserted.</w:t>
       </w:r>
     </w:p>
     <w:p>
@@ -3316,7 +3118,7 @@
           <w:rFonts w:ascii="Calibri" w:hAnsi="Calibri"/>
           <w:sz w:val="21"/>
         </w:rPr>
-        <w:t>The released table and every unperturbed electricity screen place two-phase first. Three independent findings prevent that order from becoming a public comparative conclusion: the archive does not resolve the climate method of the numeric electricity endpoints; the cooling foreground cannot be recalculated under the same AR5 method as the electricity inventories; and useful computation has not been measured across the four architectures. The most important outcome is the boundary between reproduced arithmetic and a physically identified comparison.</w:t>
+        <w:t>The released table and every unperturbed electricity screen place two-phase first. Three independent findings prevent that order from becoming a public comparative conclusion. First, the archive does not resolve the climate method of the numeric electricity endpoints. Second, the cooling foreground cannot be recalculated under the same AR5 method as the electricity inventories. Third, useful computation has not been measured across the four architectures. The most important outcome is the boundary between reproduced arithmetic and a physically identified comparison.</w:t>
       </w:r>
     </w:p>
     <w:p>
@@ -3325,7 +3127,7 @@
           <w:rFonts w:ascii="Calibri" w:hAnsi="Calibri"/>
           <w:sz w:val="21"/>
         </w:rPr>
-        <w:t>The 96.704 kg CO2e/MWh cold-plate/single-phase crossover is a property of two released numerical endpoints. It helps locate where their affine lines cross, but it is not an environmental threshold for a real site. Likewise, survival across 71 electricity factors explores one background dimension; it does not provide 71 independent observations of cooling performance. A transferable assessment must report the numerical result together with its functional unit, method identity, system boundary, cutoff structure, robustness definition, and claim status.</w:t>
+        <w:t>The 96.704 kg CO2e/MWh cold-plate/single-phase crossover is a property of two released numerical endpoints. It helps locate where their affine lines cross, but it is not an environmental threshold for a real site. Likewise, survival across 71 electricity factors explores one background dimension. It does not provide 71 independent observations of cooling performance. A transferable assessment must report the numerical result together with its functional unit, method identity, system boundary, cutoff structure, robustness definition, and claim status.</w:t>
       </w:r>
     </w:p>
     <w:p>
@@ -3377,7 +3179,7 @@
           <w:rFonts w:ascii="Calibri" w:hAnsi="Calibri"/>
           <w:sz w:val="21"/>
         </w:rPr>
-        <w:t>The all-block threshold of 1.32% is not a confidence bound. It is the radius of a specified box in which a shared grid multiplier and adverse technology-specific foreground multipliers cannot reverse the numerical first rank. Its value lies in falsifiability: any proposed empirical uncertainty model can be compared against the same bound structure. A probability of rank would additionally require measured marginal distributions and correlations [30].</w:t>
+        <w:t>The all-block threshold of 1.32% is not a confidence bound. It is the radius of a specified box in which a shared grid multiplier and adverse technology-specific foreground multipliers cannot reverse the numerical first rank. Its value lies in falsifiability. Any proposed empirical uncertainty model can be compared against the same bound structure. A probability of rank would additionally require measured marginal distributions and correlations [30].</w:t>
       </w:r>
     </w:p>
     <w:p>
@@ -3412,7 +3214,7 @@
           <w:rFonts w:ascii="Calibri" w:hAnsi="Calibri"/>
           <w:sz w:val="21"/>
         </w:rPr>
-        <w:t>A shared protocol should measure, for every architecture, completed workload or benchmark output; IT and cooling power; inlet and component temperatures; flow and pressure drop; fan, pump, CDU and heat-rejection power; onsite water; failure and maintenance events; and uncertainty/calibration lineage over the same load-weather domain. Server count, configuration, and replacement must be tracked with that performance. A thermal result without useful computation cannot close the LCA functional unit; a product carbon footprint without architecture quantity cannot close the embodied inventory.</w:t>
+        <w:t>A shared protocol should collect several forms of evidence for every architecture. It should measure i) completed workload or benchmark output, ii) IT and cooling power, and iii) inlet and component temperatures together with flow and pressure drop. It should also record iv) fan, pump, cooling distribution unit, and heat-rejection power, v) onsite water use and failure/maintenance events, and vi) uncertainty and calibration lineage over the same load-weather domain. Server count, configuration, and replacement must be tracked with that performance. A thermal result without useful computation cannot close the LCA functional unit. A product carbon footprint without architecture quantity cannot close the embodied inventory.</w:t>
       </w:r>
     </w:p>
     <w:p>
@@ -3429,7 +3231,7 @@
           <w:rFonts w:ascii="Calibri" w:hAnsi="Calibri"/>
           <w:sz w:val="21"/>
         </w:rPr>
-        <w:t>The national analysis shows a dual effect. Cleaner generation lowers every electricity-dependent cooling result and contracts the absolute value of operational efficiency, while increasing the fraction supplied by embodied terms. Percentage savings alone hide this transition: the absolute modeled two-phase-versus-air benefit fell 29.45% between the 2012 and 2023 generation conditions.</w:t>
+        <w:t>The national analysis shows a dual effect. Cleaner generation lowers every electricity-dependent cooling result and contracts the absolute value of operational efficiency, while increasing the fraction supplied by embodied terms. Percentage savings alone hide this transition. The absolute modeled two-phase-versus-air benefit fell 29.45% between the 2012 and 2023 generation conditions.</w:t>
       </w:r>
     </w:p>
     <w:p>
@@ -3438,7 +3240,7 @@
           <w:rFonts w:ascii="Calibri" w:hAnsi="Calibri"/>
           <w:sz w:val="21"/>
         </w:rPr>
-        <w:t>This shift explains why the Boavizta and ÖKOBAUDAT datasets matter even though they were not inserted into architecture totals. The 5.38-fold server manufacturing range is larger than many cooling differences, but heterogeneous PCFs cannot be treated as an uncertainty distribution for interchangeable servers. The approximately 50-60% material-route GHG levers are large per kilogram, but kilograms by architecture are missing. The needed research product is a linked foreground dataset: useful computation, server configuration and lifetime, cooling bill of quantities, material route, and measured operation under one functional unit.</w:t>
+        <w:t>This shift explains why the Boavizta and ÖKOBAUDAT datasets matter even though they were not inserted into architecture totals. The 5.38-fold server manufacturing range is larger than many cooling differences, but heterogeneous PCFs cannot be treated as an uncertainty distribution for interchangeable servers. The approximately 50-60% material-route GHG levers are large per kilogram, but kilograms by architecture are missing. The needed research product is a linked foreground dataset that combines useful computation, server configuration and lifetime, cooling bill of quantities, material route, and measured operation under one functional unit.</w:t>
       </w:r>
     </w:p>
     <w:p>
@@ -3455,121 +3257,25 @@
           <w:rFonts w:ascii="Calibri" w:hAnsi="Calibri"/>
           <w:sz w:val="21"/>
         </w:rPr>
-        <w:t>OpenDC-LCA does not replace openLCA, Brightway, Temporalis, premise, or bw_timex. Those tools provide process-network calculation, database management, prospective backgrounds, or time-explicit LCA [27-29,37,38]. The assessment layer here adds:</w:t>
+        <w:t>OpenDC-LCA does not replace openLCA, Brightway, Temporalis, premise, or bw_timex. Those tools provide process-network calculation, database management, prospective backgrounds, or time-explicit LCA [27-29,37,38]. The assessment layer adds six functions. First, it checks functional equivalence against useful computation. Second, it represents load-weather cooling performance and performs bounded annual integration. Third, it represents reliability, replacement, and cooling fluids. Fourth, it separates lifecycle electricity, direct generation rates, market instruments, and marginal signals. Fifth, it preserves source and transformation provenance. Finally, its automated metadata validator blocks declared comparisons with incompatible methods, boundaries, or source mappings.</w:t>
       </w:r>
     </w:p>
     <w:p>
-      <w:pPr>
-        <w:spacing w:after="60"/>
-        <w:ind w:left="374" w:hanging="288"/>
-      </w:pPr>
-      <w:r>
-        <w:rPr>
-          <w:rFonts w:ascii="Calibri" w:hAnsi="Calibri"/>
-          <w:sz w:val="21"/>
-        </w:rPr>
-        <w:t>1. a functional-equivalence check tied to useful computation;</w:t>
+      <w:r>
+        <w:rPr>
+          <w:rFonts w:ascii="Calibri" w:hAnsi="Calibri"/>
+          <w:sz w:val="21"/>
+        </w:rPr>
+        <w:t>The validator is deliberately narrower than a scientific review. It trusts the metadata supplied by the user and cannot determine whether a performance map is representative, a distribution is empirical, or an external review occurred. Its role is to catch machine-detectable incompatibilities before calculation, not to authorize a public environmental claim.</w:t>
       </w:r>
     </w:p>
     <w:p>
-      <w:pPr>
-        <w:spacing w:after="60"/>
-        <w:ind w:left="374" w:hanging="288"/>
-      </w:pPr>
-      <w:r>
-        <w:rPr>
-          <w:rFonts w:ascii="Calibri" w:hAnsi="Calibri"/>
-          <w:sz w:val="21"/>
-        </w:rPr>
-        <w:t>2. load-weather cooling performance and bounded annual integration;</w:t>
-      </w:r>
-    </w:p>
-    <w:p>
-      <w:pPr>
-        <w:spacing w:after="60"/>
-        <w:ind w:left="374" w:hanging="288"/>
-      </w:pPr>
-      <w:r>
-        <w:rPr>
-          <w:rFonts w:ascii="Calibri" w:hAnsi="Calibri"/>
-          <w:sz w:val="21"/>
-        </w:rPr>
-        <w:t>3. reliability, replacement, and cooling-fluid representations;</w:t>
-      </w:r>
-    </w:p>
-    <w:p>
-      <w:pPr>
-        <w:spacing w:after="60"/>
-        <w:ind w:left="374" w:hanging="288"/>
-      </w:pPr>
-      <w:r>
-        <w:rPr>
-          <w:rFonts w:ascii="Calibri" w:hAnsi="Calibri"/>
-          <w:sz w:val="21"/>
-        </w:rPr>
-        <w:t>4. explicit separation of lifecycle electricity, direct generation rates,</w:t>
-      </w:r>
-    </w:p>
-    <w:p>
-      <w:r>
-        <w:rPr>
-          <w:rFonts w:ascii="Calibri" w:hAnsi="Calibri"/>
-          <w:sz w:val="21"/>
-        </w:rPr>
-        <w:t>market instruments, and marginal signals;</w:t>
-      </w:r>
-    </w:p>
-    <w:p>
-      <w:pPr>
-        <w:spacing w:after="60"/>
-        <w:ind w:left="374" w:hanging="288"/>
-      </w:pPr>
-      <w:r>
-        <w:rPr>
-          <w:rFonts w:ascii="Calibri" w:hAnsi="Calibri"/>
-          <w:sz w:val="21"/>
-        </w:rPr>
-        <w:t>5. source and transformation provenance; and</w:t>
-      </w:r>
-    </w:p>
-    <w:p>
-      <w:pPr>
-        <w:spacing w:after="60"/>
-        <w:ind w:left="374" w:hanging="288"/>
-      </w:pPr>
-      <w:r>
-        <w:rPr>
-          <w:rFonts w:ascii="Calibri" w:hAnsi="Calibri"/>
-          <w:sz w:val="21"/>
-        </w:rPr>
-        <w:t>6. an automated metadata validator that blocks declared comparisons with</w:t>
-      </w:r>
-    </w:p>
-    <w:p>
-      <w:r>
-        <w:rPr>
-          <w:rFonts w:ascii="Calibri" w:hAnsi="Calibri"/>
-          <w:sz w:val="21"/>
-        </w:rPr>
-        <w:t>incompatible methods, boundaries, or source mappings.</w:t>
-      </w:r>
-    </w:p>
-    <w:p>
-      <w:r>
-        <w:rPr>
-          <w:rFonts w:ascii="Calibri" w:hAnsi="Calibri"/>
-          <w:sz w:val="21"/>
-        </w:rPr>
-        <w:t>The validator is deliberately narrower than a scientific review. It trusts the metadata supplied by the user and cannot determine whether a performance map is representative, a distribution is empirical, or an external review occurred. Its role is to catch machine-detectable incompatibilities before calculation, not to authorize a public environmental claim.</w:t>
-      </w:r>
-    </w:p>
-    <w:p>
-      <w:r>
-        <w:rPr>
-          <w:rFonts w:ascii="Calibri" w:hAnsi="Calibri"/>
-          <w:sz w:val="21"/>
-        </w:rPr>
-        <w:t>This role also differs from recent data-center models. AlphaDataCenterCooling provides operational validation of a cooling plant [17], while d'Orgeval et al. compare full data-center architectures and, for a subset, normalize by computational performance [16]. The present work tests whether published secondary LCA results retain their meaning when moved across electricity datasets and claim contexts; it does not duplicate either primary modeling capability.</w:t>
+      <w:r>
+        <w:rPr>
+          <w:rFonts w:ascii="Calibri" w:hAnsi="Calibri"/>
+          <w:sz w:val="21"/>
+        </w:rPr>
+        <w:t>This role also differs from recent data-center models. AlphaDataCenterCooling provides operational validation of a cooling plant [17], while d'Orgeval et al. compare full data-center architectures and, for a subset, normalize by computational performance [16]. The present work tests whether published secondary LCA results retain their meaning when moved across electricity datasets and claim contexts. It does not duplicate either primary modeling capability.</w:t>
       </w:r>
     </w:p>
     <w:p>
@@ -3595,108 +3301,7 @@
           <w:rFonts w:ascii="Calibri" w:hAnsi="Calibri"/>
           <w:sz w:val="21"/>
         </w:rPr>
-        <w:t>The most useful extension of the Microsoft/WSP work is not another static national scenario. It is a jointly governed evidence package that allows the released model to be updated without weakening its functional-unit insight. Five additions are needed:</w:t>
-      </w:r>
-    </w:p>
-    <w:p>
-      <w:pPr>
-        <w:spacing w:after="60"/>
-        <w:ind w:left="374" w:hanging="288"/>
-      </w:pPr>
-      <w:r>
-        <w:rPr>
-          <w:rFonts w:ascii="Calibri" w:hAnsi="Calibri"/>
-          <w:sz w:val="21"/>
-        </w:rPr>
-        <w:t>1. the original GWP100 electricity factors or elementary-flow inventories</w:t>
-      </w:r>
-    </w:p>
-    <w:p>
-      <w:r>
-        <w:rPr>
-          <w:rFonts w:ascii="Calibri" w:hAnsi="Calibri"/>
-          <w:sz w:val="21"/>
-        </w:rPr>
-        <w:t>needed to resolve the public workbook's blank F29 cells;</w:t>
-      </w:r>
-    </w:p>
-    <w:p>
-      <w:pPr>
-        <w:spacing w:after="60"/>
-        <w:ind w:left="374" w:hanging="288"/>
-      </w:pPr>
-      <w:r>
-        <w:rPr>
-          <w:rFonts w:ascii="Calibri" w:hAnsi="Calibri"/>
-          <w:sz w:val="21"/>
-        </w:rPr>
-        <w:t>2. architecture-specific, anonymized bills of quantities and service lives;</w:t>
-      </w:r>
-    </w:p>
-    <w:p>
-      <w:pPr>
-        <w:spacing w:after="60"/>
-        <w:ind w:left="374" w:hanging="288"/>
-      </w:pPr>
-      <w:r>
-        <w:rPr>
-          <w:rFonts w:ascii="Calibri" w:hAnsi="Calibri"/>
-          <w:sz w:val="21"/>
-        </w:rPr>
-        <w:t>3. measured performance surfaces for IT output, server power, facility</w:t>
-      </w:r>
-    </w:p>
-    <w:p>
-      <w:r>
-        <w:rPr>
-          <w:rFonts w:ascii="Calibri" w:hAnsi="Calibri"/>
-          <w:sz w:val="21"/>
-        </w:rPr>
-        <w:t>parasitics, and onsite water across load and weather;</w:t>
-      </w:r>
-    </w:p>
-    <w:p>
-      <w:pPr>
-        <w:spacing w:after="60"/>
-        <w:ind w:left="374" w:hanging="288"/>
-      </w:pPr>
-      <w:r>
-        <w:rPr>
-          <w:rFonts w:ascii="Calibri" w:hAnsi="Calibri"/>
-          <w:sz w:val="21"/>
-        </w:rPr>
-        <w:t>4. a complete provider-linked lifecycle electricity model under the same LCIA</w:t>
-      </w:r>
-    </w:p>
-    <w:p>
-      <w:r>
-        <w:rPr>
-          <w:rFonts w:ascii="Calibri" w:hAnsi="Calibri"/>
-          <w:sz w:val="21"/>
-        </w:rPr>
-        <w:t>method, with cutoffs linked or bounded and location-, market-, and marginal operational signals reported separately; and</w:t>
-      </w:r>
-    </w:p>
-    <w:p>
-      <w:pPr>
-        <w:spacing w:after="60"/>
-        <w:ind w:left="374" w:hanging="288"/>
-      </w:pPr>
-      <w:r>
-        <w:rPr>
-          <w:rFonts w:ascii="Calibri" w:hAnsi="Calibri"/>
-          <w:sz w:val="21"/>
-        </w:rPr>
-        <w:t>5. empirical uncertainty and correlation information sufficient for rank</w:t>
-      </w:r>
-    </w:p>
-    <w:p>
-      <w:r>
-        <w:rPr>
-          <w:rFonts w:ascii="Calibri" w:hAnsi="Calibri"/>
-          <w:sz w:val="21"/>
-        </w:rPr>
-        <w:t>probability and value-of-information analysis.</w:t>
+        <w:t>The most useful extension of the Microsoft/WSP work is not another static national scenario. It is a jointly governed evidence package that allows the released model to be updated without weakening its functional-unit insight. Five additions are needed. First, the original GWP100 electricity factors or elementary-flow inventories are needed to resolve the public workbook's blank F29 cells. Second, the package requires architecture-specific, anonymized bills of quantities and service lives. Third, it requires measured performance surfaces for IT output, server power, facility parasitics, and onsite water across load and weather. Fourth, it requires a complete provider-linked lifecycle electricity model under the same LCIA method, with cutoffs linked or bounded and with location-based, market-based, and marginal operational signals reported separately. Finally, empirical uncertainty and correlation information are needed for rank-probability and value-of-information analyses.</w:t>
       </w:r>
     </w:p>
     <w:p>
@@ -3722,7 +3327,7 @@
           <w:rFonts w:ascii="Calibri" w:hAnsi="Calibri"/>
           <w:sz w:val="21"/>
         </w:rPr>
-        <w:t>The analysis remains secondary. It does not recreate proprietary background inventories, confidential bills of quantities, the full virtual-core model, or measured hyperscale operation. Equation (8) uses a numerical axis whose climate-method identity is unresolved in the public archive. The Federal LCA Commons factors contain 287 national unlinked technosphere exchanges; the custom solver has not been independently reproduced in openLCA or Brightway. The additive allowance, triangular marginals, and copula dependence cases are secondary diagnostics, not estimates. The convergence check limits numerical sampling error within those designs; it does not reduce epistemic uncertainty in the ranges, dependence structure, cutoffs, or foreground model. eGRID state rates omit consumption transfers, contracts, hourly dispatch, and marginal effects.</w:t>
+        <w:t>The analysis remains secondary. It does not recreate proprietary background inventories, confidential bills of quantities, the full virtual-core model, or measured hyperscale operation. Equation (8) uses a numerical axis whose climate-method identity is unresolved in the public archive. The Federal LCA Commons factors contain 287 national unlinked technosphere exchanges. The custom solver has not been independently reproduced in openLCA or Brightway. The additive allowance, triangular marginals, and copula dependence cases are secondary diagnostics, not estimates. The convergence check limits numerical sampling error within those designs. It does not reduce epistemic uncertainty in the ranges, dependence structure, cutoffs, or foreground model. eGRID state rates omit consumption transfers, contracts, hourly dispatch, and marginal effects.</w:t>
       </w:r>
     </w:p>
     <w:p>
@@ -3757,7 +3362,7 @@
           <w:rFonts w:ascii="Calibri" w:hAnsi="Calibri"/>
           <w:sz w:val="21"/>
         </w:rPr>
-        <w:t>This assessment separates three evidence levels that had previously been combined: reproduced source arithmetic, direct-generation trend analysis, and conditional cooling screens. All 24 published totals were arithmetically reproduced, but the public archive does not resolve whether the two numeric electricity endpoints used by the screening axis are AR5 GWP100 or GTP100. Cooling ranks derived from that axis cannot be interpreted as common-method comparative LCA results.</w:t>
+        <w:t>This assessment separates three evidence levels that had previously been combined. These levels are reproduced source arithmetic, direct-generation trend analysis, and conditional cooling screens. All 24 published totals were arithmetically reproduced, but the public archive does not resolve whether the two numeric electricity endpoints used by the screening axis are AR5 GWP100 or GTP100. Cooling ranks derived from that axis cannot be interpreted as common-method comparative LCA results.</w:t>
       </w:r>
     </w:p>
     <w:p>
@@ -3775,7 +3380,7 @@
           <w:rFonts w:ascii="Calibri" w:hAnsi="Calibri"/>
           <w:sz w:val="21"/>
         </w:rPr>
-        <w:t>Equal-width robustness analysis corrected the earlier attribution of rank loss to embodied variation. At the national lifecycle factor, the first-rank screen failed at 2.64% service-equivalence variation, 2.99% use-phase variation, and 22.15% embodied variation; simultaneous equal-width changes failed at 1.32%. The dominant near-term evidence needs are architecture-resolved useful computation and use-phase demand, followed by complete bills of quantities and common-method inventories.</w:t>
+        <w:t>Equal-width robustness analysis corrected the earlier attribution of rank loss to embodied variation. At the national lifecycle factor, the first-rank screen failed at 2.64% service-equivalence variation, 2.99% use-phase variation, and 22.15% embodied variation. Simultaneous equal-width changes failed at 1.32%. The dominant near-term evidence needs are architecture-resolved useful computation and use-phase demand, followed by complete bills of quantities and common-method inventories.</w:t>
       </w:r>
     </w:p>
     <w:p>
@@ -3784,7 +3389,7 @@
           <w:rFonts w:ascii="Calibri" w:hAnsi="Calibri"/>
           <w:sz w:val="21"/>
         </w:rPr>
-        <w:t>The OpenDC-LCA validator rejects configured comparisons whose declared metadata contain mismatched functional units, boundaries, electricity accounting, LCIA methods, or missing field-level source mappings. This check detects declared incompatibilities but does not verify the underlying science. The study is suitable as a transferability Technology Assessment; it does not support a public claim of environmental superiority among cooling architectures.</w:t>
+        <w:t>The OpenDC-LCA validator rejects configured comparisons whose declared metadata contain mismatched functional units, boundaries, electricity accounting, LCIA methods, or missing field-level source mappings. This check detects declared incompatibilities but does not verify the underlying science. The study is suitable as a transferability Technology Assessment. It does not support a public claim of environmental superiority among cooling architectures.</w:t>
       </w:r>
     </w:p>
     <w:p>
@@ -3801,7 +3406,7 @@
           <w:rFonts w:ascii="Calibri" w:hAnsi="Calibri"/>
           <w:sz w:val="21"/>
         </w:rPr>
-        <w:t>OpenDC-LCA version 1.1.0 is publicly available at https://github.com/UARK-NED3/OpenDC-LCA and https://github.com/UARK-NED3/OpenDC-LCA/releases/tag/v1.1.0. The development revision evaluated here adds the Federal LCA Commons solver, cutoff reporting, equal-width robustness certificates, and comparison-level metadata checks; it will be tagged and archived before submission. Analysis metadata and the provider-file manifest record file sizes and SHA-256 checksums. Provider-native files remain outside Git when redistribution permission is unclear or a large upstream archive has not been reviewed for redistribution. The Microsoft archive, eGRID files, Federal LCA Commons baseline and method, and NOAA data are available from their public providers [15,40-42,45]. No DOI-bearing software archive is available at the time of this draft.</w:t>
+        <w:t>OpenDC-LCA version 1.1.0 is publicly available at https://github.com/UARK-NED3/OpenDC-LCA and https://github.com/UARK-NED3/OpenDC-LCA/releases/tag/v1.1.0. The development revision evaluated here adds the Federal LCA Commons solver, cutoff reporting, equal-width robustness certificates, and comparison-level metadata checks. It will be tagged and archived before submission. Analysis metadata and the provider-file manifest record file sizes and SHA-256 checksums. Provider-native files remain outside Git when redistribution permission is unclear or a large upstream archive has not been reviewed for redistribution. The Microsoft archive, eGRID files, Federal LCA Commons baseline and method, and NOAA data are available from their public providers [15,40-42,45]. No DOI-bearing software archive is available at the time of this draft.</w:t>
       </w:r>
     </w:p>
     <w:p>
@@ -3835,7 +3440,7 @@
           <w:rFonts w:ascii="Calibri" w:hAnsi="Calibri"/>
           <w:sz w:val="21"/>
         </w:rPr>
-        <w:t>This secondary study used public or author-held engineering datasets and did not involve human participants or animals; research-ethics approval was not required.</w:t>
+        <w:t>This secondary study used public or author-held engineering datasets and did not involve human participants or animals. Research-ethics approval was not required.</w:t>
       </w:r>
     </w:p>
     <w:p>

</xml_diff>

<commit_message>
Make figure and table references descriptive
</commit_message>
<xml_diff>
--- a/paper/OpenDC-LCA_manuscript.docx
+++ b/paper/OpenDC-LCA_manuscript.docx
@@ -119,7 +119,7 @@
           <w:rFonts w:ascii="Calibri" w:hAnsi="Calibri"/>
           <w:sz w:val="21"/>
         </w:rPr>
-        <w:t>Published data-center cooling life-cycle assessments (LCAs) are difficult to transfer because electricity boundaries, climate methods, useful-computation equivalence, and foreground inventories differ. This Technology Assessment uses OpenDC-LCA, an open-source evidence-audit and comparison-validation tool, to test which conclusions from the released Microsoft/WSP comparison remain supportable. We reconstructed 24 totals, harmonized nine U.S. Environmental Protection Agency Emissions &amp; Generation Resource Integrated Database (eGRID) releases to the Intergovernmental Panel on Climate Change Fifth Assessment Report 100-year global warming potential (AR5 GWP100), and calculated 71 non-residual 2023 Federal LCA Commons electricity-consumption systems. The article reports AR5 GWP100, but its archived workbook places the numeric electricity endpoints in 100-year global temperature-change-potential (GTP100) cells while the corresponding GWP100 cells are blank. Formulas point to those blank cells. We therefore retain cooling totals only as numerical transferability screens. The harmonized national direct-generation factor declined 32.46%, from 517.73 to 349.67 kg carbon dioxide equivalent per megawatt-hour between 2012 and 2023. The partial linked national consumption system yielded 422.93 kg carbon dioxide equivalent per megawatt-hour but retained 287 unlinked technosphere inputs. Under equal relative bounds, the first-rank screen failed at a 1.32% all-block half-width. Service-equivalence and use-phase thresholds were 2.64% and 2.99%, compared with 22.15% for embodied burden. This result reverses an earlier attribution of rank sensitivity to embodied variation. The audit supports the decline in generation-related greenhouse-gas intensity and identifies decision-critical data, but it does not identify a universally preferable cooling architecture.</w:t>
+        <w:t>Published data-center cooling life-cycle assessments (LCAs) are difficult to transfer because electricity boundaries, climate methods, useful-computation equivalence, and foreground inventories differ. This Technology Assessment uses OpenDC-LCA, an open-source evidence-audit and comparison-validation tool, to test which conclusions from the released Microsoft/WSP comparison remain supportable. We reconstructed 24 totals, harmonized nine U.S. Environmental Protection Agency Emissions &amp; Generation Resource Integrated Database (eGRID) releases to the Intergovernmental Panel on Climate Change Fifth Assessment Report 100-year global warming potential (AR5 GWP100), and calculated 71 non-residual 2023 Federal LCA Commons electricity-consumption systems. The article reports AR5 GWP100, but its archived workbook places the numeric electricity endpoints in 100-year global temperature-change-potential (GTP100) cells while the corresponding GWP100 cells are blank and the comparative use-phase formulas reference those blank cells. We therefore retain cooling totals only as numerical transferability screens. The harmonized national direct-generation factor declined 32.46%, from 517.73 to 349.67 kg carbon dioxide equivalent per megawatt-hour between 2012 and 2023. The partial linked national consumption system yielded 422.93 kg carbon dioxide equivalent per megawatt-hour but retained 287 unlinked technosphere inputs. Under equal relative bounds, the first-rank screen failed at a 1.32% all-block half-width. Service-equivalence and use-phase thresholds were 2.64% and 2.99%, compared with 22.15% for embodied burden. This result reverses an earlier attribution of rank sensitivity to embodied variation. The audit supports the decline in generation-related greenhouse-gas intensity and identifies decision-critical data, but it does not identify a universally preferable cooling architecture.</w:t>
       </w:r>
     </w:p>
     <w:p>
@@ -170,7 +170,7 @@
           <w:rFonts w:ascii="Calibri" w:hAnsi="Calibri"/>
           <w:sz w:val="21"/>
         </w:rPr>
-        <w:t>These alternatives are not interchangeable heat exchangers. They alter server fans, pumps, coolant distribution units, heat-rejection temperature, fluid inventory, rack or tank construction, packing density, repair procedures, and sometimes achievable clock rate. System experiments have reported materially different coefficient of performance and cost behavior for single- and two-phase immersion over load [6], while recent single-phase tests show that flow direction, coolant viscosity, and water temperature affect chip temperature, thermal resistance, and power usage effectiveness (PUE) [7]. Two-phase experiments similarly show that boiling, pressure stability, and condenser performance must be evaluated at server and system levels [8]. A comparison at equal rack count, equal IT electricity, or equal nameplate capacity risks comparing different computational services.</w:t>
+        <w:t>These cooling architectures alter more than the heat exchanger because they also change server fans, pumps, coolant distribution units, heat-rejection temperature, fluid inventory, rack or tank construction, packing density, repair procedures, and sometimes achievable clock rate. System experiments have reported materially different coefficient of performance and cost behavior for single- and two-phase immersion over load [6], while recent single-phase tests show that flow direction, coolant viscosity, and water temperature affect chip temperature, thermal resistance, and power usage effectiveness (PUE) [7]. Two-phase experiments similarly show that boiling, pressure stability, and condenser performance must be evaluated at server and system levels [8]. A comparison at equal rack count, equal IT electricity, or equal nameplate capacity risks comparing different computational services.</w:t>
       </w:r>
     </w:p>
     <w:p>
@@ -223,7 +223,7 @@
           <w:rFonts w:ascii="Calibri" w:hAnsi="Calibri"/>
           <w:sz w:val="21"/>
         </w:rPr>
-        <w:t>Other LCA work confirms that changes in electricity-generation emissions and cooling efficiency are complementary but can shift impacts among categories [19]. Manufacturer and ICT studies also show wide dispersion in embodied server impacts [20,21]. Together, this literature exposes a specific gap. Available primary studies do not provide a reusable audit for determining whether a published cooling comparison can be transferred to a different electricity system without changing its method, boundary, or computational service.</w:t>
+        <w:t>Other LCA work confirms that changes in electricity-generation emissions and cooling efficiency are complementary but can shift impacts among categories [19]. Manufacturer and ICT studies also show wide dispersion in embodied server impacts [20,21]. Together, the performance and manufacturer evidence leaves a specific transferability gap because available primary studies do not provide a reusable audit for determining whether a published cooling comparison can be moved to a different electricity system without changing its method, boundary, or computational service.</w:t>
       </w:r>
     </w:p>
     <w:p>
@@ -275,7 +275,7 @@
           <w:rFonts w:ascii="Calibri" w:hAnsi="Calibri"/>
           <w:sz w:val="21"/>
         </w:rPr>
-        <w:t>Data-quality assessment is not a decorative appendix. EPA guidance emphasizes reproducible documentation at flow and process levels [33]. Decision analysis goes further. Value-of-information methods prioritize data whose resolution is expected to change a decision, rather than simply improving every weak input [34]. This distinction is important for electronics-cooling laboratories. A parameter may have poor pedigree but negligible decision leverage. By contrast, a seemingly precise PUE difference may be decisive if two lifecycle alternatives are nearly tied.</w:t>
+        <w:t>EPA guidance treats reproducible documentation at flow and process levels as part of data-quality assessment [33]. Value-of-information methods extend this assessment by prioritizing data whose resolution is expected to change a decision rather than simply improving every weak input [34]. For electronics-cooling laboratories, this distinction separates a poor-pedigree parameter with negligible decision leverage from a small PUE difference that may decide between nearly tied lifecycle alternatives.</w:t>
       </w:r>
     </w:p>
     <w:p>
@@ -284,7 +284,7 @@
           <w:rFonts w:ascii="Calibri" w:hAnsi="Calibri"/>
           <w:sz w:val="21"/>
         </w:rPr>
-        <w:t>The review standard also depends on the claim. ISO 14040 and ISO 14044 define the LCA framework and requirements, whereas ISO 14071 (2024) specifies critical review processes and reviewer competencies, with particular relevance to comparative assertions intended for public disclosure [35,36]. Code tests, data checks, and coauthor review can strengthen traceability, but none is a substitute for an independent critical review.</w:t>
+        <w:t>ISO 14040 and ISO 14044 define the LCA framework and requirements, whereas ISO 14071 (2024) specifies the critical-review process and reviewer competencies needed for stronger claims, with particular relevance to comparative assertions intended for public disclosure [35,36]. Code tests, data checks, and coauthor review can strengthen traceability, but none is a substitute for an independent critical review.</w:t>
       </w:r>
     </w:p>
     <w:p>
@@ -319,7 +319,7 @@
           <w:rFonts w:ascii="Calibri" w:hAnsi="Calibri"/>
           <w:sz w:val="21"/>
         </w:rPr>
-        <w:t>This study is a technology assessment of the transferability of the released Microsoft/WSP case. It makes five contributions. First, it reconstructs 24 released totals and audits the workbook cells to identify an unresolved GTP100/GWP100 inconsistency in the public archive. Second, it harmonizes nine eGRID releases from gas-specific emissions. Third, it calculates 71 Federal LCA Commons 2023 consumption systems with an openLCA-compatible JSON-LD workflow and reports process links, numerical residuals, and unlinked technosphere cutoffs rather than hiding them. Fourth, it derives exact, equal-width, deterministic rank-robustness certificates that distinguish the effects of grid, use phase, embodied burden, and service equivalence without assigning unsupported probabilities. Finally, it provides the open-source OpenDC-LCA comparison validator, which blocks incompatible functional units, boundaries, electricity accounting, LCIA methods, or missing field-level lineage while stating that metadata checks are not physical validation.</w:t>
+        <w:t>This technology assessment addresses the transferability of the released Microsoft/WSP case through five linked contributions. First, it reconstructs 24 released totals and audits the workbook cells to identify an unresolved GTP100/GWP100 inconsistency in the public archive. Second, it harmonizes nine eGRID releases from gas-specific emissions. Third, it calculates 71 Federal LCA Commons 2023 consumption systems with an openLCA-compatible JSON-LD workflow and reports process links, numerical residuals, and unlinked technosphere cutoffs rather than hiding them. Fourth, it derives exact, equal-width, deterministic rank-robustness certificates that distinguish the effects of grid, use phase, embodied burden, and service equivalence without assigning unsupported probabilities. Finally, it provides the open-source OpenDC-LCA comparison validator, which blocks incompatible functional units, boundaries, electricity accounting, LCIA methods, or missing field-level lineage while stating that metadata checks are not physical validation.</w:t>
       </w:r>
     </w:p>
     <w:p>
@@ -362,7 +362,7 @@
           <w:rFonts w:ascii="Calibri" w:hAnsi="Calibri"/>
           <w:sz w:val="21"/>
         </w:rPr>
-        <w:t>Figure 1 shows the workflow of OpenDC-LCA, an open-source data-center cooling life-cycle assessment tool. The repository records source-family metadata and a per-file path, byte count, and SHA-256 checksum. Dataset-specific tables retain the worksheet, field, unit, boundary, and numerical role used in each analysis. This is file-level integrity plus family-level provenance, not a complete flow-level data-lineage graph. The harmonization stage asks four questions in order. These questions determine i) whether the alternatives are functionally equivalent, ii) whether the units, characterization methods, time, and geography are aligned, iii) whether the required transformation is interpolation or extrapolation, and iv) whether uncertainty, correlation, and review status are adequate for the proposed claim. The result is classified as reconstructed, screening-transformed, registered/unlinked, or supported by primary decision-grade evidence.</w:t>
+        <w:t>Figure 1 traces released lifecycle results, public scenario data, exchange-ready inventories, and primary engineering evidence through gates for functional equivalence, method alignment, transformation limits, and evidence classification. The workflow returns three decision products consisting of a reproducibility result, a conditional comparison boundary, and a robustness threshold paired with the next evidence requirement. The repository records source-family metadata and a per-file path, byte count, and SHA-256 checksum. Dataset-specific tables retain the worksheet, field, unit, boundary, and numerical role used in each analysis. This is file-level integrity plus family-level provenance, not a complete flow-level data-lineage graph. The harmonization gates determine i) whether the alternatives are functionally equivalent, ii) whether the units, characterization methods, time, and geography are aligned, iii) whether the required transformation is interpolation or extrapolation, and iv) whether uncertainty, correlation, and review status are adequate for the proposed claim. The result is classified as reconstructed, screening-transformed, registered/unlinked, or supported by primary decision-grade evidence.</w:t>
       </w:r>
     </w:p>
     <w:p>
@@ -482,7 +482,7 @@
           <w:rFonts w:ascii="Calibri" w:hAnsi="Calibri"/>
           <w:sz w:val="21"/>
         </w:rPr>
-        <w:t>Table 1 states how each downloaded source enters this study. This is an important methodological control. Readability by the software does not make a dataset compatible with the case model.</w:t>
+        <w:t>Table 1 distinguishes eight downloaded source families according to i) the records used, ii) their numerical role in this study, iii) the unresolved boundary or transfer limit, and iv) the permissible claim class. This source-to-claim mapping prevents software readability from being mistaken for compatibility with the case model.</w:t>
       </w:r>
     </w:p>
     <w:p>
@@ -2012,7 +2012,7 @@
           <w:rFonts w:ascii="Calibri" w:hAnsi="Calibri"/>
           <w:sz w:val="21"/>
         </w:rPr>
-        <w:t>For comparison with the earlier screening analysis, we also retained seeded, 20,000-iteration triangular stress designs for the 2023 U.S. generation factor and the lowest-carbon 2023 state. The headline design used one shared grid multiplier and independent technology-specific multipliers for use phase, embodied contribution, and impact per equivalent service. It is the all-block, zero-correlation member of the dependence analysis described below. Three declared envelopes were used (Table 2).</w:t>
+        <w:t>For comparison with the earlier screening analysis, we also retained seeded, 20,000-iteration triangular stress designs for the 2023 U.S. generation factor and the lowest-carbon 2023 state. The headline design used one shared grid multiplier and independent technology-specific multipliers for use phase, embodied contribution, and impact per equivalent service. It is the all-block, zero-correlation member of the dependence analysis described below. Table 2 defines the narrow, screening, and wide envelopes by pairing grid, use-phase, and service half-widths of ±2%, ±5%, and ±10% with embodied half-widths of ±20%, ±50%, and ±100%, respectively.</w:t>
       </w:r>
     </w:p>
     <w:p>
@@ -2665,7 +2665,7 @@
           <w:rFonts w:ascii="Calibri" w:hAnsi="Calibri"/>
           <w:sz w:val="21"/>
         </w:rPr>
-        <w:t>All 24 released combinations of architecture, electricity scenario, and impact metric reconciled to the seven published Figure-4 contributions at workbook precision. Under the released U.S. grid case, the reconstructed table reports 20.66% lower GHG, 20.00% lower primary energy, and 46.78% lower blue water for two-phase immersion than air cooling. These are reproduced source results, not independent comparisons.</w:t>
+        <w:t>Figure 2 compares the released reductions relative to air cooling for cold plate, single-phase immersion, and two-phase immersion under the U.S.-grid case across GHG, primary energy, and blue water. All 24 released combinations of architecture, electricity scenario, and impact metric reconciled to the seven published Figure-4 contributions at workbook precision. Under the released U.S. grid case, the reconstructed table reports 20.66% lower GHG, 20.00% lower primary energy, and 46.78% lower blue water for two-phase immersion than air cooling. These are reproduced source results, not independent comparisons.</w:t>
       </w:r>
     </w:p>
     <w:p>
@@ -2687,7 +2687,7 @@
         <w:drawing>
           <wp:inline xmlns:a="http://schemas.openxmlformats.org/drawingml/2006/main" xmlns:pic="http://schemas.openxmlformats.org/drawingml/2006/picture">
             <wp:extent cx="5897880" cy="3408483"/>
-            <wp:docPr id="2" name="Picture 2" descr="Figure 2. Relative reductions versus air cooling obtained by summing the released Microsoft/WSP normalized contributions. All 24 totals were reconciled at workbook precision. This figure reproduces released arithmetic. It does not validate inventories, method identity, or field performance." title="OpenDC-LCA Figure 2"/>
+            <wp:docPr id="2" name="Picture 2" descr="Figure 2. Relative GHG, primary-energy, and blue-water reductions for cold plate, single-phase immersion, and two-phase immersion versus air cooling under the released U.S.-grid case. The 24 architecture, electricity, and impact combinations reconcile at workbook precision and reproduce the released arithmetic without validating the underlying inventories, LCIA-method identity, or field performance." title="OpenDC-LCA Figure 2"/>
             <wp:cNvGraphicFramePr>
               <a:graphicFrameLocks noChangeAspect="1"/>
             </wp:cNvGraphicFramePr>
@@ -2727,7 +2727,7 @@
           <w:rFonts w:ascii="Calibri" w:hAnsi="Calibri"/>
           <w:sz w:val="18"/>
         </w:rPr>
-        <w:t>Figure 2. Relative reductions versus air cooling obtained by summing the released Microsoft/WSP normalized contributions. All 24 totals were reconciled at workbook precision. This figure reproduces released arithmetic. It does not validate inventories, method identity, or field performance.</w:t>
+        <w:t>Figure 2. Relative GHG, primary-energy, and blue-water reductions for cold plate, single-phase immersion, and two-phase immersion versus air cooling under the released U.S.-grid case. The 24 architecture, electricity, and impact combinations reconcile at workbook precision and reproduce the released arithmetic without validating the underlying inventories, LCIA-method identity, or field performance.</w:t>
       </w:r>
     </w:p>
     <w:p>
@@ -2753,7 +2753,7 @@
           <w:rFonts w:ascii="Calibri" w:hAnsi="Calibri"/>
           <w:sz w:val="21"/>
         </w:rPr>
-        <w:t>The 50-state-plus-DC reconstruction matched the official national result through 2018. From 2019 onward it was 0.32-0.43% lower because the panel covered 99.55-99.58% of the provider U.S. generation after excluding Puerto Rico. We retained the provider aggregate for the national series. In Figure 3, the orange polyline connects the reported provider U.S. aggregate direct-generation rate for each release year. It is not fitted to the state/DC points. Across the full panel, 137 of 459 numerical rates lay outside the two released cooling anchors, so 29.85% of the transfers were extrapolations.</w:t>
+        <w:t>The 50-state-plus-DC reconstruction matched the official national result through 2018. From 2019 onward it was 0.32-0.43% lower because the panel covered 99.55-99.58% of the provider U.S. generation after excluding Puerto Rico. Figure 3 places all 459 harmonized state/DC generation rates from nine eGRID releases on a common kg CO2e/MWh axis, overlays the reported provider U.S. aggregate trajectory as an orange polyline, and identifies points below the 96.704 kg CO2e/MWh cold-plate/single-phase crossover in blue. The provider aggregate was retained for the national series and was not fitted to the state/DC points. Across the full panel, 137 of 459 numerical rates lay outside the two released cooling anchors, so 29.85% of the transfers were extrapolations.</w:t>
       </w:r>
     </w:p>
     <w:p>
@@ -2823,6 +2823,15 @@
           <w:rFonts w:ascii="Calibri" w:hAnsi="Calibri"/>
           <w:sz w:val="21"/>
         </w:rPr>
+        <w:t>Figure 4 compares the partial linked-system GHG intensity of 10 FERC-region consumption systems and the national system on a delivered-electricity basis. Each bar separates generation-process impacts from other linked upstream and infrastructure impacts, while the two dashed lines locate the 96.704 and 524.893 kg CO2e/MWh released numerical anchors.</w:t>
+      </w:r>
+    </w:p>
+    <w:p>
+      <w:r>
+        <w:rPr>
+          <w:rFonts w:ascii="Calibri" w:hAnsi="Calibri"/>
+          <w:sz w:val="21"/>
+        </w:rPr>
         <w:t>The 71 non-residual Federal LCA Commons systems ranged from 0.921 to 987.844 kg CO2e/MWh. The national linked-system factor was 422.931 kg CO2e/MWh. It comprised 369.848 from electricity-generation processes and 53.084 from other linked upstream and infrastructure processes. It exceeded the 2023 national eGRID direct-generation rate by 73.264 kg CO2e/MWh, although the difference also contains consumption-mix, delivery-loss, flow-coverage, and boundary effects and is not an isolated upstream correction.</w:t>
       </w:r>
     </w:p>
@@ -2920,7 +2929,7 @@
           <w:rFonts w:ascii="Calibri" w:hAnsi="Calibri"/>
           <w:sz w:val="21"/>
         </w:rPr>
-        <w:t>At the national lifecycle factor, the numerical two-phase first rank could not be reversed by a shared grid-factor change within the tested nonnegative range through a 99.999% half-width. With technology-specific variation, reversal occurred at 2.994% for use phase, 22.154% for embodied burden, and 2.637% for service equivalence. When all four blocks used the same half-width, the first reversal occurred at 1.318%, against single-phase.</w:t>
+        <w:t>Figure 5 compares the national critical half-widths for shared grid, use phase, embodied burden, service equivalence, and simultaneous equal-width variation in panel A. Panel B plots the all-block critical half-width against lifecycle electricity intensity for 60 balancing authorities, 10 FERC regions, and the national system.</w:t>
       </w:r>
     </w:p>
     <w:p>
@@ -2929,7 +2938,7 @@
           <w:rFonts w:ascii="Calibri" w:hAnsi="Calibri"/>
           <w:sz w:val="21"/>
         </w:rPr>
-        <w:t>Across all 71 electricity contexts, the all-block critical half-width ranged from 1.123% at PUD No. 1 of Douglas County to 1.479% at Duke Energy Progress West. At the lowest-carbon system, the critical competitor was cold plate. the embodied-only and service-only thresholds were 2.291% and 2.246%, while use-phase and shared-grid changes did not reverse rank through 99.999%. The ranking is numerically fragile even though it survives every unperturbed electricity factor.</w:t>
+        <w:t>At the national lifecycle factor, the numerical two-phase first rank could not be reversed by a shared grid-factor change within the tested nonnegative range through a 99.999% half-width. With technology-specific variation, reversal occurred at 2.994% for use phase, 22.154% for embodied burden, and 2.637% for service equivalence. When all four blocks used the same half-width, the first reversal occurred at 1.318%, against single-phase.</w:t>
       </w:r>
     </w:p>
     <w:p>
@@ -2938,7 +2947,7 @@
           <w:rFonts w:ascii="Calibri" w:hAnsi="Calibri"/>
           <w:sz w:val="21"/>
         </w:rPr>
-        <w:t>This equalized analysis reverses one conclusion from the earlier triangular stress design. Embodied variation had appeared to cause the largest rank loss because its assigned half-width was 10 times those of use phase and service. At equal widths, embodied burden has the largest national one-block tolerance. service equivalence and use phase are limiting. The earlier stress frequencies and their dependence/convergence diagnostics remain in the Supplementary Information as evidence about the chosen design, not the technologies.</w:t>
+        <w:t>Across all 71 electricity contexts, the all-block critical half-width ranged from 1.123% at PUD No. 1 of Douglas County to 1.479% at Duke Energy Progress West. At the lowest-carbon system, the critical competitor was cold plate. At that point, the embodied-only and service-only thresholds were 2.291% and 2.246%, while use-phase and shared-grid changes did not reverse rank through 99.999%. The ranking is numerically fragile even though it survives every unperturbed electricity factor.</w:t>
       </w:r>
     </w:p>
     <w:p>
@@ -2947,7 +2956,16 @@
           <w:rFonts w:ascii="Calibri" w:hAnsi="Calibri"/>
           <w:sz w:val="21"/>
         </w:rPr>
-        <w:t>The one-sided functional-unit diagnostic gives a complementary threshold. across 2023 direct-rate contexts, a 5.24-6.04% adverse correction to two-phase impact per equivalent useful computation would erase its numerical first rank. This is a break-even requirement for future measurements, not an observed performance difference.</w:t>
+        <w:t>This equalized analysis reverses one conclusion from the earlier triangular stress design. Embodied variation had appeared to cause the largest rank loss because its assigned half-width was 10 times those of use phase and service. At equal widths, embodied burden has the largest national one-block tolerance, whereas service equivalence and use phase are limiting. The earlier stress frequencies and their dependence/convergence diagnostics remain in the Supplementary Information as evidence about the chosen design, not the technologies.</w:t>
+      </w:r>
+    </w:p>
+    <w:p>
+      <w:r>
+        <w:rPr>
+          <w:rFonts w:ascii="Calibri" w:hAnsi="Calibri"/>
+          <w:sz w:val="21"/>
+        </w:rPr>
+        <w:t>The one-sided functional-unit diagnostic gives a complementary threshold. Across 2023 direct-rate contexts, a 5.24-6.04% adverse correction to two-phase impact per equivalent useful computation would erase its numerical first rank. This is a break-even requirement for future measurements, not an observed performance difference.</w:t>
       </w:r>
     </w:p>
     <w:p>
@@ -3032,7 +3050,7 @@
           <w:rFonts w:ascii="Calibri" w:hAnsi="Calibri"/>
           <w:sz w:val="21"/>
         </w:rPr>
-        <w:t xml:space="preserve"> candidates, 48 included records spanned 465-2,503 kg CO2e/server for manufacturing, a 5.38-fold range. Annualized values spanned 116-626 kg CO2e/server-year. Commonly scaling the released server-related contributions across the empirical 0.38-2.06-fold annualized envelope did not change the deterministic two-phase first rank. That result is a structural stress only. it does not model architecture-specific server count, configuration, throughput, or lifetime.</w:t>
+        <w:t xml:space="preserve"> candidates, 48 included records spanned 465-2,503 kg CO2e/server for manufacturing, a 5.38-fold range. Annualized values spanned 116-626 kg CO2e/server-year. Commonly scaling the released server-related contributions across the empirical 0.38-2.06-fold annualized envelope did not change the deterministic two-phase first rank. That structural stress does not model architecture-specific server count, configuration, throughput, or lifetime.</w:t>
       </w:r>
     </w:p>
     <w:p>
@@ -3058,7 +3076,7 @@
           <w:rFonts w:ascii="Calibri" w:hAnsi="Calibri"/>
           <w:sz w:val="21"/>
         </w:rPr>
-        <w:t>Under the base contribution-times-weakness index, use phase was the highest priority, followed by storage, networking, and compute-server evidence. Across the nine alternative exponent combinations, use phase ranked first in eight and in the top three in eight. Networking ranked first once. Storage was in the top three in all nine. Compute was in the top three in four. The rank of use phase ranged from first to fourth.</w:t>
+        <w:t>Under the base contribution-times-weakness index, use phase was the highest priority, followed by storage, networking, and compute-server evidence. Across the nine alternative exponent combinations, use phase ranked first in eight and in the top three in eight. Networking ranked first once, storage remained in the top three in all nine, and compute was in the top three in four. The rank of use phase ranged from first to fourth.</w:t>
       </w:r>
     </w:p>
     <w:p>
@@ -3153,7 +3171,7 @@
           <w:rFonts w:ascii="Calibri" w:hAnsi="Calibri"/>
           <w:sz w:val="21"/>
         </w:rPr>
-        <w:t>This is a material advance, but not full harmonization. The difference between the two national factors also reflects delivery losses, consumption versus generation geography, and elementary-flow coverage. More importantly, 287 unlinked technosphere exchanges still carry zero upstream burden. A complete calculation requires those providers to be linked or their omitted impacts to be bounded and independently reproduced. Even then, electricity cannot repair the unresolved cooling-foreground LCIA method. Location- and market-based cases must also remain consistent throughout the product system [22,23]. The 7.67% national difference between ordinary and residual consumption mixes shows that the accounting choice is consequential even before the cooling foreground is harmonized.</w:t>
+        <w:t>Provider-linked consumption modeling improves boundary traceability but does not complete harmonization because the difference between the two national factors also reflects delivery losses, consumption versus generation geography, and elementary-flow coverage. More importantly, 287 unlinked technosphere exchanges still carry zero upstream burden. A complete calculation requires those providers to be linked or their omitted impacts to be bounded and independently reproduced. Even then, electricity cannot repair the unresolved cooling-foreground LCIA method. Location- and market-based cases must also remain consistent throughout the product system [22,23]. The 7.67% national difference between ordinary and residual consumption mixes shows that the accounting choice is consequential even before the cooling foreground is harmonized.</w:t>
       </w:r>
     </w:p>
     <w:p>
@@ -3170,7 +3188,7 @@
           <w:rFonts w:ascii="Calibri" w:hAnsi="Calibri"/>
           <w:sz w:val="21"/>
         </w:rPr>
-        <w:t>The earlier triangular analysis assigned embodied burden a half-width 10 times the use-phase and service widths. Its conclusion that embodied variation was the largest one-block source of rank loss conflated sensitivity with an arbitrary range choice. The equal-width certificate separates those effects. At the national lifecycle factor, embodied burden can vary by 22.15% before a worst-case one-block reversal, whereas service equivalence and use phase require only 2.64% and 2.99%.</w:t>
+        <w:t>The earlier triangular analysis assigned embodied burden a half-width 10 times the use-phase and service widths. Its conclusion that embodied variation was the largest one-block source of rank loss conflated sensitivity with an arbitrary range choice. The equal-width certificate separates range assignment from model sensitivity. At the national lifecycle factor, embodied burden can vary by 22.15% before a worst-case one-block reversal, whereas service equivalence and use phase require only 2.64% and 2.99%.</w:t>
       </w:r>
     </w:p>
     <w:p>
@@ -3179,7 +3197,7 @@
           <w:rFonts w:ascii="Calibri" w:hAnsi="Calibri"/>
           <w:sz w:val="21"/>
         </w:rPr>
-        <w:t>The all-block threshold of 1.32% is not a confidence bound. It is the radius of a specified box in which a shared grid multiplier and adverse technology-specific foreground multipliers cannot reverse the numerical first rank. Its value lies in falsifiability. Any proposed empirical uncertainty model can be compared against the same bound structure. A probability of rank would additionally require measured marginal distributions and correlations [30].</w:t>
+        <w:t>The all-block threshold of 1.32% is not a confidence bound. It is the radius of a specified box in which a shared grid multiplier and adverse technology-specific foreground multipliers cannot reverse the numerical first rank. The certificate is falsifiable because any proposed empirical uncertainty model can be compared against the same bound structure. A probability of rank would additionally require measured marginal distributions and correlations [30].</w:t>
       </w:r>
     </w:p>
     <w:p>
@@ -3188,7 +3206,7 @@
           <w:rFonts w:ascii="Calibri" w:hAnsi="Calibri"/>
           <w:sz w:val="21"/>
         </w:rPr>
-        <w:t>This correction changes the near-term research priority. Measurements should first close functional equivalence and use-phase demand, while bills of quantities and material inventories remain necessary for a common-method lifecycle comparison. The legacy triangular results still demonstrate that dependence assumptions matter, but they do not rank the real-world importance of uncertainty blocks.</w:t>
+        <w:t>Because functional equivalence and use-phase demand are limiting at equal widths, near-term measurements should close those two evidence gaps first, while bills of quantities and material inventories remain necessary for a common-method lifecycle comparison. The legacy triangular results still demonstrate that dependence assumptions matter, but they do not rank the real-world importance of uncertainty blocks.</w:t>
       </w:r>
     </w:p>
     <w:p>
@@ -3231,7 +3249,7 @@
           <w:rFonts w:ascii="Calibri" w:hAnsi="Calibri"/>
           <w:sz w:val="21"/>
         </w:rPr>
-        <w:t>The national analysis shows a dual effect. Cleaner generation lowers every electricity-dependent cooling result and contracts the absolute value of operational efficiency, while increasing the fraction supplied by embodied terms. Percentage savings alone hide this transition. The absolute modeled two-phase-versus-air benefit fell 29.45% between the 2012 and 2023 generation conditions.</w:t>
+        <w:t>National grid decarbonization simultaneously lowers every electricity-dependent cooling result, contracts the absolute value of operational efficiency, and increases the fraction supplied by embodied terms. The absolute modeled two-phase-versus-air benefit fell 29.45% between the 2012 and 2023 generation conditions, a change that percentage savings alone do not reveal.</w:t>
       </w:r>
     </w:p>
     <w:p>
@@ -3257,7 +3275,7 @@
           <w:rFonts w:ascii="Calibri" w:hAnsi="Calibri"/>
           <w:sz w:val="21"/>
         </w:rPr>
-        <w:t>OpenDC-LCA does not replace openLCA, Brightway, Temporalis, premise, or bw_timex. Those tools provide process-network calculation, database management, prospective backgrounds, or time-explicit LCA [27-29,37,38]. The assessment layer adds six functions. First, it checks functional equivalence against useful computation. Second, it represents load-weather cooling performance and performs bounded annual integration. Third, it represents reliability, replacement, and cooling fluids. Fourth, it separates lifecycle electricity, direct generation rates, market instruments, and marginal signals. Fifth, it preserves source and transformation provenance. Finally, its automated metadata validator blocks declared comparisons with incompatible methods, boundaries, or source mappings.</w:t>
+        <w:t>OpenDC-LCA does not replace openLCA, Brightway, Temporalis, premise, or bw_timex. Those tools provide process-network calculation, database management, prospective backgrounds, or time-explicit LCA [27-29,37,38]. The OpenDC-LCA assessment layer adds six comparison-audit functions. First, it checks functional equivalence against useful computation. Second, it represents load-weather cooling performance and performs bounded annual integration. Third, it represents reliability, replacement, and cooling fluids. Fourth, it separates lifecycle electricity, direct generation rates, market instruments, and marginal signals. Fifth, it preserves source and transformation provenance. Finally, its automated metadata validator blocks declared comparisons with incompatible methods, boundaries, or source mappings.</w:t>
       </w:r>
     </w:p>
     <w:p>
@@ -3266,7 +3284,7 @@
           <w:rFonts w:ascii="Calibri" w:hAnsi="Calibri"/>
           <w:sz w:val="21"/>
         </w:rPr>
-        <w:t>The validator is deliberately narrower than a scientific review. It trusts the metadata supplied by the user and cannot determine whether a performance map is representative, a distribution is empirical, or an external review occurred. Its role is to catch machine-detectable incompatibilities before calculation, not to authorize a public environmental claim.</w:t>
+        <w:t>The metadata validator is deliberately narrower than a scientific review because it trusts the metadata supplied by the user and cannot determine whether a performance map is representative, a distribution is empirical, or an external review occurred. Its role is to catch machine-detectable incompatibilities before calculation, not to authorize a public environmental claim.</w:t>
       </w:r>
     </w:p>
     <w:p>
@@ -3275,7 +3293,7 @@
           <w:rFonts w:ascii="Calibri" w:hAnsi="Calibri"/>
           <w:sz w:val="21"/>
         </w:rPr>
-        <w:t>This role also differs from recent data-center models. AlphaDataCenterCooling provides operational validation of a cooling plant [17], while d'Orgeval et al. compare full data-center architectures and, for a subset, normalize by computational performance [16]. The present work tests whether published secondary LCA results retain their meaning when moved across electricity datasets and claim contexts. It does not duplicate either primary modeling capability.</w:t>
+        <w:t>This comparison-audit role also differs from recent data-center performance and architecture models. AlphaDataCenterCooling provides operational validation of a cooling plant [17], while d'Orgeval et al. compare full data-center architectures and, for a subset, normalize by computational performance [16]. The present work tests whether published secondary LCA results retain their meaning when moved across electricity datasets and claim contexts. It does not duplicate either primary modeling capability.</w:t>
       </w:r>
     </w:p>
     <w:p>
@@ -3301,7 +3319,7 @@
           <w:rFonts w:ascii="Calibri" w:hAnsi="Calibri"/>
           <w:sz w:val="21"/>
         </w:rPr>
-        <w:t>The most useful extension of the Microsoft/WSP work is not another static national scenario. It is a jointly governed evidence package that allows the released model to be updated without weakening its functional-unit insight. Five additions are needed. First, the original GWP100 electricity factors or elementary-flow inventories are needed to resolve the public workbook's blank F29 cells. Second, the package requires architecture-specific, anonymized bills of quantities and service lives. Third, it requires measured performance surfaces for IT output, server power, facility parasitics, and onsite water across load and weather. Fourth, it requires a complete provider-linked lifecycle electricity model under the same LCIA method, with cutoffs linked or bounded and with location-based, market-based, and marginal operational signals reported separately. Finally, empirical uncertainty and correlation information are needed for rank-probability and value-of-information analyses.</w:t>
+        <w:t>The most useful extension of the Microsoft/WSP work is not another static national scenario. It is a jointly governed evidence package that allows the released model to be updated without weakening its functional-unit insight. Closing the method, foreground, performance, electricity, and uncertainty gaps requires five additions. First, the original GWP100 electricity factors or elementary-flow inventories are needed to resolve the public workbook's blank F29 cells. Second, the package requires architecture-specific, anonymized bills of quantities and service lives. Third, it requires measured performance surfaces for IT output, server power, facility parasitics, and onsite water across load and weather. Fourth, it requires a complete provider-linked lifecycle electricity model under the same LCIA method, with cutoffs linked or bounded and with location-based, market-based, and marginal operational signals reported separately. Finally, empirical uncertainty and correlation information are needed for rank-probability and value-of-information analyses.</w:t>
       </w:r>
     </w:p>
     <w:p>
@@ -3327,7 +3345,7 @@
           <w:rFonts w:ascii="Calibri" w:hAnsi="Calibri"/>
           <w:sz w:val="21"/>
         </w:rPr>
-        <w:t>The analysis remains secondary. It does not recreate proprietary background inventories, confidential bills of quantities, the full virtual-core model, or measured hyperscale operation. Equation (8) uses a numerical axis whose climate-method identity is unresolved in the public archive. The Federal LCA Commons factors contain 287 national unlinked technosphere exchanges. The custom solver has not been independently reproduced in openLCA or Brightway. The additive allowance, triangular marginals, and copula dependence cases are secondary diagnostics, not estimates. The convergence check limits numerical sampling error within those designs. It does not reduce epistemic uncertainty in the ranges, dependence structure, cutoffs, or foreground model. eGRID state rates omit consumption transfers, contracts, hourly dispatch, and marginal effects.</w:t>
+        <w:t>Because this analysis is secondary, it does not recreate proprietary background inventories, confidential bills of quantities, the full virtual-core model, or measured hyperscale operation. Equation (8) uses a numerical axis whose climate-method identity is unresolved in the public archive. The Federal LCA Commons factors contain 287 national unlinked technosphere exchanges. The custom solver has not been independently reproduced in openLCA or Brightway. The additive allowance, triangular marginals, and copula dependence cases are secondary diagnostics, not estimates. The convergence check limits numerical sampling error within those designs. It does not reduce epistemic uncertainty in the ranges, dependence structure, cutoffs, or foreground model. eGRID state rates omit consumption transfers, contracts, hourly dispatch, and marginal effects.</w:t>
       </w:r>
     </w:p>
     <w:p>
@@ -3336,7 +3354,7 @@
           <w:rFonts w:ascii="Calibri" w:hAnsi="Calibri"/>
           <w:sz w:val="21"/>
         </w:rPr>
-        <w:t>The assessment focuses on climate results. It does not provide a boundary-consistent comparison of primary energy, water scarcity, toxicity, resource use, or other impact categories. The Boavizta sample mixes products and methods. ÖKOBAUDAT records are German generic A1-A3 factors. The TMY and synthetic performance examples validate software pathways, not technology performance. The USGS file provides watershed geometry rather than water consumption or AWARE characterization. Reliability models omit dependent failures, repair queues, redundancy and maintenance logistics unless the user supplies them. A coauthor methodology review is not an independent critical review.</w:t>
+        <w:t>The climate-focused extension does not provide a boundary-consistent comparison of primary energy, water scarcity, toxicity, resource use, or other impact categories. The Boavizta sample mixes products and methods, while ÖKOBAUDAT records are German generic A1-A3 factors. The TMY and synthetic performance examples validate software pathways, not technology performance. The USGS file provides watershed geometry rather than water consumption or AWARE characterization. Reliability models omit dependent failures, repair queues, redundancy and maintenance logistics unless the user supplies them. A coauthor methodology review is not an independent critical review.</w:t>
       </w:r>
     </w:p>
     <w:p>

</xml_diff>

<commit_message>
Add mixed-infrastructure boundary validation
</commit_message>
<xml_diff>
--- a/paper/OpenDC-LCA_manuscript.docx
+++ b/paper/OpenDC-LCA_manuscript.docx
@@ -30,7 +30,7 @@
           <w:color w:val="17324D"/>
           <w:sz w:val="22"/>
         </w:rPr>
-        <w:t>Braden Stevens (1, 3), Pengjiang Xiang (1, 3), Yimin Chen (2), Darin Nutter (1), and Han Hu (1)</w:t>
+        <w:t>Braden Stevens (1, 5), Pengjiang Xiang (1, 5), Pawel Wolinski (2), Charles Dwyer (3), Yimin Chen (4), Darin Nutter (1), and Han Hu (1)</w:t>
       </w:r>
     </w:p>
     <w:p>
@@ -62,7 +62,7 @@
           <w:color w:val="17324D"/>
           <w:sz w:val="22"/>
         </w:rPr>
-        <w:t>(2) Building Technologies Research and Integration Center, Oak Ridge National Laboratory, Oak Ridge, TN 37830, U.S.</w:t>
+        <w:t>(2) Arkansas High Performance Computing Center, University of Arkansas, Fayetteville, AR 72701, U.S.</w:t>
       </w:r>
     </w:p>
     <w:p>
@@ -78,7 +78,39 @@
           <w:color w:val="17324D"/>
           <w:sz w:val="22"/>
         </w:rPr>
-        <w:t>(3) Harrison French &amp; Associates Ltd., Bentonville, AR 72712, U.S.</w:t>
+        <w:t>(3) IT Services, University of Arkansas, Fayetteville, AR 72701, U.S.</w:t>
+      </w:r>
+    </w:p>
+    <w:p>
+      <w:pPr>
+        <w:spacing w:after="60"/>
+        <w:jc w:val="center"/>
+      </w:pPr>
+      <w:r>
+        <w:rPr>
+          <w:rFonts w:ascii="Calibri" w:hAnsi="Calibri"/>
+          <w:b/>
+          <w:i w:val="0"/>
+          <w:color w:val="17324D"/>
+          <w:sz w:val="22"/>
+        </w:rPr>
+        <w:t>(4) Building Technologies Research and Integration Center, Oak Ridge National Laboratory, Oak Ridge, TN 37830, U.S.</w:t>
+      </w:r>
+    </w:p>
+    <w:p>
+      <w:pPr>
+        <w:spacing w:after="60"/>
+        <w:jc w:val="center"/>
+      </w:pPr>
+      <w:r>
+        <w:rPr>
+          <w:rFonts w:ascii="Calibri" w:hAnsi="Calibri"/>
+          <w:b/>
+          <w:i w:val="0"/>
+          <w:color w:val="17324D"/>
+          <w:sz w:val="22"/>
+        </w:rPr>
+        <w:t>(5) Harrison French &amp; Associates Ltd., Bentonville, AR 72712, U.S.</w:t>
       </w:r>
     </w:p>
     <w:p>
@@ -3328,7 +3360,25 @@
           <w:rFonts w:ascii="Calibri" w:hAnsi="Calibri"/>
           <w:sz w:val="21"/>
         </w:rPr>
-        <w:t>OpenDC-LCA supplies schemas, transformations, tests, and claim boundaries for that collaboration. The two conclusions supported independently here are the released arithmetic and the national direct-generation trend. The cooling crossovers, first ranks, and response coefficients remain conditional numerical screens until the five evidence gaps are closed.</w:t>
+        <w:t>OpenDC-LCA supplies schemas, transformations, tests, and claim boundaries for that collaboration. A preliminary university high-performance-computing site characterization illustrates why those claim boundaries matter in practice. The site combines dedicated IT and liquid-cooling paths with raised-floor CRAC cooling shared by several institutional users. It therefore cannot support a single facility PUE without a documented allocation of shared support loads. The preliminary record contains no operational time series and does not report site energy, cooling performance, PUE, or environmental impacts. It instead defines the metering sequence required to produce those results.</w:t>
+      </w:r>
+    </w:p>
+    <w:p>
+      <w:r>
+        <w:rPr>
+          <w:rFonts w:ascii="Calibri" w:hAnsi="Calibri"/>
+          <w:sz w:val="21"/>
+        </w:rPr>
+        <w:t>The custom-boundary validator now classifies each energy item as metered, allocated, or excluded. Metered records identify their meter, allocated records identify an allocation method, and excluded records state a rationale. A facility-PUE label requires a complete energy-item inventory, a metered IT-load boundary, and no excluded shared-support item. A partial record can instead report a dedicated-support ratio for the stated UPS and dedicated-cooling boundary. This check does not authenticate meter data or determine whether an allocation is physically representative, but it prevents incomplete shared infrastructure from being silently labeled as facility energy.</w:t>
+      </w:r>
+    </w:p>
+    <w:p>
+      <w:r>
+        <w:rPr>
+          <w:rFonts w:ascii="Calibri" w:hAnsi="Calibri"/>
+          <w:sz w:val="21"/>
+        </w:rPr>
+        <w:t>The two conclusions supported independently here are the released arithmetic and the national direct-generation trend. The cooling crossovers, first ranks, and response coefficients remain conditional numerical screens until the five evidence gaps are closed.</w:t>
       </w:r>
     </w:p>
     <w:p>

</xml_diff>

<commit_message>
Update transferability analysis and Overleaf package
</commit_message>
<xml_diff>
--- a/paper/OpenDC-LCA_manuscript.docx
+++ b/paper/OpenDC-LCA_manuscript.docx
@@ -14,7 +14,7 @@
           <w:color w:val="17324D"/>
           <w:sz w:val="42"/>
         </w:rPr>
-        <w:t>Transferability audit of data-center cooling life-cycle assessment considering lifecycle electricity, functional equivalence, and rank robustness</w:t>
+        <w:t>Transferability assessment of published data-center cooling life-cycle comparisons</w:t>
       </w:r>
     </w:p>
     <w:p>
@@ -151,7 +151,7 @@
           <w:rFonts w:ascii="Calibri" w:hAnsi="Calibri"/>
           <w:sz w:val="21"/>
         </w:rPr>
-        <w:t>Published data-center cooling life-cycle assessments (LCAs) are difficult to transfer because electricity boundaries, climate methods, useful-computation equivalence, and foreground inventories differ. This Technology Assessment uses OpenDC-LCA, an open-source evidence-audit and comparison-validation tool, to test which conclusions from the released Microsoft/WSP comparison remain supportable. We reconstructed 24 totals, harmonized nine U.S. Environmental Protection Agency Emissions &amp; Generation Resource Integrated Database (eGRID) releases to the Intergovernmental Panel on Climate Change Fifth Assessment Report 100-year global warming potential (AR5 GWP100), and calculated 71 non-residual 2023 Federal LCA Commons electricity-consumption systems. The article reports AR5 GWP100, but its archived workbook places the numeric electricity endpoints in 100-year global temperature-change-potential (GTP100) cells while the corresponding GWP100 cells are blank and the comparative use-phase formulas reference those blank cells. We therefore retain cooling totals only as numerical transferability screens. The harmonized national direct-generation factor declined 32.46%, from 517.73 to 349.67 kg carbon dioxide equivalent per megawatt-hour between 2012 and 2023. The partial linked national consumption system yielded 422.93 kg carbon dioxide equivalent per megawatt-hour but retained 287 unlinked technosphere inputs. Under equal relative bounds, the first-rank screen failed at a 1.32% all-block half-width. Service-equivalence and use-phase thresholds were 2.64% and 2.99%, compared with 22.15% for embodied burden. This result reverses an earlier attribution of rank sensitivity to embodied variation. The audit supports the decline in generation-related greenhouse-gas intensity and identifies decision-critical data, but it does not identify a universally preferable cooling architecture.</w:t>
+        <w:t>Published data-center cooling life-cycle assessments (LCAs) are difficult to transfer because electricity boundaries, climate methods, useful-computation equivalence, and foreground inventories differ. This Technology Assessment uses OpenDC-LCA, an open-source evidence-audit and comparison-validation tool, to determine which conclusions from the released Microsoft/WSP comparison remain supportable. We reconstructed 24 reported totals, harmonized nine U.S. Environmental Protection Agency Emissions &amp; Generation Resource Integrated Database (eGRID) releases to the Intergovernmental Panel on Climate Change Fifth Assessment Report 100-year global warming potential (AR5 GWP100), and calculated 71 non-residual 2023 Federal LCA Commons electricity-consumption systems. The archived workbook reports AR5 GWP100, but its numeric electricity endpoints occur in 100-year global temperature-change-potential (GTP100) cells. The corresponding GWP100 cells are blank and the comparative use-phase formulas reference those blank cells. Cooling totals are therefore retained only as released-workbook numerical screens. The harmonized national direct-generation factor declined 32.46%, from 517.73 to 349.67 kg carbon dioxide equivalent per megawatt-hour between 2012 and 2023. The partial linked national consumption system yielded 422.93 kg carbon dioxide equivalent per megawatt-hour but retained 287 unlinked technosphere inputs. Under equal relative bounds, the first-rank screen failed at a 1.32% all-block half-width. Service-equivalence and use-phase thresholds were 2.64% and 2.99%, compared with 22.15% for embodied burden. The assessment identifies the measurements and inventories needed before a facility can use a published comparison for a cooling decision. It supports the historical generation-intensity trend, but it does not identify a universally preferable cooling architecture.</w:t>
       </w:r>
     </w:p>
     <w:p>
@@ -202,7 +202,7 @@
           <w:rFonts w:ascii="Calibri" w:hAnsi="Calibri"/>
           <w:sz w:val="21"/>
         </w:rPr>
-        <w:t>These cooling architectures alter more than the heat exchanger because they also change server fans, pumps, coolant distribution units, heat-rejection temperature, fluid inventory, rack or tank construction, packing density, repair procedures, and sometimes achievable clock rate. System experiments have reported materially different coefficient of performance and cost behavior for single- and two-phase immersion over load [6], while recent single-phase tests show that flow direction, coolant viscosity, and water temperature affect chip temperature, thermal resistance, and power usage effectiveness (PUE) [7]. Two-phase experiments similarly show that boiling, pressure stability, and condenser performance must be evaluated at server and system levels [8]. A comparison at equal rack count, equal IT electricity, or equal nameplate capacity risks comparing different computational services.</w:t>
+        <w:t>These cooling architectures alter more than the heat exchanger. They also change server fans, pumps, coolant distribution units, heat-rejection temperature, fluid inventory, rack or tank construction, packing density, repair procedures, and sometimes achievable clock rate. System experiments have reported load-dependent differences in coefficient of performance and cost for single- and two-phase immersion [6]. Recent single-phase tests show that flow direction, coolant viscosity, and water temperature affect chip temperature, thermal resistance, and power usage effectiveness (PUE) [7]. Two-phase experiments similarly indicate that boiling, pressure stability, and condenser performance must be evaluated at server and system levels [8]. A comparison at equal rack count, equal IT electricity, or equal nameplate capacity can therefore compare different computational services.</w:t>
       </w:r>
     </w:p>
     <w:p>
@@ -351,7 +351,7 @@
           <w:rFonts w:ascii="Calibri" w:hAnsi="Calibri"/>
           <w:sz w:val="21"/>
         </w:rPr>
-        <w:t>This technology assessment addresses the transferability of the released Microsoft/WSP case through five linked contributions. First, it reconstructs 24 released totals and audits the workbook cells to identify an unresolved GTP100/GWP100 inconsistency in the public archive. Second, it harmonizes nine eGRID releases from gas-specific emissions. Third, it calculates 71 Federal LCA Commons 2023 consumption systems with an openLCA-compatible JSON-LD workflow and reports process links, numerical residuals, and unlinked technosphere cutoffs rather than hiding them. Fourth, it derives exact, equal-width, deterministic rank-robustness certificates that distinguish the effects of grid, use phase, embodied burden, and service equivalence without assigning unsupported probabilities. Finally, it provides the open-source OpenDC-LCA comparison validator, which blocks incompatible functional units, boundaries, electricity accounting, LCIA methods, or missing field-level lineage while stating that metadata checks are not physical validation.</w:t>
+        <w:t>This technology assessment evaluates one released Microsoft/WSP case through four linked analyses. First, it reconstructs 24 released totals and audits the workbook cells to identify an unresolved GTP100/GWP100 inconsistency. Second, it harmonizes nine eGRID releases from gas-specific emissions and net generation. Third, it calculates 71 Federal LCA Commons 2023 consumption systems with an openLCA-compatible JSON-LD workflow and reports process links, numerical residuals, and unlinked technosphere cutoffs. Fourth, it derives exact equal-width deterministic rank-robustness certificates that distinguish grid, use-phase, embodied-burden, and service-equivalence sensitivity without assigning unsupported probabilities. OpenDC-LCA implements the accompanying comparison audit. It checks declared functional units, boundaries, electricity accounting, LCIA methods, and field-level lineage, but it does not replace openLCA or Brightway and does not physically validate a cooling system.</w:t>
       </w:r>
     </w:p>
     <w:p>
@@ -360,16 +360,7 @@
           <w:rFonts w:ascii="Calibri" w:hAnsi="Calibri"/>
           <w:sz w:val="21"/>
         </w:rPr>
-        <w:t>Together, the reconstruction addresses the missing public arithmetic in gap 1. The harmonization and linked-system calculations expose the method and boundary conflicts in gap 2. The rank-robustness certificates identify the measurements with decision leverage in gap 3. The OpenDC-LCA validator preserves the evidence class needed to prevent gap 4. OpenDC-LCA is therefore the reproducible implementation of this assessment layer, not a replacement for the process-network engines openLCA or Brightway.</w:t>
-      </w:r>
-    </w:p>
-    <w:p>
-      <w:r>
-        <w:rPr>
-          <w:rFonts w:ascii="Calibri" w:hAnsi="Calibri"/>
-          <w:sz w:val="21"/>
-        </w:rPr>
-        <w:t>The aim is not to reconstruct licensed background inventories or declare a winning cooling technology. It is to determine which claims survive a transferability audit and which require primary measurement, complete inventories, or external critical review.</w:t>
+        <w:t>The aim is to establish the evidentiary boundary of this released case. The assessment identifies which results can be reconstructed or transformed, which results remain numerical diagnostics, and which measurements or inventories are required before a cooling decision can be transferred to another facility.</w:t>
       </w:r>
     </w:p>
     <w:p>
@@ -498,6 +489,15 @@
           <w:sz w:val="21"/>
         </w:rPr>
         <w:t>The package supports a cooling-system cradle-to-grave boundary and a broader facility cradle-to-grave boundary. The former includes cooling and heat-rejection equipment, fluids, represented maintenance and replacement, operation, and end of life. The latter can also include building, electrical, and IT assets. Common systems may be excluded only when their quantity, performance, lifetime, and end-of-life treatment are unchanged. Onsite water and electricity-supply-chain water are reported separately. Location- and market-based electricity are not merged.</w:t>
+      </w:r>
+    </w:p>
+    <w:p>
+      <w:r>
+        <w:rPr>
+          <w:rFonts w:ascii="Calibri" w:hAnsi="Calibri"/>
+          <w:sz w:val="21"/>
+        </w:rPr>
+        <w:t>Operational validation uses a separate measurement boundary. The IT boundary must be metered, and every support-energy item must be classified as metered, allocated, or excluded. A facility PUE is permitted only when the numerator contains all support energy within the declared facility boundary. A dedicated support ratio may be reported for a smaller UPS and dedicated-cooling boundary, but it is not facility PUE. The repository measurement protocol defines the required electrical, thermal, workload, calibration, and provenance records for a shared-infrastructure site. It also requires a common workload before the service denominator can be compared across cooling architectures.</w:t>
       </w:r>
     </w:p>
     <w:p>
@@ -1875,7 +1875,7 @@
           <w:rFonts w:ascii="Calibri" w:hAnsi="Calibri"/>
           <w:sz w:val="21"/>
         </w:rPr>
-        <w:t>where CO2 is reported in short tons, CH4 and N2O in pounds, E_y in MWh, and the final factor converts pounds to kilograms. The provider-published CO2e rate was retained as a comparison. The provider U.S. aggregate, rather than the 50-state-plus-DC reconstruction, was used for national results. Puerto Rico was excluded from the state/DC panel. The resulting scope coverage was reported for each year.</w:t>
+        <w:t>where CO2 is reported in short tons, CH4 and N2O in pounds, E_y in MWh, and the final factor converts pounds to kilograms. The provider-published CO2e rate was retained as a comparison. The provider U.S. aggregate, rather than the 50-state-plus-DC reconstruction, was used for national results. Puerto Rico was excluded from the state/DC dataset. The resulting scope coverage was reported for each year.</w:t>
       </w:r>
     </w:p>
     <w:p>
@@ -1958,7 +1958,7 @@
           <w:rFonts w:ascii="Calibri" w:hAnsi="Calibri"/>
           <w:sz w:val="21"/>
         </w:rPr>
-        <w:t>The provider scope includes trade, transmission and distribution losses, and upstream fuel supply. Generation infrastructure is included only for the provider-specified gas, oil, coal, solar, wind, and geothermal technologies. other generation infrastructure and transmission/distribution infrastructure are outside scope [42]. The very low factors in some hydropower-dominated systems must not be interpreted as complete electricity LCAs.</w:t>
+        <w:t>The provider scope includes trade, transmission and distribution losses, and upstream fuel supply. Generation infrastructure is included only for the provider-specified gas, oil, coal, solar, wind, and geothermal technologies. Other generation infrastructure and transmission/distribution infrastructure are outside scope [42]. The very low factors in some hydropower-dominated systems must not be interpreted as complete electricity LCAs.</w:t>
       </w:r>
     </w:p>
     <w:p>
@@ -1975,7 +1975,7 @@
           <w:rFonts w:ascii="Calibri" w:hAnsi="Calibri"/>
           <w:sz w:val="21"/>
         </w:rPr>
-        <w:t>Each of the 459 state-year rates was classified as below, between, or above the two released electricity anchors. Equation (8) is interpolation only for the middle class.</w:t>
+        <w:t>Each of the 459 state-year rates was classified as below, between, or above the two released electricity anchors. Equation (8) is interpolation only for the middle class, and its intersections are released-workbook numerical crossovers rather than physical thresholds or facility decision rules.</w:t>
       </w:r>
     </w:p>
     <w:p>
@@ -1984,7 +1984,7 @@
           <w:rFonts w:ascii="Calibri" w:hAnsi="Calibri"/>
           <w:sz w:val="21"/>
         </w:rPr>
-        <w:t>The earlier analysis added transparent allowances of 0, 25, 50, 75, and 100 kg CO2e/MWh to every 2023 eGRID rate. Those values were not data-based and are retained only in the Supplementary Information as a diagnostic of the direct generation boundary. The primary boundary analysis instead uses the partial linked-system factors in Section 2.7. We also report the exact numerical clearance between the lowest 2023 direct rate and the cold-plate/single-phase crossover, g^*-\min(g_s), without interpreting it as an upstream estimate.</w:t>
+        <w:t>The earlier analysis added transparent allowances of 0, 25, 50, 75, and 100 kg CO2e/MWh to every 2023 eGRID rate. Those values were not data-based and are retained only in the Supplementary Information as a diagnostic of the direct generation boundary. The primary boundary analysis instead uses the partial linked-system factors in Section 2.7. We also report the exact numerical clearance between the lowest 2023 direct rate and the cold-plate/single-phase released-workbook crossover, g^*-\min(g_s), without interpreting it as an upstream estimate.</w:t>
       </w:r>
     </w:p>
     <w:p>
@@ -2776,7 +2776,7 @@
           <w:rFonts w:ascii="Calibri" w:hAnsi="Calibri"/>
           <w:sz w:val="21"/>
         </w:rPr>
-        <w:t>The common-basis U.S. generation factor declined from 517.731 kg CO2e/MWh in 2012 to 349.667 kg CO2e/MWh in 2023, a 32.462% reduction. The trajectory was not monotonic. The factor rose from 373.097 in 2020 to 388.699 in 2021 before declining. Reconstructing every year with AR5 GWP100 changed the provider-published national rate by no more than 0.248 kg CO2e/MWh, in 2012. The direct CO2-only rate was 348.000 kg/MWh in 2023. Thus, the long-run decline is not an artifact of eGRID's transition from SAR to AR4 and AR5.</w:t>
+        <w:t>The common-basis U.S. generation factor declined from 517.731 kg CO2e/MWh in 2012 to 349.667 kg CO2e/MWh in 2023, a 32.462% reduction. The trajectory was not monotonic. The factor rose from 373.097 in 2020 to 388.699 in 2021 before declining. Reconstructing every year with AR5 GWP100 changed the provider-published national rate by no more than 0.248 kg CO2e/MWh, in 2012. The direct CO2-only rate was 348.000 kg/MWh in 2023. The long-run decline is therefore not an artifact of eGRID's transition from SAR to AR4 and AR5.</w:t>
       </w:r>
     </w:p>
     <w:p>
@@ -2785,7 +2785,7 @@
           <w:rFonts w:ascii="Calibri" w:hAnsi="Calibri"/>
           <w:sz w:val="21"/>
         </w:rPr>
-        <w:t>The 50-state-plus-DC reconstruction matched the official national result through 2018. From 2019 onward it was 0.32-0.43% lower because the panel covered 99.55-99.58% of the provider U.S. generation after excluding Puerto Rico. Figure 3 places all 459 harmonized state/DC generation rates from nine eGRID releases on a common kg CO2e/MWh axis, overlays the reported provider U.S. aggregate trajectory as an orange polyline, and identifies points below the 96.704 kg CO2e/MWh cold-plate/single-phase crossover in blue. The provider aggregate was retained for the national series and was not fitted to the state/DC points. Across the full panel, 137 of 459 numerical rates lay outside the two released cooling anchors, so 29.85% of the transfers were extrapolations.</w:t>
+        <w:t>The 50-state-plus-DC reconstruction matched the official national result through 2018. From 2019 onward it was 0.32-0.43% lower because the dataset covered 99.55-99.58% of the provider U.S. generation after excluding Puerto Rico. Figure 3 places all 459 harmonized state/DC generation rates from nine eGRID releases on a common kg CO2e/MWh axis, overlays the reported provider U.S. aggregate trajectory as an orange polyline, and identifies points below the 96.704 kg CO2e/MWh cold-plate/single-phase crossover in blue. The provider aggregate was retained for the national series and was not fitted to the state/DC points. Across the full dataset, 137 of 459 numerical rates lay outside the two released cooling anchors, so 29.85% of the transfers were extrapolations.</w:t>
       </w:r>
     </w:p>
     <w:p>
@@ -2798,7 +2798,7 @@
         <w:drawing>
           <wp:inline xmlns:a="http://schemas.openxmlformats.org/drawingml/2006/main" xmlns:pic="http://schemas.openxmlformats.org/drawingml/2006/picture">
             <wp:extent cx="5897880" cy="3324930"/>
-            <wp:docPr id="3" name="Picture 3" descr="Figure 3. Harmonized AR5-GWP100 eGRID state/DC generation rates for nine releases, with electricity intensity on the horizontal axis in kg CO2e/MWh. The orange polyline connects the reported provider U.S. aggregate for each year. Blue points fall below the released-model numerical cold-plate/single-phase crossover. These are direct-generation scenarios, not consumption LCIs or state cooling LCAs." title="OpenDC-LCA Figure 3"/>
+            <wp:docPr id="3" name="Picture 3" descr="Figure 3. Harmonized AR5-GWP100 eGRID state/DC generation rates for nine releases, with electricity intensity on the horizontal axis in kg CO2e/MWh. The orange polyline connects the reported provider U.S. aggregate for each year. Blue points fall below the released-workbook numerical cold-plate/single-phase crossover. These are direct-generation scenarios, not consumption LCIs, state cooling LCAs, or facility decision thresholds." title="OpenDC-LCA Figure 3"/>
             <wp:cNvGraphicFramePr>
               <a:graphicFrameLocks noChangeAspect="1"/>
             </wp:cNvGraphicFramePr>
@@ -2838,7 +2838,7 @@
           <w:rFonts w:ascii="Calibri" w:hAnsi="Calibri"/>
           <w:sz w:val="18"/>
         </w:rPr>
-        <w:t>Figure 3. Harmonized AR5-GWP100 eGRID state/DC generation rates for nine releases, with electricity intensity on the horizontal axis in kg CO2e/MWh. The orange polyline connects the reported provider U.S. aggregate for each year. Blue points fall below the released-model numerical cold-plate/single-phase crossover. These are direct-generation scenarios, not consumption LCIs or state cooling LCAs.</w:t>
+        <w:t>Figure 3. Harmonized AR5-GWP100 eGRID state/DC generation rates for nine releases, with electricity intensity on the horizontal axis in kg CO2e/MWh. The orange polyline connects the reported provider U.S. aggregate for each year. Blue points fall below the released-workbook numerical cold-plate/single-phase crossover. These are direct-generation scenarios, not consumption LCIs, state cooling LCAs, or facility decision thresholds.</w:t>
       </w:r>
     </w:p>
     <w:p>
@@ -2873,7 +2873,7 @@
           <w:rFonts w:ascii="Calibri" w:hAnsi="Calibri"/>
           <w:sz w:val="21"/>
         </w:rPr>
-        <w:t>All 10 FERC-region systems exceeded the 96.704 kg CO2e/MWh numerical cold-plate/single-phase crossover. Their factors ranged from 238.897 kg CO2e/MWh for NYISO to 557.110 kg CO2e/MWh for MISO. Ten of 60 balancing-authority systems fell below the crossover, and 15 of all 71 systems exceeded the released high anchor of 524.893 kg CO2e/MWh. The numerical cooling screen placed two-phase first in all 71 systems, but this is not a common-method comparative LCA because the cooling foreground method remains unresolved.</w:t>
+        <w:t>All 10 FERC-region systems exceeded the 96.704 kg CO2e/MWh released-workbook numerical cold-plate/single-phase crossover. Their factors ranged from 238.897 kg CO2e/MWh for NYISO to 557.110 kg CO2e/MWh for MISO. Ten of 60 balancing-authority systems fell below the crossover, and 15 of all 71 systems exceeded the released high anchor of 524.893 kg CO2e/MWh. The numerical cooling screen placed two-phase first in all 71 systems, but this is not a common-method comparative LCA because the cooling foreground method remains unresolved.</w:t>
       </w:r>
     </w:p>
     <w:p>
@@ -2904,7 +2904,7 @@
         <w:drawing>
           <wp:inline xmlns:a="http://schemas.openxmlformats.org/drawingml/2006/main" xmlns:pic="http://schemas.openxmlformats.org/drawingml/2006/picture">
             <wp:extent cx="5897880" cy="4030218"/>
-            <wp:docPr id="4" name="Picture 4" descr="Figure 4. IPCC AR5-GWP100 partial linked-system electricity factors for 10 FERC regions and the United States. The horizontal axis is kg CO2e/MWh delivered at the user. Bars separate generation-process impacts from other linked upstream and infrastructure impacts. The green dashed line marks the 96.704 kg CO2e/MWh cold-plate/single-phase numerical crossover. The purple dashed line marks the 524.893 kg CO2e/MWh released high numerical anchor. Neither line creates method equivalence." title="OpenDC-LCA Figure 4"/>
+            <wp:docPr id="4" name="Picture 4" descr="Figure 4. IPCC AR5-GWP100 partial linked-system electricity factors for 10 FERC regions and the United States. The horizontal axis is kg CO2e/MWh delivered at the user. Bars separate generation-process impacts from other linked upstream and infrastructure impacts. The green dashed line marks the 96.704 kg CO2e/MWh released-workbook numerical crossover. The purple dashed line marks the 524.893 kg CO2e/MWh released high numerical anchor. Neither line creates method equivalence or a facility decision threshold." title="OpenDC-LCA Figure 4"/>
             <wp:cNvGraphicFramePr>
               <a:graphicFrameLocks noChangeAspect="1"/>
             </wp:cNvGraphicFramePr>
@@ -2944,7 +2944,7 @@
           <w:rFonts w:ascii="Calibri" w:hAnsi="Calibri"/>
           <w:sz w:val="18"/>
         </w:rPr>
-        <w:t>Figure 4. IPCC AR5-GWP100 partial linked-system electricity factors for 10 FERC regions and the United States. The horizontal axis is kg CO2e/MWh delivered at the user. Bars separate generation-process impacts from other linked upstream and infrastructure impacts. The green dashed line marks the 96.704 kg CO2e/MWh cold-plate/single-phase numerical crossover. The purple dashed line marks the 524.893 kg CO2e/MWh released high numerical anchor. Neither line creates method equivalence.</w:t>
+        <w:t>Figure 4. IPCC AR5-GWP100 partial linked-system electricity factors for 10 FERC regions and the United States. The horizontal axis is kg CO2e/MWh delivered at the user. Bars separate generation-process impacts from other linked upstream and infrastructure impacts. The green dashed line marks the 96.704 kg CO2e/MWh released-workbook numerical crossover. The purple dashed line marks the 524.893 kg CO2e/MWh released high numerical anchor. Neither line creates method equivalence or a facility decision threshold.</w:t>
       </w:r>
     </w:p>
     <w:p>
@@ -2961,7 +2961,7 @@
           <w:rFonts w:ascii="Calibri" w:hAnsi="Calibri"/>
           <w:sz w:val="21"/>
         </w:rPr>
-        <w:t>Figure 5 compares the national critical half-widths for shared grid, use phase, embodied burden, service equivalence, and simultaneous equal-width variation in panel A. Panel B plots the all-block critical half-width against lifecycle electricity intensity for 60 balancing authorities, 10 FERC regions, and the national system.</w:t>
+        <w:t>Fig. 5a compares the national critical half-widths for shared grid, use phase, embodied burden, service equivalence, and simultaneous equal-width variation. Fig. 5b plots the all-block critical half-width against lifecycle electricity intensity for 60 balancing authorities, 10 FERC regions, and the national system.</w:t>
       </w:r>
     </w:p>
     <w:p>
@@ -3010,7 +3010,7 @@
         <w:drawing>
           <wp:inline xmlns:a="http://schemas.openxmlformats.org/drawingml/2006/main" xmlns:pic="http://schemas.openxmlformats.org/drawingml/2006/picture">
             <wp:extent cx="5897880" cy="3538728"/>
-            <wp:docPr id="5" name="Picture 5" descr="Figure 5. Deterministic equal-width rank-robustness certificates. (A) National critical half-width by active block. (B) all-block thresholds across 60 balancing authorities, 10 FERC regions, and the national system. Bounds are uncertainty sets, not probability distributions or physical validation." title="OpenDC-LCA Figure 5"/>
+            <wp:docPr id="5" name="Picture 5" descr="Figure 5. Deterministic equal-width rank-robustness certificates. (a) Critical half-widths for the national lifecycle-electricity context by active assumption block. (b) All-block critical half-widths plotted against partial linked-system electricity intensity for 60 balancing authorities, 10 FERC regions, and the national system. Bounds are uncertainty sets rather than probability distributions or physical validation." title="OpenDC-LCA Figure 5"/>
             <wp:cNvGraphicFramePr>
               <a:graphicFrameLocks noChangeAspect="1"/>
             </wp:cNvGraphicFramePr>
@@ -3050,7 +3050,7 @@
           <w:rFonts w:ascii="Calibri" w:hAnsi="Calibri"/>
           <w:sz w:val="18"/>
         </w:rPr>
-        <w:t>Figure 5. Deterministic equal-width rank-robustness certificates. (A) National critical half-width by active block. (B) all-block thresholds across 60 balancing authorities, 10 FERC regions, and the national system. Bounds are uncertainty sets, not probability distributions or physical validation.</w:t>
+        <w:t>Figure 5. Deterministic equal-width rank-robustness certificates. (a) Critical half-widths for the national lifecycle-electricity context by active assumption block. (b) All-block critical half-widths plotted against partial linked-system electricity intensity for 60 balancing authorities, 10 FERC regions, and the national system. Bounds are uncertainty sets rather than probability distributions or physical validation.</w:t>
       </w:r>
     </w:p>
     <w:p>
@@ -3082,7 +3082,7 @@
           <w:rFonts w:ascii="Calibri" w:hAnsi="Calibri"/>
           <w:sz w:val="21"/>
         </w:rPr>
-        <w:t xml:space="preserve"> candidates, 48 included records spanned 465-2,503 kg CO2e/server for manufacturing, a 5.38-fold range. Annualized values spanned 116-626 kg CO2e/server-year. Commonly scaling the released server-related contributions across the empirical 0.38-2.06-fold annualized envelope did not change the deterministic two-phase first rank. That structural stress does not model architecture-specific server count, configuration, throughput, or lifetime.</w:t>
+        <w:t xml:space="preserve"> candidates, 48 eligible records spanned 465-2,503 kg CO2e/server for manufacturing, a 5.38-fold range. Annualized values spanned 116-626 kg CO2e/server-year. Commonly scaling the released server-related contributions across the empirical 0.38-2.06-fold annualized envelope did not change the deterministic two-phase first rank. That structural stress does not model architecture-specific server count, configuration, throughput, or lifetime.</w:t>
       </w:r>
     </w:p>
     <w:p>
@@ -3342,7 +3342,7 @@
         <w:pStyle w:val="Heading2"/>
       </w:pPr>
       <w:r>
-        <w:t>4.7. Hyperscale applications</w:t>
+        <w:t>4.7. Operational validation</w:t>
       </w:r>
     </w:p>
     <w:p>
@@ -3370,6 +3370,15 @@
           <w:sz w:val="21"/>
         </w:rPr>
         <w:t>The custom-boundary validator now classifies each energy item as metered, allocated, or excluded. Metered records identify their meter, allocated records identify an allocation method, and excluded records state a rationale. A facility-PUE label requires a complete energy-item inventory, a metered IT-load boundary, and no excluded shared-support item. A partial record can instead report a dedicated-support ratio for the stated UPS and dedicated-cooling boundary. This check does not authenticate meter data or determine whether an allocation is physically representative, but it prevents incomplete shared infrastructure from being silently labeled as facility energy.</w:t>
+      </w:r>
+    </w:p>
+    <w:p>
+      <w:r>
+        <w:rPr>
+          <w:rFonts w:ascii="Calibri" w:hAnsi="Calibri"/>
+          <w:sz w:val="21"/>
+        </w:rPr>
+        <w:t>The next study stage requires synchronized interval records rather than a single annual utility total. The shared-infrastructure measurement protocol requires UPS input and output, dedicated cooling and pump electricity, shared support electricity or an allocation basis, chilled-loop temperature and flow, glycol concentration, environmental conditions, and meter calibration records. It also requires completed workload or benchmark output, hardware configuration, and availability over the same intervals. These records allow a dedicated support ratio to be calculated without calling it PUE. They permit a facility PUE only when the full shared-support boundary is metered or allocated. They also create the common service denominator needed for an architecture-level comparison.</w:t>
       </w:r>
     </w:p>
     <w:p>
@@ -3386,7 +3395,7 @@
         <w:pStyle w:val="Heading2"/>
       </w:pPr>
       <w:r>
-        <w:t>4.8. Limitations and evidence requirements</w:t>
+        <w:t>4.8. Evidence requirements and limitations</w:t>
       </w:r>
     </w:p>
     <w:p>
@@ -3413,7 +3422,16 @@
           <w:rFonts w:ascii="Calibri" w:hAnsi="Calibri"/>
           <w:sz w:val="21"/>
         </w:rPr>
-        <w:t>The evidence supports a methodological Technology Assessment of transferability, not a public assertion that one cooling architecture is environmentally preferable. Such an assertion would require resolved common-method inventories, reviewed primary performance and useful-computation data, architecture bills of quantities, water-scarcity characterization, empirically supported joint uncertainty, and an external critical review panel.</w:t>
+        <w:t>The evidence supports a methodological Technology Assessment of transferability, not a public assertion that one cooling architecture is environmentally preferable. Such an assertion would require resolved common-method inventories, reviewed primary performance and useful-computation data, architecture bills of quantities, water-scarcity characterization, empirically supported joint uncertainty, and an external critical review.</w:t>
+      </w:r>
+    </w:p>
+    <w:p>
+      <w:r>
+        <w:rPr>
+          <w:rFonts w:ascii="Calibri" w:hAnsi="Calibri"/>
+          <w:sz w:val="21"/>
+        </w:rPr>
+        <w:t>The next reproducibility gate is distinct from the next measurement gate. The national, low, and high Federal electricity systems must be independently reproduced in openLCA or Brightway using the same JSON-LD product systems and IPCC method. The comparison should report the software version, target amount, process count, link count, characterized total, and unlinked-exchange count. Any difference must be traced to unit conversion, provider resolution, characterization, or cutoff treatment. Until this check and a quantitative cutoff bound are available, the partial linked-system factors remain an auditable screen rather than a benchmark.</w:t>
       </w:r>
     </w:p>
     <w:p>
@@ -3430,7 +3448,7 @@
           <w:rFonts w:ascii="Calibri" w:hAnsi="Calibri"/>
           <w:sz w:val="21"/>
         </w:rPr>
-        <w:t>This assessment separates three evidence levels that had previously been combined. These levels are reproduced source arithmetic, direct-generation trend analysis, and conditional cooling screens. All 24 published totals were arithmetically reproduced, but the public archive does not resolve whether the two numeric electricity endpoints used by the screening axis are AR5 GWP100 or GTP100. Cooling ranks derived from that axis cannot be interpreted as common-method comparative LCA results.</w:t>
+        <w:t>Four conclusions follow from the transferability audit. First, all 24 published totals were arithmetically reproduced, but the public archive does not resolve whether the two numeric electricity endpoints used by the screening axis are AR5 GWP100 or GTP100. Cooling ranks derived from that axis cannot be interpreted as common-method comparative LCA results.</w:t>
       </w:r>
     </w:p>
     <w:p>
@@ -3439,7 +3457,7 @@
           <w:rFonts w:ascii="Calibri" w:hAnsi="Calibri"/>
           <w:sz w:val="21"/>
         </w:rPr>
-        <w:t>The national eGRID generation factor declined 32.46% from 2012 to 2023 after all nine releases were harmonized to AR5 GWP100. The Federal LCA Commons national consumption system yielded 422.93 kg CO2e/MWh, including 53.08 kg CO2e/MWh from linked processes beyond generation, and all 10 FERC regions lay above the 96.70 kg CO2e/MWh numerical crossover. These partial linked-system factors retain documented technosphere cutoffs and require independent calculator verification before benchmark use.</w:t>
+        <w:t>Second, the national eGRID generation factor declined 32.46% from 2012 to 2023 after all nine releases were harmonized to AR5 GWP100. The Federal LCA Commons national consumption system yielded 422.93 kg CO2e/MWh, including 53.08 kg CO2e/MWh from linked processes beyond generation, and all 10 FERC regions lay above the 96.70 kg CO2e/MWh numerical crossover. These partial linked-system factors retain documented technosphere cutoffs and require independent calculator verification before benchmark use.</w:t>
       </w:r>
     </w:p>
     <w:p>
@@ -3448,7 +3466,7 @@
           <w:rFonts w:ascii="Calibri" w:hAnsi="Calibri"/>
           <w:sz w:val="21"/>
         </w:rPr>
-        <w:t>Equal-width robustness analysis corrected the earlier attribution of rank loss to embodied variation. At the national lifecycle factor, the first-rank screen failed at 2.64% service-equivalence variation, 2.99% use-phase variation, and 22.15% embodied variation. Simultaneous equal-width changes failed at 1.32%. The dominant near-term evidence needs are architecture-resolved useful computation and use-phase demand, followed by complete bills of quantities and common-method inventories.</w:t>
+        <w:t>Third, equal-width robustness analysis corrected the earlier attribution of rank loss to embodied variation. At the national lifecycle factor, the first-rank screen failed at 2.64% service-equivalence variation, 2.99% use-phase variation, and 22.15% embodied variation. Simultaneous equal-width changes failed at 1.32%. The dominant near-term evidence needs are architecture-resolved useful computation and use-phase demand, followed by complete bills of quantities and common-method inventories.</w:t>
       </w:r>
     </w:p>
     <w:p>
@@ -3457,7 +3475,7 @@
           <w:rFonts w:ascii="Calibri" w:hAnsi="Calibri"/>
           <w:sz w:val="21"/>
         </w:rPr>
-        <w:t>The OpenDC-LCA validator rejects configured comparisons whose declared metadata contain mismatched functional units, boundaries, electricity accounting, LCIA methods, or missing field-level source mappings. This check detects declared incompatibilities but does not verify the underlying science. The study is suitable as a transferability Technology Assessment. It does not support a public claim of environmental superiority among cooling architectures.</w:t>
+        <w:t>Fourth, the OpenDC-LCA validator rejects configured comparisons whose declared metadata contain mismatched functional units, boundaries, electricity accounting, LCIA methods, or missing field-level source mappings. This check detects declared incompatibilities but does not verify the underlying science. The study is suitable as a transferability Technology Assessment. It does not support a public claim of environmental superiority among cooling architectures.</w:t>
       </w:r>
     </w:p>
     <w:p>
@@ -3474,7 +3492,7 @@
           <w:rFonts w:ascii="Calibri" w:hAnsi="Calibri"/>
           <w:sz w:val="21"/>
         </w:rPr>
-        <w:t>OpenDC-LCA version 1.1.0 is publicly available at https://github.com/UARK-NED3/OpenDC-LCA and https://github.com/UARK-NED3/OpenDC-LCA/releases/tag/v1.1.0. The development revision evaluated here adds the Federal LCA Commons solver, cutoff reporting, equal-width robustness certificates, and comparison-level metadata checks. It will be tagged and archived before submission. Analysis metadata and the provider-file manifest record file sizes and SHA-256 checksums. Provider-native files remain outside Git when redistribution permission is unclear or a large upstream archive has not been reviewed for redistribution. The Microsoft archive, eGRID files, Federal LCA Commons baseline and method, and NOAA data are available from their public providers [15,40-42,45]. No DOI-bearing software archive is available at the time of this draft.</w:t>
+        <w:t>OpenDC-LCA version 1.1.0 is publicly available at https://github.com/UARK-NED3/OpenDC-LCA and https://github.com/UARK-NED3/OpenDC-LCA/releases/tag/v1.1.0. The development revision evaluated here adds the Federal LCA Commons solver, cutoff reporting, equal-width robustness certificates, and comparison-level metadata checks. It is recorded in the local execution manifest with file hashes and dirty-worktree status, but it is not yet an immutable public release. Before submission, the authors must create a clean tag, archive the exact code, derived tables, figures, manuscript source, environment specification, and provenance manifest, and insert the issued version DOI here. Provider-native files remain outside Git when redistribution permission is unclear or a large upstream archive has not been reviewed for redistribution. The Microsoft archive, eGRID files, Federal LCA Commons baseline and method, and NOAA data are available from their public providers [15,40-42,45]. No DOI-bearing archive for the exact manuscript revision is available at the time of this draft.</w:t>
       </w:r>
     </w:p>
     <w:p>
@@ -3509,6 +3527,23 @@
           <w:sz w:val="21"/>
         </w:rPr>
         <w:t>This secondary study used public or author-held engineering datasets and did not involve human participants or animals. Research-ethics approval was not required.</w:t>
+      </w:r>
+    </w:p>
+    <w:p>
+      <w:pPr>
+        <w:pStyle w:val="Heading1"/>
+      </w:pPr>
+      <w:r>
+        <w:t>Author-contribution and funding confirmation</w:t>
+      </w:r>
+    </w:p>
+    <w:p>
+      <w:r>
+        <w:rPr>
+          <w:rFonts w:ascii="Calibri" w:hAnsi="Calibri"/>
+          <w:sz w:val="21"/>
+        </w:rPr>
+        <w:t>A CRediT author-contribution statement, funding statement, acknowledgments, and confirmation of any additional competing interests require all-author approval before submission. They are not inferred in this draft.</w:t>
       </w:r>
     </w:p>
     <w:p>

</xml_diff>

<commit_message>
Add transferability evidence map and archetype contract
</commit_message>
<xml_diff>
--- a/paper/OpenDC-LCA_manuscript.docx
+++ b/paper/OpenDC-LCA_manuscript.docx
@@ -342,7 +342,7 @@
           <w:rFonts w:ascii="Calibri" w:hAnsi="Calibri"/>
           <w:sz w:val="21"/>
         </w:rPr>
-        <w:t>Four gaps remain at the intersection of cooling engineering and LCA. First, published normalized totals cannot be transparently updated when foreground quantities and licensed process mappings are incomplete. Second, common-unit electricity factors can retain incompatible characterization methods and system boundaries. Third, qualitative data-quality scores do not directly show which measurement could change the technology decision. Fourth, software often produces a number without preserving whether it is reconstructed, screened, empirically supported, or suitable for a comparative claim.</w:t>
+        <w:t>Five gaps remain at the intersection of cooling engineering and LCA. First, published normalized totals cannot be transparently updated when foreground quantities and licensed process mappings are incomplete. Second, common-unit electricity factors can retain incompatible characterization methods and system boundaries. Third, qualitative data-quality scores do not directly show which measurement could change the technology decision. Fourth, software often produces a number without preserving whether it is reconstructed, screened, empirically supported, or suitable for a comparative claim. Fifth, the literature rarely records the minimum metadata needed to determine whether a published result can be numerically transferred to another facility.</w:t>
       </w:r>
     </w:p>
     <w:p>
@@ -351,7 +351,7 @@
           <w:rFonts w:ascii="Calibri" w:hAnsi="Calibri"/>
           <w:sz w:val="21"/>
         </w:rPr>
-        <w:t>This technology assessment evaluates one released Microsoft/WSP case through four linked analyses. First, it reconstructs 24 released totals and audits the workbook cells to identify an unresolved GTP100/GWP100 inconsistency. Second, it harmonizes nine eGRID releases from gas-specific emissions and net generation. Third, it calculates 71 Federal LCA Commons 2023 consumption systems with an openLCA-compatible JSON-LD workflow and reports process links, numerical residuals, and unlinked technosphere cutoffs. Fourth, it derives exact equal-width deterministic rank-robustness certificates that distinguish grid, use-phase, embodied-burden, and service-equivalence sensitivity without assigning unsupported probabilities. OpenDC-LCA implements the accompanying comparison audit. It checks declared functional units, boundaries, electricity accounting, LCIA methods, and field-level lineage, but it does not replace openLCA or Brightway and does not physically validate a cooling system.</w:t>
+        <w:t>This technology assessment evaluates one released Microsoft/WSP case through six linked analyses. First, it reconstructs 24 released totals and audits the workbook cells to identify an unresolved GTP100/GWP100 inconsistency. Second, it harmonizes nine eGRID releases from gas-specific emissions and net generation. Third, it calculates 71 Federal LCA Commons 2023 consumption systems with an openLCA-compatible JSON-LD workflow and reports process links, numerical residuals, and unlinked technosphere cutoffs. Fourth, it derives exact equal-width deterministic rank-robustness certificates that distinguish grid, use-phase, embodied-burden, and service-equivalence sensitivity without assigning unsupported probabilities. Fifth, it records the audit state of four cited cooling-LCA records without inferring unavailable information from an article. Sixth, it encodes an EnergyPlus reference-archetype contract from Sun et al. [49] but reports no model output because the reference model was not executed or calibrated. OpenDC-LCA implements the accompanying comparison audit. It checks declared functional units, boundaries, electricity accounting, LCIA methods, and field-level lineage, but it does not replace openLCA or Brightway and does not physically validate a cooling system.</w:t>
       </w:r>
     </w:p>
     <w:p>
@@ -2677,6 +2677,32 @@
     </w:p>
     <w:p>
       <w:pPr>
+        <w:pStyle w:val="Heading2"/>
+      </w:pPr>
+      <w:r>
+        <w:t>2.12. Cross-study evidence map and archetype contract</w:t>
+      </w:r>
+    </w:p>
+    <w:p>
+      <w:r>
+        <w:rPr>
+          <w:rFonts w:ascii="Calibri" w:hAnsi="Calibri"/>
+          <w:sz w:val="21"/>
+        </w:rPr>
+        <w:t>The rapid evidence map evaluates four cooling-LCA records already included in the literature context [12,14-16,19]. Each record is assigned a separate status for the functional unit, system boundary, cooling-performance evidence, numeric artifact, LCIA-method identity, and workload equivalence. A status of not audited means only that the present repository did not inspect that source beyond the article-level record. It does not indicate that the authors failed to provide an artifact or that their study is unsuitable for its stated goal. The map is therefore a reproducible audit-scope statement, not a systematic review or a study-quality score.</w:t>
+      </w:r>
+    </w:p>
+    <w:p>
+      <w:r>
+        <w:rPr>
+          <w:rFonts w:ascii="Calibri" w:hAnsi="Calibri"/>
+          <w:sz w:val="21"/>
+        </w:rPr>
+        <w:t>The extension also records the two reference prototypes published by Sun et al. [49]. The small computer-room archetype uses CRAC units at 40 and 100 W/ft2 of IT-equipment load. The large stand-alone archetype uses CRAH units and a central chiller plant at 100 and 500 W/ft2. They are useful starting points for future climate and load scenarios. The present environment contained no EnergyPlus or OpenStudio executable. No prototype was run, no AHPCC calibration was attempted, and no EnergyPlus result enters an LCA calculation. The contract prohibits treating an air-side archetype as a liquid-cooling model or as a representation of the shared AHPCC facility.</w:t>
+      </w:r>
+    </w:p>
+    <w:p>
+      <w:pPr>
         <w:pStyle w:val="Heading1"/>
       </w:pPr>
       <w:r>
@@ -3125,7 +3151,86 @@
         <w:pStyle w:val="Heading2"/>
       </w:pPr>
       <w:r>
-        <w:t>3.7. Software verification and practitioner outputs</w:t>
+        <w:t>3.7. Cross-study evidence map and archetype status</w:t>
+      </w:r>
+    </w:p>
+    <w:p>
+      <w:r>
+        <w:rPr>
+          <w:rFonts w:ascii="Calibri" w:hAnsi="Calibri"/>
+          <w:sz w:val="21"/>
+        </w:rPr>
+        <w:t>Figure 6 shows the per-record evidence status for the four-study rapid map. The Microsoft/WSP record was the only one for which this repository audited a public numeric archive. It documented the released functional unit and system boundary, but the audit retained unresolved statuses for cooling-performance evidence, LCIA-method identity, and workload equivalence. The remaining three records are article-level context only. Their not-audited cells describe the scope of this repository rather than an absence of source material. None of the four records is numerically transferable across every declared gate.</w:t>
+      </w:r>
+    </w:p>
+    <w:p>
+      <w:r>
+        <w:rPr>
+          <w:rFonts w:ascii="Calibri" w:hAnsi="Calibri"/>
+          <w:sz w:val="21"/>
+        </w:rPr>
+        <w:t>The EnergyPlus contract records a small CRAC computer room and a large CRAH-plus-chiller data center with the published IT-load-density pairs [49]. The runtime audit found neither EnergyPlus nor OpenStudio. The repository therefore reports a blocked execution status and no simulated energy, PUE, water, emissions, or technology ranking. This negative result is important because an unrun archetype must not be presented as independent operational evidence.</w:t>
+      </w:r>
+    </w:p>
+    <w:p>
+      <w:pPr>
+        <w:keepNext/>
+        <w:spacing w:before="120" w:after="40"/>
+        <w:jc w:val="center"/>
+      </w:pPr>
+      <w:r>
+        <w:drawing>
+          <wp:inline xmlns:a="http://schemas.openxmlformats.org/drawingml/2006/main" xmlns:pic="http://schemas.openxmlformats.org/drawingml/2006/picture">
+            <wp:extent cx="5897880" cy="2059343"/>
+            <wp:docPr id="6" name="Picture 6" descr="Figure 6. Rapid cross-study transferability evidence map. Each cell states whether the present repository documented, left unresolved, or did not audit the required evidence element. The four rows cover the Microsoft/WSP archive and three article-level contextual records. The map is an audit-scope statement, not a judgment of the cited studies or an assertion that unreviewed artifacts do not exist." title="OpenDC-LCA Figure 6"/>
+            <wp:cNvGraphicFramePr>
+              <a:graphicFrameLocks noChangeAspect="1"/>
+            </wp:cNvGraphicFramePr>
+            <a:graphic>
+              <a:graphicData uri="http://schemas.openxmlformats.org/drawingml/2006/picture">
+                <pic:pic>
+                  <pic:nvPicPr>
+                    <pic:cNvPr id="0" name="figure12_transferability_evidence_map.png"/>
+                    <pic:cNvPicPr/>
+                  </pic:nvPicPr>
+                  <pic:blipFill>
+                    <a:blip r:embed="rId16"/>
+                    <a:stretch>
+                      <a:fillRect/>
+                    </a:stretch>
+                  </pic:blipFill>
+                  <pic:spPr>
+                    <a:xfrm>
+                      <a:off x="0" y="0"/>
+                      <a:ext cx="5897880" cy="2059343"/>
+                    </a:xfrm>
+                    <a:prstGeom prst="rect"/>
+                  </pic:spPr>
+                </pic:pic>
+              </a:graphicData>
+            </a:graphic>
+          </wp:inline>
+        </w:drawing>
+      </w:r>
+    </w:p>
+    <w:p>
+      <w:pPr>
+        <w:pStyle w:val="Caption"/>
+      </w:pPr>
+      <w:r>
+        <w:rPr>
+          <w:rFonts w:ascii="Calibri" w:hAnsi="Calibri"/>
+          <w:sz w:val="18"/>
+        </w:rPr>
+        <w:t>Figure 6. Rapid cross-study transferability evidence map. Each cell states whether the present repository documented, left unresolved, or did not audit the required evidence element. The four rows cover the Microsoft/WSP archive and three article-level contextual records. The map is an audit-scope statement, not a judgment of the cited studies or an assertion that unreviewed artifacts do not exist.</w:t>
+      </w:r>
+    </w:p>
+    <w:p>
+      <w:pPr>
+        <w:pStyle w:val="Heading2"/>
+      </w:pPr>
+      <w:r>
+        <w:t>3.8. Software verification and practitioner outputs</w:t>
       </w:r>
     </w:p>
     <w:p>
@@ -3448,7 +3553,7 @@
           <w:rFonts w:ascii="Calibri" w:hAnsi="Calibri"/>
           <w:sz w:val="21"/>
         </w:rPr>
-        <w:t>Four conclusions follow from the transferability audit. First, all 24 published totals were arithmetically reproduced, but the public archive does not resolve whether the two numeric electricity endpoints used by the screening axis are AR5 GWP100 or GTP100. Cooling ranks derived from that axis cannot be interpreted as common-method comparative LCA results.</w:t>
+        <w:t>Five conclusions follow from the transferability audit. First, all 24 published totals were arithmetically reproduced, but the public archive does not resolve whether the two numeric electricity endpoints used by the screening axis are AR5 GWP100 or GTP100. Cooling ranks derived from that axis cannot be interpreted as common-method comparative LCA results.</w:t>
       </w:r>
     </w:p>
     <w:p>
@@ -3475,7 +3580,25 @@
           <w:rFonts w:ascii="Calibri" w:hAnsi="Calibri"/>
           <w:sz w:val="21"/>
         </w:rPr>
-        <w:t>Fourth, the OpenDC-LCA validator rejects configured comparisons whose declared metadata contain mismatched functional units, boundaries, electricity accounting, LCIA methods, or missing field-level source mappings. This check detects declared incompatibilities but does not verify the underlying science. The study is suitable as a transferability Technology Assessment. It does not support a public claim of environmental superiority among cooling architectures.</w:t>
+        <w:t>Fourth, the OpenDC-LCA validator rejects configured comparisons whose declared metadata contain mismatched functional units, boundaries, electricity accounting, LCIA methods, or missing field-level source mappings. This check detects declared incompatibilities but does not verify the underlying science.</w:t>
+      </w:r>
+    </w:p>
+    <w:p>
+      <w:r>
+        <w:rPr>
+          <w:rFonts w:ascii="Calibri" w:hAnsi="Calibri"/>
+          <w:sz w:val="21"/>
+        </w:rPr>
+        <w:t>Fifth, the rapid four-record evidence map separates an unreviewed source from a known unresolved field. Only the Microsoft/WSP public archive was audited at the numeric-artifact level. It still failed the complete transferability gate because the numeric endpoint method identity, architecture-resolved cooling performance, and common workload equivalence remain unresolved. The LBNL EnergyPlus archetype contract supplies a controlled next modeling step, but no simulated result is reported until the model is run, reviewed, and connected to validated liquid-cooling performance.</w:t>
+      </w:r>
+    </w:p>
+    <w:p>
+      <w:r>
+        <w:rPr>
+          <w:rFonts w:ascii="Calibri" w:hAnsi="Calibri"/>
+          <w:sz w:val="21"/>
+        </w:rPr>
+        <w:t>The study is suitable as a transferability Technology Assessment. It does not support a public claim of environmental superiority among cooling architectures.</w:t>
       </w:r>
     </w:p>
     <w:p>
@@ -5526,6 +5649,58 @@
           <w:sz w:val="21"/>
         </w:rPr>
         <w:t>https://www.usgs.gov/national-hydrography/watershed-boundary-dataset (accessed 11 August 2026).</w:t>
+      </w:r>
+    </w:p>
+    <w:p>
+      <w:pPr>
+        <w:spacing w:after="60"/>
+        <w:ind w:left="374" w:hanging="288"/>
+      </w:pPr>
+      <w:r>
+        <w:rPr>
+          <w:rFonts w:ascii="Calibri" w:hAnsi="Calibri"/>
+          <w:sz w:val="21"/>
+        </w:rPr>
+        <w:t>49. Sun, K., Luo, N., Luo, X. &amp; Hong, T. Prototype energy models for data</w:t>
+      </w:r>
+    </w:p>
+    <w:p>
+      <w:r>
+        <w:rPr>
+          <w:rFonts w:ascii="Calibri" w:hAnsi="Calibri"/>
+          <w:sz w:val="21"/>
+        </w:rPr>
+        <w:t xml:space="preserve">centers. </w:t>
+      </w:r>
+      <w:r>
+        <w:rPr>
+          <w:rFonts w:ascii="Calibri" w:hAnsi="Calibri"/>
+          <w:i/>
+          <w:sz w:val="21"/>
+        </w:rPr>
+        <w:t>Energy and Buildings</w:t>
+      </w:r>
+      <w:r>
+        <w:rPr>
+          <w:rFonts w:ascii="Calibri" w:hAnsi="Calibri"/>
+          <w:sz w:val="21"/>
+        </w:rPr>
+        <w:t xml:space="preserve"> </w:t>
+      </w:r>
+      <w:r>
+        <w:rPr>
+          <w:rFonts w:ascii="Calibri" w:hAnsi="Calibri"/>
+          <w:b/>
+          <w:sz w:val="21"/>
+        </w:rPr>
+        <w:t>231</w:t>
+      </w:r>
+      <w:r>
+        <w:rPr>
+          <w:rFonts w:ascii="Calibri" w:hAnsi="Calibri"/>
+          <w:sz w:val="21"/>
+        </w:rPr>
+        <w:t>, 110603 (2021). https://doi.org/10.1016/j.enbuild.2020.110603</w:t>
       </w:r>
     </w:p>
     <w:sectPr>

</xml_diff>